<commit_message>
Piano giornaliero: aggiornamento del Quaderno dalle evidenziazioni del giorno (--diff) e lettura dei progressi
Co-Authored-By: Claude Sonnet 5.5 <noreply@anthropic.com>
</commit_message>
<xml_diff>
--- a/Riassunto Fondamenti Informatica.docx
+++ b/Riassunto Fondamenti Informatica.docx
@@ -2230,100 +2230,101 @@
           <w:bCs/>
           <w:color w:val="E97132" w:themeColor="accent2"/>
         </w:rPr>
-        <w:t>Il concetto di bit e i livelli di astrazione</w:t>
-      </w:r>
-    </w:p>
-    <w:p>
-      <w:r>
-        <w:t xml:space="preserve">Nel livello più elementare di un calcolatore, tutte le informazioni (testi, numeri, immagini, suoni) sono codificate sotto forma di sequenze di 0 e 1, dette </w:t>
-      </w:r>
-      <w:r>
-        <w:rPr>
-          <w:b/>
-          <w:bCs/>
-        </w:rPr>
-        <w:t>bit</w:t>
-      </w:r>
-      <w:r>
-        <w:t xml:space="preserve"> (</w:t>
+        <w:t>Operazioni Booleane di base</w:t>
+      </w:r>
+    </w:p>
+    <w:p>
+      <w:r>
+        <w:t xml:space="preserve">Per manipolare e conservare i bit all'interno dei circuiti, si adotta la convenzione logica per cui il </w:t>
+      </w:r>
+      <w:r>
+        <w:rPr>
+          <w:highlight w:val="yellow"/>
+        </w:rPr>
+        <w:t>bit 0</w:t>
+      </w:r>
+      <w:r>
+        <w:t xml:space="preserve"> </w:t>
+      </w:r>
+      <w:r>
+        <w:rPr>
+          <w:highlight w:val="yellow"/>
+        </w:rPr>
+        <w:t xml:space="preserve">rappresenta il valore </w:t>
       </w:r>
       <w:r>
         <w:rPr>
           <w:i/>
           <w:iCs/>
-        </w:rPr>
-        <w:t>binary digits</w:t>
-      </w:r>
-      <w:r>
-        <w:t>). I bit non rappresentano necessariamente valori numerici, ma sono simboli astratti il cui significato specifico dipende dal contesto applicativo. L'hardware gestisce i dati attraverso vari livelli di astrazione, partendo dai singoli segnali elettrici di tensione fino a strutture simboliche complesse.</w:t>
-      </w:r>
-    </w:p>
-    <w:p>
-      <w:pPr>
-        <w:pStyle w:val="Titolo2"/>
-        <w:rPr>
-          <w:b/>
-          <w:bCs/>
-          <w:color w:val="E97132" w:themeColor="accent2"/>
-        </w:rPr>
-      </w:pPr>
-      <w:r>
-        <w:rPr>
-          <w:b/>
-          <w:bCs/>
-          <w:color w:val="E97132" w:themeColor="accent2"/>
-        </w:rPr>
-        <w:t>Operazioni Booleane di base</w:t>
-      </w:r>
-    </w:p>
-    <w:p>
-      <w:r>
-        <w:t xml:space="preserve">Per manipolare e conservare i bit all'interno dei circuiti, si adotta la convenzione logica per cui il bit 0 rappresenta il valore </w:t>
+          <w:highlight w:val="yellow"/>
+        </w:rPr>
+        <w:t>falso</w:t>
+      </w:r>
+      <w:r>
+        <w:rPr>
+          <w:highlight w:val="yellow"/>
+        </w:rPr>
+        <w:t xml:space="preserve"> (</w:t>
       </w:r>
       <w:r>
         <w:rPr>
           <w:i/>
           <w:iCs/>
-        </w:rPr>
-        <w:t>falso</w:t>
-      </w:r>
-      <w:r>
-        <w:t xml:space="preserve"> (</w:t>
+          <w:highlight w:val="yellow"/>
+        </w:rPr>
+        <w:t>false</w:t>
+      </w:r>
+      <w:r>
+        <w:rPr>
+          <w:highlight w:val="yellow"/>
+        </w:rPr>
+        <w:t>)</w:t>
+      </w:r>
+      <w:r>
+        <w:t xml:space="preserve"> e il </w:t>
+      </w:r>
+      <w:r>
+        <w:rPr>
+          <w:highlight w:val="yellow"/>
+        </w:rPr>
+        <w:t xml:space="preserve">bit 1 rappresenta il valore </w:t>
       </w:r>
       <w:r>
         <w:rPr>
           <w:i/>
           <w:iCs/>
-        </w:rPr>
-        <w:t>false</w:t>
-      </w:r>
-      <w:r>
-        <w:t xml:space="preserve">) e il bit 1 rappresenta il valore </w:t>
+          <w:highlight w:val="yellow"/>
+        </w:rPr>
+        <w:t>vero</w:t>
+      </w:r>
+      <w:r>
+        <w:rPr>
+          <w:highlight w:val="yellow"/>
+        </w:rPr>
+        <w:t xml:space="preserve"> (</w:t>
       </w:r>
       <w:r>
         <w:rPr>
           <w:i/>
           <w:iCs/>
-        </w:rPr>
-        <w:t>vero</w:t>
-      </w:r>
-      <w:r>
-        <w:t xml:space="preserve"> (</w:t>
-      </w:r>
-      <w:r>
-        <w:rPr>
-          <w:i/>
-          <w:iCs/>
+          <w:highlight w:val="yellow"/>
         </w:rPr>
         <w:t>true</w:t>
       </w:r>
       <w:r>
-        <w:t xml:space="preserve">). Le operazioni matematiche che operano su questi valori di verità sono dette </w:t>
-      </w:r>
-      <w:r>
-        <w:rPr>
-          <w:b/>
-          <w:bCs/>
+        <w:rPr>
+          <w:highlight w:val="yellow"/>
+        </w:rPr>
+        <w:t>)</w:t>
+      </w:r>
+      <w:r>
+        <w:t xml:space="preserve">. Le operazioni matematiche che operano su questi valori di verità sono dette </w:t>
+      </w:r>
+      <w:r>
+        <w:rPr>
+          <w:b/>
+          <w:bCs/>
+          <w:highlight w:val="yellow"/>
         </w:rPr>
         <w:t>operazioni booleane</w:t>
       </w:r>
@@ -2346,7 +2347,16 @@
         <w:t>AND</w:t>
       </w:r>
       <w:r>
-        <w:t>: produce un output pari a 1 soltanto quando entrambi gli ingressi sono pari a 1; in tutti gli altri casi l'uscita è 0.</w:t>
+        <w:t xml:space="preserve">: produce un output pari a 1 </w:t>
+      </w:r>
+      <w:r>
+        <w:rPr>
+          <w:highlight w:val="yellow"/>
+        </w:rPr>
+        <w:t>soltanto quando entrambi gli ingressi sono pari a 1</w:t>
+      </w:r>
+      <w:r>
+        <w:t>; in tutti gli altri casi l'uscita è 0.</w:t>
       </w:r>
     </w:p>
     <w:p>
@@ -2364,7 +2374,16 @@
         <w:t>OR</w:t>
       </w:r>
       <w:r>
-        <w:t>: produce un output pari a 1 quando almeno uno dei due ingressi è pari a 1; restituisce 0 solo se entrambi gli input sono 0.</w:t>
+        <w:t xml:space="preserve">: produce un output pari a 1 quando </w:t>
+      </w:r>
+      <w:r>
+        <w:rPr>
+          <w:highlight w:val="yellow"/>
+        </w:rPr>
+        <w:t>almeno uno dei due ingressi è pari a 1</w:t>
+      </w:r>
+      <w:r>
+        <w:t>; restituisce 0 solo se entrambi gli input sono 0.</w:t>
       </w:r>
     </w:p>
     <w:p>
@@ -2382,7 +2401,16 @@
         <w:t>XOR (Exclusive OR)</w:t>
       </w:r>
       <w:r>
-        <w:t>: produce un output pari a 1 quando gli ingressi sono diversi tra loro (ovvero uno è 1 e l'altro è 0), mentre restituisce 0 se gli ingressi sono identici.</w:t>
+        <w:t xml:space="preserve">: produce un output pari a 1 quando gli </w:t>
+      </w:r>
+      <w:r>
+        <w:rPr>
+          <w:highlight w:val="yellow"/>
+        </w:rPr>
+        <w:t>ingressi sono diversi tra loro</w:t>
+      </w:r>
+      <w:r>
+        <w:t xml:space="preserve"> (ovvero uno è 1 e l'altro è 0), mentre restituisce 0 se gli ingressi sono identici.</w:t>
       </w:r>
     </w:p>
     <w:p>
@@ -2400,7 +2428,16 @@
         <w:t>NOT</w:t>
       </w:r>
       <w:r>
-        <w:t>: è un'operazione unaria (ha un solo ingresso) e inverte il valore del bit in input, trasformando 1 in 0 e 0 in 1.</w:t>
+        <w:t xml:space="preserve">: è un'operazione unaria (ha un solo ingresso) e </w:t>
+      </w:r>
+      <w:r>
+        <w:rPr>
+          <w:highlight w:val="yellow"/>
+        </w:rPr>
+        <w:t>inverte il valore del bit</w:t>
+      </w:r>
+      <w:r>
+        <w:t xml:space="preserve"> in input, trasformando 1 in 0 e 0 in 1.</w:t>
       </w:r>
     </w:p>
     <w:p>
@@ -2423,12 +2460,28 @@
     </w:p>
     <w:p>
       <w:r>
-        <w:t xml:space="preserve">L'hardware esegue fisicamente queste operazioni tramite le </w:t>
-      </w:r>
-      <w:r>
-        <w:rPr>
-          <w:b/>
-          <w:bCs/>
+        <w:t xml:space="preserve">L'hardware </w:t>
+      </w:r>
+      <w:r>
+        <w:rPr>
+          <w:highlight w:val="yellow"/>
+        </w:rPr>
+        <w:t>esegue fisicamente</w:t>
+      </w:r>
+      <w:r>
+        <w:t xml:space="preserve"> queste operazioni </w:t>
+      </w:r>
+      <w:r>
+        <w:rPr>
+          <w:highlight w:val="yellow"/>
+        </w:rPr>
+        <w:t xml:space="preserve">tramite le </w:t>
+      </w:r>
+      <w:r>
+        <w:rPr>
+          <w:b/>
+          <w:bCs/>
+          <w:highlight w:val="yellow"/>
         </w:rPr>
         <w:t>porte logiche</w:t>
       </w:r>
@@ -2443,7 +2496,19 @@
         <w:t>gates</w:t>
       </w:r>
       <w:r>
-        <w:t>), che sono piccoli circuiti elettronici in cui le cifre 0 e 1 corrispondono a differenti livelli di tensione elettrica.</w:t>
+        <w:t xml:space="preserve">), che </w:t>
+      </w:r>
+      <w:r>
+        <w:t xml:space="preserve">sono </w:t>
+      </w:r>
+      <w:r>
+        <w:rPr>
+          <w:highlight w:val="yellow"/>
+        </w:rPr>
+        <w:t>piccoli circuiti elettronici in cui le cifre 0 e 1 corrispondono a differenti livelli di tensione elettrica</w:t>
+      </w:r>
+      <w:r>
+        <w:t>.</w:t>
       </w:r>
     </w:p>
     <w:p>
@@ -2461,17 +2526,57 @@
         <w:t>Composizione e Astrazione</w:t>
       </w:r>
       <w:r>
-        <w:t xml:space="preserve">: le porte logiche rappresentano i blocchi costruttivi fondamentali dell'architettura hardware. Collegando opportunamente più porte logiche tra loro si realizzano i </w:t>
-      </w:r>
-      <w:r>
-        <w:rPr>
-          <w:b/>
-          <w:bCs/>
+        <w:t>: le porte logiche rapp</w:t>
+      </w:r>
+      <w:r>
+        <w:rPr>
+          <w:highlight w:val="yellow"/>
+        </w:rPr>
+        <w:t>resentano i blocchi costruttivi fondamentali dell'architettura hardware.</w:t>
+      </w:r>
+      <w:r>
+        <w:t xml:space="preserve"> </w:t>
+      </w:r>
+      <w:r>
+        <w:rPr>
+          <w:highlight w:val="yellow"/>
+        </w:rPr>
+        <w:t xml:space="preserve">Collegando </w:t>
+      </w:r>
+      <w:r>
+        <w:t xml:space="preserve">opportunamente </w:t>
+      </w:r>
+      <w:r>
+        <w:rPr>
+          <w:highlight w:val="yellow"/>
+        </w:rPr>
+        <w:t>più porte logiche</w:t>
+      </w:r>
+      <w:r>
+        <w:t xml:space="preserve"> tra loro </w:t>
+      </w:r>
+      <w:r>
+        <w:rPr>
+          <w:highlight w:val="yellow"/>
+        </w:rPr>
+        <w:t xml:space="preserve">si realizzano i </w:t>
+      </w:r>
+      <w:r>
+        <w:rPr>
+          <w:b/>
+          <w:bCs/>
+          <w:highlight w:val="yellow"/>
         </w:rPr>
         <w:t>flip-flop</w:t>
       </w:r>
       <w:r>
-        <w:t>, ovvero i circuiti sequenziali elementari capaci di memorizzare un singolo bit attraverso impulsi di controllo.</w:t>
+        <w:rPr>
+          <w:highlight w:val="yellow"/>
+        </w:rPr>
+        <w:t>,</w:t>
+      </w:r>
+      <w:r>
+        <w:t xml:space="preserve"> ovvero i circuiti sequenziali elementari capaci di memorizzare un singolo bit attraverso impulsi di controllo.</w:t>
       </w:r>
     </w:p>
     <w:p>
@@ -2489,12 +2594,19 @@
         <w:t>Integrazione VLSI</w:t>
       </w:r>
       <w:r>
-        <w:t xml:space="preserve">: tramite la tecnologia </w:t>
-      </w:r>
-      <w:r>
-        <w:rPr>
-          <w:b/>
-          <w:bCs/>
+        <w:t xml:space="preserve">: tramite la </w:t>
+      </w:r>
+      <w:r>
+        <w:rPr>
+          <w:highlight w:val="yellow"/>
+        </w:rPr>
+        <w:t xml:space="preserve">tecnologia </w:t>
+      </w:r>
+      <w:r>
+        <w:rPr>
+          <w:b/>
+          <w:bCs/>
+          <w:highlight w:val="yellow"/>
         </w:rPr>
         <w:t>VLSI</w:t>
       </w:r>
@@ -2509,7 +2621,25 @@
         <w:t>Very Large-Scale Integration</w:t>
       </w:r>
       <w:r>
-        <w:t>), milioni o miliardi di porte logiche e flip-flop vengono miniaturizzati ed edificati su un unico wafer di silicio (chip), permettendo di realizzare circuiti complessi gestibili dai progettisti come componenti astratti.</w:t>
+        <w:t xml:space="preserve">), </w:t>
+      </w:r>
+      <w:r>
+        <w:rPr>
+          <w:highlight w:val="yellow"/>
+        </w:rPr>
+        <w:t>milioni o miliardi di porte logiche e flip-flop vengono miniaturizzati ed edificati su un unico</w:t>
+      </w:r>
+      <w:r>
+        <w:t xml:space="preserve"> wafer di silicio (</w:t>
+      </w:r>
+      <w:r>
+        <w:rPr>
+          <w:highlight w:val="yellow"/>
+        </w:rPr>
+        <w:t>chip</w:t>
+      </w:r>
+      <w:r>
+        <w:t>), permettendo di realizzare circuiti complessi gestibili dai progettisti come componenti astratti.</w:t>
       </w:r>
     </w:p>
     <w:p>
@@ -2556,11 +2686,21 @@
         <w:rPr>
           <w:b/>
           <w:bCs/>
+          <w:highlight w:val="yellow"/>
         </w:rPr>
         <w:t>memoria principale</w:t>
       </w:r>
       <w:r>
-        <w:t xml:space="preserve"> (o memoria centrale) di un computer è costituita da una vasta collezione di circuiti (come i flip-flop) destinati a contenere le informazioni in esecuzione.</w:t>
+        <w:t xml:space="preserve"> (o memoria centrale) di un computer è </w:t>
+      </w:r>
+      <w:r>
+        <w:rPr>
+          <w:highlight w:val="yellow"/>
+        </w:rPr>
+        <w:t>costituita da una vasta collezione di circuiti (come i flip-flop)</w:t>
+      </w:r>
+      <w:r>
+        <w:t xml:space="preserve"> destinati a contenere le informazioni in esecuzione.</w:t>
       </w:r>
     </w:p>
     <w:p>
@@ -2578,22 +2718,36 @@
         <w:t>Struttura a celle e Byte</w:t>
       </w:r>
       <w:r>
-        <w:t xml:space="preserve">: la memoria è suddivisa in unità di gestione denominate </w:t>
-      </w:r>
-      <w:r>
-        <w:rPr>
-          <w:b/>
-          <w:bCs/>
+        <w:t xml:space="preserve">: la </w:t>
+      </w:r>
+      <w:r>
+        <w:rPr>
+          <w:highlight w:val="yellow"/>
+        </w:rPr>
+        <w:t xml:space="preserve">memoria è suddivisa in unità di gestione denominate </w:t>
+      </w:r>
+      <w:r>
+        <w:rPr>
+          <w:b/>
+          <w:bCs/>
+          <w:highlight w:val="yellow"/>
         </w:rPr>
         <w:t>celle</w:t>
       </w:r>
       <w:r>
-        <w:t xml:space="preserve">, ciascuna delle quali ha una capacità tipica di 8 bit, definita </w:t>
-      </w:r>
-      <w:r>
-        <w:rPr>
-          <w:b/>
-          <w:bCs/>
+        <w:t xml:space="preserve">, ciascuna delle quali ha una </w:t>
+      </w:r>
+      <w:r>
+        <w:rPr>
+          <w:highlight w:val="yellow"/>
+        </w:rPr>
+        <w:t xml:space="preserve">capacità tipica di 8 bit, definita </w:t>
+      </w:r>
+      <w:r>
+        <w:rPr>
+          <w:b/>
+          <w:bCs/>
+          <w:highlight w:val="yellow"/>
         </w:rPr>
         <w:t>byte</w:t>
       </w:r>
@@ -2616,12 +2770,19 @@
         <w:t>MSB e LSB</w:t>
       </w:r>
       <w:r>
-        <w:t xml:space="preserve">: all'interno di una cella da un byte, i bit sono ordinati idealmente da sinistra a destra. Il bit all'estremità sinistra è chiamato </w:t>
-      </w:r>
-      <w:r>
-        <w:rPr>
-          <w:b/>
-          <w:bCs/>
+        <w:t xml:space="preserve">: all'interno di una cella da un byte, i bit sono ordinati idealmente da sinistra a destra. Il </w:t>
+      </w:r>
+      <w:r>
+        <w:rPr>
+          <w:highlight w:val="yellow"/>
+        </w:rPr>
+        <w:t xml:space="preserve">bit all'estremità sinistra è chiamato </w:t>
+      </w:r>
+      <w:r>
+        <w:rPr>
+          <w:b/>
+          <w:bCs/>
+          <w:highlight w:val="yellow"/>
         </w:rPr>
         <w:t>high-order bit</w:t>
       </w:r>
@@ -2632,32 +2793,57 @@
         <w:rPr>
           <w:b/>
           <w:bCs/>
-        </w:rPr>
-        <w:t>most significant bit (MSB)</w:t>
-      </w:r>
-      <w:r>
-        <w:t xml:space="preserve">, </w:t>
-      </w:r>
-      <w:r>
-        <w:lastRenderedPageBreak/>
-        <w:t xml:space="preserve">poiché rappresenta la cifra di peso maggiore in un'interpretazione numerica. Il bit all'estremità destra è detto </w:t>
-      </w:r>
-      <w:r>
-        <w:rPr>
-          <w:b/>
-          <w:bCs/>
+          <w:highlight w:val="yellow"/>
+        </w:rPr>
+        <w:t>most significant bit</w:t>
+      </w:r>
+      <w:r>
+        <w:rPr>
+          <w:b/>
+          <w:bCs/>
+        </w:rPr>
+        <w:t xml:space="preserve"> (MSB)</w:t>
+      </w:r>
+      <w:r>
+        <w:t xml:space="preserve">, poiché rappresenta la cifra di peso maggiore in un'interpretazione numerica. Il </w:t>
+      </w:r>
+      <w:r>
+        <w:rPr>
+          <w:highlight w:val="yellow"/>
+        </w:rPr>
+        <w:t>bit all'estremità destra</w:t>
+      </w:r>
+      <w:r>
+        <w:t xml:space="preserve"> è detto </w:t>
+      </w:r>
+      <w:r>
+        <w:rPr>
+          <w:b/>
+          <w:bCs/>
+          <w:highlight w:val="yellow"/>
         </w:rPr>
         <w:t>low-order bit</w:t>
       </w:r>
       <w:r>
+        <w:rPr>
+          <w:highlight w:val="yellow"/>
+        </w:rPr>
         <w:t xml:space="preserve"> o </w:t>
       </w:r>
       <w:r>
         <w:rPr>
           <w:b/>
           <w:bCs/>
-        </w:rPr>
-        <w:t>least significant bit (LSB)</w:t>
+          <w:highlight w:val="yellow"/>
+        </w:rPr>
+        <w:t>least significant bit</w:t>
+      </w:r>
+      <w:r>
+        <w:rPr>
+          <w:b/>
+          <w:bCs/>
+        </w:rPr>
+        <w:t xml:space="preserve"> (LSB)</w:t>
       </w:r>
       <w:r>
         <w:t>.</w:t>
@@ -2683,12 +2869,28 @@
     </w:p>
     <w:p>
       <w:r>
-        <w:t xml:space="preserve">Per identificare e accedere alle singole celle, a ciascuna di esse viene assegnato un "nome" numerico univoco detto </w:t>
-      </w:r>
-      <w:r>
-        <w:rPr>
-          <w:b/>
-          <w:bCs/>
+        <w:t xml:space="preserve">Per identificare e accedere alle </w:t>
+      </w:r>
+      <w:r>
+        <w:rPr>
+          <w:highlight w:val="yellow"/>
+        </w:rPr>
+        <w:t>singole celle</w:t>
+      </w:r>
+      <w:r>
+        <w:t xml:space="preserve">, a ciascuna di esse viene assegnato un </w:t>
+      </w:r>
+      <w:r>
+        <w:rPr>
+          <w:highlight w:val="yellow"/>
+        </w:rPr>
+        <w:t xml:space="preserve">"nome" numerico univoco detto </w:t>
+      </w:r>
+      <w:r>
+        <w:rPr>
+          <w:b/>
+          <w:bCs/>
+          <w:highlight w:val="yellow"/>
         </w:rPr>
         <w:t>indirizzo</w:t>
       </w:r>
@@ -2708,10 +2910,38 @@
           <w:b/>
           <w:bCs/>
         </w:rPr>
+        <w:lastRenderedPageBreak/>
         <w:t>Ordinamento sequenziale</w:t>
       </w:r>
       <w:r>
-        <w:t>: gli indirizzi partono da 0 e crescono in modo contiguo, creando una sequenza ordinata di celle. Sequenze di dati più lunghe di un singolo byte (come interi a 16, 32 o 64 bit) vengono memorizzate occupando celle adiacenti.</w:t>
+        <w:t xml:space="preserve">: gli </w:t>
+      </w:r>
+      <w:r>
+        <w:rPr>
+          <w:highlight w:val="yellow"/>
+        </w:rPr>
+        <w:t>indirizzi partono da 0 e crescono</w:t>
+      </w:r>
+      <w:r>
+        <w:t xml:space="preserve"> in modo contiguo, </w:t>
+      </w:r>
+      <w:r>
+        <w:rPr>
+          <w:highlight w:val="yellow"/>
+        </w:rPr>
+        <w:t>creando una sequenza ordinata di celle</w:t>
+      </w:r>
+      <w:r>
+        <w:t xml:space="preserve">. Sequenze di dati più lunghe di un singolo byte (come interi a 16, 32 o 64 bit) vengono memorizzate occupando </w:t>
+      </w:r>
+      <w:r>
+        <w:rPr>
+          <w:highlight w:val="yellow"/>
+        </w:rPr>
+        <w:t>celle adiacenti</w:t>
+      </w:r>
+      <w:r>
+        <w:t>.</w:t>
       </w:r>
     </w:p>
     <w:p>
@@ -2729,12 +2959,22 @@
         <w:t>Operazioni fondamentali</w:t>
       </w:r>
       <w:r>
-        <w:t xml:space="preserve">: i circuiti esterni interagiscono con la memoria mediante due operazioni: la </w:t>
-      </w:r>
-      <w:r>
-        <w:rPr>
-          <w:b/>
-          <w:bCs/>
+        <w:t xml:space="preserve">: i </w:t>
+      </w:r>
+      <w:r>
+        <w:rPr>
+          <w:highlight w:val="yellow"/>
+        </w:rPr>
+        <w:t>circuiti esterni interagiscono con la memoria mediante due operazion</w:t>
+      </w:r>
+      <w:r>
+        <w:t xml:space="preserve">i: la </w:t>
+      </w:r>
+      <w:r>
+        <w:rPr>
+          <w:b/>
+          <w:bCs/>
+          <w:highlight w:val="yellow"/>
         </w:rPr>
         <w:t>lettura</w:t>
       </w:r>
@@ -2755,6 +2995,7 @@
         <w:rPr>
           <w:b/>
           <w:bCs/>
+          <w:highlight w:val="yellow"/>
         </w:rPr>
         <w:t>scrittura</w:t>
       </w:r>
@@ -2787,12 +3028,19 @@
         <w:t>RAM e DRAM</w:t>
       </w:r>
       <w:r>
-        <w:t xml:space="preserve">: poiché l'architettura consente di accedere a qualsiasi cella in modo indipendente e nello stesso intervallo di tempo, la memoria principale è detta </w:t>
-      </w:r>
-      <w:r>
-        <w:rPr>
-          <w:b/>
-          <w:bCs/>
+        <w:t xml:space="preserve">: poiché l'architettura consente di accedere a qualsiasi cella in modo indipendente e nello stesso intervallo di tempo, la </w:t>
+      </w:r>
+      <w:r>
+        <w:rPr>
+          <w:highlight w:val="yellow"/>
+        </w:rPr>
+        <w:t xml:space="preserve">memoria principale è detta </w:t>
+      </w:r>
+      <w:r>
+        <w:rPr>
+          <w:b/>
+          <w:bCs/>
+          <w:highlight w:val="yellow"/>
         </w:rPr>
         <w:t>RAM</w:t>
       </w:r>
@@ -2807,7 +3055,16 @@
         <w:t>Random Access Memory</w:t>
       </w:r>
       <w:r>
-        <w:t>). Nelle moderne macchine, la RAM è realizzata come memoria dinamica (</w:t>
+        <w:t xml:space="preserve">). Nelle moderne macchine, la </w:t>
+      </w:r>
+      <w:r>
+        <w:rPr>
+          <w:highlight w:val="yellow"/>
+        </w:rPr>
+        <w:t>RAM è realizzata come memoria dinamica</w:t>
+      </w:r>
+      <w:r>
+        <w:t xml:space="preserve"> (</w:t>
       </w:r>
       <w:r>
         <w:rPr>
@@ -2827,7 +3084,16 @@
         <w:t>SDRAM</w:t>
       </w:r>
       <w:r>
-        <w:t xml:space="preserve">), dove i bit sono memorizzati sotto forma di microscopiche cariche elettriche che tendono a dissiparsi rapidamente e richiedono un circuito di </w:t>
+        <w:t xml:space="preserve">), dove i </w:t>
+      </w:r>
+      <w:r>
+        <w:rPr>
+          <w:highlight w:val="yellow"/>
+        </w:rPr>
+        <w:t>bit sono memorizzati sotto forma di microscopiche cariche elettriche</w:t>
+      </w:r>
+      <w:r>
+        <w:t xml:space="preserve"> che tendono a dissiparsi rapidamente e richiedono un circuito di </w:t>
       </w:r>
       <w:r>
         <w:rPr>
@@ -2860,7 +3126,16 @@
     </w:p>
     <w:p>
       <w:r>
-        <w:t xml:space="preserve">Storicamente, le dimensioni della memoria sono progettate in potenze di 2. Di conseguenza, 1 </w:t>
+        <w:t xml:space="preserve">Storicamente, le </w:t>
+      </w:r>
+      <w:r>
+        <w:rPr>
+          <w:highlight w:val="yellow"/>
+        </w:rPr>
+        <w:t>dimensioni della memoria sono progettate in potenze di 2</w:t>
+      </w:r>
+      <w:r>
+        <w:t xml:space="preserve">. Di conseguenza, 1 </w:t>
       </w:r>
       <w:r>
         <w:rPr>
@@ -2884,28 +3159,14 @@
     </w:p>
     <w:p>
       <w:pPr>
-        <w:pStyle w:val="Titolo2"/>
-        <w:rPr>
-          <w:b/>
-          <w:bCs/>
-          <w:color w:val="E97132" w:themeColor="accent2"/>
-        </w:rPr>
-      </w:pPr>
-      <w:r>
-        <w:rPr>
-          <w:b/>
-          <w:bCs/>
-          <w:color w:val="E97132" w:themeColor="accent2"/>
-        </w:rPr>
-        <w:t>Memoria di Massa e Supporti di Memorizzazione</w:t>
-      </w:r>
-    </w:p>
-    <w:p>
-      <w:r>
-        <w:t>La memoria di massa (dischi magnetici, supporti ottici, memorie Flash e SSD, schede di memoria) è descritta nel dettaglio nel capitolo 3: qui si ricorda solo che completa la memoria principale, limitata e volatile, con capacità elevate e conservazione permanente dei dati.</w:t>
-      </w:r>
-    </w:p>
-    <w:p/>
+        <w:pStyle w:val="Titolo1"/>
+        <w:rPr>
+          <w:b/>
+          <w:bCs/>
+          <w:color w:val="EE0000"/>
+        </w:rPr>
+      </w:pPr>
+    </w:p>
     <w:p>
       <w:pPr>
         <w:pStyle w:val="Titolo1"/>
@@ -3021,64 +3282,64 @@
           <w:bCs/>
           <w:color w:val="E97132" w:themeColor="accent2"/>
         </w:rPr>
+        <w:t>Rappresentazione dei Valori Numerici (ASCII vs Notazione Binaria)</w:t>
+      </w:r>
+    </w:p>
+    <w:p>
+      <w:r>
+        <w:t>Memorizzare i numeri sotto forma di caratteri ASCII o Unicode è estremamente inefficiente dal punto di vista dello spazio di archiviazione.</w:t>
+      </w:r>
+    </w:p>
+    <w:p>
+      <w:r>
+        <w:rPr>
+          <w:b/>
+          <w:bCs/>
+        </w:rPr>
+        <w:t>Incapacità della codifica a caratteri</w:t>
+      </w:r>
+      <w:r>
+        <w:t>: per salvare il numero intero 25 come testo servono due byte (16 bit), un byte per il carattere '2' e un byte per il carattere '5'. Con 16 bit espressi in ASCII il valore massimo rappresentabile è soltanto 99.</w:t>
+      </w:r>
+    </w:p>
+    <w:p>
+      <w:r>
+        <w:rPr>
+          <w:b/>
+          <w:bCs/>
+        </w:rPr>
+        <w:t>Efficienza della Notazione Binaria</w:t>
+      </w:r>
+      <w:r>
+        <w:t xml:space="preserve">: codificando il valore numerico direttamente in </w:t>
+      </w:r>
+      <w:r>
+        <w:rPr>
+          <w:b/>
+          <w:bCs/>
+        </w:rPr>
+        <w:t>notazione binaria</w:t>
+      </w:r>
+      <w:r>
+        <w:t>, gli stessi 16 bit consentono di rappresentare qualsiasi numero intero compreso tra 0 e 65.535. Per questo motivo, nei calcolatori le quantità numeriche vengono sempre memorizzate tramite rappresentazioni binarie dedicate.</w:t>
+      </w:r>
+    </w:p>
+    <w:p>
+      <w:pPr>
+        <w:pStyle w:val="Titolo2"/>
+        <w:rPr>
+          <w:b/>
+          <w:bCs/>
+          <w:color w:val="E97132" w:themeColor="accent2"/>
+        </w:rPr>
+      </w:pPr>
+      <w:r>
+        <w:rPr>
+          <w:b/>
+          <w:bCs/>
+          <w:color w:val="E97132" w:themeColor="accent2"/>
+        </w:rPr>
         <w:lastRenderedPageBreak/>
-        <w:t>Rappresentazione dei Valori Numerici (ASCII vs Notazione Binaria)</w:t>
-      </w:r>
-    </w:p>
-    <w:p>
-      <w:r>
-        <w:t>Memorizzare i numeri sotto forma di caratteri ASCII o Unicode è estremamente inefficiente dal punto di vista dello spazio di archiviazione.</w:t>
-      </w:r>
-    </w:p>
-    <w:p>
-      <w:r>
-        <w:rPr>
-          <w:b/>
-          <w:bCs/>
-        </w:rPr>
-        <w:t>Incapacità della codifica a caratteri</w:t>
-      </w:r>
-      <w:r>
-        <w:t>: per salvare il numero intero 25 come testo servono due byte (16 bit), un byte per il carattere '2' e un byte per il carattere '5'. Con 16 bit espressi in ASCII il valore massimo rappresentabile è soltanto 99.</w:t>
-      </w:r>
-    </w:p>
-    <w:p>
-      <w:r>
-        <w:rPr>
-          <w:b/>
-          <w:bCs/>
-        </w:rPr>
-        <w:t>Efficienza della Notazione Binaria</w:t>
-      </w:r>
-      <w:r>
-        <w:t xml:space="preserve">: codificando il valore numerico direttamente in </w:t>
-      </w:r>
-      <w:r>
-        <w:rPr>
-          <w:b/>
-          <w:bCs/>
-        </w:rPr>
-        <w:t>notazione binaria</w:t>
-      </w:r>
-      <w:r>
-        <w:t>, gli stessi 16 bit consentono di rappresentare qualsiasi numero intero compreso tra 0 e 65.535. Per questo motivo, nei calcolatori le quantità numeriche vengono sempre memorizzate tramite rappresentazioni binarie dedicate.</w:t>
-      </w:r>
-    </w:p>
-    <w:p>
-      <w:pPr>
-        <w:pStyle w:val="Titolo2"/>
-        <w:rPr>
-          <w:b/>
-          <w:bCs/>
-          <w:color w:val="E97132" w:themeColor="accent2"/>
-        </w:rPr>
-      </w:pPr>
-      <w:r>
-        <w:rPr>
-          <w:b/>
-          <w:bCs/>
-          <w:color w:val="E97132" w:themeColor="accent2"/>
-        </w:rPr>
         <w:t>Rappresentazione delle Immagini (Bitmap e Grafica Vettoriale)</w:t>
       </w:r>
     </w:p>
@@ -3346,11 +3607,7 @@
         <w:t>PostScript</w:t>
       </w:r>
       <w:r>
-        <w:t xml:space="preserve"> (sviluppato da Adobe), </w:t>
-      </w:r>
-      <w:r>
-        <w:lastRenderedPageBreak/>
-        <w:t xml:space="preserve">per i disegni tecnici nei software </w:t>
+        <w:t xml:space="preserve"> (sviluppato da Adobe), per i disegni tecnici nei software </w:t>
       </w:r>
       <w:r>
         <w:rPr>
@@ -3440,6 +3697,7 @@
           <w:i/>
           <w:iCs/>
         </w:rPr>
+        <w:lastRenderedPageBreak/>
         <w:t>Telefonia vocale</w:t>
       </w:r>
       <w:r>
@@ -3751,7 +4009,6 @@
           <w:b/>
           <w:bCs/>
         </w:rPr>
-        <w:lastRenderedPageBreak/>
         <w:t>Valore assoluto di una sequenza</w:t>
       </w:r>
       <w:r>
@@ -3855,6 +4112,7 @@
         </w:numPr>
       </w:pPr>
       <w:r>
+        <w:lastRenderedPageBreak/>
         <w:t>0 × 2</w:t>
       </w:r>
       <w:r>
@@ -4201,7 +4459,6 @@
           <w:bCs/>
           <w:color w:val="E97132" w:themeColor="accent2"/>
         </w:rPr>
-        <w:lastRenderedPageBreak/>
         <w:t>Aritmetica Binaria e Numeri Frazionari</w:t>
       </w:r>
     </w:p>
@@ -4323,6 +4580,7 @@
         </w:numPr>
       </w:pPr>
       <w:r>
+        <w:lastRenderedPageBreak/>
         <w:t>Colonna 1 (più a destra): 0 + 1 = 1</w:t>
       </w:r>
     </w:p>
@@ -4654,7 +4912,6 @@
           <w:bCs/>
           <w:color w:val="EE0000"/>
         </w:rPr>
-        <w:lastRenderedPageBreak/>
         <w:t>8. Rappresentazione degli interi (complemento a due e eccesso)</w:t>
       </w:r>
     </w:p>
@@ -4839,6 +5096,7 @@
     </w:p>
     <w:p>
       <w:r>
+        <w:lastRenderedPageBreak/>
         <w:t>La sequenza composta da tutti 1 (1111) rappresenta il valore -1, e i numeri negativi successivi procedono a ritroso in binario fino a raggiungere la configurazione con un 1 seguito da tutti 0 (1000, che equivale a -8). Poiché lo zero viene conteggiato nell'intervallo non negativo, un sistema a n bit genera un intervallo asimmetrico compreso tra -2</w:t>
       </w:r>
       <w:r>
@@ -5171,7 +5429,6 @@
     </w:p>
     <w:p>
       <w:r>
-        <w:lastRenderedPageBreak/>
         <w:t>Considerando ad esempio la sottrazione 7 - 5 in un sistema a 4 bit, il minuendo +7 equivale alla stringa 0111. Il sottrando +5 (0101) viene convertito nel suo opposto -5 (1011). Eseguendo la somma binaria tra 0111 e 1011, si ottiene la sequenza a 5 bit 10010. Troncando il quinto bit di riporto a sinistra (1), la macchina trattiene la stringa a 4 bit 0010, che corrisponde esattamente al risultato corretto +2 in notazione decimale.</w:t>
       </w:r>
     </w:p>
@@ -5330,6 +5587,7 @@
         </w:numPr>
       </w:pPr>
       <w:r>
+        <w:lastRenderedPageBreak/>
         <w:t xml:space="preserve">Se la </w:t>
       </w:r>
       <w:r>
@@ -5687,7 +5945,6 @@
           <w:b/>
           <w:bCs/>
         </w:rPr>
-        <w:lastRenderedPageBreak/>
         <w:t>Bit di segno (Sign Bit - 1 bit)</w:t>
       </w:r>
       <w:r>
@@ -5845,6 +6102,7 @@
         <w:rPr>
           <w:noProof/>
         </w:rPr>
+        <w:lastRenderedPageBreak/>
         <w:drawing>
           <wp:inline distT="0" distB="0" distL="0" distR="0" wp14:anchorId="4BDC786E" wp14:editId="51C4663B">
             <wp:extent cx="5861050" cy="2807077"/>
@@ -6085,33 +6343,36 @@
     </w:p>
     <w:p>
       <w:r>
+        <w:t xml:space="preserve">Un'ulteriore sorgente di errore risiede negli </w:t>
+      </w:r>
+      <w:r>
+        <w:rPr>
+          <w:b/>
+          <w:bCs/>
+        </w:rPr>
+        <w:t>sviluppi periodici non terminanti</w:t>
+      </w:r>
+      <w:r>
+        <w:t>. Proprio come nel sistema decimale la frazione 1/3 genera una sequenza infinita di cifre, nel sistema binario molte frazioni decimali apparentemente semplici non possiedono una rappresentazione finita. Il valore decimale 1/10 (0,1), ad esempio, si trasforma in binario in una frazione periodica infinita che non può essere memorizzata con esattezza assoluta. Nei software finanziari o contabili, questo dettaglio può causare imprecisioni nell'accumulo di importi monetari espressi in dollari e centesimi; per evitare tali errori, si preferisce lavorare direttamente con numeri interi (esprimendo gli importi in centesimi) tramite la notazione in complemento a due.</w:t>
+      </w:r>
+    </w:p>
+    <w:p>
+      <w:r>
+        <w:t xml:space="preserve">Le imprecisioni introdotte dai troncamenti generano una conseguenza algebrica importante: </w:t>
+      </w:r>
+      <w:r>
+        <w:rPr>
+          <w:b/>
+          <w:bCs/>
+        </w:rPr>
+        <w:t>l'addizione in virgola mobile non gode della proprietà associativa</w:t>
+      </w:r>
+      <w:r>
+        <w:t xml:space="preserve"> ((A + B) + C ≠ A + (B + C)). Quando si addiziona un numero molto grande a un numero molto piccolo, l'hardware trasla la mantissa del </w:t>
+      </w:r>
+      <w:r>
         <w:lastRenderedPageBreak/>
-        <w:t xml:space="preserve">Un'ulteriore sorgente di errore risiede negli </w:t>
-      </w:r>
-      <w:r>
-        <w:rPr>
-          <w:b/>
-          <w:bCs/>
-        </w:rPr>
-        <w:t>sviluppi periodici non terminanti</w:t>
-      </w:r>
-      <w:r>
-        <w:t>. Proprio come nel sistema decimale la frazione 1/3 genera una sequenza infinita di cifre, nel sistema binario molte frazioni decimali apparentemente semplici non possiedono una rappresentazione finita. Il valore decimale 1/10 (0,1), ad esempio, si trasforma in binario in una frazione periodica infinita che non può essere memorizzata con esattezza assoluta. Nei software finanziari o contabili, questo dettaglio può causare imprecisioni nell'accumulo di importi monetari espressi in dollari e centesimi; per evitare tali errori, si preferisce lavorare direttamente con numeri interi (esprimendo gli importi in centesimi) tramite la notazione in complemento a due.</w:t>
-      </w:r>
-    </w:p>
-    <w:p>
-      <w:r>
-        <w:t xml:space="preserve">Le imprecisioni introdotte dai troncamenti generano una conseguenza algebrica importante: </w:t>
-      </w:r>
-      <w:r>
-        <w:rPr>
-          <w:b/>
-          <w:bCs/>
-        </w:rPr>
-        <w:t>l'addizione in virgola mobile non gode della proprietà associativa</w:t>
-      </w:r>
-      <w:r>
-        <w:t xml:space="preserve"> ((A + B) + C ≠ A + (B + C)). Quando si addiziona un numero molto grande a un numero molto piccolo, l'hardware trasla la mantissa del valore piccolo verso destra per allineare gli esponenti; se la differenza tra gli ordini di grandezza è marcata, le cifre del numero piccolo scivolano fuori dalla mantissa e vengono azzerate dall'hardware. Di conseguenza, l'operazione 2 1/2 + 1/8 + 1/8 eseguita nell'ordine da sinistra a destra produce il risultato errato 2 1/2, poiché sommando 2 1/2 a 1/8 si subisce un troncamento che ripristina la somma a 2 1/2. Invertendo invece l'ordine e sommando prima i due valori piccoli tra loro (1/8 + 1/8 = 1/4), e aggiungendo solo successivamente il risultato a 2 1/2, si ottiene la risposta esatta 2 3/4.</w:t>
+        <w:t>valore piccolo verso destra per allineare gli esponenti; se la differenza tra gli ordini di grandezza è marcata, le cifre del numero piccolo scivolano fuori dalla mantissa e vengono azzerate dall'hardware. Di conseguenza, l'operazione 2 1/2 + 1/8 + 1/8 eseguita nell'ordine da sinistra a destra produce il risultato errato 2 1/2, poiché sommando 2 1/2 a 1/8 si subisce un troncamento che ripristina la somma a 2 1/2. Invertendo invece l'ordine e sommando prima i due valori piccoli tra loro (1/8 + 1/8 = 1/4), e aggiungendo solo successivamente il risultato a 2 1/2, si ottiene la risposta esatta 2 3/4.</w:t>
       </w:r>
     </w:p>
     <w:p>
@@ -6481,7 +6742,6 @@
           <w:b/>
           <w:bCs/>
         </w:rPr>
-        <w:lastRenderedPageBreak/>
         <w:t>Run-Length Encoding (RLE)</w:t>
       </w:r>
       <w:r>
@@ -6589,6 +6849,7 @@
           <w:b/>
           <w:bCs/>
         </w:rPr>
+        <w:lastRenderedPageBreak/>
         <w:t>Codifica Relativa o Differenziale</w:t>
       </w:r>
       <w:r>
@@ -7031,11 +7292,7 @@
         <w:t>JPEG Baseline Standard</w:t>
       </w:r>
       <w:r>
-        <w:t xml:space="preserve"> </w:t>
-      </w:r>
-      <w:r>
-        <w:lastRenderedPageBreak/>
-        <w:t>(</w:t>
+        <w:t xml:space="preserve"> (</w:t>
       </w:r>
       <w:r>
         <w:rPr>
@@ -7100,23 +7357,7 @@
           <w:b/>
           <w:bCs/>
         </w:rPr>
-        <w:t>Formato TIFF (</w:t>
-      </w:r>
-      <w:proofErr w:type="spellStart"/>
-      <w:r>
-        <w:rPr>
-          <w:b/>
-          <w:bCs/>
-        </w:rPr>
-        <w:t>Tagged</w:t>
-      </w:r>
-      <w:proofErr w:type="spellEnd"/>
-      <w:r>
-        <w:rPr>
-          <w:b/>
-          <w:bCs/>
-        </w:rPr>
-        <w:t xml:space="preserve"> Image File Format)</w:t>
+        <w:t>Formato TIFF (Tagged Image File Format)</w:t>
       </w:r>
       <w:r>
         <w:t xml:space="preserve">: utilizzato principalmente per </w:t>
@@ -7216,6 +7457,7 @@
         <w:rPr>
           <w:highlight w:val="yellow"/>
         </w:rPr>
+        <w:lastRenderedPageBreak/>
         <w:t>fotogrammi intermedi</w:t>
       </w:r>
       <w:r>
@@ -7438,21 +7680,12 @@
       <w:r>
         <w:t xml:space="preserve"> (</w:t>
       </w:r>
-      <w:proofErr w:type="spellStart"/>
       <w:r>
         <w:rPr>
           <w:i/>
           <w:iCs/>
         </w:rPr>
-        <w:t>parity</w:t>
-      </w:r>
-      <w:proofErr w:type="spellEnd"/>
-      <w:r>
-        <w:rPr>
-          <w:i/>
-          <w:iCs/>
-        </w:rPr>
-        <w:t xml:space="preserve"> bit</w:t>
+        <w:t>parity bit</w:t>
       </w:r>
       <w:r>
         <w:t xml:space="preserve">), a ciascun pattern di dati (ad esempio portando i codici ASCII da 8 a 9 bit), si progetta il sistema in modo che </w:t>
@@ -7549,111 +7782,108 @@
         <w:t>RAM</w:t>
       </w:r>
       <w:r>
-        <w:t xml:space="preserve"> per sistemi ad alta affidabilità. Sebbene siano concepite per gestire celle da un byte (8 bit), fisicamente queste memorie dispongono di celle a 9 bit. Durante le operazioni di scrittura, il circuito calcola e memorizza </w:t>
-      </w:r>
-      <w:r>
+        <w:t xml:space="preserve"> per sistemi ad alta affidabilità. Sebbene siano concepite per gestire celle da un byte (8 bit), fisicamente queste memorie dispongono di celle a 9 bit. Durante le operazioni di scrittura, il circuito calcola e memorizza il bit di parità; in fase di lettura, la memoria verifica il vincolo di parità sul pattern a 9 bit e, se non riscontra anomalie, rimuove il bit di controllo restituendo al processore i soli 8 bit di dati originali.</w:t>
+      </w:r>
+    </w:p>
+    <w:p>
+      <w:r>
+        <w:rPr>
+          <w:highlight w:val="yellow"/>
+        </w:rPr>
+        <w:t>Nonostante l'efficienza, la parità semplice presenta un limite strutturale</w:t>
+      </w:r>
+      <w:r>
+        <w:t xml:space="preserve">: essa </w:t>
+      </w:r>
+      <w:r>
+        <w:rPr>
+          <w:b/>
+          <w:bCs/>
+          <w:highlight w:val="yellow"/>
+        </w:rPr>
+        <w:t>non è in grado di rilevare un numero pari di errori simultanei</w:t>
+      </w:r>
+      <w:r>
+        <w:t xml:space="preserve">. Se all'interno della medesima </w:t>
+      </w:r>
+      <w:r>
+        <w:rPr>
+          <w:highlight w:val="yellow"/>
+        </w:rPr>
+        <w:t>stringa si verificano due o quattro inversioni di bit</w:t>
+      </w:r>
+      <w:r>
+        <w:t xml:space="preserve">, il conteggio complessivo della parità rimane inalterato e l'errore sfugge al controllo. Per proteggere sequenze di dati molto lunghe (come i settori dei dischi magnetici), </w:t>
+      </w:r>
+      <w:r>
+        <w:rPr>
+          <w:highlight w:val="yellow"/>
+        </w:rPr>
+        <w:t xml:space="preserve">si ricorre quindi a insiemi di bit di controllo associati a bit distribuiti lungo tutto il blocco, noti come </w:t>
+      </w:r>
+      <w:r>
+        <w:rPr>
+          <w:b/>
+          <w:bCs/>
+          <w:highlight w:val="yellow"/>
+        </w:rPr>
+        <w:t>checkbyte</w:t>
+      </w:r>
+      <w:r>
+        <w:rPr>
+          <w:highlight w:val="yellow"/>
+        </w:rPr>
+        <w:t xml:space="preserve">, </w:t>
+      </w:r>
+      <w:r>
+        <w:rPr>
+          <w:b/>
+          <w:bCs/>
+          <w:highlight w:val="yellow"/>
+        </w:rPr>
+        <w:t>checksum</w:t>
+      </w:r>
+      <w:r>
+        <w:rPr>
+          <w:highlight w:val="yellow"/>
+        </w:rPr>
+        <w:t xml:space="preserve"> o </w:t>
+      </w:r>
+      <w:r>
+        <w:rPr>
+          <w:b/>
+          <w:bCs/>
+          <w:highlight w:val="yellow"/>
+        </w:rPr>
+        <w:t>CRC</w:t>
+      </w:r>
+      <w:r>
+        <w:rPr>
+          <w:b/>
+          <w:bCs/>
+        </w:rPr>
+        <w:t xml:space="preserve"> (Cyclic Redundancy Check)</w:t>
+      </w:r>
+      <w:r>
+        <w:t>.</w:t>
+      </w:r>
+    </w:p>
+    <w:p>
+      <w:pPr>
+        <w:pStyle w:val="Titolo2"/>
+        <w:rPr>
+          <w:b/>
+          <w:bCs/>
+          <w:color w:val="E97132" w:themeColor="accent2"/>
+        </w:rPr>
+      </w:pPr>
+      <w:r>
+        <w:rPr>
+          <w:b/>
+          <w:bCs/>
+          <w:color w:val="E97132" w:themeColor="accent2"/>
+        </w:rPr>
         <w:lastRenderedPageBreak/>
-        <w:t>il bit di parità; in fase di lettura, la memoria verifica il vincolo di parità sul pattern a 9 bit e, se non riscontra anomalie, rimuove il bit di controllo restituendo al processore i soli 8 bit di dati originali.</w:t>
-      </w:r>
-    </w:p>
-    <w:p>
-      <w:r>
-        <w:rPr>
-          <w:highlight w:val="yellow"/>
-        </w:rPr>
-        <w:t>Nonostante l'efficienza, la parità semplice presenta un limite strutturale</w:t>
-      </w:r>
-      <w:r>
-        <w:t xml:space="preserve">: essa </w:t>
-      </w:r>
-      <w:r>
-        <w:rPr>
-          <w:b/>
-          <w:bCs/>
-          <w:highlight w:val="yellow"/>
-        </w:rPr>
-        <w:t>non è in grado di rilevare un numero pari di errori simultanei</w:t>
-      </w:r>
-      <w:r>
-        <w:t xml:space="preserve">. Se all'interno della medesima </w:t>
-      </w:r>
-      <w:r>
-        <w:rPr>
-          <w:highlight w:val="yellow"/>
-        </w:rPr>
-        <w:t>stringa si verificano due o quattro inversioni di bit</w:t>
-      </w:r>
-      <w:r>
-        <w:t xml:space="preserve">, il conteggio complessivo della parità rimane inalterato e l'errore sfugge al controllo. Per proteggere sequenze di dati molto lunghe (come i settori dei dischi magnetici), </w:t>
-      </w:r>
-      <w:r>
-        <w:rPr>
-          <w:highlight w:val="yellow"/>
-        </w:rPr>
-        <w:t xml:space="preserve">si ricorre quindi a insiemi di bit di controllo associati a bit distribuiti lungo tutto il blocco, noti come </w:t>
-      </w:r>
-      <w:r>
-        <w:rPr>
-          <w:b/>
-          <w:bCs/>
-          <w:highlight w:val="yellow"/>
-        </w:rPr>
-        <w:t>checkbyte</w:t>
-      </w:r>
-      <w:r>
-        <w:rPr>
-          <w:highlight w:val="yellow"/>
-        </w:rPr>
-        <w:t xml:space="preserve">, </w:t>
-      </w:r>
-      <w:r>
-        <w:rPr>
-          <w:b/>
-          <w:bCs/>
-          <w:highlight w:val="yellow"/>
-        </w:rPr>
-        <w:t>checksum</w:t>
-      </w:r>
-      <w:r>
-        <w:rPr>
-          <w:highlight w:val="yellow"/>
-        </w:rPr>
-        <w:t xml:space="preserve"> o </w:t>
-      </w:r>
-      <w:r>
-        <w:rPr>
-          <w:b/>
-          <w:bCs/>
-          <w:highlight w:val="yellow"/>
-        </w:rPr>
-        <w:t>CRC</w:t>
-      </w:r>
-      <w:r>
-        <w:rPr>
-          <w:b/>
-          <w:bCs/>
-        </w:rPr>
-        <w:t xml:space="preserve"> (Cyclic Redundancy Check)</w:t>
-      </w:r>
-      <w:r>
-        <w:t>.</w:t>
-      </w:r>
-    </w:p>
-    <w:p>
-      <w:pPr>
-        <w:pStyle w:val="Titolo2"/>
-        <w:rPr>
-          <w:b/>
-          <w:bCs/>
-          <w:color w:val="E97132" w:themeColor="accent2"/>
-        </w:rPr>
-      </w:pPr>
-      <w:r>
-        <w:rPr>
-          <w:b/>
-          <w:bCs/>
-          <w:color w:val="E97132" w:themeColor="accent2"/>
-        </w:rPr>
         <w:t>Codici di Correzione degli Errori e Distanza di Hamming</w:t>
       </w:r>
     </w:p>

</xml_diff>

<commit_message>
Aggiornamento serale: evidenziazioni (Fondamenti tutto studiato), STATO, piano di domani
Co-Authored-By: Claude Sonnet 5.5 <noreply@anthropic.com>
</commit_message>
<xml_diff>
--- a/Riassunto Fondamenti Informatica.docx
+++ b/Riassunto Fondamenti Informatica.docx
@@ -3200,35 +3200,18 @@
           <w:bCs/>
           <w:color w:val="E97132" w:themeColor="accent2"/>
         </w:rPr>
-        <w:t>Rappresentazione del Testo e dei Valori Numerici</w:t>
-      </w:r>
-    </w:p>
-    <w:p>
-      <w:r>
-        <w:t>La codifica del testo (codice ASCII, estensioni ISO, Unicode e UTF-8) è trattata nel capitolo 4: ogni simbolo è associato a uno specifico pattern di bit.</w:t>
-      </w:r>
-    </w:p>
-    <w:p>
-      <w:pPr>
-        <w:pStyle w:val="Titolo2"/>
-        <w:rPr>
-          <w:b/>
-          <w:bCs/>
-          <w:color w:val="E97132" w:themeColor="accent2"/>
-        </w:rPr>
-      </w:pPr>
-      <w:r>
-        <w:rPr>
-          <w:b/>
-          <w:bCs/>
-          <w:color w:val="E97132" w:themeColor="accent2"/>
-        </w:rPr>
         <w:t>File di Testo Semplici vs Documenti di Word Processing</w:t>
       </w:r>
     </w:p>
     <w:p>
       <w:r>
-        <w:t>È fondamentale distinguere tra due categorie di file contenenti testo:</w:t>
+        <w:t xml:space="preserve">È fondamentale distinguere tra </w:t>
+      </w:r>
+      <w:r>
+        <w:rPr>
+          <w:highlight w:val="yellow"/>
+        </w:rPr>
+        <w:t>due categorie di file contenenti testo:</w:t>
       </w:r>
     </w:p>
     <w:p>
@@ -3246,7 +3229,16 @@
         <w:t>Text File (File di testo puro)</w:t>
       </w:r>
       <w:r>
-        <w:t>: costituiti esclusivamente dalla sequenza di caratteri codificati in ASCII o Unicode, gestibili tramite editor di testo semplice (come Notepad).</w:t>
+        <w:t xml:space="preserve">: costituiti </w:t>
+      </w:r>
+      <w:r>
+        <w:rPr>
+          <w:highlight w:val="yellow"/>
+        </w:rPr>
+        <w:t>esclusivamente dalla sequenza di caratteri codificati in ASCII o Unicode</w:t>
+      </w:r>
+      <w:r>
+        <w:t>, gestibili tramite editor di testo semplice (come Notepad).</w:t>
       </w:r>
     </w:p>
     <w:p>
@@ -3264,7 +3256,43 @@
         <w:t>Documenti di Word Processing</w:t>
       </w:r>
       <w:r>
-        <w:t>: prodotti da programmi come Microsoft Word, contengono oltre al testo una serie di codici proprietari complessi per memorizzare la formattazione (font, allineamenti, margini, stili).</w:t>
+        <w:t xml:space="preserve">: </w:t>
+      </w:r>
+      <w:r>
+        <w:rPr>
+          <w:highlight w:val="yellow"/>
+        </w:rPr>
+        <w:t>prodotti da</w:t>
+      </w:r>
+      <w:r>
+        <w:t xml:space="preserve"> programmi come </w:t>
+      </w:r>
+      <w:r>
+        <w:rPr>
+          <w:highlight w:val="yellow"/>
+        </w:rPr>
+        <w:t>Microsoft Word</w:t>
+      </w:r>
+      <w:r>
+        <w:t xml:space="preserve">, </w:t>
+      </w:r>
+      <w:r>
+        <w:rPr>
+          <w:highlight w:val="yellow"/>
+        </w:rPr>
+        <w:t>contengono</w:t>
+      </w:r>
+      <w:r>
+        <w:t xml:space="preserve"> oltre al testo </w:t>
+      </w:r>
+      <w:r>
+        <w:rPr>
+          <w:highlight w:val="yellow"/>
+        </w:rPr>
+        <w:t>una serie di codici proprietari complessi per memorizzare la formattazione</w:t>
+      </w:r>
+      <w:r>
+        <w:t xml:space="preserve"> (font, allineamenti, margini, stili).</w:t>
       </w:r>
     </w:p>
     <w:p>
@@ -3287,6 +3315,9 @@
     </w:p>
     <w:p>
       <w:r>
+        <w:rPr>
+          <w:highlight w:val="yellow"/>
+        </w:rPr>
         <w:t>Memorizzare i numeri sotto forma di caratteri ASCII o Unicode è estremamente inefficiente dal punto di vista dello spazio di archiviazione.</w:t>
       </w:r>
     </w:p>
@@ -3311,17 +3342,45 @@
         <w:t>Efficienza della Notazione Binaria</w:t>
       </w:r>
       <w:r>
-        <w:t xml:space="preserve">: codificando il valore numerico direttamente in </w:t>
-      </w:r>
-      <w:r>
-        <w:rPr>
-          <w:b/>
-          <w:bCs/>
+        <w:t xml:space="preserve">: </w:t>
+      </w:r>
+      <w:r>
+        <w:rPr>
+          <w:highlight w:val="yellow"/>
+        </w:rPr>
+        <w:t xml:space="preserve">codificando il valore numerico direttamente in </w:t>
+      </w:r>
+      <w:r>
+        <w:rPr>
+          <w:b/>
+          <w:bCs/>
+          <w:highlight w:val="yellow"/>
         </w:rPr>
         <w:t>notazione binaria</w:t>
       </w:r>
       <w:r>
-        <w:t>, gli stessi 16 bit consentono di rappresentare qualsiasi numero intero compreso tra 0 e 65.535. Per questo motivo, nei calcolatori le quantità numeriche vengono sempre memorizzate tramite rappresentazioni binarie dedicate.</w:t>
+        <w:t xml:space="preserve">, gli stessi </w:t>
+      </w:r>
+      <w:r>
+        <w:rPr>
+          <w:highlight w:val="yellow"/>
+        </w:rPr>
+        <w:t>16 bit consentono di rappresentare qualsiasi numero intero compreso tra 0 e 65</w:t>
+      </w:r>
+      <w:r>
+        <w:rPr>
+          <w:highlight w:val="yellow"/>
+        </w:rPr>
+        <w:t xml:space="preserve"> </w:t>
+      </w:r>
+      <w:r>
+        <w:rPr>
+          <w:highlight w:val="yellow"/>
+        </w:rPr>
+        <w:t>535</w:t>
+      </w:r>
+      <w:r>
+        <w:t>. Per questo motivo, nei calcolatori le quantità numeriche vengono sempre memorizzate tramite rappresentazioni binarie dedicate.</w:t>
       </w:r>
     </w:p>
     <w:p>
@@ -3339,30 +3398,39 @@
           <w:bCs/>
           <w:color w:val="E97132" w:themeColor="accent2"/>
         </w:rPr>
+        <w:t>Rappresentazione delle Immagini (Bitmap e Grafica Vettoriale)</w:t>
+      </w:r>
+    </w:p>
+    <w:p>
+      <w:r>
+        <w:t xml:space="preserve">La </w:t>
+      </w:r>
+      <w:r>
+        <w:rPr>
+          <w:highlight w:val="yellow"/>
+        </w:rPr>
+        <w:t>digitalizzazione delle immagini visive richiede la trasformazione delle informazioni spaziali e cromatiche in sequenze di bit</w:t>
+      </w:r>
+      <w:r>
+        <w:t>. Esistono due approcci fondamentali:</w:t>
+      </w:r>
+    </w:p>
+    <w:p>
+      <w:pPr>
+        <w:pStyle w:val="Titolo2"/>
+        <w:rPr>
+          <w:b/>
+          <w:bCs/>
+          <w:color w:val="E97132" w:themeColor="accent2"/>
+        </w:rPr>
+      </w:pPr>
+      <w:r>
+        <w:rPr>
+          <w:b/>
+          <w:bCs/>
+          <w:color w:val="E97132" w:themeColor="accent2"/>
+        </w:rPr>
         <w:lastRenderedPageBreak/>
-        <w:t>Rappresentazione delle Immagini (Bitmap e Grafica Vettoriale)</w:t>
-      </w:r>
-    </w:p>
-    <w:p>
-      <w:r>
-        <w:t>La digitalizzazione delle immagini visive richiede la trasformazione delle informazioni spaziali e cromatiche in sequenze di bit. Esistono due approcci fondamentali:</w:t>
-      </w:r>
-    </w:p>
-    <w:p>
-      <w:pPr>
-        <w:pStyle w:val="Titolo2"/>
-        <w:rPr>
-          <w:b/>
-          <w:bCs/>
-          <w:color w:val="E97132" w:themeColor="accent2"/>
-        </w:rPr>
-      </w:pPr>
-      <w:r>
-        <w:rPr>
-          <w:b/>
-          <w:bCs/>
-          <w:color w:val="E97132" w:themeColor="accent2"/>
-        </w:rPr>
         <w:t>Grafica Bitmap (Raster)</w:t>
       </w:r>
     </w:p>
@@ -3374,16 +3442,24 @@
         <w:rPr>
           <w:b/>
           <w:bCs/>
+          <w:highlight w:val="yellow"/>
         </w:rPr>
         <w:t>bitmap</w:t>
       </w:r>
       <w:r>
-        <w:t xml:space="preserve">, la figura viene suddivisa in una griglia regolare di piccoli punti detti </w:t>
-      </w:r>
-      <w:r>
-        <w:rPr>
-          <w:b/>
-          <w:bCs/>
+        <w:t xml:space="preserve">, la </w:t>
+      </w:r>
+      <w:r>
+        <w:rPr>
+          <w:highlight w:val="yellow"/>
+        </w:rPr>
+        <w:t xml:space="preserve">figura viene suddivisa in una griglia regolare di piccoli punti detti </w:t>
+      </w:r>
+      <w:r>
+        <w:rPr>
+          <w:b/>
+          <w:bCs/>
+          <w:highlight w:val="yellow"/>
         </w:rPr>
         <w:t>pixel</w:t>
       </w:r>
@@ -3416,7 +3492,16 @@
         <w:t>Immagini in Bianco e Nero</w:t>
       </w:r>
       <w:r>
-        <w:t>: ogni pixel è rappresentato da un singolo bit (0 per il bianco, 1 per il nero), tecnica adottata ad esempio dai fax.</w:t>
+        <w:t xml:space="preserve">: </w:t>
+      </w:r>
+      <w:r>
+        <w:rPr>
+          <w:highlight w:val="yellow"/>
+        </w:rPr>
+        <w:t>ogni pixel è rappresentato da un singolo bit</w:t>
+      </w:r>
+      <w:r>
+        <w:t xml:space="preserve"> (0 per il bianco, 1 per il nero), tecnica adottata ad esempio dai fax.</w:t>
       </w:r>
     </w:p>
     <w:p>
@@ -3434,17 +3519,30 @@
         <w:t>Scala di Grigi</w:t>
       </w:r>
       <w:r>
-        <w:t xml:space="preserve">: ciascun pixel occupa tipicamente </w:t>
-      </w:r>
-      <w:r>
-        <w:rPr>
-          <w:b/>
-          <w:bCs/>
+        <w:t xml:space="preserve">: </w:t>
+      </w:r>
+      <w:r>
+        <w:rPr>
+          <w:highlight w:val="yellow"/>
+        </w:rPr>
+        <w:t xml:space="preserve">ciascun pixel occupa tipicamente </w:t>
+      </w:r>
+      <w:r>
+        <w:rPr>
+          <w:b/>
+          <w:bCs/>
+          <w:highlight w:val="yellow"/>
         </w:rPr>
         <w:t>1 byte (8 bit)</w:t>
       </w:r>
       <w:r>
-        <w:t>, consentendo di distinguere 256 diverse sfumature di grigio.</w:t>
+        <w:rPr>
+          <w:highlight w:val="yellow"/>
+        </w:rPr>
+        <w:t>, consentendo di distinguere 256 diverse sfumature di grigio</w:t>
+      </w:r>
+      <w:r>
+        <w:t>.</w:t>
       </w:r>
     </w:p>
     <w:p>
@@ -3462,7 +3560,25 @@
         <w:t>Immagini a Colori (RGB)</w:t>
       </w:r>
       <w:r>
-        <w:t>: ogni pixel richiede 3 byte (24 bit), con oltre 16,7 milioni di colori; il modello è descritto nel capitolo 4.</w:t>
+        <w:t xml:space="preserve">: </w:t>
+      </w:r>
+      <w:r>
+        <w:rPr>
+          <w:highlight w:val="yellow"/>
+        </w:rPr>
+        <w:t>ogni pixel richiede 3 byte</w:t>
+      </w:r>
+      <w:r>
+        <w:t xml:space="preserve"> (24 bit), con </w:t>
+      </w:r>
+      <w:r>
+        <w:rPr>
+          <w:highlight w:val="yellow"/>
+        </w:rPr>
+        <w:t>oltre 16,7 milioni di colori</w:t>
+      </w:r>
+      <w:r>
+        <w:t>; il modello è descritto nel capitolo 4.</w:t>
       </w:r>
     </w:p>
     <w:p>
@@ -3480,33 +3596,42 @@
         <w:t>Luminanza e Crominanza</w:t>
       </w:r>
       <w:r>
-        <w:t xml:space="preserve">: un'alternativa al modello RGB consiste nello scomporre il pixel in una componente di </w:t>
-      </w:r>
-      <w:r>
-        <w:rPr>
-          <w:b/>
-          <w:bCs/>
+        <w:t xml:space="preserve">: </w:t>
+      </w:r>
+      <w:r>
+        <w:rPr>
+          <w:highlight w:val="yellow"/>
+        </w:rPr>
+        <w:t xml:space="preserve">un'alternativa al modello RGB consiste nello scomporre il pixel in una componente di </w:t>
+      </w:r>
+      <w:r>
+        <w:rPr>
+          <w:b/>
+          <w:bCs/>
+          <w:highlight w:val="yellow"/>
         </w:rPr>
         <w:t>Luminanza</w:t>
       </w:r>
       <w:r>
-        <w:t xml:space="preserve"> (luminosità o quantità di luce bianca) e due componenti di </w:t>
-      </w:r>
-      <w:r>
-        <w:rPr>
-          <w:b/>
-          <w:bCs/>
+        <w:t xml:space="preserve"> (luminosità o quantità di luce bianca) </w:t>
+      </w:r>
+      <w:r>
+        <w:rPr>
+          <w:highlight w:val="yellow"/>
+        </w:rPr>
+        <w:t xml:space="preserve">e due componenti di </w:t>
+      </w:r>
+      <w:r>
+        <w:rPr>
+          <w:b/>
+          <w:bCs/>
+          <w:highlight w:val="yellow"/>
         </w:rPr>
         <w:t>Crominanza</w:t>
       </w:r>
       <w:r>
         <w:t xml:space="preserve"> (differenza cromatica del blu e del rosso). Nata per la trasmissione della TV a colori compatibile con i televisori in bianco e nero, questa scomposizione è sfruttata dai moderni algoritmi di compressione.</w:t>
       </w:r>
-    </w:p>
-    <w:p>
-      <w:pPr>
-        <w:ind w:left="720"/>
-      </w:pPr>
     </w:p>
     <w:p>
       <w:pPr>
@@ -3541,7 +3666,16 @@
         <w:t>Il problema del ridimensionamento (Digital Zoom)</w:t>
       </w:r>
       <w:r>
-        <w:t>: le immagini bitmap non si prestano a ingrandimenti arbitrari; all'aumentare delle dimensioni i pixel diventano visibili rendendo l'immagine sgranata ("zoom digitale").</w:t>
+        <w:t xml:space="preserve">: le immagini bitmap non si prestano a ingrandimenti arbitrari; </w:t>
+      </w:r>
+      <w:r>
+        <w:rPr>
+          <w:highlight w:val="yellow"/>
+        </w:rPr>
+        <w:t>all'aumentare delle dimensioni i pixel diventano visibili rendendo l'immagine sgranata</w:t>
+      </w:r>
+      <w:r>
+        <w:t xml:space="preserve"> ("zoom digitale").</w:t>
       </w:r>
     </w:p>
     <w:p>
@@ -3559,12 +3693,19 @@
         <w:t>Grafica Vettoriale</w:t>
       </w:r>
       <w:r>
-        <w:t xml:space="preserve">: evita il problema del ridimensionamento descrivendo l'immagine come una collezione di </w:t>
-      </w:r>
-      <w:r>
-        <w:rPr>
-          <w:b/>
-          <w:bCs/>
+        <w:t xml:space="preserve">: </w:t>
+      </w:r>
+      <w:r>
+        <w:rPr>
+          <w:highlight w:val="yellow"/>
+        </w:rPr>
+        <w:t xml:space="preserve">evita il problema del ridimensionamento descrivendo l'immagine come una collezione di </w:t>
+      </w:r>
+      <w:r>
+        <w:rPr>
+          <w:b/>
+          <w:bCs/>
+          <w:highlight w:val="yellow"/>
         </w:rPr>
         <w:t>strutture geometriche</w:t>
       </w:r>
@@ -3587,7 +3728,16 @@
         <w:t>Applicazioni della Grafica Vettoriale</w:t>
       </w:r>
       <w:r>
-        <w:t xml:space="preserve">: è lo standard utilizzato per i font scalabili dei sistemi di scrittura come </w:t>
+        <w:t>: è lo st</w:t>
+      </w:r>
+      <w:r>
+        <w:rPr>
+          <w:highlight w:val="yellow"/>
+        </w:rPr>
+        <w:t>andard utilizzato per i font scalabili dei sistemi di scrittura</w:t>
+      </w:r>
+      <w:r>
+        <w:t xml:space="preserve"> come </w:t>
       </w:r>
       <w:r>
         <w:rPr>
@@ -3607,17 +3757,33 @@
         <w:t>PostScript</w:t>
       </w:r>
       <w:r>
-        <w:t xml:space="preserve"> (sviluppato da Adobe), per i disegni tecnici nei software </w:t>
-      </w:r>
-      <w:r>
-        <w:rPr>
-          <w:b/>
-          <w:bCs/>
+        <w:t xml:space="preserve"> (sviluppato da Adobe), per i </w:t>
+      </w:r>
+      <w:r>
+        <w:rPr>
+          <w:highlight w:val="yellow"/>
+        </w:rPr>
+        <w:t xml:space="preserve">disegni tecnici nei software </w:t>
+      </w:r>
+      <w:r>
+        <w:rPr>
+          <w:b/>
+          <w:bCs/>
+          <w:highlight w:val="yellow"/>
         </w:rPr>
         <w:t>CAD</w:t>
       </w:r>
       <w:r>
-        <w:t xml:space="preserve"> e nei programmi di grafica vettoriale, dove le forme rimangono modificabili e ridimensionabili all'infinito senza alcuna perdita di nitidezza.</w:t>
+        <w:t xml:space="preserve"> e nei </w:t>
+      </w:r>
+      <w:r>
+        <w:rPr>
+          <w:highlight w:val="yellow"/>
+        </w:rPr>
+        <w:t>programmi di grafica vettoriale</w:t>
+      </w:r>
+      <w:r>
+        <w:t>, dove le forme rimangono modificabili e ridimensionabili all'infinito senza alcuna perdita di nitidezza.</w:t>
       </w:r>
     </w:p>
     <w:p>
@@ -3640,7 +3806,25 @@
     </w:p>
     <w:p>
       <w:r>
-        <w:t>La digitalizzazione dei segnali acustici analogici (onde sonore) viene gestita mediante due strategie completamente differenti:</w:t>
+        <w:t xml:space="preserve">La </w:t>
+      </w:r>
+      <w:r>
+        <w:rPr>
+          <w:highlight w:val="yellow"/>
+        </w:rPr>
+        <w:t>digitalizzazione dei segnali acustici analogici</w:t>
+      </w:r>
+      <w:r>
+        <w:t xml:space="preserve"> (onde sonore) </w:t>
+      </w:r>
+      <w:r>
+        <w:rPr>
+          <w:highlight w:val="yellow"/>
+        </w:rPr>
+        <w:t>viene gestita mediante due strategie completamente differenti</w:t>
+      </w:r>
+      <w:r>
+        <w:t>:</w:t>
       </w:r>
     </w:p>
     <w:p>
@@ -3660,17 +3844,36 @@
     </w:p>
     <w:p>
       <w:r>
-        <w:t xml:space="preserve">Il metodo generale consiste nel misurare l'ampiezza dell'onda sonora a intervalli di tempo regolari (operazione detta </w:t>
-      </w:r>
-      <w:r>
-        <w:rPr>
-          <w:b/>
-          <w:bCs/>
+        <w:t xml:space="preserve">Il </w:t>
+      </w:r>
+      <w:r>
+        <w:rPr>
+          <w:highlight w:val="yellow"/>
+        </w:rPr>
+        <w:t>metodo generale consiste nel misurare l'ampiezza dell'onda sonora a intervalli di tempo regolari</w:t>
+      </w:r>
+      <w:r>
+        <w:t xml:space="preserve"> (operazione detta </w:t>
+      </w:r>
+      <w:r>
+        <w:rPr>
+          <w:b/>
+          <w:bCs/>
+          <w:highlight w:val="yellow"/>
         </w:rPr>
         <w:t>campionamento</w:t>
       </w:r>
       <w:r>
-        <w:t>) e registrare la sequenza dei valori numerici ottenuti.</w:t>
+        <w:t xml:space="preserve">) e </w:t>
+      </w:r>
+      <w:r>
+        <w:rPr>
+          <w:highlight w:val="yellow"/>
+        </w:rPr>
+        <w:t>registrare la sequenza dei valori numerici ottenuti</w:t>
+      </w:r>
+      <w:r>
+        <w:t>.</w:t>
       </w:r>
     </w:p>
     <w:p>
@@ -3697,7 +3900,6 @@
           <w:i/>
           <w:iCs/>
         </w:rPr>
-        <w:lastRenderedPageBreak/>
         <w:t>Telefonia vocale</w:t>
       </w:r>
       <w:r>
@@ -3747,17 +3949,25 @@
           <w:bCs/>
           <w:color w:val="E97132" w:themeColor="accent2"/>
         </w:rPr>
+        <w:lastRenderedPageBreak/>
         <w:t>Sintesi Musicale e Standard MIDI</w:t>
       </w:r>
     </w:p>
     <w:p>
       <w:r>
-        <w:t xml:space="preserve">Per evitare l'enorme occupazione di memoria richiesta dal campionamento dell'onda sonora grezza, lo standard </w:t>
-      </w:r>
-      <w:r>
-        <w:rPr>
-          <w:b/>
-          <w:bCs/>
+        <w:t xml:space="preserve">Per </w:t>
+      </w:r>
+      <w:r>
+        <w:rPr>
+          <w:highlight w:val="yellow"/>
+        </w:rPr>
+        <w:t xml:space="preserve">evitare l'enorme occupazione di memoria richiesta dal campionamento dell'onda sonora grezza, lo standard </w:t>
+      </w:r>
+      <w:r>
+        <w:rPr>
+          <w:b/>
+          <w:bCs/>
+          <w:highlight w:val="yellow"/>
         </w:rPr>
         <w:t>MIDI</w:t>
       </w:r>
@@ -3772,17 +3982,30 @@
         <w:t>Musical Instrument Digital Interface</w:t>
       </w:r>
       <w:r>
-        <w:t xml:space="preserve">) adotta un approccio basato su </w:t>
-      </w:r>
-      <w:r>
-        <w:rPr>
-          <w:b/>
-          <w:bCs/>
+        <w:t xml:space="preserve">) adotta un </w:t>
+      </w:r>
+      <w:r>
+        <w:rPr>
+          <w:highlight w:val="yellow"/>
+        </w:rPr>
+        <w:t xml:space="preserve">approccio basato su </w:t>
+      </w:r>
+      <w:r>
+        <w:rPr>
+          <w:b/>
+          <w:bCs/>
+          <w:highlight w:val="yellow"/>
         </w:rPr>
         <w:t>istruzioni esecutive</w:t>
       </w:r>
       <w:r>
-        <w:t xml:space="preserve"> per sintetizzatori musicali.</w:t>
+        <w:rPr>
+          <w:highlight w:val="yellow"/>
+        </w:rPr>
+        <w:t xml:space="preserve"> per sintetizzatori musicali</w:t>
+      </w:r>
+      <w:r>
+        <w:t>.</w:t>
       </w:r>
     </w:p>
     <w:p>
@@ -3794,7 +4017,61 @@
         <w:t>Principio di funzionamento</w:t>
       </w:r>
       <w:r>
-        <w:t>: anziché registrare il suono prodotto, il formato MIDI memorizza lo "spartito digitale", ossia le informazioni su quale strumento deve suonare, quale nota eseguire, con quale intensità e per quale durata.</w:t>
+        <w:t xml:space="preserve">: </w:t>
+      </w:r>
+      <w:r>
+        <w:rPr>
+          <w:highlight w:val="yellow"/>
+        </w:rPr>
+        <w:t>anziché registrare il suono prodotto</w:t>
+      </w:r>
+      <w:r>
+        <w:t xml:space="preserve">, il formato MIDI </w:t>
+      </w:r>
+      <w:r>
+        <w:rPr>
+          <w:highlight w:val="yellow"/>
+        </w:rPr>
+        <w:t>memorizza lo "spartito digitale"</w:t>
+      </w:r>
+      <w:r>
+        <w:t xml:space="preserve">, ossia le </w:t>
+      </w:r>
+      <w:r>
+        <w:rPr>
+          <w:highlight w:val="yellow"/>
+        </w:rPr>
+        <w:t>informazioni su quale strumento deve suonare</w:t>
+      </w:r>
+      <w:r>
+        <w:t xml:space="preserve">, quale </w:t>
+      </w:r>
+      <w:r>
+        <w:rPr>
+          <w:highlight w:val="yellow"/>
+        </w:rPr>
+        <w:t>nota eseguire</w:t>
+      </w:r>
+      <w:r>
+        <w:t xml:space="preserve">, con quale </w:t>
+      </w:r>
+      <w:r>
+        <w:rPr>
+          <w:highlight w:val="yellow"/>
+        </w:rPr>
+        <w:t>intensità</w:t>
+      </w:r>
+      <w:r>
+        <w:t xml:space="preserve"> e per quale </w:t>
+      </w:r>
+      <w:r>
+        <w:rPr>
+          <w:highlight w:val="yellow"/>
+        </w:rPr>
+        <w:t>durata</w:t>
+      </w:r>
+      <w:r>
+        <w:t>.</w:t>
       </w:r>
     </w:p>
     <w:p>
@@ -3818,25 +4095,6 @@
       <w:r>
         <w:t>. Il file risulta minuscolo, anche se la resa acustica finale dipende dalla qualità dei timbri del sintetizzatore che lo riproduce.</w:t>
       </w:r>
-    </w:p>
-    <w:p/>
-    <w:p>
-      <w:pPr>
-        <w:rPr>
-          <w:b/>
-          <w:bCs/>
-          <w:color w:val="EE0000"/>
-        </w:rPr>
-      </w:pPr>
-    </w:p>
-    <w:p>
-      <w:pPr>
-        <w:rPr>
-          <w:b/>
-          <w:bCs/>
-          <w:color w:val="EE0000"/>
-        </w:rPr>
-      </w:pPr>
     </w:p>
     <w:p>
       <w:pPr>
@@ -3940,61 +4198,94 @@
         <w:t>Pesi delle posizioni</w:t>
       </w:r>
       <w:r>
-        <w:t>: partendo dalla cifra più a destra (peso 2</w:t>
-      </w:r>
-      <w:r>
-        <w:rPr>
+        <w:t xml:space="preserve">: </w:t>
+      </w:r>
+      <w:r>
+        <w:rPr>
+          <w:highlight w:val="yellow"/>
+        </w:rPr>
+        <w:t>partendo dalla cifra più a destra (peso 2</w:t>
+      </w:r>
+      <w:r>
+        <w:rPr>
+          <w:highlight w:val="yellow"/>
           <w:vertAlign w:val="superscript"/>
         </w:rPr>
         <w:t>0</w:t>
       </w:r>
       <w:r>
+        <w:rPr>
+          <w:highlight w:val="yellow"/>
+        </w:rPr>
         <w:t xml:space="preserve"> = 1), le posizioni successive verso sinistra rappresentano 2</w:t>
       </w:r>
       <w:r>
         <w:rPr>
+          <w:highlight w:val="yellow"/>
           <w:vertAlign w:val="superscript"/>
         </w:rPr>
         <w:t>1</w:t>
       </w:r>
       <w:r>
+        <w:rPr>
+          <w:highlight w:val="yellow"/>
+        </w:rPr>
         <w:t xml:space="preserve"> = 2, 2</w:t>
       </w:r>
       <w:r>
         <w:rPr>
+          <w:highlight w:val="yellow"/>
           <w:vertAlign w:val="superscript"/>
         </w:rPr>
         <w:t>2</w:t>
       </w:r>
       <w:r>
+        <w:rPr>
+          <w:highlight w:val="yellow"/>
+        </w:rPr>
         <w:t xml:space="preserve"> = 4, 2</w:t>
       </w:r>
       <w:r>
         <w:rPr>
+          <w:highlight w:val="yellow"/>
           <w:vertAlign w:val="superscript"/>
         </w:rPr>
         <w:t>3</w:t>
       </w:r>
       <w:r>
+        <w:rPr>
+          <w:highlight w:val="yellow"/>
+        </w:rPr>
         <w:t xml:space="preserve"> = 8, 2</w:t>
       </w:r>
       <w:r>
         <w:rPr>
+          <w:highlight w:val="yellow"/>
           <w:vertAlign w:val="superscript"/>
         </w:rPr>
         <w:t>4</w:t>
       </w:r>
       <w:r>
+        <w:rPr>
+          <w:highlight w:val="yellow"/>
+        </w:rPr>
         <w:t xml:space="preserve"> = 16, 2</w:t>
       </w:r>
       <w:r>
         <w:rPr>
+          <w:highlight w:val="yellow"/>
           <w:vertAlign w:val="superscript"/>
         </w:rPr>
         <w:t>5</w:t>
       </w:r>
       <w:r>
-        <w:t xml:space="preserve"> = 32, e così via.</w:t>
+        <w:rPr>
+          <w:highlight w:val="yellow"/>
+        </w:rPr>
+        <w:t xml:space="preserve"> = 32, e così via</w:t>
+      </w:r>
+      <w:r>
+        <w:t>.</w:t>
       </w:r>
     </w:p>
     <w:p>
@@ -4012,7 +4303,16 @@
         <w:t>Valore assoluto di una sequenza</w:t>
       </w:r>
       <w:r>
-        <w:t>: il valore decimale equivalente a una stringa binaria si ottiene moltiplicando ogni cifra per il peso della sua posizione e sommando i prodotti ottenuti. Poiché nel binario esistono solo 0 e 1, l'operazione si riduce semplicemente alla somma dei pesi corrispondenti alle posizioni occupate dal bit 1.</w:t>
+        <w:t xml:space="preserve">: il </w:t>
+      </w:r>
+      <w:r>
+        <w:rPr>
+          <w:highlight w:val="yellow"/>
+        </w:rPr>
+        <w:t>valore decimale equivalente a una stringa binaria si ottiene moltiplicando ogni cifra per il peso della sua posizione e sommando i prodotti ottenuti</w:t>
+      </w:r>
+      <w:r>
+        <w:t>. Poiché nel binario esistono solo 0 e 1, l'operazione si riduce semplicemente alla somma dei pesi corrispondenti alle posizioni occupate dal bit 1.</w:t>
       </w:r>
     </w:p>
     <w:p>
@@ -4112,7 +4412,6 @@
         </w:numPr>
       </w:pPr>
       <w:r>
-        <w:lastRenderedPageBreak/>
         <w:t>0 × 2</w:t>
       </w:r>
       <w:r>
@@ -4248,17 +4547,25 @@
           <w:bCs/>
           <w:color w:val="E97132" w:themeColor="accent2"/>
         </w:rPr>
+        <w:lastRenderedPageBreak/>
         <w:t>Conversione da Decimale a Binario (Algoritmo delle Divisioni Successive)</w:t>
       </w:r>
     </w:p>
     <w:p>
       <w:r>
-        <w:t>Per convertire un numero intero positivo dalla base 10 alla base 2 si applica l'</w:t>
-      </w:r>
-      <w:r>
-        <w:rPr>
-          <w:b/>
-          <w:bCs/>
+        <w:t xml:space="preserve">Per </w:t>
+      </w:r>
+      <w:r>
+        <w:rPr>
+          <w:highlight w:val="yellow"/>
+        </w:rPr>
+        <w:t>convertire un numero intero positivo dalla base 10 alla base 2 si applica l'</w:t>
+      </w:r>
+      <w:r>
+        <w:rPr>
+          <w:b/>
+          <w:bCs/>
+          <w:highlight w:val="yellow"/>
         </w:rPr>
         <w:t>algoritmo delle divisioni successive per 2</w:t>
       </w:r>
@@ -4292,12 +4599,16 @@
         </w:numPr>
       </w:pPr>
       <w:r>
+        <w:rPr>
+          <w:highlight w:val="yellow"/>
+        </w:rPr>
         <w:t xml:space="preserve">Si divide il numero decimale per 2, annotando il quoziente intero e il </w:t>
       </w:r>
       <w:r>
         <w:rPr>
           <w:b/>
           <w:bCs/>
+          <w:highlight w:val="yellow"/>
         </w:rPr>
         <w:t>resto</w:t>
       </w:r>
@@ -4313,7 +4624,13 @@
         </w:numPr>
       </w:pPr>
       <w:r>
-        <w:t>Finché il quoziente ottenuto è diverso da zero, si continua a dividere l'ultimo quoziente per 2 e a registrare il relativo resto.</w:t>
+        <w:rPr>
+          <w:highlight w:val="yellow"/>
+        </w:rPr>
+        <w:t>Finché il quoziente ottenuto è diverso da zero, si continua a dividere l'ultimo quoziente per 2 e a registrare il relativo resto</w:t>
+      </w:r>
+      <w:r>
+        <w:t>.</w:t>
       </w:r>
     </w:p>
     <w:p>
@@ -4324,7 +4641,16 @@
         </w:numPr>
       </w:pPr>
       <w:r>
-        <w:t>La rappresentazione binaria finale è data dalla sequenza dei resti letti in ordine inverso rispetto a come sono stati calcolati (dall'ultimo resto ottenuto fino al primo, ossia da destra verso sinistra).</w:t>
+        <w:t xml:space="preserve">La rappresentazione binaria finale è </w:t>
+      </w:r>
+      <w:r>
+        <w:rPr>
+          <w:highlight w:val="yellow"/>
+        </w:rPr>
+        <w:t>data dalla sequenza dei resti letti in ordine inverso rispetto a come sono stati calcolati</w:t>
+      </w:r>
+      <w:r>
+        <w:t xml:space="preserve"> (dall'ultimo resto ottenuto fino al primo, ossia da destra verso sinistra).</w:t>
       </w:r>
     </w:p>
     <w:p>
@@ -4482,7 +4808,22 @@
     </w:p>
     <w:p>
       <w:r>
-        <w:t>L'addizione in notazione binaria segue le stesse regole posizionali dell'addizione decimale (procedendo da destra verso sinistra e sommando colonna per colonna), ma impiega una tabella algebrica elementare basata su soli quattro casi fondamentali:</w:t>
+        <w:rPr>
+          <w:highlight w:val="yellow"/>
+        </w:rPr>
+        <w:t>L'addizione in notazione binaria segue le stesse regole posizionali dell'addizione decimale</w:t>
+      </w:r>
+      <w:r>
+        <w:t xml:space="preserve"> (procedendo da destra verso sinistra e sommando colonna per colonna), ma </w:t>
+      </w:r>
+      <w:r>
+        <w:rPr>
+          <w:highlight w:val="yellow"/>
+        </w:rPr>
+        <w:t>impiega una tabella algebrica elementare basata su soli quattro casi fondamentali</w:t>
+      </w:r>
+      <w:r>
+        <w:t>:</w:t>
       </w:r>
     </w:p>
     <w:p>
@@ -4580,7 +4921,6 @@
         </w:numPr>
       </w:pPr>
       <w:r>
-        <w:lastRenderedPageBreak/>
         <w:t>Colonna 1 (più a destra): 0 + 1 = 1</w:t>
       </w:r>
     </w:p>
@@ -4661,17 +5001,25 @@
           <w:bCs/>
           <w:color w:val="E97132" w:themeColor="accent2"/>
         </w:rPr>
+        <w:lastRenderedPageBreak/>
         <w:t>Rappresentazione dei Numeri Frazionari (Punto Radice)</w:t>
       </w:r>
     </w:p>
     <w:p>
       <w:r>
-        <w:t xml:space="preserve">Per estendere il sistema binario ai numeri reali o con virgola, si utilizza il </w:t>
-      </w:r>
-      <w:r>
-        <w:rPr>
-          <w:b/>
-          <w:bCs/>
+        <w:t xml:space="preserve">Per </w:t>
+      </w:r>
+      <w:r>
+        <w:rPr>
+          <w:highlight w:val="yellow"/>
+        </w:rPr>
+        <w:t xml:space="preserve">estendere il sistema binario ai numeri reali o con virgola, si utilizza il </w:t>
+      </w:r>
+      <w:r>
+        <w:rPr>
+          <w:b/>
+          <w:bCs/>
+          <w:highlight w:val="yellow"/>
         </w:rPr>
         <w:t>punto radice</w:t>
       </w:r>
@@ -5096,7 +5444,6 @@
     </w:p>
     <w:p>
       <w:r>
-        <w:lastRenderedPageBreak/>
         <w:t>La sequenza composta da tutti 1 (1111) rappresenta il valore -1, e i numeri negativi successivi procedono a ritroso in binario fino a raggiungere la configurazione con un 1 seguito da tutti 0 (1000, che equivale a -8). Poiché lo zero viene conteggiato nell'intervallo non negativo, un sistema a n bit genera un intervallo asimmetrico compreso tra -2</w:t>
       </w:r>
       <w:r>
@@ -5167,6 +5514,7 @@
         </w:numPr>
       </w:pPr>
       <w:r>
+        <w:lastRenderedPageBreak/>
         <w:t xml:space="preserve">Si </w:t>
       </w:r>
       <w:r>
@@ -5587,7 +5935,6 @@
         </w:numPr>
       </w:pPr>
       <w:r>
-        <w:lastRenderedPageBreak/>
         <w:t xml:space="preserve">Se la </w:t>
       </w:r>
       <w:r>
@@ -5724,7 +6071,11 @@
         <w:t>combinazione situata circa a metà dell'elenco</w:t>
       </w:r>
       <w:r>
-        <w:t xml:space="preserve"> — la prima che comincia con il bit 1 (ad esempio 1000 in un sistema a 4 bit) — </w:t>
+        <w:t xml:space="preserve"> — la </w:t>
+      </w:r>
+      <w:r>
+        <w:lastRenderedPageBreak/>
+        <w:t xml:space="preserve">prima che comincia con il bit 1 (ad esempio 1000 in un sistema a 4 bit) — </w:t>
       </w:r>
       <w:r>
         <w:rPr>
@@ -6102,7 +6453,6 @@
         <w:rPr>
           <w:noProof/>
         </w:rPr>
-        <w:lastRenderedPageBreak/>
         <w:drawing>
           <wp:inline distT="0" distB="0" distL="0" distR="0" wp14:anchorId="4BDC786E" wp14:editId="51C4663B">
             <wp:extent cx="5861050" cy="2807077"/>
@@ -6153,6 +6503,7 @@
           <w:bCs/>
           <w:color w:val="E97132" w:themeColor="accent2"/>
         </w:rPr>
+        <w:lastRenderedPageBreak/>
         <w:t>Normalizzazione, Conversioni e Standard Industriali</w:t>
       </w:r>
     </w:p>
@@ -6368,44 +6719,41 @@
         <w:t>l'addizione in virgola mobile non gode della proprietà associativa</w:t>
       </w:r>
       <w:r>
-        <w:t xml:space="preserve"> ((A + B) + C ≠ A + (B + C)). Quando si addiziona un numero molto grande a un numero molto piccolo, l'hardware trasla la mantissa del </w:t>
-      </w:r>
-      <w:r>
+        <w:t xml:space="preserve"> ((A + B) + C ≠ A + (B + C)). Quando si addiziona un numero molto grande a un numero molto piccolo, l'hardware trasla la mantissa del valore piccolo verso destra per allineare gli esponenti; se la differenza tra gli ordini di grandezza è marcata, le cifre del numero piccolo scivolano fuori dalla mantissa e vengono azzerate dall'hardware. Di conseguenza, l'operazione 2 1/2 + 1/8 + 1/8 eseguita nell'ordine da sinistra a destra produce il risultato errato 2 1/2, poiché sommando 2 1/2 a 1/8 si subisce un troncamento che ripristina la somma a 2 1/2. Invertendo invece l'ordine e sommando prima i due valori piccoli tra loro (1/8 + 1/8 = 1/4), e aggiungendo solo successivamente il risultato a 2 1/2, si ottiene la risposta esatta 2 3/4.</w:t>
+      </w:r>
+    </w:p>
+    <w:p>
+      <w:r>
+        <w:t xml:space="preserve">Questa caratteristica impone una regola fondamentale nell'analisi numerica: quando si devono sommare più valori espressi in virgola mobile, occorre </w:t>
+      </w:r>
+      <w:r>
+        <w:rPr>
+          <w:b/>
+          <w:bCs/>
+        </w:rPr>
+        <w:t>sommare sempre per primi i numeri più piccoli</w:t>
+      </w:r>
+      <w:r>
+        <w:t>, consentendo loro di accumularsi gradualmente fino a raggiungere una grandezza significativa prima dell'addizione con i numeri di ordine superiore.</w:t>
+      </w:r>
+    </w:p>
+    <w:p/>
+    <w:p>
+      <w:pPr>
+        <w:pStyle w:val="Titolo1"/>
+        <w:rPr>
+          <w:b/>
+          <w:bCs/>
+          <w:color w:val="EE0000"/>
+        </w:rPr>
+      </w:pPr>
+      <w:r>
+        <w:rPr>
+          <w:b/>
+          <w:bCs/>
+          <w:color w:val="EE0000"/>
+        </w:rPr>
         <w:lastRenderedPageBreak/>
-        <w:t>valore piccolo verso destra per allineare gli esponenti; se la differenza tra gli ordini di grandezza è marcata, le cifre del numero piccolo scivolano fuori dalla mantissa e vengono azzerate dall'hardware. Di conseguenza, l'operazione 2 1/2 + 1/8 + 1/8 eseguita nell'ordine da sinistra a destra produce il risultato errato 2 1/2, poiché sommando 2 1/2 a 1/8 si subisce un troncamento che ripristina la somma a 2 1/2. Invertendo invece l'ordine e sommando prima i due valori piccoli tra loro (1/8 + 1/8 = 1/4), e aggiungendo solo successivamente il risultato a 2 1/2, si ottiene la risposta esatta 2 3/4.</w:t>
-      </w:r>
-    </w:p>
-    <w:p>
-      <w:r>
-        <w:t xml:space="preserve">Questa caratteristica impone una regola fondamentale nell'analisi numerica: quando si devono sommare più valori espressi in virgola mobile, occorre </w:t>
-      </w:r>
-      <w:r>
-        <w:rPr>
-          <w:b/>
-          <w:bCs/>
-        </w:rPr>
-        <w:t>sommare sempre per primi i numeri più piccoli</w:t>
-      </w:r>
-      <w:r>
-        <w:t>, consentendo loro di accumularsi gradualmente fino a raggiungere una grandezza significativa prima dell'addizione con i numeri di ordine superiore.</w:t>
-      </w:r>
-    </w:p>
-    <w:p/>
-    <w:p>
-      <w:pPr>
-        <w:pStyle w:val="Titolo1"/>
-        <w:rPr>
-          <w:b/>
-          <w:bCs/>
-          <w:color w:val="EE0000"/>
-        </w:rPr>
-      </w:pPr>
-      <w:r>
-        <w:rPr>
-          <w:b/>
-          <w:bCs/>
-          <w:color w:val="EE0000"/>
-        </w:rPr>
         <w:t>10. Compressione Dei Dati</w:t>
       </w:r>
     </w:p>
@@ -6849,7 +7197,6 @@
           <w:b/>
           <w:bCs/>
         </w:rPr>
-        <w:lastRenderedPageBreak/>
         <w:t>Codifica Relativa o Differenziale</w:t>
       </w:r>
       <w:r>
@@ -7040,7 +7387,14 @@
         <w:rPr>
           <w:highlight w:val="yellow"/>
         </w:rPr>
-        <w:t>aggiunge via via le sequenze ricorrenti individuate nel testo</w:t>
+        <w:t xml:space="preserve">aggiunge via via le sequenze ricorrenti </w:t>
+      </w:r>
+      <w:r>
+        <w:rPr>
+          <w:highlight w:val="yellow"/>
+        </w:rPr>
+        <w:lastRenderedPageBreak/>
+        <w:t>individuate nel testo</w:t>
       </w:r>
       <w:r>
         <w:t>. Durante la decompressione, il ricevente riparte dallo stesso dizionario base e ricostruisce in parallelo la medesima tabella, eliminando la necessità di trasmettere il dizionario assieme al file. Ad esempio, codificando la stringa xyx xyx xyx xyx partendo da x, y e spazio (indici 1, 2, 3), il primo blocco xyx diventa 121, lo spazio 3, e la sequenza xyx viene aggiunta come quarto elemento. Il messaggio compresso 121343434 viene poi decodificato ricostruendo la voce 4 al primo riscontro del pattern.</w:t>
@@ -7357,7 +7711,23 @@
           <w:b/>
           <w:bCs/>
         </w:rPr>
-        <w:t>Formato TIFF (Tagged Image File Format)</w:t>
+        <w:t>Formato TIFF (</w:t>
+      </w:r>
+      <w:proofErr w:type="spellStart"/>
+      <w:r>
+        <w:rPr>
+          <w:b/>
+          <w:bCs/>
+        </w:rPr>
+        <w:t>Tagged</w:t>
+      </w:r>
+      <w:proofErr w:type="spellEnd"/>
+      <w:r>
+        <w:rPr>
+          <w:b/>
+          <w:bCs/>
+        </w:rPr>
+        <w:t xml:space="preserve"> Image File Format)</w:t>
       </w:r>
       <w:r>
         <w:t xml:space="preserve">: utilizzato principalmente per </w:t>
@@ -7457,193 +7827,193 @@
         <w:rPr>
           <w:highlight w:val="yellow"/>
         </w:rPr>
+        <w:t>fotogrammi intermedi</w:t>
+      </w:r>
+      <w:r>
+        <w:t xml:space="preserve"> tra gli I-frame vengono invece </w:t>
+      </w:r>
+      <w:r>
+        <w:rPr>
+          <w:highlight w:val="yellow"/>
+        </w:rPr>
+        <w:t>compressi mediante codifica relativa</w:t>
+      </w:r>
+      <w:r>
+        <w:t xml:space="preserve">, </w:t>
+      </w:r>
+      <w:r>
+        <w:rPr>
+          <w:highlight w:val="yellow"/>
+        </w:rPr>
+        <w:t>registrando esclusivamente le differenze</w:t>
+      </w:r>
+      <w:r>
+        <w:t xml:space="preserve"> rispetto all'immagine precedente.</w:t>
+      </w:r>
+    </w:p>
+    <w:p>
+      <w:r>
+        <w:rPr>
+          <w:b/>
+          <w:bCs/>
+        </w:rPr>
+        <w:t>Standard MP3 (MPEG Layer 3)</w:t>
+      </w:r>
+      <w:r>
+        <w:t xml:space="preserve">: formato di </w:t>
+      </w:r>
+      <w:r>
+        <w:t>compressione audio</w:t>
+      </w:r>
+      <w:r>
+        <w:t xml:space="preserve"> </w:t>
+      </w:r>
+      <w:r>
+        <w:rPr>
+          <w:highlight w:val="yellow"/>
+        </w:rPr>
+        <w:t>appartenente agli standard MPEG</w:t>
+      </w:r>
+      <w:r>
+        <w:t xml:space="preserve"> che </w:t>
+      </w:r>
+      <w:r>
+        <w:rPr>
+          <w:highlight w:val="yellow"/>
+        </w:rPr>
+        <w:t>riduce significativamente</w:t>
+      </w:r>
+      <w:r>
+        <w:t xml:space="preserve"> la dimensione dei file audio </w:t>
+      </w:r>
+      <w:r>
+        <w:rPr>
+          <w:highlight w:val="yellow"/>
+        </w:rPr>
+        <w:t>mantenendo una qualità prossima a quella di un CD</w:t>
+      </w:r>
+      <w:r>
+        <w:t xml:space="preserve">. Funziona </w:t>
+      </w:r>
+      <w:r>
+        <w:rPr>
+          <w:highlight w:val="yellow"/>
+        </w:rPr>
+        <w:t>eliminando i suoni impercettibili per l'orecchio umano</w:t>
+      </w:r>
+      <w:r>
+        <w:t xml:space="preserve"> sfruttando due principi psicoacustici</w:t>
+      </w:r>
+    </w:p>
+    <w:p>
+      <w:r>
+        <w:rPr>
+          <w:b/>
+          <w:bCs/>
+        </w:rPr>
+        <w:t>Tassi di Trasmissione</w:t>
+      </w:r>
+      <w:r>
+        <w:t xml:space="preserve">: per la fruizione tempestiva in rete, i flussi video MPEG richiedono velocità di trasferimento fino a </w:t>
+      </w:r>
+      <w:r>
+        <w:rPr>
+          <w:b/>
+          <w:bCs/>
+        </w:rPr>
+        <w:t>40 Mbps</w:t>
+      </w:r>
+      <w:r>
+        <w:t xml:space="preserve">, mentre le tracce audio MP3 necessitano di tassi non superiori a </w:t>
+      </w:r>
+      <w:r>
+        <w:rPr>
+          <w:b/>
+          <w:bCs/>
+        </w:rPr>
+        <w:t>64 Kbps</w:t>
+      </w:r>
+      <w:r>
+        <w:t>.</w:t>
+      </w:r>
+    </w:p>
+    <w:p/>
+    <w:p>
+      <w:pPr>
+        <w:pStyle w:val="Titolo1"/>
+        <w:rPr>
+          <w:b/>
+          <w:bCs/>
+          <w:color w:val="EE0000"/>
+        </w:rPr>
+      </w:pPr>
+      <w:r>
+        <w:rPr>
+          <w:b/>
+          <w:bCs/>
+          <w:color w:val="EE0000"/>
+        </w:rPr>
         <w:lastRenderedPageBreak/>
-        <w:t>fotogrammi intermedi</w:t>
-      </w:r>
-      <w:r>
-        <w:t xml:space="preserve"> tra gli I-frame vengono invece </w:t>
-      </w:r>
-      <w:r>
-        <w:rPr>
-          <w:highlight w:val="yellow"/>
-        </w:rPr>
-        <w:t>compressi mediante codifica relativa</w:t>
-      </w:r>
-      <w:r>
-        <w:t xml:space="preserve">, </w:t>
-      </w:r>
-      <w:r>
-        <w:rPr>
-          <w:highlight w:val="yellow"/>
-        </w:rPr>
-        <w:t>registrando esclusivamente le differenze</w:t>
-      </w:r>
-      <w:r>
-        <w:t xml:space="preserve"> rispetto all'immagine precedente.</w:t>
-      </w:r>
-    </w:p>
-    <w:p>
-      <w:r>
-        <w:rPr>
-          <w:b/>
-          <w:bCs/>
-        </w:rPr>
-        <w:t>Standard MP3 (MPEG Layer 3)</w:t>
-      </w:r>
-      <w:r>
-        <w:t xml:space="preserve">: formato di </w:t>
-      </w:r>
-      <w:r>
-        <w:t>compressione audio</w:t>
-      </w:r>
-      <w:r>
-        <w:t xml:space="preserve"> </w:t>
-      </w:r>
-      <w:r>
-        <w:rPr>
-          <w:highlight w:val="yellow"/>
-        </w:rPr>
-        <w:t>appartenente agli standard MPEG</w:t>
-      </w:r>
-      <w:r>
-        <w:t xml:space="preserve"> che </w:t>
-      </w:r>
-      <w:r>
-        <w:rPr>
-          <w:highlight w:val="yellow"/>
-        </w:rPr>
-        <w:t>riduce significativamente</w:t>
-      </w:r>
-      <w:r>
-        <w:t xml:space="preserve"> la dimensione dei file audio </w:t>
-      </w:r>
-      <w:r>
-        <w:rPr>
-          <w:highlight w:val="yellow"/>
-        </w:rPr>
-        <w:t>mantenendo una qualità prossima a quella di un CD</w:t>
-      </w:r>
-      <w:r>
-        <w:t xml:space="preserve">. Funziona </w:t>
-      </w:r>
-      <w:r>
-        <w:rPr>
-          <w:highlight w:val="yellow"/>
-        </w:rPr>
-        <w:t>eliminando i suoni impercettibili per l'orecchio umano</w:t>
-      </w:r>
-      <w:r>
-        <w:t xml:space="preserve"> sfruttando due principi psicoacustici</w:t>
-      </w:r>
-    </w:p>
-    <w:p>
-      <w:r>
-        <w:rPr>
-          <w:b/>
-          <w:bCs/>
-        </w:rPr>
-        <w:t>Tassi di Trasmissione</w:t>
-      </w:r>
-      <w:r>
-        <w:t xml:space="preserve">: per la fruizione tempestiva in rete, i flussi video MPEG richiedono velocità di trasferimento fino a </w:t>
-      </w:r>
-      <w:r>
-        <w:rPr>
-          <w:b/>
-          <w:bCs/>
-        </w:rPr>
-        <w:t>40 Mbps</w:t>
-      </w:r>
-      <w:r>
-        <w:t xml:space="preserve">, mentre le tracce audio MP3 necessitano di tassi non superiori a </w:t>
-      </w:r>
-      <w:r>
-        <w:rPr>
-          <w:b/>
-          <w:bCs/>
-        </w:rPr>
-        <w:t>64 Kbps</w:t>
+        <w:t xml:space="preserve">11. </w:t>
+      </w:r>
+      <w:r>
+        <w:rPr>
+          <w:b/>
+          <w:bCs/>
+          <w:color w:val="EE0000"/>
+        </w:rPr>
+        <w:t>G</w:t>
+      </w:r>
+      <w:r>
+        <w:rPr>
+          <w:b/>
+          <w:bCs/>
+          <w:color w:val="EE0000"/>
+        </w:rPr>
+        <w:t>estione e correzione degli errori di comunicazione</w:t>
+      </w:r>
+    </w:p>
+    <w:p>
+      <w:pPr>
+        <w:pStyle w:val="Titolo2"/>
+        <w:rPr>
+          <w:b/>
+          <w:bCs/>
+          <w:color w:val="E97132" w:themeColor="accent2"/>
+        </w:rPr>
+      </w:pPr>
+      <w:r>
+        <w:rPr>
+          <w:b/>
+          <w:bCs/>
+          <w:color w:val="E97132" w:themeColor="accent2"/>
+        </w:rPr>
+        <w:t>Rilevamento degli Errori e Bit di Parità</w:t>
+      </w:r>
+    </w:p>
+    <w:p>
+      <w:r>
+        <w:t xml:space="preserve">Durante il trasferimento dei dati tra le varie componenti interne di un calcolatore, la trasmissione a distanza o la semplice permanenza delle informazioni nei dispositivi di memorizzazione, </w:t>
+      </w:r>
+      <w:r>
+        <w:rPr>
+          <w:highlight w:val="yellow"/>
+        </w:rPr>
+        <w:t>esiste costantemente il rischio che i pattern di bit vengano alterati</w:t>
+      </w:r>
+      <w:r>
+        <w:t xml:space="preserve">. Sporcizia o grasso sulle superfici magnetiche, malfunzionamenti dei circuiti, interferenze statiche sui canali di trasmissione e persino la radiazione di fondo nelle memorie RAM possono invertire inavvertitamente lo stato di uno o più bit. Per garantire la massima affidabilità del sistema senza richiedere l'intervento dell'utente, </w:t>
+      </w:r>
+      <w:r>
+        <w:rPr>
+          <w:highlight w:val="yellow"/>
+        </w:rPr>
+        <w:t>l'hardware integra sofisticate tecniche di codifica volte a rilevare e correggere tali anomalie</w:t>
       </w:r>
       <w:r>
         <w:t>.</w:t>
       </w:r>
     </w:p>
-    <w:p/>
-    <w:p>
-      <w:pPr>
-        <w:pStyle w:val="Titolo1"/>
-        <w:rPr>
-          <w:b/>
-          <w:bCs/>
-          <w:color w:val="EE0000"/>
-        </w:rPr>
-      </w:pPr>
-      <w:r>
-        <w:rPr>
-          <w:b/>
-          <w:bCs/>
-          <w:color w:val="EE0000"/>
-        </w:rPr>
-        <w:t xml:space="preserve">11. </w:t>
-      </w:r>
-      <w:r>
-        <w:rPr>
-          <w:b/>
-          <w:bCs/>
-          <w:color w:val="EE0000"/>
-        </w:rPr>
-        <w:t>G</w:t>
-      </w:r>
-      <w:r>
-        <w:rPr>
-          <w:b/>
-          <w:bCs/>
-          <w:color w:val="EE0000"/>
-        </w:rPr>
-        <w:t>estione e correzione degli errori di comunicazione</w:t>
-      </w:r>
-    </w:p>
-    <w:p>
-      <w:pPr>
-        <w:pStyle w:val="Titolo2"/>
-        <w:rPr>
-          <w:b/>
-          <w:bCs/>
-          <w:color w:val="E97132" w:themeColor="accent2"/>
-        </w:rPr>
-      </w:pPr>
-      <w:r>
-        <w:rPr>
-          <w:b/>
-          <w:bCs/>
-          <w:color w:val="E97132" w:themeColor="accent2"/>
-        </w:rPr>
-        <w:t>Rilevamento degli Errori e Bit di Parità</w:t>
-      </w:r>
-    </w:p>
-    <w:p>
-      <w:r>
-        <w:t xml:space="preserve">Durante il trasferimento dei dati tra le varie componenti interne di un calcolatore, la trasmissione a distanza o la semplice permanenza delle informazioni nei dispositivi di memorizzazione, </w:t>
-      </w:r>
-      <w:r>
-        <w:rPr>
-          <w:highlight w:val="yellow"/>
-        </w:rPr>
-        <w:t>esiste costantemente il rischio che i pattern di bit vengano alterati</w:t>
-      </w:r>
-      <w:r>
-        <w:t xml:space="preserve">. Sporcizia o grasso sulle superfici magnetiche, malfunzionamenti dei circuiti, interferenze statiche sui canali di trasmissione e persino la radiazione di fondo nelle memorie RAM possono invertire inavvertitamente lo stato di uno o più bit. Per garantire la massima affidabilità del sistema senza richiedere l'intervento dell'utente, </w:t>
-      </w:r>
-      <w:r>
-        <w:rPr>
-          <w:highlight w:val="yellow"/>
-        </w:rPr>
-        <w:t>l'hardware integra sofisticate tecniche di codifica volte a rilevare e correggere tali anomalie</w:t>
-      </w:r>
-      <w:r>
-        <w:t>.</w:t>
-      </w:r>
-    </w:p>
     <w:p>
       <w:r>
         <w:t xml:space="preserve">La </w:t>
@@ -7680,12 +8050,21 @@
       <w:r>
         <w:t xml:space="preserve"> (</w:t>
       </w:r>
+      <w:proofErr w:type="spellStart"/>
       <w:r>
         <w:rPr>
           <w:i/>
           <w:iCs/>
         </w:rPr>
-        <w:t>parity bit</w:t>
+        <w:t>parity</w:t>
+      </w:r>
+      <w:proofErr w:type="spellEnd"/>
+      <w:r>
+        <w:rPr>
+          <w:i/>
+          <w:iCs/>
+        </w:rPr>
+        <w:t xml:space="preserve"> bit</w:t>
       </w:r>
       <w:r>
         <w:t xml:space="preserve">), a ciascun pattern di dati (ad esempio portando i codici ASCII da 8 a 9 bit), si progetta il sistema in modo che </w:t>
@@ -7883,7 +8262,6 @@
           <w:bCs/>
           <w:color w:val="E97132" w:themeColor="accent2"/>
         </w:rPr>
-        <w:lastRenderedPageBreak/>
         <w:t>Codici di Correzione degli Errori e Distanza di Hamming</w:t>
       </w:r>
     </w:p>
@@ -8093,7 +8471,11 @@
         <w:t>correggere 1 bit errato</w:t>
       </w:r>
       <w:r>
-        <w:t>. Infatti, se un singolo bit viene alterato, la stringa ricevuta non risulterà più una parola legale, ma si troverà a distanza di Hamming 1 dal codice originale e a distanza pari ad almeno 2 da qualsiasi altra parola legale, permettendo al decodificatore di identificare in modo univoco il dato corretto.</w:t>
+        <w:t xml:space="preserve">. Infatti, se un singolo bit viene alterato, la stringa ricevuta non risulterà </w:t>
+      </w:r>
+      <w:r>
+        <w:lastRenderedPageBreak/>
+        <w:t>più una parola legale, ma si troverà a distanza di Hamming 1 dal codice originale e a distanza pari ad almeno 2 da qualsiasi altra parola legale, permettendo al decodificatore di identificare in modo univoco il dato corretto.</w:t>
       </w:r>
     </w:p>
     <w:p>

</xml_diff>

<commit_message>
Fondamenti: capitoli 12-15 (lezione 4, logica proposizionale); quiz: logica proposizionale separata da logica avanzata
Co-Authored-By: Claude Sonnet 5.5 <noreply@anthropic.com>
</commit_message>
<xml_diff>
--- a/Riassunto Fondamenti Informatica.docx
+++ b/Riassunto Fondamenti Informatica.docx
@@ -8608,6 +8608,1843 @@
       </w:r>
     </w:p>
     <w:p/>
+    <w:p>
+      <w:pPr>
+        <w:pStyle w:val="Titolo1"/>
+      </w:pPr>
+      <w:r>
+        <w:rPr>
+          <w:b/>
+          <w:color w:val="EE0000"/>
+        </w:rPr>
+        <w:t>12. Logica Proposizionale: Proposizioni e Valori di Verità</w:t>
+      </w:r>
+    </w:p>
+    <w:p>
+      <w:pPr>
+        <w:pStyle w:val="Titolo2"/>
+      </w:pPr>
+      <w:r>
+        <w:rPr>
+          <w:b/>
+          <w:color w:val="E97132"/>
+        </w:rPr>
+        <w:t>Da dove si riparte</w:t>
+      </w:r>
+    </w:p>
+    <w:p>
+      <w:r>
+        <w:rPr/>
+        <w:t xml:space="preserve">Con questa lezione comincia la seconda parte del libro. La sezione sulla teoria degli insiemi (1.1) viene saltata perché si incontra in dettaglio nel corso di Matematica discreta, e così era stata saltata la sezione su Python nella prima parte: il testo era pensato come un libro unico che comprendeva anche programmazione e matematica discreta, mentre qui sono corsi separati. La terminologia degli insiemi verrà richiamata più avanti, quando servirà. Si parte quindi dalla sezione 1.2, la </w:t>
+      </w:r>
+      <w:r>
+        <w:rPr>
+          <w:b/>
+        </w:rPr>
+        <w:t>logica proposizionale</w:t>
+      </w:r>
+      <w:r>
+        <w:rPr/>
+        <w:t>.</w:t>
+      </w:r>
+    </w:p>
+    <w:p>
+      <w:pPr>
+        <w:pStyle w:val="Titolo2"/>
+      </w:pPr>
+      <w:r>
+        <w:rPr>
+          <w:b/>
+          <w:color w:val="E97132"/>
+        </w:rPr>
+        <w:t>Che cos'è la logica proposizionale</w:t>
+      </w:r>
+    </w:p>
+    <w:p>
+      <w:r>
+        <w:rPr/>
+        <w:t xml:space="preserve">La logica proposizionale studia il modo più semplice di combinare affermazioni. Si parte da un insieme di </w:t>
+      </w:r>
+      <w:r>
+        <w:rPr>
+          <w:b/>
+        </w:rPr>
+        <w:t>proposizioni atomiche</w:t>
+      </w:r>
+      <w:r>
+        <w:rPr/>
+        <w:t xml:space="preserve">: affermazioni di cui non si analizza il contenuto, ma a cui si sa assegnare un </w:t>
+      </w:r>
+      <w:r>
+        <w:rPr>
+          <w:b/>
+        </w:rPr>
+        <w:t>valore di verità</w:t>
+      </w:r>
+      <w:r>
+        <w:rPr/>
+        <w:t xml:space="preserve">, vero o falso. Possono essere affermazioni sul mondo esterno ("c'è un'automobile", "è giorno", "la temperatura è sopra una certa soglia"), nel caso di un'applicazione informatica in cui una macchina rileva queste informazioni. Da questo punto in poi non ci si chiede più come si ottengono i valori di verità, ma come si </w:t>
+      </w:r>
+      <w:r>
+        <w:rPr>
+          <w:b/>
+        </w:rPr>
+        <w:t>combinano</w:t>
+      </w:r>
+      <w:r>
+        <w:rPr/>
+        <w:t xml:space="preserve"> tra loro.</w:t>
+      </w:r>
+    </w:p>
+    <w:p>
+      <w:r>
+        <w:rPr/>
+        <w:t>Una proposizione è dunque una frase che è vera oppure falsa, ma non entrambe. Il libro la dimostra con una serie di frasi da classificare:</w:t>
+      </w:r>
+    </w:p>
+    <w:p>
+      <w:pPr>
+        <w:numPr>
+          <w:ilvl w:val="0"/>
+          <w:numId w:val="1"/>
+        </w:numPr>
+      </w:pPr>
+      <w:r>
+        <w:rPr/>
+        <w:t xml:space="preserve">"I soli interi positivi che dividono 7 sono 1 e 7": è </w:t>
+      </w:r>
+      <w:r>
+        <w:rPr>
+          <w:b/>
+        </w:rPr>
+        <w:t>vera</w:t>
+      </w:r>
+      <w:r>
+        <w:rPr/>
+        <w:t>, e si verifica provando che 2, 3, 4, 5 e 6 non dividono 7 (è un altro modo di dire che 7 è primo);</w:t>
+      </w:r>
+    </w:p>
+    <w:p>
+      <w:pPr>
+        <w:numPr>
+          <w:ilvl w:val="0"/>
+          <w:numId w:val="1"/>
+        </w:numPr>
+      </w:pPr>
+      <w:r>
+        <w:rPr/>
+        <w:t xml:space="preserve">"Alfred Hitchcock ha vinto l'Oscar per la regia nel 1940 con *Rebecca*": è </w:t>
+      </w:r>
+      <w:r>
+        <w:rPr>
+          <w:b/>
+        </w:rPr>
+        <w:t>falsa</w:t>
+      </w:r>
+      <w:r>
+        <w:rPr/>
+        <w:t>; si controlla su un archivio o chiedendolo a internet, ed è *Rebecca* ad aver vinto l'Oscar come miglior film, mentre per la regia vinse un altro regista;</w:t>
+      </w:r>
+    </w:p>
+    <w:p>
+      <w:pPr>
+        <w:numPr>
+          <w:ilvl w:val="0"/>
+          <w:numId w:val="1"/>
+        </w:numPr>
+      </w:pPr>
+      <w:r>
+        <w:rPr/>
+        <w:t xml:space="preserve">"Per ogni intero positivo n esiste un numero primo più grande di n": è </w:t>
+      </w:r>
+      <w:r>
+        <w:rPr>
+          <w:b/>
+        </w:rPr>
+        <w:t>vera</w:t>
+      </w:r>
+      <w:r>
+        <w:rPr/>
+        <w:t>, ed è il teorema di Euclide (i numeri primi sono infiniti): un'affermazione complessa che per la logica proposizionale ha comunque un valore di verità;</w:t>
+      </w:r>
+    </w:p>
+    <w:p>
+      <w:pPr>
+        <w:numPr>
+          <w:ilvl w:val="0"/>
+          <w:numId w:val="1"/>
+        </w:numPr>
+      </w:pPr>
+      <w:r>
+        <w:rPr/>
+        <w:t xml:space="preserve">"La Terra è l'unico pianeta dell'universo che contiene vita": non sappiamo se è vera o falsa e magari non lo sapremo mai, ma ha </w:t>
+      </w:r>
+      <w:r>
+        <w:rPr>
+          <w:b/>
+        </w:rPr>
+        <w:t>un valore di verità</w:t>
+      </w:r>
+      <w:r>
+        <w:rPr/>
+        <w:t xml:space="preserve"> anche se ignoto. La logica proposizionale copre anche questi casi, in cui si suppone soltanto che il valore esista.</w:t>
+      </w:r>
+    </w:p>
+    <w:p>
+      <w:pPr>
+        <w:pStyle w:val="Titolo2"/>
+      </w:pPr>
+      <w:r>
+        <w:rPr>
+          <w:b/>
+          <w:color w:val="E97132"/>
+        </w:rPr>
+        <w:t>Che cosa non è una proposizione</w:t>
+      </w:r>
+    </w:p>
+    <w:p>
+      <w:r>
+        <w:rPr/>
+        <w:t>Non tutte le frasi sono proposizioni. Il linguaggio contiene anche:</w:t>
+      </w:r>
+    </w:p>
+    <w:p>
+      <w:pPr>
+        <w:numPr>
+          <w:ilvl w:val="0"/>
+          <w:numId w:val="1"/>
+        </w:numPr>
+      </w:pPr>
+      <w:r>
+        <w:rPr>
+          <w:b/>
+        </w:rPr>
+        <w:t>domande</w:t>
+      </w:r>
+      <w:r>
+        <w:rPr/>
+        <w:t>, che chiedono un'informazione: non descrivono come stanno le cose;</w:t>
+      </w:r>
+    </w:p>
+    <w:p>
+      <w:pPr>
+        <w:numPr>
+          <w:ilvl w:val="0"/>
+          <w:numId w:val="1"/>
+        </w:numPr>
+      </w:pPr>
+      <w:r>
+        <w:rPr>
+          <w:b/>
+        </w:rPr>
+        <w:t>ordini</w:t>
+      </w:r>
+      <w:r>
+        <w:rPr/>
+        <w:t xml:space="preserve">, come "compra due biglietti per il concerto": lo scopo non è descrivere il mondo ma cambiarlo. In programmazione è così anche </w:t>
+      </w:r>
+      <w:r>
+        <w:rPr>
+          <w:rFonts w:ascii="Consolas" w:hAnsi="Consolas" w:cs="Consolas"/>
+        </w:rPr>
+        <w:t>x = 3</w:t>
+      </w:r>
+      <w:r>
+        <w:rPr/>
+        <w:t>, che è un'istruzione imperativa, un ordine al compilatore di assegnare alla variabile x il valore 3;</w:t>
+      </w:r>
+    </w:p>
+    <w:p>
+      <w:pPr>
+        <w:numPr>
+          <w:ilvl w:val="0"/>
+          <w:numId w:val="1"/>
+        </w:numPr>
+      </w:pPr>
+      <w:r>
+        <w:rPr>
+          <w:b/>
+        </w:rPr>
+        <w:t>affermazioni con parametri</w:t>
+      </w:r>
+      <w:r>
+        <w:rPr/>
+        <w:t>, come l'equazione x + 4 = 6: il suo valore di verità dipende da x. Con x = 2 è vera, con x = 0 è falsa. Finché ai parametri non è assegnato un valore, non è una proposizione.</w:t>
+      </w:r>
+    </w:p>
+    <w:p>
+      <w:pPr>
+        <w:pStyle w:val="Titolo2"/>
+      </w:pPr>
+      <w:r>
+        <w:rPr>
+          <w:b/>
+          <w:color w:val="E97132"/>
+        </w:rPr>
+        <w:t>Le variabili proposizionali</w:t>
+      </w:r>
+    </w:p>
+    <w:p>
+      <w:r>
+        <w:rPr/>
+        <w:t xml:space="preserve">Per indicare le proposizioni si usano variabili come p, q e r, un po' come in algebra si usano le lettere per i numeri. Si può anche </w:t>
+      </w:r>
+      <w:r>
+        <w:rPr>
+          <w:b/>
+        </w:rPr>
+        <w:t>definire</w:t>
+      </w:r>
+      <w:r>
+        <w:rPr/>
+        <w:t xml:space="preserve"> una variabile con una proposizione, scrivendo per esempio </w:t>
+      </w:r>
+      <w:r>
+        <w:rPr>
+          <w:rFonts w:ascii="Consolas" w:hAnsi="Consolas" w:cs="Consolas"/>
+        </w:rPr>
+        <w:t>p: 1 + 1 = 3</w:t>
+      </w:r>
+      <w:r>
+        <w:rPr/>
+        <w:t>, cioè "p è la proposizione 1 + 1 = 3" (che è falsa).</w:t>
+      </w:r>
+    </w:p>
+    <w:p>
+      <w:pPr>
+        <w:pStyle w:val="Titolo2"/>
+      </w:pPr>
+      <w:r>
+        <w:rPr>
+          <w:b/>
+          <w:color w:val="E97132"/>
+        </w:rPr>
+        <w:t>Perché si parla di valori booleani</w:t>
+      </w:r>
+    </w:p>
+    <w:p>
+      <w:r>
+        <w:rPr/>
+        <w:t xml:space="preserve">I valori di verità si chiamano anche </w:t>
+      </w:r>
+      <w:r>
+        <w:rPr>
+          <w:b/>
+        </w:rPr>
+        <w:t>valori booleani</w:t>
+      </w:r>
+      <w:r>
+        <w:rPr/>
+        <w:t xml:space="preserve">, dal nome di George Boole, il primo a trattare la logica proposizionale in modo scientifico: la logica proposizionale esisteva da mille anni, ma fino ad allora era una parte della filosofia. Per un informatico le affermazioni composte con i connettivi sono il primo compito da affidare ai </w:t>
+      </w:r>
+      <w:r>
+        <w:rPr>
+          <w:b/>
+        </w:rPr>
+        <w:t>circuiti</w:t>
+      </w:r>
+      <w:r>
+        <w:rPr/>
+        <w:t xml:space="preserve"> (visti nelle prime settimane del corso, capitoli 1 e 5 di questo Word): una formula di logica proposizionale si può realizzare con un circuito, ma anche scrivere e studiare su carta.</w:t>
+      </w:r>
+    </w:p>
+    <w:p>
+      <w:r>
+        <w:rPr/>
+        <w:t>La logica proposizionale si usa di fatto, anche senza dirlo, in tutte le dimostrazioni di matematica. Come ha sottolineato il docente, qui l'interesse è la base per il ragionamento automatico: si studieranno affermazioni più semplici di quelle di un corso di matematica, ma con più dettaglio, perché poi bisogna spiegare alle macchine come ragionare.</w:t>
+      </w:r>
+    </w:p>
+    <w:p>
+      <w:r>
+        <w:rPr/>
+        <w:t>Il prossimo capitolo presenta i connettivi con cui si combinano le proposizioni.</w:t>
+      </w:r>
+    </w:p>
+    <w:p>
+      <w:pPr>
+        <w:pStyle w:val="Titolo1"/>
+      </w:pPr>
+      <w:r>
+        <w:rPr>
+          <w:b/>
+          <w:color w:val="EE0000"/>
+        </w:rPr>
+        <w:t>13. I Connettivi: And, Or, Not, Xor ed Equivalenza</w:t>
+      </w:r>
+    </w:p>
+    <w:p>
+      <w:pPr>
+        <w:pStyle w:val="Titolo2"/>
+      </w:pPr>
+      <w:r>
+        <w:rPr>
+          <w:b/>
+          <w:color w:val="E97132"/>
+        </w:rPr>
+        <w:t>Combinare le proposizioni</w:t>
+      </w:r>
+    </w:p>
+    <w:p>
+      <w:r>
+        <w:rPr/>
+        <w:t xml:space="preserve">Un </w:t>
+      </w:r>
+      <w:r>
+        <w:rPr>
+          <w:b/>
+        </w:rPr>
+        <w:t>connettivo</w:t>
+      </w:r>
+      <w:r>
+        <w:rPr/>
+        <w:t xml:space="preserve"> è un'operazione che prende uno o più valori di verità in ingresso e ne restituisce uno in uscita. Sono gli stessi che i circuiti elementari realizzano (porte and, or, xor e not, già visti nel capitolo 5: qui si guardano con la tavola di verità), e alcuni erano già stati anticipati. Il valore di verità della proposizione composta è sempre determinato dai valori di verità delle sue componenti. Nelle tavole che seguono si indicano il vero con </w:t>
+      </w:r>
+      <w:r>
+        <w:rPr>
+          <w:b/>
+        </w:rPr>
+        <w:t>1</w:t>
+      </w:r>
+      <w:r>
+        <w:rPr/>
+        <w:t xml:space="preserve"> e il falso con </w:t>
+      </w:r>
+      <w:r>
+        <w:rPr>
+          <w:b/>
+        </w:rPr>
+        <w:t>0</w:t>
+      </w:r>
+      <w:r>
+        <w:rPr/>
+        <w:t>.</w:t>
+      </w:r>
+    </w:p>
+    <w:p>
+      <w:pPr>
+        <w:pStyle w:val="Titolo2"/>
+      </w:pPr>
+      <w:r>
+        <w:rPr>
+          <w:b/>
+          <w:color w:val="E97132"/>
+        </w:rPr>
+        <w:t>La congiunzione (and)</w:t>
+      </w:r>
+    </w:p>
+    <w:p>
+      <w:r>
+        <w:rPr/>
+        <w:t xml:space="preserve">La </w:t>
+      </w:r>
+      <w:r>
+        <w:rPr>
+          <w:b/>
+        </w:rPr>
+        <w:t>congiunzione</w:t>
+      </w:r>
+      <w:r>
+        <w:rPr/>
+        <w:t xml:space="preserve"> p ∧ q si legge "p e q": è vera quando </w:t>
+      </w:r>
+      <w:r>
+        <w:rPr>
+          <w:b/>
+        </w:rPr>
+        <w:t>entrambe</w:t>
+      </w:r>
+      <w:r>
+        <w:rPr/>
+        <w:t xml:space="preserve"> le proposizioni sono vere, e falsa se almeno una è falsa. Esempio del libro: "un decennio è di 10 anni e un millennio è di 100 anni" è falsa, perché la seconda parte è falsa.</w:t>
+      </w:r>
+    </w:p>
+    <w:p>
+      <w:pPr>
+        <w:pStyle w:val="Titolo2"/>
+      </w:pPr>
+      <w:r>
+        <w:rPr>
+          <w:b/>
+          <w:color w:val="E97132"/>
+        </w:rPr>
+        <w:t>La disgiunzione (or) e il caso dell'xor</w:t>
+      </w:r>
+    </w:p>
+    <w:p>
+      <w:r>
+        <w:rPr/>
+        <w:t xml:space="preserve">La </w:t>
+      </w:r>
+      <w:r>
+        <w:rPr>
+          <w:b/>
+        </w:rPr>
+        <w:t>disgiunzione</w:t>
+      </w:r>
+      <w:r>
+        <w:rPr/>
+        <w:t xml:space="preserve"> p ∨ q si legge "p o q" ed è la disgiunzione </w:t>
+      </w:r>
+      <w:r>
+        <w:rPr>
+          <w:b/>
+        </w:rPr>
+        <w:t>inclusiva</w:t>
+      </w:r>
+      <w:r>
+        <w:rPr/>
+        <w:t xml:space="preserve">: è vera se è vera p, oppure è vera q, </w:t>
+      </w:r>
+      <w:r>
+        <w:rPr>
+          <w:b/>
+        </w:rPr>
+        <w:t>oppure lo sono entrambe</w:t>
+      </w:r>
+      <w:r>
+        <w:rPr/>
+        <w:t>. È falsa solo quando sono false tutte e due. Esempio del libro: "un millennio è di 100 anni o un millennio è di 1000 anni" è vera, perché basta la seconda parte.</w:t>
+      </w:r>
+    </w:p>
+    <w:p>
+      <w:r>
+        <w:rPr/>
+        <w:t xml:space="preserve">Esiste anche la disgiunzione </w:t>
+      </w:r>
+      <w:r>
+        <w:rPr>
+          <w:b/>
+        </w:rPr>
+        <w:t>esclusiva</w:t>
+      </w:r>
+      <w:r>
+        <w:rPr/>
+        <w:t xml:space="preserve"> (l'*aut* del latino, </w:t>
+      </w:r>
+      <w:r>
+        <w:rPr>
+          <w:b/>
+        </w:rPr>
+        <w:t>xor</w:t>
+      </w:r>
+      <w:r>
+        <w:rPr/>
+        <w:t xml:space="preserve"> in inglese), vera solo quando una delle due è vera e l'altra è falsa; non lo è quando sono vere entrambe. Nel parlato "o" può avere l'uno o l'altro significato, mentre in logica quando si scrive "or" si intende quella inclusiva.</w:t>
+      </w:r>
+    </w:p>
+    <w:p>
+      <w:r>
+        <w:rPr/>
+        <w:t xml:space="preserve">Un esempio del docente: "piove e fa freddo". Se oggi non piove ma fa freddo (dove si fissa la soglia, per esempio, a 20 gradi), la </w:t>
+      </w:r>
+      <w:r>
+        <w:rPr>
+          <w:b/>
+        </w:rPr>
+        <w:t>congiunzione è falsa</w:t>
+      </w:r>
+      <w:r>
+        <w:rPr/>
+        <w:t xml:space="preserve">, perché la prima parte è falsa, mentre la </w:t>
+      </w:r>
+      <w:r>
+        <w:rPr>
+          <w:b/>
+        </w:rPr>
+        <w:t>disgiunzione "piove o fa freddo" è vera</w:t>
+      </w:r>
+      <w:r>
+        <w:rPr/>
+        <w:t>, perché la seconda parte è vera. Le frasi vanno poi sempre interpretate in un contesto.</w:t>
+      </w:r>
+    </w:p>
+    <w:p>
+      <w:r>
+        <w:rPr/>
+        <w:t xml:space="preserve">La logica si occupa della </w:t>
+      </w:r>
+      <w:r>
+        <w:rPr>
+          <w:b/>
+        </w:rPr>
+        <w:t>forma</w:t>
+      </w:r>
+      <w:r>
+        <w:rPr/>
+        <w:t xml:space="preserve"> delle proposizioni e dei rapporti tra loro, non del loro argomento: perciò "3 &lt; 5 oppure Parigi è la capitale dell'Inghilterra" è ammessa ed è vera, perché 3 &lt; 5 è vera.</w:t>
+      </w:r>
+    </w:p>
+    <w:p>
+      <w:pPr>
+        <w:pStyle w:val="Titolo2"/>
+      </w:pPr>
+      <w:r>
+        <w:rPr>
+          <w:b/>
+          <w:color w:val="E97132"/>
+        </w:rPr>
+        <w:t>La negazione (not)</w:t>
+      </w:r>
+    </w:p>
+    <w:p>
+      <w:r>
+        <w:rPr/>
+        <w:t xml:space="preserve">La </w:t>
+      </w:r>
+      <w:r>
+        <w:rPr>
+          <w:b/>
+        </w:rPr>
+        <w:t>negazione</w:t>
+      </w:r>
+      <w:r>
+        <w:rPr/>
+        <w:t xml:space="preserve"> ¬p si legge "non p" e </w:t>
+      </w:r>
+      <w:r>
+        <w:rPr>
+          <w:b/>
+        </w:rPr>
+        <w:t>scambia</w:t>
+      </w:r>
+      <w:r>
+        <w:rPr/>
+        <w:t xml:space="preserve"> il valore di verità: è vera quando p è falsa e viceversa. Esempio del libro: se p è "π è stato calcolato con un milione di cifre decimali nel 1954" (falsa: ci si arrivò solo nel 1973), ¬p è vera.</w:t>
+      </w:r>
+    </w:p>
+    <w:p>
+      <w:pPr>
+        <w:pStyle w:val="Titolo2"/>
+      </w:pPr>
+      <w:r>
+        <w:rPr>
+          <w:b/>
+          <w:color w:val="E97132"/>
+        </w:rPr>
+        <w:t>Equivalenza e xor</w:t>
+      </w:r>
+    </w:p>
+    <w:p>
+      <w:r>
+        <w:rPr/>
+        <w:t>L'</w:t>
+      </w:r>
+      <w:r>
+        <w:rPr>
+          <w:b/>
+        </w:rPr>
+        <w:t>equivalenza</w:t>
+      </w:r>
+      <w:r>
+        <w:rPr/>
+        <w:t xml:space="preserve"> (o </w:t>
+      </w:r>
+      <w:r>
+        <w:rPr>
+          <w:b/>
+        </w:rPr>
+        <w:t>uguaglianza</w:t>
+      </w:r>
+      <w:r>
+        <w:rPr/>
+        <w:t xml:space="preserve"> tra booleani) è vera quando i due valori sono </w:t>
+      </w:r>
+      <w:r>
+        <w:rPr>
+          <w:b/>
+        </w:rPr>
+        <w:t>uguali</w:t>
+      </w:r>
+      <w:r>
+        <w:rPr/>
+        <w:t>, falsa quando sono diversi. In programmazione corrisponde al test di uguaglianza (</w:t>
+      </w:r>
+      <w:r>
+        <w:rPr>
+          <w:rFonts w:ascii="Consolas" w:hAnsi="Consolas" w:cs="Consolas"/>
+        </w:rPr>
+        <w:t>==</w:t>
+      </w:r>
+      <w:r>
+        <w:rPr/>
+        <w:t xml:space="preserve"> in C++ e Java). Lo </w:t>
+      </w:r>
+      <w:r>
+        <w:rPr>
+          <w:b/>
+        </w:rPr>
+        <w:t>xor</w:t>
+      </w:r>
+      <w:r>
+        <w:rPr/>
+        <w:t xml:space="preserve"> è la sua negazione: è vero quando i due valori sono </w:t>
+      </w:r>
+      <w:r>
+        <w:rPr>
+          <w:b/>
+        </w:rPr>
+        <w:t>diversi</w:t>
+      </w:r>
+      <w:r>
+        <w:rPr/>
+        <w:t>. L'equivalenza vale 0 nei due casi intermedi (valori diversi) e 1 nel primo e nell'ultimo (valori uguali); lo xor ha la tavola opposta.</w:t>
+      </w:r>
+    </w:p>
+    <w:p>
+      <w:pPr>
+        <w:pStyle w:val="Titolo2"/>
+      </w:pPr>
+      <w:r>
+        <w:rPr>
+          <w:b/>
+          <w:color w:val="E97132"/>
+        </w:rPr>
+        <w:t>Le tavole di questi connettivi</w:t>
+      </w:r>
+    </w:p>
+    <w:p>
+      <w:r>
+        <w:rPr/>
+        <w:t>Con l'ordine del libro (prima il vero, 1, poi il falso, 0) le tavole sono:</w:t>
+      </w:r>
+    </w:p>
+    <w:p>
+      <w:pPr>
+        <w:spacing w:after="0" w:before="0" w:line="240" w:lineRule="auto"/>
+      </w:pPr>
+      <w:r>
+        <w:rPr>
+          <w:rFonts w:ascii="Consolas" w:hAnsi="Consolas" w:cs="Consolas"/>
+          <w:sz w:val="17"/>
+        </w:rPr>
+        <w:t>p q | p∧q  p∨q  xor  equiv</w:t>
+      </w:r>
+    </w:p>
+    <w:p>
+      <w:pPr>
+        <w:spacing w:after="0" w:before="0" w:line="240" w:lineRule="auto"/>
+      </w:pPr>
+      <w:r>
+        <w:rPr>
+          <w:rFonts w:ascii="Consolas" w:hAnsi="Consolas" w:cs="Consolas"/>
+          <w:sz w:val="17"/>
+        </w:rPr>
+        <w:t>1 1 |  1    1    0    1</w:t>
+      </w:r>
+    </w:p>
+    <w:p>
+      <w:pPr>
+        <w:spacing w:after="0" w:before="0" w:line="240" w:lineRule="auto"/>
+      </w:pPr>
+      <w:r>
+        <w:rPr>
+          <w:rFonts w:ascii="Consolas" w:hAnsi="Consolas" w:cs="Consolas"/>
+          <w:sz w:val="17"/>
+        </w:rPr>
+        <w:t>1 0 |  0    1    1    0</w:t>
+      </w:r>
+    </w:p>
+    <w:p>
+      <w:pPr>
+        <w:spacing w:after="0" w:before="0" w:line="240" w:lineRule="auto"/>
+      </w:pPr>
+      <w:r>
+        <w:rPr>
+          <w:rFonts w:ascii="Consolas" w:hAnsi="Consolas" w:cs="Consolas"/>
+          <w:sz w:val="17"/>
+        </w:rPr>
+        <w:t>0 1 |  0    1    1    0</w:t>
+      </w:r>
+    </w:p>
+    <w:p>
+      <w:pPr>
+        <w:spacing w:after="0" w:before="0" w:line="240" w:lineRule="auto"/>
+      </w:pPr>
+      <w:r>
+        <w:rPr>
+          <w:rFonts w:ascii="Consolas" w:hAnsi="Consolas" w:cs="Consolas"/>
+          <w:sz w:val="17"/>
+        </w:rPr>
+        <w:t>0 0 |  0    0    0    1</w:t>
+      </w:r>
+    </w:p>
+    <w:p>
+      <w:pPr>
+        <w:spacing w:after="0" w:before="0" w:line="240" w:lineRule="auto"/>
+      </w:pPr>
+      <w:r>
+        <w:rPr>
+          <w:rFonts w:ascii="Consolas" w:hAnsi="Consolas" w:cs="Consolas"/>
+          <w:sz w:val="17"/>
+        </w:rPr>
+      </w:r>
+    </w:p>
+    <w:p>
+      <w:pPr>
+        <w:spacing w:after="0" w:before="0" w:line="240" w:lineRule="auto"/>
+      </w:pPr>
+      <w:r>
+        <w:rPr>
+          <w:rFonts w:ascii="Consolas" w:hAnsi="Consolas" w:cs="Consolas"/>
+          <w:sz w:val="17"/>
+        </w:rPr>
+        <w:t>p | ¬p</w:t>
+      </w:r>
+    </w:p>
+    <w:p>
+      <w:pPr>
+        <w:spacing w:after="0" w:before="0" w:line="240" w:lineRule="auto"/>
+      </w:pPr>
+      <w:r>
+        <w:rPr>
+          <w:rFonts w:ascii="Consolas" w:hAnsi="Consolas" w:cs="Consolas"/>
+          <w:sz w:val="17"/>
+        </w:rPr>
+        <w:t>1 | 0</w:t>
+      </w:r>
+    </w:p>
+    <w:p>
+      <w:pPr>
+        <w:spacing w:after="0" w:before="0" w:line="240" w:lineRule="auto"/>
+      </w:pPr>
+      <w:r>
+        <w:rPr>
+          <w:rFonts w:ascii="Consolas" w:hAnsi="Consolas" w:cs="Consolas"/>
+          <w:sz w:val="17"/>
+        </w:rPr>
+        <w:t>0 | 1</w:t>
+      </w:r>
+    </w:p>
+    <w:p/>
+    <w:p>
+      <w:pPr>
+        <w:pStyle w:val="Titolo2"/>
+      </w:pPr>
+      <w:r>
+        <w:rPr>
+          <w:b/>
+          <w:color w:val="E97132"/>
+        </w:rPr>
+        <w:t>Notazioni diverse per lo stesso connettivo</w:t>
+      </w:r>
+    </w:p>
+    <w:p>
+      <w:r>
+        <w:rPr/>
+        <w:t xml:space="preserve">Lo stesso connettivo si scrive in modi diversi a seconda del libro e del linguaggio: sono solo </w:t>
+      </w:r>
+      <w:r>
+        <w:rPr>
+          <w:b/>
+        </w:rPr>
+        <w:t>sinonimi</w:t>
+      </w:r>
+      <w:r>
+        <w:rPr/>
+        <w:t>, non hanno tavole di verità diverse. Se una notazione non è nota conviene chiedere che cosa significa.</w:t>
+      </w:r>
+    </w:p>
+    <w:p>
+      <w:pPr>
+        <w:numPr>
+          <w:ilvl w:val="0"/>
+          <w:numId w:val="1"/>
+        </w:numPr>
+      </w:pPr>
+      <w:r>
+        <w:rPr>
+          <w:b/>
+        </w:rPr>
+        <w:t>Negazione</w:t>
+      </w:r>
+      <w:r>
+        <w:rPr/>
+        <w:t xml:space="preserve">: "non" (italiano), *not* (inglese), il simbolo ¬, la tilde </w:t>
+      </w:r>
+      <w:r>
+        <w:rPr>
+          <w:i/>
+        </w:rPr>
+        <w:t xml:space="preserve">; nei linguaggi di programmazione (C, C++, Java) il punto esclamativo </w:t>
+      </w:r>
+      <w:r>
+        <w:rPr>
+          <w:rFonts w:ascii="Consolas" w:hAnsi="Consolas" w:cs="Consolas"/>
+          <w:i/>
+        </w:rPr>
+        <w:t>!</w:t>
+      </w:r>
+      <w:r>
+        <w:rPr>
+          <w:i/>
+        </w:rPr>
+        <w:t>.</w:t>
+      </w:r>
+    </w:p>
+    <w:p>
+      <w:pPr>
+        <w:numPr>
+          <w:ilvl w:val="0"/>
+          <w:numId w:val="1"/>
+        </w:numPr>
+      </w:pPr>
+      <w:r>
+        <w:rPr>
+          <w:b/>
+        </w:rPr>
+        <w:t>Congiunzione</w:t>
+      </w:r>
+      <w:r>
+        <w:rPr/>
+        <w:t xml:space="preserve">: "e", *et* (latino), *and*, il simbolo ∧, la "e commerciale" &amp;; in Java si scrive con la doppia </w:t>
+      </w:r>
+      <w:r>
+        <w:rPr>
+          <w:rFonts w:ascii="Consolas" w:hAnsi="Consolas" w:cs="Consolas"/>
+        </w:rPr>
+        <w:t>&amp;&amp;</w:t>
+      </w:r>
+      <w:r>
+        <w:rPr/>
+        <w:t>.</w:t>
+      </w:r>
+    </w:p>
+    <w:p>
+      <w:pPr>
+        <w:numPr>
+          <w:ilvl w:val="0"/>
+          <w:numId w:val="1"/>
+        </w:numPr>
+      </w:pPr>
+      <w:r>
+        <w:rPr>
+          <w:b/>
+        </w:rPr>
+        <w:t>Disgiunzione</w:t>
+      </w:r>
+      <w:r>
+        <w:rPr/>
+        <w:t xml:space="preserve">: "o" e "oppure", *vel* (latino), *or*, il simbolo ∨; in Java con la doppia barra verticale </w:t>
+      </w:r>
+      <w:r>
+        <w:rPr>
+          <w:rFonts w:ascii="Consolas" w:hAnsi="Consolas" w:cs="Consolas"/>
+        </w:rPr>
+        <w:t>||</w:t>
+      </w:r>
+      <w:r>
+        <w:rPr/>
+        <w:t>.</w:t>
+      </w:r>
+    </w:p>
+    <w:p>
+      <w:r>
+        <w:rPr/>
+        <w:t xml:space="preserve">Nei linguaggi di programmazione "and", "or" e "not" sono definiti esattamente come in logica (esempi del libro): per esempio </w:t>
+      </w:r>
+      <w:r>
+        <w:rPr>
+          <w:rFonts w:ascii="Consolas" w:hAnsi="Consolas" w:cs="Consolas"/>
+        </w:rPr>
+        <w:t>x &lt; 10 &amp;&amp; y &gt; 4</w:t>
+      </w:r>
+      <w:r>
+        <w:rPr/>
+        <w:t xml:space="preserve"> è vera quando x è minore di 10 </w:t>
+      </w:r>
+      <w:r>
+        <w:rPr>
+          <w:b/>
+        </w:rPr>
+        <w:t>e</w:t>
+      </w:r>
+      <w:r>
+        <w:rPr/>
+        <w:t xml:space="preserve"> y è maggiore di 4, </w:t>
+      </w:r>
+      <w:r>
+        <w:rPr>
+          <w:rFonts w:ascii="Consolas" w:hAnsi="Consolas" w:cs="Consolas"/>
+        </w:rPr>
+        <w:t>x &lt; 10 || y &gt; 4</w:t>
+      </w:r>
+      <w:r>
+        <w:rPr/>
+        <w:t xml:space="preserve"> quando vale almeno una delle due, e </w:t>
+      </w:r>
+      <w:r>
+        <w:rPr>
+          <w:rFonts w:ascii="Consolas" w:hAnsi="Consolas" w:cs="Consolas"/>
+        </w:rPr>
+        <w:t>!(x &lt; 10)</w:t>
+      </w:r>
+      <w:r>
+        <w:rPr/>
+        <w:t xml:space="preserve"> quando x è maggiore o uguale a 10.</w:t>
+      </w:r>
+    </w:p>
+    <w:p>
+      <w:pPr>
+        <w:pStyle w:val="Titolo2"/>
+      </w:pPr>
+      <w:r>
+        <w:rPr>
+          <w:b/>
+          <w:color w:val="E97132"/>
+        </w:rPr>
+        <w:t>La precedenza degli operatori</w:t>
+      </w:r>
+    </w:p>
+    <w:p>
+      <w:r>
+        <w:rPr/>
+        <w:t xml:space="preserve">Quando una formula contiene ¬, ∧ e ∨ senza parentesi, si valuta </w:t>
+      </w:r>
+      <w:r>
+        <w:rPr>
+          <w:b/>
+        </w:rPr>
+        <w:t>prima ¬, poi ∧, poi ∨</w:t>
+      </w:r>
+      <w:r>
+        <w:rPr/>
+        <w:t xml:space="preserve">: è la </w:t>
+      </w:r>
+      <w:r>
+        <w:rPr>
+          <w:b/>
+        </w:rPr>
+        <w:t>precedenza degli operatori</w:t>
+      </w:r>
+      <w:r>
+        <w:rPr/>
+        <w:t xml:space="preserve">, come in algebra la moltiplicazione e la divisione si fanno prima di somma e sottrazione. Esempio del libro: con p falsa, q vera e r falsa, quanto vale ¬p ∨ q ∧ r? Si valuta prima ¬p, che è vera; poi q ∧ r, che è falsa; infine l'intera formula, vera ∨ falsa, che è </w:t>
+      </w:r>
+      <w:r>
+        <w:rPr>
+          <w:b/>
+        </w:rPr>
+        <w:t>vera</w:t>
+      </w:r>
+      <w:r>
+        <w:rPr/>
+        <w:t>.</w:t>
+      </w:r>
+    </w:p>
+    <w:p>
+      <w:pPr>
+        <w:pStyle w:val="Titolo2"/>
+      </w:pPr>
+      <w:r>
+        <w:rPr>
+          <w:b/>
+          <w:color w:val="E97132"/>
+        </w:rPr>
+        <w:t>L'implicazione si rimanda</w:t>
+      </w:r>
+    </w:p>
+    <w:p>
+      <w:r>
+        <w:rPr/>
+        <w:t>Manca ancora l'</w:t>
+      </w:r>
+      <w:r>
+        <w:rPr>
+          <w:b/>
+        </w:rPr>
+        <w:t>implicazione</w:t>
+      </w:r>
+      <w:r>
+        <w:rPr/>
+        <w:t>. Il docente l'ha rimandata alla prossima lezione, perché è il primo caso in cui la definizione logica si discosta da quella del linguaggio naturale. Finora congiunzione, disgiunzione, negazione ed equivalenza corrispondono abbastanza bene a quello che si intende nel parlato; con l'implicazione invece si possono creare confusioni, e sarà dedicata una lezione alle tavole di verità che la comprendono.</w:t>
+      </w:r>
+    </w:p>
+    <w:p>
+      <w:r>
+        <w:rPr/>
+        <w:t>Nel prossimo capitolo si vede come si costruisce una tavola di verità per formule più complesse.</w:t>
+      </w:r>
+    </w:p>
+    <w:p>
+      <w:pPr>
+        <w:pStyle w:val="Titolo1"/>
+      </w:pPr>
+      <w:r>
+        <w:rPr>
+          <w:b/>
+          <w:color w:val="EE0000"/>
+        </w:rPr>
+        <w:t>14. Le Tavole di Verità</w:t>
+      </w:r>
+    </w:p>
+    <w:p>
+      <w:pPr>
+        <w:pStyle w:val="Titolo2"/>
+      </w:pPr>
+      <w:r>
+        <w:rPr>
+          <w:b/>
+          <w:color w:val="E97132"/>
+        </w:rPr>
+        <w:t>A che cosa servono</w:t>
+      </w:r>
+    </w:p>
+    <w:p>
+      <w:r>
+        <w:rPr/>
+        <w:t xml:space="preserve">Una </w:t>
+      </w:r>
+      <w:r>
+        <w:rPr>
+          <w:b/>
+        </w:rPr>
+        <w:t>tavola di verità</w:t>
+      </w:r>
+      <w:r>
+        <w:rPr/>
+        <w:t xml:space="preserve"> è un elenco di </w:t>
+      </w:r>
+      <w:r>
+        <w:rPr>
+          <w:b/>
+        </w:rPr>
+        <w:t>tutte</w:t>
+      </w:r>
+      <w:r>
+        <w:rPr/>
+        <w:t xml:space="preserve"> le combinazioni possibili dei valori di verità delle componenti atomiche, con a fianco, per ciascuna combinazione, il valore di verità della proposizione composta. È un modo alternativo di definire un connettivo: non più come circuito, ma come tabella. Serve perché non è facile stabilire se due circuiti sono equivalenti, mentre si possono leggere come formule proposizionali e confrontare le loro tavole: è l'applicazione principale delle tavole di verità in informatica.</w:t>
+      </w:r>
+    </w:p>
+    <w:p>
+      <w:pPr>
+        <w:pStyle w:val="Titolo2"/>
+      </w:pPr>
+      <w:r>
+        <w:rPr>
+          <w:b/>
+          <w:color w:val="E97132"/>
+        </w:rPr>
+        <w:t>Come si costruisce</w:t>
+      </w:r>
+    </w:p>
+    <w:p>
+      <w:r>
+        <w:rPr/>
+        <w:t>Nella tavola si mettono a sinistra le componenti atomiche (indicate con lettere minuscole, p, q, r, …) e nell'ultima colonna la proposizione composta. Le componenti possono essere qualsiasi affermazione a cui si sa assegnare un valore di verità; per le equazioni vanno prima assegnati i parametri. Per ogni riga si scrive il valore di verità della formula seguendo la definizione del connettivo: nella tavola della disgiunzione, per esempio, si scrive 1 ogni volta che c'è almeno un 1 tra gli argomenti, e 0 solo quando sono entrambi 0.</w:t>
+      </w:r>
+    </w:p>
+    <w:p>
+      <w:r>
+        <w:rPr/>
+        <w:t xml:space="preserve">Una formula più complessa si calcola </w:t>
+      </w:r>
+      <w:r>
+        <w:rPr>
+          <w:b/>
+        </w:rPr>
+        <w:t>a passi</w:t>
+      </w:r>
+      <w:r>
+        <w:rPr/>
+        <w:t>, con una colonna per ogni sottoformula. Esempio del docente, la formula (p ∨ q) ∧ ¬p: ci sono due variabili, ma più sottoformule (p ∨ q, ¬p e l'intera congiunzione).</w:t>
+      </w:r>
+    </w:p>
+    <w:p>
+      <w:pPr>
+        <w:spacing w:after="0" w:before="0" w:line="240" w:lineRule="auto"/>
+      </w:pPr>
+      <w:r>
+        <w:rPr>
+          <w:rFonts w:ascii="Consolas" w:hAnsi="Consolas" w:cs="Consolas"/>
+          <w:sz w:val="17"/>
+        </w:rPr>
+        <w:t>p q | p∨q  ¬p | (p∨q)∧¬p</w:t>
+      </w:r>
+    </w:p>
+    <w:p>
+      <w:pPr>
+        <w:spacing w:after="0" w:before="0" w:line="240" w:lineRule="auto"/>
+      </w:pPr>
+      <w:r>
+        <w:rPr>
+          <w:rFonts w:ascii="Consolas" w:hAnsi="Consolas" w:cs="Consolas"/>
+          <w:sz w:val="17"/>
+        </w:rPr>
+        <w:t>1 1 |  1    0  |    0</w:t>
+      </w:r>
+    </w:p>
+    <w:p>
+      <w:pPr>
+        <w:spacing w:after="0" w:before="0" w:line="240" w:lineRule="auto"/>
+      </w:pPr>
+      <w:r>
+        <w:rPr>
+          <w:rFonts w:ascii="Consolas" w:hAnsi="Consolas" w:cs="Consolas"/>
+          <w:sz w:val="17"/>
+        </w:rPr>
+        <w:t>1 0 |  1    0  |    0</w:t>
+      </w:r>
+    </w:p>
+    <w:p>
+      <w:pPr>
+        <w:spacing w:after="0" w:before="0" w:line="240" w:lineRule="auto"/>
+      </w:pPr>
+      <w:r>
+        <w:rPr>
+          <w:rFonts w:ascii="Consolas" w:hAnsi="Consolas" w:cs="Consolas"/>
+          <w:sz w:val="17"/>
+        </w:rPr>
+        <w:t>0 1 |  1    1  |    1</w:t>
+      </w:r>
+    </w:p>
+    <w:p>
+      <w:pPr>
+        <w:spacing w:after="0" w:before="0" w:line="240" w:lineRule="auto"/>
+      </w:pPr>
+      <w:r>
+        <w:rPr>
+          <w:rFonts w:ascii="Consolas" w:hAnsi="Consolas" w:cs="Consolas"/>
+          <w:sz w:val="17"/>
+        </w:rPr>
+        <w:t>0 0 |  0    1  |    0</w:t>
+      </w:r>
+    </w:p>
+    <w:p/>
+    <w:p>
+      <w:r>
+        <w:rPr/>
+        <w:t>La congiunzione ha un solo 1, quello della riga in cui p è falsa e q è vera. Lo stesso risultato si ottiene ragionando: se p è falsa, il primo argomento p ∨ q è vero solo se lo è q; se p è vera, ¬p è falsa e la congiunzione è falsa. Quindi (p ∨ q) ∧ ¬p equivale a ¬p ∧ q, una formula più breve: un modo per semplificare e, in un circuito, risparmiare una porta.</w:t>
+      </w:r>
+    </w:p>
+    <w:p>
+      <w:pPr>
+        <w:pStyle w:val="Titolo2"/>
+      </w:pPr>
+      <w:r>
+        <w:rPr>
+          <w:b/>
+          <w:color w:val="E97132"/>
+        </w:rPr>
+        <w:t>Quante righe ci sono</w:t>
+      </w:r>
+    </w:p>
+    <w:p>
+      <w:r>
+        <w:rPr/>
+        <w:t xml:space="preserve">Con </w:t>
+      </w:r>
+      <w:r>
+        <w:rPr>
+          <w:b/>
+        </w:rPr>
+        <w:t>n</w:t>
+      </w:r>
+      <w:r>
+        <w:rPr/>
+        <w:t xml:space="preserve"> proposizioni atomiche le righe sono </w:t>
+      </w:r>
+      <w:r>
+        <w:rPr>
+          <w:b/>
+        </w:rPr>
+        <w:t>2ⁿ</w:t>
+      </w:r>
+      <w:r>
+        <w:rPr/>
+        <w:t>: 1 proposizione dà 2 righe, 2 danno 4, 3 danno 8 (come nell'esempio del libro). È un teorema che si dimostra per induzione e che si vedrà anche in Matematica discreta.</w:t>
+      </w:r>
+    </w:p>
+    <w:p>
+      <w:r>
+        <w:rPr/>
+        <w:t xml:space="preserve">Bisogna elencare </w:t>
+      </w:r>
+      <w:r>
+        <w:rPr>
+          <w:b/>
+        </w:rPr>
+        <w:t>tutti</w:t>
+      </w:r>
+      <w:r>
+        <w:rPr/>
+        <w:t xml:space="preserve"> i casi, e </w:t>
+      </w:r>
+      <w:r>
+        <w:rPr>
+          <w:b/>
+        </w:rPr>
+        <w:t>una volta sola</w:t>
+      </w:r>
+      <w:r>
+        <w:rPr/>
+        <w:t>. La prima richiesta è di correttezza: se manca un caso la definizione o il confronto non sono corretti. La seconda è di efficienza: ripetere uno stesso caso è uno spreco.</w:t>
+      </w:r>
+    </w:p>
+    <w:p>
+      <w:pPr>
+        <w:pStyle w:val="Titolo2"/>
+      </w:pPr>
+      <w:r>
+        <w:rPr>
+          <w:b/>
+          <w:color w:val="E97132"/>
+        </w:rPr>
+        <w:t>Come essere sicuri di averli scritti tutti</w:t>
+      </w:r>
+    </w:p>
+    <w:p>
+      <w:r>
+        <w:rPr/>
+        <w:t>Il docente ne ha mostrati due e ha descritto un terzo, quello del libro.</w:t>
+      </w:r>
+    </w:p>
+    <w:p>
+      <w:r>
+        <w:rPr/>
+        <w:t xml:space="preserve">1. </w:t>
+      </w:r>
+      <w:r>
+        <w:rPr>
+          <w:b/>
+        </w:rPr>
+        <w:t>Contare e confrontare</w:t>
+      </w:r>
+      <w:r>
+        <w:rPr/>
+        <w:t xml:space="preserve"> (principio della piccionaia): se le righe sono 2ⁿ e nessuna compare due volte, allora sono tutte, perché se ne avessi dimenticata una dovrebbe comparirne una ripetuta. Si contano le righe, poi si controlla riga per riga che non sia già stata scritta.</w:t>
+      </w:r>
+    </w:p>
+    <w:p>
+      <w:r>
+        <w:rPr/>
+        <w:t xml:space="preserve">2. </w:t>
+      </w:r>
+      <w:r>
+        <w:rPr>
+          <w:b/>
+        </w:rPr>
+        <w:t>Contare all'indietro</w:t>
+      </w:r>
+      <w:r>
+        <w:rPr/>
+        <w:t>: le n proposizioni atomiche, se si rappresentano con 0 e 1, formano un numero binario di n cifre. Si scrive prima la riga con tutti 1 (cioè 2ⁿ − 1) e si scende fino alla riga di tutti 0. Con 3 variabili: 111 (7), 110 (6), 101 (5), 100 (4), 011 (3), 010 (2), 001 (1), 000 (0). Scrivere la lista all'incontrario non cambia nulla, perché conta solo che ci siano tutti i casi.</w:t>
+      </w:r>
+    </w:p>
+    <w:p>
+      <w:r>
+        <w:rPr/>
+        <w:t xml:space="preserve">3. </w:t>
+      </w:r>
+      <w:r>
+        <w:rPr>
+          <w:b/>
+        </w:rPr>
+        <w:t>Il metodo dei periodi del libro</w:t>
+      </w:r>
+      <w:r>
+        <w:rPr/>
+        <w:t>: con n variabili le righe sono 2ⁿ. La prima variabile si scrive a blocchi lunghi quanto metà delle righe (nel caso di 8 righe: 4 volte 1, poi 4 volte 0); la seconda con blocchi dimezzati (2 volte 1, 2 volte 0, e si ripete); la terza con blocchi di lunghezza 1 (1, 0, 1, 0, …); con 4 variabili i blocchi sono lunghi 8, 4, 2, 1 (il docente li chiama periodi). È un terzo modo per prenderli tutti, una volta ciascuno.</w:t>
+      </w:r>
+    </w:p>
+    <w:p>
+      <w:pPr>
+        <w:pStyle w:val="Titolo2"/>
+      </w:pPr>
+      <w:r>
+        <w:rPr>
+          <w:b/>
+          <w:color w:val="E97132"/>
+        </w:rPr>
+        <w:t>Dualità tra and e or</w:t>
+      </w:r>
+    </w:p>
+    <w:p>
+      <w:r>
+        <w:rPr/>
+        <w:t xml:space="preserve">Nell'ordine del libro la congiunzione ha un solo 1 (quello con tutti gli argomenti veri, in cima alla tavola), mentre la disgiunzione ha un solo 0 (quello con tutti gli argomenti falsi, in fondo). Quindi le due tavole si ottengono l'una dall'altra </w:t>
+      </w:r>
+      <w:r>
+        <w:rPr>
+          <w:b/>
+        </w:rPr>
+        <w:t>scambiando 0 e 1</w:t>
+      </w:r>
+      <w:r>
+        <w:rPr/>
+        <w:t xml:space="preserve"> (e scambiando sopra e sotto): si dice che congiunzione e disgiunzione sono </w:t>
+      </w:r>
+      <w:r>
+        <w:rPr>
+          <w:b/>
+        </w:rPr>
+        <w:t>duali</w:t>
+      </w:r>
+      <w:r>
+        <w:rPr/>
+        <w:t xml:space="preserve">. La negazione è duale di sé stessa, perché scambiando 0 e 1 nella sua tavola si ottiene la stessa tavola (è </w:t>
+      </w:r>
+      <w:r>
+        <w:rPr>
+          <w:b/>
+        </w:rPr>
+        <w:t>autoduale</w:t>
+      </w:r>
+      <w:r>
+        <w:rPr/>
+        <w:t>). Il docente ha anticipato che torneranno più avanti, perché è più importante di quanto sembri: tornerà quando si studieranno le leggi di De Morgan.</w:t>
+      </w:r>
+    </w:p>
+    <w:p>
+      <w:r>
+        <w:rPr/>
+        <w:t>Il prossimo capitolo usa le tavole per confrontare formule: equivalenze, tautologie e contraddizioni.</w:t>
+      </w:r>
+    </w:p>
+    <w:p>
+      <w:pPr>
+        <w:pStyle w:val="Titolo1"/>
+      </w:pPr>
+      <w:r>
+        <w:rPr>
+          <w:b/>
+          <w:color w:val="EE0000"/>
+        </w:rPr>
+        <w:t>15. Equivalenze, Tautologie e Contraddizioni</w:t>
+      </w:r>
+    </w:p>
+    <w:p>
+      <w:pPr>
+        <w:pStyle w:val="Titolo2"/>
+      </w:pPr>
+      <w:r>
+        <w:rPr>
+          <w:b/>
+          <w:color w:val="E97132"/>
+        </w:rPr>
+        <w:t>Formule equivalenti</w:t>
+      </w:r>
+    </w:p>
+    <w:p>
+      <w:r>
+        <w:rPr/>
+        <w:t xml:space="preserve">Due formule sono </w:t>
+      </w:r>
+      <w:r>
+        <w:rPr>
+          <w:b/>
+        </w:rPr>
+        <w:t>equivalenti</w:t>
+      </w:r>
+      <w:r>
+        <w:rPr/>
+        <w:t xml:space="preserve"> se hanno gli stessi valori di verità per tutti i valori di verità delle loro componenti atomiche, cioè se hanno la </w:t>
+      </w:r>
+      <w:r>
+        <w:rPr>
+          <w:b/>
+        </w:rPr>
+        <w:t>stessa tavola di verità</w:t>
+      </w:r>
+      <w:r>
+        <w:rPr/>
+        <w:t>. Non sono la stessa formula, ma si possono scambiare l'una con l'altra, scegliendo quella più utile in un dato contesto. Questo vale per i circuiti (due circuiti equivalenti si possono sostituire), ma anche per i programmi: prima di sostituire la condizione di uscita di un ciclo con un'altra formula più leggibile bisogna essere sicuri che sia equivalente, altrimenti si cambia il comportamento del programma.</w:t>
+      </w:r>
+    </w:p>
+    <w:p>
+      <w:pPr>
+        <w:pStyle w:val="Titolo2"/>
+      </w:pPr>
+      <w:r>
+        <w:rPr>
+          <w:b/>
+          <w:color w:val="E97132"/>
+        </w:rPr>
+        <w:t>Esempio: la negazione di una disgiunzione</w:t>
+      </w:r>
+    </w:p>
+    <w:p>
+      <w:r>
+        <w:rPr/>
+        <w:t xml:space="preserve">Si vuole vedere che </w:t>
+      </w:r>
+      <w:r>
+        <w:rPr>
+          <w:b/>
+        </w:rPr>
+        <w:t>¬(p ∨ q)</w:t>
+      </w:r>
+      <w:r>
+        <w:rPr/>
+        <w:t xml:space="preserve"> è equivalente a </w:t>
+      </w:r>
+      <w:r>
+        <w:rPr>
+          <w:b/>
+        </w:rPr>
+        <w:t>¬p ∧ ¬q</w:t>
+      </w:r>
+      <w:r>
+        <w:rPr/>
+        <w:t>. Con le tavole di verità:</w:t>
+      </w:r>
+    </w:p>
+    <w:p>
+      <w:pPr>
+        <w:spacing w:after="0" w:before="0" w:line="240" w:lineRule="auto"/>
+      </w:pPr>
+      <w:r>
+        <w:rPr>
+          <w:rFonts w:ascii="Consolas" w:hAnsi="Consolas" w:cs="Consolas"/>
+          <w:sz w:val="17"/>
+        </w:rPr>
+        <w:t>p q | p∨q  ¬(p∨q) | ¬p  ¬q  ¬p∧¬q</w:t>
+      </w:r>
+    </w:p>
+    <w:p>
+      <w:pPr>
+        <w:spacing w:after="0" w:before="0" w:line="240" w:lineRule="auto"/>
+      </w:pPr>
+      <w:r>
+        <w:rPr>
+          <w:rFonts w:ascii="Consolas" w:hAnsi="Consolas" w:cs="Consolas"/>
+          <w:sz w:val="17"/>
+        </w:rPr>
+        <w:t>1 1 |  1      0    |  0   0    0</w:t>
+      </w:r>
+    </w:p>
+    <w:p>
+      <w:pPr>
+        <w:spacing w:after="0" w:before="0" w:line="240" w:lineRule="auto"/>
+      </w:pPr>
+      <w:r>
+        <w:rPr>
+          <w:rFonts w:ascii="Consolas" w:hAnsi="Consolas" w:cs="Consolas"/>
+          <w:sz w:val="17"/>
+        </w:rPr>
+        <w:t>1 0 |  1      0    |  0   1    0</w:t>
+      </w:r>
+    </w:p>
+    <w:p>
+      <w:pPr>
+        <w:spacing w:after="0" w:before="0" w:line="240" w:lineRule="auto"/>
+      </w:pPr>
+      <w:r>
+        <w:rPr>
+          <w:rFonts w:ascii="Consolas" w:hAnsi="Consolas" w:cs="Consolas"/>
+          <w:sz w:val="17"/>
+        </w:rPr>
+        <w:t>0 1 |  1      0    |  1   0    0</w:t>
+      </w:r>
+    </w:p>
+    <w:p>
+      <w:pPr>
+        <w:spacing w:after="0" w:before="0" w:line="240" w:lineRule="auto"/>
+      </w:pPr>
+      <w:r>
+        <w:rPr>
+          <w:rFonts w:ascii="Consolas" w:hAnsi="Consolas" w:cs="Consolas"/>
+          <w:sz w:val="17"/>
+        </w:rPr>
+        <w:t>0 0 |  0      1    |  1   1    1</w:t>
+      </w:r>
+    </w:p>
+    <w:p/>
+    <w:p>
+      <w:r>
+        <w:rPr/>
+        <w:t>Le colonne ¬(p∨q) e ¬p∧¬q coincidono. Lo stesso risultato si ottiene anche con un ragionamento, che il docente ha presentato passo per passo:</w:t>
+      </w:r>
+    </w:p>
+    <w:p>
+      <w:r>
+        <w:rPr/>
+        <w:t>1. ¬(p ∨ q) è vera se e solo se p ∨ q è falsa;</w:t>
+      </w:r>
+    </w:p>
+    <w:p>
+      <w:r>
+        <w:rPr/>
+        <w:t>2. una disgiunzione è falsa se e solo se i suoi argomenti sono entrambi falsi: p è falsa e q è falsa;</w:t>
+      </w:r>
+    </w:p>
+    <w:p>
+      <w:r>
+        <w:rPr/>
+        <w:t>3. questo accade se e solo se ¬p e ¬q sono entrambe vere;</w:t>
+      </w:r>
+    </w:p>
+    <w:p>
+      <w:r>
+        <w:rPr/>
+        <w:t>4. cioè se e solo se è vera la loro congiunzione ¬p ∧ ¬q.</w:t>
+      </w:r>
+    </w:p>
+    <w:p>
+      <w:r>
+        <w:rPr/>
+        <w:t>È un caso delle leggi di De Morgan, che il corso riprenderà più in dettaglio. Si può dimostrare con le tavole oppure con un ragionamento a parole.</w:t>
+      </w:r>
+    </w:p>
+    <w:p>
+      <w:pPr>
+        <w:pStyle w:val="Titolo2"/>
+      </w:pPr>
+      <w:r>
+        <w:rPr>
+          <w:b/>
+          <w:color w:val="E97132"/>
+        </w:rPr>
+        <w:t>Tautologie e contraddizioni</w:t>
+      </w:r>
+    </w:p>
+    <w:p>
+      <w:r>
+        <w:rPr/>
+        <w:t xml:space="preserve">Una </w:t>
+      </w:r>
+      <w:r>
+        <w:rPr>
+          <w:b/>
+        </w:rPr>
+        <w:t>tautologia</w:t>
+      </w:r>
+      <w:r>
+        <w:rPr/>
+        <w:t xml:space="preserve"> è una formula che è </w:t>
+      </w:r>
+      <w:r>
+        <w:rPr>
+          <w:b/>
+        </w:rPr>
+        <w:t>sempre vera</w:t>
+      </w:r>
+      <w:r>
+        <w:rPr/>
+        <w:t xml:space="preserve">, qualunque siano i valori delle sue componenti: nella colonna finale della sua tavola ci sono solo 1. Una </w:t>
+      </w:r>
+      <w:r>
+        <w:rPr>
+          <w:b/>
+        </w:rPr>
+        <w:t>contraddizione</w:t>
+      </w:r>
+      <w:r>
+        <w:rPr/>
+        <w:t xml:space="preserve"> è l'opposto: una formula </w:t>
+      </w:r>
+      <w:r>
+        <w:rPr>
+          <w:b/>
+        </w:rPr>
+        <w:t>sempre falsa</w:t>
+      </w:r>
+      <w:r>
+        <w:rPr/>
+        <w:t xml:space="preserve">. La negazione di una tautologia è una contraddizione, e viceversa. Il </w:t>
+      </w:r>
+      <w:r>
+        <w:rPr>
+          <w:b/>
+        </w:rPr>
+        <w:t>problema della tautologia</w:t>
+      </w:r>
+      <w:r>
+        <w:rPr/>
+        <w:t xml:space="preserve"> è appunto quello di stabilire se una formula vale sempre.</w:t>
+      </w:r>
+    </w:p>
+    <w:p>
+      <w:r>
+        <w:rPr/>
+        <w:t>Le tavole di verità servono a controllare:</w:t>
+      </w:r>
+    </w:p>
+    <w:p>
+      <w:pPr>
+        <w:numPr>
+          <w:ilvl w:val="0"/>
+          <w:numId w:val="1"/>
+        </w:numPr>
+      </w:pPr>
+      <w:r>
+        <w:rPr/>
+        <w:t>se due formule sono equivalenti;</w:t>
+      </w:r>
+    </w:p>
+    <w:p>
+      <w:pPr>
+        <w:numPr>
+          <w:ilvl w:val="0"/>
+          <w:numId w:val="1"/>
+        </w:numPr>
+      </w:pPr>
+      <w:r>
+        <w:rPr/>
+        <w:t>se una formula è sempre vera (una legge logica), come le leggi di De Morgan o l'associatività della disgiunzione.</w:t>
+      </w:r>
+    </w:p>
+    <w:p>
+      <w:pPr>
+        <w:pStyle w:val="Titolo2"/>
+      </w:pPr>
+      <w:r>
+        <w:rPr>
+          <w:b/>
+          <w:color w:val="E97132"/>
+        </w:rPr>
+        <w:t>Esempi svolti a lezione</w:t>
+      </w:r>
+    </w:p>
+    <w:p>
+      <w:r>
+        <w:rPr>
+          <w:b/>
+        </w:rPr>
+        <w:t>¬p ∨ q ∨ p.</w:t>
+      </w:r>
+      <w:r>
+        <w:rPr/>
+        <w:t xml:space="preserve"> Costruita la tavola, in ogni riga c'è almeno un 1: è una </w:t>
+      </w:r>
+      <w:r>
+        <w:rPr>
+          <w:b/>
+        </w:rPr>
+        <w:t>tautologia</w:t>
+      </w:r>
+      <w:r>
+        <w:rPr/>
+        <w:t>.</w:t>
+      </w:r>
+    </w:p>
+    <w:p>
+      <w:r>
+        <w:rPr>
+          <w:b/>
+        </w:rPr>
+        <w:t>p ∨ ¬p</w:t>
+      </w:r>
+      <w:r>
+        <w:rPr/>
+        <w:t xml:space="preserve">, chiamata </w:t>
+      </w:r>
+      <w:r>
+        <w:rPr>
+          <w:b/>
+        </w:rPr>
+        <w:t>terzo escluso</w:t>
+      </w:r>
+      <w:r>
+        <w:rPr/>
+        <w:t>. Se p è vera la disgiunzione è vera perché un argomento è vero; se p è falsa, ¬p è vera e di nuovo la disgiunzione è vera. Il nome dice che "o p è vera o è falsa, e non c'è un terzo caso": in realtà, ha sottolineato il docente, la logica è costruita con soli due valori di verità, e ne esistono altre, con valori intermedi, usate in informatica per scopi diversi, ma qui si usa sempre la logica a due valori.</w:t>
+      </w:r>
+    </w:p>
+    <w:p>
+      <w:r>
+        <w:rPr>
+          <w:b/>
+        </w:rPr>
+        <w:t>(p ∨ q) ∧ ¬p.</w:t>
+      </w:r>
+      <w:r>
+        <w:rPr/>
+        <w:t xml:space="preserve"> È vera in una sola riga, quella con p falsa e q vera: non è né una tautologia né una contraddizione, ma equivale a ¬p ∧ q, più semplice (come visto nel capitolo precedente).</w:t>
+      </w:r>
+    </w:p>
+    <w:p>
+      <w:pPr>
+        <w:pStyle w:val="Titolo2"/>
+      </w:pPr>
+      <w:r>
+        <w:rPr>
+          <w:b/>
+          <w:color w:val="E97132"/>
+        </w:rPr>
+        <w:t>Una dimostrazione algebrica</w:t>
+      </w:r>
+    </w:p>
+    <w:p>
+      <w:r>
+        <w:rPr/>
+        <w:t>Lo stesso fatto si può dimostrare con un ragionamento algebrico, senza tavola, usando due proprietà della disgiunzione:</w:t>
+      </w:r>
+    </w:p>
+    <w:p>
+      <w:pPr>
+        <w:numPr>
+          <w:ilvl w:val="0"/>
+          <w:numId w:val="1"/>
+        </w:numPr>
+      </w:pPr>
+      <w:r>
+        <w:rPr>
+          <w:b/>
+        </w:rPr>
+        <w:t>commutatività</w:t>
+      </w:r>
+      <w:r>
+        <w:rPr/>
+        <w:t>: p ∨ q e q ∨ p hanno la stessa tavola di verità; la definizione dice che la disgiunzione è vera se almeno un argomento è vero, senza nominare l'ordine;</w:t>
+      </w:r>
+    </w:p>
+    <w:p>
+      <w:pPr>
+        <w:numPr>
+          <w:ilvl w:val="0"/>
+          <w:numId w:val="1"/>
+        </w:numPr>
+      </w:pPr>
+      <w:r>
+        <w:rPr>
+          <w:b/>
+        </w:rPr>
+        <w:t>associatività</w:t>
+      </w:r>
+      <w:r>
+        <w:rPr/>
+        <w:t>: (p ∨ q) ∨ r equivale a p ∨ (q ∨ r); si possono spostare le parentesi.</w:t>
+      </w:r>
+    </w:p>
+    <w:p>
+      <w:r>
+        <w:rPr/>
+        <w:t>Per ¬p ∨ q ∨ p: con la commutatività si sposta p accanto a ¬p, con l'associatività si raggruppa (¬p ∨ p) ∨ q; la parte tra parentesi è un terzo escluso, sempre vera, quindi si ottiene vero ∨ q, che è vera perché un argomento è vero. Il risultato non dipende dal valore di q.</w:t>
+      </w:r>
+    </w:p>
+    <w:p>
+      <w:pPr>
+        <w:pStyle w:val="Titolo2"/>
+      </w:pPr>
+      <w:r>
+        <w:rPr>
+          <w:b/>
+          <w:color w:val="E97132"/>
+        </w:rPr>
+        <w:t>Perché le tavole non bastano sempre</w:t>
+      </w:r>
+    </w:p>
+    <w:p>
+      <w:r>
+        <w:rPr/>
+        <w:t xml:space="preserve">Le tavole di verità hanno un limite: le righe sono 2ⁿ. Con 1000 proposizioni atomiche sono 2¹⁰⁰⁰, un po' più di 10³⁰⁰ righe, un numero più grande del numero di particelle dell'universo. Con questa dimensione non si può usare la tavola, e servono metodi più veloci, che il corso accennerà più avanti. Il caso non è teorico: nella </w:t>
+      </w:r>
+      <w:r>
+        <w:rPr>
+          <w:b/>
+        </w:rPr>
+        <w:t>verifica di sistemi complessi</w:t>
+      </w:r>
+      <w:r>
+        <w:rPr/>
+        <w:t xml:space="preserve"> (*model checking*) si descrive il sistema con una formula proposizionale che dice "non esiste una situazione di pericolo", con migliaia di affermazioni atomiche (la posizione e la velocità dei treni, lo stato dei segnali, la rete elettrica, il comportamento delle persone). Il docente ha citato studi di questo tipo per la metropolitana di Londra e per le ferrovie svedesi. Il model checking non fa parte del corso, ma è una delle motivazioni: a Fondamenti si impara la logica come base del ragionamento automatico.</w:t>
+      </w:r>
+    </w:p>
+    <w:p>
+      <w:r>
+        <w:rPr/>
+        <w:t>Nella prossima lezione si introduce l'implicazione.</w:t>
+      </w:r>
+    </w:p>
     <w:sectPr>
       <w:pgSz w:w="11906" w:h="16838"/>
       <w:pgMar w:top="1417" w:right="1134" w:bottom="1134" w:left="1134" w:header="708" w:footer="708" w:gutter="0"/>

</xml_diff>

<commit_message>
Fondamenti (13) e Programmazione (12): figure inserite nei capitoli esistenti (figure_info.py)
Co-Authored-By: Claude Sonnet 5.5 <noreply@anthropic.com>
</commit_message>
<xml_diff>
--- a/Riassunto Fondamenti Informatica.docx
+++ b/Riassunto Fondamenti Informatica.docx
@@ -745,6 +745,59 @@
     </w:p>
     <w:p>
       <w:pPr>
+        <w:keepNext/>
+        <w:spacing w:before="120"/>
+        <w:jc w:val="center"/>
+      </w:pPr>
+      <w:r>
+        <w:drawing>
+          <wp:inline xmlns:a="http://schemas.openxmlformats.org/drawingml/2006/main" xmlns:pic="http://schemas.openxmlformats.org/drawingml/2006/picture">
+            <wp:extent cx="3600000" cy="1680000"/>
+            <wp:docPr id="2073952343" name="Picture 2073952343"/>
+            <wp:cNvGraphicFramePr>
+              <a:graphicFrameLocks noChangeAspect="1"/>
+            </wp:cNvGraphicFramePr>
+            <a:graphic>
+              <a:graphicData uri="http://schemas.openxmlformats.org/drawingml/2006/picture">
+                <pic:pic>
+                  <pic:nvPicPr>
+                    <pic:cNvPr id="0" name="ch02_blocchi_esadecimale.png"/>
+                    <pic:cNvPicPr/>
+                  </pic:nvPicPr>
+                  <pic:blipFill>
+                    <a:blip r:embed="rId20"/>
+                    <a:stretch>
+                      <a:fillRect/>
+                    </a:stretch>
+                  </pic:blipFill>
+                  <pic:spPr>
+                    <a:xfrm>
+                      <a:off x="0" y="0"/>
+                      <a:ext cx="3600000" cy="1680000"/>
+                    </a:xfrm>
+                    <a:prstGeom prst="rect"/>
+                  </pic:spPr>
+                </pic:pic>
+              </a:graphicData>
+            </a:graphic>
+          </wp:inline>
+        </w:drawing>
+      </w:r>
+    </w:p>
+    <w:p>
+      <w:pPr>
+        <w:jc w:val="center"/>
+      </w:pPr>
+      <w:r>
+        <w:rPr>
+          <w:i/>
+          <w:sz w:val="18"/>
+        </w:rPr>
+        <w:t>Da binario a esadecimale: blocchi da 4 bit, ciascuno diventa una cifra.</w:t>
+      </w:r>
+    </w:p>
+    <w:p>
+      <w:pPr>
         <w:numPr>
           <w:ilvl w:val="1"/>
           <w:numId w:val="4"/>
@@ -1207,6 +1260,59 @@
       </w:r>
     </w:p>
     <w:p>
+      <w:pPr>
+        <w:keepNext/>
+        <w:spacing w:before="120"/>
+        <w:jc w:val="center"/>
+      </w:pPr>
+      <w:r>
+        <w:drawing>
+          <wp:inline xmlns:a="http://schemas.openxmlformats.org/drawingml/2006/main" xmlns:pic="http://schemas.openxmlformats.org/drawingml/2006/picture">
+            <wp:extent cx="2880000" cy="2520478"/>
+            <wp:docPr id="2073952342" name="Picture 2073952342"/>
+            <wp:cNvGraphicFramePr>
+              <a:graphicFrameLocks noChangeAspect="1"/>
+            </wp:cNvGraphicFramePr>
+            <a:graphic>
+              <a:graphicData uri="http://schemas.openxmlformats.org/drawingml/2006/picture">
+                <pic:pic>
+                  <pic:nvPicPr>
+                    <pic:cNvPr id="0" name="ch03_hdd_tracce_settori.png"/>
+                    <pic:cNvPicPr/>
+                  </pic:nvPicPr>
+                  <pic:blipFill>
+                    <a:blip r:embed="rId19"/>
+                    <a:stretch>
+                      <a:fillRect/>
+                    </a:stretch>
+                  </pic:blipFill>
+                  <pic:spPr>
+                    <a:xfrm>
+                      <a:off x="0" y="0"/>
+                      <a:ext cx="2880000" cy="2520478"/>
+                    </a:xfrm>
+                    <a:prstGeom prst="rect"/>
+                  </pic:spPr>
+                </pic:pic>
+              </a:graphicData>
+            </a:graphic>
+          </wp:inline>
+        </w:drawing>
+      </w:r>
+    </w:p>
+    <w:p>
+      <w:pPr>
+        <w:jc w:val="center"/>
+      </w:pPr>
+      <w:r>
+        <w:rPr>
+          <w:i/>
+          <w:sz w:val="18"/>
+        </w:rPr>
+        <w:t>Piatto di un disco rigido: tracce concentriche divise in settori, e la testina.</w:t>
+      </w:r>
+    </w:p>
+    <w:p>
       <w:r>
         <w:rPr>
           <w:b/>
@@ -1466,6 +1572,59 @@
       </w:r>
     </w:p>
     <w:p>
+      <w:pPr>
+        <w:keepNext/>
+        <w:spacing w:before="120"/>
+        <w:jc w:val="center"/>
+      </w:pPr>
+      <w:r>
+        <w:drawing>
+          <wp:inline xmlns:a="http://schemas.openxmlformats.org/drawingml/2006/main" xmlns:pic="http://schemas.openxmlformats.org/drawingml/2006/picture">
+            <wp:extent cx="2520000" cy="2723478"/>
+            <wp:docPr id="2073952341" name="Picture 2073952341"/>
+            <wp:cNvGraphicFramePr>
+              <a:graphicFrameLocks noChangeAspect="1"/>
+            </wp:cNvGraphicFramePr>
+            <a:graphic>
+              <a:graphicData uri="http://schemas.openxmlformats.org/drawingml/2006/picture">
+                <pic:pic>
+                  <pic:nvPicPr>
+                    <pic:cNvPr id="0" name="ch03_cd_spirale.png"/>
+                    <pic:cNvPicPr/>
+                  </pic:nvPicPr>
+                  <pic:blipFill>
+                    <a:blip r:embed="rId18"/>
+                    <a:stretch>
+                      <a:fillRect/>
+                    </a:stretch>
+                  </pic:blipFill>
+                  <pic:spPr>
+                    <a:xfrm>
+                      <a:off x="0" y="0"/>
+                      <a:ext cx="2520000" cy="2723478"/>
+                    </a:xfrm>
+                    <a:prstGeom prst="rect"/>
+                  </pic:spPr>
+                </pic:pic>
+              </a:graphicData>
+            </a:graphic>
+          </wp:inline>
+        </w:drawing>
+      </w:r>
+    </w:p>
+    <w:p>
+      <w:pPr>
+        <w:jc w:val="center"/>
+      </w:pPr>
+      <w:r>
+        <w:rPr>
+          <w:i/>
+          <w:sz w:val="18"/>
+        </w:rPr>
+        <w:t>In un CD i dati stanno su un'unica traccia a spirale.</w:t>
+      </w:r>
+    </w:p>
+    <w:p>
       <w:r>
         <w:rPr>
           <w:b/>
@@ -2195,6 +2354,59 @@
         <w:t xml:space="preserve"> (2 cifre per il Rosso, 2 per il Verde, 2 per il Blu). Ad esempio, una sfumatura con prevalenza di rosso e poco verde o blu può essere espressa in modo compatto tramite una coordinata esadecimale a 6 caratteri.</w:t>
       </w:r>
     </w:p>
+    <w:p>
+      <w:pPr>
+        <w:keepNext/>
+        <w:spacing w:before="120"/>
+        <w:jc w:val="center"/>
+      </w:pPr>
+      <w:r>
+        <w:drawing>
+          <wp:inline xmlns:a="http://schemas.openxmlformats.org/drawingml/2006/main" xmlns:pic="http://schemas.openxmlformats.org/drawingml/2006/picture">
+            <wp:extent cx="3600000" cy="1974449"/>
+            <wp:docPr id="2073952340" name="Picture 2073952340"/>
+            <wp:cNvGraphicFramePr>
+              <a:graphicFrameLocks noChangeAspect="1"/>
+            </wp:cNvGraphicFramePr>
+            <a:graphic>
+              <a:graphicData uri="http://schemas.openxmlformats.org/drawingml/2006/picture">
+                <pic:pic>
+                  <pic:nvPicPr>
+                    <pic:cNvPr id="0" name="ch04_rgb_esadecimale.png"/>
+                    <pic:cNvPicPr/>
+                  </pic:nvPicPr>
+                  <pic:blipFill>
+                    <a:blip r:embed="rId17"/>
+                    <a:stretch>
+                      <a:fillRect/>
+                    </a:stretch>
+                  </pic:blipFill>
+                  <pic:spPr>
+                    <a:xfrm>
+                      <a:off x="0" y="0"/>
+                      <a:ext cx="3600000" cy="1974449"/>
+                    </a:xfrm>
+                    <a:prstGeom prst="rect"/>
+                  </pic:spPr>
+                </pic:pic>
+              </a:graphicData>
+            </a:graphic>
+          </wp:inline>
+        </w:drawing>
+      </w:r>
+    </w:p>
+    <w:p>
+      <w:pPr>
+        <w:jc w:val="center"/>
+      </w:pPr>
+      <w:r>
+        <w:rPr>
+          <w:i/>
+          <w:sz w:val="18"/>
+        </w:rPr>
+        <w:t>Un colore RGB a 24 bit scritto con 6 cifre esadecimali.</w:t>
+      </w:r>
+    </w:p>
     <w:p/>
     <w:p>
       <w:pPr>
@@ -2442,6 +2654,59 @@
     </w:p>
     <w:p>
       <w:pPr>
+        <w:keepNext/>
+        <w:spacing w:before="120"/>
+        <w:jc w:val="center"/>
+      </w:pPr>
+      <w:r>
+        <w:drawing>
+          <wp:inline xmlns:a="http://schemas.openxmlformats.org/drawingml/2006/main" xmlns:pic="http://schemas.openxmlformats.org/drawingml/2006/picture">
+            <wp:extent cx="5040000" cy="2301331"/>
+            <wp:docPr id="2073952339" name="Picture 2073952339"/>
+            <wp:cNvGraphicFramePr>
+              <a:graphicFrameLocks noChangeAspect="1"/>
+            </wp:cNvGraphicFramePr>
+            <a:graphic>
+              <a:graphicData uri="http://schemas.openxmlformats.org/drawingml/2006/picture">
+                <pic:pic>
+                  <pic:nvPicPr>
+                    <pic:cNvPr id="0" name="ch05_porte_logiche.png"/>
+                    <pic:cNvPicPr/>
+                  </pic:nvPicPr>
+                  <pic:blipFill>
+                    <a:blip r:embed="rId16"/>
+                    <a:stretch>
+                      <a:fillRect/>
+                    </a:stretch>
+                  </pic:blipFill>
+                  <pic:spPr>
+                    <a:xfrm>
+                      <a:off x="0" y="0"/>
+                      <a:ext cx="5040000" cy="2301331"/>
+                    </a:xfrm>
+                    <a:prstGeom prst="rect"/>
+                  </pic:spPr>
+                </pic:pic>
+              </a:graphicData>
+            </a:graphic>
+          </wp:inline>
+        </w:drawing>
+      </w:r>
+    </w:p>
+    <w:p>
+      <w:pPr>
+        <w:jc w:val="center"/>
+      </w:pPr>
+      <w:r>
+        <w:rPr>
+          <w:i/>
+          <w:sz w:val="18"/>
+        </w:rPr>
+        <w:t>Le porte logiche AND, OR, XOR e NOT con le loro tavole di verità.</w:t>
+      </w:r>
+    </w:p>
+    <w:p>
+      <w:pPr>
         <w:pStyle w:val="Titolo2"/>
         <w:rPr>
           <w:b/>
@@ -2946,6 +3211,59 @@
     </w:p>
     <w:p>
       <w:pPr>
+        <w:keepNext/>
+        <w:spacing w:before="120"/>
+        <w:jc w:val="center"/>
+      </w:pPr>
+      <w:r>
+        <w:drawing>
+          <wp:inline xmlns:a="http://schemas.openxmlformats.org/drawingml/2006/main" xmlns:pic="http://schemas.openxmlformats.org/drawingml/2006/picture">
+            <wp:extent cx="3960000" cy="2167000"/>
+            <wp:docPr id="2073952338" name="Picture 2073952338"/>
+            <wp:cNvGraphicFramePr>
+              <a:graphicFrameLocks noChangeAspect="1"/>
+            </wp:cNvGraphicFramePr>
+            <a:graphic>
+              <a:graphicData uri="http://schemas.openxmlformats.org/drawingml/2006/picture">
+                <pic:pic>
+                  <pic:nvPicPr>
+                    <pic:cNvPr id="0" name="ch05_celle_memoria.png"/>
+                    <pic:cNvPicPr/>
+                  </pic:nvPicPr>
+                  <pic:blipFill>
+                    <a:blip r:embed="rId15"/>
+                    <a:stretch>
+                      <a:fillRect/>
+                    </a:stretch>
+                  </pic:blipFill>
+                  <pic:spPr>
+                    <a:xfrm>
+                      <a:off x="0" y="0"/>
+                      <a:ext cx="3960000" cy="2167000"/>
+                    </a:xfrm>
+                    <a:prstGeom prst="rect"/>
+                  </pic:spPr>
+                </pic:pic>
+              </a:graphicData>
+            </a:graphic>
+          </wp:inline>
+        </w:drawing>
+      </w:r>
+    </w:p>
+    <w:p>
+      <w:pPr>
+        <w:jc w:val="center"/>
+      </w:pPr>
+      <w:r>
+        <w:rPr>
+          <w:i/>
+          <w:sz w:val="18"/>
+        </w:rPr>
+        <w:t>La memoria come sequenza di celle numerate; dentro la cella, il bit più significativo (MSB) a sinistra e il meno significativo (LSB) a destra.</w:t>
+      </w:r>
+    </w:p>
+    <w:p>
+      <w:pPr>
         <w:numPr>
           <w:ilvl w:val="0"/>
           <w:numId w:val="15"/>
@@ -3506,6 +3824,59 @@
     </w:p>
     <w:p>
       <w:pPr>
+        <w:keepNext/>
+        <w:spacing w:before="120"/>
+        <w:jc w:val="center"/>
+      </w:pPr>
+      <w:r>
+        <w:drawing>
+          <wp:inline xmlns:a="http://schemas.openxmlformats.org/drawingml/2006/main" xmlns:pic="http://schemas.openxmlformats.org/drawingml/2006/picture">
+            <wp:extent cx="3060000" cy="1850462"/>
+            <wp:docPr id="2073952337" name="Picture 2073952337"/>
+            <wp:cNvGraphicFramePr>
+              <a:graphicFrameLocks noChangeAspect="1"/>
+            </wp:cNvGraphicFramePr>
+            <a:graphic>
+              <a:graphicData uri="http://schemas.openxmlformats.org/drawingml/2006/picture">
+                <pic:pic>
+                  <pic:nvPicPr>
+                    <pic:cNvPr id="0" name="ch06_bitmap_bn.png"/>
+                    <pic:cNvPicPr/>
+                  </pic:nvPicPr>
+                  <pic:blipFill>
+                    <a:blip r:embed="rId14"/>
+                    <a:stretch>
+                      <a:fillRect/>
+                    </a:stretch>
+                  </pic:blipFill>
+                  <pic:spPr>
+                    <a:xfrm>
+                      <a:off x="0" y="0"/>
+                      <a:ext cx="3060000" cy="1850462"/>
+                    </a:xfrm>
+                    <a:prstGeom prst="rect"/>
+                  </pic:spPr>
+                </pic:pic>
+              </a:graphicData>
+            </a:graphic>
+          </wp:inline>
+        </w:drawing>
+      </w:r>
+    </w:p>
+    <w:p>
+      <w:pPr>
+        <w:jc w:val="center"/>
+      </w:pPr>
+      <w:r>
+        <w:rPr>
+          <w:i/>
+          <w:sz w:val="18"/>
+        </w:rPr>
+        <w:t>Immagine in bianco e nero: ogni pixel è un bit.</w:t>
+      </w:r>
+    </w:p>
+    <w:p>
+      <w:pPr>
         <w:numPr>
           <w:ilvl w:val="0"/>
           <w:numId w:val="22"/>
@@ -3877,6 +4248,59 @@
       </w:r>
     </w:p>
     <w:p>
+      <w:pPr>
+        <w:keepNext/>
+        <w:spacing w:before="120"/>
+        <w:jc w:val="center"/>
+      </w:pPr>
+      <w:r>
+        <w:drawing>
+          <wp:inline xmlns:a="http://schemas.openxmlformats.org/drawingml/2006/main" xmlns:pic="http://schemas.openxmlformats.org/drawingml/2006/picture">
+            <wp:extent cx="3780000" cy="2105941"/>
+            <wp:docPr id="2073952336" name="Picture 2073952336"/>
+            <wp:cNvGraphicFramePr>
+              <a:graphicFrameLocks noChangeAspect="1"/>
+            </wp:cNvGraphicFramePr>
+            <a:graphic>
+              <a:graphicData uri="http://schemas.openxmlformats.org/drawingml/2006/picture">
+                <pic:pic>
+                  <pic:nvPicPr>
+                    <pic:cNvPr id="0" name="ch06_campionamento.png"/>
+                    <pic:cNvPicPr/>
+                  </pic:nvPicPr>
+                  <pic:blipFill>
+                    <a:blip r:embed="rId13"/>
+                    <a:stretch>
+                      <a:fillRect/>
+                    </a:stretch>
+                  </pic:blipFill>
+                  <pic:spPr>
+                    <a:xfrm>
+                      <a:off x="0" y="0"/>
+                      <a:ext cx="3780000" cy="2105941"/>
+                    </a:xfrm>
+                    <a:prstGeom prst="rect"/>
+                  </pic:spPr>
+                </pic:pic>
+              </a:graphicData>
+            </a:graphic>
+          </wp:inline>
+        </w:drawing>
+      </w:r>
+    </w:p>
+    <w:p>
+      <w:pPr>
+        <w:jc w:val="center"/>
+      </w:pPr>
+      <w:r>
+        <w:rPr>
+          <w:i/>
+          <w:sz w:val="18"/>
+        </w:rPr>
+        <w:t>Campionamento: si misura l'ampiezza dell'onda a intervalli regolari.</w:t>
+      </w:r>
+    </w:p>
+    <w:p>
       <w:r>
         <w:rPr>
           <w:b/>
@@ -4534,6 +4958,59 @@
     </w:p>
     <w:p>
       <w:pPr>
+        <w:keepNext/>
+        <w:spacing w:before="120"/>
+        <w:jc w:val="center"/>
+      </w:pPr>
+      <w:r>
+        <w:drawing>
+          <wp:inline xmlns:a="http://schemas.openxmlformats.org/drawingml/2006/main" xmlns:pic="http://schemas.openxmlformats.org/drawingml/2006/picture">
+            <wp:extent cx="3600000" cy="2273208"/>
+            <wp:docPr id="2073952335" name="Picture 2073952335"/>
+            <wp:cNvGraphicFramePr>
+              <a:graphicFrameLocks noChangeAspect="1"/>
+            </wp:cNvGraphicFramePr>
+            <a:graphic>
+              <a:graphicData uri="http://schemas.openxmlformats.org/drawingml/2006/picture">
+                <pic:pic>
+                  <pic:nvPicPr>
+                    <pic:cNvPr id="0" name="ch07_pesi_binari.png"/>
+                    <pic:cNvPicPr/>
+                  </pic:nvPicPr>
+                  <pic:blipFill>
+                    <a:blip r:embed="rId12"/>
+                    <a:stretch>
+                      <a:fillRect/>
+                    </a:stretch>
+                  </pic:blipFill>
+                  <pic:spPr>
+                    <a:xfrm>
+                      <a:off x="0" y="0"/>
+                      <a:ext cx="3600000" cy="2273208"/>
+                    </a:xfrm>
+                    <a:prstGeom prst="rect"/>
+                  </pic:spPr>
+                </pic:pic>
+              </a:graphicData>
+            </a:graphic>
+          </wp:inline>
+        </w:drawing>
+      </w:r>
+    </w:p>
+    <w:p>
+      <w:pPr>
+        <w:jc w:val="center"/>
+      </w:pPr>
+      <w:r>
+        <w:rPr>
+          <w:i/>
+          <w:sz w:val="18"/>
+        </w:rPr>
+        <w:t>Da binario a decimale: ogni bit uguale a 1 contribuisce con il suo peso.</w:t>
+      </w:r>
+    </w:p>
+    <w:p>
+      <w:pPr>
         <w:pStyle w:val="Titolo2"/>
         <w:rPr>
           <w:b/>
@@ -4772,6 +5249,59 @@
     </w:p>
     <w:p>
       <w:pPr>
+        <w:keepNext/>
+        <w:spacing w:before="120"/>
+        <w:jc w:val="center"/>
+      </w:pPr>
+      <w:r>
+        <w:drawing>
+          <wp:inline xmlns:a="http://schemas.openxmlformats.org/drawingml/2006/main" xmlns:pic="http://schemas.openxmlformats.org/drawingml/2006/picture">
+            <wp:extent cx="3060000" cy="2142762"/>
+            <wp:docPr id="2073952334" name="Picture 2073952334"/>
+            <wp:cNvGraphicFramePr>
+              <a:graphicFrameLocks noChangeAspect="1"/>
+            </wp:cNvGraphicFramePr>
+            <a:graphic>
+              <a:graphicData uri="http://schemas.openxmlformats.org/drawingml/2006/picture">
+                <pic:pic>
+                  <pic:nvPicPr>
+                    <pic:cNvPr id="0" name="ch07_divisioni_successive.png"/>
+                    <pic:cNvPicPr/>
+                  </pic:nvPicPr>
+                  <pic:blipFill>
+                    <a:blip r:embed="rId11"/>
+                    <a:stretch>
+                      <a:fillRect/>
+                    </a:stretch>
+                  </pic:blipFill>
+                  <pic:spPr>
+                    <a:xfrm>
+                      <a:off x="0" y="0"/>
+                      <a:ext cx="3060000" cy="2142762"/>
+                    </a:xfrm>
+                    <a:prstGeom prst="rect"/>
+                  </pic:spPr>
+                </pic:pic>
+              </a:graphicData>
+            </a:graphic>
+          </wp:inline>
+        </w:drawing>
+      </w:r>
+    </w:p>
+    <w:p>
+      <w:pPr>
+        <w:jc w:val="center"/>
+      </w:pPr>
+      <w:r>
+        <w:rPr>
+          <w:i/>
+          <w:sz w:val="18"/>
+        </w:rPr>
+        <w:t>Da decimale a binario: i resti delle divisioni per 2, letti dal basso verso l'alto.</w:t>
+      </w:r>
+    </w:p>
+    <w:p>
+      <w:pPr>
         <w:pStyle w:val="Titolo2"/>
         <w:rPr>
           <w:b/>
@@ -4988,6 +5518,59 @@
     </w:p>
     <w:p>
       <w:pPr>
+        <w:keepNext/>
+        <w:spacing w:before="120"/>
+        <w:jc w:val="center"/>
+      </w:pPr>
+      <w:r>
+        <w:drawing>
+          <wp:inline xmlns:a="http://schemas.openxmlformats.org/drawingml/2006/main" xmlns:pic="http://schemas.openxmlformats.org/drawingml/2006/picture">
+            <wp:extent cx="3060000" cy="2433363"/>
+            <wp:docPr id="2073952333" name="Picture 2073952333"/>
+            <wp:cNvGraphicFramePr>
+              <a:graphicFrameLocks noChangeAspect="1"/>
+            </wp:cNvGraphicFramePr>
+            <a:graphic>
+              <a:graphicData uri="http://schemas.openxmlformats.org/drawingml/2006/picture">
+                <pic:pic>
+                  <pic:nvPicPr>
+                    <pic:cNvPr id="0" name="ch07_somma_binaria.png"/>
+                    <pic:cNvPicPr/>
+                  </pic:nvPicPr>
+                  <pic:blipFill>
+                    <a:blip r:embed="rId10"/>
+                    <a:stretch>
+                      <a:fillRect/>
+                    </a:stretch>
+                  </pic:blipFill>
+                  <pic:spPr>
+                    <a:xfrm>
+                      <a:off x="0" y="0"/>
+                      <a:ext cx="3060000" cy="2433363"/>
+                    </a:xfrm>
+                    <a:prstGeom prst="rect"/>
+                  </pic:spPr>
+                </pic:pic>
+              </a:graphicData>
+            </a:graphic>
+          </wp:inline>
+        </w:drawing>
+      </w:r>
+    </w:p>
+    <w:p>
+      <w:pPr>
+        <w:jc w:val="center"/>
+      </w:pPr>
+      <w:r>
+        <w:rPr>
+          <w:i/>
+          <w:sz w:val="18"/>
+        </w:rPr>
+        <w:t>La somma binaria 11010 + 11011, con i riporti.</w:t>
+      </w:r>
+    </w:p>
+    <w:p>
+      <w:pPr>
         <w:pStyle w:val="Titolo2"/>
         <w:rPr>
           <w:b/>
@@ -5587,6 +6170,59 @@
     <w:p>
       <w:r>
         <w:t>A titolo di esempio, se vogliamo trovare la rappresentazione a 4 bit del numero -6, si parte dalla codifica del +6, pari a 0110. Esaminando la stringa da destra, il primo 0 e il primo 1 vengono ricopiati inalterati (producendo la parte finale 10); il bit successivo 1 viene convertito in 0 e lo 0 di segno diventa 1, ottenendo la configurazione finale 1010.</w:t>
+      </w:r>
+    </w:p>
+    <w:p>
+      <w:pPr>
+        <w:keepNext/>
+        <w:spacing w:before="120"/>
+        <w:jc w:val="center"/>
+      </w:pPr>
+      <w:r>
+        <w:drawing>
+          <wp:inline xmlns:a="http://schemas.openxmlformats.org/drawingml/2006/main" xmlns:pic="http://schemas.openxmlformats.org/drawingml/2006/picture">
+            <wp:extent cx="3420000" cy="3420000"/>
+            <wp:docPr id="2073952332" name="Picture 2073952332"/>
+            <wp:cNvGraphicFramePr>
+              <a:graphicFrameLocks noChangeAspect="1"/>
+            </wp:cNvGraphicFramePr>
+            <a:graphic>
+              <a:graphicData uri="http://schemas.openxmlformats.org/drawingml/2006/picture">
+                <pic:pic>
+                  <pic:nvPicPr>
+                    <pic:cNvPr id="0" name="ch08_complemento_a_due.png"/>
+                    <pic:cNvPicPr/>
+                  </pic:nvPicPr>
+                  <pic:blipFill>
+                    <a:blip r:embed="rId9"/>
+                    <a:stretch>
+                      <a:fillRect/>
+                    </a:stretch>
+                  </pic:blipFill>
+                  <pic:spPr>
+                    <a:xfrm>
+                      <a:off x="0" y="0"/>
+                      <a:ext cx="3420000" cy="3420000"/>
+                    </a:xfrm>
+                    <a:prstGeom prst="rect"/>
+                  </pic:spPr>
+                </pic:pic>
+              </a:graphicData>
+            </a:graphic>
+          </wp:inline>
+        </w:drawing>
+      </w:r>
+    </w:p>
+    <w:p>
+      <w:pPr>
+        <w:jc w:val="center"/>
+      </w:pPr>
+      <w:r>
+        <w:rPr>
+          <w:i/>
+          <w:sz w:val="18"/>
+        </w:rPr>
+        <w:t>Complemento a due su 4 bit: i numeri con bit di segno 1 sono negativi.</w:t>
       </w:r>
     </w:p>
     <w:p>
@@ -8476,6 +9112,59 @@
       <w:r>
         <w:lastRenderedPageBreak/>
         <w:t>più una parola legale, ma si troverà a distanza di Hamming 1 dal codice originale e a distanza pari ad almeno 2 da qualsiasi altra parola legale, permettendo al decodificatore di identificare in modo univoco il dato corretto.</w:t>
+      </w:r>
+    </w:p>
+    <w:p>
+      <w:pPr>
+        <w:keepNext/>
+        <w:spacing w:before="120"/>
+        <w:jc w:val="center"/>
+      </w:pPr>
+      <w:r>
+        <w:drawing>
+          <wp:inline xmlns:a="http://schemas.openxmlformats.org/drawingml/2006/main" xmlns:pic="http://schemas.openxmlformats.org/drawingml/2006/picture">
+            <wp:extent cx="3960000" cy="1473936"/>
+            <wp:docPr id="2073952331" name="Picture 2073952331"/>
+            <wp:cNvGraphicFramePr>
+              <a:graphicFrameLocks noChangeAspect="1"/>
+            </wp:cNvGraphicFramePr>
+            <a:graphic>
+              <a:graphicData uri="http://schemas.openxmlformats.org/drawingml/2006/picture">
+                <pic:pic>
+                  <pic:nvPicPr>
+                    <pic:cNvPr id="0" name="ch11_distanza_hamming.png"/>
+                    <pic:cNvPicPr/>
+                  </pic:nvPicPr>
+                  <pic:blipFill>
+                    <a:blip r:embed="rId8"/>
+                    <a:stretch>
+                      <a:fillRect/>
+                    </a:stretch>
+                  </pic:blipFill>
+                  <pic:spPr>
+                    <a:xfrm>
+                      <a:off x="0" y="0"/>
+                      <a:ext cx="3960000" cy="1473936"/>
+                    </a:xfrm>
+                    <a:prstGeom prst="rect"/>
+                  </pic:spPr>
+                </pic:pic>
+              </a:graphicData>
+            </a:graphic>
+          </wp:inline>
+        </w:drawing>
+      </w:r>
+    </w:p>
+    <w:p>
+      <w:pPr>
+        <w:jc w:val="center"/>
+      </w:pPr>
+      <w:r>
+        <w:rPr>
+          <w:i/>
+          <w:sz w:val="18"/>
+        </w:rPr>
+        <w:t>Con distanza minima 3 un errore si corregge, due si rilevano.</w:t>
       </w:r>
     </w:p>
     <w:p>

</xml_diff>

<commit_message>
Quaderno aggiornato (evidenziazioni di Fondamenti)
Co-Authored-By: Claude Sonnet 5.5 <noreply@anthropic.com>
</commit_message>
<xml_diff>
--- a/Riassunto Fondamenti Informatica.docx
+++ b/Riassunto Fondamenti Informatica.docx
@@ -9891,38 +9891,63 @@
       <w:r>
         <w:rPr>
           <w:b/>
+          <w:highlight w:val="yellow"/>
         </w:rPr>
         <w:t>disgiunzione</w:t>
       </w:r>
       <w:r>
+        <w:rPr>
+          <w:highlight w:val="yellow"/>
+        </w:rPr>
         <w:t xml:space="preserve"> p ∨ q si legge "p o q" ed è la disgiunzione </w:t>
       </w:r>
       <w:r>
         <w:rPr>
           <w:b/>
+          <w:highlight w:val="yellow"/>
         </w:rPr>
         <w:t>inclusiva</w:t>
       </w:r>
       <w:r>
-        <w:t xml:space="preserve">: è vera se è vera p, oppure è vera q, </w:t>
-      </w:r>
-      <w:r>
-        <w:rPr>
-          <w:b/>
+        <w:t xml:space="preserve">: </w:t>
+      </w:r>
+      <w:r>
+        <w:rPr>
+          <w:highlight w:val="yellow"/>
+        </w:rPr>
+        <w:t xml:space="preserve">è vera se è vera p, oppure è vera q, </w:t>
+      </w:r>
+      <w:r>
+        <w:rPr>
+          <w:b/>
+          <w:highlight w:val="yellow"/>
         </w:rPr>
         <w:t>oppure lo sono entrambe</w:t>
       </w:r>
       <w:r>
-        <w:t>. È falsa solo quando sono false tutte e due. Esempio del libro: "un millennio è di 100 anni o un millennio è di 1000 anni" è vera, perché basta la seconda parte.</w:t>
-      </w:r>
-    </w:p>
-    <w:p>
-      <w:r>
+        <w:t xml:space="preserve">. </w:t>
+      </w:r>
+      <w:r>
+        <w:rPr>
+          <w:highlight w:val="yellow"/>
+        </w:rPr>
+        <w:t>È falsa solo quando sono false tutte e due</w:t>
+      </w:r>
+      <w:r>
+        <w:t>. Esempio del libro: "un millennio è di 100 anni o un millennio è di 1000 anni" è vera, perché basta la seconda parte.</w:t>
+      </w:r>
+    </w:p>
+    <w:p>
+      <w:r>
+        <w:rPr>
+          <w:highlight w:val="yellow"/>
+        </w:rPr>
         <w:t xml:space="preserve">Esiste anche la disgiunzione </w:t>
       </w:r>
       <w:r>
         <w:rPr>
           <w:b/>
+          <w:highlight w:val="yellow"/>
         </w:rPr>
         <w:t>esclusiva</w:t>
       </w:r>
@@ -9932,11 +9957,30 @@
       <w:r>
         <w:rPr>
           <w:b/>
+          <w:highlight w:val="yellow"/>
         </w:rPr>
         <w:t>xor</w:t>
       </w:r>
       <w:r>
-        <w:t xml:space="preserve"> in inglese), vera solo quando una delle due è vera e l'altra è falsa; non lo è quando sono vere entrambe. Nel parlato "o" può avere l'uno o l'altro significato, mentre in logica quando si scrive "or" si intende quella inclusiva.</w:t>
+        <w:t xml:space="preserve"> in inglese), </w:t>
+      </w:r>
+      <w:r>
+        <w:rPr>
+          <w:highlight w:val="yellow"/>
+        </w:rPr>
+        <w:t>vera solo quando una delle due è vera e l'altra è falsa</w:t>
+      </w:r>
+      <w:r>
+        <w:t xml:space="preserve">; </w:t>
+      </w:r>
+      <w:r>
+        <w:rPr>
+          <w:highlight w:val="yellow"/>
+        </w:rPr>
+        <w:t>non lo è quando sono vere entrambe</w:t>
+      </w:r>
+      <w:r>
+        <w:t>. Nel parlato "o" può avere l'uno o l'altro significato, mentre in logica quando si scrive "or" si intende quella inclusiva.</w:t>
       </w:r>
     </w:p>
     <w:p>
@@ -9995,20 +10039,40 @@
       <w:r>
         <w:rPr>
           <w:b/>
+          <w:highlight w:val="yellow"/>
         </w:rPr>
         <w:t>negazione</w:t>
       </w:r>
       <w:r>
+        <w:rPr>
+          <w:highlight w:val="yellow"/>
+        </w:rPr>
         <w:t xml:space="preserve"> ¬p si legge "non p" e </w:t>
       </w:r>
       <w:r>
         <w:rPr>
           <w:b/>
+          <w:highlight w:val="yellow"/>
         </w:rPr>
         <w:t>scambia</w:t>
       </w:r>
       <w:r>
-        <w:t xml:space="preserve"> il valore di verità: è vera quando p è falsa e viceversa. Esempio del libro: se p è "π è stato calcolato con un milione di cifre decimali nel 1954" (falsa: ci si arrivò solo nel 1973), ¬p è vera.</w:t>
+        <w:rPr>
+          <w:highlight w:val="yellow"/>
+        </w:rPr>
+        <w:t xml:space="preserve"> il valore di verità</w:t>
+      </w:r>
+      <w:r>
+        <w:t xml:space="preserve">: </w:t>
+      </w:r>
+      <w:r>
+        <w:rPr>
+          <w:highlight w:val="yellow"/>
+        </w:rPr>
+        <w:t>è vera quando p è falsa e viceversa</w:t>
+      </w:r>
+      <w:r>
+        <w:t>. Esempio del libro: se p è "π è stato calcolato con un milione di cifre decimali nel 1954" (falsa: ci si arrivò solo nel 1973), ¬p è vera.</w:t>
       </w:r>
     </w:p>
     <w:p>
@@ -10025,11 +10089,15 @@
     </w:p>
     <w:p>
       <w:r>
+        <w:rPr>
+          <w:highlight w:val="yellow"/>
+        </w:rPr>
         <w:t>L'</w:t>
       </w:r>
       <w:r>
         <w:rPr>
           <w:b/>
+          <w:highlight w:val="yellow"/>
         </w:rPr>
         <w:t>equivalenza</w:t>
       </w:r>
@@ -10039,20 +10107,34 @@
       <w:r>
         <w:rPr>
           <w:b/>
+          <w:highlight w:val="yellow"/>
         </w:rPr>
         <w:t>uguaglianza</w:t>
       </w:r>
       <w:r>
-        <w:t xml:space="preserve"> tra booleani) è vera quando i due valori sono </w:t>
-      </w:r>
-      <w:r>
-        <w:rPr>
-          <w:b/>
+        <w:t xml:space="preserve"> tra booleani) </w:t>
+      </w:r>
+      <w:r>
+        <w:rPr>
+          <w:highlight w:val="yellow"/>
+        </w:rPr>
+        <w:t xml:space="preserve">è vera quando i due valori sono </w:t>
+      </w:r>
+      <w:r>
+        <w:rPr>
+          <w:b/>
+          <w:highlight w:val="yellow"/>
         </w:rPr>
         <w:t>uguali</w:t>
       </w:r>
       <w:r>
-        <w:t>, falsa quando sono diversi. In programmazione corrisponde al test di uguaglianza (</w:t>
+        <w:rPr>
+          <w:highlight w:val="yellow"/>
+        </w:rPr>
+        <w:t>, falsa quando sono divers</w:t>
+      </w:r>
+      <w:r>
+        <w:t>i. In programmazione corrisponde al test di uguaglianza (</w:t>
       </w:r>
       <w:r>
         <w:rPr>
@@ -10105,22 +10187,26 @@
         <w:jc w:val="center"/>
       </w:pPr>
       <w:r>
+        <w:rPr>
+          <w:noProof/>
+        </w:rPr>
         <w:drawing>
-          <wp:inline xmlns:a="http://schemas.openxmlformats.org/drawingml/2006/main" xmlns:pic="http://schemas.openxmlformats.org/drawingml/2006/picture">
+          <wp:inline distT="0" distB="0" distL="0" distR="0" wp14:anchorId="049D9755" wp14:editId="2CC34609">
             <wp:extent cx="4680000" cy="1755874"/>
+            <wp:effectExtent l="0" t="0" r="0" b="0"/>
             <wp:docPr id="2073952346" name="Picture 2073952346"/>
             <wp:cNvGraphicFramePr>
-              <a:graphicFrameLocks noChangeAspect="1"/>
+              <a:graphicFrameLocks xmlns:a="http://schemas.openxmlformats.org/drawingml/2006/main" noChangeAspect="1"/>
             </wp:cNvGraphicFramePr>
-            <a:graphic>
+            <a:graphic xmlns:a="http://schemas.openxmlformats.org/drawingml/2006/main">
               <a:graphicData uri="http://schemas.openxmlformats.org/drawingml/2006/picture">
-                <pic:pic>
+                <pic:pic xmlns:pic="http://schemas.openxmlformats.org/drawingml/2006/picture">
                   <pic:nvPicPr>
                     <pic:cNvPr id="0" name="logica_connettivi.png"/>
                     <pic:cNvPicPr/>
                   </pic:nvPicPr>
                   <pic:blipFill>
-                    <a:blip r:embed="rId23"/>
+                    <a:blip r:embed="rId19"/>
                     <a:stretch>
                       <a:fillRect/>
                     </a:stretch>
@@ -10130,7 +10216,9 @@
                       <a:off x="0" y="0"/>
                       <a:ext cx="4680000" cy="1755874"/>
                     </a:xfrm>
-                    <a:prstGeom prst="rect"/>
+                    <a:prstGeom prst="rect">
+                      <a:avLst/>
+                    </a:prstGeom>
                   </pic:spPr>
                 </pic:pic>
               </a:graphicData>
@@ -10160,6 +10248,7 @@
           <w:b/>
           <w:color w:val="E97132"/>
         </w:rPr>
+        <w:lastRenderedPageBreak/>
         <w:t>Notazioni diverse per lo stesso connettivo</w:t>
       </w:r>
     </w:p>
@@ -10224,7 +10313,6 @@
         <w:rPr>
           <w:b/>
         </w:rPr>
-        <w:lastRenderedPageBreak/>
         <w:t>Congiunzione</w:t>
       </w:r>
       <w:r>
@@ -10321,11 +10409,15 @@
     </w:p>
     <w:p>
       <w:r>
+        <w:rPr>
+          <w:highlight w:val="yellow"/>
+        </w:rPr>
         <w:t xml:space="preserve">Quando una formula contiene ¬, ∧ e ∨ senza parentesi, si valuta </w:t>
       </w:r>
       <w:r>
         <w:rPr>
           <w:b/>
+          <w:highlight w:val="yellow"/>
         </w:rPr>
         <w:t>prima ¬, poi ∧, poi ∨</w:t>
       </w:r>
@@ -10353,6 +10445,27 @@
     </w:p>
     <w:p>
       <w:pPr>
+        <w:pStyle w:val="Titolo1"/>
+        <w:rPr>
+          <w:b/>
+          <w:color w:val="EE0000"/>
+        </w:rPr>
+      </w:pPr>
+    </w:p>
+    <w:p>
+      <w:pPr>
+        <w:pStyle w:val="Titolo1"/>
+      </w:pPr>
+      <w:r>
+        <w:rPr>
+          <w:b/>
+          <w:color w:val="EE0000"/>
+        </w:rPr>
+        <w:t>14. Le Tavole di Verità</w:t>
+      </w:r>
+    </w:p>
+    <w:p>
+      <w:pPr>
         <w:pStyle w:val="Titolo2"/>
       </w:pPr>
       <w:r>
@@ -10360,49 +10473,6 @@
           <w:b/>
           <w:color w:val="E97132"/>
         </w:rPr>
-        <w:t>L'implicazione si rimanda</w:t>
-      </w:r>
-    </w:p>
-    <w:p>
-      <w:r>
-        <w:t>Manca ancora l'</w:t>
-      </w:r>
-      <w:r>
-        <w:rPr>
-          <w:b/>
-        </w:rPr>
-        <w:t>implicazione</w:t>
-      </w:r>
-      <w:r>
-        <w:t>. Il docente l'ha rimandata alla prossima lezione, perché è il primo caso in cui la definizione logica si discosta da quella del linguaggio naturale. Finora congiunzione, disgiunzione, negazione ed equivalenza corrispondono abbastanza bene a quello che si intende nel parlato; con l'implicazione invece si possono creare confusioni, e sarà dedicata una lezione alle tavole di verità che la comprendono.</w:t>
-      </w:r>
-    </w:p>
-    <w:p>
-      <w:r>
-        <w:t>Nel prossimo capitolo si vede come si costruisce una tavola di verità per formule più complesse.</w:t>
-      </w:r>
-    </w:p>
-    <w:p>
-      <w:pPr>
-        <w:pStyle w:val="Titolo1"/>
-      </w:pPr>
-      <w:r>
-        <w:rPr>
-          <w:b/>
-          <w:color w:val="EE0000"/>
-        </w:rPr>
-        <w:t>14. Le Tavole di Verità</w:t>
-      </w:r>
-    </w:p>
-    <w:p>
-      <w:pPr>
-        <w:pStyle w:val="Titolo2"/>
-      </w:pPr>
-      <w:r>
-        <w:rPr>
-          <w:b/>
-          <w:color w:val="E97132"/>
-        </w:rPr>
         <w:t>A che cosa servono</w:t>
       </w:r>
     </w:p>
@@ -10413,51 +10483,31 @@
       <w:r>
         <w:rPr>
           <w:b/>
+          <w:highlight w:val="yellow"/>
         </w:rPr>
         <w:t>tavola di verità</w:t>
       </w:r>
       <w:r>
+        <w:rPr>
+          <w:highlight w:val="yellow"/>
+        </w:rPr>
         <w:t xml:space="preserve"> è un elenco di </w:t>
       </w:r>
       <w:r>
         <w:rPr>
           <w:b/>
+          <w:highlight w:val="yellow"/>
         </w:rPr>
         <w:t>tutte</w:t>
       </w:r>
       <w:r>
-        <w:t xml:space="preserve"> le combinazioni possibili dei valori di verità delle componenti atomiche, con a fianco, per ciascuna combinazione, il valore di verità della proposizione composta. È un modo alternativo di definire un connettivo: non più come circuito, ma come tabella. Serve perché non è facile stabilire se due circuiti sono equivalenti, mentre si possono leggere come formule proposizionali e confrontare le loro tavole: è l'applicazione principale delle tavole di verità in informatica.</w:t>
-      </w:r>
-    </w:p>
-    <w:p>
-      <w:pPr>
-        <w:pStyle w:val="Titolo2"/>
-      </w:pPr>
-      <w:r>
-        <w:rPr>
-          <w:b/>
-          <w:color w:val="E97132"/>
-        </w:rPr>
-        <w:t>Come si costruisce</w:t>
-      </w:r>
-    </w:p>
-    <w:p>
-      <w:r>
-        <w:t>Nella tavola si mettono a sinistra le componenti atomiche (indicate con lettere minuscole, p, q, r, …) e nell'ultima colonna la proposizione composta. Le componenti possono essere qualsiasi affermazione a cui si sa assegnare un valore di verità; per le equazioni vanno prima assegnati i parametri. Per ogni riga si scrive il valore di verità della formula seguendo la definizione del connettivo: nella tavola della disgiunzione, per esempio, si scrive 1 ogni volta che c'è almeno un 1 tra gli argomenti, e 0 solo quando sono entrambi 0.</w:t>
-      </w:r>
-    </w:p>
-    <w:p>
-      <w:r>
-        <w:t xml:space="preserve">Una formula più complessa si calcola </w:t>
-      </w:r>
-      <w:r>
-        <w:rPr>
-          <w:b/>
-        </w:rPr>
-        <w:t>a passi</w:t>
-      </w:r>
-      <w:r>
-        <w:t>, con una colonna per ogni sottoformula. Esempio del docente, la formula (p ∨ q) ∧ ¬p: ci sono due variabili, ma più sottoformule (p ∨ q, ¬p e l'intera congiunzione).</w:t>
+        <w:rPr>
+          <w:highlight w:val="yellow"/>
+        </w:rPr>
+        <w:t xml:space="preserve"> le combinazioni possibili dei valori di verità delle componenti atomiche, con a fianco, per ciascuna combinazione, il valore di verità della proposizione composta</w:t>
+      </w:r>
+      <w:r>
+        <w:t>. È un modo alternativo di definire un connettivo: non più come circuito, ma come tabella. Serve perché non è facile stabilire se due circuiti sono equivalenti, mentre si possono leggere come formule proposizionali e confrontare le loro tavole: è l'applicazione principale delle tavole di verità in informatica.</w:t>
       </w:r>
     </w:p>
     <w:p>
@@ -10466,22 +10516,26 @@
         <w:jc w:val="center"/>
       </w:pPr>
       <w:r>
+        <w:rPr>
+          <w:noProof/>
+        </w:rPr>
         <w:drawing>
-          <wp:inline xmlns:a="http://schemas.openxmlformats.org/drawingml/2006/main" xmlns:pic="http://schemas.openxmlformats.org/drawingml/2006/picture">
+          <wp:inline distT="0" distB="0" distL="0" distR="0" wp14:anchorId="5A629CE9" wp14:editId="142A8817">
             <wp:extent cx="3780000" cy="1925660"/>
+            <wp:effectExtent l="0" t="0" r="0" b="0"/>
             <wp:docPr id="2073952345" name="Picture 2073952345"/>
             <wp:cNvGraphicFramePr>
-              <a:graphicFrameLocks noChangeAspect="1"/>
+              <a:graphicFrameLocks xmlns:a="http://schemas.openxmlformats.org/drawingml/2006/main" noChangeAspect="1"/>
             </wp:cNvGraphicFramePr>
-            <a:graphic>
+            <a:graphic xmlns:a="http://schemas.openxmlformats.org/drawingml/2006/main">
               <a:graphicData uri="http://schemas.openxmlformats.org/drawingml/2006/picture">
-                <pic:pic>
+                <pic:pic xmlns:pic="http://schemas.openxmlformats.org/drawingml/2006/picture">
                   <pic:nvPicPr>
                     <pic:cNvPr id="0" name="logica_formula.png"/>
                     <pic:cNvPicPr/>
                   </pic:nvPicPr>
                   <pic:blipFill>
-                    <a:blip r:embed="rId22"/>
+                    <a:blip r:embed="rId20"/>
                     <a:stretch>
                       <a:fillRect/>
                     </a:stretch>
@@ -10491,7 +10545,9 @@
                       <a:off x="0" y="0"/>
                       <a:ext cx="3780000" cy="1925660"/>
                     </a:xfrm>
-                    <a:prstGeom prst="rect"/>
+                    <a:prstGeom prst="rect">
+                      <a:avLst/>
+                    </a:prstGeom>
                   </pic:spPr>
                 </pic:pic>
               </a:graphicData>
@@ -10514,8 +10570,95 @@
     </w:p>
     <w:p>
       <w:r>
+        <w:t>La congiunzione ha un solo 1, quello della riga in cui p è falsa e q è vera. Lo stesso risultato si ottiene ragionando: se p è falsa, il primo argomento p ∨ q è vero solo se lo è q; se p è vera, ¬p è falsa e la congiunzione è falsa. Quindi (p ∨ q) ∧ ¬p equivale a ¬p ∧ q, una formula più breve: un modo per semplificare e, in un circuito, risparmiare una porta.</w:t>
+      </w:r>
+    </w:p>
+    <w:p>
+      <w:pPr>
+        <w:pStyle w:val="Titolo2"/>
+      </w:pPr>
+      <w:r>
+        <w:rPr>
+          <w:b/>
+          <w:color w:val="E97132"/>
+        </w:rPr>
         <w:lastRenderedPageBreak/>
-        <w:t>La congiunzione ha un solo 1, quello della riga in cui p è falsa e q è vera. Lo stesso risultato si ottiene ragionando: se p è falsa, il primo argomento p ∨ q è vero solo se lo è q; se p è vera, ¬p è falsa e la congiunzione è falsa. Quindi (p ∨ q) ∧ ¬p equivale a ¬p ∧ q, una formula più breve: un modo per semplificare e, in un circuito, risparmiare una porta.</w:t>
+        <w:t>Quante righe ci sono</w:t>
+      </w:r>
+    </w:p>
+    <w:p>
+      <w:r>
+        <w:rPr>
+          <w:highlight w:val="yellow"/>
+        </w:rPr>
+        <w:t xml:space="preserve">Con </w:t>
+      </w:r>
+      <w:r>
+        <w:rPr>
+          <w:b/>
+          <w:highlight w:val="yellow"/>
+        </w:rPr>
+        <w:t>n</w:t>
+      </w:r>
+      <w:r>
+        <w:rPr>
+          <w:highlight w:val="yellow"/>
+        </w:rPr>
+        <w:t xml:space="preserve"> proposizioni atomiche le righe sono </w:t>
+      </w:r>
+      <w:r>
+        <w:rPr>
+          <w:b/>
+          <w:highlight w:val="yellow"/>
+        </w:rPr>
+        <w:t>2ⁿ</w:t>
+      </w:r>
+      <w:r>
+        <w:t>: 1 proposizione dà 2 righe, 2 danno 4, 3 danno 8 (come nell'esempio del libro). È un teorema che si dimostra per induzione e che si vedrà anche in Matematica discreta.</w:t>
+      </w:r>
+    </w:p>
+    <w:p>
+      <w:r>
+        <w:t xml:space="preserve">Bisogna elencare </w:t>
+      </w:r>
+      <w:r>
+        <w:rPr>
+          <w:b/>
+        </w:rPr>
+        <w:t>tutti</w:t>
+      </w:r>
+      <w:r>
+        <w:t xml:space="preserve"> i casi, e </w:t>
+      </w:r>
+      <w:r>
+        <w:rPr>
+          <w:b/>
+        </w:rPr>
+        <w:t>una volta sola</w:t>
+      </w:r>
+      <w:r>
+        <w:t>. La prima richiesta è di correttezza: se manca un caso la definizione o il confronto non sono corretti. La seconda è di efficienza: ripetere uno stesso caso è uno spreco.</w:t>
+      </w:r>
+    </w:p>
+    <w:p>
+      <w:pPr>
+        <w:pStyle w:val="Titolo1"/>
+        <w:rPr>
+          <w:b/>
+          <w:color w:val="EE0000"/>
+        </w:rPr>
+      </w:pPr>
+    </w:p>
+    <w:p>
+      <w:pPr>
+        <w:pStyle w:val="Titolo1"/>
+      </w:pPr>
+      <w:r>
+        <w:rPr>
+          <w:b/>
+          <w:color w:val="EE0000"/>
+        </w:rPr>
+        <w:t>15. Equivalenze, Tautologie e Contraddizioni</w:t>
       </w:r>
     </w:p>
     <w:p>
@@ -10527,53 +10670,38 @@
           <w:b/>
           <w:color w:val="E97132"/>
         </w:rPr>
-        <w:t>Quante righe ci sono</w:t>
-      </w:r>
-    </w:p>
-    <w:p>
-      <w:r>
-        <w:t xml:space="preserve">Con </w:t>
-      </w:r>
-      <w:r>
-        <w:rPr>
-          <w:b/>
-        </w:rPr>
-        <w:t>n</w:t>
-      </w:r>
-      <w:r>
-        <w:t xml:space="preserve"> proposizioni atomiche le righe sono </w:t>
-      </w:r>
-      <w:r>
-        <w:rPr>
-          <w:b/>
-        </w:rPr>
-        <w:t>2ⁿ</w:t>
-      </w:r>
-      <w:r>
-        <w:t>: 1 proposizione dà 2 righe, 2 danno 4, 3 danno 8 (come nell'esempio del libro). È un teorema che si dimostra per induzione e che si vedrà anche in Matematica discreta.</w:t>
-      </w:r>
-    </w:p>
-    <w:p>
-      <w:r>
-        <w:t xml:space="preserve">Bisogna elencare </w:t>
-      </w:r>
-      <w:r>
-        <w:rPr>
-          <w:b/>
-        </w:rPr>
-        <w:t>tutti</w:t>
-      </w:r>
-      <w:r>
-        <w:t xml:space="preserve"> i casi, e </w:t>
-      </w:r>
-      <w:r>
-        <w:rPr>
-          <w:b/>
-        </w:rPr>
-        <w:t>una volta sola</w:t>
-      </w:r>
-      <w:r>
-        <w:t>. La prima richiesta è di correttezza: se manca un caso la definizione o il confronto non sono corretti. La seconda è di efficienza: ripetere uno stesso caso è uno spreco.</w:t>
+        <w:t>Formule equivalenti</w:t>
+      </w:r>
+    </w:p>
+    <w:p>
+      <w:r>
+        <w:rPr>
+          <w:highlight w:val="yellow"/>
+        </w:rPr>
+        <w:t xml:space="preserve">Due formule sono </w:t>
+      </w:r>
+      <w:r>
+        <w:rPr>
+          <w:b/>
+          <w:highlight w:val="yellow"/>
+        </w:rPr>
+        <w:t>equivalenti</w:t>
+      </w:r>
+      <w:r>
+        <w:rPr>
+          <w:highlight w:val="yellow"/>
+        </w:rPr>
+        <w:t xml:space="preserve"> se hanno gli stessi valori di verità per tutti i valori di verità delle loro componenti atomiche, cioè se hanno la </w:t>
+      </w:r>
+      <w:r>
+        <w:rPr>
+          <w:b/>
+          <w:highlight w:val="yellow"/>
+        </w:rPr>
+        <w:t>stessa tavola di verità</w:t>
+      </w:r>
+      <w:r>
+        <w:t>. Non sono la stessa formula, ma si possono scambiare l'una con l'altra, scegliendo quella più utile in un dato contesto. Questo vale per i circuiti (due circuiti equivalenti si possono sostituire), ma anche per i programmi: prima di sostituire la condizione di uscita di un ciclo con un'altra formula più leggibile bisogna essere sicuri che sia equivalente, altrimenti si cambia il comportamento del programma.</w:t>
       </w:r>
     </w:p>
     <w:p>
@@ -10585,162 +10713,6 @@
           <w:b/>
           <w:color w:val="E97132"/>
         </w:rPr>
-        <w:t>Come essere sicuri di averli scritti tutti</w:t>
-      </w:r>
-    </w:p>
-    <w:p>
-      <w:r>
-        <w:t>Il docente ne ha mostrati due e ha descritto un terzo, quello del libro.</w:t>
-      </w:r>
-    </w:p>
-    <w:p>
-      <w:r>
-        <w:t xml:space="preserve">1. </w:t>
-      </w:r>
-      <w:r>
-        <w:rPr>
-          <w:b/>
-        </w:rPr>
-        <w:t>Contare e confrontare</w:t>
-      </w:r>
-      <w:r>
-        <w:t xml:space="preserve"> (principio della piccionaia): se le righe sono 2ⁿ e nessuna compare due volte, allora sono tutte, perché se ne avessi dimenticata una dovrebbe comparirne una ripetuta. Si contano le righe, poi si controlla riga per riga che non sia già stata scritta.</w:t>
-      </w:r>
-    </w:p>
-    <w:p>
-      <w:r>
-        <w:t xml:space="preserve">2. </w:t>
-      </w:r>
-      <w:r>
-        <w:rPr>
-          <w:b/>
-        </w:rPr>
-        <w:t>Contare all'indietro</w:t>
-      </w:r>
-      <w:r>
-        <w:t>: le n proposizioni atomiche, se si rappresentano con 0 e 1, formano un numero binario di n cifre. Si scrive prima la riga con tutti 1 (cioè 2ⁿ − 1) e si scende fino alla riga di tutti 0. Con 3 variabili: 111 (7), 110 (6), 101 (5), 100 (4), 011 (3), 010 (2), 001 (1), 000 (0). Scrivere la lista all'incontrario non cambia nulla, perché conta solo che ci siano tutti i casi.</w:t>
-      </w:r>
-    </w:p>
-    <w:p>
-      <w:r>
-        <w:t xml:space="preserve">3. </w:t>
-      </w:r>
-      <w:r>
-        <w:rPr>
-          <w:b/>
-        </w:rPr>
-        <w:t>Il metodo dei periodi del libro</w:t>
-      </w:r>
-      <w:r>
-        <w:t>: con n variabili le righe sono 2ⁿ. La prima variabile si scrive a blocchi lunghi quanto metà delle righe (nel caso di 8 righe: 4 volte 1, poi 4 volte 0); la seconda con blocchi dimezzati (2 volte 1, 2 volte 0, e si ripete); la terza con blocchi di lunghezza 1 (1, 0, 1, 0, …); con 4 variabili i blocchi sono lunghi 8, 4, 2, 1 (il docente li chiama periodi). È un terzo modo per prenderli tutti, una volta ciascuno.</w:t>
-      </w:r>
-    </w:p>
-    <w:p>
-      <w:pPr>
-        <w:pStyle w:val="Titolo2"/>
-      </w:pPr>
-      <w:r>
-        <w:rPr>
-          <w:b/>
-          <w:color w:val="E97132"/>
-        </w:rPr>
-        <w:t>Dualità tra and e or</w:t>
-      </w:r>
-    </w:p>
-    <w:p>
-      <w:r>
-        <w:t xml:space="preserve">Nell'ordine del libro la congiunzione ha un solo 1 (quello con tutti gli argomenti veri, in cima alla tavola), mentre la disgiunzione ha un solo 0 (quello con tutti gli argomenti falsi, in fondo). Quindi le due tavole si ottengono l'una dall'altra </w:t>
-      </w:r>
-      <w:r>
-        <w:rPr>
-          <w:b/>
-        </w:rPr>
-        <w:t>scambiando 0 e 1</w:t>
-      </w:r>
-      <w:r>
-        <w:t xml:space="preserve"> (e scambiando sopra e sotto): si dice che congiunzione e disgiunzione sono </w:t>
-      </w:r>
-      <w:r>
-        <w:rPr>
-          <w:b/>
-        </w:rPr>
-        <w:t>duali</w:t>
-      </w:r>
-      <w:r>
-        <w:t xml:space="preserve">. La negazione è duale di sé stessa, perché scambiando 0 e 1 nella sua tavola si ottiene la stessa tavola (è </w:t>
-      </w:r>
-      <w:r>
-        <w:rPr>
-          <w:b/>
-        </w:rPr>
-        <w:t>autoduale</w:t>
-      </w:r>
-      <w:r>
-        <w:t>). Il docente ha anticipato che torneranno più avanti, perché è più importante di quanto sembri: tornerà quando si studieranno le leggi di De Morgan.</w:t>
-      </w:r>
-    </w:p>
-    <w:p>
-      <w:r>
-        <w:t>Il prossimo capitolo usa le tavole per confrontare formule: equivalenze, tautologie e contraddizioni.</w:t>
-      </w:r>
-    </w:p>
-    <w:p>
-      <w:pPr>
-        <w:pStyle w:val="Titolo1"/>
-      </w:pPr>
-      <w:r>
-        <w:rPr>
-          <w:b/>
-          <w:color w:val="EE0000"/>
-        </w:rPr>
-        <w:t>15. Equivalenze, Tautologie e Contraddizioni</w:t>
-      </w:r>
-    </w:p>
-    <w:p>
-      <w:pPr>
-        <w:pStyle w:val="Titolo2"/>
-      </w:pPr>
-      <w:r>
-        <w:rPr>
-          <w:b/>
-          <w:color w:val="E97132"/>
-        </w:rPr>
-        <w:t>Formule equivalenti</w:t>
-      </w:r>
-    </w:p>
-    <w:p>
-      <w:r>
-        <w:t xml:space="preserve">Due formule sono </w:t>
-      </w:r>
-      <w:r>
-        <w:rPr>
-          <w:b/>
-        </w:rPr>
-        <w:t>equivalenti</w:t>
-      </w:r>
-      <w:r>
-        <w:t xml:space="preserve"> se hanno gli stessi valori di verità per tutti i valori di verità delle loro componenti atomiche, cioè se hanno la </w:t>
-      </w:r>
-      <w:r>
-        <w:rPr>
-          <w:b/>
-        </w:rPr>
-        <w:t>stessa tavola di verità</w:t>
-      </w:r>
-      <w:r>
-        <w:t>. Non sono la stessa formula, ma si possono scambiare l'una con l'altra, scegliendo quella più utile in un dato contesto. Questo vale per i circuiti (due circuiti equivalenti si possono sostituire), ma anche per i programmi: prima di sostituire la condizione di uscita di un ciclo con un'altra formula più leggibile bisogna essere sicuri che sia equivalente, altrimenti si cambia il comportamento del programma.</w:t>
-      </w:r>
-    </w:p>
-    <w:p>
-      <w:pPr>
-        <w:pStyle w:val="Titolo2"/>
-      </w:pPr>
-      <w:r>
-        <w:rPr>
-          <w:b/>
-          <w:color w:val="E97132"/>
-        </w:rPr>
-        <w:lastRenderedPageBreak/>
         <w:t>Esempio: la negazione di una disgiunzione</w:t>
       </w:r>
     </w:p>
@@ -10773,16 +10745,20 @@
         <w:jc w:val="center"/>
       </w:pPr>
       <w:r>
+        <w:rPr>
+          <w:noProof/>
+        </w:rPr>
         <w:drawing>
-          <wp:inline xmlns:a="http://schemas.openxmlformats.org/drawingml/2006/main" xmlns:pic="http://schemas.openxmlformats.org/drawingml/2006/picture">
+          <wp:inline distT="0" distB="0" distL="0" distR="0" wp14:anchorId="3EB38DFB" wp14:editId="095AB5CC">
             <wp:extent cx="4500000" cy="1585932"/>
+            <wp:effectExtent l="0" t="0" r="0" b="0"/>
             <wp:docPr id="2073952344" name="Picture 2073952344"/>
             <wp:cNvGraphicFramePr>
-              <a:graphicFrameLocks noChangeAspect="1"/>
+              <a:graphicFrameLocks xmlns:a="http://schemas.openxmlformats.org/drawingml/2006/main" noChangeAspect="1"/>
             </wp:cNvGraphicFramePr>
-            <a:graphic>
+            <a:graphic xmlns:a="http://schemas.openxmlformats.org/drawingml/2006/main">
               <a:graphicData uri="http://schemas.openxmlformats.org/drawingml/2006/picture">
-                <pic:pic>
+                <pic:pic xmlns:pic="http://schemas.openxmlformats.org/drawingml/2006/picture">
                   <pic:nvPicPr>
                     <pic:cNvPr id="0" name="logica_demorgan.png"/>
                     <pic:cNvPicPr/>
@@ -10798,7 +10774,9 @@
                       <a:off x="0" y="0"/>
                       <a:ext cx="4500000" cy="1585932"/>
                     </a:xfrm>
-                    <a:prstGeom prst="rect"/>
+                    <a:prstGeom prst="rect">
+                      <a:avLst/>
+                    </a:prstGeom>
                   </pic:spPr>
                 </pic:pic>
               </a:graphicData>
@@ -10863,39 +10841,65 @@
     </w:p>
     <w:p>
       <w:r>
+        <w:rPr>
+          <w:highlight w:val="yellow"/>
+        </w:rPr>
         <w:t xml:space="preserve">Una </w:t>
       </w:r>
       <w:r>
         <w:rPr>
           <w:b/>
+          <w:highlight w:val="yellow"/>
         </w:rPr>
         <w:t>tautologia</w:t>
       </w:r>
       <w:r>
+        <w:rPr>
+          <w:highlight w:val="yellow"/>
+        </w:rPr>
         <w:t xml:space="preserve"> è una formula che è </w:t>
       </w:r>
       <w:r>
         <w:rPr>
           <w:b/>
+          <w:highlight w:val="yellow"/>
         </w:rPr>
         <w:t>sempre vera</w:t>
       </w:r>
       <w:r>
-        <w:t xml:space="preserve">, qualunque siano i valori delle sue componenti: nella colonna finale della sua tavola ci sono solo 1. Una </w:t>
-      </w:r>
-      <w:r>
-        <w:rPr>
-          <w:b/>
-        </w:rPr>
-        <w:t>contraddizione</w:t>
-      </w:r>
-      <w:r>
+        <w:rPr>
+          <w:highlight w:val="yellow"/>
+        </w:rPr>
+        <w:t>, qualunque siano i valori delle sue componenti: nella colonna finale della sua tavola ci sono solo 1</w:t>
+      </w:r>
+      <w:r>
+        <w:t xml:space="preserve">. Una </w:t>
+      </w:r>
+      <w:r>
+        <w:rPr>
+          <w:b/>
+        </w:rPr>
+        <w:t>c</w:t>
+      </w:r>
+      <w:r>
+        <w:rPr>
+          <w:b/>
+          <w:highlight w:val="yellow"/>
+        </w:rPr>
+        <w:t>ontraddizione</w:t>
+      </w:r>
+      <w:r>
+        <w:rPr>
+          <w:highlight w:val="yellow"/>
+        </w:rPr>
         <w:t xml:space="preserve"> è l'opposto: una formula </w:t>
       </w:r>
       <w:r>
         <w:rPr>
           <w:b/>
-        </w:rPr>
+          <w:highlight w:val="yellow"/>
+        </w:rPr>
+        <w:lastRenderedPageBreak/>
         <w:t>sempre falsa</w:t>
       </w:r>
       <w:r>
@@ -11010,69 +11014,36 @@
           <w:b/>
           <w:color w:val="E97132"/>
         </w:rPr>
-        <w:t>Una dimostrazione algebrica</w:t>
-      </w:r>
-    </w:p>
-    <w:p>
-      <w:r>
-        <w:t>Lo stesso fatto si può dimostrare con un ragionamento algebrico, senza tavola, usando due proprietà della disgiunzione:</w:t>
-      </w:r>
-    </w:p>
-    <w:p>
-      <w:pPr>
-        <w:numPr>
-          <w:ilvl w:val="0"/>
-          <w:numId w:val="1"/>
-        </w:numPr>
-      </w:pPr>
-      <w:r>
-        <w:rPr>
-          <w:b/>
-        </w:rPr>
-        <w:t>commutatività</w:t>
-      </w:r>
-      <w:r>
-        <w:t>: p ∨ q e q ∨ p hanno la stessa tavola di verità; la definizione dice che la disgiunzione è vera se almeno un argomento è vero, senza nominare l'ordine;</w:t>
-      </w:r>
-    </w:p>
-    <w:p>
-      <w:pPr>
-        <w:numPr>
-          <w:ilvl w:val="0"/>
-          <w:numId w:val="1"/>
-        </w:numPr>
-      </w:pPr>
-      <w:r>
-        <w:rPr>
-          <w:b/>
-        </w:rPr>
-        <w:lastRenderedPageBreak/>
-        <w:t>associatività</w:t>
-      </w:r>
-      <w:r>
-        <w:t>: (p ∨ q) ∨ r equivale a p ∨ (q ∨ r); si possono spostare le parentesi.</w:t>
-      </w:r>
-    </w:p>
-    <w:p>
-      <w:r>
-        <w:t>Per ¬p ∨ q ∨ p: con la commutatività si sposta p accanto a ¬p, con l'associatività si raggruppa (¬p ∨ p) ∨ q; la parte tra parentesi è un terzo escluso, sempre vera, quindi si ottiene vero ∨ q, che è vera perché un argomento è vero. Il risultato non dipende dal valore di q.</w:t>
-      </w:r>
-    </w:p>
-    <w:p>
-      <w:pPr>
-        <w:pStyle w:val="Titolo2"/>
-      </w:pPr>
-      <w:r>
-        <w:rPr>
-          <w:b/>
-          <w:color w:val="E97132"/>
-        </w:rPr>
         <w:t>Perché le tavole non bastano sempre</w:t>
       </w:r>
     </w:p>
     <w:p>
       <w:r>
-        <w:t xml:space="preserve">Le tavole di verità hanno un limite: le righe sono 2ⁿ. Con 1000 proposizioni atomiche sono 2¹⁰⁰⁰, un po' più di 10³⁰⁰ righe, un numero più grande del numero di particelle dell'universo. Con questa dimensione non si può usare la tavola, e servono metodi più veloci, che il corso accennerà più avanti. Il caso non è teorico: nella </w:t>
+        <w:rPr>
+          <w:highlight w:val="yellow"/>
+        </w:rPr>
+        <w:t>Le tavole di verità hanno un limite</w:t>
+      </w:r>
+      <w:r>
+        <w:t xml:space="preserve">: </w:t>
+      </w:r>
+      <w:r>
+        <w:rPr>
+          <w:highlight w:val="yellow"/>
+        </w:rPr>
+        <w:t>le righe sono 2ⁿ</w:t>
+      </w:r>
+      <w:r>
+        <w:t xml:space="preserve">. Con 1000 proposizioni atomiche sono 2¹⁰⁰⁰, un po' più di 10³⁰⁰ righe, un numero più grande del numero di particelle dell'universo. </w:t>
+      </w:r>
+      <w:r>
+        <w:rPr>
+          <w:highlight w:val="yellow"/>
+        </w:rPr>
+        <w:t>Con questa dimensione non si può usare la tavola, e servono metodi più veloci, che il corso accennerà più avanti</w:t>
+      </w:r>
+      <w:r>
+        <w:t xml:space="preserve">. Il caso non è teorico: nella </w:t>
       </w:r>
       <w:r>
         <w:rPr>
@@ -11084,11 +11055,7 @@
         <w:t xml:space="preserve"> (*model checking*) si descrive il sistema con una formula proposizionale che dice "non esiste una situazione di pericolo", con migliaia di affermazioni atomiche (la posizione e la velocità dei treni, lo stato dei segnali, la rete elettrica, il comportamento delle persone). Il docente ha citato studi di questo tipo per la metropolitana di Londra e per le ferrovie svedesi. Il model checking non fa parte del corso, ma è una delle motivazioni: a Fondamenti si impara la logica come base del ragionamento automatico.</w:t>
       </w:r>
     </w:p>
-    <w:p>
-      <w:r>
-        <w:t>Nella prossima lezione si introduce l'implicazione.</w:t>
-      </w:r>
-    </w:p>
+    <w:p/>
     <w:sectPr>
       <w:pgSz w:w="11906" w:h="16838"/>
       <w:pgMar w:top="1417" w:right="1134" w:bottom="1134" w:left="1134" w:header="708" w:footer="708" w:gutter="0"/>

</xml_diff>

<commit_message>
Fondamenti: capitoli 16-18 (implicazione, conversa/contrapposta, bicondizionale) dalla lezione 8
Co-Authored-By: Claude Sonnet 5.5 <noreply@anthropic.com>
</commit_message>
<xml_diff>
--- a/Riassunto Fondamenti Informatica.docx
+++ b/Riassunto Fondamenti Informatica.docx
@@ -11056,6 +11056,1652 @@
       </w:r>
     </w:p>
     <w:p/>
+    <w:p>
+      <w:pPr>
+        <w:pStyle w:val="Titolo1"/>
+      </w:pPr>
+      <w:r>
+        <w:rPr>
+          <w:b/>
+          <w:color w:val="EE0000"/>
+        </w:rPr>
+        <w:t>16. L'Implicazione (Condizionale)</w:t>
+      </w:r>
+    </w:p>
+    <w:p>
+      <w:pPr>
+        <w:pStyle w:val="Titolo2"/>
+      </w:pPr>
+      <w:r>
+        <w:rPr>
+          <w:b/>
+          <w:color w:val="E97132"/>
+        </w:rPr>
+        <w:t>Da dove si riparte</w:t>
+      </w:r>
+    </w:p>
+    <w:p>
+      <w:r>
+        <w:rPr/>
+        <w:t>Dopo i connettivi and, or, not, xor ed equivalenza, la logica proposizionale continua con l'</w:t>
+      </w:r>
+      <w:r>
+        <w:rPr>
+          <w:b/>
+        </w:rPr>
+        <w:t>implicazione</w:t>
+      </w:r>
+      <w:r>
+        <w:rPr/>
+        <w:t>, che nel libro è la sezione 1.3 della seconda parte. È anche il connettivo più delicato, perché il significato che gli si dà in logica proposizionale è diverso, e più povero, di quello che ha nel linguaggio comune.</w:t>
+      </w:r>
+    </w:p>
+    <w:p>
+      <w:pPr>
+        <w:pStyle w:val="Titolo2"/>
+      </w:pPr>
+      <w:r>
+        <w:rPr>
+          <w:b/>
+          <w:color w:val="E97132"/>
+        </w:rPr>
+        <w:t>Il significato dell'implicazione: materiale e non causale</w:t>
+      </w:r>
+    </w:p>
+    <w:p>
+      <w:r>
+        <w:rPr/>
+        <w:t xml:space="preserve">Un esempio dal libro: "se il Dipartimento di Matematica ottiene 60 mila dollari di finanziamento extra, assumerà un nuovo professore". Nel linguaggio comune "se… allora" suggerisce innanzitutto una </w:t>
+      </w:r>
+      <w:r>
+        <w:rPr>
+          <w:b/>
+        </w:rPr>
+        <w:t>relazione di causa</w:t>
+      </w:r>
+      <w:r>
+        <w:rPr/>
+        <w:t xml:space="preserve">: quel denaro verrà usato proprio per assumere qualcuno. In logica proposizionale di questa relazione non c'è alcuna traccia. Si lavora soltanto con i </w:t>
+      </w:r>
+      <w:r>
+        <w:rPr>
+          <w:b/>
+        </w:rPr>
+        <w:t>valori di verità</w:t>
+      </w:r>
+      <w:r>
+        <w:rPr/>
+        <w:t xml:space="preserve"> (vero e falso), e le tavole di verità sono troppo povere per esprimere un concetto complesso come la causalità. Per questo si dice che l'implicazione della logica è </w:t>
+      </w:r>
+      <w:r>
+        <w:rPr>
+          <w:b/>
+        </w:rPr>
+        <w:t>materiale</w:t>
+      </w:r>
+      <w:r>
+        <w:rPr/>
+        <w:t>: usa soltanto i valori di verità dei due argomenti e non le relazioni tra le due parti.</w:t>
+      </w:r>
+    </w:p>
+    <w:p>
+      <w:r>
+        <w:rPr/>
+        <w:t xml:space="preserve">La seconda differenza riguarda i casi in cui l'ipotesi non si verifica. Nel linguaggio comune, se il Dipartimento non ottiene il finanziamento, l'affermazione resta di fatto </w:t>
+      </w:r>
+      <w:r>
+        <w:rPr>
+          <w:b/>
+        </w:rPr>
+        <w:t>indefinita</w:t>
+      </w:r>
+      <w:r>
+        <w:rPr/>
+        <w:t>: non è né vera né falsa. In matematica avere affermazioni prive di valore di verità è molto svantaggioso, perché si potrebbe scrivere una dimostrazione senza accorgersi che è priva di senso. Per questo si decide di dare un significato a tutte le implicazioni, anche quando l'ipotesi è falsa.</w:t>
+      </w:r>
+    </w:p>
+    <w:p>
+      <w:pPr>
+        <w:pStyle w:val="Titolo2"/>
+      </w:pPr>
+      <w:r>
+        <w:rPr>
+          <w:b/>
+          <w:color w:val="E97132"/>
+        </w:rPr>
+        <w:t>La notazione e la tavola di verità</w:t>
+      </w:r>
+    </w:p>
+    <w:p>
+      <w:r>
+        <w:rPr/>
+        <w:t xml:space="preserve">L'implicazione si scrive con una freccia: p → q si legge "p implica q". La proposizione p si chiama </w:t>
+      </w:r>
+      <w:r>
+        <w:rPr>
+          <w:b/>
+        </w:rPr>
+        <w:t>ipotesi</w:t>
+      </w:r>
+      <w:r>
+        <w:rPr/>
+        <w:t xml:space="preserve"> o </w:t>
+      </w:r>
+      <w:r>
+        <w:rPr>
+          <w:b/>
+        </w:rPr>
+        <w:t>antecedente</w:t>
+      </w:r>
+      <w:r>
+        <w:rPr/>
+        <w:t xml:space="preserve">, la proposizione q si chiama </w:t>
+      </w:r>
+      <w:r>
+        <w:rPr>
+          <w:b/>
+        </w:rPr>
+        <w:t>tesi</w:t>
+      </w:r>
+      <w:r>
+        <w:rPr/>
+        <w:t xml:space="preserve">, </w:t>
+      </w:r>
+      <w:r>
+        <w:rPr>
+          <w:b/>
+        </w:rPr>
+        <w:t>conclusione</w:t>
+      </w:r>
+      <w:r>
+        <w:rPr/>
+        <w:t xml:space="preserve"> o </w:t>
+      </w:r>
+      <w:r>
+        <w:rPr>
+          <w:b/>
+        </w:rPr>
+        <w:t>conseguente</w:t>
+      </w:r>
+      <w:r>
+        <w:rPr/>
+        <w:t>. La tavola di verità, con l'ordine del libro (prima il vero, 1, poi il falso, 0), è:</w:t>
+      </w:r>
+    </w:p>
+    <w:p>
+      <w:pPr>
+        <w:keepNext/>
+        <w:jc w:val="center"/>
+      </w:pPr>
+      <w:r>
+        <w:drawing>
+          <wp:inline xmlns:a="http://schemas.openxmlformats.org/drawingml/2006/main" xmlns:pic="http://schemas.openxmlformats.org/drawingml/2006/picture">
+            <wp:extent cx="2880000" cy="2065371"/>
+            <wp:docPr id="2073952347" name="Picture 2073952347"/>
+            <wp:cNvGraphicFramePr>
+              <a:graphicFrameLocks noChangeAspect="1"/>
+            </wp:cNvGraphicFramePr>
+            <a:graphic>
+              <a:graphicData uri="http://schemas.openxmlformats.org/drawingml/2006/picture">
+                <pic:pic>
+                  <pic:nvPicPr>
+                    <pic:cNvPr id="0" name="logica_implicazione.png"/>
+                    <pic:cNvPicPr/>
+                  </pic:nvPicPr>
+                  <pic:blipFill>
+                    <a:blip r:embed="rId24"/>
+                    <a:stretch>
+                      <a:fillRect/>
+                    </a:stretch>
+                  </pic:blipFill>
+                  <pic:spPr>
+                    <a:xfrm>
+                      <a:off x="0" y="0"/>
+                      <a:ext cx="2880000" cy="2065371"/>
+                    </a:xfrm>
+                    <a:prstGeom prst="rect"/>
+                  </pic:spPr>
+                </pic:pic>
+              </a:graphicData>
+            </a:graphic>
+          </wp:inline>
+        </w:drawing>
+      </w:r>
+    </w:p>
+    <w:p>
+      <w:pPr>
+        <w:jc w:val="center"/>
+      </w:pPr>
+      <w:r>
+        <w:rPr>
+          <w:i/>
+          <w:sz w:val="18"/>
+        </w:rPr>
+        <w:t>La tavola di verità dell'implicazione: l'unica riga falsa è quella con ipotesi vera e tesi falsa.</w:t>
+      </w:r>
+    </w:p>
+    <w:p>
+      <w:r>
+        <w:rPr/>
+        <w:t xml:space="preserve">L'implicazione è </w:t>
+      </w:r>
+      <w:r>
+        <w:rPr>
+          <w:b/>
+        </w:rPr>
+        <w:t>falsa in un solo caso</w:t>
+      </w:r>
+      <w:r>
+        <w:rPr/>
+        <w:t>: quando l'ipotesi è vera e la tesi è falsa. Contano le due righe con ipotesi vera: si prende l'ipotesi vera e si controlla che sia vera anche la tesi. Se lo è, l'implicazione è vera; se non lo è, è falsa. Nelle altre due righe, quelle con ipotesi falsa, l'implicazione è vera senza nemmeno guardare la tesi.</w:t>
+      </w:r>
+    </w:p>
+    <w:p>
+      <w:pPr>
+        <w:pStyle w:val="Titolo2"/>
+      </w:pPr>
+      <w:r>
+        <w:rPr>
+          <w:b/>
+          <w:color w:val="E97132"/>
+        </w:rPr>
+        <w:t>Vero per difetto</w:t>
+      </w:r>
+    </w:p>
+    <w:p>
+      <w:r>
+        <w:rPr/>
+        <w:t xml:space="preserve">Quando l'ipotesi è falsa l'implicazione è </w:t>
+      </w:r>
+      <w:r>
+        <w:rPr>
+          <w:b/>
+        </w:rPr>
+        <w:t>vera</w:t>
+      </w:r>
+      <w:r>
+        <w:rPr/>
+        <w:t xml:space="preserve">, qualunque sia la tesi. Si dice che è </w:t>
+      </w:r>
+      <w:r>
+        <w:rPr>
+          <w:b/>
+        </w:rPr>
+        <w:t>vera per difetto</w:t>
+      </w:r>
+      <w:r>
+        <w:rPr/>
+        <w:t xml:space="preserve"> (in inglese *vacuously true*; si può dire anche "banalmente vera"). È una </w:t>
+      </w:r>
+      <w:r>
+        <w:rPr>
+          <w:b/>
+        </w:rPr>
+        <w:t>convenzione</w:t>
+      </w:r>
+      <w:r>
+        <w:rPr/>
+        <w:t>: bisognava dare un valore di verità a questi casi, e quello che per esperienza dà meno fastidio quando si scrivono le dimostrazioni è considerare l'implicazione come provata. Quando non ci sono le condizioni per usare l'implicazione, la si prende per buona e ci si concentra sui casi in cui l'ipotesi è vera.</w:t>
+      </w:r>
+    </w:p>
+    <w:p>
+      <w:r>
+        <w:rPr/>
+        <w:t>Il motivo per cui la convenzione è comoda si vede con un esempio di matematica: "se x è positivo, allora x · x è positivo", cioè x &gt; 0 → x · x &gt; 0, che si vuole vera per ogni x.</w:t>
+      </w:r>
+    </w:p>
+    <w:p>
+      <w:pPr>
+        <w:numPr>
+          <w:ilvl w:val="0"/>
+          <w:numId w:val="1"/>
+        </w:numPr>
+      </w:pPr>
+      <w:r>
+        <w:rPr/>
+        <w:t>Con x = 3: 3 &gt; 0 è vera e 9 &gt; 0 è vera, quindi l'implicazione è vera.</w:t>
+      </w:r>
+    </w:p>
+    <w:p>
+      <w:pPr>
+        <w:numPr>
+          <w:ilvl w:val="0"/>
+          <w:numId w:val="1"/>
+        </w:numPr>
+      </w:pPr>
+      <w:r>
+        <w:rPr/>
+        <w:t>Con x = 1: 1 &gt; 0 e 1 &gt; 0 sono vere, e l'implicazione è vera.</w:t>
+      </w:r>
+    </w:p>
+    <w:p>
+      <w:pPr>
+        <w:numPr>
+          <w:ilvl w:val="0"/>
+          <w:numId w:val="1"/>
+        </w:numPr>
+      </w:pPr>
+      <w:r>
+        <w:rPr/>
+        <w:t>Con x = 0: 0 &gt; 0 è falsa e 0 · 0 &gt; 0 è falsa. L'ipotesi è falsa, quindi l'implicazione è vera per difetto.</w:t>
+      </w:r>
+    </w:p>
+    <w:p>
+      <w:pPr>
+        <w:numPr>
+          <w:ilvl w:val="0"/>
+          <w:numId w:val="1"/>
+        </w:numPr>
+      </w:pPr>
+      <w:r>
+        <w:rPr/>
+        <w:t>Con x = −1: −1 &gt; 0 è falsa, ma (−1) · (−1) = 1 &gt; 0 è vera. Anche qui l'ipotesi è falsa e l'implicazione è vera, senza che interessi che la tesi lo sia.</w:t>
+      </w:r>
+    </w:p>
+    <w:p>
+      <w:r>
+        <w:rPr/>
+        <w:t>Nel linguaggio comune qualcuno direbbe che "se 0 &gt; 0…" non ha senso. Ma in matematica, se sostituendo un valore al posto di x l'enunciato perdesse significato, un enunciato sensato diventerebbe privo di senso. Con la tavola di verità dell'implicazione l'enunciato ha invece sempre un valore: è vero per ogni x.</w:t>
+      </w:r>
+    </w:p>
+    <w:p>
+      <w:r>
+        <w:rPr/>
+        <w:t>La tavola si può leggere anche così:</w:t>
+      </w:r>
+    </w:p>
+    <w:p>
+      <w:pPr>
+        <w:numPr>
+          <w:ilvl w:val="0"/>
+          <w:numId w:val="1"/>
+        </w:numPr>
+      </w:pPr>
+      <w:r>
+        <w:rPr/>
+        <w:t>se la tesi è vera, l'implicazione è vera, e si può ignorare l'ipotesi;</w:t>
+      </w:r>
+    </w:p>
+    <w:p>
+      <w:pPr>
+        <w:numPr>
+          <w:ilvl w:val="0"/>
+          <w:numId w:val="1"/>
+        </w:numPr>
+      </w:pPr>
+      <w:r>
+        <w:rPr/>
+        <w:t>se l'ipotesi è falsa, l'implicazione è vera, e si può ignorare la tesi;</w:t>
+      </w:r>
+    </w:p>
+    <w:p>
+      <w:pPr>
+        <w:numPr>
+          <w:ilvl w:val="0"/>
+          <w:numId w:val="1"/>
+        </w:numPr>
+      </w:pPr>
+      <w:r>
+        <w:rPr/>
+        <w:t>l'unico caso in cui i due valori sono entrambi rilevanti è quello con ipotesi vera e tesi falsa, in cui l'implicazione è falsa.</w:t>
+      </w:r>
+    </w:p>
+    <w:p>
+      <w:r>
+        <w:rPr/>
+        <w:t>Come sottolineato a lezione, nel corso di Fondamenti (e in quelli di Matematica e di Programmazione) si usa sempre questa implicazione materiale: bisogna dimenticare il significato di "se… allora" del linguaggio comune.</w:t>
+      </w:r>
+    </w:p>
+    <w:p>
+      <w:pPr>
+        <w:pStyle w:val="Titolo2"/>
+      </w:pPr>
+      <w:r>
+        <w:rPr>
+          <w:b/>
+          <w:color w:val="E97132"/>
+        </w:rPr>
+        <w:t>L'implicazione come test d'ordine</w:t>
+      </w:r>
+    </w:p>
+    <w:p>
+      <w:r>
+        <w:rPr/>
+        <w:t xml:space="preserve">C'è un altro modo di descrivere la tavola. Scrivendo 0 al posto di falso e 1 al posto di vero, p → q vale 1 esattamente quando il valore di p è </w:t>
+      </w:r>
+      <w:r>
+        <w:rPr>
+          <w:b/>
+        </w:rPr>
+        <w:t>minore o uguale</w:t>
+      </w:r>
+      <w:r>
+        <w:rPr/>
+        <w:t xml:space="preserve"> al valore di q: 1 ≤ 1, 0 ≤ 1 e 0 ≤ 0 danno 1, mentre l'unico caso in cui p ≤ q è falso è p = 1 e q = 0, che è proprio la riga falsa. L'implicazione si può quindi definire come il </w:t>
+      </w:r>
+      <w:r>
+        <w:rPr>
+          <w:b/>
+        </w:rPr>
+        <w:t>test d'ordine tra valori booleani</w:t>
+      </w:r>
+      <w:r>
+        <w:rPr/>
+        <w:t>.</w:t>
+      </w:r>
+    </w:p>
+    <w:p>
+      <w:r>
+        <w:rPr/>
+        <w:t xml:space="preserve">Una conseguenza: la proposizione (p → q) ∨ (q → p) è </w:t>
+      </w:r>
+      <w:r>
+        <w:rPr>
+          <w:b/>
+        </w:rPr>
+        <w:t>sempre vera</w:t>
+      </w:r>
+      <w:r>
+        <w:rPr/>
+        <w:t>, qualunque siano i valori di p e di q. Nel linguaggio comune verrebbe da dire che è falsa, perché ci aspetteremmo che p sia causa di q oppure il contrario, mentre due eventi possono essere del tutto indipendenti. Ma tra due numeri uno dei due è sempre minore o uguale all'altro, e lo stesso vale per due valori di verità: se c'è almeno uno 0, il più piccolo è lo 0; se sono entrambi 1, sono uguali. Quindi una delle due implicazioni è vera, e la loro disgiunzione è sempre vera.</w:t>
+      </w:r>
+    </w:p>
+    <w:p>
+      <w:pPr>
+        <w:pStyle w:val="Titolo2"/>
+      </w:pPr>
+      <w:r>
+        <w:rPr>
+          <w:b/>
+          <w:color w:val="E97132"/>
+        </w:rPr>
+        <w:t>La precedenza</w:t>
+      </w:r>
+    </w:p>
+    <w:p>
+      <w:r>
+        <w:rPr/>
+        <w:t xml:space="preserve">Come in 2 + 3 · 5 la moltiplicazione si esegue prima della somma, così tra i connettivi c'è una convenzione: l'implicazione si valuta </w:t>
+      </w:r>
+      <w:r>
+        <w:rPr>
+          <w:b/>
+        </w:rPr>
+        <w:t>per ultima</w:t>
+      </w:r>
+      <w:r>
+        <w:rPr/>
+        <w:t>. Con una negazione, un or e un'implicazione senza parentesi si calcolano prima la negazione e l'or, e poi l'implicazione: p ∨ q → ¬r significa (p ∨ q) → (¬r). Chi non vuole ricordare le convenzioni può aggiungere parentesi in più, e questo non è mai sbagliato, anche se dopo un po' diventa fastidioso.</w:t>
+      </w:r>
+    </w:p>
+    <w:p>
+      <w:pPr>
+        <w:pStyle w:val="Titolo2"/>
+      </w:pPr>
+      <w:r>
+        <w:rPr>
+          <w:b/>
+          <w:color w:val="E97132"/>
+        </w:rPr>
+        <w:t>Alcuni esempi di valutazione</w:t>
+      </w:r>
+    </w:p>
+    <w:p>
+      <w:r>
+        <w:rPr/>
+        <w:t>Siano p vera, q falsa e r vera (p = 1, q = 0, r = 1). Valutiamo quattro formule.</w:t>
+      </w:r>
+    </w:p>
+    <w:p>
+      <w:pPr>
+        <w:numPr>
+          <w:ilvl w:val="0"/>
+          <w:numId w:val="1"/>
+        </w:numPr>
+      </w:pPr>
+      <w:r>
+        <w:rPr>
+          <w:b/>
+        </w:rPr>
+        <w:t>(p ∧ q) → r</w:t>
+      </w:r>
+      <w:r>
+        <w:rPr/>
+        <w:t>. La congiunzione p ∧ q è falsa, perché uno dei due lati (q) è falso. L'ipotesi è quindi falsa e l'implicazione è vera, senza guardare r. In generale, se una parte di una congiunzione è falsa, l'intera congiunzione è falsa, e un'implicazione che ha quella congiunzione come ipotesi è vera.</w:t>
+      </w:r>
+    </w:p>
+    <w:p>
+      <w:pPr>
+        <w:numPr>
+          <w:ilvl w:val="0"/>
+          <w:numId w:val="1"/>
+        </w:numPr>
+      </w:pPr>
+      <w:r>
+        <w:rPr>
+          <w:b/>
+        </w:rPr>
+        <w:t>(p ∨ q) → ¬r</w:t>
+      </w:r>
+      <w:r>
+        <w:rPr/>
+        <w:t xml:space="preserve">. La disgiunzione p ∨ q è vera (basta che un lato sia vero), mentre ¬r è falsa. Si ha 1 → 0, e l'implicazione è </w:t>
+      </w:r>
+      <w:r>
+        <w:rPr>
+          <w:b/>
+        </w:rPr>
+        <w:t>falsa</w:t>
+      </w:r>
+      <w:r>
+        <w:rPr/>
+        <w:t>.</w:t>
+      </w:r>
+    </w:p>
+    <w:p>
+      <w:pPr>
+        <w:numPr>
+          <w:ilvl w:val="0"/>
+          <w:numId w:val="1"/>
+        </w:numPr>
+      </w:pPr>
+      <w:r>
+        <w:rPr>
+          <w:b/>
+        </w:rPr>
+        <w:t>p ∧ (q → r)</w:t>
+      </w:r>
+      <w:r>
+        <w:rPr/>
+        <w:t>. L'implicazione q → r ha ipotesi falsa, quindi è vera per difetto; anche p è vera. La congiunzione è quindi vera.</w:t>
+      </w:r>
+    </w:p>
+    <w:p>
+      <w:pPr>
+        <w:numPr>
+          <w:ilvl w:val="0"/>
+          <w:numId w:val="1"/>
+        </w:numPr>
+      </w:pPr>
+      <w:r>
+        <w:rPr>
+          <w:b/>
+        </w:rPr>
+        <w:t>p → (q → r)</w:t>
+      </w:r>
+      <w:r>
+        <w:rPr/>
+        <w:t>. L'implicazione interna q → r è vera per difetto, quindi si ha 1 → 1, e l'intera formula è vera.</w:t>
+      </w:r>
+    </w:p>
+    <w:p>
+      <w:r>
+        <w:rPr/>
+        <w:t xml:space="preserve">L'ultima formula si legge in modo naturale come "se vale p, allora (se vale q, allora vale r)", cioè come un'implicazione con </w:t>
+      </w:r>
+      <w:r>
+        <w:rPr>
+          <w:b/>
+        </w:rPr>
+        <w:t>due ipotesi</w:t>
+      </w:r>
+      <w:r>
+        <w:rPr/>
+        <w:t>: se p e q sono entrambe vere, allora è vera r. In generale, quando un'implicazione ha più ipotesi e anche una sola è falsa, l'implicazione è vera per difetto; se tutte le ipotesi sono vere bisogna controllare la tesi, e l'implicazione è falsa solo se la tesi è falsa. Le due scritture sono in effetti equivalenti: p → (q → r) e (p ∧ q) → r sono false soltanto quando p e q sono vere e r è falsa.</w:t>
+      </w:r>
+    </w:p>
+    <w:p>
+      <w:r>
+        <w:rPr/>
+        <w:t>Il capitolo successivo parte dall'implicazione per costruire la sua conversa, la sua contrapposta e le espressioni "condizione necessaria" e "condizione sufficiente".</w:t>
+      </w:r>
+    </w:p>
+    <w:p>
+      <w:pPr>
+        <w:pStyle w:val="Titolo1"/>
+      </w:pPr>
+      <w:r>
+        <w:rPr>
+          <w:b/>
+          <w:color w:val="EE0000"/>
+        </w:rPr>
+        <w:t>17. Conversa, Contrapposta, Condizioni Necessarie e Sufficienti</w:t>
+      </w:r>
+    </w:p>
+    <w:p>
+      <w:pPr>
+        <w:pStyle w:val="Titolo2"/>
+      </w:pPr>
+      <w:r>
+        <w:rPr>
+          <w:b/>
+          <w:color w:val="E97132"/>
+        </w:rPr>
+        <w:t>Le forme correlate a un'implicazione</w:t>
+      </w:r>
+    </w:p>
+    <w:p>
+      <w:r>
+        <w:rPr/>
+        <w:t>Da un'implicazione se ne possono costruire altre, scambiando i due argomenti o anche negandoli. Data p → q, si definiscono due proposizioni correlate:</w:t>
+      </w:r>
+    </w:p>
+    <w:p>
+      <w:pPr>
+        <w:numPr>
+          <w:ilvl w:val="0"/>
+          <w:numId w:val="1"/>
+        </w:numPr>
+      </w:pPr>
+      <w:r>
+        <w:rPr/>
+        <w:t xml:space="preserve">la </w:t>
+      </w:r>
+      <w:r>
+        <w:rPr>
+          <w:b/>
+        </w:rPr>
+        <w:t>conversa</w:t>
+      </w:r>
+      <w:r>
+        <w:rPr/>
+        <w:t xml:space="preserve"> (o </w:t>
+      </w:r>
+      <w:r>
+        <w:rPr>
+          <w:b/>
+        </w:rPr>
+        <w:t>reciproco</w:t>
+      </w:r>
+      <w:r>
+        <w:rPr/>
+        <w:t>, in inglese *converse*): q → p, che scambia i ruoli di ipotesi e tesi;</w:t>
+      </w:r>
+    </w:p>
+    <w:p>
+      <w:pPr>
+        <w:numPr>
+          <w:ilvl w:val="0"/>
+          <w:numId w:val="1"/>
+        </w:numPr>
+      </w:pPr>
+      <w:r>
+        <w:rPr/>
+        <w:t xml:space="preserve">la </w:t>
+      </w:r>
+      <w:r>
+        <w:rPr>
+          <w:b/>
+        </w:rPr>
+        <w:t>contrapposta</w:t>
+      </w:r>
+      <w:r>
+        <w:rPr/>
+        <w:t xml:space="preserve"> (in inglese *contrapositive*): ¬q → ¬p, che scambia i ruoli </w:t>
+      </w:r>
+      <w:r>
+        <w:rPr>
+          <w:b/>
+        </w:rPr>
+        <w:t>e</w:t>
+      </w:r>
+      <w:r>
+        <w:rPr/>
+        <w:t xml:space="preserve"> nega entrambi gli argomenti.</w:t>
+      </w:r>
+    </w:p>
+    <w:p>
+      <w:pPr>
+        <w:pStyle w:val="Titolo2"/>
+      </w:pPr>
+      <w:r>
+        <w:rPr>
+          <w:b/>
+          <w:color w:val="E97132"/>
+        </w:rPr>
+        <w:t>La conversa non è equivalente</w:t>
+      </w:r>
+    </w:p>
+    <w:p>
+      <w:r>
+        <w:rPr/>
+        <w:t xml:space="preserve">Un'implicazione e la sua conversa </w:t>
+      </w:r>
+      <w:r>
+        <w:rPr>
+          <w:b/>
+        </w:rPr>
+        <w:t>non sono equivalenti</w:t>
+      </w:r>
+      <w:r>
+        <w:rPr/>
+        <w:t xml:space="preserve">. Un esempio: sia p la proposizione "1 &gt; 2", che è falsa, e q la proposizione "4 &lt; 8", che è vera. L'implicazione p → q ha l'ipotesi falsa, quindi è vera per difetto. La conversa q → p ha l'ipotesi vera e la tesi falsa, quindi è </w:t>
+      </w:r>
+      <w:r>
+        <w:rPr>
+          <w:b/>
+        </w:rPr>
+        <w:t>falsa</w:t>
+      </w:r>
+      <w:r>
+        <w:rPr/>
+        <w:t>. Esistono dunque valori di p e q per cui p → q e q → p hanno valori di verità diversi: succede quando p e q sono diversi.</w:t>
+      </w:r>
+    </w:p>
+    <w:p>
+      <w:r>
+        <w:rPr/>
+        <w:t>Se si cambia la direzione di un'implicazione, il valore di verità cambia in due casi su quattro; quando p e q sono entrambe vere, o entrambe false, resta lo stesso (vera per entrambe). Un altro esempio: "se Jerry vince la lotteria, allora va al college" può essere vera, mentre la conversa "se Jerry va al college, allora ha vinto la lotteria" è falsa, perché potrebbe andarci con i suoi risparmi. L'errore più frequente è appunto scambiare un'implicazione con la sua conversa.</w:t>
+      </w:r>
+    </w:p>
+    <w:p>
+      <w:pPr>
+        <w:pStyle w:val="Titolo2"/>
+      </w:pPr>
+      <w:r>
+        <w:rPr>
+          <w:b/>
+          <w:color w:val="E97132"/>
+        </w:rPr>
+        <w:t>La contrapposta è equivalente</w:t>
+      </w:r>
+    </w:p>
+    <w:p>
+      <w:r>
+        <w:rPr/>
+        <w:t>Con la contrapposta le cose vanno diversamente: p → q e ¬q → ¬p hanno la stessa tavola di verità.</w:t>
+      </w:r>
+    </w:p>
+    <w:p>
+      <w:pPr>
+        <w:keepNext/>
+        <w:jc w:val="center"/>
+      </w:pPr>
+      <w:r>
+        <w:drawing>
+          <wp:inline xmlns:a="http://schemas.openxmlformats.org/drawingml/2006/main" xmlns:pic="http://schemas.openxmlformats.org/drawingml/2006/picture">
+            <wp:extent cx="4140000" cy="1692410"/>
+            <wp:docPr id="2073952348" name="Picture 2073952348"/>
+            <wp:cNvGraphicFramePr>
+              <a:graphicFrameLocks noChangeAspect="1"/>
+            </wp:cNvGraphicFramePr>
+            <a:graphic>
+              <a:graphicData uri="http://schemas.openxmlformats.org/drawingml/2006/picture">
+                <pic:pic>
+                  <pic:nvPicPr>
+                    <pic:cNvPr id="0" name="logica_contrapposta.png"/>
+                    <pic:cNvPicPr/>
+                  </pic:nvPicPr>
+                  <pic:blipFill>
+                    <a:blip r:embed="rId25"/>
+                    <a:stretch>
+                      <a:fillRect/>
+                    </a:stretch>
+                  </pic:blipFill>
+                  <pic:spPr>
+                    <a:xfrm>
+                      <a:off x="0" y="0"/>
+                      <a:ext cx="4140000" cy="1692410"/>
+                    </a:xfrm>
+                    <a:prstGeom prst="rect"/>
+                  </pic:spPr>
+                </pic:pic>
+              </a:graphicData>
+            </a:graphic>
+          </wp:inline>
+        </w:drawing>
+      </w:r>
+    </w:p>
+    <w:p>
+      <w:pPr>
+        <w:jc w:val="center"/>
+      </w:pPr>
+      <w:r>
+        <w:rPr>
+          <w:i/>
+          <w:sz w:val="18"/>
+        </w:rPr>
+        <w:t>Le tavole di verità di p → q e della sua contrapposta ¬q → ¬p: le colonne coincidono.</w:t>
+      </w:r>
+    </w:p>
+    <w:p>
+      <w:r>
+        <w:rPr/>
+        <w:t>Anche con un ragionamento: p → q dice che tutte le volte che p è vera lo è anche q; allora se q è falsa dovrà essere falsa anche p. Quindi da p → q segue ¬q → ¬p. Applicando la stessa legge un'altra volta a ¬q → ¬p si ottiene ¬¬p → ¬¬q, e per la legge della doppia negazione (negare due volte equivale ad affermare: ¬¬p ≡ p, come si vede subito dalla tavola) si ritorna a p → q. Ciascuna delle due implicazioni si ottiene dall'altra, e sono quindi equivalenti.</w:t>
+      </w:r>
+    </w:p>
+    <w:p>
+      <w:pPr>
+        <w:pStyle w:val="Titolo2"/>
+      </w:pPr>
+      <w:r>
+        <w:rPr>
+          <w:b/>
+          <w:color w:val="E97132"/>
+        </w:rPr>
+        <w:t>Condizioni necessarie e condizioni sufficienti</w:t>
+      </w:r>
+    </w:p>
+    <w:p>
+      <w:r>
+        <w:rPr/>
+        <w:t>Nei corsi di matematica le implicazioni si esprimono spesso con le parole "condizione necessaria" e "condizione sufficiente". Non c'è un concetto nuovo: sono solo abbreviazioni per le due direzioni di un'implicazione, e vanno conosciute.</w:t>
+      </w:r>
+    </w:p>
+    <w:p>
+      <w:pPr>
+        <w:numPr>
+          <w:ilvl w:val="0"/>
+          <w:numId w:val="1"/>
+        </w:numPr>
+      </w:pPr>
+      <w:r>
+        <w:rPr>
+          <w:b/>
+        </w:rPr>
+        <w:t>A è una condizione necessaria per B</w:t>
+      </w:r>
+      <w:r>
+        <w:rPr/>
+        <w:t xml:space="preserve"> significa che, quando B è vera, è necessario che lo sia anche A: B → A. Il "necessario" è la parte implicata.</w:t>
+      </w:r>
+    </w:p>
+    <w:p>
+      <w:pPr>
+        <w:numPr>
+          <w:ilvl w:val="0"/>
+          <w:numId w:val="1"/>
+        </w:numPr>
+      </w:pPr>
+      <w:r>
+        <w:rPr>
+          <w:b/>
+        </w:rPr>
+        <w:t>A è una condizione sufficiente per B</w:t>
+      </w:r>
+      <w:r>
+        <w:rPr/>
+        <w:t xml:space="preserve"> significa A → B: se A è vera, basta questo perché lo sia B. Il "sufficiente" è l'ipotesi.</w:t>
+      </w:r>
+    </w:p>
+    <w:p>
+      <w:r>
+        <w:rPr/>
+        <w:t>La condizione necessaria è la direzione "difficile", quella da destra a sinistra rispetto al modo in cui di solito scriviamo; la condizione sufficiente è quella che ci viene più naturale, da sinistra a destra: è semplicemente l'implicazione scritta nell'ordine consueto, mentre il necessario è il reciproco.</w:t>
+      </w:r>
+    </w:p>
+    <w:p>
+      <w:r>
+        <w:rPr/>
+        <w:t>Che cosa si può dedurre? Basta rileggere la tavola di verità con questa terminologia.</w:t>
+      </w:r>
+    </w:p>
+    <w:p>
+      <w:r>
+        <w:rPr/>
+        <w:t xml:space="preserve">Se </w:t>
+      </w:r>
+      <w:r>
+        <w:rPr>
+          <w:b/>
+        </w:rPr>
+        <w:t>A è necessaria per B</w:t>
+      </w:r>
+      <w:r>
+        <w:rPr/>
+        <w:t xml:space="preserve"> (B → A):</w:t>
+      </w:r>
+    </w:p>
+    <w:p>
+      <w:pPr>
+        <w:numPr>
+          <w:ilvl w:val="0"/>
+          <w:numId w:val="1"/>
+        </w:numPr>
+      </w:pPr>
+      <w:r>
+        <w:rPr/>
+        <w:t>se A è vera, su B non si sa nulla (la condizione non è stata smentita, ma da sola non basta);</w:t>
+      </w:r>
+    </w:p>
+    <w:p>
+      <w:pPr>
+        <w:numPr>
+          <w:ilvl w:val="0"/>
+          <w:numId w:val="1"/>
+        </w:numPr>
+      </w:pPr>
+      <w:r>
+        <w:rPr/>
+        <w:t>se A è falsa, allora anche B è falsa: se una condizione necessaria fallisce, fallisce ciò di cui è condizione;</w:t>
+      </w:r>
+    </w:p>
+    <w:p>
+      <w:pPr>
+        <w:numPr>
+          <w:ilvl w:val="0"/>
+          <w:numId w:val="1"/>
+        </w:numPr>
+      </w:pPr>
+      <w:r>
+        <w:rPr/>
+        <w:t>se B è vera, allora A è vera: la verità di un fatto implica la verità di tutte le sue condizioni necessarie;</w:t>
+      </w:r>
+    </w:p>
+    <w:p>
+      <w:pPr>
+        <w:numPr>
+          <w:ilvl w:val="0"/>
+          <w:numId w:val="1"/>
+        </w:numPr>
+      </w:pPr>
+      <w:r>
+        <w:rPr/>
+        <w:t>se B è falsa, su A non si sa nulla: può essere falsa proprio per questa condizione o per un'altra.</w:t>
+      </w:r>
+    </w:p>
+    <w:p>
+      <w:r>
+        <w:rPr/>
+        <w:t xml:space="preserve">Se </w:t>
+      </w:r>
+      <w:r>
+        <w:rPr>
+          <w:b/>
+        </w:rPr>
+        <w:t>A è sufficiente per B</w:t>
+      </w:r>
+      <w:r>
+        <w:rPr/>
+        <w:t xml:space="preserve"> (A → B):</w:t>
+      </w:r>
+    </w:p>
+    <w:p>
+      <w:pPr>
+        <w:numPr>
+          <w:ilvl w:val="0"/>
+          <w:numId w:val="1"/>
+        </w:numPr>
+      </w:pPr>
+      <w:r>
+        <w:rPr/>
+        <w:t>se A è vera, allora B è vera;</w:t>
+      </w:r>
+    </w:p>
+    <w:p>
+      <w:pPr>
+        <w:numPr>
+          <w:ilvl w:val="0"/>
+          <w:numId w:val="1"/>
+        </w:numPr>
+      </w:pPr>
+      <w:r>
+        <w:rPr/>
+        <w:t>se A è falsa, su B non si sa nulla;</w:t>
+      </w:r>
+    </w:p>
+    <w:p>
+      <w:pPr>
+        <w:numPr>
+          <w:ilvl w:val="0"/>
+          <w:numId w:val="1"/>
+        </w:numPr>
+      </w:pPr>
+      <w:r>
+        <w:rPr/>
+        <w:t>se B è vera, su A non si sa nulla, perché quando la tesi è vera l'implicazione è vera comunque;</w:t>
+      </w:r>
+    </w:p>
+    <w:p>
+      <w:pPr>
+        <w:numPr>
+          <w:ilvl w:val="0"/>
+          <w:numId w:val="1"/>
+        </w:numPr>
+      </w:pPr>
+      <w:r>
+        <w:rPr/>
+        <w:t>se B è falsa, allora anche A è falsa: se fosse vera, anche B dovrebbe esserlo.</w:t>
+      </w:r>
+    </w:p>
+    <w:p>
+      <w:r>
+        <w:rPr/>
+        <w:t xml:space="preserve">Un esempio che non richiede conoscenze particolari: "se Maria va alla Tour Eiffel, allora visita la Francia". Andare alla Tour Eiffel è una condizione </w:t>
+      </w:r>
+      <w:r>
+        <w:rPr>
+          <w:b/>
+        </w:rPr>
+        <w:t>sufficiente</w:t>
+      </w:r>
+      <w:r>
+        <w:rPr/>
+        <w:t xml:space="preserve"> per visitare la Francia, ma non è necessaria: Maria potrebbe andare a Les Invalides, al Louvre o in Normandia, e ognuna di queste scelte sarebbe sufficiente a visitare la Francia. Invece visitare la Francia è una condizione </w:t>
+      </w:r>
+      <w:r>
+        <w:rPr>
+          <w:b/>
+        </w:rPr>
+        <w:t>necessaria</w:t>
+      </w:r>
+      <w:r>
+        <w:rPr/>
+        <w:t xml:space="preserve"> per vedere la Tour Eiffel (se non è in Francia, non può raggiungerla), ma non basta: dipende da dove va esattamente in Francia.</w:t>
+      </w:r>
+    </w:p>
+    <w:p>
+      <w:pPr>
+        <w:pStyle w:val="Titolo2"/>
+      </w:pPr>
+      <w:r>
+        <w:rPr>
+          <w:b/>
+          <w:color w:val="E97132"/>
+        </w:rPr>
+        <w:t>Come si traduce dal linguaggio naturale</w:t>
+      </w:r>
+    </w:p>
+    <w:p>
+      <w:r>
+        <w:rPr/>
+        <w:t>Nei quesiti d'esame l'implicazione p → q non compare sempre nella forma "se p, allora q". Le formulazioni seguenti equivalgono tutte a p → q:</w:t>
+      </w:r>
+    </w:p>
+    <w:p>
+      <w:pPr>
+        <w:numPr>
+          <w:ilvl w:val="0"/>
+          <w:numId w:val="1"/>
+        </w:numPr>
+      </w:pPr>
+      <w:r>
+        <w:rPr/>
+        <w:t>"se p, allora q" e "p implica q";</w:t>
+      </w:r>
+    </w:p>
+    <w:p>
+      <w:pPr>
+        <w:numPr>
+          <w:ilvl w:val="0"/>
+          <w:numId w:val="1"/>
+        </w:numPr>
+      </w:pPr>
+      <w:r>
+        <w:rPr/>
+        <w:t>"q se p" (p, dopo il "se", è l'ipotesi);</w:t>
+      </w:r>
+    </w:p>
+    <w:p>
+      <w:pPr>
+        <w:numPr>
+          <w:ilvl w:val="0"/>
+          <w:numId w:val="1"/>
+        </w:numPr>
+      </w:pPr>
+      <w:r>
+        <w:rPr/>
+        <w:t>"p solo se q" (attenzione: non q → p; il "solo se" introduce la condizione necessaria, cioè la tesi);</w:t>
+      </w:r>
+    </w:p>
+    <w:p>
+      <w:pPr>
+        <w:numPr>
+          <w:ilvl w:val="0"/>
+          <w:numId w:val="1"/>
+        </w:numPr>
+      </w:pPr>
+      <w:r>
+        <w:rPr/>
+        <w:t>"p è condizione sufficiente per q";</w:t>
+      </w:r>
+    </w:p>
+    <w:p>
+      <w:pPr>
+        <w:numPr>
+          <w:ilvl w:val="0"/>
+          <w:numId w:val="1"/>
+        </w:numPr>
+      </w:pPr>
+      <w:r>
+        <w:rPr/>
+        <w:t>"q è condizione necessaria per p".</w:t>
+      </w:r>
+    </w:p>
+    <w:p>
+      <w:r>
+        <w:rPr/>
+        <w:t>Riassumendo: l'ipotesi è la condizione sufficiente, la tesi è la condizione necessaria; la conversa, quella con i ruoli scambiati, non è equivalente all'implicazione di partenza, mentre la contrapposta lo è.</w:t>
+      </w:r>
+    </w:p>
+    <w:p>
+      <w:pPr>
+        <w:pStyle w:val="Titolo1"/>
+      </w:pPr>
+      <w:r>
+        <w:rPr>
+          <w:b/>
+          <w:color w:val="EE0000"/>
+        </w:rPr>
+        <w:t>18. Il Bicondizionale, l'Equivalenza e le Riscritture dell'Implicazione</w:t>
+      </w:r>
+    </w:p>
+    <w:p>
+      <w:pPr>
+        <w:pStyle w:val="Titolo2"/>
+      </w:pPr>
+      <w:r>
+        <w:rPr>
+          <w:b/>
+          <w:color w:val="E97132"/>
+        </w:rPr>
+        <w:t>L'equivalenza logica</w:t>
+      </w:r>
+    </w:p>
+    <w:p>
+      <w:r>
+        <w:rPr/>
+        <w:t xml:space="preserve">Due formule sono </w:t>
+      </w:r>
+      <w:r>
+        <w:rPr>
+          <w:b/>
+        </w:rPr>
+        <w:t>logicamente equivalenti</w:t>
+      </w:r>
+      <w:r>
+        <w:rPr/>
+        <w:t xml:space="preserve"> quando hanno la stessa tavola di verità (capitolo 15); si scrive P ≡ Q. Il </w:t>
+      </w:r>
+      <w:r>
+        <w:rPr>
+          <w:b/>
+        </w:rPr>
+        <w:t>bicondizionale</w:t>
+      </w:r>
+      <w:r>
+        <w:rPr/>
+        <w:t xml:space="preserve">, già incontrato come "equivalenza" nel capitolo 13, è il connettivo che dà 1 quando due valori sono uguali: p ↔ q (si legge "p se e solo se q", in inglese *iff*, o anche "doppia freccia") è vera quando i due valori di verità sono </w:t>
+      </w:r>
+      <w:r>
+        <w:rPr>
+          <w:b/>
+        </w:rPr>
+        <w:t>uguali</w:t>
+      </w:r>
+      <w:r>
+        <w:rPr/>
+        <w:t xml:space="preserve"> (entrambi veri o entrambi falsi) ed è falsa quando sono diversi. È dunque il </w:t>
+      </w:r>
+      <w:r>
+        <w:rPr>
+          <w:b/>
+        </w:rPr>
+        <w:t>test di uguaglianza</w:t>
+      </w:r>
+      <w:r>
+        <w:rPr/>
+        <w:t xml:space="preserve"> tra due valori di verità, ed è legato alla relazione ≡ tra formule: P ≡ Q vale proprio quando P ↔ Q è una tautologia.</w:t>
+      </w:r>
+    </w:p>
+    <w:p>
+      <w:pPr>
+        <w:pStyle w:val="Titolo2"/>
+      </w:pPr>
+      <w:r>
+        <w:rPr>
+          <w:b/>
+          <w:color w:val="E97132"/>
+        </w:rPr>
+        <w:t>Il bicondizionale e le due implicazioni</w:t>
+      </w:r>
+    </w:p>
+    <w:p>
+      <w:r>
+        <w:rPr/>
+        <w:t xml:space="preserve">Si chiama bicondizionale perché è fatto di due condizionali opposti, l'implicazione da sinistra a destra e quella da destra a sinistra: </w:t>
+      </w:r>
+      <w:r>
+        <w:rPr>
+          <w:b/>
+        </w:rPr>
+        <w:t>p ↔ q ≡ (p → q) ∧ (q → p)</w:t>
+      </w:r>
+      <w:r>
+        <w:rPr/>
+        <w:t xml:space="preserve">. In parole, p è condizione necessaria </w:t>
+      </w:r>
+      <w:r>
+        <w:rPr>
+          <w:b/>
+        </w:rPr>
+        <w:t>e</w:t>
+      </w:r>
+      <w:r>
+        <w:rPr/>
+        <w:t xml:space="preserve"> sufficiente per q.</w:t>
+      </w:r>
+    </w:p>
+    <w:p>
+      <w:pPr>
+        <w:keepNext/>
+        <w:jc w:val="center"/>
+      </w:pPr>
+      <w:r>
+        <w:drawing>
+          <wp:inline xmlns:a="http://schemas.openxmlformats.org/drawingml/2006/main" xmlns:pic="http://schemas.openxmlformats.org/drawingml/2006/picture">
+            <wp:extent cx="4500000" cy="1525321"/>
+            <wp:docPr id="2073952349" name="Picture 2073952349"/>
+            <wp:cNvGraphicFramePr>
+              <a:graphicFrameLocks noChangeAspect="1"/>
+            </wp:cNvGraphicFramePr>
+            <a:graphic>
+              <a:graphicData uri="http://schemas.openxmlformats.org/drawingml/2006/picture">
+                <pic:pic>
+                  <pic:nvPicPr>
+                    <pic:cNvPr id="0" name="logica_bicondizionale.png"/>
+                    <pic:cNvPicPr/>
+                  </pic:nvPicPr>
+                  <pic:blipFill>
+                    <a:blip r:embed="rId26"/>
+                    <a:stretch>
+                      <a:fillRect/>
+                    </a:stretch>
+                  </pic:blipFill>
+                  <pic:spPr>
+                    <a:xfrm>
+                      <a:off x="0" y="0"/>
+                      <a:ext cx="4500000" cy="1525321"/>
+                    </a:xfrm>
+                    <a:prstGeom prst="rect"/>
+                  </pic:spPr>
+                </pic:pic>
+              </a:graphicData>
+            </a:graphic>
+          </wp:inline>
+        </w:drawing>
+      </w:r>
+    </w:p>
+    <w:p>
+      <w:pPr>
+        <w:jc w:val="center"/>
+      </w:pPr>
+      <w:r>
+        <w:rPr>
+          <w:i/>
+          <w:sz w:val="18"/>
+        </w:rPr>
+        <w:t>La tavola di verità del bicondizionale: coincide con quella della congiunzione delle due implicazioni.</w:t>
+      </w:r>
+    </w:p>
+    <w:p>
+      <w:r>
+        <w:rPr/>
+        <w:t>Lo si può provare con una tavola di verità, come in figura, oppure con un ragionamento. Poiché p → q equivale a "il valore di p è minore o uguale al valore di q", la congiunzione (p → q) ∧ (q → p) dice che p ≤ q e q ≤ p. Per una proprietà degli ordini (l'antisimmetria), se p ≤ q e q ≤ p allora p e q sono uguali: quindi la congiunzione è il test di uguaglianza, cioè il bicondizionale. Quale dei due modi sia la definizione e quale la proprietà dipende da come si è definito il bicondizionale: se lo si definisce con la tavola di verità, si osserva che vale 1 con due valori uguali e 0 con due diversi, e poi si mostra l'equivalenza con le due implicazioni.</w:t>
+      </w:r>
+    </w:p>
+    <w:p>
+      <w:pPr>
+        <w:pStyle w:val="Titolo2"/>
+      </w:pPr>
+      <w:r>
+        <w:rPr>
+          <w:b/>
+          <w:color w:val="E97132"/>
+        </w:rPr>
+        <w:t>L'implicazione si può scrivere con altri connettivi</w:t>
+      </w:r>
+    </w:p>
+    <w:p>
+      <w:r>
+        <w:rPr/>
+        <w:t>Non è necessario avere l'implicazione come connettivo (o come circuito): se si sa realizzare la negazione e la congiunzione, si può realizzare anche l'implicazione. Vediamo come.</w:t>
+      </w:r>
+    </w:p>
+    <w:p>
+      <w:r>
+        <w:rPr>
+          <w:b/>
+        </w:rPr>
+        <w:t>La negazione dell'implicazione.</w:t>
+      </w:r>
+      <w:r>
+        <w:rPr/>
+        <w:t xml:space="preserve"> L'implicazione è falsa in un solo caso: ipotesi vera e tesi falsa. Quindi ¬(p → q) è vera esattamente quando p è vera e q è falsa:</w:t>
+      </w:r>
+    </w:p>
+    <w:p>
+      <w:r>
+        <w:rPr/>
+        <w:t>¬(p → q) ≡ p ∧ ¬q.</w:t>
+      </w:r>
+    </w:p>
+    <w:p>
+      <w:r>
+        <w:rPr/>
+        <w:t>La negazione di un'implicazione non è un'altra implicazione, ma una congiunzione. Attenzione al modo in cui si nega un'implicazione: p → ¬q oppure ¬p → ¬q non sono corrette; la negazione giusta è p ∧ ¬q. Per esempio, la negazione di "se Jerry riceve una borsa di studio, allora va al college" è "Jerry riceve la borsa di studio e non va al college".</w:t>
+      </w:r>
+    </w:p>
+    <w:p>
+      <w:r>
+        <w:rPr>
+          <w:b/>
+        </w:rPr>
+        <w:t>La doppia negazione.</w:t>
+      </w:r>
+      <w:r>
+        <w:rPr/>
+        <w:t xml:space="preserve"> Serve una legge banale ma importante: negare due volte equivale ad affermare, ¬¬p ≡ p. Basta guardare la tavola: se p è vera, ¬p è falsa e ¬¬p torna vera; se p è falsa, ¬p è vera e ¬¬p torna falsa. Nel linguaggio naturale non è così: dire che qualcosa "non è proprio falso" intende di solito qualcosa di più debole di "è vero". Nel linguaggio semplificato della logica, dove si guardano solo i valori di verità, non c'è alcuna differenza.</w:t>
+      </w:r>
+    </w:p>
+    <w:p>
+      <w:r>
+        <w:rPr>
+          <w:b/>
+        </w:rPr>
+        <w:t>L'implicazione con negazione e disgiunzione.</w:t>
+      </w:r>
+      <w:r>
+        <w:rPr/>
+        <w:t xml:space="preserve"> Si parte dalla legge precedente e si aggiunge una doppia negazione:</w:t>
+      </w:r>
+    </w:p>
+    <w:p>
+      <w:r>
+        <w:rPr/>
+        <w:t>p → q ≡ ¬¬(p → q) ≡ ¬(p ∧ ¬q).</w:t>
+      </w:r>
+    </w:p>
+    <w:p>
+      <w:r>
+        <w:rPr/>
+        <w:t xml:space="preserve">Sono già tre connettivi (due negazioni e una congiunzione) che ci permettono di scrivere l'implicazione. Con la legge di </w:t>
+      </w:r>
+      <w:r>
+        <w:rPr>
+          <w:b/>
+        </w:rPr>
+        <w:t>De Morgan</w:t>
+      </w:r>
+      <w:r>
+        <w:rPr/>
+        <w:t>, di cui nel capitolo 15 si è visto il caso della disgiunzione e di cui subito sotto si giustifica la versione duale per la congiunzione, si può ridurre. La legge dice che negare una congiunzione equivale a disgiungere le negazioni degli argomenti: ¬(a ∧ b) ≡ ¬a ∨ ¬b. Applicata a ¬(p ∧ ¬q) dà ¬p ∨ ¬¬q, e per la doppia negazione si arriva a</w:t>
+      </w:r>
+    </w:p>
+    <w:p>
+      <w:r>
+        <w:rPr>
+          <w:b/>
+        </w:rPr>
+        <w:t>p → q ≡ ¬p ∨ q.</w:t>
+      </w:r>
+    </w:p>
+    <w:p>
+      <w:pPr>
+        <w:keepNext/>
+        <w:jc w:val="center"/>
+      </w:pPr>
+      <w:r>
+        <w:drawing>
+          <wp:inline xmlns:a="http://schemas.openxmlformats.org/drawingml/2006/main" xmlns:pic="http://schemas.openxmlformats.org/drawingml/2006/picture">
+            <wp:extent cx="3780000" cy="1882500"/>
+            <wp:docPr id="2073952350" name="Picture 2073952350"/>
+            <wp:cNvGraphicFramePr>
+              <a:graphicFrameLocks noChangeAspect="1"/>
+            </wp:cNvGraphicFramePr>
+            <a:graphic>
+              <a:graphicData uri="http://schemas.openxmlformats.org/drawingml/2006/picture">
+                <pic:pic>
+                  <pic:nvPicPr>
+                    <pic:cNvPr id="0" name="logica_implicazione_disgiunzione.png"/>
+                    <pic:cNvPicPr/>
+                  </pic:nvPicPr>
+                  <pic:blipFill>
+                    <a:blip r:embed="rId27"/>
+                    <a:stretch>
+                      <a:fillRect/>
+                    </a:stretch>
+                  </pic:blipFill>
+                  <pic:spPr>
+                    <a:xfrm>
+                      <a:off x="0" y="0"/>
+                      <a:ext cx="3780000" cy="1882500"/>
+                    </a:xfrm>
+                    <a:prstGeom prst="rect"/>
+                  </pic:spPr>
+                </pic:pic>
+              </a:graphicData>
+            </a:graphic>
+          </wp:inline>
+        </w:drawing>
+      </w:r>
+    </w:p>
+    <w:p>
+      <w:pPr>
+        <w:jc w:val="center"/>
+      </w:pPr>
+      <w:r>
+        <w:rPr>
+          <w:i/>
+          <w:sz w:val="18"/>
+        </w:rPr>
+        <w:t>Le colonne di p → q e di ¬p ∨ q coincidono.</w:t>
+      </w:r>
+    </w:p>
+    <w:p>
+      <w:r>
+        <w:rPr/>
+        <w:t xml:space="preserve">È la definizione più usata dell'implicazione, e dice che un'implicazione è vera se e solo se l'ipotesi è falsa </w:t>
+      </w:r>
+      <w:r>
+        <w:rPr>
+          <w:b/>
+        </w:rPr>
+        <w:t>oppure</w:t>
+      </w:r>
+      <w:r>
+        <w:rPr/>
+        <w:t xml:space="preserve"> la tesi è vera: sono esattamente i tre casi veri della tavola, quelli con la tesi vera (due righe) e quelli con l'ipotesi falsa (due righe), con una sovrapposizione, perché con ipotesi falsa e tesi vera l'implicazione è vera per due motivi indipendenti. Si poteva arrivarci in un passo solo osservando la tavola; il passaggio per De Morgan mostra che le leggi si combinano.</w:t>
+      </w:r>
+    </w:p>
+    <w:p>
+      <w:r>
+        <w:rPr/>
+        <w:t xml:space="preserve">Per questo, in un linguaggio come Java, l'implicazione non serve come operatore: p → q si scrive come </w:t>
+      </w:r>
+      <w:r>
+        <w:rPr>
+          <w:rFonts w:ascii="Consolas" w:hAnsi="Consolas" w:cs="Consolas"/>
+        </w:rPr>
+        <w:t>!p || q</w:t>
+      </w:r>
+      <w:r>
+        <w:rPr/>
+        <w:t>.</w:t>
+      </w:r>
+    </w:p>
+    <w:p>
+      <w:pPr>
+        <w:pStyle w:val="Titolo2"/>
+      </w:pPr>
+      <w:r>
+        <w:rPr>
+          <w:b/>
+          <w:color w:val="E97132"/>
+        </w:rPr>
+        <w:t>Le leggi di De Morgan e la dualità</w:t>
+      </w:r>
+    </w:p>
+    <w:p>
+      <w:r>
+        <w:rPr/>
+        <w:t>Le leggi di De Morgan sono due:</w:t>
+      </w:r>
+    </w:p>
+    <w:p>
+      <w:pPr>
+        <w:numPr>
+          <w:ilvl w:val="0"/>
+          <w:numId w:val="1"/>
+        </w:numPr>
+      </w:pPr>
+      <w:r>
+        <w:rPr/>
+        <w:t>¬(p ∧ q) ≡ ¬p ∨ ¬q: negando una congiunzione si disgiungono le negazioni;</w:t>
+      </w:r>
+    </w:p>
+    <w:p>
+      <w:pPr>
+        <w:numPr>
+          <w:ilvl w:val="0"/>
+          <w:numId w:val="1"/>
+        </w:numPr>
+      </w:pPr>
+      <w:r>
+        <w:rPr/>
+        <w:t>¬(p ∨ q) ≡ ¬p ∧ ¬q: negando una disgiunzione si congiungono le negazioni (già vista nel capitolo 15).</w:t>
+      </w:r>
+    </w:p>
+    <w:p>
+      <w:r>
+        <w:rPr/>
+        <w:t xml:space="preserve">Sono </w:t>
+      </w:r>
+      <w:r>
+        <w:rPr>
+          <w:b/>
+        </w:rPr>
+        <w:t>duali</w:t>
+      </w:r>
+      <w:r>
+        <w:rPr/>
+        <w:t xml:space="preserve">: se si scambiano vero e falso, congiunzione e disgiunzione e si lascia la negazione com'è (la negazione è auto-duale: scambiando vero e falso, la sua tavola resta la stessa), da una legge si ottiene l'altra. La logica proposizionale è duale in generale: non c'è un ruolo privilegiato per il vero o per il falso, e se si scambia ovunque vero con falso e congiunzione con disgiunzione, ogni equivalenza valida si trasforma nella sua duale, che è ancora un'equivalenza valida. Si può quindi dire che c'è </w:t>
+      </w:r>
+      <w:r>
+        <w:rPr>
+          <w:b/>
+        </w:rPr>
+        <w:t>un'unica legge di De Morgan</w:t>
+      </w:r>
+      <w:r>
+        <w:rPr/>
+        <w:t>, e l'altra è la sua duale.</w:t>
+      </w:r>
+    </w:p>
+    <w:p>
+      <w:r>
+        <w:rPr/>
+        <w:t xml:space="preserve">Un'applicazione in Java: la condizione </w:t>
+      </w:r>
+      <w:r>
+        <w:rPr>
+          <w:rFonts w:ascii="Consolas" w:hAnsi="Consolas" w:cs="Consolas"/>
+        </w:rPr>
+        <w:t>x &lt; 10 || x &gt; 20</w:t>
+      </w:r>
+      <w:r>
+        <w:rPr/>
+        <w:t xml:space="preserve"> equivale a </w:t>
+      </w:r>
+      <w:r>
+        <w:rPr>
+          <w:rFonts w:ascii="Consolas" w:hAnsi="Consolas" w:cs="Consolas"/>
+        </w:rPr>
+        <w:t>!(x &gt;= 10 &amp;&amp; x &lt;= 20)</w:t>
+      </w:r>
+      <w:r>
+        <w:rPr/>
+        <w:t xml:space="preserve">. Questa seconda scrittura nega l'appartenenza all'intervallo tra 10 e 20 estremi compresi; applicando De Morgan si porta la negazione dentro le parentesi, scambiando la congiunzione con la disgiunzione, e arrivando ai predicati di base (uguale, diverso, minore, maggiore, minore o uguale, maggiore o uguale) si sostituisce ciascuno con il suo complementare: la negazione di </w:t>
+      </w:r>
+      <w:r>
+        <w:rPr>
+          <w:rFonts w:ascii="Consolas" w:hAnsi="Consolas" w:cs="Consolas"/>
+        </w:rPr>
+        <w:t>x &gt;= 10</w:t>
+      </w:r>
+      <w:r>
+        <w:rPr/>
+        <w:t xml:space="preserve"> è </w:t>
+      </w:r>
+      <w:r>
+        <w:rPr>
+          <w:rFonts w:ascii="Consolas" w:hAnsi="Consolas" w:cs="Consolas"/>
+        </w:rPr>
+        <w:t>x &lt; 10</w:t>
+      </w:r>
+      <w:r>
+        <w:rPr/>
+        <w:t xml:space="preserve"> e quella di </w:t>
+      </w:r>
+      <w:r>
+        <w:rPr>
+          <w:rFonts w:ascii="Consolas" w:hAnsi="Consolas" w:cs="Consolas"/>
+        </w:rPr>
+        <w:t>x &lt;= 20</w:t>
+      </w:r>
+      <w:r>
+        <w:rPr/>
+        <w:t xml:space="preserve"> è </w:t>
+      </w:r>
+      <w:r>
+        <w:rPr>
+          <w:rFonts w:ascii="Consolas" w:hAnsi="Consolas" w:cs="Consolas"/>
+        </w:rPr>
+        <w:t>x &gt; 20</w:t>
+      </w:r>
+      <w:r>
+        <w:rPr/>
+        <w:t>. La prima forma si legge più facilmente: per questo si preferisce.</w:t>
+      </w:r>
+    </w:p>
+    <w:p>
+      <w:pPr>
+        <w:pStyle w:val="Titolo2"/>
+      </w:pPr>
+      <w:r>
+        <w:rPr>
+          <w:b/>
+          <w:color w:val="E97132"/>
+        </w:rPr>
+        <w:t>Il limite delle tavole di verità</w:t>
+      </w:r>
+    </w:p>
+    <w:p>
+      <w:r>
+        <w:rPr/>
+        <w:t>Le tavole di verità sono un buon metodo per provare un'equivalenza o una tautologia quando le proposizioni atomiche sono poche (come per p ↔ q e le due implicazioni), ma non funzionano su grande scala: con n proposizioni atomiche le righe sono 2</w:t>
+      </w:r>
+      <w:r>
+        <w:rPr>
+          <w:vertAlign w:val="superscript"/>
+        </w:rPr>
+        <w:t>n</w:t>
+      </w:r>
+      <w:r>
+        <w:rPr/>
+        <w:t>, quindi il numero di passi cresce in modo esponenziale. Con cento proposizioni atomiche servirebbe una tavola di 2</w:t>
+      </w:r>
+      <w:r>
+        <w:rPr>
+          <w:vertAlign w:val="superscript"/>
+        </w:rPr>
+        <w:t>100</w:t>
+      </w:r>
+      <w:r>
+        <w:rPr/>
+        <w:t xml:space="preserve"> righe, circa 10</w:t>
+      </w:r>
+      <w:r>
+        <w:rPr>
+          <w:vertAlign w:val="superscript"/>
+        </w:rPr>
+        <w:t>30</w:t>
+      </w:r>
+      <w:r>
+        <w:rPr/>
+        <w:t>, un numero che nessun computer di oggi riesce a percorrere. In questi casi servono metodi più rapidi, che però hanno altri difetti: non riescono a concludere in tutti i casi.</w:t>
+      </w:r>
+    </w:p>
     <w:sectPr>
       <w:pgSz w:w="11906" w:h="16838"/>
       <w:pgMar w:top="1417" w:right="1134" w:bottom="1134" w:left="1134" w:header="708" w:footer="708" w:gutter="0"/>

</xml_diff>

<commit_message>
Mate discreta: integrazione dei cap. 1-20 con il libro (31 paragrafi nuovi, evidenziazioni intatte)
Co-Authored-By: Claude Sonnet 5.5 <noreply@anthropic.com>
</commit_message>
<xml_diff>
--- a/Riassunto Fondamenti Informatica.docx
+++ b/Riassunto Fondamenti Informatica.docx
@@ -11082,18 +11082,41 @@
     </w:p>
     <w:p>
       <w:r>
-        <w:rPr/>
-        <w:t>Dopo i connettivi and, or, not, xor ed equivalenza, la logica proposizionale continua con l'</w:t>
-      </w:r>
-      <w:r>
-        <w:rPr>
-          <w:b/>
+        <w:t xml:space="preserve">Dopo i connettivi and, or, not, xor ed equivalenza, la </w:t>
+      </w:r>
+      <w:r>
+        <w:rPr>
+          <w:highlight w:val="yellow"/>
+        </w:rPr>
+        <w:t>logica proposizionale continua con</w:t>
+      </w:r>
+      <w:r>
+        <w:t xml:space="preserve"> </w:t>
+      </w:r>
+      <w:r>
+        <w:rPr>
+          <w:highlight w:val="yellow"/>
+        </w:rPr>
+        <w:t>l'</w:t>
+      </w:r>
+      <w:r>
+        <w:rPr>
+          <w:b/>
+          <w:highlight w:val="yellow"/>
         </w:rPr>
         <w:t>implicazione</w:t>
       </w:r>
       <w:r>
-        <w:rPr/>
-        <w:t>, che nel libro è la sezione 1.3 della seconda parte. È anche il connettivo più delicato, perché il significato che gli si dà in logica proposizionale è diverso, e più povero, di quello che ha nel linguaggio comune.</w:t>
+        <w:t xml:space="preserve">, che nel libro è la sezione 1.3 della seconda parte. </w:t>
+      </w:r>
+      <w:r>
+        <w:rPr>
+          <w:highlight w:val="yellow"/>
+        </w:rPr>
+        <w:t>È anche il connettivo più delicato, perché il significato che gli si dà in logica proposizionale è diverso</w:t>
+      </w:r>
+      <w:r>
+        <w:t>, e più povero, di quello che ha nel linguaggio comune.</w:t>
       </w:r>
     </w:p>
     <w:p>
@@ -11110,54 +11133,101 @@
     </w:p>
     <w:p>
       <w:r>
-        <w:rPr/>
-        <w:t xml:space="preserve">Un esempio dal libro: "se il Dipartimento di Matematica ottiene 60 mila dollari di finanziamento extra, assumerà un nuovo professore". Nel linguaggio comune "se… allora" suggerisce innanzitutto una </w:t>
-      </w:r>
-      <w:r>
-        <w:rPr>
-          <w:b/>
+        <w:t>Un esempio dal libro: "se il Dipartimento di Matematica ottiene 60 mila dollari di finanziamento extra, assumerà un nuovo professore". Nel linguaggio comune "</w:t>
+      </w:r>
+      <w:r>
+        <w:rPr>
+          <w:highlight w:val="yellow"/>
+        </w:rPr>
+        <w:t xml:space="preserve">se… allora" suggerisce innanzitutto una </w:t>
+      </w:r>
+      <w:r>
+        <w:rPr>
+          <w:b/>
+          <w:highlight w:val="yellow"/>
         </w:rPr>
         <w:t>relazione di causa</w:t>
       </w:r>
       <w:r>
-        <w:rPr/>
-        <w:t xml:space="preserve">: quel denaro verrà usato proprio per assumere qualcuno. In logica proposizionale di questa relazione non c'è alcuna traccia. Si lavora soltanto con i </w:t>
-      </w:r>
-      <w:r>
-        <w:rPr>
-          <w:b/>
+        <w:t xml:space="preserve">: quel denaro verrà usato proprio per assumere qualcuno. In logica proposizionale di questa relazione non c'è alcuna traccia. </w:t>
+      </w:r>
+      <w:r>
+        <w:rPr>
+          <w:highlight w:val="yellow"/>
+        </w:rPr>
+        <w:t xml:space="preserve">Si lavora soltanto con i </w:t>
+      </w:r>
+      <w:r>
+        <w:rPr>
+          <w:b/>
+          <w:highlight w:val="yellow"/>
         </w:rPr>
         <w:t>valori di verità</w:t>
       </w:r>
       <w:r>
-        <w:rPr/>
-        <w:t xml:space="preserve"> (vero e falso), e le tavole di verità sono troppo povere per esprimere un concetto complesso come la causalità. Per questo si dice che l'implicazione della logica è </w:t>
-      </w:r>
-      <w:r>
-        <w:rPr>
-          <w:b/>
+        <w:rPr>
+          <w:highlight w:val="yellow"/>
+        </w:rPr>
+        <w:t xml:space="preserve"> (vero e falso)</w:t>
+      </w:r>
+      <w:r>
+        <w:t xml:space="preserve">, e le </w:t>
+      </w:r>
+      <w:r>
+        <w:rPr>
+          <w:highlight w:val="yellow"/>
+        </w:rPr>
+        <w:t>tavole di verità sono troppo povere per esprimere un concetto complesso come la causalità</w:t>
+      </w:r>
+      <w:r>
+        <w:t xml:space="preserve">. Per questo si dice che </w:t>
+      </w:r>
+      <w:r>
+        <w:rPr>
+          <w:highlight w:val="yellow"/>
+        </w:rPr>
+        <w:t xml:space="preserve">l'implicazione della logica è </w:t>
+      </w:r>
+      <w:r>
+        <w:rPr>
+          <w:b/>
+          <w:highlight w:val="yellow"/>
         </w:rPr>
         <w:t>materiale</w:t>
       </w:r>
       <w:r>
-        <w:rPr/>
         <w:t>: usa soltanto i valori di verità dei due argomenti e non le relazioni tra le due parti.</w:t>
       </w:r>
     </w:p>
     <w:p>
       <w:r>
-        <w:rPr/>
-        <w:t xml:space="preserve">La seconda differenza riguarda i casi in cui l'ipotesi non si verifica. Nel linguaggio comune, se il Dipartimento non ottiene il finanziamento, l'affermazione resta di fatto </w:t>
-      </w:r>
-      <w:r>
-        <w:rPr>
-          <w:b/>
+        <w:lastRenderedPageBreak/>
+        <w:t xml:space="preserve">La seconda differenza riguarda i casi in cui l'ipotesi non si verifica. Nel linguaggio comune, se il Dipartimento non ottiene il finanziamento, </w:t>
+      </w:r>
+      <w:r>
+        <w:rPr>
+          <w:highlight w:val="yellow"/>
+        </w:rPr>
+        <w:t xml:space="preserve">l'affermazione resta di fatto </w:t>
+      </w:r>
+      <w:r>
+        <w:rPr>
+          <w:b/>
+          <w:highlight w:val="yellow"/>
         </w:rPr>
         <w:t>indefinita</w:t>
       </w:r>
       <w:r>
-        <w:rPr/>
-        <w:t>: non è né vera né falsa. In matematica avere affermazioni prive di valore di verità è molto svantaggioso, perché si potrebbe scrivere una dimostrazione senza accorgersi che è priva di senso. Per questo si decide di dare un significato a tutte le implicazioni, anche quando l'ipotesi è falsa.</w:t>
+        <w:t xml:space="preserve">: non è né vera né falsa. In matematica avere affermazioni prive di valore di verità è molto svantaggioso, perché si potrebbe scrivere una dimostrazione senza accorgersi che è priva di senso. Per questo si decide di </w:t>
+      </w:r>
+      <w:r>
+        <w:rPr>
+          <w:highlight w:val="yellow"/>
+        </w:rPr>
+        <w:t>dare un significato a tutte le implicazioni, anche quando l'ipotesi è falsa</w:t>
+      </w:r>
+      <w:r>
+        <w:t>.</w:t>
       </w:r>
     </w:p>
     <w:p>
@@ -11174,57 +11244,89 @@
     </w:p>
     <w:p>
       <w:r>
-        <w:rPr/>
-        <w:t xml:space="preserve">L'implicazione si scrive con una freccia: p → q si legge "p implica q". La proposizione p si chiama </w:t>
-      </w:r>
-      <w:r>
-        <w:rPr>
-          <w:b/>
+        <w:rPr>
+          <w:highlight w:val="yellow"/>
+        </w:rPr>
+        <w:t>L'implicazione si scrive con una freccia: p → q si legge "p implica q"</w:t>
+      </w:r>
+      <w:r>
+        <w:t xml:space="preserve">. La proposizione </w:t>
+      </w:r>
+      <w:r>
+        <w:rPr>
+          <w:highlight w:val="yellow"/>
+        </w:rPr>
+        <w:t>p</w:t>
+      </w:r>
+      <w:r>
+        <w:t xml:space="preserve"> si chiama </w:t>
+      </w:r>
+      <w:r>
+        <w:rPr>
+          <w:b/>
+          <w:highlight w:val="yellow"/>
         </w:rPr>
         <w:t>ipotesi</w:t>
       </w:r>
       <w:r>
-        <w:rPr/>
+        <w:rPr>
+          <w:highlight w:val="yellow"/>
+        </w:rPr>
         <w:t xml:space="preserve"> o </w:t>
       </w:r>
       <w:r>
         <w:rPr>
           <w:b/>
+          <w:highlight w:val="yellow"/>
         </w:rPr>
         <w:t>antecedente</w:t>
       </w:r>
       <w:r>
-        <w:rPr/>
-        <w:t xml:space="preserve">, la proposizione q si chiama </w:t>
-      </w:r>
-      <w:r>
-        <w:rPr>
-          <w:b/>
+        <w:t xml:space="preserve">, la proposizione </w:t>
+      </w:r>
+      <w:r>
+        <w:rPr>
+          <w:highlight w:val="yellow"/>
+        </w:rPr>
+        <w:t>q</w:t>
+      </w:r>
+      <w:r>
+        <w:t xml:space="preserve"> si chiama </w:t>
+      </w:r>
+      <w:r>
+        <w:rPr>
+          <w:b/>
+          <w:highlight w:val="yellow"/>
         </w:rPr>
         <w:t>tesi</w:t>
       </w:r>
       <w:r>
-        <w:rPr/>
+        <w:rPr>
+          <w:highlight w:val="yellow"/>
+        </w:rPr>
         <w:t xml:space="preserve">, </w:t>
       </w:r>
       <w:r>
         <w:rPr>
           <w:b/>
+          <w:highlight w:val="yellow"/>
         </w:rPr>
         <w:t>conclusione</w:t>
       </w:r>
       <w:r>
-        <w:rPr/>
+        <w:rPr>
+          <w:highlight w:val="yellow"/>
+        </w:rPr>
         <w:t xml:space="preserve"> o </w:t>
       </w:r>
       <w:r>
         <w:rPr>
           <w:b/>
+          <w:highlight w:val="yellow"/>
         </w:rPr>
         <w:t>conseguente</w:t>
       </w:r>
       <w:r>
-        <w:rPr/>
         <w:t>. La tavola di verità, con l'ordine del libro (prima il vero, 1, poi il falso, 0), è:</w:t>
       </w:r>
     </w:p>
@@ -11234,18 +11336,1226 @@
         <w:jc w:val="center"/>
       </w:pPr>
       <w:r>
+        <w:rPr>
+          <w:noProof/>
+        </w:rPr>
         <w:drawing>
-          <wp:inline xmlns:a="http://schemas.openxmlformats.org/drawingml/2006/main" xmlns:pic="http://schemas.openxmlformats.org/drawingml/2006/picture">
+          <wp:inline distT="0" distB="0" distL="0" distR="0" wp14:anchorId="2FBE723A" wp14:editId="3830F49C">
             <wp:extent cx="2880000" cy="2065371"/>
+            <wp:effectExtent l="0" t="0" r="0" b="0"/>
             <wp:docPr id="2073952347" name="Picture 2073952347"/>
             <wp:cNvGraphicFramePr>
-              <a:graphicFrameLocks noChangeAspect="1"/>
+              <a:graphicFrameLocks xmlns:a="http://schemas.openxmlformats.org/drawingml/2006/main" noChangeAspect="1"/>
             </wp:cNvGraphicFramePr>
-            <a:graphic>
+            <a:graphic xmlns:a="http://schemas.openxmlformats.org/drawingml/2006/main">
               <a:graphicData uri="http://schemas.openxmlformats.org/drawingml/2006/picture">
-                <pic:pic>
+                <pic:pic xmlns:pic="http://schemas.openxmlformats.org/drawingml/2006/picture">
                   <pic:nvPicPr>
                     <pic:cNvPr id="0" name="logica_implicazione.png"/>
+                    <pic:cNvPicPr/>
+                  </pic:nvPicPr>
+                  <pic:blipFill>
+                    <a:blip r:embed="rId22"/>
+                    <a:stretch>
+                      <a:fillRect/>
+                    </a:stretch>
+                  </pic:blipFill>
+                  <pic:spPr>
+                    <a:xfrm>
+                      <a:off x="0" y="0"/>
+                      <a:ext cx="2880000" cy="2065371"/>
+                    </a:xfrm>
+                    <a:prstGeom prst="rect">
+                      <a:avLst/>
+                    </a:prstGeom>
+                  </pic:spPr>
+                </pic:pic>
+              </a:graphicData>
+            </a:graphic>
+          </wp:inline>
+        </w:drawing>
+      </w:r>
+    </w:p>
+    <w:p>
+      <w:pPr>
+        <w:jc w:val="center"/>
+      </w:pPr>
+      <w:r>
+        <w:rPr>
+          <w:i/>
+          <w:sz w:val="18"/>
+        </w:rPr>
+        <w:t>La tavola di verità dell'implicazione: l'unica riga falsa è quella con ipotesi vera e tesi falsa.</w:t>
+      </w:r>
+    </w:p>
+    <w:p>
+      <w:r>
+        <w:rPr>
+          <w:highlight w:val="yellow"/>
+        </w:rPr>
+        <w:t xml:space="preserve">L'implicazione è </w:t>
+      </w:r>
+      <w:r>
+        <w:rPr>
+          <w:b/>
+          <w:highlight w:val="yellow"/>
+        </w:rPr>
+        <w:t>falsa in un solo caso</w:t>
+      </w:r>
+      <w:r>
+        <w:rPr>
+          <w:highlight w:val="yellow"/>
+        </w:rPr>
+        <w:t>: quando l'ipotesi è vera e la tesi è falsa</w:t>
+      </w:r>
+      <w:r>
+        <w:t>. Contano le due righe con ipotesi vera: si prende l'ipotesi vera e si controlla che sia vera anche la tesi. Se lo è, l'implicazione è vera; se non lo è, è falsa. Nelle altre due righe, quelle con ipotesi falsa, l'implicazione è vera senza nemmeno guardare la tesi.</w:t>
+      </w:r>
+    </w:p>
+    <w:p>
+      <w:pPr>
+        <w:pStyle w:val="Titolo2"/>
+      </w:pPr>
+      <w:r>
+        <w:rPr>
+          <w:b/>
+          <w:color w:val="E97132"/>
+        </w:rPr>
+        <w:t>Vero per difetto</w:t>
+      </w:r>
+    </w:p>
+    <w:p>
+      <w:r>
+        <w:rPr>
+          <w:highlight w:val="yellow"/>
+        </w:rPr>
+        <w:t xml:space="preserve">Quando l'ipotesi è falsa l'implicazione è </w:t>
+      </w:r>
+      <w:r>
+        <w:rPr>
+          <w:b/>
+          <w:highlight w:val="yellow"/>
+        </w:rPr>
+        <w:t>vera</w:t>
+      </w:r>
+      <w:r>
+        <w:t xml:space="preserve">, </w:t>
+      </w:r>
+      <w:r>
+        <w:rPr>
+          <w:highlight w:val="yellow"/>
+        </w:rPr>
+        <w:t>qualunque sia la tesi</w:t>
+      </w:r>
+      <w:r>
+        <w:t xml:space="preserve">. Si dice che è </w:t>
+      </w:r>
+      <w:r>
+        <w:rPr>
+          <w:b/>
+          <w:highlight w:val="yellow"/>
+        </w:rPr>
+        <w:t>vera per difetto</w:t>
+      </w:r>
+      <w:r>
+        <w:t xml:space="preserve"> (in inglese *vacuously true*; si può dire anche "banalmente vera"). </w:t>
+      </w:r>
+      <w:r>
+        <w:rPr>
+          <w:highlight w:val="yellow"/>
+        </w:rPr>
+        <w:t xml:space="preserve">È una </w:t>
+      </w:r>
+      <w:r>
+        <w:rPr>
+          <w:b/>
+          <w:highlight w:val="yellow"/>
+        </w:rPr>
+        <w:t>convenzione</w:t>
+      </w:r>
+      <w:r>
+        <w:t>: bisognava dare un valore di verità a questi casi, e quello che per esperienza dà meno fastidio quando si scrivono le dimostrazioni è considerare l'implicazione come provata. Quando non ci sono le condizioni per usare l'implicazione, la si prende per buona e ci si concentra sui casi in cui l'ipotesi è vera.</w:t>
+      </w:r>
+    </w:p>
+    <w:p>
+      <w:r>
+        <w:t>Il motivo per cui la convenzione è comoda si vede con un esempio di matematica: "se x è positivo, allora x · x è positivo", cioè x &gt; 0 → x · x &gt; 0, che si vuole vera per ogni x.</w:t>
+      </w:r>
+    </w:p>
+    <w:p>
+      <w:pPr>
+        <w:numPr>
+          <w:ilvl w:val="0"/>
+          <w:numId w:val="1"/>
+        </w:numPr>
+      </w:pPr>
+      <w:r>
+        <w:t>Con x = 3: 3 &gt; 0 è vera e 9 &gt; 0 è vera, quindi l'implicazione è vera.</w:t>
+      </w:r>
+    </w:p>
+    <w:p>
+      <w:pPr>
+        <w:numPr>
+          <w:ilvl w:val="0"/>
+          <w:numId w:val="1"/>
+        </w:numPr>
+      </w:pPr>
+      <w:r>
+        <w:t>Con x = 1: 1 &gt; 0 e 1 &gt; 0 sono vere, e l'implicazione è vera.</w:t>
+      </w:r>
+    </w:p>
+    <w:p>
+      <w:pPr>
+        <w:numPr>
+          <w:ilvl w:val="0"/>
+          <w:numId w:val="1"/>
+        </w:numPr>
+      </w:pPr>
+      <w:r>
+        <w:t>Con x = 0: 0 &gt; 0 è falsa e 0 · 0 &gt; 0 è falsa. L'ipotesi è falsa, quindi l'implicazione è vera per difetto.</w:t>
+      </w:r>
+    </w:p>
+    <w:p>
+      <w:pPr>
+        <w:numPr>
+          <w:ilvl w:val="0"/>
+          <w:numId w:val="1"/>
+        </w:numPr>
+      </w:pPr>
+      <w:r>
+        <w:t>Con x = −1: −1 &gt; 0 è falsa, ma (−1) · (−1) = 1 &gt; 0 è vera. Anche qui l'ipotesi è falsa e l'implicazione è vera, senza che interessi che la tesi lo sia.</w:t>
+      </w:r>
+    </w:p>
+    <w:p>
+      <w:r>
+        <w:t xml:space="preserve">Nel linguaggio comune qualcuno direbbe che "se 0 &gt; 0…" non ha senso. Ma in matematica, se sostituendo un valore al posto di x l'enunciato perdesse significato, un enunciato sensato </w:t>
+      </w:r>
+      <w:r>
+        <w:lastRenderedPageBreak/>
+        <w:t>diventerebbe privo di senso. Con la tavola di verità dell'implicazione l'enunciato ha invece sempre un valore: è vero per ogni x.</w:t>
+      </w:r>
+    </w:p>
+    <w:p>
+      <w:r>
+        <w:t>La tavola si può leggere anche così:</w:t>
+      </w:r>
+    </w:p>
+    <w:p>
+      <w:pPr>
+        <w:numPr>
+          <w:ilvl w:val="0"/>
+          <w:numId w:val="1"/>
+        </w:numPr>
+      </w:pPr>
+      <w:r>
+        <w:t>se la tesi è vera, l'implicazione è vera, e si può ignorare l'ipotesi;</w:t>
+      </w:r>
+    </w:p>
+    <w:p>
+      <w:pPr>
+        <w:numPr>
+          <w:ilvl w:val="0"/>
+          <w:numId w:val="1"/>
+        </w:numPr>
+      </w:pPr>
+      <w:r>
+        <w:t>se l'ipotesi è falsa, l'implicazione è vera, e si può ignorare la tesi;</w:t>
+      </w:r>
+    </w:p>
+    <w:p>
+      <w:pPr>
+        <w:numPr>
+          <w:ilvl w:val="0"/>
+          <w:numId w:val="1"/>
+        </w:numPr>
+      </w:pPr>
+      <w:r>
+        <w:t>l'unico caso in cui i due valori sono entrambi rilevanti è quello con ipotesi vera e tesi falsa, in cui l'implicazione è falsa.</w:t>
+      </w:r>
+    </w:p>
+    <w:p>
+      <w:r>
+        <w:t>Come sottolineato a lezione, nel corso di Fondamenti (e in quelli di Matematica e di Programmazione) si usa sempre questa implicazione materiale: bisogna dimenticare il significato di "se… allora" del linguaggio comune.</w:t>
+      </w:r>
+    </w:p>
+    <w:p>
+      <w:pPr>
+        <w:pStyle w:val="Titolo2"/>
+      </w:pPr>
+      <w:r>
+        <w:rPr>
+          <w:b/>
+          <w:color w:val="E97132"/>
+        </w:rPr>
+        <w:t>L'implicazione come test d'ordine</w:t>
+      </w:r>
+    </w:p>
+    <w:p>
+      <w:r>
+        <w:t xml:space="preserve">C'è un altro modo di descrivere la tavola. Scrivendo 0 al posto di falso e 1 al posto di vero, p → q vale 1 esattamente quando il valore di p è </w:t>
+      </w:r>
+      <w:r>
+        <w:rPr>
+          <w:b/>
+        </w:rPr>
+        <w:t>minore o uguale</w:t>
+      </w:r>
+      <w:r>
+        <w:t xml:space="preserve"> al valore di q: 1 ≤ 1, 0 ≤ 1 e 0 ≤ 0 danno 1, mentre l'unico caso in cui p ≤ q è falso è p = 1 e q = 0, che è proprio la riga falsa. </w:t>
+      </w:r>
+      <w:r>
+        <w:rPr>
+          <w:highlight w:val="yellow"/>
+        </w:rPr>
+        <w:t xml:space="preserve">L'implicazione si può quindi definire come il </w:t>
+      </w:r>
+      <w:r>
+        <w:rPr>
+          <w:b/>
+          <w:highlight w:val="yellow"/>
+        </w:rPr>
+        <w:t>test d'ordine tra valori booleani</w:t>
+      </w:r>
+      <w:r>
+        <w:t>.</w:t>
+      </w:r>
+    </w:p>
+    <w:p>
+      <w:r>
+        <w:t xml:space="preserve">Una conseguenza: </w:t>
+      </w:r>
+      <w:r>
+        <w:rPr>
+          <w:highlight w:val="yellow"/>
+        </w:rPr>
+        <w:t xml:space="preserve">la proposizione (p → q) ∨ (q → p) è </w:t>
+      </w:r>
+      <w:r>
+        <w:rPr>
+          <w:b/>
+          <w:highlight w:val="yellow"/>
+        </w:rPr>
+        <w:t>sempre vera</w:t>
+      </w:r>
+      <w:r>
+        <w:t>, qualunque siano i valori di p e di q. Nel linguaggio comune verrebbe da dire che è falsa, perché ci aspetteremmo che p sia causa di q oppure il contrario, mentre due eventi possono essere del tutto indipendenti. Ma tra due numeri uno dei due è sempre minore o uguale all'altro, e lo stesso vale per due valori di verità: se c'è almeno uno 0, il più piccolo è lo 0; se sono entrambi 1, sono uguali. Quindi una delle due implicazioni è vera, e la loro disgiunzione è sempre vera.</w:t>
+      </w:r>
+    </w:p>
+    <w:p>
+      <w:pPr>
+        <w:pStyle w:val="Titolo2"/>
+      </w:pPr>
+      <w:r>
+        <w:rPr>
+          <w:b/>
+          <w:color w:val="E97132"/>
+        </w:rPr>
+        <w:t>La precedenza</w:t>
+      </w:r>
+    </w:p>
+    <w:p>
+      <w:r>
+        <w:t xml:space="preserve">Come in 2 + 3 · 5 la moltiplicazione si esegue prima della somma, così tra i connettivi c'è una convenzione: </w:t>
+      </w:r>
+      <w:r>
+        <w:rPr>
+          <w:highlight w:val="yellow"/>
+        </w:rPr>
+        <w:t xml:space="preserve">l'implicazione si valuta </w:t>
+      </w:r>
+      <w:r>
+        <w:rPr>
+          <w:b/>
+          <w:highlight w:val="yellow"/>
+        </w:rPr>
+        <w:t>per ultima</w:t>
+      </w:r>
+      <w:r>
+        <w:t>. Con una negazione, un or e un'implicazione senza parentesi si calcolano prima la negazione e l'or, e poi l'implicazione: p ∨ q → ¬r significa (p ∨ q) → (¬r). Chi non vuole ricordare le convenzioni può aggiungere parentesi in più, e questo non è mai sbagliato, anche se dopo un po' diventa fastidioso.</w:t>
+      </w:r>
+    </w:p>
+    <w:p>
+      <w:pPr>
+        <w:pStyle w:val="Titolo2"/>
+      </w:pPr>
+      <w:r>
+        <w:rPr>
+          <w:b/>
+          <w:color w:val="E97132"/>
+        </w:rPr>
+        <w:t>Alcuni esempi di valutazione</w:t>
+      </w:r>
+    </w:p>
+    <w:p>
+      <w:r>
+        <w:t>Siano p vera, q falsa e r vera (p = 1, q = 0, r = 1). Valutiamo quattro formule.</w:t>
+      </w:r>
+    </w:p>
+    <w:p>
+      <w:pPr>
+        <w:numPr>
+          <w:ilvl w:val="0"/>
+          <w:numId w:val="1"/>
+        </w:numPr>
+      </w:pPr>
+      <w:r>
+        <w:rPr>
+          <w:b/>
+        </w:rPr>
+        <w:t>(p ∧ q) → r</w:t>
+      </w:r>
+      <w:r>
+        <w:t>. La congiunzione p ∧ q è falsa, perché uno dei due lati (q) è falso. L'ipotesi è quindi falsa e l'implicazione è vera, senza guardare r. In generale, se una parte di una congiunzione è falsa, l'intera congiunzione è falsa, e un'implicazione che ha quella congiunzione come ipotesi è vera.</w:t>
+      </w:r>
+    </w:p>
+    <w:p>
+      <w:pPr>
+        <w:numPr>
+          <w:ilvl w:val="0"/>
+          <w:numId w:val="1"/>
+        </w:numPr>
+      </w:pPr>
+      <w:r>
+        <w:rPr>
+          <w:b/>
+        </w:rPr>
+        <w:t>(p ∨ q) → ¬r</w:t>
+      </w:r>
+      <w:r>
+        <w:t xml:space="preserve">. La disgiunzione p ∨ q è vera (basta che un lato sia vero), mentre ¬r è falsa. Si ha 1 → 0, e l'implicazione è </w:t>
+      </w:r>
+      <w:r>
+        <w:rPr>
+          <w:b/>
+        </w:rPr>
+        <w:t>falsa</w:t>
+      </w:r>
+      <w:r>
+        <w:t>.</w:t>
+      </w:r>
+    </w:p>
+    <w:p>
+      <w:pPr>
+        <w:numPr>
+          <w:ilvl w:val="0"/>
+          <w:numId w:val="1"/>
+        </w:numPr>
+      </w:pPr>
+      <w:r>
+        <w:rPr>
+          <w:b/>
+        </w:rPr>
+        <w:t>p ∧ (q → r)</w:t>
+      </w:r>
+      <w:r>
+        <w:t>. L'implicazione q → r ha ipotesi falsa, quindi è vera per difetto; anche p è vera. La congiunzione è quindi vera.</w:t>
+      </w:r>
+    </w:p>
+    <w:p>
+      <w:pPr>
+        <w:numPr>
+          <w:ilvl w:val="0"/>
+          <w:numId w:val="1"/>
+        </w:numPr>
+      </w:pPr>
+      <w:r>
+        <w:rPr>
+          <w:b/>
+        </w:rPr>
+        <w:t>p → (q → r)</w:t>
+      </w:r>
+      <w:r>
+        <w:t>. L'implicazione interna q → r è vera per difetto, quindi si ha 1 → 1, e l'intera formula è vera.</w:t>
+      </w:r>
+    </w:p>
+    <w:p>
+      <w:r>
+        <w:lastRenderedPageBreak/>
+        <w:t xml:space="preserve">L'ultima formula si legge in modo naturale come "se vale p, allora (se vale q, allora vale r)", cioè come un'implicazione con </w:t>
+      </w:r>
+      <w:r>
+        <w:rPr>
+          <w:b/>
+        </w:rPr>
+        <w:t>due ipotesi</w:t>
+      </w:r>
+      <w:r>
+        <w:t>: se p e q sono entrambe vere, allora è vera r. In generale, quando un'implicazione ha più ipotesi e anche una sola è falsa, l'implicazione è vera per difetto; se tutte le ipotesi sono vere bisogna controllare la tesi, e l'implicazione è falsa solo se la tesi è falsa. Le due scritture sono in effetti equivalenti: p → (q → r) e (p ∧ q) → r sono false soltanto quando p e q sono vere e r è falsa.</w:t>
+      </w:r>
+    </w:p>
+    <w:p>
+      <w:r>
+        <w:t>Il capitolo successivo parte dall'implicazione per costruire la sua conversa, la sua contrapposta e le espressioni "condizione necessaria" e "condizione sufficiente".</w:t>
+      </w:r>
+    </w:p>
+    <w:p>
+      <w:pPr>
+        <w:pStyle w:val="Titolo1"/>
+        <w:rPr>
+          <w:b/>
+          <w:color w:val="EE0000"/>
+        </w:rPr>
+      </w:pPr>
+    </w:p>
+    <w:p>
+      <w:pPr>
+        <w:pStyle w:val="Titolo1"/>
+      </w:pPr>
+      <w:r>
+        <w:rPr>
+          <w:b/>
+          <w:color w:val="EE0000"/>
+        </w:rPr>
+        <w:t>17. Conversa, Contrapposta, Condizioni Necessarie e Sufficienti</w:t>
+      </w:r>
+    </w:p>
+    <w:p>
+      <w:pPr>
+        <w:pStyle w:val="Titolo2"/>
+      </w:pPr>
+      <w:r>
+        <w:rPr>
+          <w:b/>
+          <w:color w:val="E97132"/>
+        </w:rPr>
+        <w:t>Le forme correlate a un'implicazione</w:t>
+      </w:r>
+    </w:p>
+    <w:p>
+      <w:r>
+        <w:rPr>
+          <w:highlight w:val="yellow"/>
+        </w:rPr>
+        <w:t>Da un'implicazione se ne possono costruire altre, scambiando i due argomenti o anche negandoli</w:t>
+      </w:r>
+      <w:r>
+        <w:t>. Data p → q, si definiscono due proposizioni correlate:</w:t>
+      </w:r>
+    </w:p>
+    <w:p>
+      <w:pPr>
+        <w:numPr>
+          <w:ilvl w:val="0"/>
+          <w:numId w:val="1"/>
+        </w:numPr>
+      </w:pPr>
+      <w:r>
+        <w:t xml:space="preserve">la </w:t>
+      </w:r>
+      <w:r>
+        <w:rPr>
+          <w:b/>
+          <w:highlight w:val="yellow"/>
+        </w:rPr>
+        <w:t>conversa</w:t>
+      </w:r>
+      <w:r>
+        <w:t xml:space="preserve"> (o </w:t>
+      </w:r>
+      <w:r>
+        <w:rPr>
+          <w:b/>
+        </w:rPr>
+        <w:t>reciproco</w:t>
+      </w:r>
+      <w:r>
+        <w:t xml:space="preserve">, in inglese *converse*): q → p, </w:t>
+      </w:r>
+      <w:r>
+        <w:rPr>
+          <w:highlight w:val="yellow"/>
+        </w:rPr>
+        <w:t>che scambia i ruoli di ipotesi e tesi</w:t>
+      </w:r>
+      <w:r>
+        <w:t>;</w:t>
+      </w:r>
+    </w:p>
+    <w:p>
+      <w:pPr>
+        <w:numPr>
+          <w:ilvl w:val="0"/>
+          <w:numId w:val="1"/>
+        </w:numPr>
+      </w:pPr>
+      <w:r>
+        <w:t xml:space="preserve">la </w:t>
+      </w:r>
+      <w:r>
+        <w:rPr>
+          <w:b/>
+          <w:highlight w:val="yellow"/>
+        </w:rPr>
+        <w:t>contrapposta</w:t>
+      </w:r>
+      <w:r>
+        <w:t xml:space="preserve"> (in inglese *contrapositive*): ¬q → ¬p, </w:t>
+      </w:r>
+      <w:r>
+        <w:rPr>
+          <w:highlight w:val="yellow"/>
+        </w:rPr>
+        <w:t xml:space="preserve">che scambia i ruoli </w:t>
+      </w:r>
+      <w:r>
+        <w:rPr>
+          <w:b/>
+          <w:highlight w:val="yellow"/>
+        </w:rPr>
+        <w:t>e</w:t>
+      </w:r>
+      <w:r>
+        <w:rPr>
+          <w:highlight w:val="yellow"/>
+        </w:rPr>
+        <w:t xml:space="preserve"> nega entrambi gli argomenti</w:t>
+      </w:r>
+      <w:r>
+        <w:t>.</w:t>
+      </w:r>
+    </w:p>
+    <w:p>
+      <w:pPr>
+        <w:pStyle w:val="Titolo2"/>
+      </w:pPr>
+      <w:r>
+        <w:rPr>
+          <w:b/>
+          <w:color w:val="E97132"/>
+        </w:rPr>
+        <w:t>La conversa non è equivalente</w:t>
+      </w:r>
+    </w:p>
+    <w:p>
+      <w:r>
+        <w:rPr>
+          <w:highlight w:val="yellow"/>
+        </w:rPr>
+        <w:t xml:space="preserve">Un'implicazione e la sua conversa </w:t>
+      </w:r>
+      <w:r>
+        <w:rPr>
+          <w:b/>
+          <w:highlight w:val="yellow"/>
+        </w:rPr>
+        <w:t>non sono equivalenti</w:t>
+      </w:r>
+      <w:r>
+        <w:t xml:space="preserve">. Un esempio: sia p la proposizione "1 &gt; 2", che è falsa, e q la proposizione "4 &lt; 8", che è vera. L'implicazione p → q ha l'ipotesi falsa, quindi è vera per difetto. La conversa q → p ha l'ipotesi vera e la tesi falsa, quindi è </w:t>
+      </w:r>
+      <w:r>
+        <w:rPr>
+          <w:b/>
+        </w:rPr>
+        <w:t>falsa</w:t>
+      </w:r>
+      <w:r>
+        <w:t>. Esistono dunque valori di p e q per cui p → q e q → p hanno valori di verità diversi: succede quando p e q sono diversi.</w:t>
+      </w:r>
+    </w:p>
+    <w:p>
+      <w:r>
+        <w:rPr>
+          <w:highlight w:val="yellow"/>
+        </w:rPr>
+        <w:t>Se si cambia la direzione di un'implicazione, il valore di verità cambia in due casi su quattro; quando p e q sono entrambe vere, o entrambe false, resta lo stesso (vera per entrambe)</w:t>
+      </w:r>
+      <w:r>
+        <w:t>. Un altro esempio: "se Jerry vince la lotteria, allora va al college" può essere vera, mentre la conversa "se Jerry va al college, allora ha vinto la lotteria" è falsa, perché potrebbe andarci con i suoi risparmi. L'errore più frequente è appunto scambiare un'implicazione con la sua conversa.</w:t>
+      </w:r>
+    </w:p>
+    <w:p>
+      <w:pPr>
+        <w:pStyle w:val="Titolo2"/>
+      </w:pPr>
+      <w:r>
+        <w:rPr>
+          <w:b/>
+          <w:color w:val="E97132"/>
+        </w:rPr>
+        <w:t>La contrapposta è equivalente</w:t>
+      </w:r>
+    </w:p>
+    <w:p>
+      <w:r>
+        <w:rPr>
+          <w:highlight w:val="yellow"/>
+        </w:rPr>
+        <w:t>Con la contrapposta le cose vanno diversamente: p → q e ¬q → ¬p hanno la stessa tavola di verità</w:t>
+      </w:r>
+      <w:r>
+        <w:t>.</w:t>
+      </w:r>
+    </w:p>
+    <w:p>
+      <w:pPr>
+        <w:keepNext/>
+        <w:jc w:val="center"/>
+      </w:pPr>
+      <w:r>
+        <w:rPr>
+          <w:noProof/>
+        </w:rPr>
+        <w:drawing>
+          <wp:inline distT="0" distB="0" distL="0" distR="0" wp14:anchorId="4924E0D5" wp14:editId="26D23541">
+            <wp:extent cx="4140000" cy="1692410"/>
+            <wp:effectExtent l="0" t="0" r="0" b="0"/>
+            <wp:docPr id="2073952348" name="Picture 2073952348"/>
+            <wp:cNvGraphicFramePr>
+              <a:graphicFrameLocks xmlns:a="http://schemas.openxmlformats.org/drawingml/2006/main" noChangeAspect="1"/>
+            </wp:cNvGraphicFramePr>
+            <a:graphic xmlns:a="http://schemas.openxmlformats.org/drawingml/2006/main">
+              <a:graphicData uri="http://schemas.openxmlformats.org/drawingml/2006/picture">
+                <pic:pic xmlns:pic="http://schemas.openxmlformats.org/drawingml/2006/picture">
+                  <pic:nvPicPr>
+                    <pic:cNvPr id="0" name="logica_contrapposta.png"/>
+                    <pic:cNvPicPr/>
+                  </pic:nvPicPr>
+                  <pic:blipFill>
+                    <a:blip r:embed="rId23"/>
+                    <a:stretch>
+                      <a:fillRect/>
+                    </a:stretch>
+                  </pic:blipFill>
+                  <pic:spPr>
+                    <a:xfrm>
+                      <a:off x="0" y="0"/>
+                      <a:ext cx="4140000" cy="1692410"/>
+                    </a:xfrm>
+                    <a:prstGeom prst="rect">
+                      <a:avLst/>
+                    </a:prstGeom>
+                  </pic:spPr>
+                </pic:pic>
+              </a:graphicData>
+            </a:graphic>
+          </wp:inline>
+        </w:drawing>
+      </w:r>
+    </w:p>
+    <w:p>
+      <w:pPr>
+        <w:jc w:val="center"/>
+      </w:pPr>
+      <w:r>
+        <w:rPr>
+          <w:i/>
+          <w:sz w:val="18"/>
+        </w:rPr>
+        <w:t>Le tavole di verità di p → q e della sua contrapposta ¬q → ¬p: le colonne coincidono.</w:t>
+      </w:r>
+    </w:p>
+    <w:p>
+      <w:r>
+        <w:t xml:space="preserve">Anche con un ragionamento: p → q dice che tutte le volte che p è vera lo è anche q; allora se q è falsa dovrà essere falsa anche p. Quindi da p → q segue ¬q → ¬p. Applicando la stessa legge un'altra volta a ¬q → ¬p si ottiene ¬¬p → ¬¬q, e per la legge della doppia negazione (negare due volte equivale ad </w:t>
+      </w:r>
+      <w:r>
+        <w:lastRenderedPageBreak/>
+        <w:t>affermare: ¬¬p ≡ p, come si vede subito dalla tavola) si ritorna a p → q. Ciascuna delle due implicazioni si ottiene dall'altra, e sono quindi equivalenti.</w:t>
+      </w:r>
+    </w:p>
+    <w:p>
+      <w:pPr>
+        <w:pStyle w:val="Titolo2"/>
+      </w:pPr>
+      <w:r>
+        <w:rPr>
+          <w:b/>
+          <w:color w:val="E97132"/>
+        </w:rPr>
+        <w:t>Condizioni necessarie e condizioni sufficienti</w:t>
+      </w:r>
+    </w:p>
+    <w:p>
+      <w:r>
+        <w:rPr>
+          <w:highlight w:val="yellow"/>
+        </w:rPr>
+        <w:t>Nei corsi di matematica le implicazioni si esprimono spesso con le parole "condizione necessaria" e "condizione sufficiente".</w:t>
+      </w:r>
+      <w:r>
+        <w:t xml:space="preserve"> Non c'è un concetto nuovo: sono solo abbreviazioni per le due direzioni di un'implicazione, e vanno conosciute.</w:t>
+      </w:r>
+    </w:p>
+    <w:p>
+      <w:pPr>
+        <w:numPr>
+          <w:ilvl w:val="0"/>
+          <w:numId w:val="1"/>
+        </w:numPr>
+      </w:pPr>
+      <w:r>
+        <w:rPr>
+          <w:b/>
+        </w:rPr>
+        <w:t>A è una condizione necessaria per B</w:t>
+      </w:r>
+      <w:r>
+        <w:t xml:space="preserve"> significa che, q</w:t>
+      </w:r>
+      <w:r>
+        <w:rPr>
+          <w:highlight w:val="yellow"/>
+        </w:rPr>
+        <w:t>uando B è vera, è necessario che lo sia anche A</w:t>
+      </w:r>
+      <w:r>
+        <w:t>: B → A. Il "necessario" è la parte implicata.</w:t>
+      </w:r>
+    </w:p>
+    <w:p>
+      <w:pPr>
+        <w:numPr>
+          <w:ilvl w:val="0"/>
+          <w:numId w:val="1"/>
+        </w:numPr>
+      </w:pPr>
+      <w:r>
+        <w:rPr>
+          <w:b/>
+        </w:rPr>
+        <w:t>A è una condizione sufficiente per B</w:t>
+      </w:r>
+      <w:r>
+        <w:t xml:space="preserve"> significa A → B: </w:t>
+      </w:r>
+      <w:r>
+        <w:rPr>
+          <w:highlight w:val="yellow"/>
+        </w:rPr>
+        <w:t>se A è vera, basta questo perché lo sia B. Il "sufficiente" è l'ipotesi</w:t>
+      </w:r>
+      <w:r>
+        <w:t>.</w:t>
+      </w:r>
+    </w:p>
+    <w:p>
+      <w:r>
+        <w:t>La condizione necessaria è la direzione "difficile", quella da destra a sinistra rispetto al modo in cui di solito scriviamo; la condizione sufficiente è quella che ci viene più naturale, da sinistra a destra: è semplicemente l'implicazione scritta nell'ordine consueto, mentre il necessario è il reciproco.</w:t>
+      </w:r>
+    </w:p>
+    <w:p>
+      <w:r>
+        <w:t>Che cosa si può dedurre? Basta rileggere la tavola di verità con questa terminologia.</w:t>
+      </w:r>
+    </w:p>
+    <w:p>
+      <w:r>
+        <w:t xml:space="preserve">Se </w:t>
+      </w:r>
+      <w:r>
+        <w:rPr>
+          <w:b/>
+        </w:rPr>
+        <w:t>A è necessaria per B</w:t>
+      </w:r>
+      <w:r>
+        <w:t xml:space="preserve"> (B → A):</w:t>
+      </w:r>
+    </w:p>
+    <w:p>
+      <w:pPr>
+        <w:numPr>
+          <w:ilvl w:val="0"/>
+          <w:numId w:val="1"/>
+        </w:numPr>
+      </w:pPr>
+      <w:r>
+        <w:t>se A è vera, su B non si sa nulla (la condizione non è stata smentita, ma da sola non basta);</w:t>
+      </w:r>
+    </w:p>
+    <w:p>
+      <w:pPr>
+        <w:numPr>
+          <w:ilvl w:val="0"/>
+          <w:numId w:val="1"/>
+        </w:numPr>
+      </w:pPr>
+      <w:r>
+        <w:t>se A è falsa, allora anche B è falsa: se una condizione necessaria fallisce, fallisce ciò di cui è condizione;</w:t>
+      </w:r>
+    </w:p>
+    <w:p>
+      <w:pPr>
+        <w:numPr>
+          <w:ilvl w:val="0"/>
+          <w:numId w:val="1"/>
+        </w:numPr>
+      </w:pPr>
+      <w:r>
+        <w:t>se B è vera, allora A è vera: la verità di un fatto implica la verità di tutte le sue condizioni necessarie;</w:t>
+      </w:r>
+    </w:p>
+    <w:p>
+      <w:pPr>
+        <w:numPr>
+          <w:ilvl w:val="0"/>
+          <w:numId w:val="1"/>
+        </w:numPr>
+      </w:pPr>
+      <w:r>
+        <w:t>se B è falsa, su A non si sa nulla: può essere falsa proprio per questa condizione o per un'altra.</w:t>
+      </w:r>
+    </w:p>
+    <w:p>
+      <w:r>
+        <w:t xml:space="preserve">Se </w:t>
+      </w:r>
+      <w:r>
+        <w:rPr>
+          <w:b/>
+        </w:rPr>
+        <w:t>A è sufficiente per B</w:t>
+      </w:r>
+      <w:r>
+        <w:t xml:space="preserve"> (A → B):</w:t>
+      </w:r>
+    </w:p>
+    <w:p>
+      <w:pPr>
+        <w:numPr>
+          <w:ilvl w:val="0"/>
+          <w:numId w:val="1"/>
+        </w:numPr>
+      </w:pPr>
+      <w:r>
+        <w:t>se A è vera, allora B è vera;</w:t>
+      </w:r>
+    </w:p>
+    <w:p>
+      <w:pPr>
+        <w:numPr>
+          <w:ilvl w:val="0"/>
+          <w:numId w:val="1"/>
+        </w:numPr>
+      </w:pPr>
+      <w:r>
+        <w:t>se A è falsa, su B non si sa nulla;</w:t>
+      </w:r>
+    </w:p>
+    <w:p>
+      <w:pPr>
+        <w:numPr>
+          <w:ilvl w:val="0"/>
+          <w:numId w:val="1"/>
+        </w:numPr>
+      </w:pPr>
+      <w:r>
+        <w:t>se B è vera, su A non si sa nulla, perché quando la tesi è vera l'implicazione è vera comunque;</w:t>
+      </w:r>
+    </w:p>
+    <w:p>
+      <w:pPr>
+        <w:numPr>
+          <w:ilvl w:val="0"/>
+          <w:numId w:val="1"/>
+        </w:numPr>
+      </w:pPr>
+      <w:r>
+        <w:t>se B è falsa, allora anche A è falsa: se fosse vera, anche B dovrebbe esserlo.</w:t>
+      </w:r>
+    </w:p>
+    <w:p>
+      <w:r>
+        <w:t xml:space="preserve">Un esempio che non richiede conoscenze particolari: "se Maria va alla Tour Eiffel, allora visita la Francia". Andare alla Tour Eiffel è una condizione </w:t>
+      </w:r>
+      <w:r>
+        <w:rPr>
+          <w:b/>
+        </w:rPr>
+        <w:t>sufficiente</w:t>
+      </w:r>
+      <w:r>
+        <w:t xml:space="preserve"> per visitare la Francia, ma non è necessaria: Maria potrebbe andare a Les Invalides, al Louvre o in Normandia, e ognuna di queste scelte sarebbe sufficiente a visitare la Francia. Invece visitare la Francia è una condizione </w:t>
+      </w:r>
+      <w:r>
+        <w:rPr>
+          <w:b/>
+        </w:rPr>
+        <w:t>necessaria</w:t>
+      </w:r>
+      <w:r>
+        <w:t xml:space="preserve"> per vedere la Tour Eiffel (se non è in Francia, non può raggiungerla), ma non basta: dipende da dove va esattamente in Francia.</w:t>
+      </w:r>
+    </w:p>
+    <w:p>
+      <w:pPr>
+        <w:pStyle w:val="Titolo2"/>
+      </w:pPr>
+      <w:r>
+        <w:rPr>
+          <w:b/>
+          <w:color w:val="E97132"/>
+        </w:rPr>
+        <w:t>Come si traduce dal linguaggio naturale</w:t>
+      </w:r>
+    </w:p>
+    <w:p>
+      <w:r>
+        <w:rPr>
+          <w:highlight w:val="yellow"/>
+        </w:rPr>
+        <w:t>Nei quesiti d'esame l'implicazione p → q non compare sempre nella forma "se p, allora q". Le formulazioni seguenti equivalgono tutte a p → q</w:t>
+      </w:r>
+      <w:r>
+        <w:t>:</w:t>
+      </w:r>
+    </w:p>
+    <w:p>
+      <w:pPr>
+        <w:numPr>
+          <w:ilvl w:val="0"/>
+          <w:numId w:val="1"/>
+        </w:numPr>
+      </w:pPr>
+      <w:r>
+        <w:t>"se p, allora q" e "p implica q";</w:t>
+      </w:r>
+    </w:p>
+    <w:p>
+      <w:pPr>
+        <w:numPr>
+          <w:ilvl w:val="0"/>
+          <w:numId w:val="1"/>
+        </w:numPr>
+      </w:pPr>
+      <w:r>
+        <w:t>"q se p" (p, dopo il "se", è l'ipotesi);</w:t>
+      </w:r>
+    </w:p>
+    <w:p>
+      <w:pPr>
+        <w:numPr>
+          <w:ilvl w:val="0"/>
+          <w:numId w:val="1"/>
+        </w:numPr>
+      </w:pPr>
+      <w:r>
+        <w:lastRenderedPageBreak/>
+        <w:t>"p solo se q" (attenzione: non q → p; il "solo se" introduce la condizione necessaria, cioè la tesi);</w:t>
+      </w:r>
+    </w:p>
+    <w:p>
+      <w:pPr>
+        <w:numPr>
+          <w:ilvl w:val="0"/>
+          <w:numId w:val="1"/>
+        </w:numPr>
+      </w:pPr>
+      <w:r>
+        <w:t>"p è condizione sufficiente per q";</w:t>
+      </w:r>
+    </w:p>
+    <w:p>
+      <w:pPr>
+        <w:numPr>
+          <w:ilvl w:val="0"/>
+          <w:numId w:val="1"/>
+        </w:numPr>
+      </w:pPr>
+      <w:r>
+        <w:t>"q è condizione necessaria per p".</w:t>
+      </w:r>
+    </w:p>
+    <w:p>
+      <w:r>
+        <w:t>Riassumendo: l'ipotesi è la condizione sufficiente, la tesi è la condizione necessaria; la conversa, quella con i ruoli scambiati, non è equivalente all'implicazione di partenza, mentre la contrapposta lo è.</w:t>
+      </w:r>
+    </w:p>
+    <w:p>
+      <w:pPr>
+        <w:pStyle w:val="Titolo1"/>
+        <w:rPr>
+          <w:b/>
+          <w:color w:val="EE0000"/>
+        </w:rPr>
+      </w:pPr>
+    </w:p>
+    <w:p>
+      <w:pPr>
+        <w:pStyle w:val="Titolo1"/>
+      </w:pPr>
+      <w:r>
+        <w:rPr>
+          <w:b/>
+          <w:color w:val="EE0000"/>
+        </w:rPr>
+        <w:t>18. Il Bicondizionale, l'Equivalenza e le Riscritture dell'Implicazione</w:t>
+      </w:r>
+    </w:p>
+    <w:p>
+      <w:pPr>
+        <w:pStyle w:val="Titolo2"/>
+      </w:pPr>
+      <w:r>
+        <w:rPr>
+          <w:b/>
+          <w:color w:val="E97132"/>
+        </w:rPr>
+        <w:t>L'equivalenza logica</w:t>
+      </w:r>
+    </w:p>
+    <w:p>
+      <w:r>
+        <w:rPr>
+          <w:highlight w:val="yellow"/>
+        </w:rPr>
+        <w:t xml:space="preserve">Due formule sono </w:t>
+      </w:r>
+      <w:r>
+        <w:rPr>
+          <w:b/>
+          <w:highlight w:val="yellow"/>
+        </w:rPr>
+        <w:t>logicamente equivalenti</w:t>
+      </w:r>
+      <w:r>
+        <w:rPr>
+          <w:highlight w:val="yellow"/>
+        </w:rPr>
+        <w:t xml:space="preserve"> quando hanno la stessa tavola di verità</w:t>
+      </w:r>
+      <w:r>
+        <w:t xml:space="preserve"> (capitolo 15); si </w:t>
+      </w:r>
+      <w:r>
+        <w:rPr>
+          <w:highlight w:val="yellow"/>
+        </w:rPr>
+        <w:t>scrive P ≡ Q</w:t>
+      </w:r>
+      <w:r>
+        <w:t xml:space="preserve">. </w:t>
+      </w:r>
+      <w:r>
+        <w:rPr>
+          <w:highlight w:val="yellow"/>
+        </w:rPr>
+        <w:t xml:space="preserve">Il </w:t>
+      </w:r>
+      <w:r>
+        <w:rPr>
+          <w:b/>
+          <w:highlight w:val="yellow"/>
+        </w:rPr>
+        <w:t>bicondizionale</w:t>
+      </w:r>
+      <w:r>
+        <w:rPr>
+          <w:highlight w:val="yellow"/>
+        </w:rPr>
+        <w:t>, già incontrato come "equivalenza" nel capitolo 13, è il connettivo che dà 1 quando due valori sono uguali: p ↔ q</w:t>
+      </w:r>
+      <w:r>
+        <w:t xml:space="preserve"> (si legge "p se e solo se q", in inglese *iff*, o anche "doppia freccia") è vera quando i due valori di verità sono </w:t>
+      </w:r>
+      <w:r>
+        <w:rPr>
+          <w:b/>
+        </w:rPr>
+        <w:t>uguali</w:t>
+      </w:r>
+      <w:r>
+        <w:t xml:space="preserve"> (entrambi veri o entrambi falsi) </w:t>
+      </w:r>
+      <w:r>
+        <w:rPr>
+          <w:highlight w:val="yellow"/>
+        </w:rPr>
+        <w:t>ed è falsa quando sono diversi.</w:t>
+      </w:r>
+      <w:r>
+        <w:t xml:space="preserve"> È dunque il </w:t>
+      </w:r>
+      <w:r>
+        <w:rPr>
+          <w:b/>
+        </w:rPr>
+        <w:t>test di uguaglianza</w:t>
+      </w:r>
+      <w:r>
+        <w:t xml:space="preserve"> tra due valori di verità, ed è legato alla relazione ≡ tra formule: P ≡ Q vale proprio quando P ↔ Q è una tautologia.</w:t>
+      </w:r>
+    </w:p>
+    <w:p>
+      <w:pPr>
+        <w:pStyle w:val="Titolo2"/>
+      </w:pPr>
+      <w:r>
+        <w:rPr>
+          <w:b/>
+          <w:color w:val="E97132"/>
+        </w:rPr>
+        <w:t>Il bicondizionale e le due implicazioni</w:t>
+      </w:r>
+    </w:p>
+    <w:p>
+      <w:r>
+        <w:t xml:space="preserve">Si chiama </w:t>
+      </w:r>
+      <w:r>
+        <w:rPr>
+          <w:highlight w:val="yellow"/>
+        </w:rPr>
+        <w:t>bicondizionale perché è fatto di due condizionali opposti</w:t>
+      </w:r>
+      <w:r>
+        <w:t xml:space="preserve">, </w:t>
+      </w:r>
+      <w:r>
+        <w:rPr>
+          <w:highlight w:val="yellow"/>
+        </w:rPr>
+        <w:t xml:space="preserve">l'implicazione da sinistra a destra e quella da destra a sinistra: </w:t>
+      </w:r>
+      <w:r>
+        <w:rPr>
+          <w:b/>
+          <w:highlight w:val="yellow"/>
+        </w:rPr>
+        <w:t>p ↔ q ≡ (p → q) ∧ (q → p)</w:t>
+      </w:r>
+      <w:r>
+        <w:rPr>
+          <w:highlight w:val="yellow"/>
+        </w:rPr>
+        <w:t>.</w:t>
+      </w:r>
+      <w:r>
+        <w:t xml:space="preserve"> In parole, p è condizione necessaria </w:t>
+      </w:r>
+      <w:r>
+        <w:rPr>
+          <w:b/>
+        </w:rPr>
+        <w:t>e</w:t>
+      </w:r>
+      <w:r>
+        <w:t xml:space="preserve"> sufficiente per q.</w:t>
+      </w:r>
+    </w:p>
+    <w:p>
+      <w:pPr>
+        <w:keepNext/>
+        <w:jc w:val="center"/>
+      </w:pPr>
+      <w:r>
+        <w:rPr>
+          <w:noProof/>
+        </w:rPr>
+        <w:drawing>
+          <wp:inline distT="0" distB="0" distL="0" distR="0" wp14:anchorId="6951CB56" wp14:editId="01F2A273">
+            <wp:extent cx="4500000" cy="1525321"/>
+            <wp:effectExtent l="0" t="0" r="0" b="0"/>
+            <wp:docPr id="2073952349" name="Picture 2073952349"/>
+            <wp:cNvGraphicFramePr>
+              <a:graphicFrameLocks xmlns:a="http://schemas.openxmlformats.org/drawingml/2006/main" noChangeAspect="1"/>
+            </wp:cNvGraphicFramePr>
+            <a:graphic xmlns:a="http://schemas.openxmlformats.org/drawingml/2006/main">
+              <a:graphicData uri="http://schemas.openxmlformats.org/drawingml/2006/picture">
+                <pic:pic xmlns:pic="http://schemas.openxmlformats.org/drawingml/2006/picture">
+                  <pic:nvPicPr>
+                    <pic:cNvPr id="0" name="logica_bicondizionale.png"/>
                     <pic:cNvPicPr/>
                   </pic:nvPicPr>
                   <pic:blipFill>
@@ -11257,9 +12567,11 @@
                   <pic:spPr>
                     <a:xfrm>
                       <a:off x="0" y="0"/>
-                      <a:ext cx="2880000" cy="2065371"/>
+                      <a:ext cx="4500000" cy="1525321"/>
                     </a:xfrm>
-                    <a:prstGeom prst="rect"/>
+                    <a:prstGeom prst="rect">
+                      <a:avLst/>
+                    </a:prstGeom>
                   </pic:spPr>
                 </pic:pic>
               </a:graphicData>
@@ -11277,23 +12589,12 @@
           <w:i/>
           <w:sz w:val="18"/>
         </w:rPr>
-        <w:t>La tavola di verità dell'implicazione: l'unica riga falsa è quella con ipotesi vera e tesi falsa.</w:t>
-      </w:r>
-    </w:p>
-    <w:p>
-      <w:r>
-        <w:rPr/>
-        <w:t xml:space="preserve">L'implicazione è </w:t>
-      </w:r>
-      <w:r>
-        <w:rPr>
-          <w:b/>
-        </w:rPr>
-        <w:t>falsa in un solo caso</w:t>
-      </w:r>
-      <w:r>
-        <w:rPr/>
-        <w:t>: quando l'ipotesi è vera e la tesi è falsa. Contano le due righe con ipotesi vera: si prende l'ipotesi vera e si controlla che sia vera anche la tesi. Se lo è, l'implicazione è vera; se non lo è, è falsa. Nelle altre due righe, quelle con ipotesi falsa, l'implicazione è vera senza nemmeno guardare la tesi.</w:t>
+        <w:t>La tavola di verità del bicondizionale: coincide con quella della congiunzione delle due implicazioni.</w:t>
+      </w:r>
+    </w:p>
+    <w:p>
+      <w:r>
+        <w:t>Lo si può provare con una tavola di verità, come in figura, oppure con un ragionamento. Poiché p → q equivale a "il valore di p è minore o uguale al valore di q", la congiunzione (p → q) ∧ (q → p) dice che p ≤ q e q ≤ p. Per una proprietà degli ordini (l'antisimmetria), se p ≤ q e q ≤ p allora p e q sono uguali: quindi la congiunzione è il test di uguaglianza, cioè il bicondizionale. Quale dei due modi sia la definizione e quale la proprietà dipende da come si è definito il bicondizionale: se lo si definisce con la tavola di verità, si osserva che vale 1 con due valori uguali e 0 con due diversi, e poi si mostra l'equivalenza con le due implicazioni.</w:t>
       </w:r>
     </w:p>
     <w:p>
@@ -11305,511 +12606,89 @@
           <w:b/>
           <w:color w:val="E97132"/>
         </w:rPr>
-        <w:t>Vero per difetto</w:t>
-      </w:r>
-    </w:p>
-    <w:p>
-      <w:r>
-        <w:rPr/>
-        <w:t xml:space="preserve">Quando l'ipotesi è falsa l'implicazione è </w:t>
-      </w:r>
-      <w:r>
-        <w:rPr>
-          <w:b/>
-        </w:rPr>
-        <w:t>vera</w:t>
-      </w:r>
-      <w:r>
-        <w:rPr/>
-        <w:t xml:space="preserve">, qualunque sia la tesi. Si dice che è </w:t>
-      </w:r>
-      <w:r>
-        <w:rPr>
-          <w:b/>
-        </w:rPr>
-        <w:t>vera per difetto</w:t>
-      </w:r>
-      <w:r>
-        <w:rPr/>
-        <w:t xml:space="preserve"> (in inglese *vacuously true*; si può dire anche "banalmente vera"). È una </w:t>
-      </w:r>
-      <w:r>
-        <w:rPr>
-          <w:b/>
-        </w:rPr>
-        <w:t>convenzione</w:t>
-      </w:r>
-      <w:r>
-        <w:rPr/>
-        <w:t>: bisognava dare un valore di verità a questi casi, e quello che per esperienza dà meno fastidio quando si scrivono le dimostrazioni è considerare l'implicazione come provata. Quando non ci sono le condizioni per usare l'implicazione, la si prende per buona e ci si concentra sui casi in cui l'ipotesi è vera.</w:t>
-      </w:r>
-    </w:p>
-    <w:p>
-      <w:r>
-        <w:rPr/>
-        <w:t>Il motivo per cui la convenzione è comoda si vede con un esempio di matematica: "se x è positivo, allora x · x è positivo", cioè x &gt; 0 → x · x &gt; 0, che si vuole vera per ogni x.</w:t>
-      </w:r>
-    </w:p>
-    <w:p>
-      <w:pPr>
-        <w:numPr>
-          <w:ilvl w:val="0"/>
-          <w:numId w:val="1"/>
-        </w:numPr>
-      </w:pPr>
-      <w:r>
-        <w:rPr/>
-        <w:t>Con x = 3: 3 &gt; 0 è vera e 9 &gt; 0 è vera, quindi l'implicazione è vera.</w:t>
-      </w:r>
-    </w:p>
-    <w:p>
-      <w:pPr>
-        <w:numPr>
-          <w:ilvl w:val="0"/>
-          <w:numId w:val="1"/>
-        </w:numPr>
-      </w:pPr>
-      <w:r>
-        <w:rPr/>
-        <w:t>Con x = 1: 1 &gt; 0 e 1 &gt; 0 sono vere, e l'implicazione è vera.</w:t>
-      </w:r>
-    </w:p>
-    <w:p>
-      <w:pPr>
-        <w:numPr>
-          <w:ilvl w:val="0"/>
-          <w:numId w:val="1"/>
-        </w:numPr>
-      </w:pPr>
-      <w:r>
-        <w:rPr/>
-        <w:t>Con x = 0: 0 &gt; 0 è falsa e 0 · 0 &gt; 0 è falsa. L'ipotesi è falsa, quindi l'implicazione è vera per difetto.</w:t>
-      </w:r>
-    </w:p>
-    <w:p>
-      <w:pPr>
-        <w:numPr>
-          <w:ilvl w:val="0"/>
-          <w:numId w:val="1"/>
-        </w:numPr>
-      </w:pPr>
-      <w:r>
-        <w:rPr/>
-        <w:t>Con x = −1: −1 &gt; 0 è falsa, ma (−1) · (−1) = 1 &gt; 0 è vera. Anche qui l'ipotesi è falsa e l'implicazione è vera, senza che interessi che la tesi lo sia.</w:t>
-      </w:r>
-    </w:p>
-    <w:p>
-      <w:r>
-        <w:rPr/>
-        <w:t>Nel linguaggio comune qualcuno direbbe che "se 0 &gt; 0…" non ha senso. Ma in matematica, se sostituendo un valore al posto di x l'enunciato perdesse significato, un enunciato sensato diventerebbe privo di senso. Con la tavola di verità dell'implicazione l'enunciato ha invece sempre un valore: è vero per ogni x.</w:t>
-      </w:r>
-    </w:p>
-    <w:p>
-      <w:r>
-        <w:rPr/>
-        <w:t>La tavola si può leggere anche così:</w:t>
-      </w:r>
-    </w:p>
-    <w:p>
-      <w:pPr>
-        <w:numPr>
-          <w:ilvl w:val="0"/>
-          <w:numId w:val="1"/>
-        </w:numPr>
-      </w:pPr>
-      <w:r>
-        <w:rPr/>
-        <w:t>se la tesi è vera, l'implicazione è vera, e si può ignorare l'ipotesi;</w:t>
-      </w:r>
-    </w:p>
-    <w:p>
-      <w:pPr>
-        <w:numPr>
-          <w:ilvl w:val="0"/>
-          <w:numId w:val="1"/>
-        </w:numPr>
-      </w:pPr>
-      <w:r>
-        <w:rPr/>
-        <w:t>se l'ipotesi è falsa, l'implicazione è vera, e si può ignorare la tesi;</w:t>
-      </w:r>
-    </w:p>
-    <w:p>
-      <w:pPr>
-        <w:numPr>
-          <w:ilvl w:val="0"/>
-          <w:numId w:val="1"/>
-        </w:numPr>
-      </w:pPr>
-      <w:r>
-        <w:rPr/>
-        <w:t>l'unico caso in cui i due valori sono entrambi rilevanti è quello con ipotesi vera e tesi falsa, in cui l'implicazione è falsa.</w:t>
-      </w:r>
-    </w:p>
-    <w:p>
-      <w:r>
-        <w:rPr/>
-        <w:t>Come sottolineato a lezione, nel corso di Fondamenti (e in quelli di Matematica e di Programmazione) si usa sempre questa implicazione materiale: bisogna dimenticare il significato di "se… allora" del linguaggio comune.</w:t>
-      </w:r>
-    </w:p>
-    <w:p>
-      <w:pPr>
-        <w:pStyle w:val="Titolo2"/>
-      </w:pPr>
-      <w:r>
-        <w:rPr>
-          <w:b/>
-          <w:color w:val="E97132"/>
-        </w:rPr>
-        <w:t>L'implicazione come test d'ordine</w:t>
-      </w:r>
-    </w:p>
-    <w:p>
-      <w:r>
-        <w:rPr/>
-        <w:t xml:space="preserve">C'è un altro modo di descrivere la tavola. Scrivendo 0 al posto di falso e 1 al posto di vero, p → q vale 1 esattamente quando il valore di p è </w:t>
-      </w:r>
-      <w:r>
-        <w:rPr>
-          <w:b/>
-        </w:rPr>
-        <w:t>minore o uguale</w:t>
-      </w:r>
-      <w:r>
-        <w:rPr/>
-        <w:t xml:space="preserve"> al valore di q: 1 ≤ 1, 0 ≤ 1 e 0 ≤ 0 danno 1, mentre l'unico caso in cui p ≤ q è falso è p = 1 e q = 0, che è proprio la riga falsa. L'implicazione si può quindi definire come il </w:t>
-      </w:r>
-      <w:r>
-        <w:rPr>
-          <w:b/>
-        </w:rPr>
-        <w:t>test d'ordine tra valori booleani</w:t>
-      </w:r>
-      <w:r>
-        <w:rPr/>
-        <w:t>.</w:t>
-      </w:r>
-    </w:p>
-    <w:p>
-      <w:r>
-        <w:rPr/>
-        <w:t xml:space="preserve">Una conseguenza: la proposizione (p → q) ∨ (q → p) è </w:t>
-      </w:r>
-      <w:r>
-        <w:rPr>
-          <w:b/>
-        </w:rPr>
-        <w:t>sempre vera</w:t>
-      </w:r>
-      <w:r>
-        <w:rPr/>
-        <w:t>, qualunque siano i valori di p e di q. Nel linguaggio comune verrebbe da dire che è falsa, perché ci aspetteremmo che p sia causa di q oppure il contrario, mentre due eventi possono essere del tutto indipendenti. Ma tra due numeri uno dei due è sempre minore o uguale all'altro, e lo stesso vale per due valori di verità: se c'è almeno uno 0, il più piccolo è lo 0; se sono entrambi 1, sono uguali. Quindi una delle due implicazioni è vera, e la loro disgiunzione è sempre vera.</w:t>
-      </w:r>
-    </w:p>
-    <w:p>
-      <w:pPr>
-        <w:pStyle w:val="Titolo2"/>
-      </w:pPr>
-      <w:r>
-        <w:rPr>
-          <w:b/>
-          <w:color w:val="E97132"/>
-        </w:rPr>
-        <w:t>La precedenza</w:t>
-      </w:r>
-    </w:p>
-    <w:p>
-      <w:r>
-        <w:rPr/>
-        <w:t xml:space="preserve">Come in 2 + 3 · 5 la moltiplicazione si esegue prima della somma, così tra i connettivi c'è una convenzione: l'implicazione si valuta </w:t>
-      </w:r>
-      <w:r>
-        <w:rPr>
-          <w:b/>
-        </w:rPr>
-        <w:t>per ultima</w:t>
-      </w:r>
-      <w:r>
-        <w:rPr/>
-        <w:t>. Con una negazione, un or e un'implicazione senza parentesi si calcolano prima la negazione e l'or, e poi l'implicazione: p ∨ q → ¬r significa (p ∨ q) → (¬r). Chi non vuole ricordare le convenzioni può aggiungere parentesi in più, e questo non è mai sbagliato, anche se dopo un po' diventa fastidioso.</w:t>
-      </w:r>
-    </w:p>
-    <w:p>
-      <w:pPr>
-        <w:pStyle w:val="Titolo2"/>
-      </w:pPr>
-      <w:r>
-        <w:rPr>
-          <w:b/>
-          <w:color w:val="E97132"/>
-        </w:rPr>
-        <w:t>Alcuni esempi di valutazione</w:t>
-      </w:r>
-    </w:p>
-    <w:p>
-      <w:r>
-        <w:rPr/>
-        <w:t>Siano p vera, q falsa e r vera (p = 1, q = 0, r = 1). Valutiamo quattro formule.</w:t>
-      </w:r>
-    </w:p>
-    <w:p>
-      <w:pPr>
-        <w:numPr>
-          <w:ilvl w:val="0"/>
-          <w:numId w:val="1"/>
-        </w:numPr>
-      </w:pPr>
-      <w:r>
-        <w:rPr>
-          <w:b/>
-        </w:rPr>
-        <w:t>(p ∧ q) → r</w:t>
-      </w:r>
-      <w:r>
-        <w:rPr/>
-        <w:t>. La congiunzione p ∧ q è falsa, perché uno dei due lati (q) è falso. L'ipotesi è quindi falsa e l'implicazione è vera, senza guardare r. In generale, se una parte di una congiunzione è falsa, l'intera congiunzione è falsa, e un'implicazione che ha quella congiunzione come ipotesi è vera.</w:t>
-      </w:r>
-    </w:p>
-    <w:p>
-      <w:pPr>
-        <w:numPr>
-          <w:ilvl w:val="0"/>
-          <w:numId w:val="1"/>
-        </w:numPr>
-      </w:pPr>
-      <w:r>
-        <w:rPr>
-          <w:b/>
-        </w:rPr>
-        <w:t>(p ∨ q) → ¬r</w:t>
-      </w:r>
-      <w:r>
-        <w:rPr/>
-        <w:t xml:space="preserve">. La disgiunzione p ∨ q è vera (basta che un lato sia vero), mentre ¬r è falsa. Si ha 1 → 0, e l'implicazione è </w:t>
-      </w:r>
-      <w:r>
-        <w:rPr>
-          <w:b/>
-        </w:rPr>
-        <w:t>falsa</w:t>
-      </w:r>
-      <w:r>
-        <w:rPr/>
-        <w:t>.</w:t>
-      </w:r>
-    </w:p>
-    <w:p>
-      <w:pPr>
-        <w:numPr>
-          <w:ilvl w:val="0"/>
-          <w:numId w:val="1"/>
-        </w:numPr>
-      </w:pPr>
-      <w:r>
-        <w:rPr>
-          <w:b/>
-        </w:rPr>
-        <w:t>p ∧ (q → r)</w:t>
-      </w:r>
-      <w:r>
-        <w:rPr/>
-        <w:t>. L'implicazione q → r ha ipotesi falsa, quindi è vera per difetto; anche p è vera. La congiunzione è quindi vera.</w:t>
-      </w:r>
-    </w:p>
-    <w:p>
-      <w:pPr>
-        <w:numPr>
-          <w:ilvl w:val="0"/>
-          <w:numId w:val="1"/>
-        </w:numPr>
-      </w:pPr>
-      <w:r>
-        <w:rPr>
-          <w:b/>
-        </w:rPr>
-        <w:t>p → (q → r)</w:t>
-      </w:r>
-      <w:r>
-        <w:rPr/>
-        <w:t>. L'implicazione interna q → r è vera per difetto, quindi si ha 1 → 1, e l'intera formula è vera.</w:t>
-      </w:r>
-    </w:p>
-    <w:p>
-      <w:r>
-        <w:rPr/>
-        <w:t xml:space="preserve">L'ultima formula si legge in modo naturale come "se vale p, allora (se vale q, allora vale r)", cioè come un'implicazione con </w:t>
-      </w:r>
-      <w:r>
-        <w:rPr>
-          <w:b/>
-        </w:rPr>
-        <w:t>due ipotesi</w:t>
-      </w:r>
-      <w:r>
-        <w:rPr/>
-        <w:t>: se p e q sono entrambe vere, allora è vera r. In generale, quando un'implicazione ha più ipotesi e anche una sola è falsa, l'implicazione è vera per difetto; se tutte le ipotesi sono vere bisogna controllare la tesi, e l'implicazione è falsa solo se la tesi è falsa. Le due scritture sono in effetti equivalenti: p → (q → r) e (p ∧ q) → r sono false soltanto quando p e q sono vere e r è falsa.</w:t>
-      </w:r>
-    </w:p>
-    <w:p>
-      <w:r>
-        <w:rPr/>
-        <w:t>Il capitolo successivo parte dall'implicazione per costruire la sua conversa, la sua contrapposta e le espressioni "condizione necessaria" e "condizione sufficiente".</w:t>
-      </w:r>
-    </w:p>
-    <w:p>
-      <w:pPr>
-        <w:pStyle w:val="Titolo1"/>
-      </w:pPr>
-      <w:r>
-        <w:rPr>
-          <w:b/>
-          <w:color w:val="EE0000"/>
-        </w:rPr>
-        <w:t>17. Conversa, Contrapposta, Condizioni Necessarie e Sufficienti</w:t>
-      </w:r>
-    </w:p>
-    <w:p>
-      <w:pPr>
-        <w:pStyle w:val="Titolo2"/>
-      </w:pPr>
-      <w:r>
-        <w:rPr>
-          <w:b/>
-          <w:color w:val="E97132"/>
-        </w:rPr>
-        <w:t>Le forme correlate a un'implicazione</w:t>
-      </w:r>
-    </w:p>
-    <w:p>
-      <w:r>
-        <w:rPr/>
-        <w:t>Da un'implicazione se ne possono costruire altre, scambiando i due argomenti o anche negandoli. Data p → q, si definiscono due proposizioni correlate:</w:t>
-      </w:r>
-    </w:p>
-    <w:p>
-      <w:pPr>
-        <w:numPr>
-          <w:ilvl w:val="0"/>
-          <w:numId w:val="1"/>
-        </w:numPr>
-      </w:pPr>
-      <w:r>
-        <w:rPr/>
-        <w:t xml:space="preserve">la </w:t>
-      </w:r>
-      <w:r>
-        <w:rPr>
-          <w:b/>
-        </w:rPr>
-        <w:t>conversa</w:t>
-      </w:r>
-      <w:r>
-        <w:rPr/>
-        <w:t xml:space="preserve"> (o </w:t>
-      </w:r>
-      <w:r>
-        <w:rPr>
-          <w:b/>
-        </w:rPr>
-        <w:t>reciproco</w:t>
-      </w:r>
-      <w:r>
-        <w:rPr/>
-        <w:t>, in inglese *converse*): q → p, che scambia i ruoli di ipotesi e tesi;</w:t>
-      </w:r>
-    </w:p>
-    <w:p>
-      <w:pPr>
-        <w:numPr>
-          <w:ilvl w:val="0"/>
-          <w:numId w:val="1"/>
-        </w:numPr>
-      </w:pPr>
-      <w:r>
-        <w:rPr/>
-        <w:t xml:space="preserve">la </w:t>
-      </w:r>
-      <w:r>
-        <w:rPr>
-          <w:b/>
-        </w:rPr>
-        <w:t>contrapposta</w:t>
-      </w:r>
-      <w:r>
-        <w:rPr/>
-        <w:t xml:space="preserve"> (in inglese *contrapositive*): ¬q → ¬p, che scambia i ruoli </w:t>
-      </w:r>
-      <w:r>
-        <w:rPr>
-          <w:b/>
-        </w:rPr>
-        <w:t>e</w:t>
-      </w:r>
-      <w:r>
-        <w:rPr/>
-        <w:t xml:space="preserve"> nega entrambi gli argomenti.</w:t>
-      </w:r>
-    </w:p>
-    <w:p>
-      <w:pPr>
-        <w:pStyle w:val="Titolo2"/>
-      </w:pPr>
-      <w:r>
-        <w:rPr>
-          <w:b/>
-          <w:color w:val="E97132"/>
-        </w:rPr>
-        <w:t>La conversa non è equivalente</w:t>
-      </w:r>
-    </w:p>
-    <w:p>
-      <w:r>
-        <w:rPr/>
-        <w:t xml:space="preserve">Un'implicazione e la sua conversa </w:t>
-      </w:r>
-      <w:r>
-        <w:rPr>
-          <w:b/>
-        </w:rPr>
-        <w:t>non sono equivalenti</w:t>
-      </w:r>
-      <w:r>
-        <w:rPr/>
-        <w:t xml:space="preserve">. Un esempio: sia p la proposizione "1 &gt; 2", che è falsa, e q la proposizione "4 &lt; 8", che è vera. L'implicazione p → q ha l'ipotesi falsa, quindi è vera per difetto. La conversa q → p ha l'ipotesi vera e la tesi falsa, quindi è </w:t>
-      </w:r>
-      <w:r>
-        <w:rPr>
-          <w:b/>
-        </w:rPr>
-        <w:t>falsa</w:t>
-      </w:r>
-      <w:r>
-        <w:rPr/>
-        <w:t>. Esistono dunque valori di p e q per cui p → q e q → p hanno valori di verità diversi: succede quando p e q sono diversi.</w:t>
-      </w:r>
-    </w:p>
-    <w:p>
-      <w:r>
-        <w:rPr/>
-        <w:t>Se si cambia la direzione di un'implicazione, il valore di verità cambia in due casi su quattro; quando p e q sono entrambe vere, o entrambe false, resta lo stesso (vera per entrambe). Un altro esempio: "se Jerry vince la lotteria, allora va al college" può essere vera, mentre la conversa "se Jerry va al college, allora ha vinto la lotteria" è falsa, perché potrebbe andarci con i suoi risparmi. L'errore più frequente è appunto scambiare un'implicazione con la sua conversa.</w:t>
-      </w:r>
-    </w:p>
-    <w:p>
-      <w:pPr>
-        <w:pStyle w:val="Titolo2"/>
-      </w:pPr>
-      <w:r>
-        <w:rPr>
-          <w:b/>
-          <w:color w:val="E97132"/>
-        </w:rPr>
-        <w:t>La contrapposta è equivalente</w:t>
-      </w:r>
-    </w:p>
-    <w:p>
-      <w:r>
-        <w:rPr/>
-        <w:t>Con la contrapposta le cose vanno diversamente: p → q e ¬q → ¬p hanno la stessa tavola di verità.</w:t>
+        <w:t>L'implicazione si può scrivere con altri connettivi</w:t>
+      </w:r>
+    </w:p>
+    <w:p>
+      <w:r>
+        <w:rPr>
+          <w:highlight w:val="yellow"/>
+        </w:rPr>
+        <w:t>Non è necessario avere l'implicazione come connettivo (o come circuito): se si sa realizzare la negazione e la congiunzione, si può realizzare anche l'implicazione</w:t>
+      </w:r>
+      <w:r>
+        <w:t>. Vediamo come.</w:t>
+      </w:r>
+    </w:p>
+    <w:p>
+      <w:r>
+        <w:rPr>
+          <w:b/>
+        </w:rPr>
+        <w:lastRenderedPageBreak/>
+        <w:t>La negazione dell'implicazione.</w:t>
+      </w:r>
+      <w:r>
+        <w:t xml:space="preserve"> L'implicazione è falsa in un solo caso: ipotesi vera e tesi falsa. Quindi ¬(p → q) è vera esattamente quando p è vera e q è falsa:</w:t>
+      </w:r>
+    </w:p>
+    <w:p>
+      <w:r>
+        <w:t>¬(p → q) ≡ p ∧ ¬q.</w:t>
+      </w:r>
+    </w:p>
+    <w:p>
+      <w:r>
+        <w:t>La negazione di un'implicazione non è un'altra implicazione, ma una congiunzione. Attenzione al modo in cui si nega un'implicazione: p → ¬q oppure ¬p → ¬q non sono corrette; la negazione giusta è p ∧ ¬q. Per esempio, la negazione di "se Jerry riceve una borsa di studio, allora va al college" è "Jerry riceve la borsa di studio e non va al college".</w:t>
+      </w:r>
+    </w:p>
+    <w:p>
+      <w:r>
+        <w:rPr>
+          <w:b/>
+        </w:rPr>
+        <w:t>La doppia negazione.</w:t>
+      </w:r>
+      <w:r>
+        <w:t xml:space="preserve"> Serve una legge banale ma importante: negare due volte equivale ad affermare, ¬¬p ≡ p. Basta guardare la tavola: se p è vera, ¬p è falsa e ¬¬p torna vera; se p è falsa, ¬p è vera e ¬¬p torna falsa. Nel linguaggio naturale non è così: dire che qualcosa "non è proprio falso" intende di solito qualcosa di più debole di "è vero". Nel linguaggio semplificato della logica, dove si guardano solo i valori di verità, non c'è alcuna differenza.</w:t>
+      </w:r>
+    </w:p>
+    <w:p>
+      <w:r>
+        <w:rPr>
+          <w:b/>
+        </w:rPr>
+        <w:t>L'implicazione con negazione e disgiunzione.</w:t>
+      </w:r>
+      <w:r>
+        <w:t xml:space="preserve"> Si parte dalla legge precedente e si aggiunge una doppia negazione:</w:t>
+      </w:r>
+    </w:p>
+    <w:p>
+      <w:r>
+        <w:t>p → q ≡ ¬¬(p → q) ≡ ¬(p ∧ ¬q).</w:t>
+      </w:r>
+    </w:p>
+    <w:p>
+      <w:r>
+        <w:t xml:space="preserve">Sono già tre connettivi (due negazioni e una congiunzione) che ci permettono di scrivere l'implicazione. Con la legge di </w:t>
+      </w:r>
+      <w:r>
+        <w:rPr>
+          <w:b/>
+        </w:rPr>
+        <w:t>De Morgan</w:t>
+      </w:r>
+      <w:r>
+        <w:t>, di cui nel capitolo 15 si è visto il caso della disgiunzione e di cui subito sotto si giustifica la versione duale per la congiunzione, si può ridurre. La legge dice che negare una congiunzione equivale a disgiungere le negazioni degli argomenti: ¬(a ∧ b) ≡ ¬a ∨ ¬b. Applicata a ¬(p ∧ ¬q) dà ¬p ∨ ¬¬q, e per la doppia negazione si arriva a</w:t>
+      </w:r>
+    </w:p>
+    <w:p>
+      <w:r>
+        <w:rPr>
+          <w:b/>
+        </w:rPr>
+        <w:t>p → q ≡ ¬p ∨ q.</w:t>
       </w:r>
     </w:p>
     <w:p>
@@ -11818,18 +12697,22 @@
         <w:jc w:val="center"/>
       </w:pPr>
       <w:r>
+        <w:rPr>
+          <w:noProof/>
+        </w:rPr>
         <w:drawing>
-          <wp:inline xmlns:a="http://schemas.openxmlformats.org/drawingml/2006/main" xmlns:pic="http://schemas.openxmlformats.org/drawingml/2006/picture">
-            <wp:extent cx="4140000" cy="1692410"/>
-            <wp:docPr id="2073952348" name="Picture 2073952348"/>
+          <wp:inline distT="0" distB="0" distL="0" distR="0" wp14:anchorId="544EC116" wp14:editId="6C524262">
+            <wp:extent cx="3780000" cy="1882500"/>
+            <wp:effectExtent l="0" t="0" r="0" b="0"/>
+            <wp:docPr id="2073952350" name="Picture 2073952350"/>
             <wp:cNvGraphicFramePr>
-              <a:graphicFrameLocks noChangeAspect="1"/>
+              <a:graphicFrameLocks xmlns:a="http://schemas.openxmlformats.org/drawingml/2006/main" noChangeAspect="1"/>
             </wp:cNvGraphicFramePr>
-            <a:graphic>
+            <a:graphic xmlns:a="http://schemas.openxmlformats.org/drawingml/2006/main">
               <a:graphicData uri="http://schemas.openxmlformats.org/drawingml/2006/picture">
-                <pic:pic>
+                <pic:pic xmlns:pic="http://schemas.openxmlformats.org/drawingml/2006/picture">
                   <pic:nvPicPr>
-                    <pic:cNvPr id="0" name="logica_contrapposta.png"/>
+                    <pic:cNvPr id="0" name="logica_implicazione_disgiunzione.png"/>
                     <pic:cNvPicPr/>
                   </pic:nvPicPr>
                   <pic:blipFill>
@@ -11841,9 +12724,11 @@
                   <pic:spPr>
                     <a:xfrm>
                       <a:off x="0" y="0"/>
-                      <a:ext cx="4140000" cy="1692410"/>
+                      <a:ext cx="3780000" cy="1882500"/>
                     </a:xfrm>
-                    <a:prstGeom prst="rect"/>
+                    <a:prstGeom prst="rect">
+                      <a:avLst/>
+                    </a:prstGeom>
                   </pic:spPr>
                 </pic:pic>
               </a:graphicData>
@@ -11861,31 +12746,93 @@
           <w:i/>
           <w:sz w:val="18"/>
         </w:rPr>
-        <w:t>Le tavole di verità di p → q e della sua contrapposta ¬q → ¬p: le colonne coincidono.</w:t>
-      </w:r>
-    </w:p>
-    <w:p>
-      <w:r>
-        <w:rPr/>
-        <w:t>Anche con un ragionamento: p → q dice che tutte le volte che p è vera lo è anche q; allora se q è falsa dovrà essere falsa anche p. Quindi da p → q segue ¬q → ¬p. Applicando la stessa legge un'altra volta a ¬q → ¬p si ottiene ¬¬p → ¬¬q, e per la legge della doppia negazione (negare due volte equivale ad affermare: ¬¬p ≡ p, come si vede subito dalla tavola) si ritorna a p → q. Ciascuna delle due implicazioni si ottiene dall'altra, e sono quindi equivalenti.</w:t>
+        <w:t>Le colonne di p → q e di ¬p ∨ q coincidono.</w:t>
+      </w:r>
+    </w:p>
+    <w:p>
+      <w:r>
+        <w:rPr>
+          <w:highlight w:val="yellow"/>
+        </w:rPr>
+        <w:t xml:space="preserve">È la definizione più usata dell'implicazione, e dice che un'implicazione è vera se e solo se l'ipotesi è falsa </w:t>
+      </w:r>
+      <w:r>
+        <w:rPr>
+          <w:b/>
+          <w:highlight w:val="yellow"/>
+        </w:rPr>
+        <w:t>oppure</w:t>
+      </w:r>
+      <w:r>
+        <w:rPr>
+          <w:highlight w:val="yellow"/>
+        </w:rPr>
+        <w:t xml:space="preserve"> la tesi è vera</w:t>
+      </w:r>
+      <w:r>
+        <w:t xml:space="preserve">: sono esattamente i tre casi veri della tavola, quelli con la tesi vera (due righe) e quelli con l'ipotesi falsa (due righe), con una sovrapposizione, perché con ipotesi falsa e tesi vera l'implicazione è vera per due motivi indipendenti. Si poteva arrivarci in un passo solo osservando la tavola; il passaggio per </w:t>
+      </w:r>
+      <w:r>
+        <w:t>De Morgan mostra che le leggi si combinano.</w:t>
+      </w:r>
+    </w:p>
+    <w:p>
+      <w:r>
+        <w:t xml:space="preserve">Per questo, </w:t>
+      </w:r>
+      <w:r>
+        <w:rPr>
+          <w:highlight w:val="yellow"/>
+        </w:rPr>
+        <w:t>in un linguaggio come Java</w:t>
+      </w:r>
+      <w:r>
+        <w:t xml:space="preserve">, l'implicazione non serve come operatore: </w:t>
+      </w:r>
+      <w:r>
+        <w:rPr>
+          <w:highlight w:val="yellow"/>
+        </w:rPr>
+        <w:t xml:space="preserve">p → q si scrive come </w:t>
+      </w:r>
+      <w:r>
+        <w:rPr>
+          <w:rFonts w:ascii="Consolas" w:hAnsi="Consolas" w:cs="Consolas"/>
+          <w:highlight w:val="yellow"/>
+        </w:rPr>
+        <w:t>!p || q</w:t>
+      </w:r>
+      <w:r>
+        <w:rPr>
+          <w:highlight w:val="yellow"/>
+        </w:rPr>
+        <w:t>.</w:t>
       </w:r>
     </w:p>
     <w:p>
       <w:pPr>
         <w:pStyle w:val="Titolo2"/>
-      </w:pPr>
-      <w:r>
         <w:rPr>
           <w:b/>
           <w:color w:val="E97132"/>
         </w:rPr>
-        <w:t>Condizioni necessarie e condizioni sufficienti</w:t>
-      </w:r>
-    </w:p>
-    <w:p>
-      <w:r>
-        <w:rPr/>
-        <w:t>Nei corsi di matematica le implicazioni si esprimono spesso con le parole "condizione necessaria" e "condizione sufficiente". Non c'è un concetto nuovo: sono solo abbreviazioni per le due direzioni di un'implicazione, e vanno conosciute.</w:t>
+      </w:pPr>
+    </w:p>
+    <w:p>
+      <w:pPr>
+        <w:pStyle w:val="Titolo2"/>
+      </w:pPr>
+      <w:r>
+        <w:rPr>
+          <w:b/>
+          <w:color w:val="E97132"/>
+        </w:rPr>
+        <w:t>Le leggi di De Morgan e la dualità</w:t>
+      </w:r>
+    </w:p>
+    <w:p>
+      <w:r>
+        <w:t>Le leggi di De Morgan sono due:</w:t>
       </w:r>
     </w:p>
     <w:p>
@@ -11896,14 +12843,16 @@
         </w:numPr>
       </w:pPr>
       <w:r>
-        <w:rPr>
-          <w:b/>
-        </w:rPr>
-        <w:t>A è una condizione necessaria per B</w:t>
-      </w:r>
-      <w:r>
-        <w:rPr/>
-        <w:t xml:space="preserve"> significa che, quando B è vera, è necessario che lo sia anche A: B → A. Il "necessario" è la parte implicata.</w:t>
+        <w:t xml:space="preserve">¬(p ∧ q) ≡ ¬p ∨ ¬q: </w:t>
+      </w:r>
+      <w:r>
+        <w:rPr>
+          <w:highlight w:val="yellow"/>
+        </w:rPr>
+        <w:t>negando una congiunzione si disgiungono le negazioni</w:t>
+      </w:r>
+      <w:r>
+        <w:t>;</w:t>
       </w:r>
     </w:p>
     <w:p>
@@ -11914,180 +12863,127 @@
         </w:numPr>
       </w:pPr>
       <w:r>
-        <w:rPr>
-          <w:b/>
-        </w:rPr>
-        <w:t>A è una condizione sufficiente per B</w:t>
-      </w:r>
-      <w:r>
-        <w:rPr/>
-        <w:t xml:space="preserve"> significa A → B: se A è vera, basta questo perché lo sia B. Il "sufficiente" è l'ipotesi.</w:t>
-      </w:r>
-    </w:p>
-    <w:p>
-      <w:r>
-        <w:rPr/>
-        <w:t>La condizione necessaria è la direzione "difficile", quella da destra a sinistra rispetto al modo in cui di solito scriviamo; la condizione sufficiente è quella che ci viene più naturale, da sinistra a destra: è semplicemente l'implicazione scritta nell'ordine consueto, mentre il necessario è il reciproco.</w:t>
-      </w:r>
-    </w:p>
-    <w:p>
-      <w:r>
-        <w:rPr/>
-        <w:t>Che cosa si può dedurre? Basta rileggere la tavola di verità con questa terminologia.</w:t>
-      </w:r>
-    </w:p>
-    <w:p>
-      <w:r>
-        <w:rPr/>
-        <w:t xml:space="preserve">Se </w:t>
-      </w:r>
-      <w:r>
-        <w:rPr>
-          <w:b/>
-        </w:rPr>
-        <w:t>A è necessaria per B</w:t>
-      </w:r>
-      <w:r>
-        <w:rPr/>
-        <w:t xml:space="preserve"> (B → A):</w:t>
-      </w:r>
-    </w:p>
-    <w:p>
-      <w:pPr>
-        <w:numPr>
-          <w:ilvl w:val="0"/>
-          <w:numId w:val="1"/>
-        </w:numPr>
-      </w:pPr>
-      <w:r>
-        <w:rPr/>
-        <w:t>se A è vera, su B non si sa nulla (la condizione non è stata smentita, ma da sola non basta);</w:t>
-      </w:r>
-    </w:p>
-    <w:p>
-      <w:pPr>
-        <w:numPr>
-          <w:ilvl w:val="0"/>
-          <w:numId w:val="1"/>
-        </w:numPr>
-      </w:pPr>
-      <w:r>
-        <w:rPr/>
-        <w:t>se A è falsa, allora anche B è falsa: se una condizione necessaria fallisce, fallisce ciò di cui è condizione;</w:t>
-      </w:r>
-    </w:p>
-    <w:p>
-      <w:pPr>
-        <w:numPr>
-          <w:ilvl w:val="0"/>
-          <w:numId w:val="1"/>
-        </w:numPr>
-      </w:pPr>
-      <w:r>
-        <w:rPr/>
-        <w:t>se B è vera, allora A è vera: la verità di un fatto implica la verità di tutte le sue condizioni necessarie;</w:t>
-      </w:r>
-    </w:p>
-    <w:p>
-      <w:pPr>
-        <w:numPr>
-          <w:ilvl w:val="0"/>
-          <w:numId w:val="1"/>
-        </w:numPr>
-      </w:pPr>
-      <w:r>
-        <w:rPr/>
-        <w:t>se B è falsa, su A non si sa nulla: può essere falsa proprio per questa condizione o per un'altra.</w:t>
-      </w:r>
-    </w:p>
-    <w:p>
-      <w:r>
-        <w:rPr/>
-        <w:t xml:space="preserve">Se </w:t>
-      </w:r>
-      <w:r>
-        <w:rPr>
-          <w:b/>
-        </w:rPr>
-        <w:t>A è sufficiente per B</w:t>
-      </w:r>
-      <w:r>
-        <w:rPr/>
-        <w:t xml:space="preserve"> (A → B):</w:t>
-      </w:r>
-    </w:p>
-    <w:p>
-      <w:pPr>
-        <w:numPr>
-          <w:ilvl w:val="0"/>
-          <w:numId w:val="1"/>
-        </w:numPr>
-      </w:pPr>
-      <w:r>
-        <w:rPr/>
-        <w:t>se A è vera, allora B è vera;</w:t>
-      </w:r>
-    </w:p>
-    <w:p>
-      <w:pPr>
-        <w:numPr>
-          <w:ilvl w:val="0"/>
-          <w:numId w:val="1"/>
-        </w:numPr>
-      </w:pPr>
-      <w:r>
-        <w:rPr/>
-        <w:t>se A è falsa, su B non si sa nulla;</w:t>
-      </w:r>
-    </w:p>
-    <w:p>
-      <w:pPr>
-        <w:numPr>
-          <w:ilvl w:val="0"/>
-          <w:numId w:val="1"/>
-        </w:numPr>
-      </w:pPr>
-      <w:r>
-        <w:rPr/>
-        <w:t>se B è vera, su A non si sa nulla, perché quando la tesi è vera l'implicazione è vera comunque;</w:t>
-      </w:r>
-    </w:p>
-    <w:p>
-      <w:pPr>
-        <w:numPr>
-          <w:ilvl w:val="0"/>
-          <w:numId w:val="1"/>
-        </w:numPr>
-      </w:pPr>
-      <w:r>
-        <w:rPr/>
-        <w:t>se B è falsa, allora anche A è falsa: se fosse vera, anche B dovrebbe esserlo.</w:t>
-      </w:r>
-    </w:p>
-    <w:p>
-      <w:r>
-        <w:rPr/>
-        <w:t xml:space="preserve">Un esempio che non richiede conoscenze particolari: "se Maria va alla Tour Eiffel, allora visita la Francia". Andare alla Tour Eiffel è una condizione </w:t>
-      </w:r>
-      <w:r>
-        <w:rPr>
-          <w:b/>
-        </w:rPr>
-        <w:t>sufficiente</w:t>
-      </w:r>
-      <w:r>
-        <w:rPr/>
-        <w:t xml:space="preserve"> per visitare la Francia, ma non è necessaria: Maria potrebbe andare a Les Invalides, al Louvre o in Normandia, e ognuna di queste scelte sarebbe sufficiente a visitare la Francia. Invece visitare la Francia è una condizione </w:t>
-      </w:r>
-      <w:r>
-        <w:rPr>
-          <w:b/>
-        </w:rPr>
-        <w:t>necessaria</w:t>
-      </w:r>
-      <w:r>
-        <w:rPr/>
-        <w:t xml:space="preserve"> per vedere la Tour Eiffel (se non è in Francia, non può raggiungerla), ma non basta: dipende da dove va esattamente in Francia.</w:t>
+        <w:t xml:space="preserve">¬(p ∨ q) ≡ ¬p ∧ ¬q: </w:t>
+      </w:r>
+      <w:r>
+        <w:rPr>
+          <w:highlight w:val="yellow"/>
+        </w:rPr>
+        <w:t>negando una disgiunzione si congiungono le negazioni</w:t>
+      </w:r>
+      <w:r>
+        <w:t xml:space="preserve"> (già vista nel capitolo 15).</w:t>
+      </w:r>
+    </w:p>
+    <w:p>
+      <w:r>
+        <w:rPr>
+          <w:highlight w:val="yellow"/>
+        </w:rPr>
+        <w:t xml:space="preserve">Sono </w:t>
+      </w:r>
+      <w:r>
+        <w:rPr>
+          <w:b/>
+          <w:highlight w:val="yellow"/>
+        </w:rPr>
+        <w:t>duali</w:t>
+      </w:r>
+      <w:r>
+        <w:rPr>
+          <w:highlight w:val="yellow"/>
+        </w:rPr>
+        <w:t>: se si scambiano vero e falso, congiunzione e disgiunzione e si lascia la negazione com'è</w:t>
+      </w:r>
+      <w:r>
+        <w:t xml:space="preserve"> (la negazione è auto-duale: scambiando vero e falso, la sua tavola resta la stessa), </w:t>
+      </w:r>
+      <w:r>
+        <w:rPr>
+          <w:highlight w:val="yellow"/>
+        </w:rPr>
+        <w:t>da una legge si ottiene l'altra</w:t>
+      </w:r>
+      <w:r>
+        <w:t xml:space="preserve">. </w:t>
+      </w:r>
+      <w:r>
+        <w:rPr>
+          <w:highlight w:val="yellow"/>
+        </w:rPr>
+        <w:t xml:space="preserve">La logica proposizionale è duale in generale: non c'è un ruolo privilegiato per il vero o per il falso, e se si scambia ovunque vero con falso e congiunzione con disgiunzione, ogni equivalenza valida si trasforma nella sua duale, che è ancora un'equivalenza valida. Si può quindi dire che c'è </w:t>
+      </w:r>
+      <w:r>
+        <w:rPr>
+          <w:b/>
+          <w:highlight w:val="yellow"/>
+        </w:rPr>
+        <w:t>un'unica legge di De Morgan</w:t>
+      </w:r>
+      <w:r>
+        <w:rPr>
+          <w:highlight w:val="yellow"/>
+        </w:rPr>
+        <w:t>, e l'altra è la sua duale.</w:t>
+      </w:r>
+    </w:p>
+    <w:p>
+      <w:r>
+        <w:t xml:space="preserve">Un'applicazione in Java: la condizione </w:t>
+      </w:r>
+      <w:r>
+        <w:rPr>
+          <w:rFonts w:ascii="Consolas" w:hAnsi="Consolas" w:cs="Consolas"/>
+        </w:rPr>
+        <w:t>x &lt; 10 || x &gt; 20</w:t>
+      </w:r>
+      <w:r>
+        <w:t xml:space="preserve"> equivale a </w:t>
+      </w:r>
+      <w:r>
+        <w:rPr>
+          <w:rFonts w:ascii="Consolas" w:hAnsi="Consolas" w:cs="Consolas"/>
+        </w:rPr>
+        <w:t>!(x &gt;= 10 &amp;&amp; x &lt;= 20)</w:t>
+      </w:r>
+      <w:r>
+        <w:t xml:space="preserve">. Questa seconda scrittura nega l'appartenenza all'intervallo tra 10 e 20 estremi compresi; applicando De Morgan si porta la negazione dentro le parentesi, scambiando la congiunzione con la disgiunzione, e arrivando ai predicati di base (uguale, diverso, minore, maggiore, minore o uguale, maggiore o uguale) si sostituisce ciascuno con il suo complementare: la negazione di </w:t>
+      </w:r>
+      <w:r>
+        <w:rPr>
+          <w:rFonts w:ascii="Consolas" w:hAnsi="Consolas" w:cs="Consolas"/>
+        </w:rPr>
+        <w:t>x &gt;= 10</w:t>
+      </w:r>
+      <w:r>
+        <w:t xml:space="preserve"> è </w:t>
+      </w:r>
+      <w:r>
+        <w:rPr>
+          <w:rFonts w:ascii="Consolas" w:hAnsi="Consolas" w:cs="Consolas"/>
+        </w:rPr>
+        <w:t>x &lt; 10</w:t>
+      </w:r>
+      <w:r>
+        <w:t xml:space="preserve"> e quella di </w:t>
+      </w:r>
+      <w:r>
+        <w:rPr>
+          <w:rFonts w:ascii="Consolas" w:hAnsi="Consolas" w:cs="Consolas"/>
+        </w:rPr>
+        <w:t>x &lt;= 20</w:t>
+      </w:r>
+      <w:r>
+        <w:t xml:space="preserve"> è </w:t>
+      </w:r>
+      <w:r>
+        <w:rPr>
+          <w:rFonts w:ascii="Consolas" w:hAnsi="Consolas" w:cs="Consolas"/>
+        </w:rPr>
+        <w:t>x &gt; 20</w:t>
+      </w:r>
+      <w:r>
+        <w:t>. La prima forma si legge più facilmente: per questo si preferisce.</w:t>
       </w:r>
     </w:p>
     <w:p>
@@ -12099,576 +12995,11 @@
           <w:b/>
           <w:color w:val="E97132"/>
         </w:rPr>
-        <w:t>Come si traduce dal linguaggio naturale</w:t>
-      </w:r>
-    </w:p>
-    <w:p>
-      <w:r>
-        <w:rPr/>
-        <w:t>Nei quesiti d'esame l'implicazione p → q non compare sempre nella forma "se p, allora q". Le formulazioni seguenti equivalgono tutte a p → q:</w:t>
-      </w:r>
-    </w:p>
-    <w:p>
-      <w:pPr>
-        <w:numPr>
-          <w:ilvl w:val="0"/>
-          <w:numId w:val="1"/>
-        </w:numPr>
-      </w:pPr>
-      <w:r>
-        <w:rPr/>
-        <w:t>"se p, allora q" e "p implica q";</w:t>
-      </w:r>
-    </w:p>
-    <w:p>
-      <w:pPr>
-        <w:numPr>
-          <w:ilvl w:val="0"/>
-          <w:numId w:val="1"/>
-        </w:numPr>
-      </w:pPr>
-      <w:r>
-        <w:rPr/>
-        <w:t>"q se p" (p, dopo il "se", è l'ipotesi);</w:t>
-      </w:r>
-    </w:p>
-    <w:p>
-      <w:pPr>
-        <w:numPr>
-          <w:ilvl w:val="0"/>
-          <w:numId w:val="1"/>
-        </w:numPr>
-      </w:pPr>
-      <w:r>
-        <w:rPr/>
-        <w:t>"p solo se q" (attenzione: non q → p; il "solo se" introduce la condizione necessaria, cioè la tesi);</w:t>
-      </w:r>
-    </w:p>
-    <w:p>
-      <w:pPr>
-        <w:numPr>
-          <w:ilvl w:val="0"/>
-          <w:numId w:val="1"/>
-        </w:numPr>
-      </w:pPr>
-      <w:r>
-        <w:rPr/>
-        <w:t>"p è condizione sufficiente per q";</w:t>
-      </w:r>
-    </w:p>
-    <w:p>
-      <w:pPr>
-        <w:numPr>
-          <w:ilvl w:val="0"/>
-          <w:numId w:val="1"/>
-        </w:numPr>
-      </w:pPr>
-      <w:r>
-        <w:rPr/>
-        <w:t>"q è condizione necessaria per p".</w:t>
-      </w:r>
-    </w:p>
-    <w:p>
-      <w:r>
-        <w:rPr/>
-        <w:t>Riassumendo: l'ipotesi è la condizione sufficiente, la tesi è la condizione necessaria; la conversa, quella con i ruoli scambiati, non è equivalente all'implicazione di partenza, mentre la contrapposta lo è.</w:t>
-      </w:r>
-    </w:p>
-    <w:p>
-      <w:pPr>
-        <w:pStyle w:val="Titolo1"/>
-      </w:pPr>
-      <w:r>
-        <w:rPr>
-          <w:b/>
-          <w:color w:val="EE0000"/>
-        </w:rPr>
-        <w:t>18. Il Bicondizionale, l'Equivalenza e le Riscritture dell'Implicazione</w:t>
-      </w:r>
-    </w:p>
-    <w:p>
-      <w:pPr>
-        <w:pStyle w:val="Titolo2"/>
-      </w:pPr>
-      <w:r>
-        <w:rPr>
-          <w:b/>
-          <w:color w:val="E97132"/>
-        </w:rPr>
-        <w:t>L'equivalenza logica</w:t>
-      </w:r>
-    </w:p>
-    <w:p>
-      <w:r>
-        <w:rPr/>
-        <w:t xml:space="preserve">Due formule sono </w:t>
-      </w:r>
-      <w:r>
-        <w:rPr>
-          <w:b/>
-        </w:rPr>
-        <w:t>logicamente equivalenti</w:t>
-      </w:r>
-      <w:r>
-        <w:rPr/>
-        <w:t xml:space="preserve"> quando hanno la stessa tavola di verità (capitolo 15); si scrive P ≡ Q. Il </w:t>
-      </w:r>
-      <w:r>
-        <w:rPr>
-          <w:b/>
-        </w:rPr>
-        <w:t>bicondizionale</w:t>
-      </w:r>
-      <w:r>
-        <w:rPr/>
-        <w:t xml:space="preserve">, già incontrato come "equivalenza" nel capitolo 13, è il connettivo che dà 1 quando due valori sono uguali: p ↔ q (si legge "p se e solo se q", in inglese *iff*, o anche "doppia freccia") è vera quando i due valori di verità sono </w:t>
-      </w:r>
-      <w:r>
-        <w:rPr>
-          <w:b/>
-        </w:rPr>
-        <w:t>uguali</w:t>
-      </w:r>
-      <w:r>
-        <w:rPr/>
-        <w:t xml:space="preserve"> (entrambi veri o entrambi falsi) ed è falsa quando sono diversi. È dunque il </w:t>
-      </w:r>
-      <w:r>
-        <w:rPr>
-          <w:b/>
-        </w:rPr>
-        <w:t>test di uguaglianza</w:t>
-      </w:r>
-      <w:r>
-        <w:rPr/>
-        <w:t xml:space="preserve"> tra due valori di verità, ed è legato alla relazione ≡ tra formule: P ≡ Q vale proprio quando P ↔ Q è una tautologia.</w:t>
-      </w:r>
-    </w:p>
-    <w:p>
-      <w:pPr>
-        <w:pStyle w:val="Titolo2"/>
-      </w:pPr>
-      <w:r>
-        <w:rPr>
-          <w:b/>
-          <w:color w:val="E97132"/>
-        </w:rPr>
-        <w:t>Il bicondizionale e le due implicazioni</w:t>
-      </w:r>
-    </w:p>
-    <w:p>
-      <w:r>
-        <w:rPr/>
-        <w:t xml:space="preserve">Si chiama bicondizionale perché è fatto di due condizionali opposti, l'implicazione da sinistra a destra e quella da destra a sinistra: </w:t>
-      </w:r>
-      <w:r>
-        <w:rPr>
-          <w:b/>
-        </w:rPr>
-        <w:t>p ↔ q ≡ (p → q) ∧ (q → p)</w:t>
-      </w:r>
-      <w:r>
-        <w:rPr/>
-        <w:t xml:space="preserve">. In parole, p è condizione necessaria </w:t>
-      </w:r>
-      <w:r>
-        <w:rPr>
-          <w:b/>
-        </w:rPr>
-        <w:t>e</w:t>
-      </w:r>
-      <w:r>
-        <w:rPr/>
-        <w:t xml:space="preserve"> sufficiente per q.</w:t>
-      </w:r>
-    </w:p>
-    <w:p>
-      <w:pPr>
-        <w:keepNext/>
-        <w:jc w:val="center"/>
-      </w:pPr>
-      <w:r>
-        <w:drawing>
-          <wp:inline xmlns:a="http://schemas.openxmlformats.org/drawingml/2006/main" xmlns:pic="http://schemas.openxmlformats.org/drawingml/2006/picture">
-            <wp:extent cx="4500000" cy="1525321"/>
-            <wp:docPr id="2073952349" name="Picture 2073952349"/>
-            <wp:cNvGraphicFramePr>
-              <a:graphicFrameLocks noChangeAspect="1"/>
-            </wp:cNvGraphicFramePr>
-            <a:graphic>
-              <a:graphicData uri="http://schemas.openxmlformats.org/drawingml/2006/picture">
-                <pic:pic>
-                  <pic:nvPicPr>
-                    <pic:cNvPr id="0" name="logica_bicondizionale.png"/>
-                    <pic:cNvPicPr/>
-                  </pic:nvPicPr>
-                  <pic:blipFill>
-                    <a:blip r:embed="rId26"/>
-                    <a:stretch>
-                      <a:fillRect/>
-                    </a:stretch>
-                  </pic:blipFill>
-                  <pic:spPr>
-                    <a:xfrm>
-                      <a:off x="0" y="0"/>
-                      <a:ext cx="4500000" cy="1525321"/>
-                    </a:xfrm>
-                    <a:prstGeom prst="rect"/>
-                  </pic:spPr>
-                </pic:pic>
-              </a:graphicData>
-            </a:graphic>
-          </wp:inline>
-        </w:drawing>
-      </w:r>
-    </w:p>
-    <w:p>
-      <w:pPr>
-        <w:jc w:val="center"/>
-      </w:pPr>
-      <w:r>
-        <w:rPr>
-          <w:i/>
-          <w:sz w:val="18"/>
-        </w:rPr>
-        <w:t>La tavola di verità del bicondizionale: coincide con quella della congiunzione delle due implicazioni.</w:t>
-      </w:r>
-    </w:p>
-    <w:p>
-      <w:r>
-        <w:rPr/>
-        <w:t>Lo si può provare con una tavola di verità, come in figura, oppure con un ragionamento. Poiché p → q equivale a "il valore di p è minore o uguale al valore di q", la congiunzione (p → q) ∧ (q → p) dice che p ≤ q e q ≤ p. Per una proprietà degli ordini (l'antisimmetria), se p ≤ q e q ≤ p allora p e q sono uguali: quindi la congiunzione è il test di uguaglianza, cioè il bicondizionale. Quale dei due modi sia la definizione e quale la proprietà dipende da come si è definito il bicondizionale: se lo si definisce con la tavola di verità, si osserva che vale 1 con due valori uguali e 0 con due diversi, e poi si mostra l'equivalenza con le due implicazioni.</w:t>
-      </w:r>
-    </w:p>
-    <w:p>
-      <w:pPr>
-        <w:pStyle w:val="Titolo2"/>
-      </w:pPr>
-      <w:r>
-        <w:rPr>
-          <w:b/>
-          <w:color w:val="E97132"/>
-        </w:rPr>
-        <w:t>L'implicazione si può scrivere con altri connettivi</w:t>
-      </w:r>
-    </w:p>
-    <w:p>
-      <w:r>
-        <w:rPr/>
-        <w:t>Non è necessario avere l'implicazione come connettivo (o come circuito): se si sa realizzare la negazione e la congiunzione, si può realizzare anche l'implicazione. Vediamo come.</w:t>
-      </w:r>
-    </w:p>
-    <w:p>
-      <w:r>
-        <w:rPr>
-          <w:b/>
-        </w:rPr>
-        <w:t>La negazione dell'implicazione.</w:t>
-      </w:r>
-      <w:r>
-        <w:rPr/>
-        <w:t xml:space="preserve"> L'implicazione è falsa in un solo caso: ipotesi vera e tesi falsa. Quindi ¬(p → q) è vera esattamente quando p è vera e q è falsa:</w:t>
-      </w:r>
-    </w:p>
-    <w:p>
-      <w:r>
-        <w:rPr/>
-        <w:t>¬(p → q) ≡ p ∧ ¬q.</w:t>
-      </w:r>
-    </w:p>
-    <w:p>
-      <w:r>
-        <w:rPr/>
-        <w:t>La negazione di un'implicazione non è un'altra implicazione, ma una congiunzione. Attenzione al modo in cui si nega un'implicazione: p → ¬q oppure ¬p → ¬q non sono corrette; la negazione giusta è p ∧ ¬q. Per esempio, la negazione di "se Jerry riceve una borsa di studio, allora va al college" è "Jerry riceve la borsa di studio e non va al college".</w:t>
-      </w:r>
-    </w:p>
-    <w:p>
-      <w:r>
-        <w:rPr>
-          <w:b/>
-        </w:rPr>
-        <w:t>La doppia negazione.</w:t>
-      </w:r>
-      <w:r>
-        <w:rPr/>
-        <w:t xml:space="preserve"> Serve una legge banale ma importante: negare due volte equivale ad affermare, ¬¬p ≡ p. Basta guardare la tavola: se p è vera, ¬p è falsa e ¬¬p torna vera; se p è falsa, ¬p è vera e ¬¬p torna falsa. Nel linguaggio naturale non è così: dire che qualcosa "non è proprio falso" intende di solito qualcosa di più debole di "è vero". Nel linguaggio semplificato della logica, dove si guardano solo i valori di verità, non c'è alcuna differenza.</w:t>
-      </w:r>
-    </w:p>
-    <w:p>
-      <w:r>
-        <w:rPr>
-          <w:b/>
-        </w:rPr>
-        <w:t>L'implicazione con negazione e disgiunzione.</w:t>
-      </w:r>
-      <w:r>
-        <w:rPr/>
-        <w:t xml:space="preserve"> Si parte dalla legge precedente e si aggiunge una doppia negazione:</w:t>
-      </w:r>
-    </w:p>
-    <w:p>
-      <w:r>
-        <w:rPr/>
-        <w:t>p → q ≡ ¬¬(p → q) ≡ ¬(p ∧ ¬q).</w:t>
-      </w:r>
-    </w:p>
-    <w:p>
-      <w:r>
-        <w:rPr/>
-        <w:t xml:space="preserve">Sono già tre connettivi (due negazioni e una congiunzione) che ci permettono di scrivere l'implicazione. Con la legge di </w:t>
-      </w:r>
-      <w:r>
-        <w:rPr>
-          <w:b/>
-        </w:rPr>
-        <w:t>De Morgan</w:t>
-      </w:r>
-      <w:r>
-        <w:rPr/>
-        <w:t>, di cui nel capitolo 15 si è visto il caso della disgiunzione e di cui subito sotto si giustifica la versione duale per la congiunzione, si può ridurre. La legge dice che negare una congiunzione equivale a disgiungere le negazioni degli argomenti: ¬(a ∧ b) ≡ ¬a ∨ ¬b. Applicata a ¬(p ∧ ¬q) dà ¬p ∨ ¬¬q, e per la doppia negazione si arriva a</w:t>
-      </w:r>
-    </w:p>
-    <w:p>
-      <w:r>
-        <w:rPr>
-          <w:b/>
-        </w:rPr>
-        <w:t>p → q ≡ ¬p ∨ q.</w:t>
-      </w:r>
-    </w:p>
-    <w:p>
-      <w:pPr>
-        <w:keepNext/>
-        <w:jc w:val="center"/>
-      </w:pPr>
-      <w:r>
-        <w:drawing>
-          <wp:inline xmlns:a="http://schemas.openxmlformats.org/drawingml/2006/main" xmlns:pic="http://schemas.openxmlformats.org/drawingml/2006/picture">
-            <wp:extent cx="3780000" cy="1882500"/>
-            <wp:docPr id="2073952350" name="Picture 2073952350"/>
-            <wp:cNvGraphicFramePr>
-              <a:graphicFrameLocks noChangeAspect="1"/>
-            </wp:cNvGraphicFramePr>
-            <a:graphic>
-              <a:graphicData uri="http://schemas.openxmlformats.org/drawingml/2006/picture">
-                <pic:pic>
-                  <pic:nvPicPr>
-                    <pic:cNvPr id="0" name="logica_implicazione_disgiunzione.png"/>
-                    <pic:cNvPicPr/>
-                  </pic:nvPicPr>
-                  <pic:blipFill>
-                    <a:blip r:embed="rId27"/>
-                    <a:stretch>
-                      <a:fillRect/>
-                    </a:stretch>
-                  </pic:blipFill>
-                  <pic:spPr>
-                    <a:xfrm>
-                      <a:off x="0" y="0"/>
-                      <a:ext cx="3780000" cy="1882500"/>
-                    </a:xfrm>
-                    <a:prstGeom prst="rect"/>
-                  </pic:spPr>
-                </pic:pic>
-              </a:graphicData>
-            </a:graphic>
-          </wp:inline>
-        </w:drawing>
-      </w:r>
-    </w:p>
-    <w:p>
-      <w:pPr>
-        <w:jc w:val="center"/>
-      </w:pPr>
-      <w:r>
-        <w:rPr>
-          <w:i/>
-          <w:sz w:val="18"/>
-        </w:rPr>
-        <w:t>Le colonne di p → q e di ¬p ∨ q coincidono.</w:t>
-      </w:r>
-    </w:p>
-    <w:p>
-      <w:r>
-        <w:rPr/>
-        <w:t xml:space="preserve">È la definizione più usata dell'implicazione, e dice che un'implicazione è vera se e solo se l'ipotesi è falsa </w:t>
-      </w:r>
-      <w:r>
-        <w:rPr>
-          <w:b/>
-        </w:rPr>
-        <w:t>oppure</w:t>
-      </w:r>
-      <w:r>
-        <w:rPr/>
-        <w:t xml:space="preserve"> la tesi è vera: sono esattamente i tre casi veri della tavola, quelli con la tesi vera (due righe) e quelli con l'ipotesi falsa (due righe), con una sovrapposizione, perché con ipotesi falsa e tesi vera l'implicazione è vera per due motivi indipendenti. Si poteva arrivarci in un passo solo osservando la tavola; il passaggio per De Morgan mostra che le leggi si combinano.</w:t>
-      </w:r>
-    </w:p>
-    <w:p>
-      <w:r>
-        <w:rPr/>
-        <w:t xml:space="preserve">Per questo, in un linguaggio come Java, l'implicazione non serve come operatore: p → q si scrive come </w:t>
-      </w:r>
-      <w:r>
-        <w:rPr>
-          <w:rFonts w:ascii="Consolas" w:hAnsi="Consolas" w:cs="Consolas"/>
-        </w:rPr>
-        <w:t>!p || q</w:t>
-      </w:r>
-      <w:r>
-        <w:rPr/>
-        <w:t>.</w:t>
-      </w:r>
-    </w:p>
-    <w:p>
-      <w:pPr>
-        <w:pStyle w:val="Titolo2"/>
-      </w:pPr>
-      <w:r>
-        <w:rPr>
-          <w:b/>
-          <w:color w:val="E97132"/>
-        </w:rPr>
-        <w:t>Le leggi di De Morgan e la dualità</w:t>
-      </w:r>
-    </w:p>
-    <w:p>
-      <w:r>
-        <w:rPr/>
-        <w:t>Le leggi di De Morgan sono due:</w:t>
-      </w:r>
-    </w:p>
-    <w:p>
-      <w:pPr>
-        <w:numPr>
-          <w:ilvl w:val="0"/>
-          <w:numId w:val="1"/>
-        </w:numPr>
-      </w:pPr>
-      <w:r>
-        <w:rPr/>
-        <w:t>¬(p ∧ q) ≡ ¬p ∨ ¬q: negando una congiunzione si disgiungono le negazioni;</w:t>
-      </w:r>
-    </w:p>
-    <w:p>
-      <w:pPr>
-        <w:numPr>
-          <w:ilvl w:val="0"/>
-          <w:numId w:val="1"/>
-        </w:numPr>
-      </w:pPr>
-      <w:r>
-        <w:rPr/>
-        <w:t>¬(p ∨ q) ≡ ¬p ∧ ¬q: negando una disgiunzione si congiungono le negazioni (già vista nel capitolo 15).</w:t>
-      </w:r>
-    </w:p>
-    <w:p>
-      <w:r>
-        <w:rPr/>
-        <w:t xml:space="preserve">Sono </w:t>
-      </w:r>
-      <w:r>
-        <w:rPr>
-          <w:b/>
-        </w:rPr>
-        <w:t>duali</w:t>
-      </w:r>
-      <w:r>
-        <w:rPr/>
-        <w:t xml:space="preserve">: se si scambiano vero e falso, congiunzione e disgiunzione e si lascia la negazione com'è (la negazione è auto-duale: scambiando vero e falso, la sua tavola resta la stessa), da una legge si ottiene l'altra. La logica proposizionale è duale in generale: non c'è un ruolo privilegiato per il vero o per il falso, e se si scambia ovunque vero con falso e congiunzione con disgiunzione, ogni equivalenza valida si trasforma nella sua duale, che è ancora un'equivalenza valida. Si può quindi dire che c'è </w:t>
-      </w:r>
-      <w:r>
-        <w:rPr>
-          <w:b/>
-        </w:rPr>
-        <w:t>un'unica legge di De Morgan</w:t>
-      </w:r>
-      <w:r>
-        <w:rPr/>
-        <w:t>, e l'altra è la sua duale.</w:t>
-      </w:r>
-    </w:p>
-    <w:p>
-      <w:r>
-        <w:rPr/>
-        <w:t xml:space="preserve">Un'applicazione in Java: la condizione </w:t>
-      </w:r>
-      <w:r>
-        <w:rPr>
-          <w:rFonts w:ascii="Consolas" w:hAnsi="Consolas" w:cs="Consolas"/>
-        </w:rPr>
-        <w:t>x &lt; 10 || x &gt; 20</w:t>
-      </w:r>
-      <w:r>
-        <w:rPr/>
-        <w:t xml:space="preserve"> equivale a </w:t>
-      </w:r>
-      <w:r>
-        <w:rPr>
-          <w:rFonts w:ascii="Consolas" w:hAnsi="Consolas" w:cs="Consolas"/>
-        </w:rPr>
-        <w:t>!(x &gt;= 10 &amp;&amp; x &lt;= 20)</w:t>
-      </w:r>
-      <w:r>
-        <w:rPr/>
-        <w:t xml:space="preserve">. Questa seconda scrittura nega l'appartenenza all'intervallo tra 10 e 20 estremi compresi; applicando De Morgan si porta la negazione dentro le parentesi, scambiando la congiunzione con la disgiunzione, e arrivando ai predicati di base (uguale, diverso, minore, maggiore, minore o uguale, maggiore o uguale) si sostituisce ciascuno con il suo complementare: la negazione di </w:t>
-      </w:r>
-      <w:r>
-        <w:rPr>
-          <w:rFonts w:ascii="Consolas" w:hAnsi="Consolas" w:cs="Consolas"/>
-        </w:rPr>
-        <w:t>x &gt;= 10</w:t>
-      </w:r>
-      <w:r>
-        <w:rPr/>
-        <w:t xml:space="preserve"> è </w:t>
-      </w:r>
-      <w:r>
-        <w:rPr>
-          <w:rFonts w:ascii="Consolas" w:hAnsi="Consolas" w:cs="Consolas"/>
-        </w:rPr>
-        <w:t>x &lt; 10</w:t>
-      </w:r>
-      <w:r>
-        <w:rPr/>
-        <w:t xml:space="preserve"> e quella di </w:t>
-      </w:r>
-      <w:r>
-        <w:rPr>
-          <w:rFonts w:ascii="Consolas" w:hAnsi="Consolas" w:cs="Consolas"/>
-        </w:rPr>
-        <w:t>x &lt;= 20</w:t>
-      </w:r>
-      <w:r>
-        <w:rPr/>
-        <w:t xml:space="preserve"> è </w:t>
-      </w:r>
-      <w:r>
-        <w:rPr>
-          <w:rFonts w:ascii="Consolas" w:hAnsi="Consolas" w:cs="Consolas"/>
-        </w:rPr>
-        <w:t>x &gt; 20</w:t>
-      </w:r>
-      <w:r>
-        <w:rPr/>
-        <w:t>. La prima forma si legge più facilmente: per questo si preferisce.</w:t>
-      </w:r>
-    </w:p>
-    <w:p>
-      <w:pPr>
-        <w:pStyle w:val="Titolo2"/>
-      </w:pPr>
-      <w:r>
-        <w:rPr>
-          <w:b/>
-          <w:color w:val="E97132"/>
-        </w:rPr>
         <w:t>Il limite delle tavole di verità</w:t>
       </w:r>
     </w:p>
     <w:p>
       <w:r>
-        <w:rPr/>
         <w:t>Le tavole di verità sono un buon metodo per provare un'equivalenza o una tautologia quando le proposizioni atomiche sono poche (come per p ↔ q e le due implicazioni), ma non funzionano su grande scala: con n proposizioni atomiche le righe sono 2</w:t>
       </w:r>
       <w:r>
@@ -12678,7 +13009,6 @@
         <w:t>n</w:t>
       </w:r>
       <w:r>
-        <w:rPr/>
         <w:t>, quindi il numero di passi cresce in modo esponenziale. Con cento proposizioni atomiche servirebbe una tavola di 2</w:t>
       </w:r>
       <w:r>
@@ -12688,7 +13018,6 @@
         <w:t>100</w:t>
       </w:r>
       <w:r>
-        <w:rPr/>
         <w:t xml:space="preserve"> righe, circa 10</w:t>
       </w:r>
       <w:r>
@@ -12698,7 +13027,6 @@
         <w:t>30</w:t>
       </w:r>
       <w:r>
-        <w:rPr/>
         <w:t>, un numero che nessun computer di oggi riesce a percorrere. In questi casi servono metodi più rapidi, che però hanno altri difetti: non riescono a concludere in tutti i casi.</w:t>
       </w:r>
     </w:p>

</xml_diff>

<commit_message>
Fondamenti: capitolo 19 (argomenti e regole di inferenza) dalla dispensa 1.4, senza audio
Co-Authored-By: Claude Sonnet 5.5 <noreply@anthropic.com>
</commit_message>
<xml_diff>
--- a/Riassunto Fondamenti Informatica.docx
+++ b/Riassunto Fondamenti Informatica.docx
@@ -13028,6 +13028,734 @@
       </w:r>
       <w:r>
         <w:t>, un numero che nessun computer di oggi riesce a percorrere. In questi casi servono metodi più rapidi, che però hanno altri difetti: non riescono a concludere in tutti i casi.</w:t>
+      </w:r>
+    </w:p>
+    <w:p>
+      <w:pPr>
+        <w:pStyle w:val="Titolo1"/>
+      </w:pPr>
+      <w:r>
+        <w:rPr>
+          <w:b/>
+          <w:color w:val="EE0000"/>
+        </w:rPr>
+        <w:t>19. Argomenti e Regole di Inferenza</w:t>
+      </w:r>
+    </w:p>
+    <w:p>
+      <w:pPr>
+        <w:pStyle w:val="Titolo2"/>
+      </w:pPr>
+      <w:r>
+        <w:rPr>
+          <w:b/>
+          <w:color w:val="E97132"/>
+        </w:rPr>
+        <w:t>Il ragionamento deduttivo</w:t>
+      </w:r>
+    </w:p>
+    <w:p>
+      <w:r>
+        <w:rPr/>
+        <w:t>Si parte da un esempio. Supponiamo di sapere tre cose: il bug è nel modulo 17 oppure nel modulo 81; il bug è un errore numerico; il modulo 81 non contiene errori numerici. Assumendo che queste affermazioni siano vere, è ragionevole concludere che il bug è nel modulo 17.</w:t>
+      </w:r>
+    </w:p>
+    <w:p>
+      <w:r>
+        <w:rPr/>
+        <w:t xml:space="preserve">Questo processo, in cui da una sequenza di proposizioni si trae una conclusione, si chiama </w:t>
+      </w:r>
+      <w:r>
+        <w:rPr>
+          <w:b/>
+        </w:rPr>
+        <w:t>ragionamento deduttivo</w:t>
+      </w:r>
+      <w:r>
+        <w:rPr/>
+        <w:t xml:space="preserve">. Le proposizioni di partenza si chiamano </w:t>
+      </w:r>
+      <w:r>
+        <w:rPr>
+          <w:b/>
+        </w:rPr>
+        <w:t>ipotesi</w:t>
+      </w:r>
+      <w:r>
+        <w:rPr/>
+        <w:t xml:space="preserve"> (o </w:t>
+      </w:r>
+      <w:r>
+        <w:rPr>
+          <w:b/>
+        </w:rPr>
+        <w:t>premesse</w:t>
+      </w:r>
+      <w:r>
+        <w:rPr/>
+        <w:t xml:space="preserve">), la proposizione che ne segue si chiama </w:t>
+      </w:r>
+      <w:r>
+        <w:rPr>
+          <w:b/>
+        </w:rPr>
+        <w:t>conclusione</w:t>
+      </w:r>
+      <w:r>
+        <w:rPr/>
+        <w:t xml:space="preserve">, e l'insieme di ipotesi più conclusione è un </w:t>
+      </w:r>
+      <w:r>
+        <w:rPr>
+          <w:b/>
+        </w:rPr>
+        <w:t>argomento</w:t>
+      </w:r>
+      <w:r>
+        <w:rPr/>
+        <w:t xml:space="preserve"> (deduttivo). Molte dimostrazioni di matematica e di informatica sono argomenti deduttivi.</w:t>
+      </w:r>
+    </w:p>
+    <w:p>
+      <w:r>
+        <w:rPr/>
+        <w:t>Un argomento ha sempre la stessa forma: «se p₁ e p₂ e … e p</w:t>
+      </w:r>
+      <w:r>
+        <w:rPr>
+          <w:vertAlign w:val="subscript"/>
+        </w:rPr>
+        <w:t>n</w:t>
+      </w:r>
+      <w:r>
+        <w:rPr/>
+        <w:t>, allora q». È la forma di un'implicazione, e questo collegamento con i capitoli 16-18 è la chiave per capire quando un argomento «funziona».</w:t>
+      </w:r>
+    </w:p>
+    <w:p>
+      <w:pPr>
+        <w:pStyle w:val="Titolo2"/>
+      </w:pPr>
+      <w:r>
+        <w:rPr>
+          <w:b/>
+          <w:color w:val="E97132"/>
+        </w:rPr>
+        <w:t>Argomento valido</w:t>
+      </w:r>
+    </w:p>
+    <w:p>
+      <w:r>
+        <w:rPr>
+          <w:b/>
+        </w:rPr>
+        <w:t>Definizione.</w:t>
+      </w:r>
+      <w:r>
+        <w:rPr/>
+        <w:t xml:space="preserve"> Un </w:t>
+      </w:r>
+      <w:r>
+        <w:rPr>
+          <w:b/>
+        </w:rPr>
+        <w:t>argomento</w:t>
+      </w:r>
+      <w:r>
+        <w:rPr/>
+        <w:t xml:space="preserve"> è una successione di proposizioni p₁, p₂, …, p</w:t>
+      </w:r>
+      <w:r>
+        <w:rPr>
+          <w:vertAlign w:val="subscript"/>
+        </w:rPr>
+        <w:t>n</w:t>
+      </w:r>
+      <w:r>
+        <w:rPr/>
+        <w:t xml:space="preserve"> (le ipotesi) seguita da una proposizione q (la conclusione), che si scrive con le ipotesi una sotto l'altra e la conclusione sotto una riga, preceduta dal simbolo ∴ («quindi»), oppure in una riga sola come p₁, p₂, …, p</w:t>
+      </w:r>
+      <w:r>
+        <w:rPr>
+          <w:vertAlign w:val="subscript"/>
+        </w:rPr>
+        <w:t>n</w:t>
+      </w:r>
+      <w:r>
+        <w:rPr/>
+        <w:t xml:space="preserve"> / ∴ q. L'argomento si dice </w:t>
+      </w:r>
+      <w:r>
+        <w:rPr>
+          <w:b/>
+        </w:rPr>
+        <w:t>valido</w:t>
+      </w:r>
+      <w:r>
+        <w:rPr/>
+        <w:t xml:space="preserve"> se, ogni volta che p₁ e p₂ e … e p</w:t>
+      </w:r>
+      <w:r>
+        <w:rPr>
+          <w:vertAlign w:val="subscript"/>
+        </w:rPr>
+        <w:t>n</w:t>
+      </w:r>
+      <w:r>
+        <w:rPr/>
+        <w:t xml:space="preserve"> sono tutte vere, anche q è vera; altrimenti si dice </w:t>
+      </w:r>
+      <w:r>
+        <w:rPr>
+          <w:b/>
+        </w:rPr>
+        <w:t>non valido</w:t>
+      </w:r>
+      <w:r>
+        <w:rPr/>
+        <w:t xml:space="preserve"> (o una </w:t>
+      </w:r>
+      <w:r>
+        <w:rPr>
+          <w:b/>
+        </w:rPr>
+        <w:t>fallacia</w:t>
+      </w:r>
+      <w:r>
+        <w:rPr/>
+        <w:t>).</w:t>
+      </w:r>
+    </w:p>
+    <w:p>
+      <w:r>
+        <w:rPr/>
+        <w:t xml:space="preserve">In un argomento valido si dice che la conclusione segue dalle ipotesi, ma bisogna capirsi su che cosa si afferma: </w:t>
+      </w:r>
+      <w:r>
+        <w:rPr>
+          <w:b/>
+        </w:rPr>
+        <w:t>non</w:t>
+      </w:r>
+      <w:r>
+        <w:rPr/>
+        <w:t xml:space="preserve"> si dice che la conclusione è vera, ma solo che se si accettano le ipotesi si deve accettare anche la conclusione. Un argomento è valido per la sua </w:t>
+      </w:r>
+      <w:r>
+        <w:rPr>
+          <w:b/>
+        </w:rPr>
+        <w:t>forma</w:t>
+      </w:r>
+      <w:r>
+        <w:rPr/>
+        <w:t xml:space="preserve"> e non per il suo contenuto: due argomenti con la stessa forma sono entrambi validi o entrambi non validi, anche se parlano di cose completamente diverse.</w:t>
+      </w:r>
+    </w:p>
+    <w:p>
+      <w:r>
+        <w:rPr/>
+        <w:t>In termini dei capitoli precedenti, dire che l'argomento è valido equivale a dire che l'implicazione (p₁ ∧ p₂ ∧ … ∧ p</w:t>
+      </w:r>
+      <w:r>
+        <w:rPr>
+          <w:vertAlign w:val="subscript"/>
+        </w:rPr>
+        <w:t>n</w:t>
+      </w:r>
+      <w:r>
+        <w:rPr/>
+        <w:t>) → q non è mai falsa: ipotesi tutte vere e conclusione falsa è l'unico caso che la renderebbe falsa.</w:t>
+      </w:r>
+    </w:p>
+    <w:p>
+      <w:r>
+        <w:rPr/>
+        <w:t xml:space="preserve">Un argomento più lungo si costruisce a passi, e ciascun passo deve produrre una conclusione intermedia valida. Le </w:t>
+      </w:r>
+      <w:r>
+        <w:rPr>
+          <w:b/>
+        </w:rPr>
+        <w:t>regole di inferenza</w:t>
+      </w:r>
+      <w:r>
+        <w:rPr/>
+        <w:t xml:space="preserve"> sono, in breve, argomenti validi già noti, che si usano come mattoni all'interno di un argomento più grande.</w:t>
+      </w:r>
+    </w:p>
+    <w:p>
+      <w:pPr>
+        <w:pStyle w:val="Titolo2"/>
+      </w:pPr>
+      <w:r>
+        <w:rPr>
+          <w:b/>
+          <w:color w:val="E97132"/>
+        </w:rPr>
+        <w:t>Come si verifica la validità</w:t>
+      </w:r>
+    </w:p>
+    <w:p>
+      <w:r>
+        <w:rPr/>
+        <w:t xml:space="preserve">Il primo metodo è la </w:t>
+      </w:r>
+      <w:r>
+        <w:rPr>
+          <w:b/>
+        </w:rPr>
+        <w:t>tavola di verità</w:t>
+      </w:r>
+      <w:r>
+        <w:rPr/>
+        <w:t xml:space="preserve">: si scrivono i valori di tutte le proposizioni coinvolte e si controlla che in ogni riga in cui le ipotesi sono vere lo sia anche la conclusione. Il secondo metodo è un </w:t>
+      </w:r>
+      <w:r>
+        <w:rPr>
+          <w:b/>
+        </w:rPr>
+        <w:t>ragionamento diretto</w:t>
+      </w:r>
+      <w:r>
+        <w:rPr/>
+        <w:t>, che evita la tavola: si suppone che le ipotesi siano vere e si verifica che la conclusione non può essere falsa.</w:t>
+      </w:r>
+    </w:p>
+    <w:p>
+      <w:r>
+        <w:rPr/>
+        <w:t>Esempio. Si vuole stabilire se è valido l'argomento p → q, p / ∴ q.</w:t>
+      </w:r>
+    </w:p>
+    <w:p>
+      <w:pPr>
+        <w:keepNext/>
+        <w:jc w:val="center"/>
+      </w:pPr>
+      <w:r>
+        <w:drawing>
+          <wp:inline xmlns:a="http://schemas.openxmlformats.org/drawingml/2006/main" xmlns:pic="http://schemas.openxmlformats.org/drawingml/2006/picture">
+            <wp:extent cx="5220000" cy="1744244"/>
+            <wp:docPr id="2073952351" name="Picture 2073952351"/>
+            <wp:cNvGraphicFramePr>
+              <a:graphicFrameLocks noChangeAspect="1"/>
+            </wp:cNvGraphicFramePr>
+            <a:graphic>
+              <a:graphicData uri="http://schemas.openxmlformats.org/drawingml/2006/picture">
+                <pic:pic>
+                  <pic:nvPicPr>
+                    <pic:cNvPr id="0" name="logica_argomenti_tavole.png"/>
+                    <pic:cNvPicPr/>
+                  </pic:nvPicPr>
+                  <pic:blipFill>
+                    <a:blip r:embed="rId28"/>
+                    <a:stretch>
+                      <a:fillRect/>
+                    </a:stretch>
+                  </pic:blipFill>
+                  <pic:spPr>
+                    <a:xfrm>
+                      <a:off x="0" y="0"/>
+                      <a:ext cx="5220000" cy="1744244"/>
+                    </a:xfrm>
+                    <a:prstGeom prst="rect"/>
+                  </pic:spPr>
+                </pic:pic>
+              </a:graphicData>
+            </a:graphic>
+          </wp:inline>
+        </w:drawing>
+      </w:r>
+    </w:p>
+    <w:p>
+      <w:pPr>
+        <w:jc w:val="center"/>
+      </w:pPr>
+      <w:r>
+        <w:rPr>
+          <w:i/>
+          <w:sz w:val="18"/>
+        </w:rPr>
+        <w:t>A sinistra la tavola del modus ponens: nell'unica riga con le due ipotesi vere (riquadro verde) lo è anche la conclusione. A destra la tavola dell'argomento p → q, q / ∴ p: nella terza riga le ipotesi sono vere e la conclusione è falsa.</w:t>
+      </w:r>
+    </w:p>
+    <w:p>
+      <w:r>
+        <w:rPr/>
+        <w:t xml:space="preserve">Con la tavola (a sinistra nella figura) si osserva che ogni volta che p → q e p sono entrambe vere, lo è anche q: l'argomento è valido. Con il ragionamento diretto: si suppone che p → q e p siano vere; allora q deve essere vera, perché altrimenti p → q sarebbe falsa (ipotesi vera e tesi falsa). Questo argomento è usato continuamente e si chiama </w:t>
+      </w:r>
+      <w:r>
+        <w:rPr>
+          <w:b/>
+        </w:rPr>
+        <w:t>modus ponens</w:t>
+      </w:r>
+      <w:r>
+        <w:rPr/>
+        <w:t xml:space="preserve"> o </w:t>
+      </w:r>
+      <w:r>
+        <w:rPr>
+          <w:b/>
+        </w:rPr>
+        <w:t>legge del distacco</w:t>
+      </w:r>
+      <w:r>
+        <w:rPr/>
+        <w:t>.</w:t>
+      </w:r>
+    </w:p>
+    <w:p>
+      <w:pPr>
+        <w:pStyle w:val="Titolo2"/>
+      </w:pPr>
+      <w:r>
+        <w:rPr>
+          <w:b/>
+          <w:color w:val="E97132"/>
+        </w:rPr>
+        <w:t>Le regole di inferenza per le proposizioni</w:t>
+      </w:r>
+    </w:p>
+    <w:p>
+      <w:r>
+        <w:rPr/>
+        <w:t>Esistono diverse regole utili, ognuna verificabile con una tavola di verità; le principali sono nella figura.</w:t>
+      </w:r>
+    </w:p>
+    <w:p>
+      <w:pPr>
+        <w:keepNext/>
+        <w:jc w:val="center"/>
+      </w:pPr>
+      <w:r>
+        <w:drawing>
+          <wp:inline xmlns:a="http://schemas.openxmlformats.org/drawingml/2006/main" xmlns:pic="http://schemas.openxmlformats.org/drawingml/2006/picture">
+            <wp:extent cx="4680000" cy="2933368"/>
+            <wp:docPr id="2073952352" name="Picture 2073952352"/>
+            <wp:cNvGraphicFramePr>
+              <a:graphicFrameLocks noChangeAspect="1"/>
+            </wp:cNvGraphicFramePr>
+            <a:graphic>
+              <a:graphicData uri="http://schemas.openxmlformats.org/drawingml/2006/picture">
+                <pic:pic>
+                  <pic:nvPicPr>
+                    <pic:cNvPr id="0" name="logica_regole_inferenza.png"/>
+                    <pic:cNvPicPr/>
+                  </pic:nvPicPr>
+                  <pic:blipFill>
+                    <a:blip r:embed="rId29"/>
+                    <a:stretch>
+                      <a:fillRect/>
+                    </a:stretch>
+                  </pic:blipFill>
+                  <pic:spPr>
+                    <a:xfrm>
+                      <a:off x="0" y="0"/>
+                      <a:ext cx="4680000" cy="2933368"/>
+                    </a:xfrm>
+                    <a:prstGeom prst="rect"/>
+                  </pic:spPr>
+                </pic:pic>
+              </a:graphicData>
+            </a:graphic>
+          </wp:inline>
+        </w:drawing>
+      </w:r>
+    </w:p>
+    <w:p>
+      <w:pPr>
+        <w:jc w:val="center"/>
+      </w:pPr>
+      <w:r>
+        <w:rPr>
+          <w:i/>
+          <w:sz w:val="18"/>
+        </w:rPr>
+        <w:t>Le regole di inferenza per le proposizioni: premesse sopra la riga, conclusione sotto.</w:t>
+      </w:r>
+    </w:p>
+    <w:p>
+      <w:pPr>
+        <w:numPr>
+          <w:ilvl w:val="0"/>
+          <w:numId w:val="1"/>
+        </w:numPr>
+      </w:pPr>
+      <w:r>
+        <w:rPr>
+          <w:b/>
+        </w:rPr>
+        <w:t>Modus ponens</w:t>
+      </w:r>
+      <w:r>
+        <w:rPr/>
+        <w:t>: da p → q e p si ricava q.</w:t>
+      </w:r>
+    </w:p>
+    <w:p>
+      <w:pPr>
+        <w:numPr>
+          <w:ilvl w:val="0"/>
+          <w:numId w:val="1"/>
+        </w:numPr>
+      </w:pPr>
+      <w:r>
+        <w:rPr>
+          <w:b/>
+        </w:rPr>
+        <w:t>Modus tollens</w:t>
+      </w:r>
+      <w:r>
+        <w:rPr/>
+        <w:t>: da p → q e ¬q si ricava ¬p.</w:t>
+      </w:r>
+    </w:p>
+    <w:p>
+      <w:pPr>
+        <w:numPr>
+          <w:ilvl w:val="0"/>
+          <w:numId w:val="1"/>
+        </w:numPr>
+      </w:pPr>
+      <w:r>
+        <w:rPr>
+          <w:b/>
+        </w:rPr>
+        <w:t>Addizione</w:t>
+      </w:r>
+      <w:r>
+        <w:rPr/>
+        <w:t>: da p si ricava p ∨ q.</w:t>
+      </w:r>
+    </w:p>
+    <w:p>
+      <w:pPr>
+        <w:numPr>
+          <w:ilvl w:val="0"/>
+          <w:numId w:val="1"/>
+        </w:numPr>
+      </w:pPr>
+      <w:r>
+        <w:rPr>
+          <w:b/>
+        </w:rPr>
+        <w:t>Semplificazione</w:t>
+      </w:r>
+      <w:r>
+        <w:rPr/>
+        <w:t>: da p ∧ q si ricava p.</w:t>
+      </w:r>
+    </w:p>
+    <w:p>
+      <w:pPr>
+        <w:numPr>
+          <w:ilvl w:val="0"/>
+          <w:numId w:val="1"/>
+        </w:numPr>
+      </w:pPr>
+      <w:r>
+        <w:rPr>
+          <w:b/>
+        </w:rPr>
+        <w:t>Congiunzione</w:t>
+      </w:r>
+      <w:r>
+        <w:rPr/>
+        <w:t>: da p e da q si ricava p ∧ q.</w:t>
+      </w:r>
+    </w:p>
+    <w:p>
+      <w:pPr>
+        <w:numPr>
+          <w:ilvl w:val="0"/>
+          <w:numId w:val="1"/>
+        </w:numPr>
+      </w:pPr>
+      <w:r>
+        <w:rPr>
+          <w:b/>
+        </w:rPr>
+        <w:t>Sillogismo ipotetico</w:t>
+      </w:r>
+      <w:r>
+        <w:rPr/>
+        <w:t>: da p → q e q → r si ricava p → r.</w:t>
+      </w:r>
+    </w:p>
+    <w:p>
+      <w:pPr>
+        <w:numPr>
+          <w:ilvl w:val="0"/>
+          <w:numId w:val="1"/>
+        </w:numPr>
+      </w:pPr>
+      <w:r>
+        <w:rPr>
+          <w:b/>
+        </w:rPr>
+        <w:t>Sillogismo disgiuntivo</w:t>
+      </w:r>
+      <w:r>
+        <w:rPr/>
+        <w:t>: da p ∨ q e ¬p si ricava q.</w:t>
+      </w:r>
+    </w:p>
+    <w:p>
+      <w:r>
+        <w:rPr/>
+        <w:t xml:space="preserve">Per riconoscere la regola in un argomento scritto a parole bisogna prima tradurlo in simboli, come nell'esempio seguente. «Se il computer ha un gigabyte di memoria, allora può eseguire il programma. Se può eseguire il programma, allora la grafica sarà d'effetto. Quindi, se il computer ha un gigabyte di memoria, la grafica sarà d'effetto.» Con p = «il computer ha un gigabyte di memoria», q = «può eseguire il programma» e r = «la grafica sarà d'effetto», l'argomento è p → q, q → r / ∴ p → r: la regola usata è il </w:t>
+      </w:r>
+      <w:r>
+        <w:rPr>
+          <w:b/>
+        </w:rPr>
+        <w:t>sillogismo ipotetico</w:t>
+      </w:r>
+      <w:r>
+        <w:rPr/>
+        <w:t>.</w:t>
+      </w:r>
+    </w:p>
+    <w:p>
+      <w:pPr>
+        <w:pStyle w:val="Titolo2"/>
+      </w:pPr>
+      <w:r>
+        <w:rPr>
+          <w:b/>
+          <w:color w:val="E97132"/>
+        </w:rPr>
+        <w:t>Una fallacia frequente: affermare la conclusione</w:t>
+      </w:r>
+    </w:p>
+    <w:p>
+      <w:r>
+        <w:rPr/>
+        <w:t>Non tutti gli argomenti che «sembrano» validi lo sono. Si consideri: «Se 2 = 3, allora ho mangiato il cappello. Ho mangiato il cappello. Quindi 2 = 3.» Con p = «2 = 3» e q = «ho mangiato il cappello», l'argomento è p → q, q / ∴ p.</w:t>
+      </w:r>
+    </w:p>
+    <w:p>
+      <w:r>
+        <w:rPr/>
+        <w:t xml:space="preserve">Se fosse valido, ogni volta che p → q e q sono vere dovrebbe esserlo anche p. Ma questo non succede: con p falsa e q vera, l'implicazione p → q è vera per difetto (ipotesi falsa), q è vera, e la conclusione p è falsa. L'argomento </w:t>
+      </w:r>
+      <w:r>
+        <w:rPr>
+          <w:b/>
+        </w:rPr>
+        <w:t>non è valido</w:t>
+      </w:r>
+      <w:r>
+        <w:rPr/>
+        <w:t xml:space="preserve">. Questa fallacia si chiama </w:t>
+      </w:r>
+      <w:r>
+        <w:rPr>
+          <w:b/>
+        </w:rPr>
+        <w:t>affermazione della conclusione</w:t>
+      </w:r>
+      <w:r>
+        <w:rPr/>
+        <w:t xml:space="preserve"> (in inglese *fallacy of affirming the conclusion*): è lo stesso errore, già visto nel capitolo 17, di scambiare un'implicazione con la sua conversa. Si arriva alla stessa conclusione guardando la tavola (a destra nella figura): nella terza riga le ipotesi sono vere e la conclusione è falsa.</w:t>
+      </w:r>
+    </w:p>
+    <w:p>
+      <w:pPr>
+        <w:pStyle w:val="Titolo2"/>
+      </w:pPr>
+      <w:r>
+        <w:rPr>
+          <w:b/>
+          <w:color w:val="E97132"/>
+        </w:rPr>
+        <w:t>Argomenti in più passaggi</w:t>
+      </w:r>
+    </w:p>
+    <w:p>
+      <w:r>
+        <w:rPr/>
+        <w:t>Quando un argomento non coincide con una sola regola, si procede a passi, applicando una regola alla volta e usando le conclusioni intermedie come nuove ipotesi.</w:t>
+      </w:r>
+    </w:p>
+    <w:p>
+      <w:r>
+        <w:rPr>
+          <w:b/>
+        </w:rPr>
+        <w:t>Il bug nei moduli.</w:t>
+      </w:r>
+      <w:r>
+        <w:rPr/>
+        <w:t xml:space="preserve"> Si ripete l'argomento d'apertura con p = «il bug è nel modulo 17», q = «il bug è nel modulo 81» e r = «il bug è un errore numerico». Le ipotesi sono p ∨ q, r e r → ¬q (il modulo 81 non ha errori numerici, quindi se il bug è numerico non è nel 81). Da r → ¬q e r, per il modus ponens si ricava ¬q. Da p ∨ q e ¬q, per il sillogismo disgiuntivo, si ricava p: il bug è nel modulo 17. L'argomento è valido.</w:t>
+      </w:r>
+    </w:p>
+    <w:p>
+      <w:r>
+        <w:rPr>
+          <w:b/>
+        </w:rPr>
+        <w:t>La squadra.</w:t>
+      </w:r>
+      <w:r>
+        <w:rPr/>
+        <w:t xml:space="preserve"> Sono date le ipotesi: se la squadra prende un buon difensore, può battere la prima avversaria; se può battere la prima, può battere la seconda; se può battere la prima, può battere la terza; la squadra prende un buon difensore. Si vuole mostrare che ne segue che la squadra può battere la seconda e la terza. Con p = «prende un buon difensore», q = «batte la prima», r = «batte la seconda» e s = «batte la terza», le ipotesi sono p → q, q → r, q → s e p.</w:t>
+      </w:r>
+    </w:p>
+    <w:p>
+      <w:r>
+        <w:rPr/>
+        <w:t>1. Da p → q e q → r, per il sillogismo ipotetico, p → r.</w:t>
+      </w:r>
+    </w:p>
+    <w:p>
+      <w:r>
+        <w:rPr/>
+        <w:t>2. Da p → r e p, per il modus ponens, r.</w:t>
+      </w:r>
+    </w:p>
+    <w:p>
+      <w:r>
+        <w:rPr/>
+        <w:t>3. Da p → q e q → s, per il sillogismo ipotetico, p → s.</w:t>
+      </w:r>
+    </w:p>
+    <w:p>
+      <w:r>
+        <w:rPr/>
+        <w:t>4. Da p → s e p, per il modus ponens, s.</w:t>
+      </w:r>
+    </w:p>
+    <w:p>
+      <w:r>
+        <w:rPr/>
+        <w:t>5. Da r e s, per la congiunzione, r ∧ s.</w:t>
+      </w:r>
+    </w:p>
+    <w:p>
+      <w:r>
+        <w:rPr/>
+        <w:t>Poiché r ∧ s dice che la squadra batte la seconda e la terza, la conclusione segue dalle ipotesi.</w:t>
+      </w:r>
+    </w:p>
+    <w:p>
+      <w:pPr>
+        <w:pStyle w:val="Titolo2"/>
+      </w:pPr>
+      <w:r>
+        <w:rPr>
+          <w:b/>
+          <w:color w:val="E97132"/>
+        </w:rPr>
+        <w:t>Un consiglio pratico</w:t>
+      </w:r>
+    </w:p>
+    <w:p>
+      <w:r>
+        <w:rPr/>
+        <w:t>La validità di un argomento molto breve si può verificare con una tavola di verità, ma, nella pratica, argomenti e dimostrazioni usano le regole di inferenza: le tavole crescono in modo esponenziale con il numero di proposizioni (capitolo 18), mentre una catena di regole resta corta e leggibile.</w:t>
       </w:r>
     </w:p>
     <w:sectPr>

</xml_diff>

<commit_message>
Fondamenti: capitoli 20-23 (logica dei quantificatori) dalla lezione 10 e dal libro 1.5
Co-Authored-By: Claude Sonnet 5.5 <noreply@anthropic.com>
</commit_message>
<xml_diff>
--- a/Riassunto Fondamenti Informatica.docx
+++ b/Riassunto Fondamenti Informatica.docx
@@ -13033,12 +13033,21 @@
     <w:p>
       <w:pPr>
         <w:pStyle w:val="Titolo1"/>
-      </w:pPr>
-      <w:r>
         <w:rPr>
           <w:b/>
           <w:color w:val="EE0000"/>
         </w:rPr>
+      </w:pPr>
+    </w:p>
+    <w:p>
+      <w:pPr>
+        <w:pStyle w:val="Titolo1"/>
+      </w:pPr>
+      <w:r>
+        <w:rPr>
+          <w:b/>
+          <w:color w:val="EE0000"/>
+        </w:rPr>
         <w:t>19. Argomenti e Regole di Inferenza</w:t>
       </w:r>
     </w:p>
@@ -13056,80 +13065,107 @@
     </w:p>
     <w:p>
       <w:r>
-        <w:rPr/>
         <w:t>Si parte da un esempio. Supponiamo di sapere tre cose: il bug è nel modulo 17 oppure nel modulo 81; il bug è un errore numerico; il modulo 81 non contiene errori numerici. Assumendo che queste affermazioni siano vere, è ragionevole concludere che il bug è nel modulo 17.</w:t>
       </w:r>
     </w:p>
     <w:p>
       <w:r>
-        <w:rPr/>
+        <w:rPr>
+          <w:highlight w:val="yellow"/>
+        </w:rPr>
         <w:t xml:space="preserve">Questo processo, in cui da una sequenza di proposizioni si trae una conclusione, si chiama </w:t>
       </w:r>
       <w:r>
         <w:rPr>
           <w:b/>
+          <w:highlight w:val="yellow"/>
         </w:rPr>
         <w:t>ragionamento deduttivo</w:t>
       </w:r>
       <w:r>
-        <w:rPr/>
-        <w:t xml:space="preserve">. Le proposizioni di partenza si chiamano </w:t>
-      </w:r>
-      <w:r>
-        <w:rPr>
-          <w:b/>
+        <w:t xml:space="preserve">. Le </w:t>
+      </w:r>
+      <w:r>
+        <w:rPr>
+          <w:highlight w:val="yellow"/>
+        </w:rPr>
+        <w:t xml:space="preserve">proposizioni di partenza </w:t>
+      </w:r>
+      <w:r>
+        <w:t xml:space="preserve">si chiamano </w:t>
+      </w:r>
+      <w:r>
+        <w:rPr>
+          <w:b/>
+          <w:highlight w:val="yellow"/>
         </w:rPr>
         <w:t>ipotesi</w:t>
       </w:r>
       <w:r>
-        <w:rPr/>
         <w:t xml:space="preserve"> (o </w:t>
       </w:r>
       <w:r>
         <w:rPr>
           <w:b/>
+          <w:highlight w:val="yellow"/>
         </w:rPr>
         <w:t>premesse</w:t>
       </w:r>
       <w:r>
-        <w:rPr/>
-        <w:t xml:space="preserve">), la proposizione che ne segue si chiama </w:t>
-      </w:r>
-      <w:r>
-        <w:rPr>
-          <w:b/>
+        <w:t xml:space="preserve">), la </w:t>
+      </w:r>
+      <w:r>
+        <w:rPr>
+          <w:highlight w:val="yellow"/>
+        </w:rPr>
+        <w:t xml:space="preserve">proposizione che ne segue si chiama </w:t>
+      </w:r>
+      <w:r>
+        <w:rPr>
+          <w:b/>
+          <w:highlight w:val="yellow"/>
         </w:rPr>
         <w:t>conclusione</w:t>
       </w:r>
       <w:r>
-        <w:rPr/>
         <w:t xml:space="preserve">, e l'insieme di ipotesi più conclusione è un </w:t>
       </w:r>
       <w:r>
         <w:rPr>
           <w:b/>
+          <w:highlight w:val="yellow"/>
         </w:rPr>
         <w:t>argomento</w:t>
       </w:r>
       <w:r>
-        <w:rPr/>
         <w:t xml:space="preserve"> (deduttivo). Molte dimostrazioni di matematica e di informatica sono argomenti deduttivi.</w:t>
       </w:r>
     </w:p>
     <w:p>
       <w:r>
-        <w:rPr/>
-        <w:t>Un argomento ha sempre la stessa forma: «se p₁ e p₂ e … e p</w:t>
-      </w:r>
-      <w:r>
-        <w:rPr>
+        <w:t>Un argomento ha sempre la stessa forma: «</w:t>
+      </w:r>
+      <w:r>
+        <w:rPr>
+          <w:highlight w:val="yellow"/>
+        </w:rPr>
+        <w:t>se p₁ e p₂ e … e p</w:t>
+      </w:r>
+      <w:r>
+        <w:rPr>
+          <w:highlight w:val="yellow"/>
           <w:vertAlign w:val="subscript"/>
         </w:rPr>
         <w:t>n</w:t>
       </w:r>
       <w:r>
-        <w:rPr/>
-        <w:t>, allora q». È la forma di un'implicazione, e questo collegamento con i capitoli 16-18 è la chiave per capire quando un argomento «funziona».</w:t>
+        <w:rPr>
+          <w:highlight w:val="yellow"/>
+        </w:rPr>
+        <w:t>, allora q</w:t>
+      </w:r>
+      <w:r>
+        <w:t>». È la forma di un'implicazione, e questo collegamento con i capitoli 16-18 è la chiave per capire quando un argomento «funziona».</w:t>
       </w:r>
     </w:p>
     <w:p>
@@ -13152,47 +13188,92 @@
         <w:t>Definizione.</w:t>
       </w:r>
       <w:r>
-        <w:rPr/>
-        <w:t xml:space="preserve"> Un </w:t>
-      </w:r>
-      <w:r>
-        <w:rPr>
-          <w:b/>
+        <w:t xml:space="preserve"> U</w:t>
+      </w:r>
+      <w:r>
+        <w:rPr>
+          <w:highlight w:val="yellow"/>
+        </w:rPr>
+        <w:t xml:space="preserve">n </w:t>
+      </w:r>
+      <w:r>
+        <w:rPr>
+          <w:b/>
+          <w:highlight w:val="yellow"/>
         </w:rPr>
         <w:t>argomento</w:t>
       </w:r>
       <w:r>
-        <w:rPr/>
+        <w:rPr>
+          <w:highlight w:val="yellow"/>
+        </w:rPr>
         <w:t xml:space="preserve"> è una successione di proposizioni p₁, p₂, …, p</w:t>
       </w:r>
       <w:r>
         <w:rPr>
+          <w:highlight w:val="yellow"/>
           <w:vertAlign w:val="subscript"/>
         </w:rPr>
         <w:t>n</w:t>
       </w:r>
       <w:r>
-        <w:rPr/>
-        <w:t xml:space="preserve"> (le ipotesi) seguita da una proposizione q (la conclusione), che si scrive con le ipotesi una sotto l'altra e la conclusione sotto una riga, preceduta dal simbolo ∴ («quindi»), oppure in una riga sola come p₁, p₂, …, p</w:t>
-      </w:r>
-      <w:r>
-        <w:rPr>
+        <w:rPr>
+          <w:highlight w:val="yellow"/>
+        </w:rPr>
+        <w:t xml:space="preserve"> (le ipotesi) seguita da una proposizione q (la conclusione)</w:t>
+      </w:r>
+      <w:r>
+        <w:t xml:space="preserve">, che si scrive con le ipotesi una sotto l'altra e la conclusione sotto una </w:t>
+      </w:r>
+      <w:r>
+        <w:lastRenderedPageBreak/>
+        <w:t xml:space="preserve">riga, preceduta dal simbolo </w:t>
+      </w:r>
+      <w:r>
+        <w:rPr>
+          <w:highlight w:val="yellow"/>
+        </w:rPr>
+        <w:t>∴ («quindi»),</w:t>
+      </w:r>
+      <w:r>
+        <w:t xml:space="preserve"> oppure in una riga sola come </w:t>
+      </w:r>
+      <w:r>
+        <w:rPr>
+          <w:highlight w:val="yellow"/>
+        </w:rPr>
+        <w:t>p₁, p₂, …, p</w:t>
+      </w:r>
+      <w:r>
+        <w:rPr>
+          <w:highlight w:val="yellow"/>
           <w:vertAlign w:val="subscript"/>
         </w:rPr>
         <w:t>n</w:t>
       </w:r>
       <w:r>
-        <w:rPr/>
-        <w:t xml:space="preserve"> / ∴ q. L'argomento si dice </w:t>
-      </w:r>
-      <w:r>
-        <w:rPr>
-          <w:b/>
+        <w:rPr>
+          <w:highlight w:val="yellow"/>
+        </w:rPr>
+        <w:t xml:space="preserve"> / ∴ q</w:t>
+      </w:r>
+      <w:r>
+        <w:t xml:space="preserve">. </w:t>
+      </w:r>
+      <w:r>
+        <w:rPr>
+          <w:highlight w:val="yellow"/>
+        </w:rPr>
+        <w:t xml:space="preserve">L'argomento si dice </w:t>
+      </w:r>
+      <w:r>
+        <w:rPr>
+          <w:b/>
+          <w:highlight w:val="yellow"/>
         </w:rPr>
         <w:t>valido</w:t>
       </w:r>
       <w:r>
-        <w:rPr/>
         <w:t xml:space="preserve"> se, ogni volta che p₁ e p₂ e … e p</w:t>
       </w:r>
       <w:r>
@@ -13202,60 +13283,108 @@
         <w:t>n</w:t>
       </w:r>
       <w:r>
-        <w:rPr/>
-        <w:t xml:space="preserve"> sono tutte vere, anche q è vera; altrimenti si dice </w:t>
-      </w:r>
-      <w:r>
-        <w:rPr>
-          <w:b/>
+        <w:t xml:space="preserve"> </w:t>
+      </w:r>
+      <w:r>
+        <w:rPr>
+          <w:highlight w:val="yellow"/>
+        </w:rPr>
+        <w:t>sono tutte vere</w:t>
+      </w:r>
+      <w:r>
+        <w:t xml:space="preserve">, </w:t>
+      </w:r>
+      <w:r>
+        <w:rPr>
+          <w:highlight w:val="yellow"/>
+        </w:rPr>
+        <w:t xml:space="preserve">anche q è vera; altrimenti si dice </w:t>
+      </w:r>
+      <w:r>
+        <w:rPr>
+          <w:b/>
+          <w:highlight w:val="yellow"/>
         </w:rPr>
         <w:t>non valido</w:t>
       </w:r>
       <w:r>
-        <w:rPr/>
         <w:t xml:space="preserve"> (o una </w:t>
       </w:r>
       <w:r>
         <w:rPr>
           <w:b/>
+          <w:highlight w:val="yellow"/>
         </w:rPr>
         <w:t>fallacia</w:t>
       </w:r>
       <w:r>
-        <w:rPr/>
         <w:t>).</w:t>
       </w:r>
     </w:p>
     <w:p>
       <w:r>
-        <w:rPr/>
-        <w:t xml:space="preserve">In un argomento valido si dice che la conclusione segue dalle ipotesi, ma bisogna capirsi su che cosa si afferma: </w:t>
-      </w:r>
-      <w:r>
-        <w:rPr>
-          <w:b/>
+        <w:rPr>
+          <w:highlight w:val="yellow"/>
+        </w:rPr>
+        <w:t>In un argomento valido si dice che la conclusione segue dalle ipotesi</w:t>
+      </w:r>
+      <w:r>
+        <w:t xml:space="preserve">, ma bisogna capirsi su che cosa si afferma: </w:t>
+      </w:r>
+      <w:r>
+        <w:rPr>
+          <w:b/>
+          <w:highlight w:val="yellow"/>
         </w:rPr>
         <w:t>non</w:t>
       </w:r>
       <w:r>
-        <w:rPr/>
-        <w:t xml:space="preserve"> si dice che la conclusione è vera, ma solo che se si accettano le ipotesi si deve accettare anche la conclusione. Un argomento è valido per la sua </w:t>
-      </w:r>
-      <w:r>
-        <w:rPr>
-          <w:b/>
+        <w:rPr>
+          <w:highlight w:val="yellow"/>
+        </w:rPr>
+        <w:t xml:space="preserve"> si dice che la conclusione è vera, ma solo che se si accettano le ipotesi si deve accettare anche la conclusione</w:t>
+      </w:r>
+      <w:r>
+        <w:t xml:space="preserve">. Un argomento è </w:t>
+      </w:r>
+      <w:r>
+        <w:rPr>
+          <w:highlight w:val="yellow"/>
+        </w:rPr>
+        <w:t>valido per</w:t>
+      </w:r>
+      <w:r>
+        <w:t xml:space="preserve"> la sua </w:t>
+      </w:r>
+      <w:r>
+        <w:rPr>
+          <w:b/>
+          <w:highlight w:val="yellow"/>
         </w:rPr>
         <w:t>forma</w:t>
       </w:r>
       <w:r>
-        <w:rPr/>
-        <w:t xml:space="preserve"> e non per il suo contenuto: due argomenti con la stessa forma sono entrambi validi o entrambi non validi, anche se parlano di cose completamente diverse.</w:t>
-      </w:r>
-    </w:p>
-    <w:p>
-      <w:r>
-        <w:rPr/>
-        <w:t>In termini dei capitoli precedenti, dire che l'argomento è valido equivale a dire che l'implicazione (p₁ ∧ p₂ ∧ … ∧ p</w:t>
+        <w:rPr>
+          <w:highlight w:val="yellow"/>
+        </w:rPr>
+        <w:t xml:space="preserve"> e non per il suo contenuto</w:t>
+      </w:r>
+      <w:r>
+        <w:t>: due argomenti con la stessa forma sono entrambi validi o entrambi non validi, anche se parlano di cose completamente diverse.</w:t>
+      </w:r>
+    </w:p>
+    <w:p>
+      <w:r>
+        <w:t xml:space="preserve">In termini dei capitoli precedenti, </w:t>
+      </w:r>
+      <w:r>
+        <w:rPr>
+          <w:highlight w:val="yellow"/>
+        </w:rPr>
+        <w:t>dire che l'argomento è valido equivale a dire che l'implicazione</w:t>
+      </w:r>
+      <w:r>
+        <w:t xml:space="preserve"> (p₁ ∧ p₂ ∧ … ∧ p</w:t>
       </w:r>
       <w:r>
         <w:rPr>
@@ -13264,24 +13393,52 @@
         <w:t>n</w:t>
       </w:r>
       <w:r>
-        <w:rPr/>
-        <w:t>) → q non è mai falsa: ipotesi tutte vere e conclusione falsa è l'unico caso che la renderebbe falsa.</w:t>
-      </w:r>
-    </w:p>
-    <w:p>
-      <w:r>
-        <w:rPr/>
-        <w:t xml:space="preserve">Un argomento più lungo si costruisce a passi, e ciascun passo deve produrre una conclusione intermedia valida. Le </w:t>
-      </w:r>
-      <w:r>
-        <w:rPr>
-          <w:b/>
+        <w:t xml:space="preserve">) → q </w:t>
+      </w:r>
+      <w:r>
+        <w:rPr>
+          <w:highlight w:val="yellow"/>
+        </w:rPr>
+        <w:t>non è mai falsa</w:t>
+      </w:r>
+      <w:r>
+        <w:t>: ipotesi tutte vere e conclusione falsa è l'unico caso che la renderebbe falsa.</w:t>
+      </w:r>
+    </w:p>
+    <w:p>
+      <w:r>
+        <w:t xml:space="preserve">Un argomento più lungo si costruisce a passi, e ciascun passo deve produrre una conclusione intermedia valida. </w:t>
+      </w:r>
+      <w:r>
+        <w:rPr>
+          <w:highlight w:val="yellow"/>
+        </w:rPr>
+        <w:t xml:space="preserve">Le </w:t>
+      </w:r>
+      <w:r>
+        <w:rPr>
+          <w:b/>
+          <w:highlight w:val="yellow"/>
         </w:rPr>
         <w:t>regole di inferenza</w:t>
       </w:r>
       <w:r>
-        <w:rPr/>
-        <w:t xml:space="preserve"> sono, in breve, argomenti validi già noti, che si usano come mattoni all'interno di un argomento più grande.</w:t>
+        <w:rPr>
+          <w:highlight w:val="yellow"/>
+        </w:rPr>
+        <w:t xml:space="preserve"> sono</w:t>
+      </w:r>
+      <w:r>
+        <w:t xml:space="preserve">, in breve, </w:t>
+      </w:r>
+      <w:r>
+        <w:rPr>
+          <w:highlight w:val="yellow"/>
+        </w:rPr>
+        <w:t>argomenti validi già noti, che si usano come mattoni all'interno di un argomento più grande</w:t>
+      </w:r>
+      <w:r>
+        <w:t>.</w:t>
       </w:r>
     </w:p>
     <w:p>
@@ -13298,7 +13455,6 @@
     </w:p>
     <w:p>
       <w:r>
-        <w:rPr/>
         <w:t xml:space="preserve">Il primo metodo è la </w:t>
       </w:r>
       <w:r>
@@ -13308,7 +13464,6 @@
         <w:t>tavola di verità</w:t>
       </w:r>
       <w:r>
-        <w:rPr/>
         <w:t xml:space="preserve">: si scrivono i valori di tutte le proposizioni coinvolte e si controlla che in ogni riga in cui le ipotesi sono vere lo sia anche la conclusione. Il secondo metodo è un </w:t>
       </w:r>
       <w:r>
@@ -13318,13 +13473,11 @@
         <w:t>ragionamento diretto</w:t>
       </w:r>
       <w:r>
-        <w:rPr/>
         <w:t>, che evita la tavola: si suppone che le ipotesi siano vere e si verifica che la conclusione non può essere falsa.</w:t>
       </w:r>
     </w:p>
     <w:p>
       <w:r>
-        <w:rPr/>
         <w:t>Esempio. Si vuole stabilire se è valido l'argomento p → q, p / ∴ q.</w:t>
       </w:r>
     </w:p>
@@ -13334,22 +13487,26 @@
         <w:jc w:val="center"/>
       </w:pPr>
       <w:r>
+        <w:rPr>
+          <w:noProof/>
+        </w:rPr>
         <w:drawing>
-          <wp:inline xmlns:a="http://schemas.openxmlformats.org/drawingml/2006/main" xmlns:pic="http://schemas.openxmlformats.org/drawingml/2006/picture">
+          <wp:inline distT="0" distB="0" distL="0" distR="0" wp14:anchorId="1FFADC8A" wp14:editId="75EB6595">
             <wp:extent cx="5220000" cy="1744244"/>
+            <wp:effectExtent l="0" t="0" r="0" b="0"/>
             <wp:docPr id="2073952351" name="Picture 2073952351"/>
             <wp:cNvGraphicFramePr>
-              <a:graphicFrameLocks noChangeAspect="1"/>
+              <a:graphicFrameLocks xmlns:a="http://schemas.openxmlformats.org/drawingml/2006/main" noChangeAspect="1"/>
             </wp:cNvGraphicFramePr>
-            <a:graphic>
+            <a:graphic xmlns:a="http://schemas.openxmlformats.org/drawingml/2006/main">
               <a:graphicData uri="http://schemas.openxmlformats.org/drawingml/2006/picture">
-                <pic:pic>
+                <pic:pic xmlns:pic="http://schemas.openxmlformats.org/drawingml/2006/picture">
                   <pic:nvPicPr>
                     <pic:cNvPr id="0" name="logica_argomenti_tavole.png"/>
                     <pic:cNvPicPr/>
                   </pic:nvPicPr>
                   <pic:blipFill>
-                    <a:blip r:embed="rId28"/>
+                    <a:blip r:embed="rId26"/>
                     <a:stretch>
                       <a:fillRect/>
                     </a:stretch>
@@ -13359,7 +13516,9 @@
                       <a:off x="0" y="0"/>
                       <a:ext cx="5220000" cy="1744244"/>
                     </a:xfrm>
-                    <a:prstGeom prst="rect"/>
+                    <a:prstGeom prst="rect">
+                      <a:avLst/>
+                    </a:prstGeom>
                   </pic:spPr>
                 </pic:pic>
               </a:graphicData>
@@ -13382,7 +13541,6 @@
     </w:p>
     <w:p>
       <w:r>
-        <w:rPr/>
         <w:t xml:space="preserve">Con la tavola (a sinistra nella figura) si osserva che ogni volta che p → q e p sono entrambe vere, lo è anche q: l'argomento è valido. Con il ragionamento diretto: si suppone che p → q e p siano vere; allora q deve essere vera, perché altrimenti p → q sarebbe falsa (ipotesi vera e tesi falsa). Questo argomento è usato continuamente e si chiama </w:t>
       </w:r>
       <w:r>
@@ -13392,7 +13550,6 @@
         <w:t>modus ponens</w:t>
       </w:r>
       <w:r>
-        <w:rPr/>
         <w:t xml:space="preserve"> o </w:t>
       </w:r>
       <w:r>
@@ -13402,7 +13559,6 @@
         <w:t>legge del distacco</w:t>
       </w:r>
       <w:r>
-        <w:rPr/>
         <w:t>.</w:t>
       </w:r>
     </w:p>
@@ -13420,7 +13576,6 @@
     </w:p>
     <w:p>
       <w:r>
-        <w:rPr/>
         <w:t>Esistono diverse regole utili, ognuna verificabile con una tavola di verità; le principali sono nella figura.</w:t>
       </w:r>
     </w:p>
@@ -13430,22 +13585,27 @@
         <w:jc w:val="center"/>
       </w:pPr>
       <w:r>
+        <w:rPr>
+          <w:noProof/>
+        </w:rPr>
+        <w:lastRenderedPageBreak/>
         <w:drawing>
-          <wp:inline xmlns:a="http://schemas.openxmlformats.org/drawingml/2006/main" xmlns:pic="http://schemas.openxmlformats.org/drawingml/2006/picture">
+          <wp:inline distT="0" distB="0" distL="0" distR="0" wp14:anchorId="62A501F5" wp14:editId="6F490585">
             <wp:extent cx="4680000" cy="2933368"/>
+            <wp:effectExtent l="0" t="0" r="0" b="0"/>
             <wp:docPr id="2073952352" name="Picture 2073952352"/>
             <wp:cNvGraphicFramePr>
-              <a:graphicFrameLocks noChangeAspect="1"/>
+              <a:graphicFrameLocks xmlns:a="http://schemas.openxmlformats.org/drawingml/2006/main" noChangeAspect="1"/>
             </wp:cNvGraphicFramePr>
-            <a:graphic>
+            <a:graphic xmlns:a="http://schemas.openxmlformats.org/drawingml/2006/main">
               <a:graphicData uri="http://schemas.openxmlformats.org/drawingml/2006/picture">
-                <pic:pic>
+                <pic:pic xmlns:pic="http://schemas.openxmlformats.org/drawingml/2006/picture">
                   <pic:nvPicPr>
                     <pic:cNvPr id="0" name="logica_regole_inferenza.png"/>
                     <pic:cNvPicPr/>
                   </pic:nvPicPr>
                   <pic:blipFill>
-                    <a:blip r:embed="rId29"/>
+                    <a:blip r:embed="rId27"/>
                     <a:stretch>
                       <a:fillRect/>
                     </a:stretch>
@@ -13455,6 +13615,744 @@
                       <a:off x="0" y="0"/>
                       <a:ext cx="4680000" cy="2933368"/>
                     </a:xfrm>
+                    <a:prstGeom prst="rect">
+                      <a:avLst/>
+                    </a:prstGeom>
+                  </pic:spPr>
+                </pic:pic>
+              </a:graphicData>
+            </a:graphic>
+          </wp:inline>
+        </w:drawing>
+      </w:r>
+    </w:p>
+    <w:p>
+      <w:pPr>
+        <w:jc w:val="center"/>
+      </w:pPr>
+      <w:r>
+        <w:rPr>
+          <w:i/>
+          <w:sz w:val="18"/>
+        </w:rPr>
+        <w:t>Le regole di inferenza per le proposizioni: premesse sopra la riga, conclusione sotto.</w:t>
+      </w:r>
+    </w:p>
+    <w:p>
+      <w:pPr>
+        <w:numPr>
+          <w:ilvl w:val="0"/>
+          <w:numId w:val="1"/>
+        </w:numPr>
+      </w:pPr>
+      <w:r>
+        <w:rPr>
+          <w:b/>
+        </w:rPr>
+        <w:t>Modus ponens</w:t>
+      </w:r>
+      <w:r>
+        <w:t>: da p → q e p si ricava q.</w:t>
+      </w:r>
+    </w:p>
+    <w:p>
+      <w:pPr>
+        <w:numPr>
+          <w:ilvl w:val="0"/>
+          <w:numId w:val="1"/>
+        </w:numPr>
+      </w:pPr>
+      <w:r>
+        <w:rPr>
+          <w:b/>
+        </w:rPr>
+        <w:t>Modus tollens</w:t>
+      </w:r>
+      <w:r>
+        <w:t>: da p → q e ¬q si ricava ¬p.</w:t>
+      </w:r>
+    </w:p>
+    <w:p>
+      <w:pPr>
+        <w:numPr>
+          <w:ilvl w:val="0"/>
+          <w:numId w:val="1"/>
+        </w:numPr>
+      </w:pPr>
+      <w:r>
+        <w:rPr>
+          <w:b/>
+        </w:rPr>
+        <w:t>Addizione</w:t>
+      </w:r>
+      <w:r>
+        <w:t>: da p si ricava p ∨ q.</w:t>
+      </w:r>
+    </w:p>
+    <w:p>
+      <w:pPr>
+        <w:numPr>
+          <w:ilvl w:val="0"/>
+          <w:numId w:val="1"/>
+        </w:numPr>
+      </w:pPr>
+      <w:r>
+        <w:rPr>
+          <w:b/>
+        </w:rPr>
+        <w:t>Semplificazione</w:t>
+      </w:r>
+      <w:r>
+        <w:t>: da p ∧ q si ricava p.</w:t>
+      </w:r>
+    </w:p>
+    <w:p>
+      <w:pPr>
+        <w:numPr>
+          <w:ilvl w:val="0"/>
+          <w:numId w:val="1"/>
+        </w:numPr>
+      </w:pPr>
+      <w:r>
+        <w:rPr>
+          <w:b/>
+        </w:rPr>
+        <w:t>Congiunzione</w:t>
+      </w:r>
+      <w:r>
+        <w:t>: da p e da q si ricava p ∧ q.</w:t>
+      </w:r>
+    </w:p>
+    <w:p>
+      <w:pPr>
+        <w:numPr>
+          <w:ilvl w:val="0"/>
+          <w:numId w:val="1"/>
+        </w:numPr>
+      </w:pPr>
+      <w:r>
+        <w:rPr>
+          <w:b/>
+        </w:rPr>
+        <w:t>Sillogismo ipotetico</w:t>
+      </w:r>
+      <w:r>
+        <w:t>: da p → q e q → r si ricava p → r.</w:t>
+      </w:r>
+    </w:p>
+    <w:p>
+      <w:pPr>
+        <w:numPr>
+          <w:ilvl w:val="0"/>
+          <w:numId w:val="1"/>
+        </w:numPr>
+      </w:pPr>
+      <w:r>
+        <w:rPr>
+          <w:b/>
+        </w:rPr>
+        <w:t>Sillogismo disgiuntivo</w:t>
+      </w:r>
+      <w:r>
+        <w:t>: da p ∨ q e ¬p si ricava q.</w:t>
+      </w:r>
+    </w:p>
+    <w:p>
+      <w:r>
+        <w:t xml:space="preserve">Per riconoscere la regola in un argomento scritto a parole bisogna prima tradurlo in simboli, come nell'esempio seguente. «Se il computer ha un gigabyte di memoria, allora può eseguire il programma. Se può eseguire il programma, allora la grafica sarà d'effetto. Quindi, se il computer ha un gigabyte di memoria, la grafica sarà d'effetto.» Con p = «il computer ha un gigabyte di memoria», q = «può eseguire il programma» e r = «la grafica sarà d'effetto», l'argomento è p → q, q → r / ∴ p → r: la regola usata è il </w:t>
+      </w:r>
+      <w:r>
+        <w:rPr>
+          <w:b/>
+        </w:rPr>
+        <w:t>sillogismo ipotetico</w:t>
+      </w:r>
+      <w:r>
+        <w:t>.</w:t>
+      </w:r>
+    </w:p>
+    <w:p>
+      <w:pPr>
+        <w:pStyle w:val="Titolo2"/>
+      </w:pPr>
+      <w:r>
+        <w:rPr>
+          <w:b/>
+          <w:color w:val="E97132"/>
+        </w:rPr>
+        <w:t>Una fallacia frequente: affermare la conclusione</w:t>
+      </w:r>
+    </w:p>
+    <w:p>
+      <w:r>
+        <w:t>Non tutti gli argomenti che «sembrano» validi lo sono. Si consideri: «Se 2 = 3, allora ho mangiato il cappello. Ho mangiato il cappello. Quindi 2 = 3.» Con p = «2 = 3» e q = «ho mangiato il cappello», l'argomento è p → q, q / ∴ p.</w:t>
+      </w:r>
+    </w:p>
+    <w:p>
+      <w:r>
+        <w:t xml:space="preserve">Se fosse valido, ogni volta che p → q e q sono vere dovrebbe esserlo anche p. Ma questo non succede: con p falsa e q vera, l'implicazione p → q è vera per difetto (ipotesi falsa), q è vera, e la conclusione p è falsa. L'argomento </w:t>
+      </w:r>
+      <w:r>
+        <w:rPr>
+          <w:b/>
+        </w:rPr>
+        <w:t>non è valido</w:t>
+      </w:r>
+      <w:r>
+        <w:t xml:space="preserve">. Questa fallacia si chiama </w:t>
+      </w:r>
+      <w:r>
+        <w:rPr>
+          <w:b/>
+        </w:rPr>
+        <w:t>affermazione della conclusione</w:t>
+      </w:r>
+      <w:r>
+        <w:t xml:space="preserve"> (in inglese *fallacy of affirming the conclusion*): è lo stesso errore, già visto nel capitolo 17, di scambiare un'implicazione con la sua conversa. Si arriva alla stessa conclusione guardando la tavola (a destra nella figura): nella terza riga le ipotesi sono vere e la conclusione è falsa.</w:t>
+      </w:r>
+    </w:p>
+    <w:p>
+      <w:pPr>
+        <w:pStyle w:val="Titolo2"/>
+      </w:pPr>
+      <w:r>
+        <w:rPr>
+          <w:b/>
+          <w:color w:val="E97132"/>
+        </w:rPr>
+        <w:lastRenderedPageBreak/>
+        <w:t>Argomenti in più passaggi</w:t>
+      </w:r>
+    </w:p>
+    <w:p>
+      <w:r>
+        <w:t>Quando un argomento non coincide con una sola regola, si procede a passi, applicando una regola alla volta e usando le conclusioni intermedie come nuove ipotesi.</w:t>
+      </w:r>
+    </w:p>
+    <w:p>
+      <w:r>
+        <w:rPr>
+          <w:b/>
+        </w:rPr>
+        <w:t>Il bug nei moduli.</w:t>
+      </w:r>
+      <w:r>
+        <w:t xml:space="preserve"> Si ripete l'argomento d'apertura con p = «il bug è nel modulo 17», q = «il bug è nel modulo 81» e r = «il bug è un errore numerico». Le ipotesi sono p ∨ q, r e r → ¬q (il modulo 81 non ha errori numerici, quindi se il bug è numerico non è nel 81). Da r → ¬q e r, per il modus ponens si ricava ¬q. Da p ∨ q e ¬q, per il sillogismo disgiuntivo, si ricava p: il bug è nel modulo 17. L'argomento è valido.</w:t>
+      </w:r>
+    </w:p>
+    <w:p>
+      <w:r>
+        <w:rPr>
+          <w:b/>
+        </w:rPr>
+        <w:t>La squadra.</w:t>
+      </w:r>
+      <w:r>
+        <w:t xml:space="preserve"> Sono date le ipotesi: se la squadra prende un buon difensore, può battere la prima avversaria; se può battere la prima, può battere la seconda; se può battere la prima, può battere la terza; la squadra prende un buon difensore. Si vuole mostrare che ne segue che la squadra può battere la seconda e la terza. Con p = «prende un buon difensore», q = «batte la prima», r = «batte la seconda» e s = «batte la terza», le ipotesi sono p → q, q → r, q → s e p.</w:t>
+      </w:r>
+    </w:p>
+    <w:p>
+      <w:r>
+        <w:t>1. Da p → q e q → r, per il sillogismo ipotetico, p → r.</w:t>
+      </w:r>
+    </w:p>
+    <w:p>
+      <w:r>
+        <w:t>2. Da p → r e p, per il modus ponens, r.</w:t>
+      </w:r>
+    </w:p>
+    <w:p>
+      <w:r>
+        <w:t>3. Da p → q e q → s, per il sillogismo ipotetico, p → s.</w:t>
+      </w:r>
+    </w:p>
+    <w:p>
+      <w:r>
+        <w:t>4. Da p → s e p, per il modus ponens, s.</w:t>
+      </w:r>
+    </w:p>
+    <w:p>
+      <w:r>
+        <w:t>5. Da r e s, per la congiunzione, r ∧ s.</w:t>
+      </w:r>
+    </w:p>
+    <w:p>
+      <w:r>
+        <w:t>Poiché r ∧ s dice che la squadra batte la seconda e la terza, la conclusione segue dalle ipotesi.</w:t>
+      </w:r>
+    </w:p>
+    <w:p>
+      <w:pPr>
+        <w:pStyle w:val="Titolo2"/>
+      </w:pPr>
+      <w:r>
+        <w:rPr>
+          <w:b/>
+          <w:color w:val="E97132"/>
+        </w:rPr>
+        <w:t>Un consiglio pratico</w:t>
+      </w:r>
+    </w:p>
+    <w:p>
+      <w:r>
+        <w:t>La validità di un argomento molto breve si può verificare con una tavola di verità, ma, nella pratica, argomenti e dimostrazioni usano le regole di inferenza: le tavole crescono in modo esponenziale con il numero di proposizioni (capitolo 18), mentre una catena di regole resta corta e leggibile.</w:t>
+      </w:r>
+    </w:p>
+    <w:p>
+      <w:pPr>
+        <w:pStyle w:val="Titolo1"/>
+      </w:pPr>
+      <w:r>
+        <w:rPr>
+          <w:b/>
+          <w:color w:val="EE0000"/>
+        </w:rPr>
+        <w:t>20. Predicati, Dominio del Discorso e Variabili</w:t>
+      </w:r>
+    </w:p>
+    <w:p>
+      <w:pPr>
+        <w:pStyle w:val="Titolo2"/>
+      </w:pPr>
+      <w:r>
+        <w:rPr>
+          <w:b/>
+          <w:color w:val="E97132"/>
+        </w:rPr>
+        <w:t>Perché non basta la logica proposizionale</w:t>
+      </w:r>
+    </w:p>
+    <w:p>
+      <w:r>
+        <w:rPr/>
+        <w:t xml:space="preserve">Dopo la logica proposizionale (capitoli 12-19) si passa alla </w:t>
+      </w:r>
+      <w:r>
+        <w:rPr>
+          <w:b/>
+        </w:rPr>
+        <w:t>logica dei quantificatori</w:t>
+      </w:r>
+      <w:r>
+        <w:rPr/>
+        <w:t xml:space="preserve">. Come sottolineato a lezione, la si tratta con più dettaglio di quanto facciano i corsi di matematica, ma per un motivo diverso: lo scopo è preparare alla possibilità di </w:t>
+      </w:r>
+      <w:r>
+        <w:rPr>
+          <w:b/>
+        </w:rPr>
+        <w:t>meccanizzare il ragionamento</w:t>
+      </w:r>
+      <w:r>
+        <w:rPr/>
+        <w:t>, cioè insegnare a un computer a controllare una dimostrazione e a cercare delle verità. Per questo bisogna conoscere con precisione le definizioni di connettivo, di quantificatore e le regole di inferenza, più di quanto servirebbe per capire una dimostrazione di matematica; gli esempi di prove che si fanno sono volutamente troppo semplici per un corso di matematica, ma servono a capire che cos'è una prova e come si controlla se è corretta.</w:t>
+      </w:r>
+    </w:p>
+    <w:p>
+      <w:r>
+        <w:rPr/>
+        <w:t>La logica delle sezioni 1.2 e 1.3 non basta a descrivere la maggior parte degli enunciati della matematica e dell'informatica. Si prenda l'affermazione «n è un intero dispari»: non è una proposizione, perché è vera o falsa a seconda del valore di n (è vera per n = 103 e falsa per n = 8). Siccome quasi tutti gli enunciati usano variabili, bisogna estendere la logica per includerle.</w:t>
+      </w:r>
+    </w:p>
+    <w:p>
+      <w:pPr>
+        <w:pStyle w:val="Titolo2"/>
+      </w:pPr>
+      <w:r>
+        <w:rPr>
+          <w:b/>
+          <w:color w:val="E97132"/>
+        </w:rPr>
+        <w:t>Funzione proposizionale (o predicato)</w:t>
+      </w:r>
+    </w:p>
+    <w:p>
+      <w:r>
+        <w:rPr>
+          <w:b/>
+        </w:rPr>
+        <w:t>Definizione.</w:t>
+      </w:r>
+      <w:r>
+        <w:rPr/>
+        <w:t xml:space="preserve"> Sia P(x) un enunciato che contiene la variabile x e sia D un insieme. P si chiama </w:t>
+      </w:r>
+      <w:r>
+        <w:rPr>
+          <w:b/>
+        </w:rPr>
+        <w:t>funzione proposizionale</w:t>
+      </w:r>
+      <w:r>
+        <w:rPr/>
+        <w:t xml:space="preserve"> o </w:t>
+      </w:r>
+      <w:r>
+        <w:rPr>
+          <w:b/>
+        </w:rPr>
+        <w:t>predicato</w:t>
+      </w:r>
+      <w:r>
+        <w:rPr/>
+        <w:t xml:space="preserve"> (rispetto a D) se per ogni x ∈ D l'enunciato P(x) è una proposizione. L'insieme D si chiama </w:t>
+      </w:r>
+      <w:r>
+        <w:rPr>
+          <w:b/>
+        </w:rPr>
+        <w:t>dominio del discorso</w:t>
+      </w:r>
+      <w:r>
+        <w:rPr/>
+        <w:t xml:space="preserve"> di P e specifica i valori ammessi per x.</w:t>
+      </w:r>
+    </w:p>
+    <w:p>
+      <w:r>
+        <w:rPr/>
+        <w:t xml:space="preserve">Un predicato da solo non è né vero né falso: lo diventano le singole proposizioni P(x) quando alla variabile si assegna un valore del dominio. Si può pensare al predicato come a una </w:t>
+      </w:r>
+      <w:r>
+        <w:rPr>
+          <w:b/>
+        </w:rPr>
+        <w:t>famiglia di proposizioni</w:t>
+      </w:r>
+      <w:r>
+        <w:rPr/>
+        <w:t>, una per ogni elemento del dominio: se D = ℤ⁺ (gli interi positivi: ℤ è il nome degli interi, ℤ⁺ è riservato a 1, 2, 3, …) si ottiene la famiglia P(1), P(2), …, e ciascuna è vera o falsa ma non entrambe.</w:t>
+      </w:r>
+    </w:p>
+    <w:p>
+      <w:r>
+        <w:rPr/>
+        <w:t xml:space="preserve">Il dominio serve perché certe sostituzioni non avrebbero senso: «π è un numero dispari» non significa nulla, perché si parla di interi. Un predicato può anche avere </w:t>
+      </w:r>
+      <w:r>
+        <w:rPr>
+          <w:b/>
+        </w:rPr>
+        <w:t>più variabili</w:t>
+      </w:r>
+      <w:r>
+        <w:rPr/>
+        <w:t>, come una funzione può avere più argomenti: il test di uguaglianza tra due stringhe, che si incontra in programmazione, è un predicato a due variabili sull'insieme delle sequenze di caratteri.</w:t>
+      </w:r>
+    </w:p>
+    <w:p>
+      <w:r>
+        <w:rPr>
+          <w:b/>
+        </w:rPr>
+        <w:t>Esempio.</w:t>
+      </w:r>
+      <w:r>
+        <w:rPr/>
+        <w:t xml:space="preserve"> Sia P(n) = «n è un intero dispari», con dominio ℤ⁺. Allora P(1) = «1 è dispari» è vera e P(2) = «2 è dispari» è falsa.</w:t>
+      </w:r>
+    </w:p>
+    <w:p>
+      <w:r>
+        <w:rPr/>
+        <w:t>In programmazione succede lo stesso: l'affermazione x &lt; y non è né vera né falsa finché non si assegnano valori a x e a y; con x = 3 e y = 2 diventa 3 &lt; 2, che è falsa. Come in logica proposizionale, si possono quindi scrivere anche enunciati falsi (come «2 è un numero primo dispari»): servono proprio perché si vuole insegnare a un computer a distinguere tra vero e falso, a dare una garanzia quando un'affermazione è vera o a smentire una convinzione sbagliata.</w:t>
+      </w:r>
+    </w:p>
+    <w:p>
+      <w:r>
+        <w:rPr/>
+        <w:t>Esempi di funzioni proposizionali, con il loro dominio:</w:t>
+      </w:r>
+    </w:p>
+    <w:p>
+      <w:pPr>
+        <w:numPr>
+          <w:ilvl w:val="0"/>
+          <w:numId w:val="1"/>
+        </w:numPr>
+      </w:pPr>
+      <w:r>
+        <w:rPr/>
+        <w:t>n² + 2n è dispari (dominio ℤ⁺);</w:t>
+      </w:r>
+    </w:p>
+    <w:p>
+      <w:pPr>
+        <w:numPr>
+          <w:ilvl w:val="0"/>
+          <w:numId w:val="1"/>
+        </w:numPr>
+      </w:pPr>
+      <w:r>
+        <w:rPr/>
+        <w:t>x² − x − 6 = 0 (dominio ℝ);</w:t>
+      </w:r>
+    </w:p>
+    <w:p>
+      <w:pPr>
+        <w:numPr>
+          <w:ilvl w:val="0"/>
+          <w:numId w:val="1"/>
+        </w:numPr>
+      </w:pPr>
+      <w:r>
+        <w:rPr/>
+        <w:t>«il giocatore ha battuto sopra .300 nel 2015» (dominio: i giocatori di baseball);</w:t>
+      </w:r>
+    </w:p>
+    <w:p>
+      <w:pPr>
+        <w:numPr>
+          <w:ilvl w:val="0"/>
+          <w:numId w:val="1"/>
+        </w:numPr>
+      </w:pPr>
+      <w:r>
+        <w:rPr/>
+        <w:t>«il film ha una valutazione superiore al 20% su Rotten Tomatoes», con la scala da 0% a 100% (dominio: i film valutati dal sito).</w:t>
+      </w:r>
+    </w:p>
+    <w:p>
+      <w:r>
+        <w:rPr/>
+        <w:t>Negli ultimi due la variabile è «giocatore» o «film»: sostituendo un giocatore o un film particolare si ottiene una proposizione (vera con Spectre, che ha il 64%; falsa con Blended, che ha il 14%). Ciò che è un parametro con valore già assegnato, come il 20% o il nome del sito, non è la variabile: cambiando sito o soglia cambia la funzione, ma resta una funzione proposizionale nella sola variabile film.</w:t>
+      </w:r>
+    </w:p>
+    <w:p>
+      <w:r>
+        <w:rPr/>
+        <w:t xml:space="preserve">Un predicato può essere </w:t>
+      </w:r>
+      <w:r>
+        <w:rPr>
+          <w:b/>
+        </w:rPr>
+        <w:t>sempre vero</w:t>
+      </w:r>
+      <w:r>
+        <w:rPr/>
+        <w:t xml:space="preserve">, </w:t>
+      </w:r>
+      <w:r>
+        <w:rPr>
+          <w:b/>
+        </w:rPr>
+        <w:t>sempre falso</w:t>
+      </w:r>
+      <w:r>
+        <w:rPr/>
+        <w:t>, oppure vero in qualche caso e falso in altri. Per x² − x − 6 = 0 su ℝ basta risolvere l'equazione di secondo grado: le radici sono 3 e −2, quindi il predicato è vero solo per x = 3 e x = −2 e falso in tutti gli altri casi (con x = 10 si ha 100 − 10 − 6 = 84).</w:t>
+      </w:r>
+    </w:p>
+    <w:p>
+      <w:pPr>
+        <w:pStyle w:val="Titolo2"/>
+      </w:pPr>
+      <w:r>
+        <w:rPr>
+          <w:b/>
+          <w:color w:val="E97132"/>
+        </w:rPr>
+        <w:t>Variabile libera e variabile legata</w:t>
+      </w:r>
+    </w:p>
+    <w:p>
+      <w:r>
+        <w:rPr/>
+        <w:t xml:space="preserve">Si chiama </w:t>
+      </w:r>
+      <w:r>
+        <w:rPr>
+          <w:b/>
+        </w:rPr>
+        <w:t>variabile libera</w:t>
+      </w:r>
+      <w:r>
+        <w:rPr/>
+        <w:t xml:space="preserve"> una variabile non ancora assegnata (è «libera» di spaziare su tutto il dominio), e </w:t>
+      </w:r>
+      <w:r>
+        <w:rPr>
+          <w:b/>
+        </w:rPr>
+        <w:t>variabile legata</w:t>
+      </w:r>
+      <w:r>
+        <w:rPr/>
+        <w:t xml:space="preserve"> una variabile a cui è stato assegnato un valore oppure che compare dentro un quantificatore, nel qual caso si intende che prende tutti i valori del dominio.</w:t>
+      </w:r>
+    </w:p>
+    <w:p>
+      <w:r>
+        <w:rPr/>
+        <w:t xml:space="preserve">Una funzione proposizionale non ha un valore di verità. Un enunciato con variabili libere </w:t>
+      </w:r>
+      <w:r>
+        <w:rPr>
+          <w:b/>
+        </w:rPr>
+        <w:t>non è una proposizione</w:t>
+      </w:r>
+      <w:r>
+        <w:rPr/>
+        <w:t xml:space="preserve">; un enunciato senza variabili libere (tutte legate) </w:t>
+      </w:r>
+      <w:r>
+        <w:rPr>
+          <w:b/>
+        </w:rPr>
+        <w:t>è una proposizione</w:t>
+      </w:r>
+      <w:r>
+        <w:rPr/>
+        <w:t>, e ha un valore di verità.</w:t>
+      </w:r>
+    </w:p>
+    <w:p>
+      <w:r>
+        <w:rPr/>
+        <w:t xml:space="preserve">Due esempi di enunciati senza variabili libere: «per ogni triangolo T, la somma degli angoli di T è 180°» (un teorema di geometria euclidea) e «esiste un programma P il cui output è P stesso» (in informatica; ne sono un esempio i virus, che devono saper produrre in output sé stessi per riprodursi, cosa più facile in un linguaggio a basso livello dove si sa in quali celle sta il programma). Per dare un significato a enunciati di questo tipo si dovrebbero prendere tutti i triangoli, o tutti i programmi, e controllarli: un metodo puramente ideale, perché sono infiniti. Sono esempi di </w:t>
+      </w:r>
+      <w:r>
+        <w:rPr>
+          <w:b/>
+        </w:rPr>
+        <w:t>quantificazione</w:t>
+      </w:r>
+      <w:r>
+        <w:rPr/>
+        <w:t>, introdotta nei capitoli seguenti: il capitolo 21 tratta «per ogni», il capitolo 22 tratta «esiste».</w:t>
+      </w:r>
+    </w:p>
+    <w:p>
+      <w:pPr>
+        <w:pStyle w:val="Titolo1"/>
+      </w:pPr>
+      <w:r>
+        <w:rPr>
+          <w:b/>
+          <w:color w:val="EE0000"/>
+        </w:rPr>
+        <w:t>21. Il Quantificatore Universale</w:t>
+      </w:r>
+    </w:p>
+    <w:p>
+      <w:pPr>
+        <w:pStyle w:val="Titolo2"/>
+      </w:pPr>
+      <w:r>
+        <w:rPr>
+          <w:b/>
+          <w:color w:val="E97132"/>
+        </w:rPr>
+        <w:t>La definizione</w:t>
+      </w:r>
+    </w:p>
+    <w:p>
+      <w:r>
+        <w:rPr/>
+        <w:t xml:space="preserve">Un enunciato della forma «per ogni x, P(x)» si dice </w:t>
+      </w:r>
+      <w:r>
+        <w:rPr>
+          <w:b/>
+        </w:rPr>
+        <w:t>enunciato quantificato universalmente</w:t>
+      </w:r>
+      <w:r>
+        <w:rPr/>
+        <w:t xml:space="preserve">. Il simbolo ∀ significa «per ogni» e si chiama </w:t>
+      </w:r>
+      <w:r>
+        <w:rPr>
+          <w:b/>
+        </w:rPr>
+        <w:t>quantificatore universale</w:t>
+      </w:r>
+      <w:r>
+        <w:rPr/>
+        <w:t>: l'enunciato si scrive ∀x P(x). Nel linguaggio naturale, in inglese, «for all», «for any» e «for every» sono sinonimi; il simbolo ∀ si può leggere in tutti questi modi. È «universale» perché tutti gli oggetti del discorso devono avere la proprietà.</w:t>
+      </w:r>
+    </w:p>
+    <w:p>
+      <w:r>
+        <w:rPr>
+          <w:b/>
+        </w:rPr>
+        <w:t>Definizione.</w:t>
+      </w:r>
+      <w:r>
+        <w:rPr/>
+        <w:t xml:space="preserve"> Sia P una funzione proposizionale con dominio D. L'enunciato ∀x P(x) è </w:t>
+      </w:r>
+      <w:r>
+        <w:rPr>
+          <w:b/>
+        </w:rPr>
+        <w:t>vero</w:t>
+      </w:r>
+      <w:r>
+        <w:rPr/>
+        <w:t xml:space="preserve"> se P(x) è vera per ogni x ∈ D. È </w:t>
+      </w:r>
+      <w:r>
+        <w:rPr>
+          <w:b/>
+        </w:rPr>
+        <w:t>falso</w:t>
+      </w:r>
+      <w:r>
+        <w:rPr/>
+        <w:t xml:space="preserve"> se P(x) è falsa per almeno un x ∈ D.</w:t>
+      </w:r>
+    </w:p>
+    <w:p>
+      <w:r>
+        <w:rPr/>
+        <w:t xml:space="preserve">Come sottolineato a lezione, per decidere il valore di un quantificatore si assegnano alla funzione tutti i possibili valori del dominio e si controlla che siano tutti veri. Ne basta </w:t>
+      </w:r>
+      <w:r>
+        <w:rPr>
+          <w:b/>
+        </w:rPr>
+        <w:t>uno falso</w:t>
+      </w:r>
+      <w:r>
+        <w:rPr/>
+        <w:t xml:space="preserve"> su infiniti perché il quantificatore sia falso: non è una questione di probabilità. Si lavora con due soli valori di verità, quindi non esistono gradazioni come «quasi sempre vero» (quelle appartengono a studi molto più avanzati).</w:t>
+      </w:r>
+    </w:p>
+    <w:p>
+      <w:pPr>
+        <w:keepNext/>
+        <w:jc w:val="center"/>
+      </w:pPr>
+      <w:r>
+        <w:drawing>
+          <wp:inline xmlns:a="http://schemas.openxmlformats.org/drawingml/2006/main" xmlns:pic="http://schemas.openxmlformats.org/drawingml/2006/picture">
+            <wp:extent cx="4860000" cy="2129699"/>
+            <wp:docPr id="2073952353" name="Picture 2073952353"/>
+            <wp:cNvGraphicFramePr>
+              <a:graphicFrameLocks noChangeAspect="1"/>
+            </wp:cNvGraphicFramePr>
+            <a:graphic>
+              <a:graphicData uri="http://schemas.openxmlformats.org/drawingml/2006/picture">
+                <pic:pic>
+                  <pic:nvPicPr>
+                    <pic:cNvPr id="0" name="logica_quantificatori_dominio.png"/>
+                    <pic:cNvPicPr/>
+                  </pic:nvPicPr>
+                  <pic:blipFill>
+                    <a:blip r:embed="rId30"/>
+                    <a:stretch>
+                      <a:fillRect/>
+                    </a:stretch>
+                  </pic:blipFill>
+                  <pic:spPr>
+                    <a:xfrm>
+                      <a:off x="0" y="0"/>
+                      <a:ext cx="4860000" cy="2129699"/>
+                    </a:xfrm>
                     <a:prstGeom prst="rect"/>
                   </pic:spPr>
                 </pic:pic>
@@ -13473,7 +14371,41 @@
           <w:i/>
           <w:sz w:val="18"/>
         </w:rPr>
-        <w:t>Le regole di inferenza per le proposizioni: premesse sopra la riga, conclusione sotto.</w:t>
+        <w:t>I tre casi: P(x) vera ovunque, vera in alcuni punti, falsa ovunque.</w:t>
+      </w:r>
+    </w:p>
+    <w:p>
+      <w:r>
+        <w:rPr/>
+        <w:t xml:space="preserve">Un valore di x del dominio che rende P(x) falsa si chiama </w:t>
+      </w:r>
+      <w:r>
+        <w:rPr>
+          <w:b/>
+        </w:rPr>
+        <w:t>controesempio</w:t>
+      </w:r>
+      <w:r>
+        <w:rPr/>
+        <w:t xml:space="preserve"> all'enunciato ∀x P(x).</w:t>
+      </w:r>
+    </w:p>
+    <w:p>
+      <w:pPr>
+        <w:pStyle w:val="Titolo2"/>
+      </w:pPr>
+      <w:r>
+        <w:rPr>
+          <w:b/>
+          <w:color w:val="E97132"/>
+        </w:rPr>
+        <w:t>Il dominio cambia il valore di verità</w:t>
+      </w:r>
+    </w:p>
+    <w:p>
+      <w:r>
+        <w:rPr/>
+        <w:t>Il dominio del discorso è essenziale, perché lo stesso enunciato può essere vero in un dominio e falso in un altro. Si consideri ∀x (x² ≥ 0).</w:t>
       </w:r>
     </w:p>
     <w:p>
@@ -13484,14 +14416,18 @@
         </w:numPr>
       </w:pPr>
       <w:r>
-        <w:rPr>
-          <w:b/>
-        </w:rPr>
-        <w:t>Modus ponens</w:t>
-      </w:r>
-      <w:r>
         <w:rPr/>
-        <w:t>: da p → q e p si ricava q.</w:t>
+        <w:t xml:space="preserve">Con dominio ℝ è </w:t>
+      </w:r>
+      <w:r>
+        <w:rPr>
+          <w:b/>
+        </w:rPr>
+        <w:t>vero</w:t>
+      </w:r>
+      <w:r>
+        <w:rPr/>
+        <w:t>: per ogni numero reale il quadrato è positivo o nullo (se x &gt; 0 il quadrato è positivo, se x = 0 è zero, se x &lt; 0 il quadrato è positivo).</w:t>
       </w:r>
     </w:p>
     <w:p>
@@ -13502,14 +14438,100 @@
         </w:numPr>
       </w:pPr>
       <w:r>
-        <w:rPr>
-          <w:b/>
-        </w:rPr>
-        <w:t>Modus tollens</w:t>
-      </w:r>
-      <w:r>
         <w:rPr/>
-        <w:t>: da p → q e ¬q si ricava ¬p.</w:t>
+        <w:t xml:space="preserve">Con dominio ℂ è </w:t>
+      </w:r>
+      <w:r>
+        <w:rPr>
+          <w:b/>
+        </w:rPr>
+        <w:t>falso</w:t>
+      </w:r>
+      <w:r>
+        <w:rPr/>
+        <w:t>: prendendo x = √(−1) = i si ha x² = −1, che non è ≥ 0 (e un controesempio basta).</w:t>
+      </w:r>
+    </w:p>
+    <w:p>
+      <w:r>
+        <w:rPr/>
+        <w:t xml:space="preserve">Un secondo esempio, sempre con dominio ℝ: ∀x (x² − 1 &gt; 0). È </w:t>
+      </w:r>
+      <w:r>
+        <w:rPr>
+          <w:b/>
+        </w:rPr>
+        <w:t>falso</w:t>
+      </w:r>
+      <w:r>
+        <w:rPr/>
+        <w:t>: per x = 1 la proposizione 1² − 1 &gt; 0 è falsa, e 1 è un controesempio. Ci sono tantissimi valori che rendono vera la funzione (per esempio x = 10 dà 99 &gt; 0 e x = 5 dà 24 &gt; 0), ma il quantificatore universale è falso lo stesso, perché basta un'eccezione. In realtà tutti i valori da −1 a +1, zero compreso, sono controesempi: per un x con |x| ≤ 1 il quadrato è minore o uguale a 1, e x² − 1 non è positivo.</w:t>
+      </w:r>
+    </w:p>
+    <w:p>
+      <w:pPr>
+        <w:pStyle w:val="Titolo2"/>
+      </w:pPr>
+      <w:r>
+        <w:rPr>
+          <w:b/>
+          <w:color w:val="E97132"/>
+        </w:rPr>
+        <w:t>Come si dimostra che ∀x P(x) è vero</w:t>
+      </w:r>
+    </w:p>
+    <w:p>
+      <w:r>
+        <w:rPr/>
+        <w:t xml:space="preserve">Per provare che ∀x P(x) è vero bisogna, in sostanza, esaminare </w:t>
+      </w:r>
+      <w:r>
+        <w:rPr>
+          <w:b/>
+        </w:rPr>
+        <w:t>ogni</w:t>
+      </w:r>
+      <w:r>
+        <w:rPr/>
+        <w:t xml:space="preserve"> valore di x del dominio e mostrare che P(x) è vera. Una tecnica è porre che x sia un elemento </w:t>
+      </w:r>
+      <w:r>
+        <w:rPr>
+          <w:b/>
+        </w:rPr>
+        <w:t>arbitrario</w:t>
+      </w:r>
+      <w:r>
+        <w:rPr/>
+        <w:t xml:space="preserve"> del dominio D e procedere con il simbolo x: qualunque cosa si affermi su x deve valere per qualsiasi valore x possa avere in D, e il ragionamento deve concludere che P(x) è vera. Mostrare che P(x) è vera per un valore particolare </w:t>
+      </w:r>
+      <w:r>
+        <w:rPr>
+          <w:b/>
+        </w:rPr>
+        <w:t>non</w:t>
+      </w:r>
+      <w:r>
+        <w:rPr/>
+        <w:t xml:space="preserve"> dimostra che ∀x P(x) sia vero.</w:t>
+      </w:r>
+    </w:p>
+    <w:p>
+      <w:r>
+        <w:rPr/>
+        <w:t>Per specificare il dominio si scrive anche: per ogni x ∈ D, P(x).</w:t>
+      </w:r>
+    </w:p>
+    <w:p>
+      <w:r>
+        <w:rPr>
+          <w:b/>
+        </w:rPr>
+        <w:t>Esempio.</w:t>
+      </w:r>
+      <w:r>
+        <w:rPr/>
+        <w:t xml:space="preserve"> Si verifica che l'enunciato «per ogni numero reale x, se x &gt; 1 allora x + 1 &gt; 1» è vero. Sia x un reale qualunque. Allora vale x ≤ 1 oppure x &gt; 1.</w:t>
       </w:r>
     </w:p>
     <w:p>
@@ -13520,14 +14542,18 @@
         </w:numPr>
       </w:pPr>
       <w:r>
-        <w:rPr>
-          <w:b/>
-        </w:rPr>
-        <w:t>Addizione</w:t>
-      </w:r>
-      <w:r>
         <w:rPr/>
-        <w:t>: da p si ricava p ∨ q.</w:t>
+        <w:t xml:space="preserve">Se x ≤ 1, l'implicazione «se x &gt; 1 allora x + 1 &gt; 1» è </w:t>
+      </w:r>
+      <w:r>
+        <w:rPr>
+          <w:b/>
+        </w:rPr>
+        <w:t>vera per difetto</w:t>
+      </w:r>
+      <w:r>
+        <w:rPr/>
+        <w:t>: l'ipotesi è falsa e, come visto nel capitolo 16, un'implicazione con ipotesi falsa è vera qualunque sia la tesi (nella maggior parte delle dimostrazioni questo caso si omette).</w:t>
       </w:r>
     </w:p>
     <w:p>
@@ -13538,14 +14564,241 @@
         </w:numPr>
       </w:pPr>
       <w:r>
-        <w:rPr>
-          <w:b/>
-        </w:rPr>
-        <w:t>Semplificazione</w:t>
-      </w:r>
-      <w:r>
         <w:rPr/>
-        <w:t>: da p ∧ q si ricava p.</w:t>
+        <w:t>Se x &gt; 1, qualunque sia il valore di x si ha x + 1 &gt; x; da x + 1 &gt; x e x &gt; 1 si conclude che x + 1 &gt; 1, quindi la conclusione è vera e l'implicazione è vera.</w:t>
+      </w:r>
+    </w:p>
+    <w:p>
+      <w:r>
+        <w:rPr/>
+        <w:t>In entrambi i casi l'implicazione è vera, quindi l'enunciato quantificato è vero.</w:t>
+      </w:r>
+    </w:p>
+    <w:p>
+      <w:r>
+        <w:rPr/>
+        <w:t xml:space="preserve">Il lettore interessato alla «meccanizzazione» può notare che questa prova usa passaggi più piccoli: la compatibilità del maggiore con la somma (da x &gt; 1 si ricava x + 1 &gt; 1 + 1, aggiungendo 1 a entrambi i lati), il calcolo 1 + 1 &gt; 1 e la </w:t>
+      </w:r>
+      <w:r>
+        <w:rPr>
+          <w:b/>
+        </w:rPr>
+        <w:t>transitività</w:t>
+      </w:r>
+      <w:r>
+        <w:rPr/>
+        <w:t xml:space="preserve"> del maggiore (se a &gt; b e b &gt; c allora a &gt; c). Un corso di matematica chiede di saper fare questi ragionamenti direttamente, senza spiegare i passaggi più piccoli, ma per una macchina tutto deve essere precisato.</w:t>
+      </w:r>
+    </w:p>
+    <w:p>
+      <w:r>
+        <w:rPr/>
+        <w:t xml:space="preserve">Dimostrare che ∀x P(x) è </w:t>
+      </w:r>
+      <w:r>
+        <w:rPr>
+          <w:b/>
+        </w:rPr>
+        <w:t>falso</w:t>
+      </w:r>
+      <w:r>
+        <w:rPr/>
+        <w:t xml:space="preserve"> è molto più semplice: basta trovare </w:t>
+      </w:r>
+      <w:r>
+        <w:rPr>
+          <w:b/>
+        </w:rPr>
+        <w:t>un</w:t>
+      </w:r>
+      <w:r>
+        <w:rPr/>
+        <w:t xml:space="preserve"> controesempio.</w:t>
+      </w:r>
+    </w:p>
+    <w:p>
+      <w:pPr>
+        <w:pStyle w:val="Titolo2"/>
+      </w:pPr>
+      <w:r>
+        <w:rPr>
+          <w:b/>
+          <w:color w:val="E97132"/>
+        </w:rPr>
+        <w:t>Un algoritmo per decidere ∀x P(x) su un dominio finito</w:t>
+      </w:r>
+    </w:p>
+    <w:p>
+      <w:r>
+        <w:rPr/>
+        <w:t xml:space="preserve">Se il dominio è infinito non c'è un modo ovvio per decidere un quantificatore con la sola definizione: servirebbero infiniti controlli, e un elenco, per quanto lungo, di valori non li esaurisce (esistono metodi migliori, ma appartengono ad altri corsi, di verifica automatica e di intelligenza artificiale). Quando il dominio è </w:t>
+      </w:r>
+      <w:r>
+        <w:rPr>
+          <w:b/>
+        </w:rPr>
+        <w:t>finito</w:t>
+      </w:r>
+      <w:r>
+        <w:rPr/>
+        <w:t>, invece, si può scrivere un programma. Sia D = {d₁, …, d</w:t>
+      </w:r>
+      <w:r>
+        <w:rPr>
+          <w:vertAlign w:val="subscript"/>
+        </w:rPr>
+        <w:t>n</w:t>
+      </w:r>
+      <w:r>
+        <w:rPr/>
+        <w:t>} (per esempio gli elementi di un vettore) e sia P una funzione proposizionale su D. Questo pseudocodice (non è un linguaggio particolare) decide ∀x P(x):</w:t>
+      </w:r>
+    </w:p>
+    <w:p>
+      <w:pPr>
+        <w:spacing w:after="0" w:before="0" w:line="240" w:lineRule="auto"/>
+      </w:pPr>
+      <w:r>
+        <w:rPr>
+          <w:rFonts w:ascii="Consolas" w:hAnsi="Consolas" w:cs="Consolas"/>
+          <w:sz w:val="17"/>
+        </w:rPr>
+        <w:t>for i = 1 to n</w:t>
+      </w:r>
+    </w:p>
+    <w:p>
+      <w:pPr>
+        <w:spacing w:after="0" w:before="0" w:line="240" w:lineRule="auto"/>
+      </w:pPr>
+      <w:r>
+        <w:rPr>
+          <w:rFonts w:ascii="Consolas" w:hAnsi="Consolas" w:cs="Consolas"/>
+          <w:sz w:val="17"/>
+        </w:rPr>
+        <w:t xml:space="preserve">    if (¬P(d_i))</w:t>
+      </w:r>
+    </w:p>
+    <w:p>
+      <w:pPr>
+        <w:spacing w:after="0" w:before="0" w:line="240" w:lineRule="auto"/>
+      </w:pPr>
+      <w:r>
+        <w:rPr>
+          <w:rFonts w:ascii="Consolas" w:hAnsi="Consolas" w:cs="Consolas"/>
+          <w:sz w:val="17"/>
+        </w:rPr>
+        <w:t xml:space="preserve">        return false</w:t>
+      </w:r>
+    </w:p>
+    <w:p>
+      <w:pPr>
+        <w:spacing w:after="0" w:before="0" w:line="240" w:lineRule="auto"/>
+      </w:pPr>
+      <w:r>
+        <w:rPr>
+          <w:rFonts w:ascii="Consolas" w:hAnsi="Consolas" w:cs="Consolas"/>
+          <w:sz w:val="17"/>
+        </w:rPr>
+        <w:t>return true</w:t>
+      </w:r>
+    </w:p>
+    <w:p/>
+    <w:p>
+      <w:r>
+        <w:rPr/>
+        <w:t>Il ciclo esamina uno a uno gli elementi del dominio. Se trova un d</w:t>
+      </w:r>
+      <w:r>
+        <w:rPr>
+          <w:vertAlign w:val="subscript"/>
+        </w:rPr>
+        <w:t>i</w:t>
+      </w:r>
+      <w:r>
+        <w:rPr/>
+        <w:t xml:space="preserve"> per cui P(d</w:t>
+      </w:r>
+      <w:r>
+        <w:rPr>
+          <w:vertAlign w:val="subscript"/>
+        </w:rPr>
+        <w:t>i</w:t>
+      </w:r>
+      <w:r>
+        <w:rPr/>
+        <w:t>) è falsa, la condizione ¬P(d</w:t>
+      </w:r>
+      <w:r>
+        <w:rPr>
+          <w:vertAlign w:val="subscript"/>
+        </w:rPr>
+        <w:t>i</w:t>
+      </w:r>
+      <w:r>
+        <w:rPr/>
+        <w:t xml:space="preserve">) dell'if è vera e il programma restituisce </w:t>
+      </w:r>
+      <w:r>
+        <w:rPr>
+          <w:b/>
+        </w:rPr>
+        <w:t>false</w:t>
+      </w:r>
+      <w:r>
+        <w:rPr/>
+        <w:t xml:space="preserve"> (d</w:t>
+      </w:r>
+      <w:r>
+        <w:rPr>
+          <w:vertAlign w:val="subscript"/>
+        </w:rPr>
+        <w:t>i</w:t>
+      </w:r>
+      <w:r>
+        <w:rPr/>
+        <w:t xml:space="preserve"> è un controesempio) e termina. Se P(d</w:t>
+      </w:r>
+      <w:r>
+        <w:rPr>
+          <w:vertAlign w:val="subscript"/>
+        </w:rPr>
+        <w:t>i</w:t>
+      </w:r>
+      <w:r>
+        <w:rPr/>
+        <w:t>) è vera per ogni d</w:t>
+      </w:r>
+      <w:r>
+        <w:rPr>
+          <w:vertAlign w:val="subscript"/>
+        </w:rPr>
+        <w:t>i</w:t>
+      </w:r>
+      <w:r>
+        <w:rPr/>
+        <w:t xml:space="preserve">, la condizione dell'if è sempre falsa, il ciclo arriva alla fine e il programma restituisce </w:t>
+      </w:r>
+      <w:r>
+        <w:rPr>
+          <w:b/>
+        </w:rPr>
+        <w:t>true</w:t>
+      </w:r>
+      <w:r>
+        <w:rPr/>
+        <w:t>. Quindi se ∀x P(x) è vero il ciclo deve arrivare fino in fondo, controllando ogni elemento; se è falso, il ciclo si ferma appena trova un elemento che rende P(x) falsa.</w:t>
+      </w:r>
+    </w:p>
+    <w:p>
+      <w:r>
+        <w:rPr>
+          <w:b/>
+        </w:rPr>
+        <w:t>Trabocchetto d'esame.</w:t>
+      </w:r>
+      <w:r>
+        <w:rPr/>
+        <w:t xml:space="preserve"> Come sottolineato a lezione, è un tipo di programma che si chiede agli esami, e gli errori più comuni sono due.</w:t>
       </w:r>
     </w:p>
     <w:p>
@@ -13556,14 +14809,38 @@
         </w:numPr>
       </w:pPr>
       <w:r>
-        <w:rPr>
-          <w:b/>
-        </w:rPr>
-        <w:t>Congiunzione</w:t>
-      </w:r>
-      <w:r>
         <w:rPr/>
-        <w:t>: da p e da q si ricava p ∧ q.</w:t>
+        <w:t xml:space="preserve">Scrivere un </w:t>
+      </w:r>
+      <w:r>
+        <w:rPr>
+          <w:rFonts w:ascii="Consolas" w:hAnsi="Consolas" w:cs="Consolas"/>
+        </w:rPr>
+        <w:t>else</w:t>
+      </w:r>
+      <w:r>
+        <w:rPr/>
+        <w:t xml:space="preserve"> con </w:t>
+      </w:r>
+      <w:r>
+        <w:rPr>
+          <w:rFonts w:ascii="Consolas" w:hAnsi="Consolas" w:cs="Consolas"/>
+        </w:rPr>
+        <w:t>return true</w:t>
+      </w:r>
+      <w:r>
+        <w:rPr/>
+        <w:t xml:space="preserve"> dentro il ciclo: se P(d₁) è vera non si può concludere che il quantificatore sia vero, perché dipende dagli altri valori che non sono stati controllati. L'if va lasciato senza else: quando P(d</w:t>
+      </w:r>
+      <w:r>
+        <w:rPr>
+          <w:vertAlign w:val="subscript"/>
+        </w:rPr>
+        <w:t>i</w:t>
+      </w:r>
+      <w:r>
+        <w:rPr/>
+        <w:t>) è vera non c'è abbastanza informazione e il ciclo deve semplicemente passare all'elemento successivo.</w:t>
       </w:r>
     </w:p>
     <w:p>
@@ -13574,14 +14851,547 @@
         </w:numPr>
       </w:pPr>
       <w:r>
-        <w:rPr>
-          <w:b/>
-        </w:rPr>
-        <w:t>Sillogismo ipotetico</w:t>
-      </w:r>
-      <w:r>
         <w:rPr/>
-        <w:t>: da p → q e q → r si ricava p → r.</w:t>
+        <w:t xml:space="preserve">Mettere il </w:t>
+      </w:r>
+      <w:r>
+        <w:rPr>
+          <w:rFonts w:ascii="Consolas" w:hAnsi="Consolas" w:cs="Consolas"/>
+        </w:rPr>
+        <w:t>return true</w:t>
+      </w:r>
+      <w:r>
+        <w:rPr/>
+        <w:t xml:space="preserve"> dentro il ciclo o sotto l'if. Il </w:t>
+      </w:r>
+      <w:r>
+        <w:rPr>
+          <w:rFonts w:ascii="Consolas" w:hAnsi="Consolas" w:cs="Consolas"/>
+        </w:rPr>
+        <w:t>return true</w:t>
+      </w:r>
+      <w:r>
+        <w:rPr/>
+        <w:t xml:space="preserve"> finale deve stare </w:t>
+      </w:r>
+      <w:r>
+        <w:rPr>
+          <w:b/>
+        </w:rPr>
+        <w:t>fuori dal ciclo</w:t>
+      </w:r>
+      <w:r>
+        <w:rPr/>
+        <w:t xml:space="preserve">, allineato con il </w:t>
+      </w:r>
+      <w:r>
+        <w:rPr>
+          <w:rFonts w:ascii="Consolas" w:hAnsi="Consolas" w:cs="Consolas"/>
+        </w:rPr>
+        <w:t>for</w:t>
+      </w:r>
+      <w:r>
+        <w:rPr/>
+        <w:t>: è l'istruzione che si esegue solo se il for finisce senza aver mai trovato un falso. Se fosse dentro, il programma prenderebbe il primo valore di P e lo darebbe per valore del quantificatore, cosa in generale falsa.</w:t>
+      </w:r>
+    </w:p>
+    <w:p>
+      <w:r>
+        <w:rPr/>
+        <w:t>Cicli di questo tipo sono quelli che cercano un oggetto con una certa proprietà in una banca dati; in un programma reale si cerca anche l'indirizzo dell'oggetto, ma qui interessa solo il valore di verità.</w:t>
+      </w:r>
+    </w:p>
+    <w:p>
+      <w:r>
+        <w:rPr/>
+        <w:t>In pratica un ∀ si controlla con un programma solo se il dominio è finito e molto piccolo (anche qualche miliardo, ma non di più): una tavola di verità, per esempio, è di solito un dominio troppo grande, quando il numero di proposizioni atomiche è elevato. Per questo spesso si usano ragionamenti, cioè deduzioni valide in tutti i casi, invece di esplorare tutti i casi.</w:t>
+      </w:r>
+    </w:p>
+    <w:p>
+      <w:pPr>
+        <w:pStyle w:val="Titolo1"/>
+      </w:pPr>
+      <w:r>
+        <w:rPr>
+          <w:b/>
+          <w:color w:val="EE0000"/>
+        </w:rPr>
+        <w:t>22. Il Quantificatore Esistenziale e le Leggi di De Morgan per i Quantificatori</w:t>
+      </w:r>
+    </w:p>
+    <w:p>
+      <w:pPr>
+        <w:pStyle w:val="Titolo2"/>
+      </w:pPr>
+      <w:r>
+        <w:rPr>
+          <w:b/>
+          <w:color w:val="E97132"/>
+        </w:rPr>
+        <w:t>La definizione</w:t>
+      </w:r>
+    </w:p>
+    <w:p>
+      <w:r>
+        <w:rPr/>
+        <w:t>Il secondo quantificatore è l'</w:t>
+      </w:r>
+      <w:r>
+        <w:rPr>
+          <w:b/>
+        </w:rPr>
+        <w:t>esistenziale</w:t>
+      </w:r>
+      <w:r>
+        <w:rPr/>
+        <w:t xml:space="preserve">. Un enunciato della forma «esiste x tale che P(x)» si dice </w:t>
+      </w:r>
+      <w:r>
+        <w:rPr>
+          <w:b/>
+        </w:rPr>
+        <w:t>enunciato quantificato esistenzialmente</w:t>
+      </w:r>
+      <w:r>
+        <w:rPr/>
+        <w:t xml:space="preserve">; il simbolo ∃ significa «esiste» e si chiama </w:t>
+      </w:r>
+      <w:r>
+        <w:rPr>
+          <w:b/>
+        </w:rPr>
+        <w:t>quantificatore esistenziale</w:t>
+      </w:r>
+      <w:r>
+        <w:rPr/>
+        <w:t>: l'enunciato si scrive ∃x P(x).</w:t>
+      </w:r>
+    </w:p>
+    <w:p>
+      <w:r>
+        <w:rPr>
+          <w:b/>
+        </w:rPr>
+        <w:t>Definizione.</w:t>
+      </w:r>
+      <w:r>
+        <w:rPr/>
+        <w:t xml:space="preserve"> Sia P una funzione proposizionale con dominio D. L'enunciato ∃x P(x) è </w:t>
+      </w:r>
+      <w:r>
+        <w:rPr>
+          <w:b/>
+        </w:rPr>
+        <w:t>vero</w:t>
+      </w:r>
+      <w:r>
+        <w:rPr/>
+        <w:t xml:space="preserve"> se P(x) è vera per almeno un x ∈ D. È </w:t>
+      </w:r>
+      <w:r>
+        <w:rPr>
+          <w:b/>
+        </w:rPr>
+        <w:t>falso</w:t>
+      </w:r>
+      <w:r>
+        <w:rPr/>
+        <w:t xml:space="preserve"> se P(x) è falsa per ogni x ∈ D.</w:t>
+      </w:r>
+    </w:p>
+    <w:p>
+      <w:r>
+        <w:rPr/>
+        <w:t xml:space="preserve">È la definizione esattamente </w:t>
+      </w:r>
+      <w:r>
+        <w:rPr>
+          <w:b/>
+        </w:rPr>
+        <w:t>duale</w:t>
+      </w:r>
+      <w:r>
+        <w:rPr/>
+        <w:t xml:space="preserve"> di quella dell'universale: basta scambiare il vero con il falso. Il quantificatore universale è vero quando tutti i valori sono veri e falso se anche uno solo è falso; l'esistenziale è falso quando tutti i valori sono falsi e vero se anche uno solo è vero. In inglese si può dire «there exists», «for some», «for at least one»; il simbolo ∃ si legge in tutti questi modi. Non si chiede che il valore sia unico: l'esistenziale è vero se P(x) vale per un solo valore, per due, per un numero qualunque di valori, anche infiniti, e anche per tutti.</w:t>
+      </w:r>
+    </w:p>
+    <w:p>
+      <w:pPr>
+        <w:pStyle w:val="Titolo2"/>
+      </w:pPr>
+      <w:r>
+        <w:rPr>
+          <w:b/>
+          <w:color w:val="E97132"/>
+        </w:rPr>
+        <w:t>Esempi</w:t>
+      </w:r>
+    </w:p>
+    <w:p>
+      <w:r>
+        <w:rPr>
+          <w:b/>
+        </w:rPr>
+        <w:t>Un esistenziale vero.</w:t>
+      </w:r>
+      <w:r>
+        <w:rPr/>
+        <w:t xml:space="preserve"> ∃x (x/(x² + 1) = 2/5), con dominio ℝ. È vero: basta un numero reale per cui valga l'uguaglianza, e x = 2 funziona, perché 2/(2² + 1) = 2/5. Non vale per ogni x (con x = 1 si ha 1/2, e 1/2 ≠ 2/5). Un secondo valore che la soddisfa è x = 1/2 (il motivo è che l'equazione ottenuta è di secondo grado con il termine di secondo grado e il termine noto uguali, e questo fa sì che a ogni radice corrisponda quella inversa); non era richiesto, perché un solo valore basta.</w:t>
+      </w:r>
+    </w:p>
+    <w:p>
+      <w:r>
+        <w:rPr>
+          <w:b/>
+        </w:rPr>
+        <w:t>Un altro esistenziale vero.</w:t>
+      </w:r>
+      <w:r>
+        <w:rPr/>
+        <w:t xml:space="preserve"> «Per qualche n, se n è primo allora n + 1, n + 2, n + 3 e n + 4 non sono primi», con dominio ℤ⁺. Basta trovare un n che renda vera l'implicazione, per esempio n = 23: l'ipotesi «23 è primo» e la conclusione «24, 25, 26 e 27 non sono primi» sono entrambe vere. Alcuni valori rendono l'implicazione vera (n = 23, n = 4, n = 47) e altri la rendono falsa (n = 2, n = 101): conta il fatto che se ne sia trovato </w:t>
+      </w:r>
+      <w:r>
+        <w:rPr>
+          <w:b/>
+        </w:rPr>
+        <w:t>uno</w:t>
+      </w:r>
+      <w:r>
+        <w:rPr/>
+        <w:t>.</w:t>
+      </w:r>
+    </w:p>
+    <w:p>
+      <w:r>
+        <w:rPr>
+          <w:b/>
+        </w:rPr>
+        <w:t>Un esistenziale falso.</w:t>
+      </w:r>
+      <w:r>
+        <w:rPr/>
+        <w:t xml:space="preserve"> ∃x (1/(x² + 1) &gt; 1), con dominio ℝ. Per mostrare che è falso bisogna dimostrare che la disuguaglianza è falsa per </w:t>
+      </w:r>
+      <w:r>
+        <w:rPr>
+          <w:b/>
+        </w:rPr>
+        <w:t>ogni</w:t>
+      </w:r>
+      <w:r>
+        <w:rPr/>
+        <w:t xml:space="preserve"> x reale, cioè che per ogni x vale 1/(x² + 1) ≤ 1. Sia x un reale qualunque. Poiché x² ≥ 0, si può aggiungere 1 a entrambi i lati e ottenere 1 ≤ x² + 1; dividendo entrambi i lati per x² + 1 (positivo) si ottiene 1/(x² + 1) ≤ 1. Quindi la disuguaglianza di partenza è falsa per ogni x e l'esistenziale è falso. (Mostrare che P(x) è falsa per un valore particolare </w:t>
+      </w:r>
+      <w:r>
+        <w:rPr>
+          <w:b/>
+        </w:rPr>
+        <w:t>non</w:t>
+      </w:r>
+      <w:r>
+        <w:rPr/>
+        <w:t xml:space="preserve"> basta.)</w:t>
+      </w:r>
+    </w:p>
+    <w:p>
+      <w:pPr>
+        <w:pStyle w:val="Titolo2"/>
+      </w:pPr>
+      <w:r>
+        <w:rPr>
+          <w:b/>
+          <w:color w:val="E97132"/>
+        </w:rPr>
+        <w:t>Un algoritmo per decidere ∃x P(x) su un dominio finito</w:t>
+      </w:r>
+    </w:p>
+    <w:p>
+      <w:r>
+        <w:rPr/>
+        <w:t xml:space="preserve">Si può usare la stessa idea del capitolo 21: la soluzione si ottiene </w:t>
+      </w:r>
+      <w:r>
+        <w:rPr>
+          <w:b/>
+        </w:rPr>
+        <w:t>scambiando dappertutto vero e falso</w:t>
+      </w:r>
+      <w:r>
+        <w:rPr/>
+        <w:t>. Con il dominio D = {d₁, …, d</w:t>
+      </w:r>
+      <w:r>
+        <w:rPr>
+          <w:vertAlign w:val="subscript"/>
+        </w:rPr>
+        <w:t>n</w:t>
+      </w:r>
+      <w:r>
+        <w:rPr/>
+        <w:t>}:</w:t>
+      </w:r>
+    </w:p>
+    <w:p>
+      <w:pPr>
+        <w:spacing w:after="0" w:before="0" w:line="240" w:lineRule="auto"/>
+      </w:pPr>
+      <w:r>
+        <w:rPr>
+          <w:rFonts w:ascii="Consolas" w:hAnsi="Consolas" w:cs="Consolas"/>
+          <w:sz w:val="17"/>
+        </w:rPr>
+        <w:t>for i = 1 to n</w:t>
+      </w:r>
+    </w:p>
+    <w:p>
+      <w:pPr>
+        <w:spacing w:after="0" w:before="0" w:line="240" w:lineRule="auto"/>
+      </w:pPr>
+      <w:r>
+        <w:rPr>
+          <w:rFonts w:ascii="Consolas" w:hAnsi="Consolas" w:cs="Consolas"/>
+          <w:sz w:val="17"/>
+        </w:rPr>
+        <w:t xml:space="preserve">    if (P(d_i))</w:t>
+      </w:r>
+    </w:p>
+    <w:p>
+      <w:pPr>
+        <w:spacing w:after="0" w:before="0" w:line="240" w:lineRule="auto"/>
+      </w:pPr>
+      <w:r>
+        <w:rPr>
+          <w:rFonts w:ascii="Consolas" w:hAnsi="Consolas" w:cs="Consolas"/>
+          <w:sz w:val="17"/>
+        </w:rPr>
+        <w:t xml:space="preserve">        return true</w:t>
+      </w:r>
+    </w:p>
+    <w:p>
+      <w:pPr>
+        <w:spacing w:after="0" w:before="0" w:line="240" w:lineRule="auto"/>
+      </w:pPr>
+      <w:r>
+        <w:rPr>
+          <w:rFonts w:ascii="Consolas" w:hAnsi="Consolas" w:cs="Consolas"/>
+          <w:sz w:val="17"/>
+        </w:rPr>
+        <w:t>return false</w:t>
+      </w:r>
+    </w:p>
+    <w:p/>
+    <w:p>
+      <w:r>
+        <w:rPr/>
+        <w:t>Il ciclo esamina i d</w:t>
+      </w:r>
+      <w:r>
+        <w:rPr>
+          <w:vertAlign w:val="subscript"/>
+        </w:rPr>
+        <w:t>i</w:t>
+      </w:r>
+      <w:r>
+        <w:rPr/>
+        <w:t xml:space="preserve"> uno a uno. Se trova un d</w:t>
+      </w:r>
+      <w:r>
+        <w:rPr>
+          <w:vertAlign w:val="subscript"/>
+        </w:rPr>
+        <w:t>i</w:t>
+      </w:r>
+      <w:r>
+        <w:rPr/>
+        <w:t xml:space="preserve"> per cui P(d</w:t>
+      </w:r>
+      <w:r>
+        <w:rPr>
+          <w:vertAlign w:val="subscript"/>
+        </w:rPr>
+        <w:t>i</w:t>
+      </w:r>
+      <w:r>
+        <w:rPr/>
+        <w:t xml:space="preserve">) è vera, restituisce </w:t>
+      </w:r>
+      <w:r>
+        <w:rPr>
+          <w:b/>
+        </w:rPr>
+        <w:t>true</w:t>
+      </w:r>
+      <w:r>
+        <w:rPr/>
+        <w:t xml:space="preserve"> e termina: ne basta uno. Se P(d</w:t>
+      </w:r>
+      <w:r>
+        <w:rPr>
+          <w:vertAlign w:val="subscript"/>
+        </w:rPr>
+        <w:t>i</w:t>
+      </w:r>
+      <w:r>
+        <w:rPr/>
+        <w:t>) è falsa per ogni d</w:t>
+      </w:r>
+      <w:r>
+        <w:rPr>
+          <w:vertAlign w:val="subscript"/>
+        </w:rPr>
+        <w:t>i</w:t>
+      </w:r>
+      <w:r>
+        <w:rPr/>
+        <w:t xml:space="preserve">, il ciclo arriva alla fine e il programma restituisce </w:t>
+      </w:r>
+      <w:r>
+        <w:rPr>
+          <w:b/>
+        </w:rPr>
+        <w:t>false</w:t>
+      </w:r>
+      <w:r>
+        <w:rPr/>
+        <w:t>. Quindi se ∃x P(x) è vero il ciclo si ferma appena trova un elemento che rende P vera; se è falso deve controllare tutti gli elementi.</w:t>
+      </w:r>
+    </w:p>
+    <w:p>
+      <w:r>
+        <w:rPr/>
+        <w:t xml:space="preserve">Anche qui valgono gli errori del capitolo precedente, duali. Scrivere </w:t>
+      </w:r>
+      <w:r>
+        <w:rPr>
+          <w:rFonts w:ascii="Consolas" w:hAnsi="Consolas" w:cs="Consolas"/>
+        </w:rPr>
+        <w:t>if (¬P(d_i)) return false</w:t>
+      </w:r>
+      <w:r>
+        <w:rPr/>
+        <w:t xml:space="preserve"> è sbagliato: se P(d₁) è falsa non si può concludere che l'esistenziale sia falso, perché potrebbe essere vero per il settimo elemento. Si deve restituire </w:t>
+      </w:r>
+      <w:r>
+        <w:rPr>
+          <w:b/>
+        </w:rPr>
+        <w:t>true</w:t>
+      </w:r>
+      <w:r>
+        <w:rPr/>
+        <w:t xml:space="preserve"> al primo vero, e il </w:t>
+      </w:r>
+      <w:r>
+        <w:rPr>
+          <w:rFonts w:ascii="Consolas" w:hAnsi="Consolas" w:cs="Consolas"/>
+        </w:rPr>
+        <w:t>return false</w:t>
+      </w:r>
+      <w:r>
+        <w:rPr/>
+        <w:t xml:space="preserve"> va </w:t>
+      </w:r>
+      <w:r>
+        <w:rPr>
+          <w:b/>
+        </w:rPr>
+        <w:t>fuori dal ciclo</w:t>
+      </w:r>
+      <w:r>
+        <w:rPr/>
+        <w:t xml:space="preserve">, allineato con il </w:t>
+      </w:r>
+      <w:r>
+        <w:rPr>
+          <w:rFonts w:ascii="Consolas" w:hAnsi="Consolas" w:cs="Consolas"/>
+        </w:rPr>
+        <w:t>for</w:t>
+      </w:r>
+      <w:r>
+        <w:rPr/>
+        <w:t>. Il programma funziona come test: per esempio si può provare a scriverlo per cercare in un vettore di numeri se c'è almeno un numero pari, oppure se sono tutti pari.</w:t>
+      </w:r>
+    </w:p>
+    <w:p>
+      <w:pPr>
+        <w:pStyle w:val="Titolo2"/>
+      </w:pPr>
+      <w:r>
+        <w:rPr>
+          <w:b/>
+          <w:color w:val="E97132"/>
+        </w:rPr>
+        <w:t>Duali, congiunzione e disgiunzione</w:t>
+      </w:r>
+    </w:p>
+    <w:p>
+      <w:r>
+        <w:rPr/>
+        <w:t xml:space="preserve">Poiché la definizione dell'uno diventa quella dell'altro scambiando dappertutto il vero con il falso, ∀ e ∃ si dicono </w:t>
+      </w:r>
+      <w:r>
+        <w:rPr>
+          <w:b/>
+        </w:rPr>
+        <w:t>quantificatori duali</w:t>
+      </w:r>
+      <w:r>
+        <w:rPr/>
+        <w:t>; è lo stesso legame che c'è tra congiunzione e disgiunzione. Per questo, come per quelli, valgono le leggi di De Morgan. In effetti un enunciato universale generalizza la congiunzione P₁ ∧ P₂ ∧ … ∧ P</w:t>
+      </w:r>
+      <w:r>
+        <w:rPr>
+          <w:vertAlign w:val="subscript"/>
+        </w:rPr>
+        <w:t>n</w:t>
+      </w:r>
+      <w:r>
+        <w:rPr/>
+        <w:t>: al posto delle singole proposizioni P₁, …, P</w:t>
+      </w:r>
+      <w:r>
+        <w:rPr>
+          <w:vertAlign w:val="subscript"/>
+        </w:rPr>
+        <w:t>n</w:t>
+      </w:r>
+      <w:r>
+        <w:rPr/>
+        <w:t xml:space="preserve"> si ha una famiglia P(x), con x nel dominio, e ∀x P(x) è vero se e solo se P(x) è vera per ogni x. Se il dominio è {−1, 0, 1}, ∀x P(x) equivale a P(−1) ∧ P(0) ∧ P(1). Allo stesso modo ∃x P(x) generalizza la disgiunzione P₁ ∨ P₂ ∨ … ∨ P</w:t>
+      </w:r>
+      <w:r>
+        <w:rPr>
+          <w:vertAlign w:val="subscript"/>
+        </w:rPr>
+        <w:t>n</w:t>
+      </w:r>
+      <w:r>
+        <w:rPr/>
+        <w:t>: con dominio {1, 2, 3, 4}, ∃x P(x) equivale a P(1) ∨ P(2) ∨ P(3) ∨ P(4).</w:t>
+      </w:r>
+    </w:p>
+    <w:p>
+      <w:pPr>
+        <w:pStyle w:val="Titolo2"/>
+      </w:pPr>
+      <w:r>
+        <w:rPr>
+          <w:b/>
+          <w:color w:val="E97132"/>
+        </w:rPr>
+        <w:t>Le leggi di De Morgan per i quantificatori</w:t>
+      </w:r>
+    </w:p>
+    <w:p>
+      <w:r>
+        <w:rPr>
+          <w:b/>
+        </w:rPr>
+        <w:t>Teorema (leggi di De Morgan generalizzate).</w:t>
+      </w:r>
+      <w:r>
+        <w:rPr/>
+        <w:t xml:space="preserve"> Se P è una funzione proposizionale, ciascuna delle due coppie di enunciati seguenti ha gli stessi valori di verità (sono entrambi veri o entrambi falsi):</w:t>
       </w:r>
     </w:p>
     <w:p>
@@ -13592,26 +15402,340 @@
         </w:numPr>
       </w:pPr>
       <w:r>
-        <w:rPr>
-          <w:b/>
-        </w:rPr>
-        <w:t>Sillogismo disgiuntivo</w:t>
-      </w:r>
-      <w:r>
         <w:rPr/>
-        <w:t>: da p ∨ q e ¬p si ricava q.</w:t>
-      </w:r>
-    </w:p>
-    <w:p>
+        <w:t>¬(∀x P(x)) e ∃x ¬P(x): non è vero che per ogni x vale P(x) se e solo se c'è un x per cui non vale P(x);</w:t>
+      </w:r>
+    </w:p>
+    <w:p>
+      <w:pPr>
+        <w:numPr>
+          <w:ilvl w:val="0"/>
+          <w:numId w:val="1"/>
+        </w:numPr>
+      </w:pPr>
       <w:r>
         <w:rPr/>
-        <w:t xml:space="preserve">Per riconoscere la regola in un argomento scritto a parole bisogna prima tradurlo in simboli, come nell'esempio seguente. «Se il computer ha un gigabyte di memoria, allora può eseguire il programma. Se può eseguire il programma, allora la grafica sarà d'effetto. Quindi, se il computer ha un gigabyte di memoria, la grafica sarà d'effetto.» Con p = «il computer ha un gigabyte di memoria», q = «può eseguire il programma» e r = «la grafica sarà d'effetto», l'argomento è p → q, q → r / ∴ p → r: la regola usata è il </w:t>
-      </w:r>
-      <w:r>
-        <w:rPr>
-          <w:b/>
-        </w:rPr>
-        <w:t>sillogismo ipotetico</w:t>
+        <w:t>¬(∃x P(x)) e ∀x ¬P(x): non è vero che esiste un x per cui vale P(x) se e solo se per ogni x non vale P(x).</w:t>
+      </w:r>
+    </w:p>
+    <w:p>
+      <w:r>
+        <w:rPr/>
+        <w:t>Sono esattamente le leggi di De Morgan dei capitoli 15 e 18, in cui la negazione di una congiunzione è la disgiunzione delle negazioni e viceversa.</w:t>
+      </w:r>
+    </w:p>
+    <w:p>
+      <w:r>
+        <w:rPr>
+          <w:b/>
+        </w:rPr>
+        <w:t>Dimostrazione della prima legge.</w:t>
+      </w:r>
+      <w:r>
+        <w:rPr/>
+        <w:t xml:space="preserve"> Se ¬(∀x P(x)) è vera, allora ∀x P(x) è falso; per la definizione di universale, questo succede esattamente quando P(x) è falsa per almeno un x del dominio. Ma se P(x) è falsa per almeno un x, allora ¬P(x) è vera per almeno un x, e per la definizione di esistenziale ∃x ¬P(x) è vero. Il ragionamento inverso mostra che se ¬(∀x P(x)) è falsa lo è anche ∃x ¬P(x). La seconda legge si dimostra in modo simile (è un esercizio del libro).</w:t>
+      </w:r>
+    </w:p>
+    <w:p>
+      <w:r>
+        <w:rPr/>
+        <w:t>Un altro modo di riconoscerle: portare il «non» dentro il quantificatore scambia il vero con il falso sia nel valore del predicato sia nel valore della proposizione finale, e sappiamo che questo doppio scambio trasforma il «per ogni» in «esiste» e viceversa.</w:t>
+      </w:r>
+    </w:p>
+    <w:p>
+      <w:r>
+        <w:rPr/>
+        <w:t>La seconda legge spiega anche un modo di smentire un esistenziale: per mostrare che ∃x P(x) è falso si dimostra che ∀x ¬P(x) è vero, come si è fatto sopra per 1/(x² + 1) &gt; 1.</w:t>
+      </w:r>
+    </w:p>
+    <w:p>
+      <w:pPr>
+        <w:pStyle w:val="Titolo2"/>
+      </w:pPr>
+      <w:r>
+        <w:rPr>
+          <w:b/>
+          <w:color w:val="E97132"/>
+        </w:rPr>
+        <w:t>La negazione nel linguaggio naturale</w:t>
+      </w:r>
+    </w:p>
+    <w:p>
+      <w:r>
+        <w:rPr/>
+        <w:t>Per negare un enunciato quantificato si applicano le leggi precedenti.</w:t>
+      </w:r>
+    </w:p>
+    <w:p>
+      <w:pPr>
+        <w:numPr>
+          <w:ilvl w:val="0"/>
+          <w:numId w:val="1"/>
+        </w:numPr>
+      </w:pPr>
+      <w:r>
+        <w:rPr/>
+        <w:t>«Ogni tifoso del rock ama gli U2» si scrive ∀x P(x), con P(x) = «x ama gli U2» e dominio i tifosi del rock. La sua negazione ¬(∀x P(x)) equivale a ∃x ¬P(x): «esiste un tifoso del rock che non ama gli U2».</w:t>
+      </w:r>
+    </w:p>
+    <w:p>
+      <w:pPr>
+        <w:numPr>
+          <w:ilvl w:val="0"/>
+          <w:numId w:val="1"/>
+        </w:numPr>
+      </w:pPr>
+      <w:r>
+        <w:rPr/>
+        <w:t>«Alcuni uccelli non volano» si scrive ∃x ¬P(x), con P(x) = «x vola» (o anche ∃x Q(x) con Q(x) = «x non vola»). La negazione ¬(∃x ¬P(x)) equivale a ∀x ¬¬P(x), cioè ∀x P(x): «ogni uccello vola».</w:t>
+      </w:r>
+    </w:p>
+    <w:p>
+      <w:r>
+        <w:rPr/>
+        <w:t>Gli enunciati a parole possono avere più interpretazioni. «Tutto ciò che luccica non è oro» (dal *Mercante di Venezia*) si può leggere come «ogni oggetto che luccica non è oro», cioè ∀x (P(x) → ¬Q(x)), con P(x) = «x luccica» e Q(x) = «x è oro»; ma ciò che Shakespeare intendeva è «qualche oggetto che luccica non è oro», cioè ∃x (P(x) ∧ ¬Q(x)), che per De Morgan e per le equivalenze del capitolo 18 equivale a ¬(∀x (P(x) → Q(x))). L'ambiguità dipende da dove si applica la negazione: a Q(x) oppure all'intero enunciato.</w:t>
+      </w:r>
+    </w:p>
+    <w:p>
+      <w:r>
+        <w:rPr/>
+        <w:t>Nel linguaggio naturale, negli enunciati positivi «ogni», «tutti», «ciascuno» e «qualunque» hanno lo stesso significato; negli enunciati negativi la situazione cambia. «Non tutti gli x soddisfano P(x)», «non ogni x» e «non ciascun x» significano ∃x ¬P(x), mentre «nessun x soddisfa P(x)» e «non esiste alcun x che soddisfi P(x)» significano ∀x ¬P(x).</w:t>
+      </w:r>
+    </w:p>
+    <w:p>
+      <w:pPr>
+        <w:pStyle w:val="Titolo1"/>
+      </w:pPr>
+      <w:r>
+        <w:rPr>
+          <w:b/>
+          <w:color w:val="EE0000"/>
+        </w:rPr>
+        <w:t>23. Regole di Inferenza per gli Enunciati Quantificati</w:t>
+      </w:r>
+    </w:p>
+    <w:p>
+      <w:pPr>
+        <w:pStyle w:val="Titolo2"/>
+      </w:pPr>
+      <w:r>
+        <w:rPr>
+          <w:b/>
+          <w:color w:val="E97132"/>
+        </w:rPr>
+        <w:t>Dal capitolo 19 ai quantificatori</w:t>
+      </w:r>
+    </w:p>
+    <w:p>
+      <w:r>
+        <w:rPr/>
+        <w:t>Si chiude la sezione sui quantificatori vedendo come si estendono le regole di inferenza del capitolo 19 agli enunciati con ∀ e ∃, e come si combinano con quelle per le proposizioni.</w:t>
+      </w:r>
+    </w:p>
+    <w:p>
+      <w:r>
+        <w:rPr/>
+        <w:t xml:space="preserve">Si supponga che ∀x P(x) sia vero. Per la definizione di universale, P(x) è vera per ogni x del dominio D; quindi, per un particolare d ∈ D, P(d) è vera. L'argomento ∀x P(x) / ∴ P(d) con d ∈ D è perciò valido, e la regola si chiama </w:t>
+      </w:r>
+      <w:r>
+        <w:rPr>
+          <w:b/>
+        </w:rPr>
+        <w:t>istanziazione universale</w:t>
+      </w:r>
+      <w:r>
+        <w:rPr/>
+        <w:t>. Con ragionamenti simili si giustificano le altre tre regole della tabella.</w:t>
+      </w:r>
+    </w:p>
+    <w:p>
+      <w:pPr>
+        <w:keepNext/>
+        <w:jc w:val="center"/>
+      </w:pPr>
+      <w:r>
+        <w:drawing>
+          <wp:inline xmlns:a="http://schemas.openxmlformats.org/drawingml/2006/main" xmlns:pic="http://schemas.openxmlformats.org/drawingml/2006/picture">
+            <wp:extent cx="4500000" cy="2150036"/>
+            <wp:docPr id="2073952354" name="Picture 2073952354"/>
+            <wp:cNvGraphicFramePr>
+              <a:graphicFrameLocks noChangeAspect="1"/>
+            </wp:cNvGraphicFramePr>
+            <a:graphic>
+              <a:graphicData uri="http://schemas.openxmlformats.org/drawingml/2006/picture">
+                <pic:pic>
+                  <pic:nvPicPr>
+                    <pic:cNvPr id="0" name="logica_regole_quantificatori.png"/>
+                    <pic:cNvPicPr/>
+                  </pic:nvPicPr>
+                  <pic:blipFill>
+                    <a:blip r:embed="rId31"/>
+                    <a:stretch>
+                      <a:fillRect/>
+                    </a:stretch>
+                  </pic:blipFill>
+                  <pic:spPr>
+                    <a:xfrm>
+                      <a:off x="0" y="0"/>
+                      <a:ext cx="4500000" cy="2150036"/>
+                    </a:xfrm>
+                    <a:prstGeom prst="rect"/>
+                  </pic:spPr>
+                </pic:pic>
+              </a:graphicData>
+            </a:graphic>
+          </wp:inline>
+        </w:drawing>
+      </w:r>
+    </w:p>
+    <w:p>
+      <w:pPr>
+        <w:jc w:val="center"/>
+      </w:pPr>
+      <w:r>
+        <w:rPr>
+          <w:i/>
+          <w:sz w:val="18"/>
+        </w:rPr>
+        <w:t>Le regole di inferenza per gli enunciati quantificati.</w:t>
+      </w:r>
+    </w:p>
+    <w:p>
+      <w:pPr>
+        <w:numPr>
+          <w:ilvl w:val="0"/>
+          <w:numId w:val="1"/>
+        </w:numPr>
+      </w:pPr>
+      <w:r>
+        <w:rPr>
+          <w:b/>
+        </w:rPr>
+        <w:t>Istanziazione universale</w:t>
+      </w:r>
+      <w:r>
+        <w:rPr/>
+        <w:t>: da ∀x P(x) si ricava P(d), per ogni d ∈ D.</w:t>
+      </w:r>
+    </w:p>
+    <w:p>
+      <w:pPr>
+        <w:numPr>
+          <w:ilvl w:val="0"/>
+          <w:numId w:val="1"/>
+        </w:numPr>
+      </w:pPr>
+      <w:r>
+        <w:rPr>
+          <w:b/>
+        </w:rPr>
+        <w:t>Generalizzazione universale</w:t>
+      </w:r>
+      <w:r>
+        <w:rPr/>
+        <w:t>: se P(d) è vera per ogni d ∈ D, si ricava ∀x P(x). Si usa con un elemento arbitrario, come nel capitolo 21.</w:t>
+      </w:r>
+    </w:p>
+    <w:p>
+      <w:pPr>
+        <w:numPr>
+          <w:ilvl w:val="0"/>
+          <w:numId w:val="1"/>
+        </w:numPr>
+      </w:pPr>
+      <w:r>
+        <w:rPr>
+          <w:b/>
+        </w:rPr>
+        <w:t>Istanziazione esistenziale</w:t>
+      </w:r>
+      <w:r>
+        <w:rPr/>
+        <w:t>: da ∃x P(x) si ricava P(d) per qualche d ∈ D (un elemento di cui si sa solo che esiste).</w:t>
+      </w:r>
+    </w:p>
+    <w:p>
+      <w:pPr>
+        <w:numPr>
+          <w:ilvl w:val="0"/>
+          <w:numId w:val="1"/>
+        </w:numPr>
+      </w:pPr>
+      <w:r>
+        <w:rPr>
+          <w:b/>
+        </w:rPr>
+        <w:t>Generalizzazione esistenziale</w:t>
+      </w:r>
+      <w:r>
+        <w:rPr/>
+        <w:t>: se P(d) è vera per qualche d ∈ D, si ricava ∃x P(x).</w:t>
+      </w:r>
+    </w:p>
+    <w:p>
+      <w:pPr>
+        <w:pStyle w:val="Titolo2"/>
+      </w:pPr>
+      <w:r>
+        <w:rPr>
+          <w:b/>
+          <w:color w:val="E97132"/>
+        </w:rPr>
+        <w:t>Esempi</w:t>
+      </w:r>
+    </w:p>
+    <w:p>
+      <w:r>
+        <w:rPr>
+          <w:b/>
+        </w:rPr>
+        <w:t>Istanziazione universale.</w:t>
+      </w:r>
+      <w:r>
+        <w:rPr/>
+        <w:t xml:space="preserve"> Si sa che «per ogni intero positivo n, n² ≥ n» è vero. Poiché 54 è un intero positivo, cioè un elemento del dominio, per istanziazione universale si conclude che 54² ≥ 54.</w:t>
+      </w:r>
+    </w:p>
+    <w:p>
+      <w:r>
+        <w:rPr>
+          <w:b/>
+        </w:rPr>
+        <w:t>Generalizzazione esistenziale.</w:t>
+      </w:r>
+      <w:r>
+        <w:rPr/>
+        <w:t xml:space="preserve"> Sia P(x) = «x possiede un computer portatile», con dominio gli studenti di MATH 201 (matematica discreta). Se Taylor, che frequenta il corso, possiede un portatile, in simboli P(Taylor) è vera, e per generalizzazione esistenziale si conclude che ∃x P(x) è vero.</w:t>
+      </w:r>
+    </w:p>
+    <w:p>
+      <w:r>
+        <w:rPr>
+          <w:b/>
+        </w:rPr>
+        <w:t>Modus tollens universale.</w:t>
+      </w:r>
+      <w:r>
+        <w:rPr/>
+        <w:t xml:space="preserve"> Si consideri l'argomento: «per ogni numero reale x, se x è un intero allora x è razionale. Il numero √2 non è razionale. Quindi √2 non è un intero». Con P(x) = «x è un intero» e Q(x) = «x è razionale», l'argomento è</w:t>
+      </w:r>
+    </w:p>
+    <w:p>
+      <w:r>
+        <w:rPr/>
+        <w:t>∀x ∈ ℝ (P(x) → Q(x)), ¬Q(√2) / ∴ ¬P(√2).</w:t>
+      </w:r>
+    </w:p>
+    <w:p>
+      <w:r>
+        <w:rPr/>
+        <w:t xml:space="preserve">Poiché √2 ∈ ℝ, per istanziazione universale si ottiene P(√2) → Q(√2); insieme a ¬Q(√2), per il modus tollens (capitolo 19) si conclude ¬P(√2). L'argomento è valido e si chiama </w:t>
+      </w:r>
+      <w:r>
+        <w:rPr>
+          <w:b/>
+        </w:rPr>
+        <w:t>modus tollens universale</w:t>
       </w:r>
       <w:r>
         <w:rPr/>
@@ -13619,6 +15743,18 @@
       </w:r>
     </w:p>
     <w:p>
+      <w:r>
+        <w:rPr>
+          <w:b/>
+        </w:rPr>
+        <w:t>Sillogismo disgiuntivo con un quantificatore.</w:t>
+      </w:r>
+      <w:r>
+        <w:rPr/>
+        <w:t xml:space="preserve"> Si hanno le ipotesi: «tutti amano Microsoft o Apple» e «Lynn non ama Microsoft». Si vuole mostrare che «Lynn ama Apple». Con P(x) = «x ama Microsoft» e Q(x) = «x ama Apple», la prima ipotesi è ∀x (P(x) ∨ Q(x)); per istanziazione universale si ha P(Lynn) ∨ Q(Lynn). La seconda ipotesi è ¬P(Lynn): il sillogismo disgiuntivo dà Q(Lynn), cioè «Lynn ama Apple». La conclusione segue dalle ipotesi.</w:t>
+      </w:r>
+    </w:p>
+    <w:p>
       <w:pPr>
         <w:pStyle w:val="Titolo2"/>
       </w:pPr>
@@ -13627,135 +15763,161 @@
           <w:b/>
           <w:color w:val="E97132"/>
         </w:rPr>
-        <w:t>Una fallacia frequente: affermare la conclusione</w:t>
+        <w:t>Riepilogo: come si prova o si smentisce un quantificatore</w:t>
       </w:r>
     </w:p>
     <w:p>
       <w:r>
         <w:rPr/>
-        <w:t>Non tutti gli argomenti che «sembrano» validi lo sono. Si consideri: «Se 2 = 3, allora ho mangiato il cappello. Ho mangiato il cappello. Quindi 2 = 3.» Con p = «2 = 3» e q = «ho mangiato il cappello», l'argomento è p → q, q / ∴ p.</w:t>
-      </w:r>
-    </w:p>
-    <w:p>
+        <w:t>Le regole pratiche per dimostrare e smentire enunciati quantificati sono quattro, e conviene averle chiare perché sono il punto più usato negli esercizi.</w:t>
+      </w:r>
+    </w:p>
+    <w:p>
+      <w:pPr>
+        <w:numPr>
+          <w:ilvl w:val="0"/>
+          <w:numId w:val="1"/>
+        </w:numPr>
+      </w:pPr>
       <w:r>
         <w:rPr/>
-        <w:t xml:space="preserve">Se fosse valido, ogni volta che p → q e q sono vere dovrebbe esserlo anche p. Ma questo non succede: con p falsa e q vera, l'implicazione p → q è vera per difetto (ipotesi falsa), q è vera, e la conclusione p è falsa. L'argomento </w:t>
-      </w:r>
-      <w:r>
-        <w:rPr>
-          <w:b/>
-        </w:rPr>
-        <w:t>non è valido</w:t>
+        <w:t xml:space="preserve">Per provare che ∀x P(x) è </w:t>
+      </w:r>
+      <w:r>
+        <w:rPr>
+          <w:b/>
+        </w:rPr>
+        <w:t>vero</w:t>
       </w:r>
       <w:r>
         <w:rPr/>
-        <w:t xml:space="preserve">. Questa fallacia si chiama </w:t>
-      </w:r>
-      <w:r>
-        <w:rPr>
-          <w:b/>
-        </w:rPr>
-        <w:t>affermazione della conclusione</w:t>
+        <w:t xml:space="preserve">, bisogna mostrare che P(x) è vera per </w:t>
+      </w:r>
+      <w:r>
+        <w:rPr>
+          <w:b/>
+        </w:rPr>
+        <w:t>ogni</w:t>
       </w:r>
       <w:r>
         <w:rPr/>
-        <w:t xml:space="preserve"> (in inglese *fallacy of affirming the conclusion*): è lo stesso errore, già visto nel capitolo 17, di scambiare un'implicazione con la sua conversa. Si arriva alla stessa conclusione guardando la tavola (a destra nella figura): nella terza riga le ipotesi sono vere e la conclusione è falsa.</w:t>
-      </w:r>
-    </w:p>
-    <w:p>
-      <w:pPr>
-        <w:pStyle w:val="Titolo2"/>
-      </w:pPr>
-      <w:r>
-        <w:rPr>
-          <w:b/>
-          <w:color w:val="E97132"/>
-        </w:rPr>
-        <w:t>Argomenti in più passaggi</w:t>
-      </w:r>
-    </w:p>
-    <w:p>
+        <w:t xml:space="preserve"> x del dominio. Mostrare che P(x) è vera per un valore particolare </w:t>
+      </w:r>
+      <w:r>
+        <w:rPr>
+          <w:b/>
+        </w:rPr>
+        <w:t>non</w:t>
+      </w:r>
       <w:r>
         <w:rPr/>
-        <w:t>Quando un argomento non coincide con una sola regola, si procede a passi, applicando una regola alla volta e usando le conclusioni intermedie come nuove ipotesi.</w:t>
-      </w:r>
-    </w:p>
-    <w:p>
-      <w:r>
-        <w:rPr>
-          <w:b/>
-        </w:rPr>
-        <w:t>Il bug nei moduli.</w:t>
-      </w:r>
+        <w:t xml:space="preserve"> basta.</w:t>
+      </w:r>
+    </w:p>
+    <w:p>
+      <w:pPr>
+        <w:numPr>
+          <w:ilvl w:val="0"/>
+          <w:numId w:val="1"/>
+        </w:numPr>
+      </w:pPr>
       <w:r>
         <w:rPr/>
-        <w:t xml:space="preserve"> Si ripete l'argomento d'apertura con p = «il bug è nel modulo 17», q = «il bug è nel modulo 81» e r = «il bug è un errore numerico». Le ipotesi sono p ∨ q, r e r → ¬q (il modulo 81 non ha errori numerici, quindi se il bug è numerico non è nel 81). Da r → ¬q e r, per il modus ponens si ricava ¬q. Da p ∨ q e ¬q, per il sillogismo disgiuntivo, si ricava p: il bug è nel modulo 17. L'argomento è valido.</w:t>
-      </w:r>
-    </w:p>
-    <w:p>
-      <w:r>
-        <w:rPr>
-          <w:b/>
-        </w:rPr>
-        <w:t>La squadra.</w:t>
+        <w:t xml:space="preserve">Per provare che ∃x P(x) è </w:t>
+      </w:r>
+      <w:r>
+        <w:rPr>
+          <w:b/>
+        </w:rPr>
+        <w:t>vero</w:t>
       </w:r>
       <w:r>
         <w:rPr/>
-        <w:t xml:space="preserve"> Sono date le ipotesi: se la squadra prende un buon difensore, può battere la prima avversaria; se può battere la prima, può battere la seconda; se può battere la prima, può battere la terza; la squadra prende un buon difensore. Si vuole mostrare che ne segue che la squadra può battere la seconda e la terza. Con p = «prende un buon difensore», q = «batte la prima», r = «batte la seconda» e s = «batte la terza», le ipotesi sono p → q, q → r, q → s e p.</w:t>
-      </w:r>
-    </w:p>
-    <w:p>
+        <w:t xml:space="preserve">, basta trovare </w:t>
+      </w:r>
+      <w:r>
+        <w:rPr>
+          <w:b/>
+        </w:rPr>
+        <w:t>un</w:t>
+      </w:r>
       <w:r>
         <w:rPr/>
-        <w:t>1. Da p → q e q → r, per il sillogismo ipotetico, p → r.</w:t>
-      </w:r>
-    </w:p>
-    <w:p>
+        <w:t xml:space="preserve"> valore di x del dominio per cui P(x) è vera.</w:t>
+      </w:r>
+    </w:p>
+    <w:p>
+      <w:pPr>
+        <w:numPr>
+          <w:ilvl w:val="0"/>
+          <w:numId w:val="1"/>
+        </w:numPr>
+      </w:pPr>
       <w:r>
         <w:rPr/>
-        <w:t>2. Da p → r e p, per il modus ponens, r.</w:t>
-      </w:r>
-    </w:p>
-    <w:p>
+        <w:t xml:space="preserve">Per provare che ∀x P(x) è </w:t>
+      </w:r>
+      <w:r>
+        <w:rPr>
+          <w:b/>
+        </w:rPr>
+        <w:t>falso</w:t>
+      </w:r>
       <w:r>
         <w:rPr/>
-        <w:t>3. Da p → q e q → s, per il sillogismo ipotetico, p → s.</w:t>
-      </w:r>
-    </w:p>
-    <w:p>
+        <w:t xml:space="preserve">, basta trovare </w:t>
+      </w:r>
+      <w:r>
+        <w:rPr>
+          <w:b/>
+        </w:rPr>
+        <w:t>un</w:t>
+      </w:r>
       <w:r>
         <w:rPr/>
-        <w:t>4. Da p → s e p, per il modus ponens, s.</w:t>
-      </w:r>
-    </w:p>
-    <w:p>
+        <w:t xml:space="preserve"> valore di x (un controesempio) per cui P(x) è falsa.</w:t>
+      </w:r>
+    </w:p>
+    <w:p>
+      <w:pPr>
+        <w:numPr>
+          <w:ilvl w:val="0"/>
+          <w:numId w:val="1"/>
+        </w:numPr>
+      </w:pPr>
       <w:r>
         <w:rPr/>
-        <w:t>5. Da r e s, per la congiunzione, r ∧ s.</w:t>
-      </w:r>
-    </w:p>
-    <w:p>
+        <w:t xml:space="preserve">Per provare che ∃x P(x) è </w:t>
+      </w:r>
+      <w:r>
+        <w:rPr>
+          <w:b/>
+        </w:rPr>
+        <w:t>falso</w:t>
+      </w:r>
       <w:r>
         <w:rPr/>
-        <w:t>Poiché r ∧ s dice che la squadra batte la seconda e la terza, la conclusione segue dalle ipotesi.</w:t>
-      </w:r>
-    </w:p>
-    <w:p>
-      <w:pPr>
-        <w:pStyle w:val="Titolo2"/>
-      </w:pPr>
-      <w:r>
-        <w:rPr>
-          <w:b/>
-          <w:color w:val="E97132"/>
-        </w:rPr>
-        <w:t>Un consiglio pratico</w:t>
-      </w:r>
-    </w:p>
-    <w:p>
+        <w:t xml:space="preserve">, bisogna mostrare che P(x) è falsa per </w:t>
+      </w:r>
+      <w:r>
+        <w:rPr>
+          <w:b/>
+        </w:rPr>
+        <w:t>ogni</w:t>
+      </w:r>
       <w:r>
         <w:rPr/>
-        <w:t>La validità di un argomento molto breve si può verificare con una tavola di verità, ma, nella pratica, argomenti e dimostrazioni usano le regole di inferenza: le tavole crescono in modo esponenziale con il numero di proposizioni (capitolo 18), mentre una catena di regole resta corta e leggibile.</w:t>
+        <w:t xml:space="preserve"> x del dominio. Mostrare che P(x) è falsa per un valore particolare </w:t>
+      </w:r>
+      <w:r>
+        <w:rPr>
+          <w:b/>
+        </w:rPr>
+        <w:t>non</w:t>
+      </w:r>
+      <w:r>
+        <w:rPr/>
+        <w:t xml:space="preserve"> basta.</w:t>
       </w:r>
     </w:p>
     <w:sectPr>

</xml_diff>

<commit_message>
Fondamenti: correzioni dal revisore ai cap. 20-23
Co-Authored-By: Claude Sonnet 5.5 <noreply@anthropic.com>
</commit_message>
<xml_diff>
--- a/Riassunto Fondamenti Informatica.docx
+++ b/Riassunto Fondamenti Informatica.docx
@@ -13951,7 +13951,7 @@
     <w:p>
       <w:r>
         <w:rPr/>
-        <w:t>La logica delle sezioni 1.2 e 1.3 non basta a descrivere la maggior parte degli enunciati della matematica e dell'informatica. Si prenda l'affermazione «n è un intero dispari»: non è una proposizione, perché è vera o falsa a seconda del valore di n (è vera per n = 103 e falsa per n = 8). Siccome quasi tutti gli enunciati usano variabili, bisogna estendere la logica per includerle.</w:t>
+        <w:t>La logica proposizionale dei capitoli precedenti non basta a descrivere la maggior parte degli enunciati della matematica e dell'informatica. Si prenda l'affermazione «n è un intero dispari»: non è una proposizione, perché è vera o falsa a seconda del valore di n (è vera per n = 103 e falsa per n = 8). Siccome quasi tutti gli enunciati usano variabili, bisogna estendere la logica per includerle.</w:t>
       </w:r>
     </w:p>
     <w:p>
@@ -14055,7 +14055,7 @@
     <w:p>
       <w:r>
         <w:rPr/>
-        <w:t>In programmazione succede lo stesso: l'affermazione x &lt; y non è né vera né falsa finché non si assegnano valori a x e a y; con x = 3 e y = 2 diventa 3 &lt; 2, che è falsa. Come in logica proposizionale, si possono quindi scrivere anche enunciati falsi (come «2 è un numero primo dispari»): servono proprio perché si vuole insegnare a un computer a distinguere tra vero e falso, a dare una garanzia quando un'affermazione è vera o a smentire una convinzione sbagliata.</w:t>
+        <w:t>In programmazione succede lo stesso: l'affermazione x &lt; y non è né vera né falsa finché non si assegnano valori a x e a y; con x = 3 e y = 2 diventa 3 &lt; 2, che è falsa. Come in logica proposizionale, si possono quindi scrivere anche enunciati falsi (come «2 è un numero dispari»): servono proprio perché si vuole insegnare a un computer a distinguere tra vero e falso, a dare una garanzia quando un'affermazione è vera o a smentire una convinzione sbagliata.</w:t>
       </w:r>
     </w:p>
     <w:p>
@@ -14451,6 +14451,9 @@
         <w:rPr/>
         <w:t>: prendendo x = √(−1) = i si ha x² = −1, che non è ≥ 0 (e un controesempio basta).</w:t>
       </w:r>
+      <w:r>
+        <w:t xml:space="preserve"> (su ℂ la disuguaglianza ha senso solo per i numeri reali, quindi qui si considera falsa per x non reale).</w:t>
+      </w:r>
     </w:p>
     <w:p>
       <w:r>
@@ -14798,7 +14801,7 @@
       </w:r>
       <w:r>
         <w:rPr/>
-        <w:t xml:space="preserve"> Come sottolineato a lezione, è un tipo di programma che si chiede agli esami, e gli errori più comuni sono due.</w:t>
+        <w:t xml:space="preserve"> Come sottolineato a lezione, è un tipo di programma che si chiede agli esami, e l'errore tipico ha due varianti.</w:t>
       </w:r>
     </w:p>
     <w:p>
@@ -14904,7 +14907,10 @@
     <w:p>
       <w:r>
         <w:rPr/>
-        <w:t>In pratica un ∀ si controlla con un programma solo se il dominio è finito e molto piccolo (anche qualche miliardo, ma non di più): una tavola di verità, per esempio, è di solito un dominio troppo grande, quando il numero di proposizioni atomiche è elevato. Per questo spesso si usano ragionamenti, cioè deduzioni valide in tutti i casi, invece di esplorare tutti i casi.</w:t>
+        <w:t>In pratica un ∀ si controlla con un programma solo se il dominio è finito e molto piccolo (anche qualche miliardo): una tavola di verità, per esempio, è di solito un dominio troppo grande, quando il numero di proposizioni atomiche è elevato. Per questo spesso si usano ragionamenti, cioè deduzioni valide in tutti i casi, invece di esplorare tutti i casi.</w:t>
+      </w:r>
+      <w:r>
+        <w:t xml:space="preserve"> Il capitolo successivo introduce l'altro quantificatore, l'esistenziale.</w:t>
       </w:r>
     </w:p>
     <w:p>
@@ -15309,7 +15315,7 @@
       </w:r>
       <w:r>
         <w:rPr/>
-        <w:t>. Il programma funziona come test: per esempio si può provare a scriverlo per cercare in un vettore di numeri se c'è almeno un numero pari, oppure se sono tutti pari.</w:t>
+        <w:t>. Per fare pratica si può provare a scrivere il programma per cercare in un vettore di numeri se c'è almeno un numero pari, oppure se sono tutti pari.</w:t>
       </w:r>
     </w:p>
     <w:p>
@@ -15337,7 +15343,7 @@
       </w:r>
       <w:r>
         <w:rPr/>
-        <w:t>; è lo stesso legame che c'è tra congiunzione e disgiunzione. Per questo, come per quelli, valgono le leggi di De Morgan. In effetti un enunciato universale generalizza la congiunzione P₁ ∧ P₂ ∧ … ∧ P</w:t>
+        <w:t>; è lo stesso legame che c'è tra congiunzione e disgiunzione. Per questo, come per congiunzione e disgiunzione, valgono le leggi di De Morgan. In effetti un enunciato universale generalizza la congiunzione P₁ ∧ P₂ ∧ … ∧ P</w:t>
       </w:r>
       <w:r>
         <w:rPr>
@@ -15433,7 +15439,7 @@
       </w:r>
       <w:r>
         <w:rPr/>
-        <w:t xml:space="preserve"> Se ¬(∀x P(x)) è vera, allora ∀x P(x) è falso; per la definizione di universale, questo succede esattamente quando P(x) è falsa per almeno un x del dominio. Ma se P(x) è falsa per almeno un x, allora ¬P(x) è vera per almeno un x, e per la definizione di esistenziale ∃x ¬P(x) è vero. Il ragionamento inverso mostra che se ¬(∀x P(x)) è falsa lo è anche ∃x ¬P(x). La seconda legge si dimostra in modo simile (è un esercizio del libro).</w:t>
+        <w:t xml:space="preserve"> Se ¬(∀x P(x)) è vera, allora ∀x P(x) è falso; per la definizione di universale, questo succede esattamente quando P(x) è falsa per almeno un x del dominio. Ma se P(x) è falsa per almeno un x, allora ¬P(x) è vera per almeno un x, e per la definizione di esistenziale ∃x ¬P(x) è vero. Un ragionamento analogo mostra che se ¬(∀x P(x)) è falsa lo è anche ∃x ¬P(x). La seconda legge si dimostra in modo simile (è un esercizio del libro).</w:t>
       </w:r>
     </w:p>
     <w:p>
@@ -15447,6 +15453,7 @@
         <w:rPr/>
         <w:t>La seconda legge spiega anche un modo di smentire un esistenziale: per mostrare che ∃x P(x) è falso si dimostra che ∀x ¬P(x) è vero, come si è fatto sopra per 1/(x² + 1) &gt; 1.</w:t>
       </w:r>
+      <w:r/>
     </w:p>
     <w:p>
       <w:pPr>
@@ -15487,13 +15494,13 @@
       </w:pPr>
       <w:r>
         <w:rPr/>
-        <w:t>«Alcuni uccelli non volano» si scrive ∃x ¬P(x), con P(x) = «x vola» (o anche ∃x Q(x) con Q(x) = «x non vola»). La negazione ¬(∃x ¬P(x)) equivale a ∀x ¬¬P(x), cioè ∀x P(x): «ogni uccello vola».</w:t>
+        <w:t>«Alcuni uccelli non possono volare» si scrive ∃x ¬P(x), con P(x) = «x vola» (o anche ∃x Q(x) con Q(x) = «x non può volare»). La negazione ¬(∃x ¬P(x)) equivale a ∀x ¬¬P(x), cioè ∀x P(x): «ogni uccello vola».</w:t>
       </w:r>
     </w:p>
     <w:p>
       <w:r>
         <w:rPr/>
-        <w:t>Gli enunciati a parole possono avere più interpretazioni. «Tutto ciò che luccica non è oro» (dal *Mercante di Venezia*) si può leggere come «ogni oggetto che luccica non è oro», cioè ∀x (P(x) → ¬Q(x)), con P(x) = «x luccica» e Q(x) = «x è oro»; ma ciò che Shakespeare intendeva è «qualche oggetto che luccica non è oro», cioè ∃x (P(x) ∧ ¬Q(x)), che per De Morgan e per le equivalenze del capitolo 18 equivale a ¬(∀x (P(x) → Q(x))). L'ambiguità dipende da dove si applica la negazione: a Q(x) oppure all'intero enunciato.</w:t>
+        <w:t>Gli enunciati a parole possono avere più interpretazioni. «Tutto ciò che luccica non è oro» (dal Mercante di Venezia) si può leggere come «ogni oggetto che luccica non è oro», cioè ∀x (P(x) → ¬Q(x)), con P(x) = «x luccica» e Q(x) = «x è oro»; ma ciò che Shakespeare intendeva è «qualche oggetto che luccica non è oro», cioè ∃x (P(x) ∧ ¬Q(x)), che per De Morgan e per le equivalenze del capitolo 18 equivale a ¬(∀x (P(x) → Q(x))). L'ambiguità dipende da dove si applica la negazione: a Q(x) oppure all'intero enunciato.</w:t>
       </w:r>
     </w:p>
     <w:p>
@@ -15769,7 +15776,7 @@
     <w:p>
       <w:r>
         <w:rPr/>
-        <w:t>Le regole pratiche per dimostrare e smentire enunciati quantificati sono quattro, e conviene averle chiare perché sono il punto più usato negli esercizi.</w:t>
+        <w:t>Le regole pratiche per dimostrare e smentire enunciati quantificati sono quattro, e riassumono quanto visto nei capitoli 21 e 22.</w:t>
       </w:r>
     </w:p>
     <w:p>

</xml_diff>

<commit_message>
Fondamenti: cap. 23 tolto temporaneamente dal Word (testo in bozze)
Co-Authored-By: Claude Sonnet 5.5 <noreply@anthropic.com>
</commit_message>
<xml_diff>
--- a/Riassunto Fondamenti Informatica.docx
+++ b/Riassunto Fondamenti Informatica.docx
@@ -13460,25 +13460,51 @@
       <w:r>
         <w:rPr>
           <w:b/>
+          <w:highlight w:val="yellow"/>
         </w:rPr>
         <w:t>tavola di verità</w:t>
       </w:r>
       <w:r>
-        <w:t xml:space="preserve">: si scrivono i valori di tutte le proposizioni coinvolte e si controlla che in ogni riga in cui le ipotesi sono vere lo sia anche la conclusione. Il secondo metodo è un </w:t>
-      </w:r>
-      <w:r>
-        <w:rPr>
-          <w:b/>
+        <w:t xml:space="preserve">: si scrivono i valori di tutte le proposizioni coinvolte e si controlla che in ogni riga in cui le ipotesi sono vere lo sia anche la conclusione. </w:t>
+      </w:r>
+      <w:r>
+        <w:rPr>
+          <w:highlight w:val="yellow"/>
+        </w:rPr>
+        <w:t xml:space="preserve">Il secondo metodo è un </w:t>
+      </w:r>
+      <w:r>
+        <w:rPr>
+          <w:b/>
+          <w:highlight w:val="yellow"/>
         </w:rPr>
         <w:t>ragionamento diretto</w:t>
       </w:r>
       <w:r>
-        <w:t>, che evita la tavola: si suppone che le ipotesi siano vere e si verifica che la conclusione non può essere falsa.</w:t>
+        <w:t xml:space="preserve">, che evita la tavola: </w:t>
+      </w:r>
+      <w:r>
+        <w:rPr>
+          <w:highlight w:val="yellow"/>
+        </w:rPr>
+        <w:t>si suppone che le ipotesi siano vere e si verifica che la conclusione non può essere falsa.</w:t>
       </w:r>
     </w:p>
     <w:p>
       <w:r>
         <w:t>Esempio. Si vuole stabilire se è valido l'argomento p → q, p / ∴ q.</w:t>
+      </w:r>
+    </w:p>
+    <w:p>
+      <w:r>
+        <w:rPr>
+          <w:b/>
+          <w:bCs/>
+        </w:rPr>
+        <w:t>Esempio.</w:t>
+      </w:r>
+      <w:r>
+        <w:t xml:space="preserve"> «Se piove, la strada è bagnata» (p → q). «Sta piovendo» (p). Quindi la strada è bagnata (q).</w:t>
       </w:r>
     </w:p>
     <w:p>
@@ -13541,26 +13567,91 @@
     </w:p>
     <w:p>
       <w:r>
-        <w:t xml:space="preserve">Con la tavola (a sinistra nella figura) si osserva che ogni volta che p → q e p sono entrambe vere, lo è anche q: l'argomento è valido. Con il ragionamento diretto: si suppone che p → q e p siano vere; allora q deve essere vera, perché altrimenti p → q sarebbe falsa (ipotesi vera e tesi falsa). Questo argomento è usato continuamente e si chiama </w:t>
-      </w:r>
-      <w:r>
-        <w:rPr>
-          <w:b/>
+        <w:t xml:space="preserve">Con la tavola (a sinistra nella figura) </w:t>
+      </w:r>
+      <w:r>
+        <w:rPr>
+          <w:highlight w:val="yellow"/>
+        </w:rPr>
+        <w:t>si osserva che ogni volta che p → q e p sono entrambe vere, lo è anche q:</w:t>
+      </w:r>
+      <w:r>
+        <w:t xml:space="preserve"> l'argomento è valido. Con il ragionamento diretto: </w:t>
+      </w:r>
+      <w:r>
+        <w:rPr>
+          <w:highlight w:val="yellow"/>
+        </w:rPr>
+        <w:t>si suppone che p → q e p siano vere</w:t>
+      </w:r>
+      <w:r>
+        <w:t xml:space="preserve">; </w:t>
+      </w:r>
+      <w:r>
+        <w:rPr>
+          <w:highlight w:val="yellow"/>
+        </w:rPr>
+        <w:t>allora q deve essere vera</w:t>
+      </w:r>
+      <w:r>
+        <w:t xml:space="preserve">, perché altrimenti p → q sarebbe falsa (ipotesi vera e tesi falsa). Questo argomento è usato continuamente e </w:t>
+      </w:r>
+      <w:r>
+        <w:rPr>
+          <w:highlight w:val="yellow"/>
+        </w:rPr>
+        <w:t xml:space="preserve">si chiama </w:t>
+      </w:r>
+      <w:r>
+        <w:rPr>
+          <w:b/>
+          <w:highlight w:val="yellow"/>
         </w:rPr>
         <w:t>modus ponens</w:t>
       </w:r>
       <w:r>
+        <w:rPr>
+          <w:highlight w:val="yellow"/>
+        </w:rPr>
         <w:t xml:space="preserve"> o </w:t>
       </w:r>
       <w:r>
         <w:rPr>
           <w:b/>
+          <w:highlight w:val="yellow"/>
         </w:rPr>
         <w:t>legge del distacco</w:t>
       </w:r>
       <w:r>
         <w:t>.</w:t>
       </w:r>
+    </w:p>
+    <w:p>
+      <w:pPr>
+        <w:pStyle w:val="Titolo2"/>
+        <w:rPr>
+          <w:b/>
+          <w:color w:val="E97132"/>
+        </w:rPr>
+      </w:pPr>
+    </w:p>
+    <w:p>
+      <w:pPr>
+        <w:pStyle w:val="Titolo2"/>
+        <w:rPr>
+          <w:b/>
+          <w:color w:val="E97132"/>
+        </w:rPr>
+      </w:pPr>
+    </w:p>
+    <w:p>
+      <w:pPr>
+        <w:pStyle w:val="Titolo2"/>
+        <w:rPr>
+          <w:b/>
+          <w:color w:val="E97132"/>
+        </w:rPr>
+      </w:pPr>
     </w:p>
     <w:p>
       <w:pPr>
@@ -13588,7 +13679,6 @@
         <w:rPr>
           <w:noProof/>
         </w:rPr>
-        <w:lastRenderedPageBreak/>
         <w:drawing>
           <wp:inline distT="0" distB="0" distL="0" distR="0" wp14:anchorId="62A501F5" wp14:editId="6F490585">
             <wp:extent cx="4680000" cy="2933368"/>
@@ -13652,7 +13742,16 @@
         <w:t>Modus ponens</w:t>
       </w:r>
       <w:r>
-        <w:t>: da p → q e p si ricava q.</w:t>
+        <w:t xml:space="preserve">: </w:t>
+      </w:r>
+      <w:r>
+        <w:rPr>
+          <w:highlight w:val="yellow"/>
+        </w:rPr>
+        <w:t>da p → q e p si ricava q</w:t>
+      </w:r>
+      <w:r>
+        <w:t>.</w:t>
       </w:r>
     </w:p>
     <w:p>
@@ -13669,7 +13768,16 @@
         <w:t>Modus tollens</w:t>
       </w:r>
       <w:r>
-        <w:t>: da p → q e ¬q si ricava ¬p.</w:t>
+        <w:t xml:space="preserve">: </w:t>
+      </w:r>
+      <w:r>
+        <w:rPr>
+          <w:highlight w:val="yellow"/>
+        </w:rPr>
+        <w:t>da p → q e ¬q si ricava ¬p</w:t>
+      </w:r>
+      <w:r>
+        <w:t>.</w:t>
       </w:r>
     </w:p>
     <w:p>
@@ -13686,7 +13794,16 @@
         <w:t>Addizione</w:t>
       </w:r>
       <w:r>
-        <w:t>: da p si ricava p ∨ q.</w:t>
+        <w:t xml:space="preserve">: </w:t>
+      </w:r>
+      <w:r>
+        <w:rPr>
+          <w:highlight w:val="yellow"/>
+        </w:rPr>
+        <w:t>da p si ricava p ∨ q</w:t>
+      </w:r>
+      <w:r>
+        <w:t>.</w:t>
       </w:r>
     </w:p>
     <w:p>
@@ -13703,7 +13820,16 @@
         <w:t>Semplificazione</w:t>
       </w:r>
       <w:r>
-        <w:t>: da p ∧ q si ricava p.</w:t>
+        <w:t xml:space="preserve">: </w:t>
+      </w:r>
+      <w:r>
+        <w:rPr>
+          <w:highlight w:val="yellow"/>
+        </w:rPr>
+        <w:t>da p ∧ q si ricava p</w:t>
+      </w:r>
+      <w:r>
+        <w:t>.</w:t>
       </w:r>
     </w:p>
     <w:p>
@@ -13720,7 +13846,16 @@
         <w:t>Congiunzione</w:t>
       </w:r>
       <w:r>
-        <w:t>: da p e da q si ricava p ∧ q.</w:t>
+        <w:t xml:space="preserve">: </w:t>
+      </w:r>
+      <w:r>
+        <w:rPr>
+          <w:highlight w:val="yellow"/>
+        </w:rPr>
+        <w:t>da p e da q si ricava p ∧ q</w:t>
+      </w:r>
+      <w:r>
+        <w:t>.</w:t>
       </w:r>
     </w:p>
     <w:p>
@@ -13737,7 +13872,16 @@
         <w:t>Sillogismo ipotetico</w:t>
       </w:r>
       <w:r>
-        <w:t>: da p → q e q → r si ricava p → r.</w:t>
+        <w:t xml:space="preserve">: </w:t>
+      </w:r>
+      <w:r>
+        <w:rPr>
+          <w:highlight w:val="yellow"/>
+        </w:rPr>
+        <w:t>da p → q e q → r si ricava p → r</w:t>
+      </w:r>
+      <w:r>
+        <w:t>.</w:t>
       </w:r>
     </w:p>
     <w:p>
@@ -13754,12 +13898,27 @@
         <w:t>Sillogismo disgiuntivo</w:t>
       </w:r>
       <w:r>
-        <w:t>: da p ∨ q e ¬p si ricava q.</w:t>
-      </w:r>
-    </w:p>
-    <w:p>
-      <w:r>
-        <w:t xml:space="preserve">Per riconoscere la regola in un argomento scritto a parole bisogna prima tradurlo in simboli, come nell'esempio seguente. «Se il computer ha un gigabyte di memoria, allora può eseguire il programma. Se può eseguire il programma, allora la grafica sarà d'effetto. Quindi, se il computer ha un gigabyte di memoria, la grafica sarà d'effetto.» Con p = «il computer ha un gigabyte di memoria», q = «può eseguire il programma» e r = «la grafica sarà d'effetto», l'argomento è p → q, q → r / ∴ p → r: la regola usata è il </w:t>
+        <w:t xml:space="preserve">: </w:t>
+      </w:r>
+      <w:r>
+        <w:rPr>
+          <w:highlight w:val="yellow"/>
+        </w:rPr>
+        <w:t>da p ∨ q e ¬p si ricava q</w:t>
+      </w:r>
+      <w:r>
+        <w:t>.</w:t>
+      </w:r>
+    </w:p>
+    <w:p>
+      <w:r>
+        <w:rPr>
+          <w:highlight w:val="yellow"/>
+        </w:rPr>
+        <w:t>Per riconoscere la regola in un argomento scritto a parole bisogna prima tradurlo in simboli</w:t>
+      </w:r>
+      <w:r>
+        <w:t xml:space="preserve">, come nell'esempio seguente. «Se il computer ha un gigabyte di memoria, allora può eseguire il programma. Se può eseguire il programma, allora la grafica sarà d'effetto. Quindi, se il computer ha un gigabyte di memoria, la grafica sarà d'effetto.» Con p = «il computer ha un gigabyte di memoria», q = «può eseguire il programma» e r = «la grafica sarà d'effetto», l'argomento è p → q, q → r / ∴ p → r: la regola usata è il </w:t>
       </w:r>
       <w:r>
         <w:rPr>
@@ -13790,25 +13949,64 @@
     </w:p>
     <w:p>
       <w:r>
-        <w:t xml:space="preserve">Se fosse valido, ogni volta che p → q e q sono vere dovrebbe esserlo anche p. Ma questo non succede: con p falsa e q vera, l'implicazione p → q è vera per difetto (ipotesi falsa), q è vera, e la conclusione p è falsa. L'argomento </w:t>
-      </w:r>
-      <w:r>
-        <w:rPr>
-          <w:b/>
+        <w:lastRenderedPageBreak/>
+        <w:t xml:space="preserve">Se fosse valido, ogni volta che p → q e q sono vere dovrebbe esserlo anche p. Ma questo non succede: con p falsa e q vera, l'implicazione p → q è vera per difetto (ipotesi falsa), q è vera, e la conclusione p è falsa. </w:t>
+      </w:r>
+      <w:r>
+        <w:rPr>
+          <w:highlight w:val="yellow"/>
+        </w:rPr>
+        <w:t xml:space="preserve">L'argomento </w:t>
+      </w:r>
+      <w:r>
+        <w:rPr>
+          <w:b/>
+          <w:highlight w:val="yellow"/>
         </w:rPr>
         <w:t>non è valido</w:t>
       </w:r>
       <w:r>
-        <w:t xml:space="preserve">. Questa fallacia si chiama </w:t>
-      </w:r>
-      <w:r>
-        <w:rPr>
-          <w:b/>
+        <w:rPr>
+          <w:highlight w:val="yellow"/>
+        </w:rPr>
+        <w:t>.</w:t>
+      </w:r>
+      <w:r>
+        <w:t xml:space="preserve"> </w:t>
+      </w:r>
+      <w:r>
+        <w:rPr>
+          <w:highlight w:val="yellow"/>
+        </w:rPr>
+        <w:t xml:space="preserve">Questa fallacia si chiama </w:t>
+      </w:r>
+      <w:r>
+        <w:rPr>
+          <w:b/>
+          <w:highlight w:val="yellow"/>
         </w:rPr>
         <w:t>affermazione della conclusione</w:t>
       </w:r>
       <w:r>
-        <w:t xml:space="preserve"> (in inglese *fallacy of affirming the conclusion*): è lo stesso errore, già visto nel capitolo 17, di scambiare un'implicazione con la sua conversa. Si arriva alla stessa conclusione guardando la tavola (a destra nella figura): nella terza riga le ipotesi sono vere e la conclusione è falsa.</w:t>
+        <w:t xml:space="preserve"> (in inglese *fallacy of affirming the conclusion*): </w:t>
+      </w:r>
+      <w:r>
+        <w:rPr>
+          <w:highlight w:val="yellow"/>
+        </w:rPr>
+        <w:t>è lo stesso errore</w:t>
+      </w:r>
+      <w:r>
+        <w:t xml:space="preserve">, già visto nel capitolo 17, </w:t>
+      </w:r>
+      <w:r>
+        <w:rPr>
+          <w:highlight w:val="yellow"/>
+        </w:rPr>
+        <w:t>di scambiare un'implicazione con la sua conversa</w:t>
+      </w:r>
+      <w:r>
+        <w:t>. Si arriva alla stessa conclusione guardando la tavola (a destra nella figura): nella terza riga le ipotesi sono vere e la conclusione è falsa.</w:t>
       </w:r>
     </w:p>
     <w:p>
@@ -13820,65 +14018,158 @@
           <w:b/>
           <w:color w:val="E97132"/>
         </w:rPr>
+        <w:t>Argomenti in più passaggi</w:t>
+      </w:r>
+    </w:p>
+    <w:p>
+      <w:r>
+        <w:rPr>
+          <w:highlight w:val="yellow"/>
+        </w:rPr>
+        <w:t>Quando un argomento non coincide con una sola regola, si procede a passi, applicando una regola alla volta e usando le conclusioni intermedie come nuove ipotesi</w:t>
+      </w:r>
+      <w:r>
+        <w:t>.</w:t>
+      </w:r>
+    </w:p>
+    <w:p>
+      <w:r>
+        <w:rPr>
+          <w:b/>
+        </w:rPr>
+        <w:t>Il bug nei moduli.</w:t>
+      </w:r>
+      <w:r>
+        <w:t xml:space="preserve"> Si ripete l'argomento d'apertura con p = «il bug è nel modulo 17», q = «il bug è nel modulo 81» e r = «il bug è un errore numerico». Le ipotesi sono p ∨ q, r e r → ¬q (il modulo 81 non ha errori numerici, quindi se il bug è numerico non è nel 81). Da r → ¬q e r, per il modus ponens si ricava ¬q. Da p ∨ q e ¬q, per il sillogismo disgiuntivo, si ricava p: il bug è nel modulo 17. L'argomento è valido.</w:t>
+      </w:r>
+    </w:p>
+    <w:p>
+      <w:r>
+        <w:rPr>
+          <w:b/>
+        </w:rPr>
+        <w:t>La squadra.</w:t>
+      </w:r>
+      <w:r>
+        <w:t xml:space="preserve"> Sono date le ipotesi: se la squadra prende un buon difensore, può battere la prima avversaria; se può battere la prima, può battere la seconda; se può battere la prima, può battere la terza; la squadra prende un buon difensore. Si vuole mostrare che ne segue che la squadra può battere la seconda e la terza. Con p = «prende un buon difensore», q = «batte la prima», r = «batte la seconda» e s = «batte la terza», le ipotesi sono p → q, q → r, q → s e p.</w:t>
+      </w:r>
+    </w:p>
+    <w:p>
+      <w:r>
+        <w:t>1. Da p → q e q → r, per il sillogismo ipotetico, p → r.</w:t>
+      </w:r>
+    </w:p>
+    <w:p>
+      <w:r>
+        <w:t>2. Da p → r e p, per il modus ponens, r.</w:t>
+      </w:r>
+    </w:p>
+    <w:p>
+      <w:r>
+        <w:t>3. Da p → q e q → s, per il sillogismo ipotetico, p → s.</w:t>
+      </w:r>
+    </w:p>
+    <w:p>
+      <w:r>
+        <w:t>4. Da p → s e p, per il modus ponens, s.</w:t>
+      </w:r>
+    </w:p>
+    <w:p>
+      <w:r>
+        <w:t>5. Da r e s, per la congiunzione, r ∧ s.</w:t>
+      </w:r>
+    </w:p>
+    <w:p>
+      <w:r>
+        <w:t>Poiché r ∧ s dice che la squadra batte la seconda e la terza, la conclusione segue dalle ipotesi.</w:t>
+      </w:r>
+    </w:p>
+    <w:p>
+      <w:pPr>
+        <w:pStyle w:val="Titolo2"/>
+      </w:pPr>
+      <w:r>
+        <w:rPr>
+          <w:b/>
+          <w:color w:val="E97132"/>
+        </w:rPr>
+        <w:t>Un consiglio pratico</w:t>
+      </w:r>
+    </w:p>
+    <w:p>
+      <w:r>
+        <w:t xml:space="preserve">La </w:t>
+      </w:r>
+      <w:r>
+        <w:rPr>
+          <w:highlight w:val="yellow"/>
+        </w:rPr>
+        <w:t>validità di un argomento molto breve si può verificare con una tavola di verità, ma, nella pratica, argomenti e dimostrazioni usano le regole di inferenza</w:t>
+      </w:r>
+      <w:r>
+        <w:t>: le tavole crescono in modo esponenziale con il numero di proposizioni (capitolo 18), mentre una catena di regole resta corta e leggibile.</w:t>
+      </w:r>
+    </w:p>
+    <w:p>
+      <w:pPr>
+        <w:pStyle w:val="Titolo1"/>
+        <w:rPr>
+          <w:b/>
+          <w:color w:val="EE0000"/>
+        </w:rPr>
+      </w:pPr>
+    </w:p>
+    <w:p>
+      <w:pPr>
+        <w:pStyle w:val="Titolo1"/>
+      </w:pPr>
+      <w:r>
+        <w:rPr>
+          <w:b/>
+          <w:color w:val="EE0000"/>
+        </w:rPr>
+        <w:t>20. Predicati, Dominio del Discorso e Variabili</w:t>
+      </w:r>
+    </w:p>
+    <w:p>
+      <w:pPr>
+        <w:pStyle w:val="Titolo2"/>
+      </w:pPr>
+      <w:r>
+        <w:rPr>
+          <w:b/>
+          <w:color w:val="E97132"/>
+        </w:rPr>
+        <w:t>Perché non basta la logica proposizionale</w:t>
+      </w:r>
+    </w:p>
+    <w:p>
+      <w:r>
+        <w:t xml:space="preserve">Dopo la logica proposizionale (capitoli 12-19) si passa alla </w:t>
+      </w:r>
+      <w:r>
+        <w:rPr>
+          <w:b/>
+        </w:rPr>
+        <w:t>logica dei quantificatori</w:t>
+      </w:r>
+      <w:r>
+        <w:t xml:space="preserve">. Come sottolineato a lezione, la si tratta con più dettaglio di quanto facciano i corsi di matematica, ma per un motivo diverso: lo scopo è preparare alla possibilità di </w:t>
+      </w:r>
+      <w:r>
+        <w:rPr>
+          <w:b/>
+        </w:rPr>
+        <w:t>meccanizzare il ragionamento</w:t>
+      </w:r>
+      <w:r>
+        <w:t>, cioè insegnare a un computer a controllare una dimostrazione e a cercare delle verità. Per questo bisogna conoscere con precisione le definizioni di connettivo, di quantificatore e le regole di inferenza, più di quanto servirebbe per capire una dimostrazione di matematica; gli esempi di prove che si fanno sono volutamente troppo semplici per un corso di matematica, ma servono a capire che cos'è una prova e come si controlla se è corretta.</w:t>
+      </w:r>
+    </w:p>
+    <w:p>
+      <w:r>
         <w:lastRenderedPageBreak/>
-        <w:t>Argomenti in più passaggi</w:t>
-      </w:r>
-    </w:p>
-    <w:p>
-      <w:r>
-        <w:t>Quando un argomento non coincide con una sola regola, si procede a passi, applicando una regola alla volta e usando le conclusioni intermedie come nuove ipotesi.</w:t>
-      </w:r>
-    </w:p>
-    <w:p>
-      <w:r>
-        <w:rPr>
-          <w:b/>
-        </w:rPr>
-        <w:t>Il bug nei moduli.</w:t>
-      </w:r>
-      <w:r>
-        <w:t xml:space="preserve"> Si ripete l'argomento d'apertura con p = «il bug è nel modulo 17», q = «il bug è nel modulo 81» e r = «il bug è un errore numerico». Le ipotesi sono p ∨ q, r e r → ¬q (il modulo 81 non ha errori numerici, quindi se il bug è numerico non è nel 81). Da r → ¬q e r, per il modus ponens si ricava ¬q. Da p ∨ q e ¬q, per il sillogismo disgiuntivo, si ricava p: il bug è nel modulo 17. L'argomento è valido.</w:t>
-      </w:r>
-    </w:p>
-    <w:p>
-      <w:r>
-        <w:rPr>
-          <w:b/>
-        </w:rPr>
-        <w:t>La squadra.</w:t>
-      </w:r>
-      <w:r>
-        <w:t xml:space="preserve"> Sono date le ipotesi: se la squadra prende un buon difensore, può battere la prima avversaria; se può battere la prima, può battere la seconda; se può battere la prima, può battere la terza; la squadra prende un buon difensore. Si vuole mostrare che ne segue che la squadra può battere la seconda e la terza. Con p = «prende un buon difensore», q = «batte la prima», r = «batte la seconda» e s = «batte la terza», le ipotesi sono p → q, q → r, q → s e p.</w:t>
-      </w:r>
-    </w:p>
-    <w:p>
-      <w:r>
-        <w:t>1. Da p → q e q → r, per il sillogismo ipotetico, p → r.</w:t>
-      </w:r>
-    </w:p>
-    <w:p>
-      <w:r>
-        <w:t>2. Da p → r e p, per il modus ponens, r.</w:t>
-      </w:r>
-    </w:p>
-    <w:p>
-      <w:r>
-        <w:t>3. Da p → q e q → s, per il sillogismo ipotetico, p → s.</w:t>
-      </w:r>
-    </w:p>
-    <w:p>
-      <w:r>
-        <w:t>4. Da p → s e p, per il modus ponens, s.</w:t>
-      </w:r>
-    </w:p>
-    <w:p>
-      <w:r>
-        <w:t>5. Da r e s, per la congiunzione, r ∧ s.</w:t>
-      </w:r>
-    </w:p>
-    <w:p>
-      <w:r>
-        <w:t>Poiché r ∧ s dice che la squadra batte la seconda e la terza, la conclusione segue dalle ipotesi.</w:t>
+        <w:t>La logica proposizionale dei capitoli precedenti non basta a descrivere la maggior parte degli enunciati della matematica e dell'informatica. Si prenda l'affermazione «n è un intero dispari»: non è una proposizione, perché è vera o falsa a seconda del valore di n (è vera per n = 103 e falsa per n = 8). Siccome quasi tutti gli enunciati usano variabili, bisogna estendere la logica per includerle.</w:t>
       </w:r>
     </w:p>
     <w:p>
@@ -13890,79 +14181,6 @@
           <w:b/>
           <w:color w:val="E97132"/>
         </w:rPr>
-        <w:t>Un consiglio pratico</w:t>
-      </w:r>
-    </w:p>
-    <w:p>
-      <w:r>
-        <w:t>La validità di un argomento molto breve si può verificare con una tavola di verità, ma, nella pratica, argomenti e dimostrazioni usano le regole di inferenza: le tavole crescono in modo esponenziale con il numero di proposizioni (capitolo 18), mentre una catena di regole resta corta e leggibile.</w:t>
-      </w:r>
-    </w:p>
-    <w:p>
-      <w:pPr>
-        <w:pStyle w:val="Titolo1"/>
-      </w:pPr>
-      <w:r>
-        <w:rPr>
-          <w:b/>
-          <w:color w:val="EE0000"/>
-        </w:rPr>
-        <w:t>20. Predicati, Dominio del Discorso e Variabili</w:t>
-      </w:r>
-    </w:p>
-    <w:p>
-      <w:pPr>
-        <w:pStyle w:val="Titolo2"/>
-      </w:pPr>
-      <w:r>
-        <w:rPr>
-          <w:b/>
-          <w:color w:val="E97132"/>
-        </w:rPr>
-        <w:t>Perché non basta la logica proposizionale</w:t>
-      </w:r>
-    </w:p>
-    <w:p>
-      <w:r>
-        <w:rPr/>
-        <w:t xml:space="preserve">Dopo la logica proposizionale (capitoli 12-19) si passa alla </w:t>
-      </w:r>
-      <w:r>
-        <w:rPr>
-          <w:b/>
-        </w:rPr>
-        <w:t>logica dei quantificatori</w:t>
-      </w:r>
-      <w:r>
-        <w:rPr/>
-        <w:t xml:space="preserve">. Come sottolineato a lezione, la si tratta con più dettaglio di quanto facciano i corsi di matematica, ma per un motivo diverso: lo scopo è preparare alla possibilità di </w:t>
-      </w:r>
-      <w:r>
-        <w:rPr>
-          <w:b/>
-        </w:rPr>
-        <w:t>meccanizzare il ragionamento</w:t>
-      </w:r>
-      <w:r>
-        <w:rPr/>
-        <w:t>, cioè insegnare a un computer a controllare una dimostrazione e a cercare delle verità. Per questo bisogna conoscere con precisione le definizioni di connettivo, di quantificatore e le regole di inferenza, più di quanto servirebbe per capire una dimostrazione di matematica; gli esempi di prove che si fanno sono volutamente troppo semplici per un corso di matematica, ma servono a capire che cos'è una prova e come si controlla se è corretta.</w:t>
-      </w:r>
-    </w:p>
-    <w:p>
-      <w:r>
-        <w:rPr/>
-        <w:t>La logica proposizionale dei capitoli precedenti non basta a descrivere la maggior parte degli enunciati della matematica e dell'informatica. Si prenda l'affermazione «n è un intero dispari»: non è una proposizione, perché è vera o falsa a seconda del valore di n (è vera per n = 103 e falsa per n = 8). Siccome quasi tutti gli enunciati usano variabili, bisogna estendere la logica per includerle.</w:t>
-      </w:r>
-    </w:p>
-    <w:p>
-      <w:pPr>
-        <w:pStyle w:val="Titolo2"/>
-      </w:pPr>
-      <w:r>
-        <w:rPr>
-          <w:b/>
-          <w:color w:val="E97132"/>
-        </w:rPr>
         <w:t>Funzione proposizionale (o predicato)</w:t>
       </w:r>
     </w:p>
@@ -13974,7 +14192,6 @@
         <w:t>Definizione.</w:t>
       </w:r>
       <w:r>
-        <w:rPr/>
         <w:t xml:space="preserve"> Sia P(x) un enunciato che contiene la variabile x e sia D un insieme. P si chiama </w:t>
       </w:r>
       <w:r>
@@ -13984,7 +14201,6 @@
         <w:t>funzione proposizionale</w:t>
       </w:r>
       <w:r>
-        <w:rPr/>
         <w:t xml:space="preserve"> o </w:t>
       </w:r>
       <w:r>
@@ -13994,7 +14210,6 @@
         <w:t>predicato</w:t>
       </w:r>
       <w:r>
-        <w:rPr/>
         <w:t xml:space="preserve"> (rispetto a D) se per ogni x ∈ D l'enunciato P(x) è una proposizione. L'insieme D si chiama </w:t>
       </w:r>
       <w:r>
@@ -14004,13 +14219,11 @@
         <w:t>dominio del discorso</w:t>
       </w:r>
       <w:r>
-        <w:rPr/>
         <w:t xml:space="preserve"> di P e specifica i valori ammessi per x.</w:t>
       </w:r>
     </w:p>
     <w:p>
       <w:r>
-        <w:rPr/>
         <w:t xml:space="preserve">Un predicato da solo non è né vero né falso: lo diventano le singole proposizioni P(x) quando alla variabile si assegna un valore del dominio. Si può pensare al predicato come a una </w:t>
       </w:r>
       <w:r>
@@ -14020,13 +14233,11 @@
         <w:t>famiglia di proposizioni</w:t>
       </w:r>
       <w:r>
-        <w:rPr/>
         <w:t>, una per ogni elemento del dominio: se D = ℤ⁺ (gli interi positivi: ℤ è il nome degli interi, ℤ⁺ è riservato a 1, 2, 3, …) si ottiene la famiglia P(1), P(2), …, e ciascuna è vera o falsa ma non entrambe.</w:t>
       </w:r>
     </w:p>
     <w:p>
       <w:r>
-        <w:rPr/>
         <w:t xml:space="preserve">Il dominio serve perché certe sostituzioni non avrebbero senso: «π è un numero dispari» non significa nulla, perché si parla di interi. Un predicato può anche avere </w:t>
       </w:r>
       <w:r>
@@ -14036,7 +14247,6 @@
         <w:t>più variabili</w:t>
       </w:r>
       <w:r>
-        <w:rPr/>
         <w:t>, come una funzione può avere più argomenti: il test di uguaglianza tra due stringhe, che si incontra in programmazione, è un predicato a due variabili sull'insieme delle sequenze di caratteri.</w:t>
       </w:r>
     </w:p>
@@ -14048,19 +14258,16 @@
         <w:t>Esempio.</w:t>
       </w:r>
       <w:r>
-        <w:rPr/>
         <w:t xml:space="preserve"> Sia P(n) = «n è un intero dispari», con dominio ℤ⁺. Allora P(1) = «1 è dispari» è vera e P(2) = «2 è dispari» è falsa.</w:t>
       </w:r>
     </w:p>
     <w:p>
       <w:r>
-        <w:rPr/>
         <w:t>In programmazione succede lo stesso: l'affermazione x &lt; y non è né vera né falsa finché non si assegnano valori a x e a y; con x = 3 e y = 2 diventa 3 &lt; 2, che è falsa. Come in logica proposizionale, si possono quindi scrivere anche enunciati falsi (come «2 è un numero dispari»): servono proprio perché si vuole insegnare a un computer a distinguere tra vero e falso, a dare una garanzia quando un'affermazione è vera o a smentire una convinzione sbagliata.</w:t>
       </w:r>
     </w:p>
     <w:p>
       <w:r>
-        <w:rPr/>
         <w:t>Esempi di funzioni proposizionali, con il loro dominio:</w:t>
       </w:r>
     </w:p>
@@ -14072,7 +14279,6 @@
         </w:numPr>
       </w:pPr>
       <w:r>
-        <w:rPr/>
         <w:t>n² + 2n è dispari (dominio ℤ⁺);</w:t>
       </w:r>
     </w:p>
@@ -14084,7 +14290,6 @@
         </w:numPr>
       </w:pPr>
       <w:r>
-        <w:rPr/>
         <w:t>x² − x − 6 = 0 (dominio ℝ);</w:t>
       </w:r>
     </w:p>
@@ -14096,7 +14301,6 @@
         </w:numPr>
       </w:pPr>
       <w:r>
-        <w:rPr/>
         <w:t>«il giocatore ha battuto sopra .300 nel 2015» (dominio: i giocatori di baseball);</w:t>
       </w:r>
     </w:p>
@@ -14108,19 +14312,16 @@
         </w:numPr>
       </w:pPr>
       <w:r>
-        <w:rPr/>
         <w:t>«il film ha una valutazione superiore al 20% su Rotten Tomatoes», con la scala da 0% a 100% (dominio: i film valutati dal sito).</w:t>
       </w:r>
     </w:p>
     <w:p>
       <w:r>
-        <w:rPr/>
         <w:t>Negli ultimi due la variabile è «giocatore» o «film»: sostituendo un giocatore o un film particolare si ottiene una proposizione (vera con Spectre, che ha il 64%; falsa con Blended, che ha il 14%). Ciò che è un parametro con valore già assegnato, come il 20% o il nome del sito, non è la variabile: cambiando sito o soglia cambia la funzione, ma resta una funzione proposizionale nella sola variabile film.</w:t>
       </w:r>
     </w:p>
     <w:p>
       <w:r>
-        <w:rPr/>
         <w:t xml:space="preserve">Un predicato può essere </w:t>
       </w:r>
       <w:r>
@@ -14130,7 +14331,6 @@
         <w:t>sempre vero</w:t>
       </w:r>
       <w:r>
-        <w:rPr/>
         <w:t xml:space="preserve">, </w:t>
       </w:r>
       <w:r>
@@ -14140,7 +14340,6 @@
         <w:t>sempre falso</w:t>
       </w:r>
       <w:r>
-        <w:rPr/>
         <w:t>, oppure vero in qualche caso e falso in altri. Per x² − x − 6 = 0 su ℝ basta risolvere l'equazione di secondo grado: le radici sono 3 e −2, quindi il predicato è vero solo per x = 3 e x = −2 e falso in tutti gli altri casi (con x = 10 si ha 100 − 10 − 6 = 84).</w:t>
       </w:r>
     </w:p>
@@ -14158,7 +14357,6 @@
     </w:p>
     <w:p>
       <w:r>
-        <w:rPr/>
         <w:t xml:space="preserve">Si chiama </w:t>
       </w:r>
       <w:r>
@@ -14168,7 +14366,6 @@
         <w:t>variabile libera</w:t>
       </w:r>
       <w:r>
-        <w:rPr/>
         <w:t xml:space="preserve"> una variabile non ancora assegnata (è «libera» di spaziare su tutto il dominio), e </w:t>
       </w:r>
       <w:r>
@@ -14178,13 +14375,12 @@
         <w:t>variabile legata</w:t>
       </w:r>
       <w:r>
-        <w:rPr/>
         <w:t xml:space="preserve"> una variabile a cui è stato assegnato un valore oppure che compare dentro un quantificatore, nel qual caso si intende che prende tutti i valori del dominio.</w:t>
       </w:r>
     </w:p>
     <w:p>
       <w:r>
-        <w:rPr/>
+        <w:lastRenderedPageBreak/>
         <w:t xml:space="preserve">Una funzione proposizionale non ha un valore di verità. Un enunciato con variabili libere </w:t>
       </w:r>
       <w:r>
@@ -14194,7 +14390,6 @@
         <w:t>non è una proposizione</w:t>
       </w:r>
       <w:r>
-        <w:rPr/>
         <w:t xml:space="preserve">; un enunciato senza variabili libere (tutte legate) </w:t>
       </w:r>
       <w:r>
@@ -14204,13 +14399,11 @@
         <w:t>è una proposizione</w:t>
       </w:r>
       <w:r>
-        <w:rPr/>
         <w:t>, e ha un valore di verità.</w:t>
       </w:r>
     </w:p>
     <w:p>
       <w:r>
-        <w:rPr/>
         <w:t xml:space="preserve">Due esempi di enunciati senza variabili libere: «per ogni triangolo T, la somma degli angoli di T è 180°» (un teorema di geometria euclidea) e «esiste un programma P il cui output è P stesso» (in informatica; ne sono un esempio i virus, che devono saper produrre in output sé stessi per riprodursi, cosa più facile in un linguaggio a basso livello dove si sa in quali celle sta il programma). Per dare un significato a enunciati di questo tipo si dovrebbero prendere tutti i triangoli, o tutti i programmi, e controllarli: un metodo puramente ideale, perché sono infiniti. Sono esempi di </w:t>
       </w:r>
       <w:r>
@@ -14220,7 +14413,6 @@
         <w:t>quantificazione</w:t>
       </w:r>
       <w:r>
-        <w:rPr/>
         <w:t>, introdotta nei capitoli seguenti: il capitolo 21 tratta «per ogni», il capitolo 22 tratta «esiste».</w:t>
       </w:r>
     </w:p>
@@ -14250,7 +14442,6 @@
     </w:p>
     <w:p>
       <w:r>
-        <w:rPr/>
         <w:t xml:space="preserve">Un enunciato della forma «per ogni x, P(x)» si dice </w:t>
       </w:r>
       <w:r>
@@ -14260,7 +14451,6 @@
         <w:t>enunciato quantificato universalmente</w:t>
       </w:r>
       <w:r>
-        <w:rPr/>
         <w:t xml:space="preserve">. Il simbolo ∀ significa «per ogni» e si chiama </w:t>
       </w:r>
       <w:r>
@@ -14270,7 +14460,6 @@
         <w:t>quantificatore universale</w:t>
       </w:r>
       <w:r>
-        <w:rPr/>
         <w:t>: l'enunciato si scrive ∀x P(x). Nel linguaggio naturale, in inglese, «for all», «for any» e «for every» sono sinonimi; il simbolo ∀ si può leggere in tutti questi modi. È «universale» perché tutti gli oggetti del discorso devono avere la proprietà.</w:t>
       </w:r>
     </w:p>
@@ -14282,7 +14471,6 @@
         <w:t>Definizione.</w:t>
       </w:r>
       <w:r>
-        <w:rPr/>
         <w:t xml:space="preserve"> Sia P una funzione proposizionale con dominio D. L'enunciato ∀x P(x) è </w:t>
       </w:r>
       <w:r>
@@ -14292,7 +14480,6 @@
         <w:t>vero</w:t>
       </w:r>
       <w:r>
-        <w:rPr/>
         <w:t xml:space="preserve"> se P(x) è vera per ogni x ∈ D. È </w:t>
       </w:r>
       <w:r>
@@ -14302,13 +14489,11 @@
         <w:t>falso</w:t>
       </w:r>
       <w:r>
-        <w:rPr/>
         <w:t xml:space="preserve"> se P(x) è falsa per almeno un x ∈ D.</w:t>
       </w:r>
     </w:p>
     <w:p>
       <w:r>
-        <w:rPr/>
         <w:t xml:space="preserve">Come sottolineato a lezione, per decidere il valore di un quantificatore si assegnano alla funzione tutti i possibili valori del dominio e si controlla che siano tutti veri. Ne basta </w:t>
       </w:r>
       <w:r>
@@ -14318,7 +14503,6 @@
         <w:t>uno falso</w:t>
       </w:r>
       <w:r>
-        <w:rPr/>
         <w:t xml:space="preserve"> su infiniti perché il quantificatore sia falso: non è una questione di probabilità. Si lavora con due soli valori di verità, quindi non esistono gradazioni come «quasi sempre vero» (quelle appartengono a studi molto più avanzati).</w:t>
       </w:r>
     </w:p>
@@ -14328,22 +14512,26 @@
         <w:jc w:val="center"/>
       </w:pPr>
       <w:r>
+        <w:rPr>
+          <w:noProof/>
+        </w:rPr>
         <w:drawing>
-          <wp:inline xmlns:a="http://schemas.openxmlformats.org/drawingml/2006/main" xmlns:pic="http://schemas.openxmlformats.org/drawingml/2006/picture">
+          <wp:inline distT="0" distB="0" distL="0" distR="0" wp14:anchorId="1CDAE8E9" wp14:editId="1525E3A7">
             <wp:extent cx="4860000" cy="2129699"/>
+            <wp:effectExtent l="0" t="0" r="0" b="0"/>
             <wp:docPr id="2073952353" name="Picture 2073952353"/>
             <wp:cNvGraphicFramePr>
-              <a:graphicFrameLocks noChangeAspect="1"/>
+              <a:graphicFrameLocks xmlns:a="http://schemas.openxmlformats.org/drawingml/2006/main" noChangeAspect="1"/>
             </wp:cNvGraphicFramePr>
-            <a:graphic>
+            <a:graphic xmlns:a="http://schemas.openxmlformats.org/drawingml/2006/main">
               <a:graphicData uri="http://schemas.openxmlformats.org/drawingml/2006/picture">
-                <pic:pic>
+                <pic:pic xmlns:pic="http://schemas.openxmlformats.org/drawingml/2006/picture">
                   <pic:nvPicPr>
                     <pic:cNvPr id="0" name="logica_quantificatori_dominio.png"/>
                     <pic:cNvPicPr/>
                   </pic:nvPicPr>
                   <pic:blipFill>
-                    <a:blip r:embed="rId30"/>
+                    <a:blip r:embed="rId28"/>
                     <a:stretch>
                       <a:fillRect/>
                     </a:stretch>
@@ -14353,7 +14541,9 @@
                       <a:off x="0" y="0"/>
                       <a:ext cx="4860000" cy="2129699"/>
                     </a:xfrm>
-                    <a:prstGeom prst="rect"/>
+                    <a:prstGeom prst="rect">
+                      <a:avLst/>
+                    </a:prstGeom>
                   </pic:spPr>
                 </pic:pic>
               </a:graphicData>
@@ -14376,7 +14566,6 @@
     </w:p>
     <w:p>
       <w:r>
-        <w:rPr/>
         <w:t xml:space="preserve">Un valore di x del dominio che rende P(x) falsa si chiama </w:t>
       </w:r>
       <w:r>
@@ -14386,7 +14575,6 @@
         <w:t>controesempio</w:t>
       </w:r>
       <w:r>
-        <w:rPr/>
         <w:t xml:space="preserve"> all'enunciato ∀x P(x).</w:t>
       </w:r>
     </w:p>
@@ -14404,7 +14592,6 @@
     </w:p>
     <w:p>
       <w:r>
-        <w:rPr/>
         <w:t>Il dominio del discorso è essenziale, perché lo stesso enunciato può essere vero in un dominio e falso in un altro. Si consideri ∀x (x² ≥ 0).</w:t>
       </w:r>
     </w:p>
@@ -14416,7 +14603,6 @@
         </w:numPr>
       </w:pPr>
       <w:r>
-        <w:rPr/>
         <w:t xml:space="preserve">Con dominio ℝ è </w:t>
       </w:r>
       <w:r>
@@ -14426,7 +14612,6 @@
         <w:t>vero</w:t>
       </w:r>
       <w:r>
-        <w:rPr/>
         <w:t>: per ogni numero reale il quadrato è positivo o nullo (se x &gt; 0 il quadrato è positivo, se x = 0 è zero, se x &lt; 0 il quadrato è positivo).</w:t>
       </w:r>
     </w:p>
@@ -14438,7 +14623,7 @@
         </w:numPr>
       </w:pPr>
       <w:r>
-        <w:rPr/>
+        <w:lastRenderedPageBreak/>
         <w:t xml:space="preserve">Con dominio ℂ è </w:t>
       </w:r>
       <w:r>
@@ -14448,16 +14633,11 @@
         <w:t>falso</w:t>
       </w:r>
       <w:r>
-        <w:rPr/>
-        <w:t>: prendendo x = √(−1) = i si ha x² = −1, che non è ≥ 0 (e un controesempio basta).</w:t>
-      </w:r>
-      <w:r>
-        <w:t xml:space="preserve"> (su ℂ la disuguaglianza ha senso solo per i numeri reali, quindi qui si considera falsa per x non reale).</w:t>
-      </w:r>
-    </w:p>
-    <w:p>
-      <w:r>
-        <w:rPr/>
+        <w:t>: prendendo x = √(−1) = i si ha x² = −1, che non è ≥ 0 (e un controesempio basta). (su ℂ la disuguaglianza ha senso solo per i numeri reali, quindi qui si considera falsa per x non reale).</w:t>
+      </w:r>
+    </w:p>
+    <w:p>
+      <w:r>
         <w:t xml:space="preserve">Un secondo esempio, sempre con dominio ℝ: ∀x (x² − 1 &gt; 0). È </w:t>
       </w:r>
       <w:r>
@@ -14467,7 +14647,6 @@
         <w:t>falso</w:t>
       </w:r>
       <w:r>
-        <w:rPr/>
         <w:t>: per x = 1 la proposizione 1² − 1 &gt; 0 è falsa, e 1 è un controesempio. Ci sono tantissimi valori che rendono vera la funzione (per esempio x = 10 dà 99 &gt; 0 e x = 5 dà 24 &gt; 0), ma il quantificatore universale è falso lo stesso, perché basta un'eccezione. In realtà tutti i valori da −1 a +1, zero compreso, sono controesempi: per un x con |x| ≤ 1 il quadrato è minore o uguale a 1, e x² − 1 non è positivo.</w:t>
       </w:r>
     </w:p>
@@ -14485,7 +14664,6 @@
     </w:p>
     <w:p>
       <w:r>
-        <w:rPr/>
         <w:t xml:space="preserve">Per provare che ∀x P(x) è vero bisogna, in sostanza, esaminare </w:t>
       </w:r>
       <w:r>
@@ -14495,7 +14673,6 @@
         <w:t>ogni</w:t>
       </w:r>
       <w:r>
-        <w:rPr/>
         <w:t xml:space="preserve"> valore di x del dominio e mostrare che P(x) è vera. Una tecnica è porre che x sia un elemento </w:t>
       </w:r>
       <w:r>
@@ -14505,7 +14682,6 @@
         <w:t>arbitrario</w:t>
       </w:r>
       <w:r>
-        <w:rPr/>
         <w:t xml:space="preserve"> del dominio D e procedere con il simbolo x: qualunque cosa si affermi su x deve valere per qualsiasi valore x possa avere in D, e il ragionamento deve concludere che P(x) è vera. Mostrare che P(x) è vera per un valore particolare </w:t>
       </w:r>
       <w:r>
@@ -14515,13 +14691,11 @@
         <w:t>non</w:t>
       </w:r>
       <w:r>
-        <w:rPr/>
         <w:t xml:space="preserve"> dimostra che ∀x P(x) sia vero.</w:t>
       </w:r>
     </w:p>
     <w:p>
       <w:r>
-        <w:rPr/>
         <w:t>Per specificare il dominio si scrive anche: per ogni x ∈ D, P(x).</w:t>
       </w:r>
     </w:p>
@@ -14533,7 +14707,6 @@
         <w:t>Esempio.</w:t>
       </w:r>
       <w:r>
-        <w:rPr/>
         <w:t xml:space="preserve"> Si verifica che l'enunciato «per ogni numero reale x, se x &gt; 1 allora x + 1 &gt; 1» è vero. Sia x un reale qualunque. Allora vale x ≤ 1 oppure x &gt; 1.</w:t>
       </w:r>
     </w:p>
@@ -14545,7 +14718,6 @@
         </w:numPr>
       </w:pPr>
       <w:r>
-        <w:rPr/>
         <w:t xml:space="preserve">Se x ≤ 1, l'implicazione «se x &gt; 1 allora x + 1 &gt; 1» è </w:t>
       </w:r>
       <w:r>
@@ -14555,7 +14727,6 @@
         <w:t>vera per difetto</w:t>
       </w:r>
       <w:r>
-        <w:rPr/>
         <w:t>: l'ipotesi è falsa e, come visto nel capitolo 16, un'implicazione con ipotesi falsa è vera qualunque sia la tesi (nella maggior parte delle dimostrazioni questo caso si omette).</w:t>
       </w:r>
     </w:p>
@@ -14567,19 +14738,16 @@
         </w:numPr>
       </w:pPr>
       <w:r>
-        <w:rPr/>
         <w:t>Se x &gt; 1, qualunque sia il valore di x si ha x + 1 &gt; x; da x + 1 &gt; x e x &gt; 1 si conclude che x + 1 &gt; 1, quindi la conclusione è vera e l'implicazione è vera.</w:t>
       </w:r>
     </w:p>
     <w:p>
       <w:r>
-        <w:rPr/>
         <w:t>In entrambi i casi l'implicazione è vera, quindi l'enunciato quantificato è vero.</w:t>
       </w:r>
     </w:p>
     <w:p>
       <w:r>
-        <w:rPr/>
         <w:t xml:space="preserve">Il lettore interessato alla «meccanizzazione» può notare che questa prova usa passaggi più piccoli: la compatibilità del maggiore con la somma (da x &gt; 1 si ricava x + 1 &gt; 1 + 1, aggiungendo 1 a entrambi i lati), il calcolo 1 + 1 &gt; 1 e la </w:t>
       </w:r>
       <w:r>
@@ -14589,13 +14757,11 @@
         <w:t>transitività</w:t>
       </w:r>
       <w:r>
-        <w:rPr/>
         <w:t xml:space="preserve"> del maggiore (se a &gt; b e b &gt; c allora a &gt; c). Un corso di matematica chiede di saper fare questi ragionamenti direttamente, senza spiegare i passaggi più piccoli, ma per una macchina tutto deve essere precisato.</w:t>
       </w:r>
     </w:p>
     <w:p>
       <w:r>
-        <w:rPr/>
         <w:t xml:space="preserve">Dimostrare che ∀x P(x) è </w:t>
       </w:r>
       <w:r>
@@ -14605,7 +14771,6 @@
         <w:t>falso</w:t>
       </w:r>
       <w:r>
-        <w:rPr/>
         <w:t xml:space="preserve"> è molto più semplice: basta trovare </w:t>
       </w:r>
       <w:r>
@@ -14615,7 +14780,6 @@
         <w:t>un</w:t>
       </w:r>
       <w:r>
-        <w:rPr/>
         <w:t xml:space="preserve"> controesempio.</w:t>
       </w:r>
     </w:p>
@@ -14633,7 +14797,6 @@
     </w:p>
     <w:p>
       <w:r>
-        <w:rPr/>
         <w:t xml:space="preserve">Se il dominio è infinito non c'è un modo ovvio per decidere un quantificatore con la sola definizione: servirebbero infiniti controlli, e un elenco, per quanto lungo, di valori non li esaurisce (esistono metodi migliori, ma appartengono ad altri corsi, di verifica automatica e di intelligenza artificiale). Quando il dominio è </w:t>
       </w:r>
       <w:r>
@@ -14643,7 +14806,6 @@
         <w:t>finito</w:t>
       </w:r>
       <w:r>
-        <w:rPr/>
         <w:t>, invece, si può scrivere un programma. Sia D = {d₁, …, d</w:t>
       </w:r>
       <w:r>
@@ -14653,54 +14815,114 @@
         <w:t>n</w:t>
       </w:r>
       <w:r>
-        <w:rPr/>
         <w:t>} (per esempio gli elementi di un vettore) e sia P una funzione proposizionale su D. Questo pseudocodice (non è un linguaggio particolare) decide ∀x P(x):</w:t>
       </w:r>
     </w:p>
     <w:p>
       <w:pPr>
-        <w:spacing w:after="0" w:before="0" w:line="240" w:lineRule="auto"/>
+        <w:spacing w:after="0" w:line="240" w:lineRule="auto"/>
+        <w:rPr>
+          <w:lang w:val="en-US"/>
+        </w:rPr>
       </w:pPr>
       <w:r>
         <w:rPr>
           <w:rFonts w:ascii="Consolas" w:hAnsi="Consolas" w:cs="Consolas"/>
           <w:sz w:val="17"/>
-        </w:rPr>
-        <w:t>for i = 1 to n</w:t>
-      </w:r>
-    </w:p>
-    <w:p>
-      <w:pPr>
-        <w:spacing w:after="0" w:before="0" w:line="240" w:lineRule="auto"/>
-      </w:pPr>
+          <w:lang w:val="en-US"/>
+        </w:rPr>
+        <w:t xml:space="preserve">for </w:t>
+      </w:r>
+      <w:proofErr w:type="spellStart"/>
       <w:r>
         <w:rPr>
           <w:rFonts w:ascii="Consolas" w:hAnsi="Consolas" w:cs="Consolas"/>
           <w:sz w:val="17"/>
-        </w:rPr>
-        <w:t xml:space="preserve">    if (¬P(d_i))</w:t>
-      </w:r>
-    </w:p>
-    <w:p>
-      <w:pPr>
-        <w:spacing w:after="0" w:before="0" w:line="240" w:lineRule="auto"/>
-      </w:pPr>
+          <w:lang w:val="en-US"/>
+        </w:rPr>
+        <w:t>i</w:t>
+      </w:r>
+      <w:proofErr w:type="spellEnd"/>
       <w:r>
         <w:rPr>
           <w:rFonts w:ascii="Consolas" w:hAnsi="Consolas" w:cs="Consolas"/>
           <w:sz w:val="17"/>
-        </w:rPr>
-        <w:t xml:space="preserve">        return false</w:t>
-      </w:r>
-    </w:p>
-    <w:p>
-      <w:pPr>
-        <w:spacing w:after="0" w:before="0" w:line="240" w:lineRule="auto"/>
+          <w:lang w:val="en-US"/>
+        </w:rPr>
+        <w:t xml:space="preserve"> = 1 to n</w:t>
+      </w:r>
+    </w:p>
+    <w:p>
+      <w:pPr>
+        <w:spacing w:after="0" w:line="240" w:lineRule="auto"/>
+        <w:rPr>
+          <w:lang w:val="en-US"/>
+        </w:rPr>
       </w:pPr>
       <w:r>
         <w:rPr>
           <w:rFonts w:ascii="Consolas" w:hAnsi="Consolas" w:cs="Consolas"/>
           <w:sz w:val="17"/>
+          <w:lang w:val="en-US"/>
+        </w:rPr>
+        <w:t xml:space="preserve">    if (¬P(</w:t>
+      </w:r>
+      <w:proofErr w:type="spellStart"/>
+      <w:r>
+        <w:rPr>
+          <w:rFonts w:ascii="Consolas" w:hAnsi="Consolas" w:cs="Consolas"/>
+          <w:sz w:val="17"/>
+          <w:lang w:val="en-US"/>
+        </w:rPr>
+        <w:t>d_i</w:t>
+      </w:r>
+      <w:proofErr w:type="spellEnd"/>
+      <w:r>
+        <w:rPr>
+          <w:rFonts w:ascii="Consolas" w:hAnsi="Consolas" w:cs="Consolas"/>
+          <w:sz w:val="17"/>
+          <w:lang w:val="en-US"/>
+        </w:rPr>
+        <w:t>))</w:t>
+      </w:r>
+    </w:p>
+    <w:p>
+      <w:pPr>
+        <w:spacing w:after="0" w:line="240" w:lineRule="auto"/>
+      </w:pPr>
+      <w:r>
+        <w:rPr>
+          <w:rFonts w:ascii="Consolas" w:hAnsi="Consolas" w:cs="Consolas"/>
+          <w:sz w:val="17"/>
+          <w:lang w:val="en-US"/>
+        </w:rPr>
+        <w:t xml:space="preserve">        </w:t>
+      </w:r>
+      <w:proofErr w:type="spellStart"/>
+      <w:r>
+        <w:rPr>
+          <w:rFonts w:ascii="Consolas" w:hAnsi="Consolas" w:cs="Consolas"/>
+          <w:sz w:val="17"/>
+        </w:rPr>
+        <w:t>return</w:t>
+      </w:r>
+      <w:proofErr w:type="spellEnd"/>
+      <w:r>
+        <w:rPr>
+          <w:rFonts w:ascii="Consolas" w:hAnsi="Consolas" w:cs="Consolas"/>
+          <w:sz w:val="17"/>
+        </w:rPr>
+        <w:t xml:space="preserve"> false</w:t>
+      </w:r>
+    </w:p>
+    <w:p>
+      <w:pPr>
+        <w:spacing w:after="0" w:line="240" w:lineRule="auto"/>
+      </w:pPr>
+      <w:r>
+        <w:rPr>
+          <w:rFonts w:ascii="Consolas" w:hAnsi="Consolas" w:cs="Consolas"/>
+          <w:sz w:val="17"/>
         </w:rPr>
         <w:t>return true</w:t>
       </w:r>
@@ -14708,7 +14930,7 @@
     <w:p/>
     <w:p>
       <w:r>
-        <w:rPr/>
+        <w:lastRenderedPageBreak/>
         <w:t>Il ciclo esamina uno a uno gli elementi del dominio. Se trova un d</w:t>
       </w:r>
       <w:r>
@@ -14718,7 +14940,6 @@
         <w:t>i</w:t>
       </w:r>
       <w:r>
-        <w:rPr/>
         <w:t xml:space="preserve"> per cui P(d</w:t>
       </w:r>
       <w:r>
@@ -14728,7 +14949,6 @@
         <w:t>i</w:t>
       </w:r>
       <w:r>
-        <w:rPr/>
         <w:t>) è falsa, la condizione ¬P(d</w:t>
       </w:r>
       <w:r>
@@ -14738,7 +14958,6 @@
         <w:t>i</w:t>
       </w:r>
       <w:r>
-        <w:rPr/>
         <w:t xml:space="preserve">) dell'if è vera e il programma restituisce </w:t>
       </w:r>
       <w:r>
@@ -14748,7 +14967,6 @@
         <w:t>false</w:t>
       </w:r>
       <w:r>
-        <w:rPr/>
         <w:t xml:space="preserve"> (d</w:t>
       </w:r>
       <w:r>
@@ -14758,7 +14976,6 @@
         <w:t>i</w:t>
       </w:r>
       <w:r>
-        <w:rPr/>
         <w:t xml:space="preserve"> è un controesempio) e termina. Se P(d</w:t>
       </w:r>
       <w:r>
@@ -14768,7 +14985,6 @@
         <w:t>i</w:t>
       </w:r>
       <w:r>
-        <w:rPr/>
         <w:t>) è vera per ogni d</w:t>
       </w:r>
       <w:r>
@@ -14778,7 +14994,6 @@
         <w:t>i</w:t>
       </w:r>
       <w:r>
-        <w:rPr/>
         <w:t xml:space="preserve">, la condizione dell'if è sempre falsa, il ciclo arriva alla fine e il programma restituisce </w:t>
       </w:r>
       <w:r>
@@ -14788,7 +15003,6 @@
         <w:t>true</w:t>
       </w:r>
       <w:r>
-        <w:rPr/>
         <w:t>. Quindi se ∀x P(x) è vero il ciclo deve arrivare fino in fondo, controllando ogni elemento; se è falso, il ciclo si ferma appena trova un elemento che rende P(x) falsa.</w:t>
       </w:r>
     </w:p>
@@ -14800,7 +15014,6 @@
         <w:t>Trabocchetto d'esame.</w:t>
       </w:r>
       <w:r>
-        <w:rPr/>
         <w:t xml:space="preserve"> Come sottolineato a lezione, è un tipo di programma che si chiede agli esami, e l'errore tipico ha due varianti.</w:t>
       </w:r>
     </w:p>
@@ -14812,7 +15025,6 @@
         </w:numPr>
       </w:pPr>
       <w:r>
-        <w:rPr/>
         <w:t xml:space="preserve">Scrivere un </w:t>
       </w:r>
       <w:r>
@@ -14822,7 +15034,6 @@
         <w:t>else</w:t>
       </w:r>
       <w:r>
-        <w:rPr/>
         <w:t xml:space="preserve"> con </w:t>
       </w:r>
       <w:r>
@@ -14832,7 +15043,6 @@
         <w:t>return true</w:t>
       </w:r>
       <w:r>
-        <w:rPr/>
         <w:t xml:space="preserve"> dentro il ciclo: se P(d₁) è vera non si può concludere che il quantificatore sia vero, perché dipende dagli altri valori che non sono stati controllati. L'if va lasciato senza else: quando P(d</w:t>
       </w:r>
       <w:r>
@@ -14842,7 +15052,6 @@
         <w:t>i</w:t>
       </w:r>
       <w:r>
-        <w:rPr/>
         <w:t>) è vera non c'è abbastanza informazione e il ciclo deve semplicemente passare all'elemento successivo.</w:t>
       </w:r>
     </w:p>
@@ -14854,7 +15063,6 @@
         </w:numPr>
       </w:pPr>
       <w:r>
-        <w:rPr/>
         <w:t xml:space="preserve">Mettere il </w:t>
       </w:r>
       <w:r>
@@ -14864,7 +15072,6 @@
         <w:t>return true</w:t>
       </w:r>
       <w:r>
-        <w:rPr/>
         <w:t xml:space="preserve"> dentro il ciclo o sotto l'if. Il </w:t>
       </w:r>
       <w:r>
@@ -14874,7 +15081,6 @@
         <w:t>return true</w:t>
       </w:r>
       <w:r>
-        <w:rPr/>
         <w:t xml:space="preserve"> finale deve stare </w:t>
       </w:r>
       <w:r>
@@ -14884,7 +15090,6 @@
         <w:t>fuori dal ciclo</w:t>
       </w:r>
       <w:r>
-        <w:rPr/>
         <w:t xml:space="preserve">, allineato con il </w:t>
       </w:r>
       <w:r>
@@ -14894,23 +15099,17 @@
         <w:t>for</w:t>
       </w:r>
       <w:r>
-        <w:rPr/>
         <w:t>: è l'istruzione che si esegue solo se il for finisce senza aver mai trovato un falso. Se fosse dentro, il programma prenderebbe il primo valore di P e lo darebbe per valore del quantificatore, cosa in generale falsa.</w:t>
       </w:r>
     </w:p>
     <w:p>
       <w:r>
-        <w:rPr/>
         <w:t>Cicli di questo tipo sono quelli che cercano un oggetto con una certa proprietà in una banca dati; in un programma reale si cerca anche l'indirizzo dell'oggetto, ma qui interessa solo il valore di verità.</w:t>
       </w:r>
     </w:p>
     <w:p>
       <w:r>
-        <w:rPr/>
-        <w:t>In pratica un ∀ si controlla con un programma solo se il dominio è finito e molto piccolo (anche qualche miliardo): una tavola di verità, per esempio, è di solito un dominio troppo grande, quando il numero di proposizioni atomiche è elevato. Per questo spesso si usano ragionamenti, cioè deduzioni valide in tutti i casi, invece di esplorare tutti i casi.</w:t>
-      </w:r>
-      <w:r>
-        <w:t xml:space="preserve"> Il capitolo successivo introduce l'altro quantificatore, l'esistenziale.</w:t>
+        <w:t>In pratica un ∀ si controlla con un programma solo se il dominio è finito e molto piccolo (anche qualche miliardo): una tavola di verità, per esempio, è di solito un dominio troppo grande, quando il numero di proposizioni atomiche è elevato. Per questo spesso si usano ragionamenti, cioè deduzioni valide in tutti i casi, invece di esplorare tutti i casi. Il capitolo successivo introduce l'altro quantificatore, l'esistenziale.</w:t>
       </w:r>
     </w:p>
     <w:p>
@@ -14939,7 +15138,6 @@
     </w:p>
     <w:p>
       <w:r>
-        <w:rPr/>
         <w:t>Il secondo quantificatore è l'</w:t>
       </w:r>
       <w:r>
@@ -14949,7 +15147,6 @@
         <w:t>esistenziale</w:t>
       </w:r>
       <w:r>
-        <w:rPr/>
         <w:t xml:space="preserve">. Un enunciato della forma «esiste x tale che P(x)» si dice </w:t>
       </w:r>
       <w:r>
@@ -14959,7 +15156,6 @@
         <w:t>enunciato quantificato esistenzialmente</w:t>
       </w:r>
       <w:r>
-        <w:rPr/>
         <w:t xml:space="preserve">; il simbolo ∃ significa «esiste» e si chiama </w:t>
       </w:r>
       <w:r>
@@ -14969,7 +15165,6 @@
         <w:t>quantificatore esistenziale</w:t>
       </w:r>
       <w:r>
-        <w:rPr/>
         <w:t>: l'enunciato si scrive ∃x P(x).</w:t>
       </w:r>
     </w:p>
@@ -14981,7 +15176,6 @@
         <w:t>Definizione.</w:t>
       </w:r>
       <w:r>
-        <w:rPr/>
         <w:t xml:space="preserve"> Sia P una funzione proposizionale con dominio D. L'enunciato ∃x P(x) è </w:t>
       </w:r>
       <w:r>
@@ -14991,7 +15185,6 @@
         <w:t>vero</w:t>
       </w:r>
       <w:r>
-        <w:rPr/>
         <w:t xml:space="preserve"> se P(x) è vera per almeno un x ∈ D. È </w:t>
       </w:r>
       <w:r>
@@ -15001,13 +15194,11 @@
         <w:t>falso</w:t>
       </w:r>
       <w:r>
-        <w:rPr/>
         <w:t xml:space="preserve"> se P(x) è falsa per ogni x ∈ D.</w:t>
       </w:r>
     </w:p>
     <w:p>
       <w:r>
-        <w:rPr/>
         <w:t xml:space="preserve">È la definizione esattamente </w:t>
       </w:r>
       <w:r>
@@ -15017,7 +15208,6 @@
         <w:t>duale</w:t>
       </w:r>
       <w:r>
-        <w:rPr/>
         <w:t xml:space="preserve"> di quella dell'universale: basta scambiare il vero con il falso. Il quantificatore universale è vero quando tutti i valori sono veri e falso se anche uno solo è falso; l'esistenziale è falso quando tutti i valori sono falsi e vero se anche uno solo è vero. In inglese si può dire «there exists», «for some», «for at least one»; il simbolo ∃ si legge in tutti questi modi. Non si chiede che il valore sia unico: l'esistenziale è vero se P(x) vale per un solo valore, per due, per un numero qualunque di valori, anche infiniti, e anche per tutti.</w:t>
       </w:r>
     </w:p>
@@ -15041,7 +15231,6 @@
         <w:t>Un esistenziale vero.</w:t>
       </w:r>
       <w:r>
-        <w:rPr/>
         <w:t xml:space="preserve"> ∃x (x/(x² + 1) = 2/5), con dominio ℝ. È vero: basta un numero reale per cui valga l'uguaglianza, e x = 2 funziona, perché 2/(2² + 1) = 2/5. Non vale per ogni x (con x = 1 si ha 1/2, e 1/2 ≠ 2/5). Un secondo valore che la soddisfa è x = 1/2 (il motivo è che l'equazione ottenuta è di secondo grado con il termine di secondo grado e il termine noto uguali, e questo fa sì che a ogni radice corrisponda quella inversa); non era richiesto, perché un solo valore basta.</w:t>
       </w:r>
     </w:p>
@@ -15050,10 +15239,10 @@
         <w:rPr>
           <w:b/>
         </w:rPr>
+        <w:lastRenderedPageBreak/>
         <w:t>Un altro esistenziale vero.</w:t>
       </w:r>
       <w:r>
-        <w:rPr/>
         <w:t xml:space="preserve"> «Per qualche n, se n è primo allora n + 1, n + 2, n + 3 e n + 4 non sono primi», con dominio ℤ⁺. Basta trovare un n che renda vera l'implicazione, per esempio n = 23: l'ipotesi «23 è primo» e la conclusione «24, 25, 26 e 27 non sono primi» sono entrambe vere. Alcuni valori rendono l'implicazione vera (n = 23, n = 4, n = 47) e altri la rendono falsa (n = 2, n = 101): conta il fatto che se ne sia trovato </w:t>
       </w:r>
       <w:r>
@@ -15063,7 +15252,6 @@
         <w:t>uno</w:t>
       </w:r>
       <w:r>
-        <w:rPr/>
         <w:t>.</w:t>
       </w:r>
     </w:p>
@@ -15075,7 +15263,6 @@
         <w:t>Un esistenziale falso.</w:t>
       </w:r>
       <w:r>
-        <w:rPr/>
         <w:t xml:space="preserve"> ∃x (1/(x² + 1) &gt; 1), con dominio ℝ. Per mostrare che è falso bisogna dimostrare che la disuguaglianza è falsa per </w:t>
       </w:r>
       <w:r>
@@ -15085,7 +15272,6 @@
         <w:t>ogni</w:t>
       </w:r>
       <w:r>
-        <w:rPr/>
         <w:t xml:space="preserve"> x reale, cioè che per ogni x vale 1/(x² + 1) ≤ 1. Sia x un reale qualunque. Poiché x² ≥ 0, si può aggiungere 1 a entrambi i lati e ottenere 1 ≤ x² + 1; dividendo entrambi i lati per x² + 1 (positivo) si ottiene 1/(x² + 1) ≤ 1. Quindi la disuguaglianza di partenza è falsa per ogni x e l'esistenziale è falso. (Mostrare che P(x) è falsa per un valore particolare </w:t>
       </w:r>
       <w:r>
@@ -15095,7 +15281,6 @@
         <w:t>non</w:t>
       </w:r>
       <w:r>
-        <w:rPr/>
         <w:t xml:space="preserve"> basta.)</w:t>
       </w:r>
     </w:p>
@@ -15112,8 +15297,12 @@
       </w:r>
     </w:p>
     <w:p>
-      <w:r>
-        <w:rPr/>
+      <w:pPr>
+        <w:rPr>
+          <w:lang w:val="en-US"/>
+        </w:rPr>
+      </w:pPr>
+      <w:r>
         <w:t xml:space="preserve">Si può usare la stessa idea del capitolo 21: la soluzione si ottiene </w:t>
       </w:r>
       <w:r>
@@ -15123,199 +15312,317 @@
         <w:t>scambiando dappertutto vero e falso</w:t>
       </w:r>
       <w:r>
-        <w:rPr/>
-        <w:t>. Con il dominio D = {d₁, …, d</w:t>
+        <w:t xml:space="preserve">. </w:t>
+      </w:r>
+      <w:r>
+        <w:rPr>
+          <w:lang w:val="en-US"/>
+        </w:rPr>
+        <w:t xml:space="preserve">Con il </w:t>
+      </w:r>
+      <w:proofErr w:type="spellStart"/>
+      <w:r>
+        <w:rPr>
+          <w:lang w:val="en-US"/>
+        </w:rPr>
+        <w:t>dominio</w:t>
+      </w:r>
+      <w:proofErr w:type="spellEnd"/>
+      <w:r>
+        <w:rPr>
+          <w:lang w:val="en-US"/>
+        </w:rPr>
+        <w:t xml:space="preserve"> D = {d₁, …, d</w:t>
       </w:r>
       <w:r>
         <w:rPr>
           <w:vertAlign w:val="subscript"/>
+          <w:lang w:val="en-US"/>
         </w:rPr>
         <w:t>n</w:t>
       </w:r>
       <w:r>
-        <w:rPr/>
+        <w:rPr>
+          <w:lang w:val="en-US"/>
+        </w:rPr>
         <w:t>}:</w:t>
       </w:r>
     </w:p>
     <w:p>
       <w:pPr>
-        <w:spacing w:after="0" w:before="0" w:line="240" w:lineRule="auto"/>
+        <w:spacing w:after="0" w:line="240" w:lineRule="auto"/>
+        <w:rPr>
+          <w:lang w:val="en-US"/>
+        </w:rPr>
       </w:pPr>
       <w:r>
         <w:rPr>
           <w:rFonts w:ascii="Consolas" w:hAnsi="Consolas" w:cs="Consolas"/>
           <w:sz w:val="17"/>
-        </w:rPr>
-        <w:t>for i = 1 to n</w:t>
-      </w:r>
-    </w:p>
-    <w:p>
-      <w:pPr>
-        <w:spacing w:after="0" w:before="0" w:line="240" w:lineRule="auto"/>
-      </w:pPr>
+          <w:lang w:val="en-US"/>
+        </w:rPr>
+        <w:t xml:space="preserve">for </w:t>
+      </w:r>
+      <w:proofErr w:type="spellStart"/>
       <w:r>
         <w:rPr>
           <w:rFonts w:ascii="Consolas" w:hAnsi="Consolas" w:cs="Consolas"/>
           <w:sz w:val="17"/>
-        </w:rPr>
-        <w:t xml:space="preserve">    if (P(d_i))</w:t>
-      </w:r>
-    </w:p>
-    <w:p>
-      <w:pPr>
-        <w:spacing w:after="0" w:before="0" w:line="240" w:lineRule="auto"/>
-      </w:pPr>
+          <w:lang w:val="en-US"/>
+        </w:rPr>
+        <w:t>i</w:t>
+      </w:r>
+      <w:proofErr w:type="spellEnd"/>
       <w:r>
         <w:rPr>
           <w:rFonts w:ascii="Consolas" w:hAnsi="Consolas" w:cs="Consolas"/>
           <w:sz w:val="17"/>
-        </w:rPr>
-        <w:t xml:space="preserve">        return true</w:t>
-      </w:r>
-    </w:p>
-    <w:p>
-      <w:pPr>
-        <w:spacing w:after="0" w:before="0" w:line="240" w:lineRule="auto"/>
+          <w:lang w:val="en-US"/>
+        </w:rPr>
+        <w:t xml:space="preserve"> = 1 to n</w:t>
+      </w:r>
+    </w:p>
+    <w:p>
+      <w:pPr>
+        <w:spacing w:after="0" w:line="240" w:lineRule="auto"/>
+        <w:rPr>
+          <w:lang w:val="en-US"/>
+        </w:rPr>
       </w:pPr>
       <w:r>
         <w:rPr>
           <w:rFonts w:ascii="Consolas" w:hAnsi="Consolas" w:cs="Consolas"/>
           <w:sz w:val="17"/>
+          <w:lang w:val="en-US"/>
+        </w:rPr>
+        <w:t xml:space="preserve">    if (P(</w:t>
+      </w:r>
+      <w:proofErr w:type="spellStart"/>
+      <w:r>
+        <w:rPr>
+          <w:rFonts w:ascii="Consolas" w:hAnsi="Consolas" w:cs="Consolas"/>
+          <w:sz w:val="17"/>
+          <w:lang w:val="en-US"/>
+        </w:rPr>
+        <w:t>d_i</w:t>
+      </w:r>
+      <w:proofErr w:type="spellEnd"/>
+      <w:r>
+        <w:rPr>
+          <w:rFonts w:ascii="Consolas" w:hAnsi="Consolas" w:cs="Consolas"/>
+          <w:sz w:val="17"/>
+          <w:lang w:val="en-US"/>
+        </w:rPr>
+        <w:t>))</w:t>
+      </w:r>
+    </w:p>
+    <w:p>
+      <w:pPr>
+        <w:spacing w:after="0" w:line="240" w:lineRule="auto"/>
+        <w:rPr>
+          <w:lang w:val="en-US"/>
+        </w:rPr>
+      </w:pPr>
+      <w:r>
+        <w:rPr>
+          <w:rFonts w:ascii="Consolas" w:hAnsi="Consolas" w:cs="Consolas"/>
+          <w:sz w:val="17"/>
+          <w:lang w:val="en-US"/>
+        </w:rPr>
+        <w:t xml:space="preserve">        return true</w:t>
+      </w:r>
+    </w:p>
+    <w:p>
+      <w:pPr>
+        <w:spacing w:after="0" w:line="240" w:lineRule="auto"/>
+      </w:pPr>
+      <w:proofErr w:type="spellStart"/>
+      <w:r>
+        <w:rPr>
+          <w:rFonts w:ascii="Consolas" w:hAnsi="Consolas" w:cs="Consolas"/>
+          <w:sz w:val="17"/>
+        </w:rPr>
+        <w:t>return</w:t>
+      </w:r>
+      <w:proofErr w:type="spellEnd"/>
+      <w:r>
+        <w:rPr>
+          <w:rFonts w:ascii="Consolas" w:hAnsi="Consolas" w:cs="Consolas"/>
+          <w:sz w:val="17"/>
+        </w:rPr>
+        <w:t xml:space="preserve"> false</w:t>
+      </w:r>
+    </w:p>
+    <w:p/>
+    <w:p>
+      <w:r>
+        <w:t>Il ciclo esamina i d</w:t>
+      </w:r>
+      <w:r>
+        <w:rPr>
+          <w:vertAlign w:val="subscript"/>
+        </w:rPr>
+        <w:t>i</w:t>
+      </w:r>
+      <w:r>
+        <w:t xml:space="preserve"> uno a uno. Se trova un d</w:t>
+      </w:r>
+      <w:r>
+        <w:rPr>
+          <w:vertAlign w:val="subscript"/>
+        </w:rPr>
+        <w:t>i</w:t>
+      </w:r>
+      <w:r>
+        <w:t xml:space="preserve"> per cui P(d</w:t>
+      </w:r>
+      <w:r>
+        <w:rPr>
+          <w:vertAlign w:val="subscript"/>
+        </w:rPr>
+        <w:t>i</w:t>
+      </w:r>
+      <w:r>
+        <w:t xml:space="preserve">) è vera, restituisce </w:t>
+      </w:r>
+      <w:r>
+        <w:rPr>
+          <w:b/>
+        </w:rPr>
+        <w:t>true</w:t>
+      </w:r>
+      <w:r>
+        <w:t xml:space="preserve"> e termina: ne basta uno. Se P(d</w:t>
+      </w:r>
+      <w:r>
+        <w:rPr>
+          <w:vertAlign w:val="subscript"/>
+        </w:rPr>
+        <w:t>i</w:t>
+      </w:r>
+      <w:r>
+        <w:t>) è falsa per ogni d</w:t>
+      </w:r>
+      <w:r>
+        <w:rPr>
+          <w:vertAlign w:val="subscript"/>
+        </w:rPr>
+        <w:t>i</w:t>
+      </w:r>
+      <w:r>
+        <w:t xml:space="preserve">, il ciclo arriva alla fine e il programma restituisce </w:t>
+      </w:r>
+      <w:r>
+        <w:rPr>
+          <w:b/>
+        </w:rPr>
+        <w:t>false</w:t>
+      </w:r>
+      <w:r>
+        <w:t>. Quindi se ∃x P(x) è vero il ciclo si ferma appena trova un elemento che rende P vera; se è falso deve controllare tutti gli elementi.</w:t>
+      </w:r>
+    </w:p>
+    <w:p>
+      <w:r>
+        <w:t xml:space="preserve">Anche qui valgono gli errori del capitolo precedente, duali. Scrivere </w:t>
+      </w:r>
+      <w:r>
+        <w:rPr>
+          <w:rFonts w:ascii="Consolas" w:hAnsi="Consolas" w:cs="Consolas"/>
+        </w:rPr>
+        <w:t>if (¬P(d_i)) return false</w:t>
+      </w:r>
+      <w:r>
+        <w:t xml:space="preserve"> è sbagliato: se P(d₁) è falsa non si può concludere che l'esistenziale sia falso, perché potrebbe essere vero per il settimo elemento. Si deve restituire </w:t>
+      </w:r>
+      <w:r>
+        <w:rPr>
+          <w:b/>
+        </w:rPr>
+        <w:t>true</w:t>
+      </w:r>
+      <w:r>
+        <w:t xml:space="preserve"> al primo vero, e il </w:t>
+      </w:r>
+      <w:r>
+        <w:rPr>
+          <w:rFonts w:ascii="Consolas" w:hAnsi="Consolas" w:cs="Consolas"/>
         </w:rPr>
         <w:t>return false</w:t>
       </w:r>
-    </w:p>
-    <w:p/>
-    <w:p>
-      <w:r>
-        <w:rPr/>
-        <w:t>Il ciclo esamina i d</w:t>
+      <w:r>
+        <w:t xml:space="preserve"> va </w:t>
+      </w:r>
+      <w:r>
+        <w:rPr>
+          <w:b/>
+        </w:rPr>
+        <w:t>fuori dal ciclo</w:t>
+      </w:r>
+      <w:r>
+        <w:t xml:space="preserve">, allineato con il </w:t>
+      </w:r>
+      <w:r>
+        <w:rPr>
+          <w:rFonts w:ascii="Consolas" w:hAnsi="Consolas" w:cs="Consolas"/>
+        </w:rPr>
+        <w:t>for</w:t>
+      </w:r>
+      <w:r>
+        <w:t>. Per fare pratica si può provare a scrivere il programma per cercare in un vettore di numeri se c'è almeno un numero pari, oppure se sono tutti pari.</w:t>
+      </w:r>
+    </w:p>
+    <w:p>
+      <w:pPr>
+        <w:pStyle w:val="Titolo2"/>
+      </w:pPr>
+      <w:r>
+        <w:rPr>
+          <w:b/>
+          <w:color w:val="E97132"/>
+        </w:rPr>
+        <w:t>Duali, congiunzione e disgiunzione</w:t>
+      </w:r>
+    </w:p>
+    <w:p>
+      <w:r>
+        <w:t xml:space="preserve">Poiché la definizione dell'uno diventa quella dell'altro scambiando dappertutto il vero con il falso, ∀ e ∃ si dicono </w:t>
+      </w:r>
+      <w:r>
+        <w:rPr>
+          <w:b/>
+        </w:rPr>
+        <w:t>quantificatori duali</w:t>
+      </w:r>
+      <w:r>
+        <w:t>; è lo stesso legame che c'è tra congiunzione e disgiunzione. Per questo, come per congiunzione e disgiunzione, valgono le leggi di De Morgan. In effetti un enunciato universale generalizza la congiunzione P₁ ∧ P₂ ∧ … ∧ P</w:t>
       </w:r>
       <w:r>
         <w:rPr>
           <w:vertAlign w:val="subscript"/>
         </w:rPr>
-        <w:t>i</w:t>
-      </w:r>
-      <w:r>
-        <w:rPr/>
-        <w:t xml:space="preserve"> uno a uno. Se trova un d</w:t>
+        <w:t>n</w:t>
+      </w:r>
+      <w:r>
+        <w:t>: al posto delle singole proposizioni P₁, …, P</w:t>
       </w:r>
       <w:r>
         <w:rPr>
           <w:vertAlign w:val="subscript"/>
         </w:rPr>
-        <w:t>i</w:t>
-      </w:r>
-      <w:r>
-        <w:rPr/>
-        <w:t xml:space="preserve"> per cui P(d</w:t>
+        <w:t>n</w:t>
+      </w:r>
+      <w:r>
+        <w:t xml:space="preserve"> si ha una famiglia P(x), con x nel dominio, e ∀x P(x) è vero se e solo se P(x) è vera per ogni x. Se il dominio è {−1, 0, 1}, ∀x P(x) equivale a P(−1) ∧ P(0) ∧ P(1). Allo stesso modo ∃x P(x) generalizza la disgiunzione P₁ ∨ P₂ ∨ … ∨ P</w:t>
       </w:r>
       <w:r>
         <w:rPr>
           <w:vertAlign w:val="subscript"/>
         </w:rPr>
-        <w:t>i</w:t>
-      </w:r>
-      <w:r>
-        <w:rPr/>
-        <w:t xml:space="preserve">) è vera, restituisce </w:t>
-      </w:r>
-      <w:r>
-        <w:rPr>
-          <w:b/>
-        </w:rPr>
-        <w:t>true</w:t>
-      </w:r>
-      <w:r>
-        <w:rPr/>
-        <w:t xml:space="preserve"> e termina: ne basta uno. Se P(d</w:t>
-      </w:r>
-      <w:r>
-        <w:rPr>
-          <w:vertAlign w:val="subscript"/>
-        </w:rPr>
-        <w:t>i</w:t>
-      </w:r>
-      <w:r>
-        <w:rPr/>
-        <w:t>) è falsa per ogni d</w:t>
-      </w:r>
-      <w:r>
-        <w:rPr>
-          <w:vertAlign w:val="subscript"/>
-        </w:rPr>
-        <w:t>i</w:t>
-      </w:r>
-      <w:r>
-        <w:rPr/>
-        <w:t xml:space="preserve">, il ciclo arriva alla fine e il programma restituisce </w:t>
-      </w:r>
-      <w:r>
-        <w:rPr>
-          <w:b/>
-        </w:rPr>
-        <w:t>false</w:t>
-      </w:r>
-      <w:r>
-        <w:rPr/>
-        <w:t>. Quindi se ∃x P(x) è vero il ciclo si ferma appena trova un elemento che rende P vera; se è falso deve controllare tutti gli elementi.</w:t>
-      </w:r>
-    </w:p>
-    <w:p>
-      <w:r>
-        <w:rPr/>
-        <w:t xml:space="preserve">Anche qui valgono gli errori del capitolo precedente, duali. Scrivere </w:t>
-      </w:r>
-      <w:r>
-        <w:rPr>
-          <w:rFonts w:ascii="Consolas" w:hAnsi="Consolas" w:cs="Consolas"/>
-        </w:rPr>
-        <w:t>if (¬P(d_i)) return false</w:t>
-      </w:r>
-      <w:r>
-        <w:rPr/>
-        <w:t xml:space="preserve"> è sbagliato: se P(d₁) è falsa non si può concludere che l'esistenziale sia falso, perché potrebbe essere vero per il settimo elemento. Si deve restituire </w:t>
-      </w:r>
-      <w:r>
-        <w:rPr>
-          <w:b/>
-        </w:rPr>
-        <w:t>true</w:t>
-      </w:r>
-      <w:r>
-        <w:rPr/>
-        <w:t xml:space="preserve"> al primo vero, e il </w:t>
-      </w:r>
-      <w:r>
-        <w:rPr>
-          <w:rFonts w:ascii="Consolas" w:hAnsi="Consolas" w:cs="Consolas"/>
-        </w:rPr>
-        <w:t>return false</w:t>
-      </w:r>
-      <w:r>
-        <w:rPr/>
-        <w:t xml:space="preserve"> va </w:t>
-      </w:r>
-      <w:r>
-        <w:rPr>
-          <w:b/>
-        </w:rPr>
-        <w:t>fuori dal ciclo</w:t>
-      </w:r>
-      <w:r>
-        <w:rPr/>
-        <w:t xml:space="preserve">, allineato con il </w:t>
-      </w:r>
-      <w:r>
-        <w:rPr>
-          <w:rFonts w:ascii="Consolas" w:hAnsi="Consolas" w:cs="Consolas"/>
-        </w:rPr>
-        <w:t>for</w:t>
-      </w:r>
-      <w:r>
-        <w:rPr/>
-        <w:t>. Per fare pratica si può provare a scrivere il programma per cercare in un vettore di numeri se c'è almeno un numero pari, oppure se sono tutti pari.</w:t>
+        <w:t>n</w:t>
+      </w:r>
+      <w:r>
+        <w:t>: con dominio {1, 2, 3, 4}, ∃x P(x) equivale a P(1) ∨ P(2) ∨ P(3) ∨ P(4).</w:t>
       </w:r>
     </w:p>
     <w:p>
@@ -15327,64 +15634,6 @@
           <w:b/>
           <w:color w:val="E97132"/>
         </w:rPr>
-        <w:t>Duali, congiunzione e disgiunzione</w:t>
-      </w:r>
-    </w:p>
-    <w:p>
-      <w:r>
-        <w:rPr/>
-        <w:t xml:space="preserve">Poiché la definizione dell'uno diventa quella dell'altro scambiando dappertutto il vero con il falso, ∀ e ∃ si dicono </w:t>
-      </w:r>
-      <w:r>
-        <w:rPr>
-          <w:b/>
-        </w:rPr>
-        <w:t>quantificatori duali</w:t>
-      </w:r>
-      <w:r>
-        <w:rPr/>
-        <w:t>; è lo stesso legame che c'è tra congiunzione e disgiunzione. Per questo, come per congiunzione e disgiunzione, valgono le leggi di De Morgan. In effetti un enunciato universale generalizza la congiunzione P₁ ∧ P₂ ∧ … ∧ P</w:t>
-      </w:r>
-      <w:r>
-        <w:rPr>
-          <w:vertAlign w:val="subscript"/>
-        </w:rPr>
-        <w:t>n</w:t>
-      </w:r>
-      <w:r>
-        <w:rPr/>
-        <w:t>: al posto delle singole proposizioni P₁, …, P</w:t>
-      </w:r>
-      <w:r>
-        <w:rPr>
-          <w:vertAlign w:val="subscript"/>
-        </w:rPr>
-        <w:t>n</w:t>
-      </w:r>
-      <w:r>
-        <w:rPr/>
-        <w:t xml:space="preserve"> si ha una famiglia P(x), con x nel dominio, e ∀x P(x) è vero se e solo se P(x) è vera per ogni x. Se il dominio è {−1, 0, 1}, ∀x P(x) equivale a P(−1) ∧ P(0) ∧ P(1). Allo stesso modo ∃x P(x) generalizza la disgiunzione P₁ ∨ P₂ ∨ … ∨ P</w:t>
-      </w:r>
-      <w:r>
-        <w:rPr>
-          <w:vertAlign w:val="subscript"/>
-        </w:rPr>
-        <w:t>n</w:t>
-      </w:r>
-      <w:r>
-        <w:rPr/>
-        <w:t>: con dominio {1, 2, 3, 4}, ∃x P(x) equivale a P(1) ∨ P(2) ∨ P(3) ∨ P(4).</w:t>
-      </w:r>
-    </w:p>
-    <w:p>
-      <w:pPr>
-        <w:pStyle w:val="Titolo2"/>
-      </w:pPr>
-      <w:r>
-        <w:rPr>
-          <w:b/>
-          <w:color w:val="E97132"/>
-        </w:rPr>
         <w:t>Le leggi di De Morgan per i quantificatori</w:t>
       </w:r>
     </w:p>
@@ -15396,7 +15645,6 @@
         <w:t>Teorema (leggi di De Morgan generalizzate).</w:t>
       </w:r>
       <w:r>
-        <w:rPr/>
         <w:t xml:space="preserve"> Se P è una funzione proposizionale, ciascuna delle due coppie di enunciati seguenti ha gli stessi valori di verità (sono entrambi veri o entrambi falsi):</w:t>
       </w:r>
     </w:p>
@@ -15408,7 +15656,6 @@
         </w:numPr>
       </w:pPr>
       <w:r>
-        <w:rPr/>
         <w:t>¬(∀x P(x)) e ∃x ¬P(x): non è vero che per ogni x vale P(x) se e solo se c'è un x per cui non vale P(x);</w:t>
       </w:r>
     </w:p>
@@ -15420,13 +15667,12 @@
         </w:numPr>
       </w:pPr>
       <w:r>
-        <w:rPr/>
         <w:t>¬(∃x P(x)) e ∀x ¬P(x): non è vero che esiste un x per cui vale P(x) se e solo se per ogni x non vale P(x).</w:t>
       </w:r>
     </w:p>
     <w:p>
       <w:r>
-        <w:rPr/>
+        <w:lastRenderedPageBreak/>
         <w:t>Sono esattamente le leggi di De Morgan dei capitoli 15 e 18, in cui la negazione di una congiunzione è la disgiunzione delle negazioni e viceversa.</w:t>
       </w:r>
     </w:p>
@@ -15438,22 +15684,18 @@
         <w:t>Dimostrazione della prima legge.</w:t>
       </w:r>
       <w:r>
-        <w:rPr/>
         <w:t xml:space="preserve"> Se ¬(∀x P(x)) è vera, allora ∀x P(x) è falso; per la definizione di universale, questo succede esattamente quando P(x) è falsa per almeno un x del dominio. Ma se P(x) è falsa per almeno un x, allora ¬P(x) è vera per almeno un x, e per la definizione di esistenziale ∃x ¬P(x) è vero. Un ragionamento analogo mostra che se ¬(∀x P(x)) è falsa lo è anche ∃x ¬P(x). La seconda legge si dimostra in modo simile (è un esercizio del libro).</w:t>
       </w:r>
     </w:p>
     <w:p>
       <w:r>
-        <w:rPr/>
         <w:t>Un altro modo di riconoscerle: portare il «non» dentro il quantificatore scambia il vero con il falso sia nel valore del predicato sia nel valore della proposizione finale, e sappiamo che questo doppio scambio trasforma il «per ogni» in «esiste» e viceversa.</w:t>
       </w:r>
     </w:p>
     <w:p>
       <w:r>
-        <w:rPr/>
         <w:t>La seconda legge spiega anche un modo di smentire un esistenziale: per mostrare che ∃x P(x) è falso si dimostra che ∀x ¬P(x) è vero, come si è fatto sopra per 1/(x² + 1) &gt; 1.</w:t>
       </w:r>
-      <w:r/>
     </w:p>
     <w:p>
       <w:pPr>
@@ -15469,7 +15711,6 @@
     </w:p>
     <w:p>
       <w:r>
-        <w:rPr/>
         <w:t>Per negare un enunciato quantificato si applicano le leggi precedenti.</w:t>
       </w:r>
     </w:p>
@@ -15481,7 +15722,6 @@
         </w:numPr>
       </w:pPr>
       <w:r>
-        <w:rPr/>
         <w:t>«Ogni tifoso del rock ama gli U2» si scrive ∀x P(x), con P(x) = «x ama gli U2» e dominio i tifosi del rock. La sua negazione ¬(∀x P(x)) equivale a ∃x ¬P(x): «esiste un tifoso del rock che non ama gli U2».</w:t>
       </w:r>
     </w:p>
@@ -15493,438 +15733,17 @@
         </w:numPr>
       </w:pPr>
       <w:r>
-        <w:rPr/>
         <w:t>«Alcuni uccelli non possono volare» si scrive ∃x ¬P(x), con P(x) = «x vola» (o anche ∃x Q(x) con Q(x) = «x non può volare»). La negazione ¬(∃x ¬P(x)) equivale a ∀x ¬¬P(x), cioè ∀x P(x): «ogni uccello vola».</w:t>
       </w:r>
     </w:p>
     <w:p>
       <w:r>
-        <w:rPr/>
         <w:t>Gli enunciati a parole possono avere più interpretazioni. «Tutto ciò che luccica non è oro» (dal Mercante di Venezia) si può leggere come «ogni oggetto che luccica non è oro», cioè ∀x (P(x) → ¬Q(x)), con P(x) = «x luccica» e Q(x) = «x è oro»; ma ciò che Shakespeare intendeva è «qualche oggetto che luccica non è oro», cioè ∃x (P(x) ∧ ¬Q(x)), che per De Morgan e per le equivalenze del capitolo 18 equivale a ¬(∀x (P(x) → Q(x))). L'ambiguità dipende da dove si applica la negazione: a Q(x) oppure all'intero enunciato.</w:t>
       </w:r>
     </w:p>
     <w:p>
       <w:r>
-        <w:rPr/>
         <w:t>Nel linguaggio naturale, negli enunciati positivi «ogni», «tutti», «ciascuno» e «qualunque» hanno lo stesso significato; negli enunciati negativi la situazione cambia. «Non tutti gli x soddisfano P(x)», «non ogni x» e «non ciascun x» significano ∃x ¬P(x), mentre «nessun x soddisfa P(x)» e «non esiste alcun x che soddisfi P(x)» significano ∀x ¬P(x).</w:t>
-      </w:r>
-    </w:p>
-    <w:p>
-      <w:pPr>
-        <w:pStyle w:val="Titolo1"/>
-      </w:pPr>
-      <w:r>
-        <w:rPr>
-          <w:b/>
-          <w:color w:val="EE0000"/>
-        </w:rPr>
-        <w:t>23. Regole di Inferenza per gli Enunciati Quantificati</w:t>
-      </w:r>
-    </w:p>
-    <w:p>
-      <w:pPr>
-        <w:pStyle w:val="Titolo2"/>
-      </w:pPr>
-      <w:r>
-        <w:rPr>
-          <w:b/>
-          <w:color w:val="E97132"/>
-        </w:rPr>
-        <w:t>Dal capitolo 19 ai quantificatori</w:t>
-      </w:r>
-    </w:p>
-    <w:p>
-      <w:r>
-        <w:rPr/>
-        <w:t>Si chiude la sezione sui quantificatori vedendo come si estendono le regole di inferenza del capitolo 19 agli enunciati con ∀ e ∃, e come si combinano con quelle per le proposizioni.</w:t>
-      </w:r>
-    </w:p>
-    <w:p>
-      <w:r>
-        <w:rPr/>
-        <w:t xml:space="preserve">Si supponga che ∀x P(x) sia vero. Per la definizione di universale, P(x) è vera per ogni x del dominio D; quindi, per un particolare d ∈ D, P(d) è vera. L'argomento ∀x P(x) / ∴ P(d) con d ∈ D è perciò valido, e la regola si chiama </w:t>
-      </w:r>
-      <w:r>
-        <w:rPr>
-          <w:b/>
-        </w:rPr>
-        <w:t>istanziazione universale</w:t>
-      </w:r>
-      <w:r>
-        <w:rPr/>
-        <w:t>. Con ragionamenti simili si giustificano le altre tre regole della tabella.</w:t>
-      </w:r>
-    </w:p>
-    <w:p>
-      <w:pPr>
-        <w:keepNext/>
-        <w:jc w:val="center"/>
-      </w:pPr>
-      <w:r>
-        <w:drawing>
-          <wp:inline xmlns:a="http://schemas.openxmlformats.org/drawingml/2006/main" xmlns:pic="http://schemas.openxmlformats.org/drawingml/2006/picture">
-            <wp:extent cx="4500000" cy="2150036"/>
-            <wp:docPr id="2073952354" name="Picture 2073952354"/>
-            <wp:cNvGraphicFramePr>
-              <a:graphicFrameLocks noChangeAspect="1"/>
-            </wp:cNvGraphicFramePr>
-            <a:graphic>
-              <a:graphicData uri="http://schemas.openxmlformats.org/drawingml/2006/picture">
-                <pic:pic>
-                  <pic:nvPicPr>
-                    <pic:cNvPr id="0" name="logica_regole_quantificatori.png"/>
-                    <pic:cNvPicPr/>
-                  </pic:nvPicPr>
-                  <pic:blipFill>
-                    <a:blip r:embed="rId31"/>
-                    <a:stretch>
-                      <a:fillRect/>
-                    </a:stretch>
-                  </pic:blipFill>
-                  <pic:spPr>
-                    <a:xfrm>
-                      <a:off x="0" y="0"/>
-                      <a:ext cx="4500000" cy="2150036"/>
-                    </a:xfrm>
-                    <a:prstGeom prst="rect"/>
-                  </pic:spPr>
-                </pic:pic>
-              </a:graphicData>
-            </a:graphic>
-          </wp:inline>
-        </w:drawing>
-      </w:r>
-    </w:p>
-    <w:p>
-      <w:pPr>
-        <w:jc w:val="center"/>
-      </w:pPr>
-      <w:r>
-        <w:rPr>
-          <w:i/>
-          <w:sz w:val="18"/>
-        </w:rPr>
-        <w:t>Le regole di inferenza per gli enunciati quantificati.</w:t>
-      </w:r>
-    </w:p>
-    <w:p>
-      <w:pPr>
-        <w:numPr>
-          <w:ilvl w:val="0"/>
-          <w:numId w:val="1"/>
-        </w:numPr>
-      </w:pPr>
-      <w:r>
-        <w:rPr>
-          <w:b/>
-        </w:rPr>
-        <w:t>Istanziazione universale</w:t>
-      </w:r>
-      <w:r>
-        <w:rPr/>
-        <w:t>: da ∀x P(x) si ricava P(d), per ogni d ∈ D.</w:t>
-      </w:r>
-    </w:p>
-    <w:p>
-      <w:pPr>
-        <w:numPr>
-          <w:ilvl w:val="0"/>
-          <w:numId w:val="1"/>
-        </w:numPr>
-      </w:pPr>
-      <w:r>
-        <w:rPr>
-          <w:b/>
-        </w:rPr>
-        <w:t>Generalizzazione universale</w:t>
-      </w:r>
-      <w:r>
-        <w:rPr/>
-        <w:t>: se P(d) è vera per ogni d ∈ D, si ricava ∀x P(x). Si usa con un elemento arbitrario, come nel capitolo 21.</w:t>
-      </w:r>
-    </w:p>
-    <w:p>
-      <w:pPr>
-        <w:numPr>
-          <w:ilvl w:val="0"/>
-          <w:numId w:val="1"/>
-        </w:numPr>
-      </w:pPr>
-      <w:r>
-        <w:rPr>
-          <w:b/>
-        </w:rPr>
-        <w:t>Istanziazione esistenziale</w:t>
-      </w:r>
-      <w:r>
-        <w:rPr/>
-        <w:t>: da ∃x P(x) si ricava P(d) per qualche d ∈ D (un elemento di cui si sa solo che esiste).</w:t>
-      </w:r>
-    </w:p>
-    <w:p>
-      <w:pPr>
-        <w:numPr>
-          <w:ilvl w:val="0"/>
-          <w:numId w:val="1"/>
-        </w:numPr>
-      </w:pPr>
-      <w:r>
-        <w:rPr>
-          <w:b/>
-        </w:rPr>
-        <w:t>Generalizzazione esistenziale</w:t>
-      </w:r>
-      <w:r>
-        <w:rPr/>
-        <w:t>: se P(d) è vera per qualche d ∈ D, si ricava ∃x P(x).</w:t>
-      </w:r>
-    </w:p>
-    <w:p>
-      <w:pPr>
-        <w:pStyle w:val="Titolo2"/>
-      </w:pPr>
-      <w:r>
-        <w:rPr>
-          <w:b/>
-          <w:color w:val="E97132"/>
-        </w:rPr>
-        <w:t>Esempi</w:t>
-      </w:r>
-    </w:p>
-    <w:p>
-      <w:r>
-        <w:rPr>
-          <w:b/>
-        </w:rPr>
-        <w:t>Istanziazione universale.</w:t>
-      </w:r>
-      <w:r>
-        <w:rPr/>
-        <w:t xml:space="preserve"> Si sa che «per ogni intero positivo n, n² ≥ n» è vero. Poiché 54 è un intero positivo, cioè un elemento del dominio, per istanziazione universale si conclude che 54² ≥ 54.</w:t>
-      </w:r>
-    </w:p>
-    <w:p>
-      <w:r>
-        <w:rPr>
-          <w:b/>
-        </w:rPr>
-        <w:t>Generalizzazione esistenziale.</w:t>
-      </w:r>
-      <w:r>
-        <w:rPr/>
-        <w:t xml:space="preserve"> Sia P(x) = «x possiede un computer portatile», con dominio gli studenti di MATH 201 (matematica discreta). Se Taylor, che frequenta il corso, possiede un portatile, in simboli P(Taylor) è vera, e per generalizzazione esistenziale si conclude che ∃x P(x) è vero.</w:t>
-      </w:r>
-    </w:p>
-    <w:p>
-      <w:r>
-        <w:rPr>
-          <w:b/>
-        </w:rPr>
-        <w:t>Modus tollens universale.</w:t>
-      </w:r>
-      <w:r>
-        <w:rPr/>
-        <w:t xml:space="preserve"> Si consideri l'argomento: «per ogni numero reale x, se x è un intero allora x è razionale. Il numero √2 non è razionale. Quindi √2 non è un intero». Con P(x) = «x è un intero» e Q(x) = «x è razionale», l'argomento è</w:t>
-      </w:r>
-    </w:p>
-    <w:p>
-      <w:r>
-        <w:rPr/>
-        <w:t>∀x ∈ ℝ (P(x) → Q(x)), ¬Q(√2) / ∴ ¬P(√2).</w:t>
-      </w:r>
-    </w:p>
-    <w:p>
-      <w:r>
-        <w:rPr/>
-        <w:t xml:space="preserve">Poiché √2 ∈ ℝ, per istanziazione universale si ottiene P(√2) → Q(√2); insieme a ¬Q(√2), per il modus tollens (capitolo 19) si conclude ¬P(√2). L'argomento è valido e si chiama </w:t>
-      </w:r>
-      <w:r>
-        <w:rPr>
-          <w:b/>
-        </w:rPr>
-        <w:t>modus tollens universale</w:t>
-      </w:r>
-      <w:r>
-        <w:rPr/>
-        <w:t>.</w:t>
-      </w:r>
-    </w:p>
-    <w:p>
-      <w:r>
-        <w:rPr>
-          <w:b/>
-        </w:rPr>
-        <w:t>Sillogismo disgiuntivo con un quantificatore.</w:t>
-      </w:r>
-      <w:r>
-        <w:rPr/>
-        <w:t xml:space="preserve"> Si hanno le ipotesi: «tutti amano Microsoft o Apple» e «Lynn non ama Microsoft». Si vuole mostrare che «Lynn ama Apple». Con P(x) = «x ama Microsoft» e Q(x) = «x ama Apple», la prima ipotesi è ∀x (P(x) ∨ Q(x)); per istanziazione universale si ha P(Lynn) ∨ Q(Lynn). La seconda ipotesi è ¬P(Lynn): il sillogismo disgiuntivo dà Q(Lynn), cioè «Lynn ama Apple». La conclusione segue dalle ipotesi.</w:t>
-      </w:r>
-    </w:p>
-    <w:p>
-      <w:pPr>
-        <w:pStyle w:val="Titolo2"/>
-      </w:pPr>
-      <w:r>
-        <w:rPr>
-          <w:b/>
-          <w:color w:val="E97132"/>
-        </w:rPr>
-        <w:t>Riepilogo: come si prova o si smentisce un quantificatore</w:t>
-      </w:r>
-    </w:p>
-    <w:p>
-      <w:r>
-        <w:rPr/>
-        <w:t>Le regole pratiche per dimostrare e smentire enunciati quantificati sono quattro, e riassumono quanto visto nei capitoli 21 e 22.</w:t>
-      </w:r>
-    </w:p>
-    <w:p>
-      <w:pPr>
-        <w:numPr>
-          <w:ilvl w:val="0"/>
-          <w:numId w:val="1"/>
-        </w:numPr>
-      </w:pPr>
-      <w:r>
-        <w:rPr/>
-        <w:t xml:space="preserve">Per provare che ∀x P(x) è </w:t>
-      </w:r>
-      <w:r>
-        <w:rPr>
-          <w:b/>
-        </w:rPr>
-        <w:t>vero</w:t>
-      </w:r>
-      <w:r>
-        <w:rPr/>
-        <w:t xml:space="preserve">, bisogna mostrare che P(x) è vera per </w:t>
-      </w:r>
-      <w:r>
-        <w:rPr>
-          <w:b/>
-        </w:rPr>
-        <w:t>ogni</w:t>
-      </w:r>
-      <w:r>
-        <w:rPr/>
-        <w:t xml:space="preserve"> x del dominio. Mostrare che P(x) è vera per un valore particolare </w:t>
-      </w:r>
-      <w:r>
-        <w:rPr>
-          <w:b/>
-        </w:rPr>
-        <w:t>non</w:t>
-      </w:r>
-      <w:r>
-        <w:rPr/>
-        <w:t xml:space="preserve"> basta.</w:t>
-      </w:r>
-    </w:p>
-    <w:p>
-      <w:pPr>
-        <w:numPr>
-          <w:ilvl w:val="0"/>
-          <w:numId w:val="1"/>
-        </w:numPr>
-      </w:pPr>
-      <w:r>
-        <w:rPr/>
-        <w:t xml:space="preserve">Per provare che ∃x P(x) è </w:t>
-      </w:r>
-      <w:r>
-        <w:rPr>
-          <w:b/>
-        </w:rPr>
-        <w:t>vero</w:t>
-      </w:r>
-      <w:r>
-        <w:rPr/>
-        <w:t xml:space="preserve">, basta trovare </w:t>
-      </w:r>
-      <w:r>
-        <w:rPr>
-          <w:b/>
-        </w:rPr>
-        <w:t>un</w:t>
-      </w:r>
-      <w:r>
-        <w:rPr/>
-        <w:t xml:space="preserve"> valore di x del dominio per cui P(x) è vera.</w:t>
-      </w:r>
-    </w:p>
-    <w:p>
-      <w:pPr>
-        <w:numPr>
-          <w:ilvl w:val="0"/>
-          <w:numId w:val="1"/>
-        </w:numPr>
-      </w:pPr>
-      <w:r>
-        <w:rPr/>
-        <w:t xml:space="preserve">Per provare che ∀x P(x) è </w:t>
-      </w:r>
-      <w:r>
-        <w:rPr>
-          <w:b/>
-        </w:rPr>
-        <w:t>falso</w:t>
-      </w:r>
-      <w:r>
-        <w:rPr/>
-        <w:t xml:space="preserve">, basta trovare </w:t>
-      </w:r>
-      <w:r>
-        <w:rPr>
-          <w:b/>
-        </w:rPr>
-        <w:t>un</w:t>
-      </w:r>
-      <w:r>
-        <w:rPr/>
-        <w:t xml:space="preserve"> valore di x (un controesempio) per cui P(x) è falsa.</w:t>
-      </w:r>
-    </w:p>
-    <w:p>
-      <w:pPr>
-        <w:numPr>
-          <w:ilvl w:val="0"/>
-          <w:numId w:val="1"/>
-        </w:numPr>
-      </w:pPr>
-      <w:r>
-        <w:rPr/>
-        <w:t xml:space="preserve">Per provare che ∃x P(x) è </w:t>
-      </w:r>
-      <w:r>
-        <w:rPr>
-          <w:b/>
-        </w:rPr>
-        <w:t>falso</w:t>
-      </w:r>
-      <w:r>
-        <w:rPr/>
-        <w:t xml:space="preserve">, bisogna mostrare che P(x) è falsa per </w:t>
-      </w:r>
-      <w:r>
-        <w:rPr>
-          <w:b/>
-        </w:rPr>
-        <w:t>ogni</w:t>
-      </w:r>
-      <w:r>
-        <w:rPr/>
-        <w:t xml:space="preserve"> x del dominio. Mostrare che P(x) è falsa per un valore particolare </w:t>
-      </w:r>
-      <w:r>
-        <w:rPr>
-          <w:b/>
-        </w:rPr>
-        <w:t>non</w:t>
-      </w:r>
-      <w:r>
-        <w:rPr/>
-        <w:t xml:space="preserve"> basta.</w:t>
       </w:r>
     </w:p>
     <w:sectPr>
@@ -22813,7 +22632,6 @@
   <w:style w:type="character" w:default="1" w:styleId="Carpredefinitoparagrafo">
     <w:name w:val="Default Paragraph Font"/>
     <w:uiPriority w:val="1"/>
-    <w:semiHidden/>
     <w:unhideWhenUsed/>
   </w:style>
   <w:style w:type="table" w:default="1" w:styleId="Tabellanormale">

</xml_diff>

<commit_message>
Algebra: capitoli 19-22 (matrici, sottospazi, matrici quadrate, Span) dalla L6 con audio 2026 + dispense + 2025
Co-Authored-By: Claude Sonnet 5.5 <noreply@anthropic.com>
</commit_message>
<xml_diff>
--- a/Riassunto Fondamenti Informatica.docx
+++ b/Riassunto Fondamenti Informatica.docx
@@ -71,7 +71,6 @@
         <w:t>In parole povere:</w:t>
       </w:r>
       <w:r>
-        <w:rPr/>
         <w:t xml:space="preserve"> un circuito combinatorio è come una calcolatrice: guarda solo quello che premi adesso. Un circuito sequenziale è come un contatore con la memoria: la sua risposta dipende anche da quello che è successo prima, perché si porta dentro un ricordo (lo stato). Esempio: l'ascensore che si ricorda a che piano si trova.</w:t>
       </w:r>
     </w:p>
@@ -143,7 +142,6 @@
         <w:t>In parole povere:</w:t>
       </w:r>
       <w:r>
-        <w:rPr/>
         <w:t xml:space="preserve"> il feedback è un'uscita che viene rimandata all'ingresso, come quando il microfono capta il suono dell'altoparlante e lo ripete in continuazione. Questo girare in tondo del segnale è proprio ciò che permette al circuito di tenersi dentro un bit invece di lasciarlo scappare.</w:t>
       </w:r>
     </w:p>
@@ -185,7 +183,6 @@
         <w:t>In parole povere:</w:t>
       </w:r>
       <w:r>
-        <w:rPr/>
         <w:t xml:space="preserve"> volatile vuol dire che il ricordo dura solo finché c'è corrente, come un appunto scritto sulla sabbia con il mare che arriva. Se stacchi la spina il segnale smette di girare e il bit sparisce.</w:t>
       </w:r>
     </w:p>
@@ -239,7 +236,6 @@
         <w:t>In parole povere:</w:t>
       </w:r>
       <w:r>
-        <w:rPr/>
         <w:t xml:space="preserve"> il flip-flop è un piccolo interruttore con memoria: ha due pulsanti, uno per mettere il bit a 1 e uno per metterlo a 0. Dopo che hai lasciato il pulsante, il circuito si ricorda l'ultimo valore scelto, come una levetta che resta su o giù finché qualcuno non la sposta.</w:t>
       </w:r>
     </w:p>
@@ -364,6 +360,7 @@
           <w:bCs/>
           <w:color w:val="E97132" w:themeColor="accent2"/>
         </w:rPr>
+        <w:lastRenderedPageBreak/>
         <w:t>Implementazione e Astrazione</w:t>
       </w:r>
     </w:p>
@@ -431,7 +428,6 @@
         <w:t>In parole povere:</w:t>
       </w:r>
       <w:r>
-        <w:rPr/>
         <w:t xml:space="preserve"> astrazione significa usare un oggetto sapendo cosa fa ma non com'è fatto dentro. Come guidare un'auto senza conoscere il motore: il progettista usa il flip-flop come una scatola nera che memorizza un bit e non pensa più alle porte logiche interne.</w:t>
       </w:r>
     </w:p>
@@ -453,7 +449,6 @@
           <w:bCs/>
           <w:color w:val="EE0000"/>
         </w:rPr>
-        <w:lastRenderedPageBreak/>
         <w:t>2. Notazione Esadecimale</w:t>
       </w:r>
     </w:p>
@@ -517,7 +512,6 @@
         <w:t>In parole povere:</w:t>
       </w:r>
       <w:r>
-        <w:rPr/>
         <w:t xml:space="preserve"> il sistema esadecimale è un'abbreviazione per scrivere i bit: invece di scrivere quattro bit alla volta si scrive un solo simbolo (0-9 e A-F). Esempio: 1111 diventa F e 1010 diventa A, così una lunga fila di 0 e 1 diventa corta e leggibile. Il computer resta binario, è solo una comodità per noi.</w:t>
       </w:r>
     </w:p>
@@ -661,6 +655,7 @@
         </w:numPr>
       </w:pPr>
       <w:r>
+        <w:lastRenderedPageBreak/>
         <w:t>D = 13 (1101)</w:t>
       </w:r>
     </w:p>
@@ -825,7 +820,6 @@
         <w:rPr>
           <w:noProof/>
         </w:rPr>
-        <w:lastRenderedPageBreak/>
         <w:drawing>
           <wp:inline distT="0" distB="0" distL="0" distR="0" wp14:anchorId="44D89B16" wp14:editId="44C26E63">
             <wp:extent cx="3600000" cy="1680000"/>
@@ -1130,6 +1124,7 @@
           <w:bCs/>
           <w:color w:val="EE0000"/>
         </w:rPr>
+        <w:lastRenderedPageBreak/>
         <w:t>3. Memoria Permanente e Supporti di Memorizzazione di Massa</w:t>
       </w:r>
     </w:p>
@@ -1175,7 +1170,6 @@
         <w:t>In parole povere:</w:t>
       </w:r>
       <w:r>
-        <w:rPr/>
         <w:t xml:space="preserve"> la memoria secondaria (o di massa) è l'archivio del computer: dischi, chiavette, SSD. Costa poco, contiene tanto e non dimentica quando spegni, a differenza della RAM che è come il banco di lavoro che si svuota a fine giornata.</w:t>
       </w:r>
     </w:p>
@@ -1257,7 +1251,6 @@
         <w:t>In parole povere:</w:t>
       </w:r>
       <w:r>
-        <w:rPr/>
         <w:t xml:space="preserve"> accesso sequenziale vuol dire che per arrivare a un dato devi passare per tutti quelli che lo precedono, come cercare una canzone su una cassetta riavvolgendo il nastro. L'accesso diretto, invece, permette di saltare subito al punto giusto, come scegliere una traccia su un CD.</w:t>
       </w:r>
     </w:p>
@@ -1313,7 +1306,6 @@
           <w:b/>
           <w:bCs/>
         </w:rPr>
-        <w:lastRenderedPageBreak/>
         <w:t>Struttura fisica</w:t>
       </w:r>
       <w:r>
@@ -1370,7 +1362,6 @@
         <w:t>In parole povere:</w:t>
       </w:r>
       <w:r>
-        <w:rPr/>
         <w:t xml:space="preserve"> immagina un disco di vinile: le tracce sono i cerchi concentrici, i settori sono le fette di torta in cui ogni cerchio viene tagliato (ogni fetta contiene una quantità fissa di dati), il cilindro è la pila delle tracce alla stessa distanza dal centro nei vari piatti, come una colonna di anelli uguali impilati.</w:t>
       </w:r>
     </w:p>
@@ -1384,6 +1375,7 @@
         <w:rPr>
           <w:noProof/>
         </w:rPr>
+        <w:lastRenderedPageBreak/>
         <w:drawing>
           <wp:inline distT="0" distB="0" distL="0" distR="0" wp14:anchorId="7211AC2C" wp14:editId="2B06F684">
             <wp:extent cx="2880000" cy="2520478"/>
@@ -1452,7 +1444,6 @@
         <w:t>In parole povere:</w:t>
       </w:r>
       <w:r>
-        <w:rPr/>
         <w:t xml:space="preserve"> le tracce esterne sono più lunghe di quelle interne, quindi ci stanno più dati. Con lo zoned-bit recording il disco sfrutta questa maggior lunghezza dando più settori alle tracce esterne, invece di sprecare spazio con lo stesso numero ovunque. È come mettere più posti a sedere nelle file più larghe di un teatro.</w:t>
       </w:r>
     </w:p>
@@ -1543,7 +1534,6 @@
         <w:t>In parole povere:</w:t>
       </w:r>
       <w:r>
-        <w:rPr/>
         <w:t xml:space="preserve"> il seek time è il tempo che la testina impiega a spostarsi sulla traccia giusta, come il braccio del giradischi che si posa sul solco voluto.</w:t>
       </w:r>
     </w:p>
@@ -1581,7 +1571,6 @@
         <w:t>In parole povere:</w:t>
       </w:r>
       <w:r>
-        <w:rPr/>
         <w:t xml:space="preserve"> la latenza è l'attesa, dopo che la testina è arrivata sulla traccia, perché il disco giri finché il settore voluto le passa sotto. Pensa di aspettare che passi il tuo posto su una giostra che gira.</w:t>
       </w:r>
     </w:p>
@@ -1619,7 +1608,6 @@
         <w:t>In parole povere:</w:t>
       </w:r>
       <w:r>
-        <w:rPr/>
         <w:t xml:space="preserve"> è il tempo totale per raggiungere un dato: prima sposti la testina, poi aspetti che il disco giri. Quindi tempo di ricerca più latenza.</w:t>
       </w:r>
     </w:p>
@@ -1648,7 +1636,6 @@
         <w:t>In parole povere:</w:t>
       </w:r>
       <w:r>
-        <w:rPr/>
         <w:t xml:space="preserve"> è la velocità con cui, una volta trovato il dato, questo scorre dal disco al computer (o viceversa), un po' come la portata di un rubinetto una volta aperto.</w:t>
       </w:r>
     </w:p>
@@ -1745,14 +1732,7 @@
         <w:rPr>
           <w:highlight w:val="yellow"/>
         </w:rPr>
-        <w:t xml:space="preserve">ideali per la </w:t>
-      </w:r>
-      <w:r>
-        <w:rPr>
-          <w:highlight w:val="yellow"/>
-        </w:rPr>
-        <w:lastRenderedPageBreak/>
-        <w:t>riproduzione di flussi continui di dati</w:t>
+        <w:t>ideali per la riproduzione di flussi continui di dati</w:t>
       </w:r>
       <w:r>
         <w:t xml:space="preserve"> (come brani audio o video), ma meno efficienti per l'accesso casuale frequente.</w:t>
@@ -2034,6 +2014,7 @@
           <w:b/>
           <w:bCs/>
         </w:rPr>
+        <w:lastRenderedPageBreak/>
         <w:t>Limitazione ed erosione</w:t>
       </w:r>
       <w:r>
@@ -2084,7 +2065,6 @@
         <w:t>In parole povere:</w:t>
       </w:r>
       <w:r>
-        <w:rPr/>
         <w:t xml:space="preserve"> se scrivi sempre sulle stesse celle quelle si consumano prima delle altre. Il wear-leveling è la tattica del controller dell'SSD di far girare le scritture su tutte le celle, come ruotare le gomme dell'auto per farle consumare in modo uniforme.</w:t>
       </w:r>
     </w:p>
@@ -2093,7 +2073,6 @@
         <w:rPr>
           <w:b/>
         </w:rPr>
-        <w:lastRenderedPageBreak/>
         <w:t>Schede di memoria</w:t>
       </w:r>
       <w:r>
@@ -2259,7 +2238,6 @@
         <w:t>In parole povere:</w:t>
       </w:r>
       <w:r>
-        <w:rPr/>
         <w:t xml:space="preserve"> ASCII è una tabella che associa a ogni lettera, cifra o segno un numero a 7 bit (poi esteso a 8), come un codice Morse in cui ogni carattere ha la sua sequenza. Esempio: la lettera A è sempre lo stesso pattern di bit, in tutti i computer che usano l'ASCII.</w:t>
       </w:r>
     </w:p>
@@ -2363,7 +2341,6 @@
         <w:t>In parole povere:</w:t>
       </w:r>
       <w:r>
-        <w:rPr/>
         <w:t xml:space="preserve"> Unicode è una tabella enorme che dà un numero a ogni simbolo di ogni lingua del mondo (anche cinese ed emoji). UTF-8 è il modo di scrivere questi numeri in byte: le lettere inglesi occupano un solo byte, i simboli più rari ne occupano di più, così non si spreca spazio.</w:t>
       </w:r>
     </w:p>
@@ -2382,6 +2359,7 @@
           <w:bCs/>
           <w:color w:val="E97132" w:themeColor="accent2"/>
         </w:rPr>
+        <w:lastRenderedPageBreak/>
         <w:t>Rappresentazione dei Colori (Il Modello RGB)</w:t>
       </w:r>
     </w:p>
@@ -2419,7 +2397,6 @@
         <w:t>In parole povere:</w:t>
       </w:r>
       <w:r>
-        <w:rPr/>
         <w:t xml:space="preserve"> un'immagine digitale è come un mosaico: i pixel sono le tessere minuscole, ciascuna di un solo colore. Messe una accanto all'altra formano la figura.</w:t>
       </w:r>
     </w:p>
@@ -2491,7 +2468,6 @@
         <w:t>In parole povere:</w:t>
       </w:r>
       <w:r>
-        <w:rPr/>
         <w:t xml:space="preserve"> ogni colore si ottiene mescolando luce rossa, verde e blu in quantità diverse, come i tre faretti di un palcoscenico. Per ogni faretto si usa un byte, cioè un numero da 0 (spento) a 255 (al massimo): 0,0,0 è nero, 255,255,255 è bianco.</w:t>
       </w:r>
     </w:p>
@@ -2617,7 +2593,6 @@
         <w:rPr>
           <w:noProof/>
         </w:rPr>
-        <w:lastRenderedPageBreak/>
         <w:drawing>
           <wp:inline distT="0" distB="0" distL="0" distR="0" wp14:anchorId="6CE07A21" wp14:editId="7ABA43F6">
             <wp:extent cx="3600000" cy="1974449"/>
@@ -2811,7 +2786,6 @@
         <w:t>In parole povere:</w:t>
       </w:r>
       <w:r>
-        <w:rPr/>
         <w:t xml:space="preserve"> un'operazione booleana è un'operazione tra valori che possono essere solo vero o falso (1 o 0), come le domande a cui si risponde solo sì o no. Il risultato è a sua volta un sì o un no.</w:t>
       </w:r>
     </w:p>
@@ -2827,6 +2801,7 @@
           <w:b/>
           <w:bCs/>
         </w:rPr>
+        <w:lastRenderedPageBreak/>
         <w:t>AND</w:t>
       </w:r>
       <w:r>
@@ -2850,7 +2825,6 @@
         <w:t>In parole povere:</w:t>
       </w:r>
       <w:r>
-        <w:rPr/>
         <w:t xml:space="preserve"> AND dà 1 solo se tutti e due gli ingressi sono 1. Come due interruttori in serie: la lampadina si accende solo se li chiudi entrambi.</w:t>
       </w:r>
     </w:p>
@@ -2889,7 +2863,6 @@
         <w:t>In parole povere:</w:t>
       </w:r>
       <w:r>
-        <w:rPr/>
         <w:t xml:space="preserve"> OR dà 1 se almeno uno dei due ingressi è 1. Come due interruttori in parallelo: basta chiuderne uno perché la lampadina si accenda.</w:t>
       </w:r>
     </w:p>
@@ -2928,7 +2901,6 @@
         <w:t>In parole povere:</w:t>
       </w:r>
       <w:r>
-        <w:rPr/>
         <w:t xml:space="preserve"> XOR dà 1 quando i due ingressi sono diversi. Come i due interruttori di una scala: premendone uno si accende, premendo anche l'altro si spegne di nuovo.</w:t>
       </w:r>
     </w:p>
@@ -2967,7 +2939,6 @@
         <w:t>In parole povere:</w:t>
       </w:r>
       <w:r>
-        <w:rPr/>
         <w:t xml:space="preserve"> NOT è il bottone del contrario: se entra 1 esce 0, se entra 0 esce 1. Ha un solo ingresso.</w:t>
       </w:r>
     </w:p>
@@ -3045,7 +3016,6 @@
           <w:bCs/>
           <w:color w:val="E97132" w:themeColor="accent2"/>
         </w:rPr>
-        <w:lastRenderedPageBreak/>
         <w:t>Porte Logiche e tecnologia VLSI</w:t>
       </w:r>
     </w:p>
@@ -3110,7 +3080,6 @@
         <w:t>In parole povere:</w:t>
       </w:r>
       <w:r>
-        <w:rPr/>
         <w:t xml:space="preserve"> una porta logica è una piccola scatola elettronica che calcola un'operazione booleana: i fili in ingresso portano tensione alta o bassa (cioè 1 o 0) e ne esce uno solo con il risultato. Con tante porte collegate si costruisce tutto il computer.</w:t>
       </w:r>
     </w:p>
@@ -3194,6 +3163,7 @@
           <w:b/>
           <w:bCs/>
         </w:rPr>
+        <w:lastRenderedPageBreak/>
         <w:t>Integrazione VLSI</w:t>
       </w:r>
       <w:r>
@@ -3314,7 +3284,6 @@
         <w:t>In parole povere:</w:t>
       </w:r>
       <w:r>
-        <w:rPr/>
         <w:t xml:space="preserve"> la memoria principale è il blocco di appunti su cui il computer lavora mentre i programmi girano: è fatta di tantissimi piccoli circuiti che ricordano un bit ciascuno.</w:t>
       </w:r>
     </w:p>
@@ -3378,7 +3347,6 @@
         <w:t>In parole povere:</w:t>
       </w:r>
       <w:r>
-        <w:rPr/>
         <w:t xml:space="preserve"> la memoria è come un condominio con tante caselle uguali: ogni cella è una casella e ognuna contiene 8 bit. Un gruppo di 8 bit si chiama byte; è la porzione minima che il computer sposta o legge.</w:t>
       </w:r>
     </w:p>
@@ -3484,7 +3452,6 @@
         <w:t>In parole povere:</w:t>
       </w:r>
       <w:r>
-        <w:rPr/>
         <w:t xml:space="preserve"> in un numero scritto in cifre, la cifra più a sinistra conta di più (nelle migliaia, il 2 di 2000 pesa più del 5 di 5). Allo stesso modo in un byte il bit più a sinistra, MSB, è quello che pesa di più e quello più a destra, LSB, è quello che pesa di meno.</w:t>
       </w:r>
     </w:p>
@@ -3545,7 +3512,6 @@
         <w:t>In parole povere:</w:t>
       </w:r>
       <w:r>
-        <w:rPr/>
         <w:t xml:space="preserve"> l'indirizzo è il numero civico di una cella: serve a dire al computer in quale cella andare a leggere o scrivere, come il numero di una casella postale.</w:t>
       </w:r>
     </w:p>
@@ -3604,6 +3570,7 @@
         <w:rPr>
           <w:noProof/>
         </w:rPr>
+        <w:lastRenderedPageBreak/>
         <w:drawing>
           <wp:inline distT="0" distB="0" distL="0" distR="0" wp14:anchorId="3797C7D2" wp14:editId="54D9957C">
             <wp:extent cx="3960000" cy="2167000"/>
@@ -3698,11 +3665,7 @@
         <w:t>read operation</w:t>
       </w:r>
       <w:r>
-        <w:t xml:space="preserve">), con cui si richiede il contenuto presente a un </w:t>
-      </w:r>
-      <w:r>
-        <w:lastRenderedPageBreak/>
-        <w:t xml:space="preserve">determinato indirizzo, e la </w:t>
+        <w:t xml:space="preserve">), con cui si richiede il contenuto presente a un determinato indirizzo, e la </w:t>
       </w:r>
       <w:r>
         <w:rPr>
@@ -3734,7 +3697,6 @@
         <w:t>In parole povere:</w:t>
       </w:r>
       <w:r>
-        <w:rPr/>
         <w:t xml:space="preserve"> leggere è guardare cosa c'è scritto nella cella con un certo indirizzo, senza cambiarlo; scrivere è cancellare il contenuto della cella e metterci un valore nuovo, come cambiare il biglietto dentro una cassetta.</w:t>
       </w:r>
     </w:p>
@@ -3839,7 +3801,6 @@
         <w:t>In parole povere:</w:t>
       </w:r>
       <w:r>
-        <w:rPr/>
         <w:t xml:space="preserve"> RAM vuol dire memoria a cui si accede in un punto qualsiasi, senza dover scorrere gli altri, e con la stessa velocità per tutti: come aprire direttamente la casella che vuoi senza passare dalle precedenti. La DRAM tiene i bit come cariche elettriche piccolissime che si scaricano, quindi bisogna ricaricarle di continuo (refresh).</w:t>
       </w:r>
     </w:p>
@@ -3902,7 +3863,6 @@
         <w:t>In parole povere:</w:t>
       </w:r>
       <w:r>
-        <w:rPr/>
         <w:t xml:space="preserve"> un kilobyte in informatica non è 1000 byte ma 1024, perché si lavora con potenze di 2. Sono due modi di contare: 1024 è il numero tondo per i computer, 1000 quello tondo per noi.</w:t>
       </w:r>
     </w:p>
@@ -3975,6 +3935,7 @@
           <w:b/>
           <w:bCs/>
         </w:rPr>
+        <w:lastRenderedPageBreak/>
         <w:t>Text File (File di testo puro)</w:t>
       </w:r>
       <w:r>
@@ -3998,7 +3959,6 @@
         <w:t>In parole povere:</w:t>
       </w:r>
       <w:r>
-        <w:rPr/>
         <w:t xml:space="preserve"> un file di testo puro contiene solo i caratteri, come un foglio scritto a macchina senza grassetti né colori. Lo apri con qualunque editor, anche il più semplice.</w:t>
       </w:r>
     </w:p>
@@ -4245,7 +4205,6 @@
         <w:t>In parole povere:</w:t>
       </w:r>
       <w:r>
-        <w:rPr/>
         <w:t xml:space="preserve"> un'immagine bitmap è come un disegno a quadretti: la figura è divisa in una griglia di puntini (pixel) e si salva il colore di ciascun quadretto, uno dopo l'altro.</w:t>
       </w:r>
     </w:p>
@@ -4261,7 +4220,6 @@
           <w:b/>
           <w:bCs/>
         </w:rPr>
-        <w:lastRenderedPageBreak/>
         <w:t>Immagini in Bianco e Nero</w:t>
       </w:r>
       <w:r>
@@ -4389,6 +4347,7 @@
           <w:b/>
           <w:bCs/>
         </w:rPr>
+        <w:lastRenderedPageBreak/>
         <w:t>Immagini a Colori (RGB)</w:t>
       </w:r>
       <w:r>
@@ -4473,7 +4432,6 @@
         <w:t>In parole povere:</w:t>
       </w:r>
       <w:r>
-        <w:rPr/>
         <w:t xml:space="preserve"> invece di dire quanto rosso, verde e blu c'è, si dice quanto è chiaro il punto (luminanza) e di che tinta è (crominanza). È come una foto in bianco e nero (la luminanza) a cui si aggiunge la tinta sopra. Serve soprattutto per comprimere meglio.</w:t>
       </w:r>
     </w:p>
@@ -4565,7 +4523,6 @@
         <w:t>In parole povere:</w:t>
       </w:r>
       <w:r>
-        <w:rPr/>
         <w:t xml:space="preserve"> un'immagine vettoriale non memorizza i puntini, ma le istruzioni per disegnarla (tira una linea da qui a là, disegna un cerchio così). Il dispositivo la ridisegna alla grandezza che vuoi, quindi non diventa mai sgranata.</w:t>
       </w:r>
     </w:p>
@@ -4740,7 +4697,6 @@
         <w:t>In parole povere:</w:t>
       </w:r>
       <w:r>
-        <w:rPr/>
         <w:t xml:space="preserve"> il campionamento consiste nel misurare il volume del suono a intervalli regolarissimi, come fare tante fotografie ravvicinate, e salvare i numeri trovati. Più misure al secondo fai, più il suono ricostruito è fedele.</w:t>
       </w:r>
     </w:p>
@@ -4943,7 +4899,6 @@
         <w:t>In parole povere:</w:t>
       </w:r>
       <w:r>
-        <w:rPr/>
         <w:t xml:space="preserve"> MIDI non salva il suono ma lo spartito: dice quale strumento suona, quale nota, quanto forte e per quanto tempo. È come mandare un foglio di musica a un pianista invece di una registrazione: occupa pochissimo, ma il suono finale dipende da chi suona.</w:t>
       </w:r>
     </w:p>
@@ -5127,10 +5082,10 @@
         <w:rPr>
           <w:b/>
         </w:rPr>
+        <w:lastRenderedPageBreak/>
         <w:t>In parole povere:</w:t>
       </w:r>
       <w:r>
-        <w:rPr/>
         <w:t xml:space="preserve"> nella notazione posizionale il valore di una cifra dipende da dove sta. In base 10 ogni posto vale dieci volte il precedente (unità, decine, centinaia); in base 2 ogni posto vale il doppio del precedente (1, 2, 4, 8...) e le cifre sono solo 0 e 1.</w:t>
       </w:r>
     </w:p>
@@ -5263,11 +5218,7 @@
         <w:t>valore decimale equivalente a una stringa binaria si ottiene moltiplicando ogni cifra per il peso della sua posizione e sommando i prodotti ottenuti</w:t>
       </w:r>
       <w:r>
-        <w:t xml:space="preserve">. </w:t>
-      </w:r>
-      <w:r>
-        <w:lastRenderedPageBreak/>
-        <w:t>Poiché nel binario esistono solo 0 e 1, l'operazione si riduce semplicemente alla somma dei pesi corrispondenti alle posizioni occupate dal bit 1.</w:t>
+        <w:t>. Poiché nel binario esistono solo 0 e 1, l'operazione si riduce semplicemente alla somma dei pesi corrispondenti alle posizioni occupate dal bit 1.</w:t>
       </w:r>
     </w:p>
     <w:p>
@@ -5278,7 +5229,6 @@
         <w:t>In parole povere:</w:t>
       </w:r>
       <w:r>
-        <w:rPr/>
         <w:t xml:space="preserve"> per sapere che numero è una sequenza di bit, guardi dove stanno gli 1 e sommi i pesi di quelle posizioni. Esempio: 101 vuol dire 4 più 1, cioè 5.</w:t>
       </w:r>
     </w:p>
@@ -5610,6 +5560,7 @@
           <w:b/>
           <w:bCs/>
         </w:rPr>
+        <w:lastRenderedPageBreak/>
         <w:t>Procedimento</w:t>
       </w:r>
       <w:r>
@@ -5690,7 +5641,6 @@
           <w:i/>
           <w:iCs/>
         </w:rPr>
-        <w:lastRenderedPageBreak/>
         <w:t>Esempio (Conversione del numero 13)</w:t>
       </w:r>
       <w:r>
@@ -6006,6 +5956,7 @@
         </w:numPr>
       </w:pPr>
       <w:r>
+        <w:lastRenderedPageBreak/>
         <w:t>Colonna 1 (più a destra): 0 + 1 = 1</w:t>
       </w:r>
     </w:p>
@@ -6081,7 +6032,6 @@
         <w:rPr>
           <w:noProof/>
         </w:rPr>
-        <w:lastRenderedPageBreak/>
         <w:drawing>
           <wp:inline distT="0" distB="0" distL="0" distR="0" wp14:anchorId="7A432D4B" wp14:editId="7E2D99BE">
             <wp:extent cx="3060000" cy="2433363"/>
@@ -6189,7 +6139,6 @@
         <w:t>In parole povere:</w:t>
       </w:r>
       <w:r>
-        <w:rPr/>
         <w:t xml:space="preserve"> il punto radice è la virgola dei numeri binari: a sinistra le potenze di 2 normali (1, 2, 4), a destra le metà successive (un mezzo, un quarto, un ottavo). Esempio: 0.1 in binario vale un mezzo.</w:t>
       </w:r>
     </w:p>
@@ -6394,6 +6343,7 @@
           <w:b/>
           <w:bCs/>
         </w:rPr>
+        <w:lastRenderedPageBreak/>
         <w:t>Operazioni con i numeri frazionari</w:t>
       </w:r>
       <w:r>
@@ -6501,13 +6451,11 @@
         <w:t>In parole povere:</w:t>
       </w:r>
       <w:r>
-        <w:rPr/>
         <w:t xml:space="preserve"> è un modo di scrivere i numeri positivi e negativi con un numero fisso di bit, in cui per cambiare segno basta una semplice regola (copia i bit fino al primo 1, poi inverti il resto). I positivi iniziano per 0, i negativi per 1. Il vantaggio è che per sommare e sottrarre l'hardware usa un solo circuito.</w:t>
       </w:r>
     </w:p>
     <w:p>
       <w:r>
-        <w:lastRenderedPageBreak/>
         <w:t xml:space="preserve">Il </w:t>
       </w:r>
       <w:r>
@@ -6619,7 +6567,6 @@
         <w:t>In parole povere:</w:t>
       </w:r>
       <w:r>
-        <w:rPr/>
         <w:t xml:space="preserve"> il bit di segno è il primo bit a sinistra e dice se il numero è positivo o zero (0) oppure negativo (1). Con 4 bit, 0101 è +5 e 1011 è un numero negativo.</w:t>
       </w:r>
     </w:p>
@@ -6779,6 +6726,7 @@
         <w:rPr>
           <w:noProof/>
         </w:rPr>
+        <w:lastRenderedPageBreak/>
         <w:drawing>
           <wp:inline distT="0" distB="0" distL="0" distR="0" wp14:anchorId="367005D6" wp14:editId="029CA74E">
             <wp:extent cx="3420000" cy="3420000"/>
@@ -6843,7 +6791,6 @@
           <w:bCs/>
           <w:color w:val="E97132" w:themeColor="accent2"/>
         </w:rPr>
-        <w:lastRenderedPageBreak/>
         <w:t>Aritmetica e Sottrazione in Complemento a Due</w:t>
       </w:r>
     </w:p>
@@ -7098,12 +7045,12 @@
         <w:t>In parole povere:</w:t>
       </w:r>
       <w:r>
-        <w:rPr/>
         <w:t xml:space="preserve"> l'overflow succede quando il risultato non ci sta nei bit a disposizione, come cercare di scrivere 100 su un contatore a due cifre: il numero esce dalla scala e il calcolo dà un valore sbagliato. Con 4 bit il massimo è 7, quindi 5 più 4 non ci sta.</w:t>
       </w:r>
     </w:p>
     <w:p>
       <w:r>
+        <w:lastRenderedPageBreak/>
         <w:t>L'hardware rileva automaticamente l'insorgere dell'overflow monitorando il bit di segno del risultato:</w:t>
       </w:r>
     </w:p>
@@ -7351,7 +7298,6 @@
         <w:t>In parole povere:</w:t>
       </w:r>
       <w:r>
-        <w:rPr/>
         <w:t xml:space="preserve"> si mette lo zero a metà della lista dei numeri in ordine e si conta in su (positivi) e in giù (negativi) da lì. È come i piani di un palazzo in cui il piano zero non è il primo: i piani sotto sono i negativi e quelli sopra i positivi.</w:t>
       </w:r>
     </w:p>
@@ -7408,7 +7354,6 @@
         <w:t>In parole povere:</w:t>
       </w:r>
       <w:r>
-        <w:rPr/>
         <w:t xml:space="preserve"> il nome dice quanto vale lo zero se letto come binario normale: se lo zero è 1000, che in binario vale 8, il sistema si chiama Excess-8. Per ottenere il numero vero si toglie 8 al valore binario.</w:t>
       </w:r>
     </w:p>
@@ -7428,7 +7373,6 @@
           <w:bCs/>
           <w:color w:val="EE0000"/>
         </w:rPr>
-        <w:lastRenderedPageBreak/>
         <w:t xml:space="preserve">9. </w:t>
       </w:r>
       <w:r>
@@ -7560,7 +7504,6 @@
         <w:t>In parole povere:</w:t>
       </w:r>
       <w:r>
-        <w:rPr/>
         <w:t xml:space="preserve"> è la notazione scientifica del computer: invece di tenere il numero con la virgola fissa si salvano le cifre significative e dove va messa la virgola, come 3,5 per 10 alla sesta. Così il numero può essere gigantesco o minuscolo senza occupare molto spazio.</w:t>
       </w:r>
     </w:p>
@@ -7581,6 +7524,7 @@
           <w:b/>
           <w:bCs/>
         </w:rPr>
+        <w:lastRenderedPageBreak/>
         <w:t>Bit di segno (Sign Bit - 1 bit)</w:t>
       </w:r>
       <w:r>
@@ -7693,7 +7637,6 @@
         <w:t>In parole povere:</w:t>
       </w:r>
       <w:r>
-        <w:rPr/>
         <w:t xml:space="preserve"> l'esponente dice di quanto spostare la virgola, cioè per quale potenza di 2 moltiplicare. Si salva in notazione in eccesso per avere anche esponenti negativi: è il numero che dice sposta a destra o sposta a sinistra.</w:t>
       </w:r>
     </w:p>
@@ -7750,7 +7693,6 @@
         <w:t>In parole povere:</w:t>
       </w:r>
       <w:r>
-        <w:rPr/>
         <w:t xml:space="preserve"> la mantissa è il blocco di cifre significative del numero, quelle che contano, senza dire dove sta la virgola. È come le cifre 3,14 in 3,14 per 10 alla seconda: l'esponente le sposta, ma le cifre sono quelle.</w:t>
       </w:r>
     </w:p>
@@ -7905,64 +7847,64 @@
           <w:b/>
           <w:bCs/>
         </w:rPr>
+        <w:t>Doppia Precisione (Double Precision - 64 bit)</w:t>
+      </w:r>
+      <w:r>
+        <w:t xml:space="preserve">: impiega </w:t>
+      </w:r>
+      <w:r>
+        <w:rPr>
+          <w:highlight w:val="yellow"/>
+        </w:rPr>
+        <w:t>1 bit di segno</w:t>
+      </w:r>
+      <w:r>
+        <w:t xml:space="preserve">, </w:t>
+      </w:r>
+      <w:r>
+        <w:rPr>
+          <w:highlight w:val="yellow"/>
+        </w:rPr>
+        <w:t>11 bit per l'esponente</w:t>
+      </w:r>
+      <w:r>
+        <w:t xml:space="preserve"> (in Excess-1023) e </w:t>
+      </w:r>
+      <w:r>
+        <w:rPr>
+          <w:highlight w:val="yellow"/>
+        </w:rPr>
+        <w:t>52 bit per la mantissa</w:t>
+      </w:r>
+      <w:r>
+        <w:t>, offrendo una precisione di circa 15 cifre decimali significative.</w:t>
+      </w:r>
+    </w:p>
+    <w:p>
+      <w:pPr>
+        <w:rPr>
+          <w:b/>
+          <w:bCs/>
+          <w:color w:val="E97132" w:themeColor="accent2"/>
+        </w:rPr>
+      </w:pPr>
+    </w:p>
+    <w:p>
+      <w:pPr>
+        <w:pStyle w:val="Titolo2"/>
+        <w:rPr>
+          <w:b/>
+          <w:bCs/>
+          <w:color w:val="E97132" w:themeColor="accent2"/>
+        </w:rPr>
+      </w:pPr>
+      <w:r>
+        <w:rPr>
+          <w:b/>
+          <w:bCs/>
+          <w:color w:val="E97132" w:themeColor="accent2"/>
+        </w:rPr>
         <w:lastRenderedPageBreak/>
-        <w:t>Doppia Precisione (Double Precision - 64 bit)</w:t>
-      </w:r>
-      <w:r>
-        <w:t xml:space="preserve">: impiega </w:t>
-      </w:r>
-      <w:r>
-        <w:rPr>
-          <w:highlight w:val="yellow"/>
-        </w:rPr>
-        <w:t>1 bit di segno</w:t>
-      </w:r>
-      <w:r>
-        <w:t xml:space="preserve">, </w:t>
-      </w:r>
-      <w:r>
-        <w:rPr>
-          <w:highlight w:val="yellow"/>
-        </w:rPr>
-        <w:t>11 bit per l'esponente</w:t>
-      </w:r>
-      <w:r>
-        <w:t xml:space="preserve"> (in Excess-1023) e </w:t>
-      </w:r>
-      <w:r>
-        <w:rPr>
-          <w:highlight w:val="yellow"/>
-        </w:rPr>
-        <w:t>52 bit per la mantissa</w:t>
-      </w:r>
-      <w:r>
-        <w:t>, offrendo una precisione di circa 15 cifre decimali significative.</w:t>
-      </w:r>
-    </w:p>
-    <w:p>
-      <w:pPr>
-        <w:rPr>
-          <w:b/>
-          <w:bCs/>
-          <w:color w:val="E97132" w:themeColor="accent2"/>
-        </w:rPr>
-      </w:pPr>
-    </w:p>
-    <w:p>
-      <w:pPr>
-        <w:pStyle w:val="Titolo2"/>
-        <w:rPr>
-          <w:b/>
-          <w:bCs/>
-          <w:color w:val="E97132" w:themeColor="accent2"/>
-        </w:rPr>
-      </w:pPr>
-      <w:r>
-        <w:rPr>
-          <w:b/>
-          <w:bCs/>
-          <w:color w:val="E97132" w:themeColor="accent2"/>
-        </w:rPr>
         <w:t>Errori di Troncamento e Proprietà dell'Aritmetica in Virgola Mobile</w:t>
       </w:r>
     </w:p>
@@ -8009,7 +7951,6 @@
         <w:t>In parole povere:</w:t>
       </w:r>
       <w:r>
-        <w:rPr/>
         <w:t xml:space="preserve"> i bit della mantissa sono pochi: se il numero ne richiede di più, quelli in eccesso vengono buttati via. Come scrivere 3,14159 su un foglio che ha posto solo per 3,14: perdi qualcosa e il valore salvato è un po' diverso da quello vero.</w:t>
       </w:r>
     </w:p>
@@ -8194,12 +8135,12 @@
         <w:t>In parole povere:</w:t>
       </w:r>
       <w:r>
-        <w:rPr/>
         <w:t xml:space="preserve"> comprimere un file vuol dire riscriverlo in modo più corto, sfruttando ripetizioni e cose ridondanti, per occupare meno spazio e viaggiare più in fretta in rete. Come riassumere un racconto o fare le valigie piegando bene i vestiti.</w:t>
       </w:r>
     </w:p>
     <w:p>
       <w:r>
+        <w:lastRenderedPageBreak/>
         <w:t xml:space="preserve">Tutti gli </w:t>
       </w:r>
       <w:r>
@@ -8242,7 +8183,6 @@
           <w:b/>
           <w:bCs/>
         </w:rPr>
-        <w:lastRenderedPageBreak/>
         <w:t xml:space="preserve">Compressione </w:t>
       </w:r>
       <w:r>
@@ -8308,7 +8248,6 @@
         <w:t>In parole povere:</w:t>
       </w:r>
       <w:r>
-        <w:rPr/>
         <w:t xml:space="preserve"> lossless significa senza perdita: dopo aver decompresso si riottiene il file identico all'originale, come una valigia che apri e ritrovi tutto uguale. Necessario per programmi, testi e conti.</w:t>
       </w:r>
     </w:p>
@@ -8390,7 +8329,6 @@
         <w:t>In parole povere:</w:t>
       </w:r>
       <w:r>
-        <w:rPr/>
         <w:t xml:space="preserve"> lossy significa con perdita: si butta via qualcosa che si nota poco, per risparmiare molto di più, e non si può recuperare. Come ridurre una foto: a occhio sembra uguale ma i dettagli minuscoli non ci sono più. Va bene per foto, musica e video.</w:t>
       </w:r>
     </w:p>
@@ -8514,7 +8452,6 @@
         <w:t>In parole povere:</w:t>
       </w:r>
       <w:r>
-        <w:rPr/>
         <w:t xml:space="preserve"> se ci sono lunghe serie di valori uguali, invece di ripeterli si scrive quale valore e quante volte. Esempio: invece di AAAAAAAA scrivi 8 A. È lossless e va bene dove ci sono molte ripetizioni.</w:t>
       </w:r>
     </w:p>
@@ -8562,7 +8499,6 @@
         <w:t>In parole povere:</w:t>
       </w:r>
       <w:r>
-        <w:rPr/>
         <w:t xml:space="preserve"> le cose che compaiono spesso ricevono codici brevi e quelle rare codici lunghi, come le abbreviazioni dei messaggi per le parole più comuni. Nel testo inglese la e ha un codice corto e la z uno lungo, così in media si risparmia.</w:t>
       </w:r>
     </w:p>
@@ -8675,7 +8611,6 @@
         <w:t>In parole povere:</w:t>
       </w:r>
       <w:r>
-        <w:rPr/>
         <w:t xml:space="preserve"> se ogni elemento è quasi uguale al precedente (come due fotogrammi di un film), si salva solo ciò che è cambiato. Esempio: si dice nella scena cambia solo la posizione dell'attore invece di ridisegnare tutto lo sfondo.</w:t>
       </w:r>
     </w:p>
@@ -8691,6 +8626,7 @@
           <w:b/>
           <w:bCs/>
         </w:rPr>
+        <w:lastRenderedPageBreak/>
         <w:t>Codifica a Dizionario e Algoritmo LZW</w:t>
       </w:r>
       <w:r>
@@ -8740,7 +8676,6 @@
         <w:t>In parole povere:</w:t>
       </w:r>
       <w:r>
-        <w:rPr/>
         <w:t xml:space="preserve"> si crea un dizionario numerato di pezzi di messaggio (parole o gruppi di lettere) e il messaggio viene scritto con i numeri del dizionario. Come usare il numero di pagina di un libro invece di ricopiare il testo: il numero è più corto della parola.</w:t>
       </w:r>
     </w:p>
@@ -8806,7 +8741,6 @@
         <w:t>In parole povere:</w:t>
       </w:r>
       <w:r>
-        <w:rPr/>
         <w:t xml:space="preserve"> è un dizionario che si costruisce mentre il testo scorre: parte con le lettere semplici e aggiunge i gruppi che si ripetono. Chi decomprime ripete lo stesso lavoro e ricostruisce il dizionario da solo, quindi non serve spedirlo insieme al file.</w:t>
       </w:r>
     </w:p>
@@ -8901,7 +8835,6 @@
           <w:bCs/>
           <w:color w:val="E97132" w:themeColor="accent2"/>
         </w:rPr>
-        <w:lastRenderedPageBreak/>
         <w:t>Compressione delle Immagini: GIF, JPEG e TIFF</w:t>
       </w:r>
     </w:p>
@@ -9183,6 +9116,7 @@
           <w:bCs/>
           <w:color w:val="E97132" w:themeColor="accent2"/>
         </w:rPr>
+        <w:lastRenderedPageBreak/>
         <w:t>Compressione Audio e Video: MPEG e MP3</w:t>
       </w:r>
     </w:p>
@@ -9426,7 +9360,6 @@
     </w:p>
     <w:p>
       <w:r>
-        <w:lastRenderedPageBreak/>
         <w:t xml:space="preserve">La </w:t>
       </w:r>
       <w:r>
@@ -9498,7 +9431,6 @@
         <w:t>In parole povere:</w:t>
       </w:r>
       <w:r>
-        <w:rPr/>
         <w:t xml:space="preserve"> il bit di parità è un bit in più, messo alla fine di un gruppo di bit, che serve per controllare gli errori: si sceglie in modo che il numero di 1 sia sempre pari (o sempre dispari). Se all'arrivo il conto non torna, qualche bit si è rovinato per strada.</w:t>
       </w:r>
     </w:p>
@@ -9545,7 +9477,6 @@
         <w:t>In parole povere:</w:t>
       </w:r>
       <w:r>
-        <w:rPr/>
         <w:t xml:space="preserve"> si aggiunge 0 o 1 in modo che il totale degli 1 sia dispari. Se arriva un numero pari di 1 c'è sicuramente un errore. Esempio: 1101 ha tre 1, già dispari, quindi si aggiunge 0.</w:t>
       </w:r>
     </w:p>
@@ -9592,12 +9523,12 @@
         <w:t>In parole povere:</w:t>
       </w:r>
       <w:r>
-        <w:rPr/>
         <w:t xml:space="preserve"> il contrario: il bit aggiunto serve a far venire un numero pari di 1. Esempio: 1101 ha tre 1, quindi si aggiunge un 1 per arrivare a quattro.</w:t>
       </w:r>
     </w:p>
     <w:p>
       <w:r>
+        <w:lastRenderedPageBreak/>
         <w:t xml:space="preserve">Un'applicazione pratica fondamentale di questo schema si trova nelle memorie </w:t>
       </w:r>
       <w:r>
@@ -9781,7 +9712,6 @@
         <w:t>In parole povere:</w:t>
       </w:r>
       <w:r>
-        <w:rPr/>
         <w:t xml:space="preserve"> un bit di parità dice solo c'è stato un errore. Un codice correttore invece aggiunge tanti bit di controllo da capire anche dove sta l'errore, e quindi lo ripara da solo, senza dover rimandare il messaggio. Come il correttore automatico che sa quale lettera sbagliata sostituire.</w:t>
       </w:r>
     </w:p>
@@ -9858,7 +9788,6 @@
         <w:t>In parole povere:</w:t>
       </w:r>
       <w:r>
-        <w:rPr/>
         <w:t xml:space="preserve"> la distanza di Hamming conta in quante posizioni due stringhe di bit sono diverse, come in un gioco dei sette errori. Esempio: 1011 e 1001 differiscono in un solo posto, quindi distanza 1; 1011 e 0100 differiscono in quattro posti, distanza 4.</w:t>
       </w:r>
     </w:p>
@@ -9955,7 +9884,6 @@
         <w:rPr>
           <w:noProof/>
         </w:rPr>
-        <w:lastRenderedPageBreak/>
         <w:drawing>
           <wp:inline distT="0" distB="0" distL="0" distR="0" wp14:anchorId="4ECB1687" wp14:editId="602C25EA">
             <wp:extent cx="3960000" cy="1473936"/>
@@ -10017,6 +9945,7 @@
           <w:b/>
           <w:bCs/>
         </w:rPr>
+        <w:lastRenderedPageBreak/>
         <w:t>Distanza minima pari a 5</w:t>
       </w:r>
       <w:r>
@@ -10231,7 +10160,6 @@
         <w:t>In parole povere:</w:t>
       </w:r>
       <w:r>
-        <w:rPr/>
         <w:t xml:space="preserve"> una proposizione atomica è un'affermazione semplice, senza pezzi dentro, di cui interessa solo se è vera o falsa (come c'è un'automobile o è giorno). È il mattoncino da cui si costruiscono le frasi più complicate.</w:t>
       </w:r>
     </w:p>
@@ -10248,7 +10176,6 @@
         <w:t>In parole povere:</w:t>
       </w:r>
       <w:r>
-        <w:rPr/>
         <w:t xml:space="preserve"> una proposizione è una frase di cui ha senso dire che è vera oppure falsa (una cosa o l'altra). Non importa se non sai quale delle due. Esempio: sette è un numero primo è vera; Roma è in Francia è falsa.</w:t>
       </w:r>
     </w:p>
@@ -10320,28 +10247,28 @@
         </w:numPr>
       </w:pPr>
       <w:r>
+        <w:t xml:space="preserve">"La Terra è l'unico pianeta dell'universo che contiene vita": non sappiamo se è vera o falsa e magari non lo sapremo mai, ma ha </w:t>
+      </w:r>
+      <w:r>
+        <w:rPr>
+          <w:b/>
+        </w:rPr>
+        <w:t>un valore di verità</w:t>
+      </w:r>
+      <w:r>
+        <w:t xml:space="preserve"> anche se ignoto. La logica proposizionale copre anche questi casi, in cui si suppone soltanto che il valore esista.</w:t>
+      </w:r>
+    </w:p>
+    <w:p>
+      <w:pPr>
+        <w:pStyle w:val="Titolo2"/>
+      </w:pPr>
+      <w:r>
+        <w:rPr>
+          <w:b/>
+          <w:color w:val="E97132"/>
+        </w:rPr>
         <w:lastRenderedPageBreak/>
-        <w:t xml:space="preserve">"La Terra è l'unico pianeta dell'universo che contiene vita": non sappiamo se è vera o falsa e magari non lo sapremo mai, ma ha </w:t>
-      </w:r>
-      <w:r>
-        <w:rPr>
-          <w:b/>
-        </w:rPr>
-        <w:t>un valore di verità</w:t>
-      </w:r>
-      <w:r>
-        <w:t xml:space="preserve"> anche se ignoto. La logica proposizionale copre anche questi casi, in cui si suppone soltanto che il valore esista.</w:t>
-      </w:r>
-    </w:p>
-    <w:p>
-      <w:pPr>
-        <w:pStyle w:val="Titolo2"/>
-      </w:pPr>
-      <w:r>
-        <w:rPr>
-          <w:b/>
-          <w:color w:val="E97132"/>
-        </w:rPr>
         <w:t>Che cosa non è una proposizione</w:t>
       </w:r>
     </w:p>
@@ -10462,7 +10389,6 @@
         <w:t>In parole povere:</w:t>
       </w:r>
       <w:r>
-        <w:rPr/>
         <w:t xml:space="preserve"> una variabile proposizionale è un'etichetta (p, q, r) che sta per una proposizione qualsiasi, come in algebra x sta per un numero. Si usa per ragionare sulla forma delle frasi senza ripetere ogni volta il testo.</w:t>
       </w:r>
     </w:p>
@@ -10520,7 +10446,6 @@
         <w:t>In parole povere:</w:t>
       </w:r>
       <w:r>
-        <w:rPr/>
         <w:t xml:space="preserve"> valore booleano è un altro nome per vero e falso (1 e 0). Il nome ricorda George Boole, che trasformò la logica da filosofia a calcolo, e per questo si parla di logica booleana quando i valori sono solo due.</w:t>
       </w:r>
     </w:p>
@@ -10634,10 +10559,10 @@
         <w:rPr>
           <w:b/>
         </w:rPr>
+        <w:lastRenderedPageBreak/>
         <w:t>In parole povere:</w:t>
       </w:r>
       <w:r>
-        <w:rPr/>
         <w:t xml:space="preserve"> un connettivo è una macchinetta che prende uno o più valori di verità e ne restituisce uno nuovo, come and, or e not. Prende le frasi vero/falso e le combina per formarne di più grandi. Esempio: piove E fa freddo.</w:t>
       </w:r>
     </w:p>
@@ -10650,405 +10575,400 @@
           <w:b/>
           <w:color w:val="E97132"/>
         </w:rPr>
+        <w:t>La congiunzione (and)</w:t>
+      </w:r>
+    </w:p>
+    <w:p>
+      <w:r>
+        <w:t xml:space="preserve">La </w:t>
+      </w:r>
+      <w:r>
+        <w:rPr>
+          <w:b/>
+          <w:highlight w:val="yellow"/>
+        </w:rPr>
+        <w:t>congiunzione</w:t>
+      </w:r>
+      <w:r>
+        <w:rPr>
+          <w:highlight w:val="yellow"/>
+        </w:rPr>
+        <w:t xml:space="preserve"> p ∧ q si legge "p e q": è vera quando </w:t>
+      </w:r>
+      <w:r>
+        <w:rPr>
+          <w:b/>
+          <w:highlight w:val="yellow"/>
+        </w:rPr>
+        <w:t>entrambe</w:t>
+      </w:r>
+      <w:r>
+        <w:rPr>
+          <w:highlight w:val="yellow"/>
+        </w:rPr>
+        <w:t xml:space="preserve"> le proposizioni sono vere, e falsa se almeno una è falsa</w:t>
+      </w:r>
+      <w:r>
+        <w:t>. Esempio del libro: "un decennio è di 10 anni e un millennio è di 100 anni" è falsa, perché la seconda parte è falsa.</w:t>
+      </w:r>
+    </w:p>
+    <w:p>
+      <w:r>
+        <w:rPr>
+          <w:b/>
+        </w:rPr>
+        <w:t>In parole povere:</w:t>
+      </w:r>
+      <w:r>
+        <w:t xml:space="preserve"> la congiunzione è la e: vale vero solo se sono vere tutte e due le frasi. Basta una falsa e il risultato è falso. Esempio: ho fame e ho soldi: se manca uno dei due, non mangio.</w:t>
+      </w:r>
+    </w:p>
+    <w:p>
+      <w:pPr>
+        <w:pStyle w:val="Titolo2"/>
+      </w:pPr>
+      <w:r>
+        <w:rPr>
+          <w:b/>
+          <w:color w:val="E97132"/>
+        </w:rPr>
+        <w:t>La disgiunzione (or) e il caso dell'xor</w:t>
+      </w:r>
+    </w:p>
+    <w:p>
+      <w:r>
+        <w:t xml:space="preserve">La </w:t>
+      </w:r>
+      <w:r>
+        <w:rPr>
+          <w:b/>
+          <w:highlight w:val="yellow"/>
+        </w:rPr>
+        <w:t>disgiunzione</w:t>
+      </w:r>
+      <w:r>
+        <w:rPr>
+          <w:highlight w:val="yellow"/>
+        </w:rPr>
+        <w:t xml:space="preserve"> p ∨ q si legge "p o q" ed è la disgiunzione </w:t>
+      </w:r>
+      <w:r>
+        <w:rPr>
+          <w:b/>
+          <w:highlight w:val="yellow"/>
+        </w:rPr>
+        <w:t>inclusiva</w:t>
+      </w:r>
+      <w:r>
+        <w:t xml:space="preserve">: </w:t>
+      </w:r>
+      <w:r>
+        <w:rPr>
+          <w:highlight w:val="yellow"/>
+        </w:rPr>
+        <w:t xml:space="preserve">è vera se è vera p, oppure è vera q, </w:t>
+      </w:r>
+      <w:r>
+        <w:rPr>
+          <w:b/>
+          <w:highlight w:val="yellow"/>
+        </w:rPr>
+        <w:t>oppure lo sono entrambe</w:t>
+      </w:r>
+      <w:r>
+        <w:t xml:space="preserve">. </w:t>
+      </w:r>
+      <w:r>
+        <w:rPr>
+          <w:highlight w:val="yellow"/>
+        </w:rPr>
+        <w:t>È falsa solo quando sono false tutte e due</w:t>
+      </w:r>
+      <w:r>
+        <w:t>. Esempio del libro: "un millennio è di 100 anni o un millennio è di 1000 anni" è vera, perché basta la seconda parte.</w:t>
+      </w:r>
+    </w:p>
+    <w:p>
+      <w:r>
+        <w:rPr>
+          <w:b/>
+        </w:rPr>
+        <w:t>In parole povere:</w:t>
+      </w:r>
+      <w:r>
+        <w:t xml:space="preserve"> la disgiunzione è la o: basta che una delle due sia vera. Anche se sono vere tutte e due, è vera. Solo se sono entrambe false è falsa. Esempio: prendo il caffè o il tè: se prendo tutti e due non ho sbagliato.</w:t>
+      </w:r>
+    </w:p>
+    <w:p>
+      <w:r>
+        <w:rPr>
+          <w:highlight w:val="yellow"/>
+        </w:rPr>
+        <w:t xml:space="preserve">Esiste anche la disgiunzione </w:t>
+      </w:r>
+      <w:r>
+        <w:rPr>
+          <w:b/>
+          <w:highlight w:val="yellow"/>
+        </w:rPr>
+        <w:t>esclusiva</w:t>
+      </w:r>
+      <w:r>
+        <w:t xml:space="preserve"> (l'*aut* del latino, </w:t>
+      </w:r>
+      <w:r>
+        <w:rPr>
+          <w:b/>
+          <w:highlight w:val="yellow"/>
+        </w:rPr>
+        <w:t>xor</w:t>
+      </w:r>
+      <w:r>
+        <w:t xml:space="preserve"> in inglese), </w:t>
+      </w:r>
+      <w:r>
+        <w:rPr>
+          <w:highlight w:val="yellow"/>
+        </w:rPr>
+        <w:t>vera solo quando una delle due è vera e l'altra è falsa</w:t>
+      </w:r>
+      <w:r>
+        <w:t xml:space="preserve">; </w:t>
+      </w:r>
+      <w:r>
+        <w:rPr>
+          <w:highlight w:val="yellow"/>
+        </w:rPr>
+        <w:t>non lo è quando sono vere entrambe</w:t>
+      </w:r>
+      <w:r>
+        <w:t>. Nel parlato "o" può avere l'uno o l'altro significato, mentre in logica quando si scrive "or" si intende quella inclusiva.</w:t>
+      </w:r>
+    </w:p>
+    <w:p>
+      <w:r>
+        <w:rPr>
+          <w:b/>
+        </w:rPr>
+        <w:t>In parole povere:</w:t>
+      </w:r>
+      <w:r>
+        <w:t xml:space="preserve"> lo xor è la o dell'aut aut: o una o l'altra, ma non entrambe. Esempio: nel menu fisso scegli la carne o il pesce: se li prendi tutti e due hai sbagliato.</w:t>
+      </w:r>
+    </w:p>
+    <w:p>
+      <w:r>
+        <w:t xml:space="preserve">Un esempio del docente: "piove e fa freddo". Se oggi non piove ma fa freddo (dove si fissa la soglia, per esempio, a 20 gradi), la </w:t>
+      </w:r>
+      <w:r>
+        <w:rPr>
+          <w:b/>
+        </w:rPr>
+        <w:t>congiunzione è falsa</w:t>
+      </w:r>
+      <w:r>
+        <w:t xml:space="preserve">, perché la prima parte è falsa, mentre la </w:t>
+      </w:r>
+      <w:r>
+        <w:rPr>
+          <w:b/>
+        </w:rPr>
+        <w:t>disgiunzione "piove o fa freddo" è vera</w:t>
+      </w:r>
+      <w:r>
+        <w:t>, perché la seconda parte è vera. Le frasi vanno poi sempre interpretate in un contesto.</w:t>
+      </w:r>
+    </w:p>
+    <w:p>
+      <w:r>
+        <w:t xml:space="preserve">La logica si occupa della </w:t>
+      </w:r>
+      <w:r>
+        <w:rPr>
+          <w:b/>
+        </w:rPr>
+        <w:t>forma</w:t>
+      </w:r>
+      <w:r>
+        <w:t xml:space="preserve"> delle proposizioni e dei rapporti tra loro, non del loro argomento: perciò "3 &lt; 5 oppure Parigi è la capitale dell'Inghilterra" è ammessa ed è vera, perché 3 &lt; 5 è vera.</w:t>
+      </w:r>
+    </w:p>
+    <w:p>
+      <w:pPr>
+        <w:pStyle w:val="Titolo2"/>
+      </w:pPr>
+      <w:r>
+        <w:rPr>
+          <w:b/>
+          <w:color w:val="E97132"/>
+        </w:rPr>
+        <w:t>La negazione (not)</w:t>
+      </w:r>
+    </w:p>
+    <w:p>
+      <w:r>
+        <w:t xml:space="preserve">La </w:t>
+      </w:r>
+      <w:r>
+        <w:rPr>
+          <w:b/>
+          <w:highlight w:val="yellow"/>
+        </w:rPr>
+        <w:t>negazione</w:t>
+      </w:r>
+      <w:r>
+        <w:rPr>
+          <w:highlight w:val="yellow"/>
+        </w:rPr>
+        <w:t xml:space="preserve"> ¬p si legge "non p" e </w:t>
+      </w:r>
+      <w:r>
+        <w:rPr>
+          <w:b/>
+          <w:highlight w:val="yellow"/>
+        </w:rPr>
+        <w:t>scambia</w:t>
+      </w:r>
+      <w:r>
+        <w:rPr>
+          <w:highlight w:val="yellow"/>
+        </w:rPr>
+        <w:t xml:space="preserve"> il valore di verità</w:t>
+      </w:r>
+      <w:r>
+        <w:t xml:space="preserve">: </w:t>
+      </w:r>
+      <w:r>
+        <w:rPr>
+          <w:highlight w:val="yellow"/>
+        </w:rPr>
+        <w:t>è vera quando p è falsa e viceversa</w:t>
+      </w:r>
+      <w:r>
+        <w:t>. Esempio del libro: se p è "π è stato calcolato con un milione di cifre decimali nel 1954" (falsa: ci si arrivò solo nel 1973), ¬p è vera.</w:t>
+      </w:r>
+    </w:p>
+    <w:p>
+      <w:r>
+        <w:rPr>
+          <w:b/>
+        </w:rPr>
+        <w:t>In parole povere:</w:t>
+      </w:r>
+      <w:r>
+        <w:t xml:space="preserve"> la negazione ribalta il valore: se la frase era vera diventa falsa e viceversa. Come dire non è vero che... davanti alla frase.</w:t>
+      </w:r>
+    </w:p>
+    <w:p>
+      <w:pPr>
+        <w:pStyle w:val="Titolo2"/>
+      </w:pPr>
+      <w:r>
+        <w:rPr>
+          <w:b/>
+          <w:color w:val="E97132"/>
+        </w:rPr>
+        <w:t>Equivalenza e xor</w:t>
+      </w:r>
+    </w:p>
+    <w:p>
+      <w:r>
+        <w:rPr>
+          <w:highlight w:val="yellow"/>
+        </w:rPr>
+        <w:t>L'</w:t>
+      </w:r>
+      <w:r>
+        <w:rPr>
+          <w:b/>
+          <w:highlight w:val="yellow"/>
+        </w:rPr>
+        <w:t>equivalenza</w:t>
+      </w:r>
+      <w:r>
+        <w:t xml:space="preserve"> (o </w:t>
+      </w:r>
+      <w:r>
+        <w:rPr>
+          <w:b/>
+          <w:highlight w:val="yellow"/>
+        </w:rPr>
+        <w:t>uguaglianza</w:t>
+      </w:r>
+      <w:r>
+        <w:t xml:space="preserve"> tra booleani) </w:t>
+      </w:r>
+      <w:r>
+        <w:rPr>
+          <w:highlight w:val="yellow"/>
+        </w:rPr>
+        <w:t xml:space="preserve">è vera quando i due valori sono </w:t>
+      </w:r>
+      <w:r>
+        <w:rPr>
+          <w:b/>
+          <w:highlight w:val="yellow"/>
+        </w:rPr>
+        <w:t>uguali</w:t>
+      </w:r>
+      <w:r>
+        <w:rPr>
+          <w:highlight w:val="yellow"/>
+        </w:rPr>
+        <w:t>, falsa quando sono divers</w:t>
+      </w:r>
+      <w:r>
+        <w:t>i. In programmazione corrisponde al test di uguaglianza (</w:t>
+      </w:r>
+      <w:r>
+        <w:rPr>
+          <w:rFonts w:ascii="Consolas" w:hAnsi="Consolas" w:cs="Consolas"/>
+        </w:rPr>
+        <w:t>==</w:t>
+      </w:r>
+      <w:r>
+        <w:t xml:space="preserve"> in C++ e Java). Lo </w:t>
+      </w:r>
+      <w:r>
+        <w:rPr>
+          <w:b/>
+        </w:rPr>
+        <w:t>xor</w:t>
+      </w:r>
+      <w:r>
+        <w:t xml:space="preserve"> è la sua negazione: è vero quando i due valori sono </w:t>
+      </w:r>
+      <w:r>
+        <w:rPr>
+          <w:b/>
+        </w:rPr>
+        <w:t>diversi</w:t>
+      </w:r>
+      <w:r>
+        <w:t>. L'equivalenza vale 0 nei due casi intermedi (valori diversi) e 1 nel primo e nell'ultimo (valori uguali); lo xor ha la tavola opposta.</w:t>
+      </w:r>
+    </w:p>
+    <w:p>
+      <w:r>
+        <w:rPr>
+          <w:b/>
+        </w:rPr>
+        <w:t>In parole povere:</w:t>
+      </w:r>
+      <w:r>
+        <w:t xml:space="preserve"> l'equivalenza è vera quando i due valori sono uguali (tutti e due veri o tutti e due falsi) e falsa quando sono diversi. È il test sono uguali? applicato ai valori di verità.</w:t>
+      </w:r>
+    </w:p>
+    <w:p>
+      <w:pPr>
+        <w:pStyle w:val="Titolo2"/>
+      </w:pPr>
+      <w:r>
+        <w:rPr>
+          <w:b/>
+          <w:color w:val="E97132"/>
+        </w:rPr>
         <w:lastRenderedPageBreak/>
-        <w:t>La congiunzione (and)</w:t>
-      </w:r>
-    </w:p>
-    <w:p>
-      <w:r>
-        <w:t xml:space="preserve">La </w:t>
-      </w:r>
-      <w:r>
-        <w:rPr>
-          <w:b/>
-          <w:highlight w:val="yellow"/>
-        </w:rPr>
-        <w:t>congiunzione</w:t>
-      </w:r>
-      <w:r>
-        <w:rPr>
-          <w:highlight w:val="yellow"/>
-        </w:rPr>
-        <w:t xml:space="preserve"> p ∧ q si legge "p e q": è vera quando </w:t>
-      </w:r>
-      <w:r>
-        <w:rPr>
-          <w:b/>
-          <w:highlight w:val="yellow"/>
-        </w:rPr>
-        <w:t>entrambe</w:t>
-      </w:r>
-      <w:r>
-        <w:rPr>
-          <w:highlight w:val="yellow"/>
-        </w:rPr>
-        <w:t xml:space="preserve"> le proposizioni sono vere, e falsa se almeno una è falsa</w:t>
-      </w:r>
-      <w:r>
-        <w:t>. Esempio del libro: "un decennio è di 10 anni e un millennio è di 100 anni" è falsa, perché la seconda parte è falsa.</w:t>
-      </w:r>
-    </w:p>
-    <w:p>
-      <w:r>
-        <w:rPr>
-          <w:b/>
-        </w:rPr>
-        <w:t>In parole povere:</w:t>
-      </w:r>
-      <w:r>
-        <w:rPr/>
-        <w:t xml:space="preserve"> la congiunzione è la e: vale vero solo se sono vere tutte e due le frasi. Basta una falsa e il risultato è falso. Esempio: ho fame e ho soldi: se manca uno dei due, non mangio.</w:t>
-      </w:r>
-    </w:p>
-    <w:p>
-      <w:pPr>
-        <w:pStyle w:val="Titolo2"/>
-      </w:pPr>
-      <w:r>
-        <w:rPr>
-          <w:b/>
-          <w:color w:val="E97132"/>
-        </w:rPr>
-        <w:t>La disgiunzione (or) e il caso dell'xor</w:t>
-      </w:r>
-    </w:p>
-    <w:p>
-      <w:r>
-        <w:t xml:space="preserve">La </w:t>
-      </w:r>
-      <w:r>
-        <w:rPr>
-          <w:b/>
-          <w:highlight w:val="yellow"/>
-        </w:rPr>
-        <w:t>disgiunzione</w:t>
-      </w:r>
-      <w:r>
-        <w:rPr>
-          <w:highlight w:val="yellow"/>
-        </w:rPr>
-        <w:t xml:space="preserve"> p ∨ q si legge "p o q" ed è la disgiunzione </w:t>
-      </w:r>
-      <w:r>
-        <w:rPr>
-          <w:b/>
-          <w:highlight w:val="yellow"/>
-        </w:rPr>
-        <w:t>inclusiva</w:t>
-      </w:r>
-      <w:r>
-        <w:t xml:space="preserve">: </w:t>
-      </w:r>
-      <w:r>
-        <w:rPr>
-          <w:highlight w:val="yellow"/>
-        </w:rPr>
-        <w:t xml:space="preserve">è vera se è vera p, oppure è vera q, </w:t>
-      </w:r>
-      <w:r>
-        <w:rPr>
-          <w:b/>
-          <w:highlight w:val="yellow"/>
-        </w:rPr>
-        <w:t>oppure lo sono entrambe</w:t>
-      </w:r>
-      <w:r>
-        <w:t xml:space="preserve">. </w:t>
-      </w:r>
-      <w:r>
-        <w:rPr>
-          <w:highlight w:val="yellow"/>
-        </w:rPr>
-        <w:t>È falsa solo quando sono false tutte e due</w:t>
-      </w:r>
-      <w:r>
-        <w:t>. Esempio del libro: "un millennio è di 100 anni o un millennio è di 1000 anni" è vera, perché basta la seconda parte.</w:t>
-      </w:r>
-    </w:p>
-    <w:p>
-      <w:r>
-        <w:rPr>
-          <w:b/>
-        </w:rPr>
-        <w:t>In parole povere:</w:t>
-      </w:r>
-      <w:r>
-        <w:rPr/>
-        <w:t xml:space="preserve"> la disgiunzione è la o: basta che una delle due sia vera. Anche se sono vere tutte e due, è vera. Solo se sono entrambe false è falsa. Esempio: prendo il caffè o il tè: se prendo tutti e due non ho sbagliato.</w:t>
-      </w:r>
-    </w:p>
-    <w:p>
-      <w:r>
-        <w:rPr>
-          <w:highlight w:val="yellow"/>
-        </w:rPr>
-        <w:t xml:space="preserve">Esiste anche la disgiunzione </w:t>
-      </w:r>
-      <w:r>
-        <w:rPr>
-          <w:b/>
-          <w:highlight w:val="yellow"/>
-        </w:rPr>
-        <w:t>esclusiva</w:t>
-      </w:r>
-      <w:r>
-        <w:t xml:space="preserve"> (l'*aut* del latino, </w:t>
-      </w:r>
-      <w:r>
-        <w:rPr>
-          <w:b/>
-          <w:highlight w:val="yellow"/>
-        </w:rPr>
-        <w:t>xor</w:t>
-      </w:r>
-      <w:r>
-        <w:t xml:space="preserve"> in inglese), </w:t>
-      </w:r>
-      <w:r>
-        <w:rPr>
-          <w:highlight w:val="yellow"/>
-        </w:rPr>
-        <w:t>vera solo quando una delle due è vera e l'altra è falsa</w:t>
-      </w:r>
-      <w:r>
-        <w:t xml:space="preserve">; </w:t>
-      </w:r>
-      <w:r>
-        <w:rPr>
-          <w:highlight w:val="yellow"/>
-        </w:rPr>
-        <w:t>non lo è quando sono vere entrambe</w:t>
-      </w:r>
-      <w:r>
-        <w:t>. Nel parlato "o" può avere l'uno o l'altro significato, mentre in logica quando si scrive "or" si intende quella inclusiva.</w:t>
-      </w:r>
-    </w:p>
-    <w:p>
-      <w:r>
-        <w:rPr>
-          <w:b/>
-        </w:rPr>
-        <w:t>In parole povere:</w:t>
-      </w:r>
-      <w:r>
-        <w:rPr/>
-        <w:t xml:space="preserve"> lo xor è la o dell'aut aut: o una o l'altra, ma non entrambe. Esempio: nel menu fisso scegli la carne o il pesce: se li prendi tutti e due hai sbagliato.</w:t>
-      </w:r>
-    </w:p>
-    <w:p>
-      <w:r>
-        <w:t xml:space="preserve">Un esempio del docente: "piove e fa freddo". Se oggi non piove ma fa freddo (dove si fissa la soglia, per esempio, a 20 gradi), la </w:t>
-      </w:r>
-      <w:r>
-        <w:rPr>
-          <w:b/>
-        </w:rPr>
-        <w:t>congiunzione è falsa</w:t>
-      </w:r>
-      <w:r>
-        <w:t xml:space="preserve">, perché la prima parte è falsa, mentre la </w:t>
-      </w:r>
-      <w:r>
-        <w:rPr>
-          <w:b/>
-        </w:rPr>
-        <w:t>disgiunzione "piove o fa freddo" è vera</w:t>
-      </w:r>
-      <w:r>
-        <w:t>, perché la seconda parte è vera. Le frasi vanno poi sempre interpretate in un contesto.</w:t>
-      </w:r>
-    </w:p>
-    <w:p>
-      <w:r>
-        <w:t xml:space="preserve">La logica si occupa della </w:t>
-      </w:r>
-      <w:r>
-        <w:rPr>
-          <w:b/>
-        </w:rPr>
-        <w:t>forma</w:t>
-      </w:r>
-      <w:r>
-        <w:t xml:space="preserve"> delle proposizioni e dei rapporti tra loro, non del loro argomento: perciò "3 &lt; 5 oppure Parigi è la capitale dell'Inghilterra" è ammessa ed è vera, perché 3 &lt; 5 è vera.</w:t>
-      </w:r>
-    </w:p>
-    <w:p>
-      <w:pPr>
-        <w:pStyle w:val="Titolo2"/>
-      </w:pPr>
-      <w:r>
-        <w:rPr>
-          <w:b/>
-          <w:color w:val="E97132"/>
-        </w:rPr>
-        <w:t>La negazione (not)</w:t>
-      </w:r>
-    </w:p>
-    <w:p>
-      <w:r>
-        <w:t xml:space="preserve">La </w:t>
-      </w:r>
-      <w:r>
-        <w:rPr>
-          <w:b/>
-          <w:highlight w:val="yellow"/>
-        </w:rPr>
-        <w:t>negazione</w:t>
-      </w:r>
-      <w:r>
-        <w:rPr>
-          <w:highlight w:val="yellow"/>
-        </w:rPr>
-        <w:t xml:space="preserve"> ¬p si legge "non p" e </w:t>
-      </w:r>
-      <w:r>
-        <w:rPr>
-          <w:b/>
-          <w:highlight w:val="yellow"/>
-        </w:rPr>
-        <w:t>scambia</w:t>
-      </w:r>
-      <w:r>
-        <w:rPr>
-          <w:highlight w:val="yellow"/>
-        </w:rPr>
-        <w:t xml:space="preserve"> il valore di verità</w:t>
-      </w:r>
-      <w:r>
-        <w:t xml:space="preserve">: </w:t>
-      </w:r>
-      <w:r>
-        <w:rPr>
-          <w:highlight w:val="yellow"/>
-        </w:rPr>
-        <w:t>è vera quando p è falsa e viceversa</w:t>
-      </w:r>
-      <w:r>
-        <w:t>. Esempio del libro: se p è "π è stato calcolato con un milione di cifre decimali nel 1954" (falsa: ci si arrivò solo nel 1973), ¬p è vera.</w:t>
-      </w:r>
-    </w:p>
-    <w:p>
-      <w:r>
-        <w:rPr>
-          <w:b/>
-        </w:rPr>
-        <w:t>In parole povere:</w:t>
-      </w:r>
-      <w:r>
-        <w:rPr/>
-        <w:t xml:space="preserve"> la negazione ribalta il valore: se la frase era vera diventa falsa e viceversa. Come dire non è vero che... davanti alla frase.</w:t>
-      </w:r>
-    </w:p>
-    <w:p>
-      <w:pPr>
-        <w:pStyle w:val="Titolo2"/>
-      </w:pPr>
-      <w:r>
-        <w:rPr>
-          <w:b/>
-          <w:color w:val="E97132"/>
-        </w:rPr>
-        <w:t>Equivalenza e xor</w:t>
-      </w:r>
-    </w:p>
-    <w:p>
-      <w:r>
-        <w:rPr>
-          <w:highlight w:val="yellow"/>
-        </w:rPr>
-        <w:t>L'</w:t>
-      </w:r>
-      <w:r>
-        <w:rPr>
-          <w:b/>
-          <w:highlight w:val="yellow"/>
-        </w:rPr>
-        <w:t>equivalenza</w:t>
-      </w:r>
-      <w:r>
-        <w:t xml:space="preserve"> (o </w:t>
-      </w:r>
-      <w:r>
-        <w:rPr>
-          <w:b/>
-          <w:highlight w:val="yellow"/>
-        </w:rPr>
-        <w:t>uguaglianza</w:t>
-      </w:r>
-      <w:r>
-        <w:t xml:space="preserve"> tra booleani) </w:t>
-      </w:r>
-      <w:r>
-        <w:rPr>
-          <w:highlight w:val="yellow"/>
-        </w:rPr>
-        <w:t xml:space="preserve">è vera quando i due valori sono </w:t>
-      </w:r>
-      <w:r>
-        <w:rPr>
-          <w:b/>
-          <w:highlight w:val="yellow"/>
-        </w:rPr>
-        <w:t>uguali</w:t>
-      </w:r>
-      <w:r>
-        <w:rPr>
-          <w:highlight w:val="yellow"/>
-        </w:rPr>
-        <w:t>, falsa quando sono divers</w:t>
-      </w:r>
-      <w:r>
-        <w:t>i. In programmazione corrisponde al test di uguaglianza (</w:t>
-      </w:r>
-      <w:r>
-        <w:rPr>
-          <w:rFonts w:ascii="Consolas" w:hAnsi="Consolas" w:cs="Consolas"/>
-        </w:rPr>
-        <w:t>==</w:t>
-      </w:r>
-      <w:r>
-        <w:t xml:space="preserve"> in C++ e Java). Lo </w:t>
-      </w:r>
-      <w:r>
-        <w:rPr>
-          <w:b/>
-        </w:rPr>
-        <w:t>xor</w:t>
-      </w:r>
-      <w:r>
-        <w:t xml:space="preserve"> è la sua negazione: è vero quando i due valori sono </w:t>
-      </w:r>
-      <w:r>
-        <w:rPr>
-          <w:b/>
-        </w:rPr>
-        <w:t>diversi</w:t>
-      </w:r>
-      <w:r>
-        <w:t>. L'equivalenza vale 0 nei due casi intermedi (valori diversi) e 1 nel primo e nell'ultimo (valori uguali); lo xor ha la tavola opposta.</w:t>
-      </w:r>
-    </w:p>
-    <w:p>
-      <w:r>
-        <w:rPr>
-          <w:b/>
-        </w:rPr>
-        <w:t>In parole povere:</w:t>
-      </w:r>
-      <w:r>
-        <w:rPr/>
-        <w:t xml:space="preserve"> l'equivalenza è vera quando i due valori sono uguali (tutti e due veri o tutti e due falsi) e falsa quando sono diversi. È il test sono uguali? applicato ai valori di verità.</w:t>
-      </w:r>
-    </w:p>
-    <w:p>
-      <w:pPr>
-        <w:pStyle w:val="Titolo2"/>
-      </w:pPr>
-      <w:r>
-        <w:rPr>
-          <w:b/>
-          <w:color w:val="E97132"/>
-        </w:rPr>
         <w:t>Le tavole di questi connettivi</w:t>
       </w:r>
     </w:p>
@@ -11124,7 +11044,6 @@
           <w:b/>
           <w:color w:val="E97132"/>
         </w:rPr>
-        <w:lastRenderedPageBreak/>
         <w:t>Notazioni diverse per lo stesso connettivo</w:t>
       </w:r>
     </w:p>
@@ -11327,7 +11246,6 @@
         <w:t>In parole povere:</w:t>
       </w:r>
       <w:r>
-        <w:rPr/>
         <w:t xml:space="preserve"> la precedenza è l'ordine in cui si fanno le operazioni quando non ci sono parentesi, come in matematica dove si fa prima la moltiplicazione e poi la somma. Qui si valuta prima il not, poi l'and, poi l'or. Nel dubbio, metti le parentesi.</w:t>
       </w:r>
     </w:p>
@@ -11395,7 +11313,11 @@
         <w:t xml:space="preserve"> le combinazioni possibili dei valori di verità delle componenti atomiche, con a fianco, per ciascuna combinazione, il valore di verità della proposizione composta</w:t>
       </w:r>
       <w:r>
-        <w:t>. È un modo alternativo di definire un connettivo: non più come circuito, ma come tabella. Serve perché non è facile stabilire se due circuiti sono equivalenti, mentre si possono leggere come formule proposizionali e confrontare le loro tavole: è l'applicazione principale delle tavole di verità in informatica.</w:t>
+        <w:t xml:space="preserve">. È un modo alternativo di definire un connettivo: non più come circuito, ma come tabella. Serve perché non è facile stabilire se due circuiti sono equivalenti, mentre si possono leggere come formule </w:t>
+      </w:r>
+      <w:r>
+        <w:lastRenderedPageBreak/>
+        <w:t>proposizionali e confrontare le loro tavole: è l'applicazione principale delle tavole di verità in informatica.</w:t>
       </w:r>
     </w:p>
     <w:p>
@@ -11406,7 +11328,6 @@
         <w:t>In parole povere:</w:t>
       </w:r>
       <w:r>
-        <w:rPr/>
         <w:t xml:space="preserve"> una tavola di verità è una tabellina in cui metti tutte le combinazioni possibili di vero/falso delle frasi semplici e a fianco scrivi cosa viene alla frase composta. È come provare tutti i casi possibili uno per uno per vedere sempre il risultato.</w:t>
       </w:r>
     </w:p>
@@ -11482,7 +11403,6 @@
           <w:b/>
           <w:color w:val="E97132"/>
         </w:rPr>
-        <w:lastRenderedPageBreak/>
         <w:t>Quante righe ci sono</w:t>
       </w:r>
     </w:p>
@@ -11612,7 +11532,6 @@
         <w:t>In parole povere:</w:t>
       </w:r>
       <w:r>
-        <w:rPr/>
         <w:t xml:space="preserve"> due formule sono equivalenti se in ogni caso possibile danno lo stesso risultato, cioè hanno la stessa tabella di verità. Sono scritte in modo diverso, ma si comportano allo stesso modo, come due modi diversi di dire la stessa cosa.</w:t>
       </w:r>
     </w:p>
@@ -11660,6 +11579,7 @@
         <w:rPr>
           <w:noProof/>
         </w:rPr>
+        <w:lastRenderedPageBreak/>
         <w:drawing>
           <wp:inline distT="0" distB="0" distL="0" distR="0" wp14:anchorId="3EB38DFB" wp14:editId="095AB5CC">
             <wp:extent cx="4500000" cy="1585932"/>
@@ -11811,7 +11731,6 @@
           <w:b/>
           <w:highlight w:val="yellow"/>
         </w:rPr>
-        <w:lastRenderedPageBreak/>
         <w:t>sempre falsa</w:t>
       </w:r>
       <w:r>
@@ -11835,7 +11754,6 @@
         <w:t>In parole povere:</w:t>
       </w:r>
       <w:r>
-        <w:rPr/>
         <w:t xml:space="preserve"> la tautologia è la frase che è sempre vera, qualunque cosa succeda: ad esempio piove oppure non piove. La contraddizione è l'opposto, una frase sempre falsa, come piove e non piove insieme. La negazione di una è l'altra.</w:t>
       </w:r>
     </w:p>
@@ -11926,7 +11844,6 @@
         <w:t>In parole povere:</w:t>
       </w:r>
       <w:r>
-        <w:rPr/>
         <w:t xml:space="preserve"> il terzo escluso dice che una proposizione o è vera o è falsa, e non c'è una terza possibilità. Per questo p o non p è sempre vera: o piove oppure non piove.</w:t>
       </w:r>
     </w:p>
@@ -11935,6 +11852,7 @@
         <w:rPr>
           <w:b/>
         </w:rPr>
+        <w:lastRenderedPageBreak/>
         <w:t>(p ∨ q) ∧ ¬p.</w:t>
       </w:r>
       <w:r>
@@ -12143,13 +12061,11 @@
         <w:t>In parole povere:</w:t>
       </w:r>
       <w:r>
-        <w:rPr/>
         <w:t xml:space="preserve"> l'implicazione materiale guarda solo se le due frasi sono vere o false, non se una è causa dell'altra. Quindi se piove allora la Terra è rotonda è una frase che in logica ha un valore preciso, anche se pioggia e Terra non c'entrano niente.</w:t>
       </w:r>
     </w:p>
     <w:p>
       <w:r>
-        <w:lastRenderedPageBreak/>
         <w:t xml:space="preserve">La seconda differenza riguarda i casi in cui l'ipotesi non si verifica. Nel linguaggio comune, se il Dipartimento non ottiene il finanziamento, </w:t>
       </w:r>
       <w:r>
@@ -12286,7 +12202,6 @@
         <w:t>In parole povere:</w:t>
       </w:r>
       <w:r>
-        <w:rPr/>
         <w:t xml:space="preserve"> p implica q è come una promessa: se succede p, prometto q. L'ipotesi è la condizione (il se), la tesi è la cosa promessa (il allora). La promessa si rompe, cioè è falsa, solo quando la condizione si avvera ma la cosa promessa non c'è.</w:t>
       </w:r>
     </w:p>
@@ -12299,6 +12214,7 @@
         <w:rPr>
           <w:noProof/>
         </w:rPr>
+        <w:lastRenderedPageBreak/>
         <w:drawing>
           <wp:inline distT="0" distB="0" distL="0" distR="0" wp14:anchorId="2FBE723A" wp14:editId="3830F49C">
             <wp:extent cx="2880000" cy="2065371"/>
@@ -12445,7 +12361,6 @@
         <w:t>In parole povere:</w:t>
       </w:r>
       <w:r>
-        <w:rPr/>
         <w:t xml:space="preserve"> se l'ipotesi è falsa la promessa non ha modo di essere violata, quindi si considera vera per comodità. Esempio: se vinco alla lotteria ti regalo un'auto: se non vinco, non ho mentito a nessuno.</w:t>
       </w:r>
     </w:p>
@@ -12500,11 +12415,7 @@
     </w:p>
     <w:p>
       <w:r>
-        <w:t xml:space="preserve">Nel linguaggio comune qualcuno direbbe che "se 0 &gt; 0…" non ha senso. Ma in matematica, se sostituendo un valore al posto di x l'enunciato perdesse significato, un enunciato sensato </w:t>
-      </w:r>
-      <w:r>
-        <w:lastRenderedPageBreak/>
-        <w:t>diventerebbe privo di senso. Con la tavola di verità dell'implicazione l'enunciato ha invece sempre un valore: è vero per ogni x.</w:t>
+        <w:t>Nel linguaggio comune qualcuno direbbe che "se 0 &gt; 0…" non ha senso. Ma in matematica, se sostituendo un valore al posto di x l'enunciato perdesse significato, un enunciato sensato diventerebbe privo di senso. Con la tavola di verità dell'implicazione l'enunciato ha invece sempre un valore: è vero per ogni x.</w:t>
       </w:r>
     </w:p>
     <w:p>
@@ -12542,6 +12453,7 @@
         </w:numPr>
       </w:pPr>
       <w:r>
+        <w:lastRenderedPageBreak/>
         <w:t>l'unico caso in cui i due valori sono entrambi rilevanti è quello con ipotesi vera e tesi falsa, in cui l'implicazione è falsa.</w:t>
       </w:r>
     </w:p>
@@ -12742,21 +12654,21 @@
     </w:p>
     <w:p>
       <w:r>
+        <w:t xml:space="preserve">L'ultima formula si legge in modo naturale come "se vale p, allora (se vale q, allora vale r)", cioè come un'implicazione con </w:t>
+      </w:r>
+      <w:r>
+        <w:rPr>
+          <w:b/>
+        </w:rPr>
+        <w:t>due ipotesi</w:t>
+      </w:r>
+      <w:r>
+        <w:t>: se p e q sono entrambe vere, allora è vera r. In generale, quando un'implicazione ha più ipotesi e anche una sola è falsa, l'implicazione è vera per difetto; se tutte le ipotesi sono vere bisogna controllare la tesi, e l'implicazione è falsa solo se la tesi è falsa. Le due scritture sono in effetti equivalenti: p → (q → r) e (p ∧ q) → r sono false soltanto quando p e q sono vere e r è falsa.</w:t>
+      </w:r>
+    </w:p>
+    <w:p>
+      <w:r>
         <w:lastRenderedPageBreak/>
-        <w:t xml:space="preserve">L'ultima formula si legge in modo naturale come "se vale p, allora (se vale q, allora vale r)", cioè come un'implicazione con </w:t>
-      </w:r>
-      <w:r>
-        <w:rPr>
-          <w:b/>
-        </w:rPr>
-        <w:t>due ipotesi</w:t>
-      </w:r>
-      <w:r>
-        <w:t>: se p e q sono entrambe vere, allora è vera r. In generale, quando un'implicazione ha più ipotesi e anche una sola è falsa, l'implicazione è vera per difetto; se tutte le ipotesi sono vere bisogna controllare la tesi, e l'implicazione è falsa solo se la tesi è falsa. Le due scritture sono in effetti equivalenti: p → (q → r) e (p ∧ q) → r sono false soltanto quando p e q sono vere e r è falsa.</w:t>
-      </w:r>
-    </w:p>
-    <w:p>
-      <w:r>
         <w:t>Il capitolo successivo parte dall'implicazione per costruire la sua conversa, la sua contrapposta e le espressioni "condizione necessaria" e "condizione sufficiente".</w:t>
       </w:r>
     </w:p>
@@ -12851,7 +12763,6 @@
         <w:t>In parole povere:</w:t>
       </w:r>
       <w:r>
-        <w:rPr/>
         <w:t xml:space="preserve"> la conversa si ottiene girando l'implicazione, cioè scambiando se e allora. Esempio: se piove, la strada è bagnata diventa se la strada è bagnata, piove. Non dice la stessa cosa: la strada può essere bagnata per altri motivi.</w:t>
       </w:r>
     </w:p>
@@ -12906,7 +12817,6 @@
         <w:t>In parole povere:</w:t>
       </w:r>
       <w:r>
-        <w:rPr/>
         <w:t xml:space="preserve"> la contrapposta si ottiene scambiando e negando entrambi i pezzi: da se piove, la strada è bagnata si passa a se la strada non è bagnata, non piove. Dice esattamente la stessa cosa dell'originale.</w:t>
       </w:r>
     </w:p>
@@ -13043,11 +12953,11 @@
     </w:p>
     <w:p>
       <w:r>
-        <w:t xml:space="preserve">Anche con un ragionamento: p → q dice che tutte le volte che p è vera lo è anche q; allora se q è falsa dovrà essere falsa anche p. Quindi da p → q segue ¬q → ¬p. Applicando la stessa legge un'altra volta a ¬q → ¬p si ottiene ¬¬p → ¬¬q, e per la legge della doppia negazione (negare due volte equivale ad </w:t>
+        <w:t xml:space="preserve">Anche con un ragionamento: p → q dice che tutte le volte che p è vera lo è anche q; allora se q è falsa dovrà essere falsa anche p. Quindi da p → q segue ¬q → ¬p. Applicando la stessa legge un'altra volta a </w:t>
       </w:r>
       <w:r>
         <w:lastRenderedPageBreak/>
-        <w:t>affermare: ¬¬p ≡ p, come si vede subito dalla tavola) si ritorna a p → q. Ciascuna delle due implicazioni si ottiene dall'altra, e sono quindi equivalenti.</w:t>
+        <w:t>¬q → ¬p si ottiene ¬¬p → ¬¬q, e per la legge della doppia negazione (negare due volte equivale ad affermare: ¬¬p ≡ p, come si vede subito dalla tavola) si ritorna a p → q. Ciascuna delle due implicazioni si ottiene dall'altra, e sono quindi equivalenti.</w:t>
       </w:r>
     </w:p>
     <w:p>
@@ -13107,7 +13017,6 @@
         <w:t>In parole povere:</w:t>
       </w:r>
       <w:r>
-        <w:rPr/>
         <w:t xml:space="preserve"> A è necessaria per B se, senza A, B non può esserci. Come il biglietto per entrare al cinema: ti serve, ma non basta da solo (se non hai A, sicuramente non hai B).</w:t>
       </w:r>
     </w:p>
@@ -13145,7 +13054,6 @@
         <w:t>In parole povere:</w:t>
       </w:r>
       <w:r>
-        <w:rPr/>
         <w:t xml:space="preserve"> A è sufficiente per B se, quando c'è A, B c'è di sicuro. Come avere la laurea per essere laureati: basta quello. Ma B potrebbe esserci anche per altre strade.</w:t>
       </w:r>
     </w:p>
@@ -13307,6 +13215,7 @@
           <w:b/>
           <w:color w:val="E97132"/>
         </w:rPr>
+        <w:lastRenderedPageBreak/>
         <w:t>Come si traduce dal linguaggio naturale</w:t>
       </w:r>
     </w:p>
@@ -13351,7 +13260,6 @@
         </w:numPr>
       </w:pPr>
       <w:r>
-        <w:lastRenderedPageBreak/>
         <w:t>"p solo se q" (attenzione: non q → p; il "solo se" introduce la condizione necessaria, cioè la tesi);</w:t>
       </w:r>
     </w:p>
@@ -13505,7 +13413,6 @@
         <w:t>In parole povere:</w:t>
       </w:r>
       <w:r>
-        <w:rPr/>
         <w:t xml:space="preserve"> due formule sono logicamente equivalenti se in ogni caso valgono la stessa cosa (stessa tavola di verità). Il bicondizionale p se e solo se q è il connettivo che dice sono uguali: è vero se le due frasi sono entrambe vere o entrambe false.</w:t>
       </w:r>
     </w:p>
@@ -13626,7 +13533,11 @@
     </w:p>
     <w:p>
       <w:r>
-        <w:t>Lo si può provare con una tavola di verità, come in figura, oppure con un ragionamento. Poiché p → q equivale a "il valore di p è minore o uguale al valore di q", la congiunzione (p → q) ∧ (q → p) dice che p ≤ q e q ≤ p. Per una proprietà degli ordini (l'antisimmetria), se p ≤ q e q ≤ p allora p e q sono uguali: quindi la congiunzione è il test di uguaglianza, cioè il bicondizionale. Quale dei due modi sia la definizione e quale la proprietà dipende da come si è definito il bicondizionale: se lo si definisce con la tavola di verità, si osserva che vale 1 con due valori uguali e 0 con due diversi, e poi si mostra l'equivalenza con le due implicazioni.</w:t>
+        <w:t xml:space="preserve">Lo si può provare con una tavola di verità, come in figura, oppure con un ragionamento. Poiché p → q equivale a "il valore di p è minore o uguale al valore di q", la congiunzione (p → q) ∧ (q → p) dice che p ≤ q </w:t>
+      </w:r>
+      <w:r>
+        <w:lastRenderedPageBreak/>
+        <w:t>e q ≤ p. Per una proprietà degli ordini (l'antisimmetria), se p ≤ q e q ≤ p allora p e q sono uguali: quindi la congiunzione è il test di uguaglianza, cioè il bicondizionale. Quale dei due modi sia la definizione e quale la proprietà dipende da come si è definito il bicondizionale: se lo si definisce con la tavola di verità, si osserva che vale 1 con due valori uguali e 0 con due diversi, e poi si mostra l'equivalenza con le due implicazioni.</w:t>
       </w:r>
     </w:p>
     <w:p>
@@ -13657,7 +13568,6 @@
         <w:rPr>
           <w:b/>
         </w:rPr>
-        <w:lastRenderedPageBreak/>
         <w:t>La negazione dell'implicazione.</w:t>
       </w:r>
       <w:r>
@@ -13802,7 +13712,11 @@
         <w:t xml:space="preserve"> la tesi è vera</w:t>
       </w:r>
       <w:r>
-        <w:t xml:space="preserve">: sono esattamente i tre casi veri della tavola, quelli con la tesi vera (due righe) e quelli con l'ipotesi falsa (due righe), con una sovrapposizione, perché con ipotesi falsa e tesi vera l'implicazione è vera per due motivi indipendenti. Si poteva arrivarci in un passo solo osservando la tavola; il passaggio per </w:t>
+        <w:t xml:space="preserve">: sono esattamente i tre casi veri della tavola, quelli con la tesi vera (due </w:t>
+      </w:r>
+      <w:r>
+        <w:lastRenderedPageBreak/>
+        <w:t xml:space="preserve">righe) e quelli con l'ipotesi falsa (due righe), con una sovrapposizione, perché con ipotesi falsa e tesi vera l'implicazione è vera per due motivi indipendenti. Si poteva arrivarci in un passo solo osservando la tavola; il passaggio per </w:t>
       </w:r>
       <w:r>
         <w:t>De Morgan mostra che le leggi si combinano.</w:t>
@@ -14178,10 +14092,10 @@
         <w:rPr>
           <w:b/>
         </w:rPr>
+        <w:lastRenderedPageBreak/>
         <w:t>In parole povere:</w:t>
       </w:r>
       <w:r>
-        <w:rPr/>
         <w:t xml:space="preserve"> il ragionamento deduttivo è il ragionamento in cui parti da fatti che ti vengono dati (le ipotesi o premesse) e ne tiri fuori una conseguenza (la conclusione). L'argomento è l'insieme di queste premesse più la conclusione, come un piccolo mattone di dimostrazione.</w:t>
       </w:r>
     </w:p>
@@ -14267,11 +14181,7 @@
         <w:t xml:space="preserve"> (le ipotesi) seguita da una proposizione q (la conclusione)</w:t>
       </w:r>
       <w:r>
-        <w:t xml:space="preserve">, che si scrive con le ipotesi una sotto l'altra e la conclusione sotto una </w:t>
-      </w:r>
-      <w:r>
-        <w:lastRenderedPageBreak/>
-        <w:t xml:space="preserve">riga, preceduta dal simbolo </w:t>
+        <w:t xml:space="preserve">, che si scrive con le ipotesi una sotto l'altra e la conclusione sotto una riga, preceduta dal simbolo </w:t>
       </w:r>
       <w:r>
         <w:rPr>
@@ -14373,7 +14283,6 @@
         <w:t>In parole povere:</w:t>
       </w:r>
       <w:r>
-        <w:rPr/>
         <w:t xml:space="preserve"> un argomento è valido se, ogni volta che le ipotesi sono tutte vere, la conclusione deve essere vera per forza: non può succedere che le premesse siano vere e la conclusione falsa. Conta solo la forma, non se le frasi sono vere nella realtà. Esempio: se piove, la strada è bagnata; piove; quindi la strada è bagnata.</w:t>
       </w:r>
     </w:p>
@@ -14505,7 +14414,6 @@
         <w:t>In parole povere:</w:t>
       </w:r>
       <w:r>
-        <w:rPr/>
         <w:t xml:space="preserve"> una regola di inferenza è un argomento valido già collaudato e riutilizzabile, come una mossa standard degli scacchi. Quando in un ragionamento ne riconosci la forma, puoi applicarla senza ricontrollare tutto.</w:t>
       </w:r>
     </w:p>
@@ -14584,6 +14492,7 @@
         <w:rPr>
           <w:noProof/>
         </w:rPr>
+        <w:lastRenderedPageBreak/>
         <w:drawing>
           <wp:inline distT="0" distB="0" distL="0" distR="0" wp14:anchorId="1FFADC8A" wp14:editId="75EB6595">
             <wp:extent cx="5220000" cy="1744244"/>
@@ -14702,7 +14611,6 @@
         <w:t>In parole povere:</w:t>
       </w:r>
       <w:r>
-        <w:rPr/>
         <w:t xml:space="preserve"> il modus ponens è la regola più naturale: sai che se p allora q, e sai che p è vera, quindi puoi dire che q è vera. Esempio: se studio, passo l'esame; ho studiato; quindi passo l'esame.</w:t>
       </w:r>
     </w:p>
@@ -14897,6 +14805,7 @@
         <w:rPr>
           <w:b/>
         </w:rPr>
+        <w:lastRenderedPageBreak/>
         <w:t>Semplificazione</w:t>
       </w:r>
       <w:r>
@@ -15029,65 +14938,344 @@
     </w:p>
     <w:p>
       <w:r>
+        <w:t xml:space="preserve">Se fosse valido, ogni volta che p → q e q sono vere dovrebbe esserlo anche p. Ma questo non succede: con p falsa e q vera, l'implicazione p → q è vera per difetto (ipotesi falsa), q è vera, e la conclusione p è falsa. </w:t>
+      </w:r>
+      <w:r>
+        <w:rPr>
+          <w:highlight w:val="yellow"/>
+        </w:rPr>
+        <w:t xml:space="preserve">L'argomento </w:t>
+      </w:r>
+      <w:r>
+        <w:rPr>
+          <w:b/>
+          <w:highlight w:val="yellow"/>
+        </w:rPr>
+        <w:t>non è valido</w:t>
+      </w:r>
+      <w:r>
+        <w:rPr>
+          <w:highlight w:val="yellow"/>
+        </w:rPr>
+        <w:t>.</w:t>
+      </w:r>
+      <w:r>
+        <w:t xml:space="preserve"> </w:t>
+      </w:r>
+      <w:r>
+        <w:rPr>
+          <w:highlight w:val="yellow"/>
+        </w:rPr>
+        <w:t xml:space="preserve">Questa fallacia si chiama </w:t>
+      </w:r>
+      <w:r>
+        <w:rPr>
+          <w:b/>
+          <w:highlight w:val="yellow"/>
+        </w:rPr>
+        <w:t>affermazione della conclusione</w:t>
+      </w:r>
+      <w:r>
+        <w:t xml:space="preserve"> (in inglese *fallacy of affirming the conclusion*): </w:t>
+      </w:r>
+      <w:r>
+        <w:rPr>
+          <w:highlight w:val="yellow"/>
+        </w:rPr>
+        <w:t>è lo stesso errore</w:t>
+      </w:r>
+      <w:r>
+        <w:t xml:space="preserve">, già visto nel capitolo 17, </w:t>
+      </w:r>
+      <w:r>
+        <w:rPr>
+          <w:highlight w:val="yellow"/>
+        </w:rPr>
+        <w:t>di scambiare un'implicazione con la sua conversa</w:t>
+      </w:r>
+      <w:r>
+        <w:t>. Si arriva alla stessa conclusione guardando la tavola (a destra nella figura): nella terza riga le ipotesi sono vere e la conclusione è falsa.</w:t>
+      </w:r>
+    </w:p>
+    <w:p>
+      <w:r>
+        <w:rPr>
+          <w:b/>
+        </w:rPr>
+        <w:t>In parole povere:</w:t>
+      </w:r>
+      <w:r>
+        <w:t xml:space="preserve"> è l'errore di credere che da se p allora q e da q segua p. Esempio: se piove, la strada è bagnata; la strada è bagnata; quindi piove? No, magari è passata la spazzatrice. È lo stesso errore di scambiare un'implicazione con la sua conversa.</w:t>
+      </w:r>
+    </w:p>
+    <w:p>
+      <w:pPr>
+        <w:pStyle w:val="Titolo2"/>
+      </w:pPr>
+      <w:r>
+        <w:rPr>
+          <w:b/>
+          <w:color w:val="E97132"/>
+        </w:rPr>
+        <w:t>Argomenti in più passaggi</w:t>
+      </w:r>
+    </w:p>
+    <w:p>
+      <w:r>
+        <w:rPr>
+          <w:highlight w:val="yellow"/>
+        </w:rPr>
+        <w:t>Quando un argomento non coincide con una sola regola, si procede a passi, applicando una regola alla volta e usando le conclusioni intermedie come nuove ipotesi</w:t>
+      </w:r>
+      <w:r>
+        <w:t>.</w:t>
+      </w:r>
+    </w:p>
+    <w:p>
+      <w:r>
+        <w:rPr>
+          <w:b/>
+        </w:rPr>
+        <w:t>Il bug nei moduli.</w:t>
+      </w:r>
+      <w:r>
+        <w:t xml:space="preserve"> Si ripete l'argomento d'apertura con p = «il bug è nel modulo 17», q = «il bug è nel modulo 81» e r = «il bug è un errore numerico». Le ipotesi sono p ∨ q, r e r → ¬q (il modulo 81 non ha errori numerici, quindi se il bug è numerico non è nel 81). Da r → ¬q e r, per il modus ponens si ricava ¬q. Da p ∨ q e ¬q, per il sillogismo disgiuntivo, si ricava p: il bug è nel modulo 17. L'argomento è valido.</w:t>
+      </w:r>
+    </w:p>
+    <w:p>
+      <w:r>
+        <w:rPr>
+          <w:b/>
+        </w:rPr>
+        <w:t>La squadra.</w:t>
+      </w:r>
+      <w:r>
+        <w:t xml:space="preserve"> Sono date le ipotesi: se la squadra prende un buon difensore, può battere la prima avversaria; se può battere la prima, può battere la seconda; se può battere la prima, può battere la terza; la squadra prende un buon difensore. Si vuole mostrare che ne segue che la squadra può battere la seconda e la terza. Con p = «prende un buon difensore», q = «batte la prima», r = «batte la seconda» e s = «batte la terza», le ipotesi sono p → q, q → r, q → s e p.</w:t>
+      </w:r>
+    </w:p>
+    <w:p>
+      <w:r>
+        <w:t>1. Da p → q e q → r, per il sillogismo ipotetico, p → r.</w:t>
+      </w:r>
+    </w:p>
+    <w:p>
+      <w:r>
+        <w:t>2. Da p → r e p, per il modus ponens, r.</w:t>
+      </w:r>
+    </w:p>
+    <w:p>
+      <w:r>
+        <w:t>3. Da p → q e q → s, per il sillogismo ipotetico, p → s.</w:t>
+      </w:r>
+    </w:p>
+    <w:p>
+      <w:r>
+        <w:t>4. Da p → s e p, per il modus ponens, s.</w:t>
+      </w:r>
+    </w:p>
+    <w:p>
+      <w:r>
         <w:lastRenderedPageBreak/>
-        <w:t xml:space="preserve">Se fosse valido, ogni volta che p → q e q sono vere dovrebbe esserlo anche p. Ma questo non succede: con p falsa e q vera, l'implicazione p → q è vera per difetto (ipotesi falsa), q è vera, e la conclusione p è falsa. </w:t>
-      </w:r>
-      <w:r>
-        <w:rPr>
-          <w:highlight w:val="yellow"/>
-        </w:rPr>
-        <w:t xml:space="preserve">L'argomento </w:t>
-      </w:r>
-      <w:r>
-        <w:rPr>
-          <w:b/>
-          <w:highlight w:val="yellow"/>
-        </w:rPr>
-        <w:t>non è valido</w:t>
-      </w:r>
-      <w:r>
-        <w:rPr>
-          <w:highlight w:val="yellow"/>
-        </w:rPr>
+        <w:t>5. Da r e s, per la congiunzione, r ∧ s.</w:t>
+      </w:r>
+    </w:p>
+    <w:p>
+      <w:r>
+        <w:t>Poiché r ∧ s dice che la squadra batte la seconda e la terza, la conclusione segue dalle ipotesi.</w:t>
+      </w:r>
+    </w:p>
+    <w:p>
+      <w:pPr>
+        <w:pStyle w:val="Titolo2"/>
+      </w:pPr>
+      <w:r>
+        <w:rPr>
+          <w:b/>
+          <w:color w:val="E97132"/>
+        </w:rPr>
+        <w:t>Un consiglio pratico</w:t>
+      </w:r>
+    </w:p>
+    <w:p>
+      <w:r>
+        <w:t xml:space="preserve">La </w:t>
+      </w:r>
+      <w:r>
+        <w:rPr>
+          <w:highlight w:val="yellow"/>
+        </w:rPr>
+        <w:t>validità di un argomento molto breve si può verificare con una tavola di verità, ma, nella pratica, argomenti e dimostrazioni usano le regole di inferenza</w:t>
+      </w:r>
+      <w:r>
+        <w:t>: le tavole crescono in modo esponenziale con il numero di proposizioni (capitolo 18), mentre una catena di regole resta corta e leggibile.</w:t>
+      </w:r>
+    </w:p>
+    <w:p>
+      <w:pPr>
+        <w:pStyle w:val="Titolo1"/>
+        <w:rPr>
+          <w:b/>
+          <w:color w:val="EE0000"/>
+        </w:rPr>
+      </w:pPr>
+    </w:p>
+    <w:p>
+      <w:pPr>
+        <w:pStyle w:val="Titolo1"/>
+      </w:pPr>
+      <w:r>
+        <w:rPr>
+          <w:b/>
+          <w:color w:val="EE0000"/>
+        </w:rPr>
+        <w:t>20. Predicati, Dominio del Discorso e Variabili</w:t>
+      </w:r>
+    </w:p>
+    <w:p>
+      <w:pPr>
+        <w:pStyle w:val="Titolo2"/>
+      </w:pPr>
+      <w:r>
+        <w:rPr>
+          <w:b/>
+          <w:color w:val="E97132"/>
+        </w:rPr>
+        <w:t>Perché non basta la logica proposizionale</w:t>
+      </w:r>
+    </w:p>
+    <w:p>
+      <w:r>
+        <w:t xml:space="preserve">Dopo la logica proposizionale (capitoli 12-19) si passa alla </w:t>
+      </w:r>
+      <w:r>
+        <w:rPr>
+          <w:b/>
+          <w:highlight w:val="yellow"/>
+        </w:rPr>
+        <w:t>logica dei quantificatori</w:t>
+      </w:r>
+      <w:r>
+        <w:t xml:space="preserve">. Come sottolineato a lezione, </w:t>
+      </w:r>
+      <w:r>
+        <w:rPr>
+          <w:highlight w:val="yellow"/>
+        </w:rPr>
+        <w:t xml:space="preserve">la si tratta con più dettaglio di quanto facciano i corsi di matematica, ma per un motivo diverso: lo scopo è preparare alla possibilità di </w:t>
+      </w:r>
+      <w:r>
+        <w:rPr>
+          <w:b/>
+          <w:highlight w:val="yellow"/>
+        </w:rPr>
+        <w:t>meccanizzare il ragionamento</w:t>
+      </w:r>
+      <w:r>
+        <w:t xml:space="preserve">, cioè insegnare a un computer a controllare una dimostrazione e a cercare delle verità. Per questo bisogna conoscere con precisione le definizioni di </w:t>
+      </w:r>
+      <w:r>
+        <w:rPr>
+          <w:highlight w:val="yellow"/>
+        </w:rPr>
+        <w:t>connettivo</w:t>
+      </w:r>
+      <w:r>
+        <w:t xml:space="preserve">, di </w:t>
+      </w:r>
+      <w:r>
+        <w:rPr>
+          <w:highlight w:val="yellow"/>
+        </w:rPr>
+        <w:t>quantificatore</w:t>
+      </w:r>
+      <w:r>
+        <w:t xml:space="preserve"> e </w:t>
+      </w:r>
+      <w:r>
+        <w:rPr>
+          <w:highlight w:val="yellow"/>
+        </w:rPr>
+        <w:t>le regole di inferenza</w:t>
+      </w:r>
+      <w:r>
+        <w:t>, più di quanto servirebbe per capire una dimostrazione di matematica; gli esempi di prove che si fanno sono volutamente troppo semplici per un corso di matematica, ma servono a capire che cos'è una prova e come si controlla se è corretta.</w:t>
+      </w:r>
+    </w:p>
+    <w:p>
+      <w:r>
+        <w:t>La logica proposizionale dei capitoli precedenti non basta a descrivere la maggior parte degli enunciati della matematica e dell'informatica. Si prenda l'affermazione «n è un intero dispari»: non è una proposizione, perché è vera o falsa a seconda del valore di n (è vera per n = 103 e falsa per n = 8). Siccome quasi tutti gli enunciati usano variabili, bisogna estendere la logica per includerle.</w:t>
+      </w:r>
+    </w:p>
+    <w:p>
+      <w:pPr>
+        <w:pStyle w:val="Titolo2"/>
+      </w:pPr>
+      <w:r>
+        <w:rPr>
+          <w:b/>
+          <w:color w:val="E97132"/>
+        </w:rPr>
+        <w:t>Funzione proposizionale (o predicato)</w:t>
+      </w:r>
+    </w:p>
+    <w:p>
+      <w:r>
+        <w:rPr>
+          <w:b/>
+        </w:rPr>
+        <w:t>Definizione.</w:t>
+      </w:r>
+      <w:r>
+        <w:t xml:space="preserve"> </w:t>
+      </w:r>
+      <w:r>
+        <w:rPr>
+          <w:highlight w:val="yellow"/>
+        </w:rPr>
+        <w:t xml:space="preserve">Sia P(x) un enunciato che contiene la variabile x e sia D un insieme. P si chiama </w:t>
+      </w:r>
+      <w:r>
+        <w:rPr>
+          <w:b/>
+          <w:highlight w:val="yellow"/>
+        </w:rPr>
+        <w:t>funzione proposizionale</w:t>
+      </w:r>
+      <w:r>
+        <w:rPr>
+          <w:highlight w:val="yellow"/>
+        </w:rPr>
+        <w:t xml:space="preserve"> o </w:t>
+      </w:r>
+      <w:r>
+        <w:rPr>
+          <w:b/>
+          <w:highlight w:val="yellow"/>
+        </w:rPr>
+        <w:t>predicato</w:t>
+      </w:r>
+      <w:r>
+        <w:rPr>
+          <w:highlight w:val="yellow"/>
+        </w:rPr>
+        <w:t xml:space="preserve"> (rispetto a D) se per ogni x ∈ D l'enunciato P(x) è una proposizione. L'insieme D si chiama </w:t>
+      </w:r>
+      <w:r>
+        <w:rPr>
+          <w:b/>
+          <w:highlight w:val="yellow"/>
+        </w:rPr>
+        <w:t>dominio del discorso</w:t>
+      </w:r>
+      <w:r>
+        <w:rPr>
+          <w:highlight w:val="yellow"/>
+        </w:rPr>
+        <w:t xml:space="preserve"> di P e specifica i valori ammessi per x</w:t>
+      </w:r>
+      <w:r>
         <w:t>.</w:t>
       </w:r>
-      <w:r>
-        <w:t xml:space="preserve"> </w:t>
-      </w:r>
-      <w:r>
-        <w:rPr>
-          <w:highlight w:val="yellow"/>
-        </w:rPr>
-        <w:t xml:space="preserve">Questa fallacia si chiama </w:t>
-      </w:r>
-      <w:r>
-        <w:rPr>
-          <w:b/>
-          <w:highlight w:val="yellow"/>
-        </w:rPr>
-        <w:t>affermazione della conclusione</w:t>
-      </w:r>
-      <w:r>
-        <w:t xml:space="preserve"> (in inglese *fallacy of affirming the conclusion*): </w:t>
-      </w:r>
-      <w:r>
-        <w:rPr>
-          <w:highlight w:val="yellow"/>
-        </w:rPr>
-        <w:t>è lo stesso errore</w:t>
-      </w:r>
-      <w:r>
-        <w:t xml:space="preserve">, già visto nel capitolo 17, </w:t>
-      </w:r>
-      <w:r>
-        <w:rPr>
-          <w:highlight w:val="yellow"/>
-        </w:rPr>
-        <w:t>di scambiare un'implicazione con la sua conversa</w:t>
-      </w:r>
-      <w:r>
-        <w:t>. Si arriva alla stessa conclusione guardando la tavola (a destra nella figura): nella terza riga le ipotesi sono vere e la conclusione è falsa.</w:t>
-      </w:r>
     </w:p>
     <w:p>
       <w:r>
@@ -15097,355 +15285,77 @@
         <w:t>In parole povere:</w:t>
       </w:r>
       <w:r>
-        <w:rPr/>
-        <w:t xml:space="preserve"> è l'errore di credere che da se p allora q e da q segua p. Esempio: se piove, la strada è bagnata; la strada è bagnata; quindi piove? No, magari è passata la spazzatrice. È lo stesso errore di scambiare un'implicazione con la sua conversa.</w:t>
-      </w:r>
-    </w:p>
-    <w:p>
-      <w:pPr>
-        <w:pStyle w:val="Titolo2"/>
-      </w:pPr>
-      <w:r>
-        <w:rPr>
-          <w:b/>
-          <w:color w:val="E97132"/>
-        </w:rPr>
-        <w:t>Argomenti in più passaggi</w:t>
-      </w:r>
-    </w:p>
-    <w:p>
-      <w:r>
-        <w:rPr>
-          <w:highlight w:val="yellow"/>
-        </w:rPr>
-        <w:t>Quando un argomento non coincide con una sola regola, si procede a passi, applicando una regola alla volta e usando le conclusioni intermedie come nuove ipotesi</w:t>
-      </w:r>
-      <w:r>
-        <w:t>.</w:t>
-      </w:r>
-    </w:p>
-    <w:p>
-      <w:r>
-        <w:rPr>
-          <w:b/>
-        </w:rPr>
-        <w:t>Il bug nei moduli.</w:t>
-      </w:r>
-      <w:r>
-        <w:t xml:space="preserve"> Si ripete l'argomento d'apertura con p = «il bug è nel modulo 17», q = «il bug è nel modulo 81» e r = «il bug è un errore numerico». Le ipotesi sono p ∨ q, r e r → ¬q (il modulo 81 non ha errori numerici, quindi se il bug è numerico non è nel 81). Da r → ¬q e r, per il modus ponens si ricava ¬q. Da p ∨ q e ¬q, per il sillogismo disgiuntivo, si ricava p: il bug è nel modulo 17. L'argomento è valido.</w:t>
-      </w:r>
-    </w:p>
-    <w:p>
-      <w:r>
-        <w:rPr>
-          <w:b/>
-        </w:rPr>
-        <w:t>La squadra.</w:t>
-      </w:r>
-      <w:r>
-        <w:t xml:space="preserve"> Sono date le ipotesi: se la squadra prende un buon difensore, può battere la prima avversaria; se può battere la prima, può battere la seconda; se può battere la prima, può battere la terza; la squadra prende un buon difensore. Si vuole mostrare che ne segue che la squadra può battere la seconda e la terza. Con p = «prende un buon difensore», q = «batte la prima», r = «batte la seconda» e s = «batte la terza», le ipotesi sono p → q, q → r, q → s e p.</w:t>
-      </w:r>
-    </w:p>
-    <w:p>
-      <w:r>
-        <w:t>1. Da p → q e q → r, per il sillogismo ipotetico, p → r.</w:t>
-      </w:r>
-    </w:p>
-    <w:p>
-      <w:r>
-        <w:t>2. Da p → r e p, per il modus ponens, r.</w:t>
-      </w:r>
-    </w:p>
-    <w:p>
-      <w:r>
-        <w:t>3. Da p → q e q → s, per il sillogismo ipotetico, p → s.</w:t>
-      </w:r>
-    </w:p>
-    <w:p>
-      <w:r>
-        <w:t>4. Da p → s e p, per il modus ponens, s.</w:t>
-      </w:r>
-    </w:p>
-    <w:p>
-      <w:r>
-        <w:t>5. Da r e s, per la congiunzione, r ∧ s.</w:t>
-      </w:r>
-    </w:p>
-    <w:p>
-      <w:r>
-        <w:t>Poiché r ∧ s dice che la squadra batte la seconda e la terza, la conclusione segue dalle ipotesi.</w:t>
-      </w:r>
-    </w:p>
-    <w:p>
-      <w:pPr>
-        <w:pStyle w:val="Titolo2"/>
-      </w:pPr>
-      <w:r>
-        <w:rPr>
-          <w:b/>
-          <w:color w:val="E97132"/>
-        </w:rPr>
-        <w:t>Un consiglio pratico</w:t>
-      </w:r>
-    </w:p>
-    <w:p>
-      <w:r>
-        <w:t xml:space="preserve">La </w:t>
-      </w:r>
-      <w:r>
-        <w:rPr>
-          <w:highlight w:val="yellow"/>
-        </w:rPr>
-        <w:t>validità di un argomento molto breve si può verificare con una tavola di verità, ma, nella pratica, argomenti e dimostrazioni usano le regole di inferenza</w:t>
-      </w:r>
-      <w:r>
-        <w:t>: le tavole crescono in modo esponenziale con il numero di proposizioni (capitolo 18), mentre una catena di regole resta corta e leggibile.</w:t>
-      </w:r>
-    </w:p>
-    <w:p>
-      <w:pPr>
-        <w:pStyle w:val="Titolo1"/>
-        <w:rPr>
-          <w:b/>
-          <w:color w:val="EE0000"/>
-        </w:rPr>
-      </w:pPr>
-    </w:p>
-    <w:p>
-      <w:pPr>
-        <w:pStyle w:val="Titolo1"/>
-      </w:pPr>
-      <w:r>
-        <w:rPr>
-          <w:b/>
-          <w:color w:val="EE0000"/>
-        </w:rPr>
-        <w:t>20. Predicati, Dominio del Discorso e Variabili</w:t>
-      </w:r>
-    </w:p>
-    <w:p>
-      <w:pPr>
-        <w:pStyle w:val="Titolo2"/>
-      </w:pPr>
-      <w:r>
-        <w:rPr>
-          <w:b/>
-          <w:color w:val="E97132"/>
-        </w:rPr>
-        <w:t>Perché non basta la logica proposizionale</w:t>
-      </w:r>
-    </w:p>
-    <w:p>
-      <w:r>
-        <w:t xml:space="preserve">Dopo la logica proposizionale (capitoli 12-19) si passa alla </w:t>
-      </w:r>
-      <w:r>
-        <w:rPr>
-          <w:b/>
-          <w:highlight w:val="yellow"/>
-        </w:rPr>
-        <w:t>logica dei quantificatori</w:t>
-      </w:r>
-      <w:r>
-        <w:t xml:space="preserve">. Come sottolineato a lezione, </w:t>
-      </w:r>
-      <w:r>
-        <w:rPr>
-          <w:highlight w:val="yellow"/>
-        </w:rPr>
-        <w:t xml:space="preserve">la si tratta con più dettaglio di quanto facciano i corsi di matematica, ma per un motivo diverso: lo scopo è preparare alla possibilità di </w:t>
-      </w:r>
-      <w:r>
-        <w:rPr>
-          <w:b/>
-          <w:highlight w:val="yellow"/>
-        </w:rPr>
-        <w:t>meccanizzare il ragionamento</w:t>
-      </w:r>
-      <w:r>
-        <w:t xml:space="preserve">, cioè insegnare a un computer a controllare una dimostrazione e a cercare delle verità. Per questo bisogna conoscere con precisione le definizioni di </w:t>
-      </w:r>
-      <w:r>
-        <w:rPr>
-          <w:highlight w:val="yellow"/>
-        </w:rPr>
-        <w:t>connettivo</w:t>
-      </w:r>
-      <w:r>
-        <w:t xml:space="preserve">, di </w:t>
-      </w:r>
-      <w:r>
-        <w:rPr>
-          <w:highlight w:val="yellow"/>
-        </w:rPr>
-        <w:t>quantificatore</w:t>
-      </w:r>
-      <w:r>
-        <w:t xml:space="preserve"> e </w:t>
-      </w:r>
-      <w:r>
-        <w:rPr>
-          <w:highlight w:val="yellow"/>
-        </w:rPr>
-        <w:t>le regole di inferenza</w:t>
-      </w:r>
-      <w:r>
-        <w:t>, più di quanto servirebbe per capire una dimostrazione di matematica; gli esempi di prove che si fanno sono volutamente troppo semplici per un corso di matematica, ma servono a capire che cos'è una prova e come si controlla se è corretta.</w:t>
-      </w:r>
-    </w:p>
-    <w:p>
+        <w:t xml:space="preserve"> un predicato è una frase con un buco da riempire. Finché il buco è vuoto la frase non è né vera né falsa; appena metti un valore del dominio diventa vera o falsa. Il dominio è l'insieme dei valori che ci puoi mettere. Esempio: x è dispari con x = 3 è vera, con x = 8 è falsa.</w:t>
+      </w:r>
+    </w:p>
+    <w:p>
+      <w:r>
+        <w:rPr>
+          <w:highlight w:val="yellow"/>
+        </w:rPr>
+        <w:t>Un predicato da solo non è né vero né falso: lo diventano le singole proposizioni P(x) quando alla variabile si assegna un valore del dominio</w:t>
+      </w:r>
+      <w:r>
+        <w:t xml:space="preserve">. Si può pensare al predicato come a una </w:t>
+      </w:r>
+      <w:r>
+        <w:rPr>
+          <w:b/>
+        </w:rPr>
+        <w:t>famiglia di proposizioni</w:t>
+      </w:r>
+      <w:r>
+        <w:t>, una per ogni elemento del dominio: se D = ℤ⁺ (gli interi positivi: ℤ è il nome degli interi, ℤ⁺ è riservato a 1, 2, 3, …) si ottiene la famiglia P(1), P(2), …, e ciascuna è vera o falsa ma non entrambe.</w:t>
+      </w:r>
+    </w:p>
+    <w:p>
+      <w:r>
+        <w:t xml:space="preserve">Il dominio serve perché certe sostituzioni non avrebbero senso: «π è un numero dispari» non significa nulla, perché si parla di interi. </w:t>
+      </w:r>
+      <w:r>
+        <w:rPr>
+          <w:highlight w:val="yellow"/>
+        </w:rPr>
+        <w:t xml:space="preserve">Un predicato può anche avere </w:t>
+      </w:r>
+      <w:r>
+        <w:rPr>
+          <w:b/>
+          <w:highlight w:val="yellow"/>
+        </w:rPr>
+        <w:t>più variabili</w:t>
+      </w:r>
+      <w:r>
+        <w:t xml:space="preserve">, </w:t>
+      </w:r>
+      <w:r>
+        <w:rPr>
+          <w:highlight w:val="yellow"/>
+        </w:rPr>
+        <w:t>come una funzione può avere più argomenti</w:t>
+      </w:r>
+      <w:r>
+        <w:t>: il test di uguaglianza tra due stringhe, che si incontra in programmazione, è un predicato a due variabili sull'insieme delle sequenze di caratteri.</w:t>
+      </w:r>
+    </w:p>
+    <w:p>
+      <w:r>
+        <w:rPr>
+          <w:b/>
+        </w:rPr>
+        <w:t>Esempio.</w:t>
+      </w:r>
+      <w:r>
+        <w:t xml:space="preserve"> Sia P(n) = «n è un intero dispari», con dominio ℤ⁺. Allora P(1) = «1 è dispari» è vera e P(2) = «2 è dispari» è falsa.</w:t>
+      </w:r>
+    </w:p>
+    <w:p>
+      <w:r>
+        <w:t xml:space="preserve">In programmazione succede lo stesso: l'affermazione x &lt; y non è né vera né falsa finché non si assegnano valori a x e a y; con x = 3 e y = 2 diventa 3 &lt; 2, che è falsa. Come in logica proposizionale, si </w:t>
+      </w:r>
       <w:r>
         <w:lastRenderedPageBreak/>
-        <w:t>La logica proposizionale dei capitoli precedenti non basta a descrivere la maggior parte degli enunciati della matematica e dell'informatica. Si prenda l'affermazione «n è un intero dispari»: non è una proposizione, perché è vera o falsa a seconda del valore di n (è vera per n = 103 e falsa per n = 8). Siccome quasi tutti gli enunciati usano variabili, bisogna estendere la logica per includerle.</w:t>
-      </w:r>
-    </w:p>
-    <w:p>
-      <w:pPr>
-        <w:pStyle w:val="Titolo2"/>
-      </w:pPr>
-      <w:r>
-        <w:rPr>
-          <w:b/>
-          <w:color w:val="E97132"/>
-        </w:rPr>
-        <w:t>Funzione proposizionale (o predicato)</w:t>
-      </w:r>
-    </w:p>
-    <w:p>
-      <w:r>
-        <w:rPr>
-          <w:b/>
-        </w:rPr>
-        <w:t>Definizione.</w:t>
-      </w:r>
-      <w:r>
-        <w:t xml:space="preserve"> </w:t>
-      </w:r>
-      <w:r>
-        <w:rPr>
-          <w:highlight w:val="yellow"/>
-        </w:rPr>
-        <w:t xml:space="preserve">Sia P(x) un enunciato che contiene la variabile x e sia D un insieme. P si chiama </w:t>
-      </w:r>
-      <w:r>
-        <w:rPr>
-          <w:b/>
-          <w:highlight w:val="yellow"/>
-        </w:rPr>
-        <w:t>funzione proposizionale</w:t>
-      </w:r>
-      <w:r>
-        <w:rPr>
-          <w:highlight w:val="yellow"/>
-        </w:rPr>
-        <w:t xml:space="preserve"> o </w:t>
-      </w:r>
-      <w:r>
-        <w:rPr>
-          <w:b/>
-          <w:highlight w:val="yellow"/>
-        </w:rPr>
-        <w:t>predicato</w:t>
-      </w:r>
-      <w:r>
-        <w:rPr>
-          <w:highlight w:val="yellow"/>
-        </w:rPr>
-        <w:t xml:space="preserve"> (rispetto a D) se per ogni x ∈ D l'enunciato P(x) è una proposizione. L'insieme D si chiama </w:t>
-      </w:r>
-      <w:r>
-        <w:rPr>
-          <w:b/>
-          <w:highlight w:val="yellow"/>
-        </w:rPr>
-        <w:t>dominio del discorso</w:t>
-      </w:r>
-      <w:r>
-        <w:rPr>
-          <w:highlight w:val="yellow"/>
-        </w:rPr>
-        <w:t xml:space="preserve"> di P e specifica i valori ammessi per x</w:t>
-      </w:r>
-      <w:r>
-        <w:t>.</w:t>
-      </w:r>
-    </w:p>
-    <w:p>
-      <w:r>
-        <w:rPr>
-          <w:b/>
-        </w:rPr>
-        <w:t>In parole povere:</w:t>
-      </w:r>
-      <w:r>
-        <w:rPr/>
-        <w:t xml:space="preserve"> un predicato è una frase con un buco da riempire. Finché il buco è vuoto la frase non è né vera né falsa; appena metti un valore del dominio diventa vera o falsa. Il dominio è l'insieme dei valori che ci puoi mettere. Esempio: x è dispari con x = 3 è vera, con x = 8 è falsa.</w:t>
-      </w:r>
-    </w:p>
-    <w:p>
-      <w:r>
-        <w:rPr>
-          <w:highlight w:val="yellow"/>
-        </w:rPr>
-        <w:t>Un predicato da solo non è né vero né falso: lo diventano le singole proposizioni P(x) quando alla variabile si assegna un valore del dominio</w:t>
-      </w:r>
-      <w:r>
-        <w:t xml:space="preserve">. Si può pensare al predicato come a una </w:t>
-      </w:r>
-      <w:r>
-        <w:rPr>
-          <w:b/>
-        </w:rPr>
-        <w:t>famiglia di proposizioni</w:t>
-      </w:r>
-      <w:r>
-        <w:t>, una per ogni elemento del dominio: se D = ℤ⁺ (gli interi positivi: ℤ è il nome degli interi, ℤ⁺ è riservato a 1, 2, 3, …) si ottiene la famiglia P(1), P(2), …, e ciascuna è vera o falsa ma non entrambe.</w:t>
-      </w:r>
-    </w:p>
-    <w:p>
-      <w:r>
-        <w:t xml:space="preserve">Il dominio serve perché certe sostituzioni non avrebbero senso: «π è un numero dispari» non significa nulla, perché si parla di interi. </w:t>
-      </w:r>
-      <w:r>
-        <w:rPr>
-          <w:highlight w:val="yellow"/>
-        </w:rPr>
-        <w:t xml:space="preserve">Un predicato può anche avere </w:t>
-      </w:r>
-      <w:r>
-        <w:rPr>
-          <w:b/>
-          <w:highlight w:val="yellow"/>
-        </w:rPr>
-        <w:t>più variabili</w:t>
-      </w:r>
-      <w:r>
-        <w:t xml:space="preserve">, </w:t>
-      </w:r>
-      <w:r>
-        <w:rPr>
-          <w:highlight w:val="yellow"/>
-        </w:rPr>
-        <w:t>come una funzione può avere più argomenti</w:t>
-      </w:r>
-      <w:r>
-        <w:t>: il test di uguaglianza tra due stringhe, che si incontra in programmazione, è un predicato a due variabili sull'insieme delle sequenze di caratteri.</w:t>
-      </w:r>
-    </w:p>
-    <w:p>
-      <w:r>
-        <w:rPr>
-          <w:b/>
-        </w:rPr>
-        <w:t>Esempio.</w:t>
-      </w:r>
-      <w:r>
-        <w:t xml:space="preserve"> Sia P(n) = «n è un intero dispari», con dominio ℤ⁺. Allora P(1) = «1 è dispari» è vera e P(2) = «2 è dispari» è falsa.</w:t>
-      </w:r>
-    </w:p>
-    <w:p>
-      <w:r>
-        <w:t>In programmazione succede lo stesso: l'affermazione x &lt; y non è né vera né falsa finché non si assegnano valori a x e a y; con x = 3 e y = 2 diventa 3 &lt; 2, che è falsa. Come in logica proposizionale, si possono quindi scrivere anche enunciati falsi (come «2 è un numero dispari»): servono proprio perché si vuole insegnare a un computer a distinguere tra vero e falso, a dare una garanzia quando un'affermazione è vera o a smentire una convinzione sbagliata.</w:t>
+        <w:t>possono quindi scrivere anche enunciati falsi (come «2 è un numero dispari»): servono proprio perché si vuole insegnare a un computer a distinguere tra vero e falso, a dare una garanzia quando un'affermazione è vera o a smentire una convinzione sbagliata.</w:t>
       </w:r>
     </w:p>
     <w:p>
@@ -15602,7 +15512,6 @@
         <w:t>In parole povere:</w:t>
       </w:r>
       <w:r>
-        <w:rPr/>
         <w:t xml:space="preserve"> una variabile libera è una lettera ancora da riempire, quindi la frase non è vera né falsa. Una variabile legata è già sistemata: o le hai dato un valore preciso, o è sotto un per ogni oppure esiste che le dice di quali valori parlare. Esempio: x più 4 uguale a 6 ha la x libera; per ogni x, x più 0 uguale a x non ha variabili libere ed è vera o falsa.</w:t>
       </w:r>
     </w:p>
@@ -15611,121 +15520,124 @@
         <w:rPr>
           <w:highlight w:val="yellow"/>
         </w:rPr>
+        <w:t xml:space="preserve">Una funzione proposizionale non ha un valore di verità. Un enunciato con variabili libere </w:t>
+      </w:r>
+      <w:r>
+        <w:rPr>
+          <w:b/>
+          <w:highlight w:val="yellow"/>
+        </w:rPr>
+        <w:t>non è una proposizione</w:t>
+      </w:r>
+      <w:r>
+        <w:rPr>
+          <w:highlight w:val="yellow"/>
+        </w:rPr>
+        <w:t xml:space="preserve">; un enunciato senza variabili libere (tutte legate) </w:t>
+      </w:r>
+      <w:r>
+        <w:rPr>
+          <w:b/>
+          <w:highlight w:val="yellow"/>
+        </w:rPr>
+        <w:t>è una proposizione</w:t>
+      </w:r>
+      <w:r>
+        <w:rPr>
+          <w:highlight w:val="yellow"/>
+        </w:rPr>
+        <w:t>, e ha un valore di verità</w:t>
+      </w:r>
+      <w:r>
+        <w:t>.</w:t>
+      </w:r>
+    </w:p>
+    <w:p>
+      <w:r>
+        <w:t xml:space="preserve">Due esempi di enunciati senza variabili libere: «per ogni triangolo T, la somma degli angoli di T è 180°» (un teorema di geometria euclidea) e «esiste un programma P il cui output è P stesso» (in informatica; ne sono un esempio i virus, che devono saper produrre in output sé stessi per riprodursi, cosa più facile in un linguaggio a basso livello dove si sa in quali celle sta il programma). Per dare un significato a enunciati di questo tipo si dovrebbero prendere tutti i triangoli, o tutti i programmi, e controllarli: un metodo puramente ideale, perché sono infiniti. Sono esempi di </w:t>
+      </w:r>
+      <w:r>
+        <w:rPr>
+          <w:b/>
+        </w:rPr>
+        <w:t>quantificazione</w:t>
+      </w:r>
+      <w:r>
+        <w:t>, introdotta nei capitoli seguenti: il capitolo 21 tratta «per ogni», il capitolo 22 tratta «esiste».</w:t>
+      </w:r>
+    </w:p>
+    <w:p>
+      <w:pPr>
+        <w:pStyle w:val="Titolo1"/>
+        <w:rPr>
+          <w:b/>
+          <w:color w:val="EE0000"/>
+        </w:rPr>
+      </w:pPr>
+    </w:p>
+    <w:p>
+      <w:pPr>
+        <w:pStyle w:val="Titolo1"/>
+      </w:pPr>
+      <w:r>
+        <w:rPr>
+          <w:b/>
+          <w:color w:val="EE0000"/>
+        </w:rPr>
+        <w:t>21. Il Quantificatore Universale</w:t>
+      </w:r>
+    </w:p>
+    <w:p>
+      <w:pPr>
+        <w:pStyle w:val="Titolo2"/>
+      </w:pPr>
+      <w:r>
+        <w:rPr>
+          <w:b/>
+          <w:color w:val="E97132"/>
+        </w:rPr>
+        <w:t>La definizione</w:t>
+      </w:r>
+    </w:p>
+    <w:p>
+      <w:r>
+        <w:rPr>
+          <w:highlight w:val="yellow"/>
+        </w:rPr>
+        <w:t xml:space="preserve">Un enunciato della forma «per ogni x, P(x)» si dice </w:t>
+      </w:r>
+      <w:r>
+        <w:rPr>
+          <w:b/>
+          <w:highlight w:val="yellow"/>
+        </w:rPr>
+        <w:t>enunciato quantificato universalmente</w:t>
+      </w:r>
+      <w:r>
+        <w:rPr>
+          <w:highlight w:val="yellow"/>
+        </w:rPr>
+        <w:t xml:space="preserve">. Il simbolo ∀ significa «per ogni» e si chiama </w:t>
+      </w:r>
+      <w:r>
+        <w:rPr>
+          <w:b/>
+          <w:highlight w:val="yellow"/>
+        </w:rPr>
+        <w:t>quantificatore universale</w:t>
+      </w:r>
+      <w:r>
+        <w:rPr>
+          <w:highlight w:val="yellow"/>
+        </w:rPr>
+        <w:t>: l'enunciato si scrive ∀x P(x).</w:t>
+      </w:r>
+      <w:r>
+        <w:t xml:space="preserve"> Nel linguaggio naturale, in inglese, «for all», «for any» e «for every» sono sinonimi; il simbolo ∀ si può </w:t>
+      </w:r>
+      <w:r>
         <w:lastRenderedPageBreak/>
-        <w:t xml:space="preserve">Una funzione proposizionale non ha un valore di verità. Un enunciato con variabili libere </w:t>
-      </w:r>
-      <w:r>
-        <w:rPr>
-          <w:b/>
-          <w:highlight w:val="yellow"/>
-        </w:rPr>
-        <w:t>non è una proposizione</w:t>
-      </w:r>
-      <w:r>
-        <w:rPr>
-          <w:highlight w:val="yellow"/>
-        </w:rPr>
-        <w:t xml:space="preserve">; un enunciato senza variabili libere (tutte legate) </w:t>
-      </w:r>
-      <w:r>
-        <w:rPr>
-          <w:b/>
-          <w:highlight w:val="yellow"/>
-        </w:rPr>
-        <w:t>è una proposizione</w:t>
-      </w:r>
-      <w:r>
-        <w:rPr>
-          <w:highlight w:val="yellow"/>
-        </w:rPr>
-        <w:t>, e ha un valore di verità</w:t>
-      </w:r>
-      <w:r>
-        <w:t>.</w:t>
-      </w:r>
-    </w:p>
-    <w:p>
-      <w:r>
-        <w:t xml:space="preserve">Due esempi di enunciati senza variabili libere: «per ogni triangolo T, la somma degli angoli di T è 180°» (un teorema di geometria euclidea) e «esiste un programma P il cui output è P stesso» (in informatica; ne sono un esempio i virus, che devono saper produrre in output sé stessi per riprodursi, cosa più facile in un linguaggio a basso livello dove si sa in quali celle sta il programma). Per dare un significato a enunciati di questo tipo si dovrebbero prendere tutti i triangoli, o tutti i programmi, e controllarli: un metodo puramente ideale, perché sono infiniti. Sono esempi di </w:t>
-      </w:r>
-      <w:r>
-        <w:rPr>
-          <w:b/>
-        </w:rPr>
-        <w:t>quantificazione</w:t>
-      </w:r>
-      <w:r>
-        <w:t>, introdotta nei capitoli seguenti: il capitolo 21 tratta «per ogni», il capitolo 22 tratta «esiste».</w:t>
-      </w:r>
-    </w:p>
-    <w:p>
-      <w:pPr>
-        <w:pStyle w:val="Titolo1"/>
-        <w:rPr>
-          <w:b/>
-          <w:color w:val="EE0000"/>
-        </w:rPr>
-      </w:pPr>
-    </w:p>
-    <w:p>
-      <w:pPr>
-        <w:pStyle w:val="Titolo1"/>
-      </w:pPr>
-      <w:r>
-        <w:rPr>
-          <w:b/>
-          <w:color w:val="EE0000"/>
-        </w:rPr>
-        <w:t>21. Il Quantificatore Universale</w:t>
-      </w:r>
-    </w:p>
-    <w:p>
-      <w:pPr>
-        <w:pStyle w:val="Titolo2"/>
-      </w:pPr>
-      <w:r>
-        <w:rPr>
-          <w:b/>
-          <w:color w:val="E97132"/>
-        </w:rPr>
-        <w:t>La definizione</w:t>
-      </w:r>
-    </w:p>
-    <w:p>
-      <w:r>
-        <w:rPr>
-          <w:highlight w:val="yellow"/>
-        </w:rPr>
-        <w:t xml:space="preserve">Un enunciato della forma «per ogni x, P(x)» si dice </w:t>
-      </w:r>
-      <w:r>
-        <w:rPr>
-          <w:b/>
-          <w:highlight w:val="yellow"/>
-        </w:rPr>
-        <w:t>enunciato quantificato universalmente</w:t>
-      </w:r>
-      <w:r>
-        <w:rPr>
-          <w:highlight w:val="yellow"/>
-        </w:rPr>
-        <w:t xml:space="preserve">. Il simbolo ∀ significa «per ogni» e si chiama </w:t>
-      </w:r>
-      <w:r>
-        <w:rPr>
-          <w:b/>
-          <w:highlight w:val="yellow"/>
-        </w:rPr>
-        <w:t>quantificatore universale</w:t>
-      </w:r>
-      <w:r>
-        <w:rPr>
-          <w:highlight w:val="yellow"/>
-        </w:rPr>
-        <w:t>: l'enunciato si scrive ∀x P(x).</w:t>
-      </w:r>
-      <w:r>
-        <w:t xml:space="preserve"> Nel linguaggio naturale, in inglese, «for all», «for any» e «for every» sono sinonimi; il simbolo ∀ si può leggere in tutti questi modi. È «universale» perché tutti gli oggetti del discorso devono avere la proprietà.</w:t>
+        <w:t>leggere in tutti questi modi. È «universale» perché tutti gli oggetti del discorso devono avere la proprietà.</w:t>
       </w:r>
     </w:p>
     <w:p>
@@ -15779,8 +15691,34 @@
         <w:t>In parole povere:</w:t>
       </w:r>
       <w:r>
-        <w:rPr/>
-        <w:t xml:space="preserve"> il per ogni dice che la proprietà vale per tutti gli elementi del dominio, senza eccezioni. Per dire che è vero devi controllare che non ce ne sia nemmeno uno che sbaglia; per dire che è falso ne basta uno solo che sbaglia. Esempio: tutti gli studenti della classe hanno il libro: basta uno senza libro per renderla falsa.</w:t>
+        <w:t xml:space="preserve"> il </w:t>
+      </w:r>
+      <w:r>
+        <w:rPr>
+          <w:highlight w:val="yellow"/>
+        </w:rPr>
+        <w:t>per ogni dice che la proprietà vale per tutti gli elementi del dominio,</w:t>
+      </w:r>
+      <w:r>
+        <w:t xml:space="preserve"> senza eccezioni. </w:t>
+      </w:r>
+      <w:r>
+        <w:rPr>
+          <w:highlight w:val="yellow"/>
+        </w:rPr>
+        <w:t>Per dire che è vero devi controllare che non ce ne sia nemmeno uno che sbaglia</w:t>
+      </w:r>
+      <w:r>
+        <w:t xml:space="preserve">; </w:t>
+      </w:r>
+      <w:r>
+        <w:rPr>
+          <w:highlight w:val="yellow"/>
+        </w:rPr>
+        <w:t>per dire che è falso ne basta uno solo che sbaglia</w:t>
+      </w:r>
+      <w:r>
+        <w:t>. Esempio: tutti gli studenti della classe hanno il libro: basta uno senza libro per renderla falsa.</w:t>
       </w:r>
     </w:p>
     <w:p>
@@ -15857,15 +15795,22 @@
     </w:p>
     <w:p>
       <w:r>
+        <w:rPr>
+          <w:highlight w:val="yellow"/>
+        </w:rPr>
         <w:t xml:space="preserve">Un valore di x del dominio che rende P(x) falsa si chiama </w:t>
       </w:r>
       <w:r>
         <w:rPr>
           <w:b/>
+          <w:highlight w:val="yellow"/>
         </w:rPr>
         <w:t>controesempio</w:t>
       </w:r>
       <w:r>
+        <w:rPr>
+          <w:highlight w:val="yellow"/>
+        </w:rPr>
         <w:t xml:space="preserve"> all'enunciato ∀x P(x).</w:t>
       </w:r>
     </w:p>
@@ -15877,7 +15822,6 @@
         <w:t>In parole povere:</w:t>
       </w:r>
       <w:r>
-        <w:rPr/>
         <w:t xml:space="preserve"> un controesempio è un caso che smentisce un per ogni: un solo elemento del dominio per cui la proprietà non vale. Come dire tutti i cigni sono bianchi: un singolo cigno nero è sufficiente per smentirlo.</w:t>
       </w:r>
     </w:p>
@@ -15895,7 +15839,16 @@
     </w:p>
     <w:p>
       <w:r>
-        <w:t>Il dominio del discorso è essenziale, perché lo stesso enunciato può essere vero in un dominio e falso in un altro. Si consideri ∀x (x² ≥ 0).</w:t>
+        <w:t xml:space="preserve">Il dominio del discorso è essenziale, perché lo </w:t>
+      </w:r>
+      <w:r>
+        <w:rPr>
+          <w:highlight w:val="yellow"/>
+        </w:rPr>
+        <w:t>stesso enunciato può essere vero in un dominio e falso in un altro.</w:t>
+      </w:r>
+      <w:r>
+        <w:t xml:space="preserve"> Si consideri ∀x (x² ≥ 0).</w:t>
       </w:r>
     </w:p>
     <w:p>
@@ -15906,7 +15859,6 @@
         </w:numPr>
       </w:pPr>
       <w:r>
-        <w:lastRenderedPageBreak/>
         <w:t xml:space="preserve">Con dominio ℝ è </w:t>
       </w:r>
       <w:r>
@@ -15962,30 +15914,57 @@
           <w:b/>
           <w:color w:val="E97132"/>
         </w:rPr>
+        <w:lastRenderedPageBreak/>
         <w:t>Come si dimostra che ∀x P(x) è vero</w:t>
       </w:r>
     </w:p>
     <w:p>
       <w:r>
-        <w:t xml:space="preserve">Per provare che ∀x P(x) è vero bisogna, in sostanza, esaminare </w:t>
-      </w:r>
-      <w:r>
-        <w:rPr>
-          <w:b/>
+        <w:t>Per provare che ∀x P(x) è vero bisogna, in sostanza, e</w:t>
+      </w:r>
+      <w:r>
+        <w:rPr>
+          <w:highlight w:val="yellow"/>
+        </w:rPr>
+        <w:t xml:space="preserve">saminare </w:t>
+      </w:r>
+      <w:r>
+        <w:rPr>
+          <w:b/>
+          <w:highlight w:val="yellow"/>
         </w:rPr>
         <w:t>ogni</w:t>
       </w:r>
       <w:r>
-        <w:t xml:space="preserve"> valore di x del dominio e mostrare che P(x) è vera. Una tecnica è porre che x sia un elemento </w:t>
-      </w:r>
-      <w:r>
-        <w:rPr>
-          <w:b/>
+        <w:rPr>
+          <w:highlight w:val="yellow"/>
+        </w:rPr>
+        <w:t xml:space="preserve"> valore di x del dominio e mostrare che P(x) è vera.</w:t>
+      </w:r>
+      <w:r>
+        <w:t xml:space="preserve"> </w:t>
+      </w:r>
+      <w:r>
+        <w:rPr>
+          <w:highlight w:val="yellow"/>
+        </w:rPr>
+        <w:t xml:space="preserve">Una tecnica è porre che x sia un elemento </w:t>
+      </w:r>
+      <w:r>
+        <w:rPr>
+          <w:b/>
+          <w:highlight w:val="yellow"/>
         </w:rPr>
         <w:t>arbitrario</w:t>
       </w:r>
       <w:r>
-        <w:t xml:space="preserve"> del dominio D e procedere con il simbolo x: qualunque cosa si affermi su x deve valere per qualsiasi valore x possa avere in D, e il ragionamento deve concludere che P(x) è vera. Mostrare che P(x) è vera per un valore particolare </w:t>
+        <w:rPr>
+          <w:highlight w:val="yellow"/>
+        </w:rPr>
+        <w:t xml:space="preserve"> del dominio D e procedere con il simbolo x: qualunque cosa si affermi su x deve valere per qualsiasi valore x possa avere in D</w:t>
+      </w:r>
+      <w:r>
+        <w:t xml:space="preserve">, e il ragionamento deve concludere che P(x) è vera. Mostrare che P(x) è vera per un valore particolare </w:t>
       </w:r>
       <w:r>
         <w:rPr>
@@ -16109,16 +16088,53 @@
         <w:t>finito</w:t>
       </w:r>
       <w:r>
-        <w:t>, invece, si può scrivere un programma. Sia D = {d₁, …, d</w:t>
-      </w:r>
-      <w:r>
-        <w:rPr>
+        <w:t xml:space="preserve">, invece, </w:t>
+      </w:r>
+      <w:r>
+        <w:rPr>
+          <w:highlight w:val="yellow"/>
+        </w:rPr>
+        <w:t>si può scrivere un programma</w:t>
+      </w:r>
+      <w:r>
+        <w:t xml:space="preserve">. </w:t>
+      </w:r>
+      <w:r>
+        <w:rPr>
+          <w:highlight w:val="yellow"/>
+        </w:rPr>
+        <w:t>Sia D = {d₁, …, d</w:t>
+      </w:r>
+      <w:r>
+        <w:rPr>
+          <w:highlight w:val="yellow"/>
           <w:vertAlign w:val="subscript"/>
         </w:rPr>
         <w:t>n</w:t>
       </w:r>
       <w:r>
-        <w:t>} (per esempio gli elementi di un vettore) e sia P una funzione proposizionale su D. Questo pseudocodice (non è un linguaggio particolare) decide ∀x P(x):</w:t>
+        <w:rPr>
+          <w:highlight w:val="yellow"/>
+        </w:rPr>
+        <w:t>}</w:t>
+      </w:r>
+      <w:r>
+        <w:t xml:space="preserve"> (per esempio gli elementi di un vettore) </w:t>
+      </w:r>
+      <w:r>
+        <w:rPr>
+          <w:highlight w:val="yellow"/>
+        </w:rPr>
+        <w:t>e sia P una funzione proposizionale su D. Questo pseudocodice</w:t>
+      </w:r>
+      <w:r>
+        <w:t xml:space="preserve"> (non è un linguaggio particolare) </w:t>
+      </w:r>
+      <w:r>
+        <w:rPr>
+          <w:highlight w:val="yellow"/>
+        </w:rPr>
+        <w:t>decide ∀x P(x):</w:t>
       </w:r>
     </w:p>
     <w:p>
@@ -16128,13 +16144,22 @@
           <w:lang w:val="en-US"/>
         </w:rPr>
       </w:pPr>
+      <w:r>
+        <w:rPr>
+          <w:rFonts w:ascii="Consolas" w:hAnsi="Consolas" w:cs="Consolas"/>
+          <w:sz w:val="17"/>
+          <w:highlight w:val="yellow"/>
+          <w:lang w:val="en-US"/>
+        </w:rPr>
+        <w:t>for</w:t>
+      </w:r>
       <w:r>
         <w:rPr>
           <w:rFonts w:ascii="Consolas" w:hAnsi="Consolas" w:cs="Consolas"/>
           <w:sz w:val="17"/>
           <w:lang w:val="en-US"/>
         </w:rPr>
-        <w:t xml:space="preserve">for </w:t>
+        <w:t xml:space="preserve"> </w:t>
       </w:r>
       <w:proofErr w:type="spellStart"/>
       <w:r>
@@ -16168,54 +16193,27 @@
           <w:sz w:val="17"/>
           <w:lang w:val="en-US"/>
         </w:rPr>
-        <w:t xml:space="preserve">    if (¬P(</w:t>
-      </w:r>
-      <w:proofErr w:type="spellStart"/>
+        <w:t xml:space="preserve">    if (¬P(d_i))</w:t>
+      </w:r>
+    </w:p>
+    <w:p>
+      <w:pPr>
+        <w:spacing w:after="0" w:line="240" w:lineRule="auto"/>
+      </w:pPr>
       <w:r>
         <w:rPr>
           <w:rFonts w:ascii="Consolas" w:hAnsi="Consolas" w:cs="Consolas"/>
           <w:sz w:val="17"/>
           <w:lang w:val="en-US"/>
         </w:rPr>
-        <w:t>d_i</w:t>
-      </w:r>
-      <w:proofErr w:type="spellEnd"/>
+        <w:t xml:space="preserve">        </w:t>
+      </w:r>
       <w:r>
         <w:rPr>
           <w:rFonts w:ascii="Consolas" w:hAnsi="Consolas" w:cs="Consolas"/>
           <w:sz w:val="17"/>
-          <w:lang w:val="en-US"/>
-        </w:rPr>
-        <w:t>))</w:t>
-      </w:r>
-    </w:p>
-    <w:p>
-      <w:pPr>
-        <w:spacing w:after="0" w:line="240" w:lineRule="auto"/>
-      </w:pPr>
-      <w:r>
-        <w:rPr>
-          <w:rFonts w:ascii="Consolas" w:hAnsi="Consolas" w:cs="Consolas"/>
-          <w:sz w:val="17"/>
-          <w:lang w:val="en-US"/>
-        </w:rPr>
-        <w:t xml:space="preserve">        </w:t>
-      </w:r>
-      <w:proofErr w:type="spellStart"/>
-      <w:r>
-        <w:rPr>
-          <w:rFonts w:ascii="Consolas" w:hAnsi="Consolas" w:cs="Consolas"/>
-          <w:sz w:val="17"/>
-        </w:rPr>
-        <w:t>return</w:t>
-      </w:r>
-      <w:proofErr w:type="spellEnd"/>
-      <w:r>
-        <w:rPr>
-          <w:rFonts w:ascii="Consolas" w:hAnsi="Consolas" w:cs="Consolas"/>
-          <w:sz w:val="17"/>
-        </w:rPr>
-        <w:t xml:space="preserve"> false</w:t>
+        </w:rPr>
+        <w:t>return false</w:t>
       </w:r>
     </w:p>
     <w:p>
@@ -16345,7 +16343,11 @@
         <w:t>return true</w:t>
       </w:r>
       <w:r>
-        <w:t xml:space="preserve"> dentro il ciclo: se P(d₁) è vera non si può concludere che il quantificatore sia vero, perché dipende dagli altri valori che non sono stati controllati. L'if va lasciato senza else: quando P(d</w:t>
+        <w:t xml:space="preserve"> dentro il ciclo: se P(d₁) è vera non si può concludere che il quantificatore sia vero, perché dipende dagli altri valori che non sono stati controllati. L'if va </w:t>
+      </w:r>
+      <w:r>
+        <w:lastRenderedPageBreak/>
+        <w:t>lasciato senza else: quando P(d</w:t>
       </w:r>
       <w:r>
         <w:rPr>
@@ -16365,16 +16367,26 @@
         </w:numPr>
       </w:pPr>
       <w:r>
+        <w:rPr>
+          <w:highlight w:val="yellow"/>
+        </w:rPr>
         <w:t xml:space="preserve">Mettere il </w:t>
       </w:r>
       <w:r>
         <w:rPr>
           <w:rFonts w:ascii="Consolas" w:hAnsi="Consolas" w:cs="Consolas"/>
+          <w:highlight w:val="yellow"/>
         </w:rPr>
         <w:t>return true</w:t>
       </w:r>
       <w:r>
-        <w:t xml:space="preserve"> dentro il ciclo o sotto l'if. Il </w:t>
+        <w:rPr>
+          <w:highlight w:val="yellow"/>
+        </w:rPr>
+        <w:t xml:space="preserve"> dentro il ciclo o sotto l'if.</w:t>
+      </w:r>
+      <w:r>
+        <w:t xml:space="preserve"> Il </w:t>
       </w:r>
       <w:r>
         <w:rPr>
@@ -16417,12 +16429,21 @@
     <w:p>
       <w:pPr>
         <w:pStyle w:val="Titolo1"/>
-      </w:pPr>
-      <w:r>
         <w:rPr>
           <w:b/>
           <w:color w:val="EE0000"/>
         </w:rPr>
+      </w:pPr>
+    </w:p>
+    <w:p>
+      <w:pPr>
+        <w:pStyle w:val="Titolo1"/>
+      </w:pPr>
+      <w:r>
+        <w:rPr>
+          <w:b/>
+          <w:color w:val="EE0000"/>
+        </w:rPr>
         <w:t>22. Il Quantificatore Esistenziale e le Leggi di De Morgan per i Quantificatori</w:t>
       </w:r>
     </w:p>
@@ -16440,29 +16461,53 @@
     </w:p>
     <w:p>
       <w:r>
+        <w:rPr>
+          <w:highlight w:val="yellow"/>
+        </w:rPr>
         <w:t>Il secondo quantificatore è l'</w:t>
       </w:r>
       <w:r>
         <w:rPr>
           <w:b/>
+          <w:highlight w:val="yellow"/>
         </w:rPr>
         <w:t>esistenziale</w:t>
       </w:r>
       <w:r>
-        <w:t xml:space="preserve">. Un enunciato della forma «esiste x tale che P(x)» si dice </w:t>
-      </w:r>
-      <w:r>
-        <w:rPr>
-          <w:b/>
+        <w:rPr>
+          <w:highlight w:val="yellow"/>
+        </w:rPr>
+        <w:t>.</w:t>
+      </w:r>
+      <w:r>
+        <w:t xml:space="preserve"> Un enunciato della forma «</w:t>
+      </w:r>
+      <w:r>
+        <w:rPr>
+          <w:highlight w:val="yellow"/>
+        </w:rPr>
+        <w:t xml:space="preserve">esiste x tale che P(x)» si dice </w:t>
+      </w:r>
+      <w:r>
+        <w:rPr>
+          <w:b/>
+          <w:highlight w:val="yellow"/>
         </w:rPr>
         <w:t>enunciato quantificato esistenzialmente</w:t>
       </w:r>
       <w:r>
-        <w:t xml:space="preserve">; il simbolo ∃ significa «esiste» e si chiama </w:t>
-      </w:r>
-      <w:r>
-        <w:rPr>
-          <w:b/>
+        <w:t xml:space="preserve">; </w:t>
+      </w:r>
+      <w:r>
+        <w:rPr>
+          <w:highlight w:val="yellow"/>
+        </w:rPr>
+        <w:t xml:space="preserve">il simbolo ∃ significa «esiste» e si chiama </w:t>
+      </w:r>
+      <w:r>
+        <w:rPr>
+          <w:b/>
+          <w:highlight w:val="yellow"/>
         </w:rPr>
         <w:t>quantificatore esistenziale</w:t>
       </w:r>
@@ -16478,25 +16523,42 @@
         <w:t>Definizione.</w:t>
       </w:r>
       <w:r>
-        <w:t xml:space="preserve"> Sia P una funzione proposizionale con dominio D. L'enunciato ∃x P(x) è </w:t>
-      </w:r>
-      <w:r>
-        <w:rPr>
-          <w:b/>
+        <w:t xml:space="preserve"> </w:t>
+      </w:r>
+      <w:r>
+        <w:rPr>
+          <w:highlight w:val="yellow"/>
+        </w:rPr>
+        <w:t xml:space="preserve">Sia P una funzione proposizionale con dominio D. L'enunciato ∃x P(x) è </w:t>
+      </w:r>
+      <w:r>
+        <w:rPr>
+          <w:b/>
+          <w:highlight w:val="yellow"/>
         </w:rPr>
         <w:t>vero</w:t>
       </w:r>
       <w:r>
+        <w:rPr>
+          <w:highlight w:val="yellow"/>
+        </w:rPr>
         <w:t xml:space="preserve"> se P(x) è vera per almeno un x ∈ D. È </w:t>
       </w:r>
       <w:r>
         <w:rPr>
           <w:b/>
+          <w:highlight w:val="yellow"/>
         </w:rPr>
         <w:t>falso</w:t>
       </w:r>
       <w:r>
-        <w:t xml:space="preserve"> se P(x) è falsa per ogni x ∈ D.</w:t>
+        <w:rPr>
+          <w:highlight w:val="yellow"/>
+        </w:rPr>
+        <w:t xml:space="preserve"> se P(x) è falsa per ogni x ∈ D</w:t>
+      </w:r>
+      <w:r>
+        <w:t>.</w:t>
       </w:r>
     </w:p>
     <w:p>
@@ -16507,8 +16569,34 @@
         <w:t>In parole povere:</w:t>
       </w:r>
       <w:r>
-        <w:rPr/>
-        <w:t xml:space="preserve"> l'esiste dice che c'è almeno un elemento del dominio per cui la proprietà vale (anche uno solo, anche tanti). Per dire che è vero ne basta uno che funzioni; per dire che è falso devono sbagliare tutti. Esempio: c'è uno studente con il libro: se ne trovi uno, hai finito.</w:t>
+        <w:t xml:space="preserve"> </w:t>
+      </w:r>
+      <w:r>
+        <w:rPr>
+          <w:highlight w:val="yellow"/>
+        </w:rPr>
+        <w:t>l'esiste dice che c'è almeno un elemento del dominio per cui la proprietà vale</w:t>
+      </w:r>
+      <w:r>
+        <w:t xml:space="preserve"> (anche uno solo, anche tanti). </w:t>
+      </w:r>
+      <w:r>
+        <w:rPr>
+          <w:highlight w:val="yellow"/>
+        </w:rPr>
+        <w:t>Per dire che è vero ne basta uno che funzioni</w:t>
+      </w:r>
+      <w:r>
+        <w:t xml:space="preserve">; </w:t>
+      </w:r>
+      <w:r>
+        <w:rPr>
+          <w:highlight w:val="yellow"/>
+        </w:rPr>
+        <w:t>per dire che è falso devono sbagliare tutti</w:t>
+      </w:r>
+      <w:r>
+        <w:t>. Esempio: c'è uno studente con il libro: se ne trovi uno, hai finito.</w:t>
       </w:r>
     </w:p>
     <w:p>
@@ -16553,27 +16641,27 @@
         <w:rPr>
           <w:b/>
         </w:rPr>
+        <w:t>Un altro esistenziale vero.</w:t>
+      </w:r>
+      <w:r>
+        <w:t xml:space="preserve"> «Per qualche n, se n è primo allora n + 1, n + 2, n + 3 e n + 4 non sono primi», con dominio ℤ⁺. Basta trovare un n che renda vera l'implicazione, per esempio n = 23: l'ipotesi «23 è primo» e la conclusione «24, 25, 26 e 27 non sono primi» sono entrambe vere. Alcuni valori rendono l'implicazione vera (n = 23, n = 4, n = 47) e altri la rendono falsa (n = 2, n = 101): conta il fatto che se ne sia trovato </w:t>
+      </w:r>
+      <w:r>
+        <w:rPr>
+          <w:b/>
+        </w:rPr>
+        <w:t>uno</w:t>
+      </w:r>
+      <w:r>
+        <w:t>.</w:t>
+      </w:r>
+    </w:p>
+    <w:p>
+      <w:r>
+        <w:rPr>
+          <w:b/>
+        </w:rPr>
         <w:lastRenderedPageBreak/>
-        <w:t>Un altro esistenziale vero.</w:t>
-      </w:r>
-      <w:r>
-        <w:t xml:space="preserve"> «Per qualche n, se n è primo allora n + 1, n + 2, n + 3 e n + 4 non sono primi», con dominio ℤ⁺. Basta trovare un n che renda vera l'implicazione, per esempio n = 23: l'ipotesi «23 è primo» e la conclusione «24, 25, 26 e 27 non sono primi» sono entrambe vere. Alcuni valori rendono l'implicazione vera (n = 23, n = 4, n = 47) e altri la rendono falsa (n = 2, n = 101): conta il fatto che se ne sia trovato </w:t>
-      </w:r>
-      <w:r>
-        <w:rPr>
-          <w:b/>
-        </w:rPr>
-        <w:t>uno</w:t>
-      </w:r>
-      <w:r>
-        <w:t>.</w:t>
-      </w:r>
-    </w:p>
-    <w:p>
-      <w:r>
-        <w:rPr>
-          <w:b/>
-        </w:rPr>
         <w:t>Un esistenziale falso.</w:t>
       </w:r>
       <w:r>
@@ -16617,11 +16705,15 @@
         </w:rPr>
       </w:pPr>
       <w:r>
+        <w:rPr>
+          <w:highlight w:val="yellow"/>
+        </w:rPr>
         <w:t xml:space="preserve">Si può usare la stessa idea del capitolo 21: la soluzione si ottiene </w:t>
       </w:r>
       <w:r>
         <w:rPr>
           <w:b/>
+          <w:highlight w:val="yellow"/>
         </w:rPr>
         <w:t>scambiando dappertutto vero e falso</w:t>
       </w:r>
@@ -16709,181 +16801,294 @@
           <w:sz w:val="17"/>
           <w:lang w:val="en-US"/>
         </w:rPr>
-        <w:t xml:space="preserve">    if (P(</w:t>
-      </w:r>
-      <w:proofErr w:type="spellStart"/>
+        <w:t xml:space="preserve">    if (P(d_i))</w:t>
+      </w:r>
+    </w:p>
+    <w:p>
+      <w:pPr>
+        <w:spacing w:after="0" w:line="240" w:lineRule="auto"/>
+        <w:rPr>
+          <w:lang w:val="en-US"/>
+        </w:rPr>
+      </w:pPr>
       <w:r>
         <w:rPr>
           <w:rFonts w:ascii="Consolas" w:hAnsi="Consolas" w:cs="Consolas"/>
           <w:sz w:val="17"/>
           <w:lang w:val="en-US"/>
         </w:rPr>
-        <w:t>d_i</w:t>
-      </w:r>
-      <w:proofErr w:type="spellEnd"/>
+        <w:t xml:space="preserve">        return true</w:t>
+      </w:r>
+    </w:p>
+    <w:p>
+      <w:pPr>
+        <w:spacing w:after="0" w:line="240" w:lineRule="auto"/>
+      </w:pPr>
       <w:r>
         <w:rPr>
           <w:rFonts w:ascii="Consolas" w:hAnsi="Consolas" w:cs="Consolas"/>
           <w:sz w:val="17"/>
-          <w:lang w:val="en-US"/>
-        </w:rPr>
-        <w:t>))</w:t>
-      </w:r>
-    </w:p>
-    <w:p>
-      <w:pPr>
-        <w:spacing w:after="0" w:line="240" w:lineRule="auto"/>
-        <w:rPr>
-          <w:lang w:val="en-US"/>
-        </w:rPr>
-      </w:pPr>
+        </w:rPr>
+        <w:t>return false</w:t>
+      </w:r>
+    </w:p>
+    <w:p/>
+    <w:p>
+      <w:r>
+        <w:t>Il ciclo esamina i d</w:t>
+      </w:r>
+      <w:r>
+        <w:rPr>
+          <w:vertAlign w:val="subscript"/>
+        </w:rPr>
+        <w:t>i</w:t>
+      </w:r>
+      <w:r>
+        <w:t xml:space="preserve"> uno a uno. Se trova un d</w:t>
+      </w:r>
+      <w:r>
+        <w:rPr>
+          <w:vertAlign w:val="subscript"/>
+        </w:rPr>
+        <w:t>i</w:t>
+      </w:r>
+      <w:r>
+        <w:t xml:space="preserve"> per cui P(d</w:t>
+      </w:r>
+      <w:r>
+        <w:rPr>
+          <w:vertAlign w:val="subscript"/>
+        </w:rPr>
+        <w:t>i</w:t>
+      </w:r>
+      <w:r>
+        <w:t xml:space="preserve">) è vera, restituisce </w:t>
+      </w:r>
+      <w:r>
+        <w:rPr>
+          <w:b/>
+        </w:rPr>
+        <w:t>true</w:t>
+      </w:r>
+      <w:r>
+        <w:t xml:space="preserve"> e termina: ne basta uno. Se P(d</w:t>
+      </w:r>
+      <w:r>
+        <w:rPr>
+          <w:vertAlign w:val="subscript"/>
+        </w:rPr>
+        <w:t>i</w:t>
+      </w:r>
+      <w:r>
+        <w:t>) è falsa per ogni d</w:t>
+      </w:r>
+      <w:r>
+        <w:rPr>
+          <w:vertAlign w:val="subscript"/>
+        </w:rPr>
+        <w:t>i</w:t>
+      </w:r>
+      <w:r>
+        <w:t xml:space="preserve">, il ciclo arriva alla fine e il programma restituisce </w:t>
+      </w:r>
+      <w:r>
+        <w:rPr>
+          <w:b/>
+        </w:rPr>
+        <w:t>false</w:t>
+      </w:r>
+      <w:r>
+        <w:t>. Quindi se ∃x P(x) è vero il ciclo si ferma appena trova un elemento che rende P vera; se è falso deve controllare tutti gli elementi.</w:t>
+      </w:r>
+    </w:p>
+    <w:p>
+      <w:r>
+        <w:t xml:space="preserve">Anche qui valgono gli errori del capitolo precedente, duali. Scrivere </w:t>
+      </w:r>
       <w:r>
         <w:rPr>
           <w:rFonts w:ascii="Consolas" w:hAnsi="Consolas" w:cs="Consolas"/>
-          <w:sz w:val="17"/>
-          <w:lang w:val="en-US"/>
-        </w:rPr>
-        <w:t xml:space="preserve">        return true</w:t>
-      </w:r>
-    </w:p>
-    <w:p>
-      <w:pPr>
-        <w:spacing w:after="0" w:line="240" w:lineRule="auto"/>
-      </w:pPr>
-      <w:proofErr w:type="spellStart"/>
+        </w:rPr>
+        <w:t>if (¬P(d_i)) return false</w:t>
+      </w:r>
+      <w:r>
+        <w:t xml:space="preserve"> è sbagliato: se P(d₁) è falsa non si può concludere che l'esistenziale sia falso, perché potrebbe essere vero per il settimo elemento. Si deve restituire </w:t>
+      </w:r>
+      <w:r>
+        <w:rPr>
+          <w:b/>
+        </w:rPr>
+        <w:t>true</w:t>
+      </w:r>
+      <w:r>
+        <w:t xml:space="preserve"> al primo vero, e il </w:t>
+      </w:r>
       <w:r>
         <w:rPr>
           <w:rFonts w:ascii="Consolas" w:hAnsi="Consolas" w:cs="Consolas"/>
-          <w:sz w:val="17"/>
-        </w:rPr>
-        <w:t>return</w:t>
-      </w:r>
-      <w:proofErr w:type="spellEnd"/>
+        </w:rPr>
+        <w:t>return false</w:t>
+      </w:r>
+      <w:r>
+        <w:t xml:space="preserve"> va </w:t>
+      </w:r>
+      <w:r>
+        <w:rPr>
+          <w:b/>
+        </w:rPr>
+        <w:t>fuori dal ciclo</w:t>
+      </w:r>
+      <w:r>
+        <w:t xml:space="preserve">, allineato con il </w:t>
+      </w:r>
       <w:r>
         <w:rPr>
           <w:rFonts w:ascii="Consolas" w:hAnsi="Consolas" w:cs="Consolas"/>
-          <w:sz w:val="17"/>
-        </w:rPr>
-        <w:t xml:space="preserve"> false</w:t>
-      </w:r>
-    </w:p>
-    <w:p/>
-    <w:p>
-      <w:r>
-        <w:t>Il ciclo esamina i d</w:t>
+        </w:rPr>
+        <w:t>for</w:t>
+      </w:r>
+      <w:r>
+        <w:t>. Per fare pratica si può provare a scrivere il programma per cercare in un vettore di numeri se c'è almeno un numero pari, oppure se sono tutti pari.</w:t>
+      </w:r>
+    </w:p>
+    <w:p>
+      <w:pPr>
+        <w:pStyle w:val="Titolo2"/>
+      </w:pPr>
+      <w:r>
+        <w:rPr>
+          <w:b/>
+          <w:color w:val="E97132"/>
+        </w:rPr>
+        <w:t>Duali, congiunzione e disgiunzione</w:t>
+      </w:r>
+    </w:p>
+    <w:p>
+      <w:r>
+        <w:rPr>
+          <w:highlight w:val="yellow"/>
+        </w:rPr>
+        <w:t xml:space="preserve">Poiché la definizione dell'uno diventa quella dell'altro scambiando dappertutto il vero con il falso, ∀ e ∃ si dicono </w:t>
+      </w:r>
+      <w:r>
+        <w:rPr>
+          <w:b/>
+          <w:highlight w:val="yellow"/>
+        </w:rPr>
+        <w:t>quantificatori duali</w:t>
+      </w:r>
+      <w:r>
+        <w:t xml:space="preserve">; è lo stesso legame che c'è tra congiunzione e disgiunzione. Per questo, </w:t>
+      </w:r>
+      <w:r>
+        <w:rPr>
+          <w:highlight w:val="yellow"/>
+        </w:rPr>
+        <w:t>come per congiunzione e disgiunzione, valgono le leggi di De Morgan</w:t>
+      </w:r>
+      <w:r>
+        <w:t>. In effetti un enunciato universale generalizza la congiunzione P₁ ∧ P₂ ∧ … ∧ P</w:t>
       </w:r>
       <w:r>
         <w:rPr>
           <w:vertAlign w:val="subscript"/>
         </w:rPr>
-        <w:t>i</w:t>
-      </w:r>
-      <w:r>
-        <w:t xml:space="preserve"> uno a uno. Se trova un d</w:t>
+        <w:t>n</w:t>
+      </w:r>
+      <w:r>
+        <w:t>: al posto delle singole proposizioni P₁, …, P</w:t>
       </w:r>
       <w:r>
         <w:rPr>
           <w:vertAlign w:val="subscript"/>
         </w:rPr>
-        <w:t>i</w:t>
-      </w:r>
-      <w:r>
-        <w:t xml:space="preserve"> per cui P(d</w:t>
+        <w:t>n</w:t>
+      </w:r>
+      <w:r>
+        <w:t xml:space="preserve"> si ha una famiglia P(x), con x nel dominio, e ∀x P(x) è vero se e solo se P(x) è vera per ogni x. Se il dominio è {−1, 0, 1}, ∀x P(x) equivale a P(−1) ∧ P(0) ∧ P(1). Allo stesso modo ∃x P(x) generalizza la disgiunzione P₁ ∨ P₂ ∨ … ∨ P</w:t>
       </w:r>
       <w:r>
         <w:rPr>
           <w:vertAlign w:val="subscript"/>
         </w:rPr>
-        <w:t>i</w:t>
-      </w:r>
-      <w:r>
-        <w:t xml:space="preserve">) è vera, restituisce </w:t>
-      </w:r>
-      <w:r>
-        <w:rPr>
-          <w:b/>
-        </w:rPr>
-        <w:t>true</w:t>
-      </w:r>
-      <w:r>
-        <w:t xml:space="preserve"> e termina: ne basta uno. Se P(d</w:t>
-      </w:r>
-      <w:r>
-        <w:rPr>
-          <w:vertAlign w:val="subscript"/>
-        </w:rPr>
-        <w:t>i</w:t>
-      </w:r>
-      <w:r>
-        <w:t>) è falsa per ogni d</w:t>
-      </w:r>
-      <w:r>
-        <w:rPr>
-          <w:vertAlign w:val="subscript"/>
-        </w:rPr>
-        <w:t>i</w:t>
-      </w:r>
-      <w:r>
-        <w:t xml:space="preserve">, il ciclo arriva alla fine e il programma restituisce </w:t>
-      </w:r>
-      <w:r>
-        <w:rPr>
-          <w:b/>
-        </w:rPr>
-        <w:t>false</w:t>
-      </w:r>
-      <w:r>
-        <w:t>. Quindi se ∃x P(x) è vero il ciclo si ferma appena trova un elemento che rende P vera; se è falso deve controllare tutti gli elementi.</w:t>
-      </w:r>
-    </w:p>
-    <w:p>
-      <w:r>
-        <w:t xml:space="preserve">Anche qui valgono gli errori del capitolo precedente, duali. Scrivere </w:t>
-      </w:r>
-      <w:r>
-        <w:rPr>
-          <w:rFonts w:ascii="Consolas" w:hAnsi="Consolas" w:cs="Consolas"/>
-        </w:rPr>
-        <w:t>if (¬P(d_i)) return false</w:t>
-      </w:r>
-      <w:r>
-        <w:t xml:space="preserve"> è sbagliato: se P(d₁) è falsa non si può concludere che l'esistenziale sia falso, perché potrebbe essere vero per il settimo elemento. Si deve restituire </w:t>
-      </w:r>
-      <w:r>
-        <w:rPr>
-          <w:b/>
-        </w:rPr>
-        <w:t>true</w:t>
-      </w:r>
-      <w:r>
-        <w:t xml:space="preserve"> al primo vero, e il </w:t>
-      </w:r>
-      <w:r>
-        <w:rPr>
-          <w:rFonts w:ascii="Consolas" w:hAnsi="Consolas" w:cs="Consolas"/>
-        </w:rPr>
-        <w:t>return false</w:t>
-      </w:r>
-      <w:r>
-        <w:t xml:space="preserve"> va </w:t>
-      </w:r>
-      <w:r>
-        <w:rPr>
-          <w:b/>
-        </w:rPr>
-        <w:t>fuori dal ciclo</w:t>
-      </w:r>
-      <w:r>
-        <w:t xml:space="preserve">, allineato con il </w:t>
-      </w:r>
-      <w:r>
-        <w:rPr>
-          <w:rFonts w:ascii="Consolas" w:hAnsi="Consolas" w:cs="Consolas"/>
-        </w:rPr>
-        <w:t>for</w:t>
-      </w:r>
-      <w:r>
-        <w:t>. Per fare pratica si può provare a scrivere il programma per cercare in un vettore di numeri se c'è almeno un numero pari, oppure se sono tutti pari.</w:t>
+        <w:t>n</w:t>
+      </w:r>
+      <w:r>
+        <w:t>: con dominio {1, 2, 3, 4}, ∃x P(x) equivale a P(1) ∨ P(2) ∨ P(3) ∨ P(4).</w:t>
+      </w:r>
+    </w:p>
+    <w:p>
+      <w:r>
+        <w:rPr>
+          <w:b/>
+        </w:rPr>
+        <w:t>In parole povere:</w:t>
+      </w:r>
+      <w:r>
+        <w:t xml:space="preserve"> d</w:t>
+      </w:r>
+      <w:r>
+        <w:rPr>
+          <w:highlight w:val="yellow"/>
+        </w:rPr>
+        <w:t>uali vuol dire che sono l'uno il rovescio dell'altro</w:t>
+      </w:r>
+      <w:r>
+        <w:t xml:space="preserve">: se </w:t>
+      </w:r>
+      <w:r>
+        <w:rPr>
+          <w:highlight w:val="yellow"/>
+        </w:rPr>
+        <w:t>scambi vero con falso, il per ogni diventa esiste e viceversa</w:t>
+      </w:r>
+      <w:r>
+        <w:t xml:space="preserve">. Succede </w:t>
+      </w:r>
+      <w:r>
+        <w:rPr>
+          <w:highlight w:val="yellow"/>
+        </w:rPr>
+        <w:t>lo stesso tra e e o</w:t>
+      </w:r>
+      <w:r>
+        <w:t xml:space="preserve">. Un </w:t>
+      </w:r>
+      <w:r>
+        <w:rPr>
+          <w:highlight w:val="yellow"/>
+        </w:rPr>
+        <w:t>per ogni</w:t>
+      </w:r>
+      <w:r>
+        <w:t xml:space="preserve"> è come una </w:t>
+      </w:r>
+      <w:r>
+        <w:rPr>
+          <w:highlight w:val="yellow"/>
+        </w:rPr>
+        <w:t>lunga e</w:t>
+      </w:r>
+      <w:r>
+        <w:t xml:space="preserve"> di tante frasi, un </w:t>
+      </w:r>
+      <w:r>
+        <w:rPr>
+          <w:highlight w:val="yellow"/>
+        </w:rPr>
+        <w:t>esiste</w:t>
+      </w:r>
+      <w:r>
+        <w:t xml:space="preserve"> come una </w:t>
+      </w:r>
+      <w:r>
+        <w:rPr>
+          <w:highlight w:val="yellow"/>
+        </w:rPr>
+        <w:t>lunga o</w:t>
+      </w:r>
+      <w:r>
+        <w:t>.</w:t>
       </w:r>
     </w:p>
     <w:p>
@@ -16895,71 +17100,6 @@
           <w:b/>
           <w:color w:val="E97132"/>
         </w:rPr>
-        <w:t>Duali, congiunzione e disgiunzione</w:t>
-      </w:r>
-    </w:p>
-    <w:p>
-      <w:r>
-        <w:t xml:space="preserve">Poiché la definizione dell'uno diventa quella dell'altro scambiando dappertutto il vero con il falso, ∀ e ∃ si dicono </w:t>
-      </w:r>
-      <w:r>
-        <w:rPr>
-          <w:b/>
-        </w:rPr>
-        <w:t>quantificatori duali</w:t>
-      </w:r>
-      <w:r>
-        <w:t>; è lo stesso legame che c'è tra congiunzione e disgiunzione. Per questo, come per congiunzione e disgiunzione, valgono le leggi di De Morgan. In effetti un enunciato universale generalizza la congiunzione P₁ ∧ P₂ ∧ … ∧ P</w:t>
-      </w:r>
-      <w:r>
-        <w:rPr>
-          <w:vertAlign w:val="subscript"/>
-        </w:rPr>
-        <w:t>n</w:t>
-      </w:r>
-      <w:r>
-        <w:t>: al posto delle singole proposizioni P₁, …, P</w:t>
-      </w:r>
-      <w:r>
-        <w:rPr>
-          <w:vertAlign w:val="subscript"/>
-        </w:rPr>
-        <w:t>n</w:t>
-      </w:r>
-      <w:r>
-        <w:t xml:space="preserve"> si ha una famiglia P(x), con x nel dominio, e ∀x P(x) è vero se e solo se P(x) è vera per ogni x. Se il dominio è {−1, 0, 1}, ∀x P(x) equivale a P(−1) ∧ P(0) ∧ P(1). Allo stesso modo ∃x P(x) generalizza la disgiunzione P₁ ∨ P₂ ∨ … ∨ P</w:t>
-      </w:r>
-      <w:r>
-        <w:rPr>
-          <w:vertAlign w:val="subscript"/>
-        </w:rPr>
-        <w:t>n</w:t>
-      </w:r>
-      <w:r>
-        <w:t>: con dominio {1, 2, 3, 4}, ∃x P(x) equivale a P(1) ∨ P(2) ∨ P(3) ∨ P(4).</w:t>
-      </w:r>
-    </w:p>
-    <w:p>
-      <w:r>
-        <w:rPr>
-          <w:b/>
-        </w:rPr>
-        <w:t>In parole povere:</w:t>
-      </w:r>
-      <w:r>
-        <w:rPr/>
-        <w:t xml:space="preserve"> duali vuol dire che sono l'uno il rovescio dell'altro: se scambi vero con falso, il per ogni diventa esiste e viceversa. Succede lo stesso tra e e o. Un per ogni è come una lunga e di tante frasi, un esiste come una lunga o.</w:t>
-      </w:r>
-    </w:p>
-    <w:p>
-      <w:pPr>
-        <w:pStyle w:val="Titolo2"/>
-      </w:pPr>
-      <w:r>
-        <w:rPr>
-          <w:b/>
-          <w:color w:val="E97132"/>
-        </w:rPr>
         <w:t>Le leggi di De Morgan per i quantificatori</w:t>
       </w:r>
     </w:p>
@@ -16971,7 +17111,16 @@
         <w:t>Teorema (leggi di De Morgan generalizzate).</w:t>
       </w:r>
       <w:r>
-        <w:t xml:space="preserve"> Se P è una funzione proposizionale, ciascuna delle due coppie di enunciati seguenti ha gli stessi valori di verità (sono entrambi veri o entrambi falsi):</w:t>
+        <w:t xml:space="preserve"> Se </w:t>
+      </w:r>
+      <w:r>
+        <w:rPr>
+          <w:highlight w:val="yellow"/>
+        </w:rPr>
+        <w:t>P è una funzione proposizionale, ciascuna delle due coppie di enunciati seguenti ha gli stessi valori di verità</w:t>
+      </w:r>
+      <w:r>
+        <w:t xml:space="preserve"> (sono entrambi veri o entrambi falsi):</w:t>
       </w:r>
     </w:p>
     <w:p>
@@ -16982,7 +17131,13 @@
         </w:numPr>
       </w:pPr>
       <w:r>
-        <w:t>¬(∀x P(x)) e ∃x ¬P(x): non è vero che per ogni x vale P(x) se e solo se c'è un x per cui non vale P(x);</w:t>
+        <w:t xml:space="preserve">¬(∀x P(x)) e ∃x ¬P(x): </w:t>
+      </w:r>
+      <w:r>
+        <w:rPr>
+          <w:highlight w:val="yellow"/>
+        </w:rPr>
+        <w:t>non è vero che per ogni x vale P(x) se e solo se c'è un x per cui non vale P(x);</w:t>
       </w:r>
     </w:p>
     <w:p>
@@ -16992,21 +17147,55 @@
           <w:numId w:val="1"/>
         </w:numPr>
       </w:pPr>
-      <w:r>
-        <w:t>¬(∃x P(x)) e ∀x ¬P(x): non è vero che esiste un x per cui vale P(x) se e solo se per ogni x non vale P(x).</w:t>
-      </w:r>
-    </w:p>
-    <w:p>
-      <w:r>
+      <w:proofErr w:type="gramStart"/>
+      <w:r>
+        <w:t>¬(</w:t>
+      </w:r>
+      <w:proofErr w:type="gramEnd"/>
+      <w:r>
+        <w:t xml:space="preserve">∃x P(x)) e ∀x ¬P(x): </w:t>
+      </w:r>
+      <w:r>
+        <w:rPr>
+          <w:highlight w:val="yellow"/>
+        </w:rPr>
+        <w:t xml:space="preserve">non è vero che esiste </w:t>
+      </w:r>
+      <w:proofErr w:type="gramStart"/>
+      <w:r>
+        <w:rPr>
+          <w:highlight w:val="yellow"/>
+        </w:rPr>
+        <w:t>un x</w:t>
+      </w:r>
+      <w:proofErr w:type="gramEnd"/>
+      <w:r>
+        <w:rPr>
+          <w:highlight w:val="yellow"/>
+        </w:rPr>
+        <w:t xml:space="preserve"> per cui vale P(x) se e solo se per ogni x non vale P(x).</w:t>
+      </w:r>
+    </w:p>
+    <w:p>
+      <w:r>
+        <w:t xml:space="preserve">Sono esattamente le leggi di De Morgan dei capitoli 15 e 18, in </w:t>
+      </w:r>
+      <w:r>
+        <w:rPr>
+          <w:highlight w:val="yellow"/>
+        </w:rPr>
+        <w:t>cui la negazione di una congiunzione è la disgiunzione delle negazioni e viceversa</w:t>
+      </w:r>
+      <w:r>
+        <w:t>.</w:t>
+      </w:r>
+    </w:p>
+    <w:p>
+      <w:r>
+        <w:rPr>
+          <w:b/>
+        </w:rPr>
         <w:lastRenderedPageBreak/>
-        <w:t>Sono esattamente le leggi di De Morgan dei capitoli 15 e 18, in cui la negazione di una congiunzione è la disgiunzione delle negazioni e viceversa.</w:t>
-      </w:r>
-    </w:p>
-    <w:p>
-      <w:r>
-        <w:rPr>
-          <w:b/>
-        </w:rPr>
         <w:t>Dimostrazione della prima legge.</w:t>
       </w:r>
       <w:r>
@@ -17037,7 +17226,16 @@
     </w:p>
     <w:p>
       <w:r>
-        <w:t>Per negare un enunciato quantificato si applicano le leggi precedenti.</w:t>
+        <w:t xml:space="preserve">Per </w:t>
+      </w:r>
+      <w:r>
+        <w:rPr>
+          <w:highlight w:val="yellow"/>
+        </w:rPr>
+        <w:t>negare</w:t>
+      </w:r>
+      <w:r>
+        <w:t xml:space="preserve"> un enunciato quantificato si applicano le leggi precedenti.</w:t>
       </w:r>
     </w:p>
     <w:p>
@@ -17048,7 +17246,16 @@
         </w:numPr>
       </w:pPr>
       <w:r>
-        <w:t>«Ogni tifoso del rock ama gli U2» si scrive ∀x P(x), con P(x) = «x ama gli U2» e dominio i tifosi del rock. La sua negazione ¬(∀x P(x)) equivale a ∃x ¬P(x): «esiste un tifoso del rock che non ama gli U2».</w:t>
+        <w:t>«Ogni tifoso del rock ama gli U2» si scrive ∀x P(x), con P(x) = «x ama gli U2» e dominio i tifosi del rock. La sua negazione ¬(∀x P(x)) equivale a ∃x ¬P(x): «</w:t>
+      </w:r>
+      <w:r>
+        <w:rPr>
+          <w:highlight w:val="yellow"/>
+        </w:rPr>
+        <w:t>esiste un tifoso del rock che non ama gli U2</w:t>
+      </w:r>
+      <w:r>
+        <w:t>».</w:t>
       </w:r>
     </w:p>
     <w:p>

</xml_diff>